<commit_message>
Update: Change Happy Path and Post Condition of some Edit* Usecase
</commit_message>
<xml_diff>
--- a/Diagrams/UsecaseDiagram/DacTa/DacTaUsecase.docx
+++ b/Diagrams/UsecaseDiagram/DacTa/DacTaUsecase.docx
@@ -1794,12 +1794,6 @@
             <w:insideH w:val="single" w:color="auto" w:sz="4" w:space="0"/>
             <w:insideV w:val="single" w:color="auto" w:sz="4" w:space="0"/>
           </w:tblBorders>
-          <w:tblCellMar>
-            <w:top w:w="0" w:type="dxa"/>
-            <w:left w:w="108" w:type="dxa"/>
-            <w:bottom w:w="0" w:type="dxa"/>
-            <w:right w:w="108" w:type="dxa"/>
-          </w:tblCellMar>
         </w:tblPrEx>
         <w:tc>
           <w:tcPr>
@@ -4289,24 +4283,25 @@
                 <w:ilvl w:val="0"/>
                 <w:numId w:val="22"/>
               </w:numPr>
-              <w:jc w:val="both"/>
-              <w:rPr>
-                <w:rFonts w:hint="default"/>
-                <w:sz w:val="32"/>
-                <w:szCs w:val="32"/>
-                <w:vertAlign w:val="baseline"/>
-                <w:lang w:val="en-US"/>
-              </w:rPr>
-            </w:pPr>
-            <w:r>
-              <w:rPr>
-                <w:rFonts w:hint="default"/>
-                <w:sz w:val="32"/>
-                <w:szCs w:val="32"/>
-                <w:vertAlign w:val="baseline"/>
-                <w:lang w:val="en-US"/>
-              </w:rPr>
-              <w:t>Hệ thống hiện giao diện gồm danh sách bài hát nghệ sĩ đã tải lên thành công.</w:t>
+              <w:ind w:left="0" w:leftChars="0" w:firstLine="0" w:firstLineChars="0"/>
+              <w:jc w:val="both"/>
+              <w:rPr>
+                <w:rFonts w:hint="default"/>
+                <w:sz w:val="32"/>
+                <w:szCs w:val="32"/>
+                <w:vertAlign w:val="baseline"/>
+                <w:lang w:val="en-US"/>
+              </w:rPr>
+            </w:pPr>
+            <w:r>
+              <w:rPr>
+                <w:rFonts w:hint="default"/>
+                <w:sz w:val="32"/>
+                <w:szCs w:val="32"/>
+                <w:vertAlign w:val="baseline"/>
+                <w:lang w:val="en-US"/>
+              </w:rPr>
+              <w:t>Hệ thống hiện form để nghệ sĩ sửa thông tin bài hát (Ảnh nền, tên bài hát, thể loại, mô tả bài hát,….) và file âm nhạc thành công (có sẵn thông tin hiện tại của bài hát).</w:t>
             </w:r>
           </w:p>
           <w:p>
@@ -4316,24 +4311,25 @@
                 <w:ilvl w:val="0"/>
                 <w:numId w:val="22"/>
               </w:numPr>
-              <w:jc w:val="both"/>
-              <w:rPr>
-                <w:rFonts w:hint="default"/>
-                <w:sz w:val="32"/>
-                <w:szCs w:val="32"/>
-                <w:vertAlign w:val="baseline"/>
-                <w:lang w:val="en-US"/>
-              </w:rPr>
-            </w:pPr>
-            <w:r>
-              <w:rPr>
-                <w:rFonts w:hint="default"/>
-                <w:sz w:val="32"/>
-                <w:szCs w:val="32"/>
-                <w:vertAlign w:val="baseline"/>
-                <w:lang w:val="en-US"/>
-              </w:rPr>
-              <w:t>Nghệ sĩ xem và tìm kiếm danh sách bài hát đã tải lên.</w:t>
+              <w:ind w:left="0" w:leftChars="0" w:firstLine="0" w:firstLineChars="0"/>
+              <w:jc w:val="both"/>
+              <w:rPr>
+                <w:rFonts w:hint="default"/>
+                <w:sz w:val="32"/>
+                <w:szCs w:val="32"/>
+                <w:vertAlign w:val="baseline"/>
+                <w:lang w:val="en-US"/>
+              </w:rPr>
+            </w:pPr>
+            <w:r>
+              <w:rPr>
+                <w:rFonts w:hint="default"/>
+                <w:sz w:val="32"/>
+                <w:szCs w:val="32"/>
+                <w:vertAlign w:val="baseline"/>
+                <w:lang w:val="en-US"/>
+              </w:rPr>
+              <w:t>Nghệ sĩ thay đổi thông tin bài hát hoặc tải lên file âm nhạc mới và chọn Lưu.</w:t>
             </w:r>
           </w:p>
           <w:p>
@@ -4361,119 +4357,7 @@
                 <w:vertAlign w:val="baseline"/>
                 <w:lang w:val="en-US"/>
               </w:rPr>
-              <w:t>Nghệ sĩ chọn 1 bài hát để sửa.</w:t>
-            </w:r>
-          </w:p>
-          <w:p>
-            <w:pPr>
-              <w:widowControl w:val="0"/>
-              <w:numPr>
-                <w:ilvl w:val="0"/>
-                <w:numId w:val="22"/>
-              </w:numPr>
-              <w:ind w:left="0" w:leftChars="0" w:firstLine="0" w:firstLineChars="0"/>
-              <w:jc w:val="both"/>
-              <w:rPr>
-                <w:rFonts w:hint="default"/>
-                <w:sz w:val="32"/>
-                <w:szCs w:val="32"/>
-                <w:vertAlign w:val="baseline"/>
-                <w:lang w:val="en-US"/>
-              </w:rPr>
-            </w:pPr>
-            <w:r>
-              <w:rPr>
-                <w:rFonts w:hint="default"/>
-                <w:sz w:val="32"/>
-                <w:szCs w:val="32"/>
-                <w:vertAlign w:val="baseline"/>
-                <w:lang w:val="en-US"/>
-              </w:rPr>
-              <w:t>Hệ thống hiện form để nghệ sĩ sửa thông tin bài hát (Ảnh nền, tên bài hát, thể loại, mô tả bài hát,….) và file âm nhạc thành công (có sẵn thông tin hiện tại của bài hát).</w:t>
-            </w:r>
-          </w:p>
-          <w:p>
-            <w:pPr>
-              <w:widowControl w:val="0"/>
-              <w:numPr>
-                <w:ilvl w:val="0"/>
-                <w:numId w:val="22"/>
-              </w:numPr>
-              <w:ind w:left="0" w:leftChars="0" w:firstLine="0" w:firstLineChars="0"/>
-              <w:jc w:val="both"/>
-              <w:rPr>
-                <w:rFonts w:hint="default"/>
-                <w:sz w:val="32"/>
-                <w:szCs w:val="32"/>
-                <w:vertAlign w:val="baseline"/>
-                <w:lang w:val="en-US"/>
-              </w:rPr>
-            </w:pPr>
-            <w:r>
-              <w:rPr>
-                <w:rFonts w:hint="default"/>
-                <w:sz w:val="32"/>
-                <w:szCs w:val="32"/>
-                <w:vertAlign w:val="baseline"/>
-                <w:lang w:val="en-US"/>
-              </w:rPr>
-              <w:t>Nghệ sĩ thay đổi thông tin bài hát hoặc tải lên file âm nhạc mới và chọn Lưu.</w:t>
-            </w:r>
-          </w:p>
-          <w:p>
-            <w:pPr>
-              <w:widowControl w:val="0"/>
-              <w:numPr>
-                <w:ilvl w:val="0"/>
-                <w:numId w:val="22"/>
-              </w:numPr>
-              <w:ind w:left="0" w:leftChars="0" w:firstLine="0" w:firstLineChars="0"/>
-              <w:jc w:val="both"/>
-              <w:rPr>
-                <w:rFonts w:hint="default"/>
-                <w:sz w:val="32"/>
-                <w:szCs w:val="32"/>
-                <w:vertAlign w:val="baseline"/>
-                <w:lang w:val="en-US"/>
-              </w:rPr>
-            </w:pPr>
-            <w:r>
-              <w:rPr>
-                <w:rFonts w:hint="default"/>
-                <w:sz w:val="32"/>
-                <w:szCs w:val="32"/>
-                <w:vertAlign w:val="baseline"/>
-                <w:lang w:val="en-US"/>
-              </w:rPr>
               <w:t>Hệ thống cập nhật thông tin mới của bài hát đó vào danh sách bài hát cá nhân nghệ sĩ thành công.</w:t>
-            </w:r>
-          </w:p>
-          <w:p>
-            <w:pPr>
-              <w:widowControl w:val="0"/>
-              <w:numPr>
-                <w:ilvl w:val="0"/>
-                <w:numId w:val="22"/>
-              </w:numPr>
-              <w:ind w:left="0" w:leftChars="0" w:firstLine="0" w:firstLineChars="0"/>
-              <w:jc w:val="both"/>
-              <w:rPr>
-                <w:rFonts w:hint="default"/>
-                <w:sz w:val="32"/>
-                <w:szCs w:val="32"/>
-                <w:vertAlign w:val="baseline"/>
-                <w:lang w:val="en-US"/>
-              </w:rPr>
-            </w:pPr>
-            <w:r>
-              <w:rPr>
-                <w:rFonts w:hint="default"/>
-                <w:sz w:val="32"/>
-                <w:szCs w:val="32"/>
-                <w:vertAlign w:val="baseline"/>
-                <w:lang w:val="en-US"/>
-              </w:rPr>
-              <w:t>Hệ thống hiện lại giao diện với thông tin mới của bài hát đó sau khi cập nhật thành công.</w:t>
             </w:r>
           </w:p>
         </w:tc>
@@ -4546,7 +4430,19 @@
                 <w:vertAlign w:val="baseline"/>
                 <w:lang w:val="en-US"/>
               </w:rPr>
-              <w:t>Nếu hệ thống hiện giao diện, hiện form, cập nhật hoặc hiện lại thông tin mới của bài hát đó không thành công thì hệ thống sẽ thông báo lỗi đến nghệ sĩ.</w:t>
+              <w:t xml:space="preserve">Nếu hệ thống hiện giao diện, hiện form, cập nhật </w:t>
+            </w:r>
+            <w:bookmarkStart w:id="0" w:name="_GoBack"/>
+            <w:bookmarkEnd w:id="0"/>
+            <w:r>
+              <w:rPr>
+                <w:rFonts w:hint="default"/>
+                <w:sz w:val="32"/>
+                <w:szCs w:val="32"/>
+                <w:vertAlign w:val="baseline"/>
+                <w:lang w:val="en-US"/>
+              </w:rPr>
+              <w:t>thông tin mới của bài hát đó không thành công thì hệ thống sẽ thông báo lỗi đến nghệ sĩ.</w:t>
             </w:r>
           </w:p>
         </w:tc>
@@ -4720,7 +4616,7 @@
                 <w:vertAlign w:val="baseline"/>
                 <w:lang w:val="en-US"/>
               </w:rPr>
-              <w:t>Hệ thống sẵn sàng thực hiện yêu cầu chỉnh sửa tiếp theo mà nghệ sĩ yêu cầu.</w:t>
+              <w:t>Hệ thống chuyển sang giao diện Quản lý bài hát cá nhân nghệ sĩ sau khi sửa thông tin bài hát.</w:t>
             </w:r>
           </w:p>
         </w:tc>
@@ -10518,7 +10414,7 @@
                 <w:vertAlign w:val="baseline"/>
                 <w:lang w:val="en-US"/>
               </w:rPr>
-              <w:t>Hệ thống hiện giao diện gồm form để người dùng nhập các thông tin mới cho hồ sơ cá nhân của mình (Tên, ảnh đại diện,…).</w:t>
+              <w:t>Hệ thống hiện giao diện gồm form để người dùng nhập các thông tin mới cho hồ sơ cá nhân của mình (Tên, ảnh đại diện,…) thành công.</w:t>
             </w:r>
           </w:p>
           <w:p>
@@ -10574,35 +10470,7 @@
                 <w:vertAlign w:val="baseline"/>
                 <w:lang w:val="en-US"/>
               </w:rPr>
-              <w:t>Hệ thống ghi nhận các thông tin mới của hồ sơ cá nhân và cập nhật vào hệ thống.</w:t>
-            </w:r>
-          </w:p>
-          <w:p>
-            <w:pPr>
-              <w:widowControl w:val="0"/>
-              <w:numPr>
-                <w:ilvl w:val="0"/>
-                <w:numId w:val="65"/>
-              </w:numPr>
-              <w:ind w:left="0" w:leftChars="0" w:firstLine="0" w:firstLineChars="0"/>
-              <w:jc w:val="both"/>
-              <w:rPr>
-                <w:rFonts w:hint="default"/>
-                <w:sz w:val="32"/>
-                <w:szCs w:val="32"/>
-                <w:vertAlign w:val="baseline"/>
-                <w:lang w:val="en-US"/>
-              </w:rPr>
-            </w:pPr>
-            <w:r>
-              <w:rPr>
-                <w:rFonts w:hint="default"/>
-                <w:sz w:val="32"/>
-                <w:szCs w:val="32"/>
-                <w:vertAlign w:val="baseline"/>
-                <w:lang w:val="en-US"/>
-              </w:rPr>
-              <w:t>Hệ thống hiện lại giao diện hồ sơ cá nhân với các thông tin mới sau khi cập nhật thành công.</w:t>
+              <w:t>Hệ thống ghi nhận các thông tin mới của hồ sơ cá nhân và cập nhật vào hệ thống thành công.</w:t>
             </w:r>
           </w:p>
         </w:tc>
@@ -10675,7 +10543,7 @@
                 <w:vertAlign w:val="baseline"/>
                 <w:lang w:val="en-US"/>
               </w:rPr>
-              <w:t>Nếu hệ thống hiện giao diện, ghi nhận thông tin mới hoặc hiện lại hồ sơ cá nhân sau khi cập nhật không thành công thì hệ thống thông báo lỗi đến người dùng.</w:t>
+              <w:t>Nếu hệ thống hiện giao diện, ghi nhận thông tin mới hoặc không thành công thì hệ thống thông báo lỗi đến người dùng.</w:t>
             </w:r>
           </w:p>
         </w:tc>
@@ -10821,7 +10689,7 @@
                 <w:vertAlign w:val="baseline"/>
                 <w:lang w:val="en-US"/>
               </w:rPr>
-              <w:t>Hệ thống sẵn sàng thực hiện yêu cầu chỉnh sửa tiếp theo mà người dùng yêu cầu.</w:t>
+              <w:t>Hệ thống chuyển sang giao diện Quản lý hồ sơ cá nhân sau khi chỉnh sửa.</w:t>
             </w:r>
           </w:p>
         </w:tc>
@@ -13315,19 +13183,7 @@
                 <w:vertAlign w:val="baseline"/>
                 <w:lang w:val="en-US"/>
               </w:rPr>
-              <w:t>Hệ thống chuyển sang giao diện Sửa Playlist cá nhân của Playlist sau chỉnh sửa</w:t>
-            </w:r>
-            <w:bookmarkStart w:id="0" w:name="_GoBack"/>
-            <w:bookmarkEnd w:id="0"/>
-            <w:r>
-              <w:rPr>
-                <w:rFonts w:hint="default"/>
-                <w:sz w:val="32"/>
-                <w:szCs w:val="32"/>
-                <w:vertAlign w:val="baseline"/>
-                <w:lang w:val="en-US"/>
-              </w:rPr>
-              <w:t>.</w:t>
+              <w:t>Hệ thống chuyển sang giao diện Sửa Playlist cá nhân của Playlist sau khi chỉnh sửa thông tin.</w:t>
             </w:r>
           </w:p>
         </w:tc>

</xml_diff>

<commit_message>
Update: Fix Usecase Spec and BFD
</commit_message>
<xml_diff>
--- a/Diagrams/UsecaseDiagram/DacTa/DacTaUsecase.docx
+++ b/Diagrams/UsecaseDiagram/DacTa/DacTaUsecase.docx
@@ -606,7 +606,19 @@
           <w:vertAlign w:val="baseline"/>
           <w:lang w:val="en-US"/>
         </w:rPr>
-        <w:t>Tương tác xã hội:</w:t>
+        <w:t>Quản lý tương tác bài hát</w:t>
+      </w:r>
+      <w:bookmarkStart w:id="0" w:name="_GoBack"/>
+      <w:bookmarkEnd w:id="0"/>
+      <w:r>
+        <w:rPr>
+          <w:rFonts w:hint="default"/>
+          <w:sz w:val="32"/>
+          <w:szCs w:val="32"/>
+          <w:vertAlign w:val="baseline"/>
+          <w:lang w:val="en-US"/>
+        </w:rPr>
+        <w:t>:</w:t>
       </w:r>
     </w:p>
     <w:p>
@@ -1066,7 +1078,7 @@
           <w:vertAlign w:val="baseline"/>
           <w:lang w:val="en-US"/>
         </w:rPr>
-        <w:t>Xử lý báo cáo vi phạm: Xem danh sách các báo cáo do người dùng gửi đến.</w:t>
+        <w:t>Quản lý báo cáo vi phạm: Xem danh sách các báo cáo do người dùng gửi đến.</w:t>
       </w:r>
     </w:p>
     <w:p>
@@ -1794,6 +1806,12 @@
             <w:insideH w:val="single" w:color="auto" w:sz="4" w:space="0"/>
             <w:insideV w:val="single" w:color="auto" w:sz="4" w:space="0"/>
           </w:tblBorders>
+          <w:tblCellMar>
+            <w:top w:w="0" w:type="dxa"/>
+            <w:left w:w="108" w:type="dxa"/>
+            <w:bottom w:w="0" w:type="dxa"/>
+            <w:right w:w="108" w:type="dxa"/>
+          </w:tblCellMar>
         </w:tblPrEx>
         <w:tc>
           <w:tcPr>
@@ -2029,7 +2047,7 @@
           <w:vertAlign w:val="baseline"/>
           <w:lang w:val="en-US"/>
         </w:rPr>
-        <w:t>Đặc tả Usecase Xử lý báo cáo vi phạm</w:t>
+        <w:t>Đặc tả Usecase Quản lý báo cáo vi phạm</w:t>
       </w:r>
     </w:p>
     <w:tbl>
@@ -2097,7 +2115,7 @@
                 <w:vertAlign w:val="baseline"/>
                 <w:lang w:val="en-US"/>
               </w:rPr>
-              <w:t>Tóm tắt: Usecase bắt đầu khi Admin chọn chức năng Xử lý báo cáo vi phạm. Hệ thống cho phép Admin Xử lý báo cáo vi phạm trong hệ thống.</w:t>
+              <w:t>Tóm tắt: Usecase bắt đầu khi Admin chọn chức năng Quản lý báo cáo vi phạm. Hệ thống cho phép Admin xem danh sách báo cáo vi phạm trong hệ thống.</w:t>
             </w:r>
           </w:p>
         </w:tc>
@@ -3883,33 +3901,6 @@
               <w:t>Hệ thống ghi nhận bài hát mới vào danh sách bài hát cá nhân nghệ sĩ thành công.</w:t>
             </w:r>
           </w:p>
-          <w:p>
-            <w:pPr>
-              <w:widowControl w:val="0"/>
-              <w:numPr>
-                <w:ilvl w:val="0"/>
-                <w:numId w:val="18"/>
-              </w:numPr>
-              <w:jc w:val="both"/>
-              <w:rPr>
-                <w:rFonts w:hint="default"/>
-                <w:sz w:val="32"/>
-                <w:szCs w:val="32"/>
-                <w:vertAlign w:val="baseline"/>
-                <w:lang w:val="en-US"/>
-              </w:rPr>
-            </w:pPr>
-            <w:r>
-              <w:rPr>
-                <w:rFonts w:hint="default"/>
-                <w:sz w:val="32"/>
-                <w:szCs w:val="32"/>
-                <w:vertAlign w:val="baseline"/>
-                <w:lang w:val="en-US"/>
-              </w:rPr>
-              <w:t>Hệ thống hiện lại giao diện với danh sách các bài hát cá nhân nghệ sĩ sau khi cập nhật thành công.</w:t>
-            </w:r>
-          </w:p>
         </w:tc>
       </w:tr>
       <w:tr>
@@ -4127,7 +4118,7 @@
                 <w:vertAlign w:val="baseline"/>
                 <w:lang w:val="en-US"/>
               </w:rPr>
-              <w:t>Hệ thống sẵn sàng thực hiện yêu cầu Tải lên bài hát tiếp theo mà nghệ sĩ yêu cầu.</w:t>
+              <w:t>Hệ thống chuyển sang giao diện Quản lý bài hát cá nhân nghệ sĩ sau khi tải lên bài hát.</w:t>
             </w:r>
           </w:p>
         </w:tc>
@@ -4430,19 +4421,7 @@
                 <w:vertAlign w:val="baseline"/>
                 <w:lang w:val="en-US"/>
               </w:rPr>
-              <w:t xml:space="preserve">Nếu hệ thống hiện giao diện, hiện form, cập nhật </w:t>
-            </w:r>
-            <w:bookmarkStart w:id="0" w:name="_GoBack"/>
-            <w:bookmarkEnd w:id="0"/>
-            <w:r>
-              <w:rPr>
-                <w:rFonts w:hint="default"/>
-                <w:sz w:val="32"/>
-                <w:szCs w:val="32"/>
-                <w:vertAlign w:val="baseline"/>
-                <w:lang w:val="en-US"/>
-              </w:rPr>
-              <w:t>thông tin mới của bài hát đó không thành công thì hệ thống sẽ thông báo lỗi đến nghệ sĩ.</w:t>
+              <w:t>Nếu hệ thống hiện giao diện, hiện form, cập nhật thông tin mới của bài hát đó không thành công thì hệ thống sẽ thông báo lỗi đến nghệ sĩ.</w:t>
             </w:r>
           </w:p>
         </w:tc>
@@ -6296,7 +6275,7 @@
                 <w:vertAlign w:val="baseline"/>
                 <w:lang w:val="en-US"/>
               </w:rPr>
-              <w:t>Hệ thống hiện giao diện gồm form đăng ký gồm email, mật khẩu, vai trò thành công.</w:t>
+              <w:t>Hệ thống hiện giao diện gồm form đăng nhập gồm email, mật khẩu thành công.</w:t>
             </w:r>
           </w:p>
           <w:p>
@@ -6324,7 +6303,7 @@
                 <w:vertAlign w:val="baseline"/>
                 <w:lang w:val="en-US"/>
               </w:rPr>
-              <w:t>Người dùng nhập email, mật khẩu, chọn vai trò và nhấn Đăng nhập.</w:t>
+              <w:t>Người dùng nhập email, mật khẩu và nhấn Đăng nhập.</w:t>
             </w:r>
           </w:p>
           <w:p>
@@ -6352,7 +6331,7 @@
                 <w:vertAlign w:val="baseline"/>
                 <w:lang w:val="en-US"/>
               </w:rPr>
-              <w:t>Hệ thống kiểm tra xem có trùng email, mật khẩu quá yếu hay tài khoản có tồn tại trong hệ thống không thành công.</w:t>
+              <w:t>Hệ thống kiểm tra xem email và mật khẩu có khớp với 1 tài khoản đã tồn tại trong hệ thống hay không thành công.</w:t>
             </w:r>
           </w:p>
           <w:p>
@@ -6380,7 +6359,7 @@
                 <w:vertAlign w:val="baseline"/>
                 <w:lang w:val="en-US"/>
               </w:rPr>
-              <w:t>Nếu thành công thì hệ thống sẽ ghi nhận tài khoản mới và thông báo đến người dùng đăng nhập thành công.</w:t>
+              <w:t>Nếu khớp thì hệ thống sẽ thông báo đến người dùng đăng nhập thành công.</w:t>
             </w:r>
           </w:p>
         </w:tc>
@@ -6454,7 +6433,7 @@
                 <w:vertAlign w:val="baseline"/>
                 <w:lang w:val="en-US"/>
               </w:rPr>
-              <w:t>Nếu hệ thống hiện giao diện không thành công thì hệ thống sẽ thông báo lỗi đến người dùng hoặc nếu người dùng nhập email không hợp lệ, mật khẩu quá yếu thì hệ thống sẽ thông báo lỗi và yêu cầu người dùng nhập lại email, mật khẩu hay nếu tài khoản không tồn tại thì yêu cầu người dùng đăng ký.</w:t>
+              <w:t>Nếu hệ thống hiện giao diện không thành công thì hệ thống sẽ thông báo lỗi đến người dùng hoặc nếu người dùng nhập email, mật khẩu không khớp thì hệ thống sẽ thông báo người dùng đăng nhập thất bại và yêu cầu người dùng nhập lại email, mật khẩu hay nếu tài khoản không tồn tại thì yêu cầu người dùng đăng ký.</w:t>
             </w:r>
           </w:p>
         </w:tc>
@@ -7089,12 +7068,6 @@
             <w:insideH w:val="single" w:color="auto" w:sz="4" w:space="0"/>
             <w:insideV w:val="single" w:color="auto" w:sz="4" w:space="0"/>
           </w:tblBorders>
-          <w:tblCellMar>
-            <w:top w:w="0" w:type="dxa"/>
-            <w:left w:w="108" w:type="dxa"/>
-            <w:bottom w:w="0" w:type="dxa"/>
-            <w:right w:w="108" w:type="dxa"/>
-          </w:tblCellMar>
         </w:tblPrEx>
         <w:tc>
           <w:tcPr>
@@ -7734,6 +7707,7 @@
             <w:pPr>
               <w:widowControl w:val="0"/>
               <w:numPr>
+                <w:ilvl w:val="0"/>
                 <w:numId w:val="0"/>
               </w:numPr>
               <w:ind w:firstLine="320" w:firstLineChars="100"/>
@@ -7761,6 +7735,7 @@
             <w:pPr>
               <w:widowControl w:val="0"/>
               <w:numPr>
+                <w:ilvl w:val="0"/>
                 <w:numId w:val="0"/>
               </w:numPr>
               <w:jc w:val="both"/>
@@ -7787,6 +7762,7 @@
             <w:pPr>
               <w:widowControl w:val="0"/>
               <w:numPr>
+                <w:ilvl w:val="0"/>
                 <w:numId w:val="0"/>
               </w:numPr>
               <w:jc w:val="both"/>
@@ -8125,7 +8101,7 @@
                 <w:vertAlign w:val="baseline"/>
                 <w:lang w:val="en-US"/>
               </w:rPr>
-              <w:t>Tóm tắt: Usecase bắt đầu khi người dùng chọn chức năng Xem danh sách và tìm kiếm bài hát. Hệ thống cho phép người xem danh sách và tìm kiếm bài hát trong hệ thống.</w:t>
+              <w:t>Tóm tắt: Usecase bắt đầu khi người dùng chọn chức năng Xem danh sách và tìm kiếm bài hát. Hệ thống cho phép người dùng xem danh sách và tìm kiếm bài hát trong hệ thống.</w:t>
             </w:r>
           </w:p>
         </w:tc>
@@ -8255,7 +8231,7 @@
                 <w:vertAlign w:val="baseline"/>
                 <w:lang w:val="en-US"/>
               </w:rPr>
-              <w:t>Người dùng có thể thực hiện các usecase như Nghe nhạc, Tương tác xã hội (Thích, bình luận, chia sẻ, đăng lại),… khi chọn đúng bài hát mình cần.</w:t>
+              <w:t>Người dùng có thể thực hiện các Usecase như Nghe nhạc, Quản lý tương tác bài hát (Thích, bình luận, chia sẻ, đăng lại),… khi chọn đúng bài hát mình cần.</w:t>
             </w:r>
           </w:p>
         </w:tc>
@@ -8474,7 +8450,7 @@
                 <w:vertAlign w:val="baseline"/>
                 <w:lang w:val="en-US"/>
               </w:rPr>
-              <w:t>Hệ thống sẵn sàng để thực hiện yêu cầu tiếp theo của người dùng khi chọn đúng bài hát mình cần như nghe nhạc, tương tác xã hội,….</w:t>
+              <w:t>Hệ thống sẵn sàng để thực hiện yêu cầu tiếp theo của người dùng khi chọn đúng bài hát mình cần như nghe nhạc, tương tác xã hội,…</w:t>
             </w:r>
           </w:p>
         </w:tc>
@@ -8506,7 +8482,7 @@
           <w:vertAlign w:val="baseline"/>
           <w:lang w:val="en-US"/>
         </w:rPr>
-        <w:t>Đặc tả Usecase Tương tác xã hội</w:t>
+        <w:t>Đặc tả Usecase Xem danh sách và tìm kiếm nghệ sĩ</w:t>
       </w:r>
     </w:p>
     <w:tbl>
@@ -8574,7 +8550,7 @@
                 <w:vertAlign w:val="baseline"/>
                 <w:lang w:val="en-US"/>
               </w:rPr>
-              <w:t>Tóm tắt: Usecase bắt đầu khi người dùng muốn Tương tác xã hội khi đang Xem danh sách và tìm kiếm bài hát. Hệ thống cho phép người thực hiện thích bài hát, bình luận, chia sẻ.</w:t>
+              <w:t>Tóm tắt: Usecase bắt đầu khi người dùng chọn chức năng Xem danh sách và tìm kiếm nghệ sĩ. Hệ thống cho phép người dùng xem danh sách và tìm kiếm nghệ sĩ trong hệ thống.</w:t>
             </w:r>
           </w:p>
         </w:tc>
@@ -8647,7 +8623,7 @@
                 <w:vertAlign w:val="baseline"/>
                 <w:lang w:val="en-US"/>
               </w:rPr>
-              <w:t>Hệ thống hiện giao diện gồm danh sách bài hát thành công.</w:t>
+              <w:t>Hệ thống hiện giao diện gồm danh sách nghệ sĩ thành công.</w:t>
             </w:r>
           </w:p>
           <w:p>
@@ -8675,7 +8651,7 @@
                 <w:vertAlign w:val="baseline"/>
                 <w:lang w:val="en-US"/>
               </w:rPr>
-              <w:t>Người dùng xem danh sách và tìm kiếm bài hát.</w:t>
+              <w:t>Người dùng xem danh sách và tìm kiếm nghệ sĩ.</w:t>
             </w:r>
           </w:p>
           <w:p>
@@ -8703,203 +8679,7 @@
                 <w:vertAlign w:val="baseline"/>
                 <w:lang w:val="en-US"/>
               </w:rPr>
-              <w:t>Người dùng chọn 1 bài hát.</w:t>
-            </w:r>
-          </w:p>
-          <w:p>
-            <w:pPr>
-              <w:widowControl w:val="0"/>
-              <w:numPr>
-                <w:ilvl w:val="0"/>
-                <w:numId w:val="53"/>
-              </w:numPr>
-              <w:ind w:left="0" w:leftChars="0" w:firstLine="0" w:firstLineChars="0"/>
-              <w:jc w:val="both"/>
-              <w:rPr>
-                <w:rFonts w:hint="default"/>
-                <w:sz w:val="32"/>
-                <w:szCs w:val="32"/>
-                <w:vertAlign w:val="baseline"/>
-                <w:lang w:val="en-US"/>
-              </w:rPr>
-            </w:pPr>
-            <w:r>
-              <w:rPr>
-                <w:rFonts w:hint="default"/>
-                <w:sz w:val="32"/>
-                <w:szCs w:val="32"/>
-                <w:vertAlign w:val="baseline"/>
-                <w:lang w:val="en-US"/>
-              </w:rPr>
-              <w:t>Người dùng có thể thực hiện các hành động tương tác xã hội như:</w:t>
-            </w:r>
-          </w:p>
-          <w:p>
-            <w:pPr>
-              <w:widowControl w:val="0"/>
-              <w:numPr>
-                <w:ilvl w:val="0"/>
-                <w:numId w:val="0"/>
-              </w:numPr>
-              <w:ind w:leftChars="0"/>
-              <w:jc w:val="both"/>
-              <w:rPr>
-                <w:rFonts w:hint="default"/>
-                <w:sz w:val="32"/>
-                <w:szCs w:val="32"/>
-                <w:vertAlign w:val="baseline"/>
-                <w:lang w:val="en-US"/>
-              </w:rPr>
-            </w:pPr>
-            <w:r>
-              <w:rPr>
-                <w:rFonts w:hint="default"/>
-                <w:sz w:val="32"/>
-                <w:szCs w:val="32"/>
-                <w:vertAlign w:val="baseline"/>
-                <w:lang w:val="en-US"/>
-              </w:rPr>
-              <w:t xml:space="preserve">     4.1/ Nếu người dùng chọn thích bài hát đó thì hệ thống sẽ thêm bài hát đó vào danh sách bài hát yêu thích của người dùng thành công.</w:t>
-            </w:r>
-          </w:p>
-          <w:p>
-            <w:pPr>
-              <w:widowControl w:val="0"/>
-              <w:numPr>
-                <w:ilvl w:val="0"/>
-                <w:numId w:val="0"/>
-              </w:numPr>
-              <w:ind w:leftChars="0"/>
-              <w:jc w:val="both"/>
-              <w:rPr>
-                <w:rFonts w:hint="default"/>
-                <w:sz w:val="32"/>
-                <w:szCs w:val="32"/>
-                <w:vertAlign w:val="baseline"/>
-                <w:lang w:val="en-US"/>
-              </w:rPr>
-            </w:pPr>
-            <w:r>
-              <w:rPr>
-                <w:rFonts w:hint="default"/>
-                <w:sz w:val="32"/>
-                <w:szCs w:val="32"/>
-                <w:vertAlign w:val="baseline"/>
-                <w:lang w:val="en-US"/>
-              </w:rPr>
-              <w:t xml:space="preserve">     4.2/ Nếu người dùng chọn bình luận thì hệ thống sẽ thêm bình luận đó vào danh sách bình luận và hiện lại danh sách sau khi cập nhật thành công.</w:t>
-            </w:r>
-          </w:p>
-          <w:p>
-            <w:pPr>
-              <w:widowControl w:val="0"/>
-              <w:numPr>
-                <w:ilvl w:val="0"/>
-                <w:numId w:val="0"/>
-              </w:numPr>
-              <w:ind w:leftChars="0"/>
-              <w:jc w:val="both"/>
-              <w:rPr>
-                <w:rFonts w:hint="default"/>
-                <w:sz w:val="32"/>
-                <w:szCs w:val="32"/>
-                <w:vertAlign w:val="baseline"/>
-                <w:lang w:val="en-US"/>
-              </w:rPr>
-            </w:pPr>
-            <w:r>
-              <w:rPr>
-                <w:rFonts w:hint="default"/>
-                <w:sz w:val="32"/>
-                <w:szCs w:val="32"/>
-                <w:vertAlign w:val="baseline"/>
-                <w:lang w:val="en-US"/>
-              </w:rPr>
-              <w:t xml:space="preserve">     4.3/ Nếu người dùng chọn chia sẻ bài hát thì chuyển sang Usecase Chia sẻ bài hát.</w:t>
-            </w:r>
-          </w:p>
-          <w:p>
-            <w:pPr>
-              <w:widowControl w:val="0"/>
-              <w:numPr>
-                <w:ilvl w:val="0"/>
-                <w:numId w:val="0"/>
-              </w:numPr>
-              <w:ind w:leftChars="0"/>
-              <w:jc w:val="both"/>
-              <w:rPr>
-                <w:rFonts w:hint="default"/>
-                <w:sz w:val="32"/>
-                <w:szCs w:val="32"/>
-                <w:vertAlign w:val="baseline"/>
-                <w:lang w:val="en-US"/>
-              </w:rPr>
-            </w:pPr>
-            <w:r>
-              <w:rPr>
-                <w:rFonts w:hint="default"/>
-                <w:sz w:val="32"/>
-                <w:szCs w:val="32"/>
-                <w:vertAlign w:val="baseline"/>
-                <w:lang w:val="en-US"/>
-              </w:rPr>
-              <w:t xml:space="preserve">     4.4/ Nếu người dùng chọn Đăng lại bài hát thì hệ thống sẽ ghi nhận và thêm bài hát đó vào hồ sơ cá nhân của người dùng thành công.</w:t>
-            </w:r>
-          </w:p>
-          <w:p>
-            <w:pPr>
-              <w:widowControl w:val="0"/>
-              <w:numPr>
-                <w:ilvl w:val="0"/>
-                <w:numId w:val="53"/>
-              </w:numPr>
-              <w:ind w:left="0" w:leftChars="0" w:firstLine="0" w:firstLineChars="0"/>
-              <w:jc w:val="both"/>
-              <w:rPr>
-                <w:rFonts w:hint="default"/>
-                <w:sz w:val="32"/>
-                <w:szCs w:val="32"/>
-                <w:vertAlign w:val="baseline"/>
-                <w:lang w:val="en-US"/>
-              </w:rPr>
-            </w:pPr>
-            <w:r>
-              <w:rPr>
-                <w:rFonts w:hint="default"/>
-                <w:sz w:val="32"/>
-                <w:szCs w:val="32"/>
-                <w:vertAlign w:val="baseline"/>
-                <w:lang w:val="en-US"/>
-              </w:rPr>
-              <w:t>Hệ thống ghi nhận hành động của người dùng và cập nhật lại số lượt thích, số bình luận, số lượt chia sẻ, số lượt đăng lại thành công.</w:t>
-            </w:r>
-          </w:p>
-          <w:p>
-            <w:pPr>
-              <w:widowControl w:val="0"/>
-              <w:numPr>
-                <w:ilvl w:val="0"/>
-                <w:numId w:val="53"/>
-              </w:numPr>
-              <w:ind w:left="0" w:leftChars="0" w:firstLine="0" w:firstLineChars="0"/>
-              <w:jc w:val="both"/>
-              <w:rPr>
-                <w:rFonts w:hint="default"/>
-                <w:sz w:val="32"/>
-                <w:szCs w:val="32"/>
-                <w:vertAlign w:val="baseline"/>
-                <w:lang w:val="en-US"/>
-              </w:rPr>
-            </w:pPr>
-            <w:r>
-              <w:rPr>
-                <w:rFonts w:hint="default"/>
-                <w:sz w:val="32"/>
-                <w:szCs w:val="32"/>
-                <w:vertAlign w:val="baseline"/>
-                <w:lang w:val="en-US"/>
-              </w:rPr>
-              <w:t>Hệ thống hiện lại giao diện với số lượt tương tác xã hội sau khi cập nhật thành công.</w:t>
+              <w:t>Người dùng có thể thực hiện Usecase Theo dõi nghệ sĩ khi chọn đúng nghệ sĩ mình muốn.</w:t>
             </w:r>
           </w:p>
         </w:tc>
@@ -8972,7 +8752,7 @@
                 <w:vertAlign w:val="baseline"/>
                 <w:lang w:val="en-US"/>
               </w:rPr>
-              <w:t>Nếu hệ thống hiện giao diện, ghi nhận hành động, cập nhật lại số lượt tương tác xã hội hoặc hiện lại số lượt tương tác xã hội sau khi cập nhật không thành công thì hệ thống thông báo lỗi đến người dùng.</w:t>
+              <w:t>Nếu hệ thống hiện giao diện không thành công thì hệ thống thông báo lỗi đến người dùng.</w:t>
             </w:r>
           </w:p>
         </w:tc>
@@ -9026,26 +8806,26 @@
               <w:widowControl w:val="0"/>
               <w:numPr>
                 <w:ilvl w:val="0"/>
-                <w:numId w:val="55"/>
-              </w:numPr>
-              <w:jc w:val="both"/>
-              <w:rPr>
-                <w:rFonts w:hint="default"/>
-                <w:sz w:val="32"/>
-                <w:szCs w:val="32"/>
-                <w:vertAlign w:val="baseline"/>
-                <w:lang w:val="en-US"/>
-              </w:rPr>
-            </w:pPr>
-            <w:r>
-              <w:rPr>
-                <w:rFonts w:hint="default"/>
-                <w:sz w:val="32"/>
-                <w:szCs w:val="32"/>
-                <w:vertAlign w:val="baseline"/>
-                <w:lang w:val="en-US"/>
-              </w:rPr>
-              <w:t>Người dùng đăng nhập thành công vào hệ thống.</w:t>
+                <w:numId w:val="0"/>
+              </w:numPr>
+              <w:jc w:val="both"/>
+              <w:rPr>
+                <w:rFonts w:hint="default"/>
+                <w:sz w:val="32"/>
+                <w:szCs w:val="32"/>
+                <w:vertAlign w:val="baseline"/>
+                <w:lang w:val="en-US"/>
+              </w:rPr>
+            </w:pPr>
+            <w:r>
+              <w:rPr>
+                <w:rFonts w:hint="default"/>
+                <w:sz w:val="32"/>
+                <w:szCs w:val="32"/>
+                <w:vertAlign w:val="baseline"/>
+                <w:lang w:val="en-US"/>
+              </w:rPr>
+              <w:t>Không có</w:t>
             </w:r>
           </w:p>
         </w:tc>
@@ -9099,26 +8879,26 @@
               <w:widowControl w:val="0"/>
               <w:numPr>
                 <w:ilvl w:val="0"/>
-                <w:numId w:val="56"/>
-              </w:numPr>
-              <w:jc w:val="both"/>
-              <w:rPr>
-                <w:rFonts w:hint="default"/>
-                <w:sz w:val="32"/>
-                <w:szCs w:val="32"/>
-                <w:vertAlign w:val="baseline"/>
-                <w:lang w:val="en-US"/>
-              </w:rPr>
-            </w:pPr>
-            <w:r>
-              <w:rPr>
-                <w:rFonts w:hint="default"/>
-                <w:sz w:val="32"/>
-                <w:szCs w:val="32"/>
-                <w:vertAlign w:val="baseline"/>
-                <w:lang w:val="en-US"/>
-              </w:rPr>
-              <w:t>Hệ thống sẵn sàng để thực hiện hành động tương tác xã hội tiếp theo của người dùng.</w:t>
+                <w:numId w:val="55"/>
+              </w:numPr>
+              <w:jc w:val="both"/>
+              <w:rPr>
+                <w:rFonts w:hint="default"/>
+                <w:sz w:val="32"/>
+                <w:szCs w:val="32"/>
+                <w:vertAlign w:val="baseline"/>
+                <w:lang w:val="en-US"/>
+              </w:rPr>
+            </w:pPr>
+            <w:r>
+              <w:rPr>
+                <w:rFonts w:hint="default"/>
+                <w:sz w:val="32"/>
+                <w:szCs w:val="32"/>
+                <w:vertAlign w:val="baseline"/>
+                <w:lang w:val="en-US"/>
+              </w:rPr>
+              <w:t>Hệ thống sẵn sàng để thực hiện yêu cầu tiếp theo của người dùng khi chọn đúng nghệ sĩ mình muốn.</w:t>
             </w:r>
           </w:p>
         </w:tc>
@@ -9150,7 +8930,7 @@
           <w:vertAlign w:val="baseline"/>
           <w:lang w:val="en-US"/>
         </w:rPr>
-        <w:t>Đặc tả Usecase Chia sẻ bài hát</w:t>
+        <w:t>Đặc tả Usecase Quản lý tương tác bài hát</w:t>
       </w:r>
     </w:p>
     <w:tbl>
@@ -9218,7 +8998,7 @@
                 <w:vertAlign w:val="baseline"/>
                 <w:lang w:val="en-US"/>
               </w:rPr>
-              <w:t>Tóm tắt: Usecase bắt đầu khi người dùng chọn chức năng Chia sẻ bài hát trong Tương tác xã hội. Hệ thống thực hiện chức năng Chia sẻ bài hát đến các nền tảng khác theo yêu cầu của người dùng.</w:t>
+              <w:t>Tóm tắt: Usecase bắt đầu khi người dùng muốn tương tác bài hát khi đang Xem danh sách và tìm kiếm bài hát. Hệ thống cho phép người thực hiện thích bài hát, bình luận, chia sẻ, đăng lại.</w:t>
             </w:r>
           </w:p>
         </w:tc>
@@ -9272,34 +9052,34 @@
               <w:widowControl w:val="0"/>
               <w:numPr>
                 <w:ilvl w:val="0"/>
-                <w:numId w:val="57"/>
-              </w:numPr>
-              <w:jc w:val="both"/>
-              <w:rPr>
-                <w:rFonts w:hint="default"/>
-                <w:sz w:val="32"/>
-                <w:szCs w:val="32"/>
-                <w:vertAlign w:val="baseline"/>
-                <w:lang w:val="en-US"/>
-              </w:rPr>
-            </w:pPr>
-            <w:r>
-              <w:rPr>
-                <w:rFonts w:hint="default"/>
-                <w:sz w:val="32"/>
-                <w:szCs w:val="32"/>
-                <w:vertAlign w:val="baseline"/>
-                <w:lang w:val="en-US"/>
-              </w:rPr>
-              <w:t>Hệ thống hiện giao diện để người dùng chọn nền tảng muốn chia sẻ đến thành công.</w:t>
-            </w:r>
-          </w:p>
-          <w:p>
-            <w:pPr>
-              <w:widowControl w:val="0"/>
-              <w:numPr>
-                <w:ilvl w:val="0"/>
-                <w:numId w:val="57"/>
+                <w:numId w:val="56"/>
+              </w:numPr>
+              <w:jc w:val="both"/>
+              <w:rPr>
+                <w:rFonts w:hint="default"/>
+                <w:sz w:val="32"/>
+                <w:szCs w:val="32"/>
+                <w:vertAlign w:val="baseline"/>
+                <w:lang w:val="en-US"/>
+              </w:rPr>
+            </w:pPr>
+            <w:r>
+              <w:rPr>
+                <w:rFonts w:hint="default"/>
+                <w:sz w:val="32"/>
+                <w:szCs w:val="32"/>
+                <w:vertAlign w:val="baseline"/>
+                <w:lang w:val="en-US"/>
+              </w:rPr>
+              <w:t>Hệ thống hiện giao diện gồm danh sách bài hát thành công.</w:t>
+            </w:r>
+          </w:p>
+          <w:p>
+            <w:pPr>
+              <w:widowControl w:val="0"/>
+              <w:numPr>
+                <w:ilvl w:val="0"/>
+                <w:numId w:val="56"/>
               </w:numPr>
               <w:ind w:left="0" w:leftChars="0" w:firstLine="0" w:firstLineChars="0"/>
               <w:jc w:val="both"/>
@@ -9319,15 +9099,15 @@
                 <w:vertAlign w:val="baseline"/>
                 <w:lang w:val="en-US"/>
               </w:rPr>
-              <w:t>Người dùng chọn nền tảng mình muốn chia sẻ.</w:t>
-            </w:r>
-          </w:p>
-          <w:p>
-            <w:pPr>
-              <w:widowControl w:val="0"/>
-              <w:numPr>
-                <w:ilvl w:val="0"/>
-                <w:numId w:val="57"/>
+              <w:t>Người dùng xem danh sách và tìm kiếm bài hát.</w:t>
+            </w:r>
+          </w:p>
+          <w:p>
+            <w:pPr>
+              <w:widowControl w:val="0"/>
+              <w:numPr>
+                <w:ilvl w:val="0"/>
+                <w:numId w:val="56"/>
               </w:numPr>
               <w:ind w:left="0" w:leftChars="0" w:firstLine="0" w:firstLineChars="0"/>
               <w:jc w:val="both"/>
@@ -9347,15 +9127,15 @@
                 <w:vertAlign w:val="baseline"/>
                 <w:lang w:val="en-US"/>
               </w:rPr>
-              <w:t>Hệ thống hiện ra các tài khoản trong nền tảng đó mà người dùng muốn chia sẻ đến thành công.</w:t>
-            </w:r>
-          </w:p>
-          <w:p>
-            <w:pPr>
-              <w:widowControl w:val="0"/>
-              <w:numPr>
-                <w:ilvl w:val="0"/>
-                <w:numId w:val="57"/>
+              <w:t>Người dùng chọn 1 bài hát.</w:t>
+            </w:r>
+          </w:p>
+          <w:p>
+            <w:pPr>
+              <w:widowControl w:val="0"/>
+              <w:numPr>
+                <w:ilvl w:val="0"/>
+                <w:numId w:val="56"/>
               </w:numPr>
               <w:ind w:left="0" w:leftChars="0" w:firstLine="0" w:firstLineChars="0"/>
               <w:jc w:val="both"/>
@@ -9375,15 +9155,127 @@
                 <w:vertAlign w:val="baseline"/>
                 <w:lang w:val="en-US"/>
               </w:rPr>
-              <w:t>Người dùng chọn tài khoản mình muốn chia sẻ và nhấn Chia sẻ.</w:t>
-            </w:r>
-          </w:p>
-          <w:p>
-            <w:pPr>
-              <w:widowControl w:val="0"/>
-              <w:numPr>
-                <w:ilvl w:val="0"/>
-                <w:numId w:val="57"/>
+              <w:t>Người dùng có thể thực hiện các hành động tương tác như:</w:t>
+            </w:r>
+          </w:p>
+          <w:p>
+            <w:pPr>
+              <w:widowControl w:val="0"/>
+              <w:numPr>
+                <w:ilvl w:val="0"/>
+                <w:numId w:val="0"/>
+              </w:numPr>
+              <w:ind w:leftChars="0"/>
+              <w:jc w:val="both"/>
+              <w:rPr>
+                <w:rFonts w:hint="default"/>
+                <w:sz w:val="32"/>
+                <w:szCs w:val="32"/>
+                <w:vertAlign w:val="baseline"/>
+                <w:lang w:val="en-US"/>
+              </w:rPr>
+            </w:pPr>
+            <w:r>
+              <w:rPr>
+                <w:rFonts w:hint="default"/>
+                <w:sz w:val="32"/>
+                <w:szCs w:val="32"/>
+                <w:vertAlign w:val="baseline"/>
+                <w:lang w:val="en-US"/>
+              </w:rPr>
+              <w:t xml:space="preserve">     4.1/ Nếu người dùng chọn thích bài hát đó thì hệ thống sẽ thêm bài hát đó vào danh sách bài hát yêu thích của người dùng thành công.</w:t>
+            </w:r>
+          </w:p>
+          <w:p>
+            <w:pPr>
+              <w:widowControl w:val="0"/>
+              <w:numPr>
+                <w:ilvl w:val="0"/>
+                <w:numId w:val="0"/>
+              </w:numPr>
+              <w:ind w:leftChars="0"/>
+              <w:jc w:val="both"/>
+              <w:rPr>
+                <w:rFonts w:hint="default"/>
+                <w:sz w:val="32"/>
+                <w:szCs w:val="32"/>
+                <w:vertAlign w:val="baseline"/>
+                <w:lang w:val="en-US"/>
+              </w:rPr>
+            </w:pPr>
+            <w:r>
+              <w:rPr>
+                <w:rFonts w:hint="default"/>
+                <w:sz w:val="32"/>
+                <w:szCs w:val="32"/>
+                <w:vertAlign w:val="baseline"/>
+                <w:lang w:val="en-US"/>
+              </w:rPr>
+              <w:t xml:space="preserve">     4.2/ Nếu người dùng chọn bình luận thì hệ thống sẽ thêm bình luận đó vào danh sách bình luận và hiện lại danh sách sau khi cập nhật thành công.</w:t>
+            </w:r>
+          </w:p>
+          <w:p>
+            <w:pPr>
+              <w:widowControl w:val="0"/>
+              <w:numPr>
+                <w:ilvl w:val="0"/>
+                <w:numId w:val="0"/>
+              </w:numPr>
+              <w:ind w:leftChars="0"/>
+              <w:jc w:val="both"/>
+              <w:rPr>
+                <w:rFonts w:hint="default"/>
+                <w:sz w:val="32"/>
+                <w:szCs w:val="32"/>
+                <w:vertAlign w:val="baseline"/>
+                <w:lang w:val="en-US"/>
+              </w:rPr>
+            </w:pPr>
+            <w:r>
+              <w:rPr>
+                <w:rFonts w:hint="default"/>
+                <w:sz w:val="32"/>
+                <w:szCs w:val="32"/>
+                <w:vertAlign w:val="baseline"/>
+                <w:lang w:val="en-US"/>
+              </w:rPr>
+              <w:t xml:space="preserve">     4.3/ Nếu người dùng chọn chia sẻ bài hát thì chuyển sang Usecase Chia sẻ bài hát.</w:t>
+            </w:r>
+          </w:p>
+          <w:p>
+            <w:pPr>
+              <w:widowControl w:val="0"/>
+              <w:numPr>
+                <w:ilvl w:val="0"/>
+                <w:numId w:val="0"/>
+              </w:numPr>
+              <w:ind w:leftChars="0"/>
+              <w:jc w:val="both"/>
+              <w:rPr>
+                <w:rFonts w:hint="default"/>
+                <w:sz w:val="32"/>
+                <w:szCs w:val="32"/>
+                <w:vertAlign w:val="baseline"/>
+                <w:lang w:val="en-US"/>
+              </w:rPr>
+            </w:pPr>
+            <w:r>
+              <w:rPr>
+                <w:rFonts w:hint="default"/>
+                <w:sz w:val="32"/>
+                <w:szCs w:val="32"/>
+                <w:vertAlign w:val="baseline"/>
+                <w:lang w:val="en-US"/>
+              </w:rPr>
+              <w:t xml:space="preserve">     4.4/ Nếu người dùng chọn Đăng lại bài hát thì hệ thống sẽ ghi nhận và thêm bài hát đó vào hồ sơ cá nhân của người dùng thành công.</w:t>
+            </w:r>
+          </w:p>
+          <w:p>
+            <w:pPr>
+              <w:widowControl w:val="0"/>
+              <w:numPr>
+                <w:ilvl w:val="0"/>
+                <w:numId w:val="56"/>
               </w:numPr>
               <w:ind w:left="0" w:leftChars="0" w:firstLine="0" w:firstLineChars="0"/>
               <w:jc w:val="both"/>
@@ -9403,15 +9295,15 @@
                 <w:vertAlign w:val="baseline"/>
                 <w:lang w:val="en-US"/>
               </w:rPr>
-              <w:t>Hệ thống chia sẻ đường dẫn của bài hát đó đến tài khoản của nền tảng mà người dùng chọn thành công.</w:t>
-            </w:r>
-          </w:p>
-          <w:p>
-            <w:pPr>
-              <w:widowControl w:val="0"/>
-              <w:numPr>
-                <w:ilvl w:val="0"/>
-                <w:numId w:val="57"/>
+              <w:t>Hệ thống ghi nhận hành động của người dùng và cập nhật lại số lượt thích, số bình luận, số lượt chia sẻ, số lượt đăng lại thành công.</w:t>
+            </w:r>
+          </w:p>
+          <w:p>
+            <w:pPr>
+              <w:widowControl w:val="0"/>
+              <w:numPr>
+                <w:ilvl w:val="0"/>
+                <w:numId w:val="56"/>
               </w:numPr>
               <w:ind w:left="0" w:leftChars="0" w:firstLine="0" w:firstLineChars="0"/>
               <w:jc w:val="both"/>
@@ -9431,63 +9323,7 @@
                 <w:vertAlign w:val="baseline"/>
                 <w:lang w:val="en-US"/>
               </w:rPr>
-              <w:t>Hệ thống ghi nhận hành động chia sẻ bài hát đến nền tảng đó của người dùng thành công.</w:t>
-            </w:r>
-          </w:p>
-          <w:p>
-            <w:pPr>
-              <w:widowControl w:val="0"/>
-              <w:numPr>
-                <w:ilvl w:val="0"/>
-                <w:numId w:val="57"/>
-              </w:numPr>
-              <w:ind w:left="0" w:leftChars="0" w:firstLine="0" w:firstLineChars="0"/>
-              <w:jc w:val="both"/>
-              <w:rPr>
-                <w:rFonts w:hint="default"/>
-                <w:sz w:val="32"/>
-                <w:szCs w:val="32"/>
-                <w:vertAlign w:val="baseline"/>
-                <w:lang w:val="en-US"/>
-              </w:rPr>
-            </w:pPr>
-            <w:r>
-              <w:rPr>
-                <w:rFonts w:hint="default"/>
-                <w:sz w:val="32"/>
-                <w:szCs w:val="32"/>
-                <w:vertAlign w:val="baseline"/>
-                <w:lang w:val="en-US"/>
-              </w:rPr>
-              <w:t>Hệ thống thông báo “Đã chia sẻ” đến người dùng thành công.</w:t>
-            </w:r>
-          </w:p>
-          <w:p>
-            <w:pPr>
-              <w:widowControl w:val="0"/>
-              <w:numPr>
-                <w:ilvl w:val="0"/>
-                <w:numId w:val="57"/>
-              </w:numPr>
-              <w:ind w:left="0" w:leftChars="0" w:firstLine="0" w:firstLineChars="0"/>
-              <w:jc w:val="both"/>
-              <w:rPr>
-                <w:rFonts w:hint="default"/>
-                <w:sz w:val="32"/>
-                <w:szCs w:val="32"/>
-                <w:vertAlign w:val="baseline"/>
-                <w:lang w:val="en-US"/>
-              </w:rPr>
-            </w:pPr>
-            <w:r>
-              <w:rPr>
-                <w:rFonts w:hint="default"/>
-                <w:sz w:val="32"/>
-                <w:szCs w:val="32"/>
-                <w:vertAlign w:val="baseline"/>
-                <w:lang w:val="en-US"/>
-              </w:rPr>
-              <w:t>Hệ thống hiện lại giao diện với số lượt chia sẻ sau khi cập nhật thành công.</w:t>
+              <w:t>Hệ thống hiện lại giao diện với số lượt tương tác sau khi cập nhật thành công.</w:t>
             </w:r>
           </w:p>
         </w:tc>
@@ -9541,26 +9377,26 @@
               <w:widowControl w:val="0"/>
               <w:numPr>
                 <w:ilvl w:val="0"/>
-                <w:numId w:val="58"/>
-              </w:numPr>
-              <w:jc w:val="both"/>
-              <w:rPr>
-                <w:rFonts w:hint="default"/>
-                <w:sz w:val="32"/>
-                <w:szCs w:val="32"/>
-                <w:vertAlign w:val="baseline"/>
-                <w:lang w:val="en-US"/>
-              </w:rPr>
-            </w:pPr>
-            <w:r>
-              <w:rPr>
-                <w:rFonts w:hint="default"/>
-                <w:sz w:val="32"/>
-                <w:szCs w:val="32"/>
-                <w:vertAlign w:val="baseline"/>
-                <w:lang w:val="en-US"/>
-              </w:rPr>
-              <w:t>Nếu hệ thống hiện giao diện, các tài khoản, chia sẻ đường dẫn, ghi nhận hành đồng, thông báo, hiện lại số lượt chia sẻ sau khi cập nhật không thành công thì hệ thống sẽ thông báo lỗi đến người dùng.</w:t>
+                <w:numId w:val="57"/>
+              </w:numPr>
+              <w:jc w:val="both"/>
+              <w:rPr>
+                <w:rFonts w:hint="default"/>
+                <w:sz w:val="32"/>
+                <w:szCs w:val="32"/>
+                <w:vertAlign w:val="baseline"/>
+                <w:lang w:val="en-US"/>
+              </w:rPr>
+            </w:pPr>
+            <w:r>
+              <w:rPr>
+                <w:rFonts w:hint="default"/>
+                <w:sz w:val="32"/>
+                <w:szCs w:val="32"/>
+                <w:vertAlign w:val="baseline"/>
+                <w:lang w:val="en-US"/>
+              </w:rPr>
+              <w:t>Nếu hệ thống hiện giao diện, ghi nhận hành động, cập nhật lại số lượt tương tác hoặc hiện lại số lượt tương tác sau khi cập nhật không thành công thì hệ thống thông báo lỗi đến người dùng.</w:t>
             </w:r>
           </w:p>
         </w:tc>
@@ -9614,7 +9450,7 @@
               <w:widowControl w:val="0"/>
               <w:numPr>
                 <w:ilvl w:val="0"/>
-                <w:numId w:val="59"/>
+                <w:numId w:val="58"/>
               </w:numPr>
               <w:jc w:val="both"/>
               <w:rPr>
@@ -9687,8 +9523,562 @@
               <w:widowControl w:val="0"/>
               <w:numPr>
                 <w:ilvl w:val="0"/>
+                <w:numId w:val="59"/>
+              </w:numPr>
+              <w:jc w:val="both"/>
+              <w:rPr>
+                <w:rFonts w:hint="default"/>
+                <w:sz w:val="32"/>
+                <w:szCs w:val="32"/>
+                <w:vertAlign w:val="baseline"/>
+                <w:lang w:val="en-US"/>
+              </w:rPr>
+            </w:pPr>
+            <w:r>
+              <w:rPr>
+                <w:rFonts w:hint="default"/>
+                <w:sz w:val="32"/>
+                <w:szCs w:val="32"/>
+                <w:vertAlign w:val="baseline"/>
+                <w:lang w:val="en-US"/>
+              </w:rPr>
+              <w:t>Hệ thống sẵn sàng để thực hiện hành động tương tác tiếp theo của người dùng.</w:t>
+            </w:r>
+          </w:p>
+        </w:tc>
+      </w:tr>
+    </w:tbl>
+    <w:p>
+      <w:pPr>
+        <w:rPr>
+          <w:sz w:val="32"/>
+          <w:szCs w:val="32"/>
+        </w:rPr>
+      </w:pPr>
+    </w:p>
+    <w:p>
+      <w:pPr>
+        <w:rPr>
+          <w:rFonts w:hint="default"/>
+          <w:sz w:val="32"/>
+          <w:szCs w:val="32"/>
+          <w:vertAlign w:val="baseline"/>
+          <w:lang w:val="en-US"/>
+        </w:rPr>
+      </w:pPr>
+      <w:r>
+        <w:rPr>
+          <w:rFonts w:hint="default"/>
+          <w:sz w:val="32"/>
+          <w:szCs w:val="32"/>
+          <w:vertAlign w:val="baseline"/>
+          <w:lang w:val="en-US"/>
+        </w:rPr>
+        <w:t>Đặc tả Usecase Chia sẻ bài hát</w:t>
+      </w:r>
+    </w:p>
+    <w:tbl>
+      <w:tblPr>
+        <w:tblStyle w:val="4"/>
+        <w:tblW w:w="0" w:type="auto"/>
+        <w:tblInd w:w="0" w:type="dxa"/>
+        <w:tblBorders>
+          <w:top w:val="single" w:color="auto" w:sz="4" w:space="0"/>
+          <w:left w:val="single" w:color="auto" w:sz="4" w:space="0"/>
+          <w:bottom w:val="single" w:color="auto" w:sz="4" w:space="0"/>
+          <w:right w:val="single" w:color="auto" w:sz="4" w:space="0"/>
+          <w:insideH w:val="single" w:color="auto" w:sz="4" w:space="0"/>
+          <w:insideV w:val="single" w:color="auto" w:sz="4" w:space="0"/>
+        </w:tblBorders>
+        <w:tblLayout w:type="autofit"/>
+        <w:tblCellMar>
+          <w:top w:w="0" w:type="dxa"/>
+          <w:left w:w="108" w:type="dxa"/>
+          <w:bottom w:w="0" w:type="dxa"/>
+          <w:right w:w="108" w:type="dxa"/>
+        </w:tblCellMar>
+      </w:tblPr>
+      <w:tblGrid>
+        <w:gridCol w:w="8522"/>
+      </w:tblGrid>
+      <w:tr>
+        <w:tblPrEx>
+          <w:tblBorders>
+            <w:top w:val="single" w:color="auto" w:sz="4" w:space="0"/>
+            <w:left w:val="single" w:color="auto" w:sz="4" w:space="0"/>
+            <w:bottom w:val="single" w:color="auto" w:sz="4" w:space="0"/>
+            <w:right w:val="single" w:color="auto" w:sz="4" w:space="0"/>
+            <w:insideH w:val="single" w:color="auto" w:sz="4" w:space="0"/>
+            <w:insideV w:val="single" w:color="auto" w:sz="4" w:space="0"/>
+          </w:tblBorders>
+        </w:tblPrEx>
+        <w:tc>
+          <w:tcPr>
+            <w:tcW w:w="8522" w:type="dxa"/>
+          </w:tcPr>
+          <w:p>
+            <w:pPr>
+              <w:widowControl w:val="0"/>
+              <w:jc w:val="both"/>
+              <w:rPr>
+                <w:rFonts w:hint="default"/>
+                <w:sz w:val="32"/>
+                <w:szCs w:val="32"/>
+                <w:vertAlign w:val="baseline"/>
+                <w:lang w:val="en-US"/>
+              </w:rPr>
+            </w:pPr>
+            <w:r>
+              <w:rPr>
+                <w:rFonts w:hint="default"/>
+                <w:sz w:val="32"/>
+                <w:szCs w:val="32"/>
+                <w:vertAlign w:val="baseline"/>
+                <w:lang w:val="en-US"/>
+              </w:rPr>
+              <w:t>Tóm tắt: Usecase bắt đầu khi người dùng chọn chức năng Chia sẻ bài hát trong Quản lý tương tác bài hát. Hệ thống thực hiện chức năng Chia sẻ bài hát đến các nền tảng khác theo yêu cầu của người dùng.</w:t>
+            </w:r>
+          </w:p>
+        </w:tc>
+      </w:tr>
+      <w:tr>
+        <w:tblPrEx>
+          <w:tblBorders>
+            <w:top w:val="single" w:color="auto" w:sz="4" w:space="0"/>
+            <w:left w:val="single" w:color="auto" w:sz="4" w:space="0"/>
+            <w:bottom w:val="single" w:color="auto" w:sz="4" w:space="0"/>
+            <w:right w:val="single" w:color="auto" w:sz="4" w:space="0"/>
+            <w:insideH w:val="single" w:color="auto" w:sz="4" w:space="0"/>
+            <w:insideV w:val="single" w:color="auto" w:sz="4" w:space="0"/>
+          </w:tblBorders>
+          <w:tblCellMar>
+            <w:top w:w="0" w:type="dxa"/>
+            <w:left w:w="108" w:type="dxa"/>
+            <w:bottom w:w="0" w:type="dxa"/>
+            <w:right w:w="108" w:type="dxa"/>
+          </w:tblCellMar>
+        </w:tblPrEx>
+        <w:tc>
+          <w:tcPr>
+            <w:tcW w:w="8522" w:type="dxa"/>
+          </w:tcPr>
+          <w:p>
+            <w:pPr>
+              <w:widowControl w:val="0"/>
+              <w:jc w:val="both"/>
+              <w:rPr>
+                <w:rFonts w:hint="default"/>
+                <w:sz w:val="32"/>
+                <w:szCs w:val="32"/>
+                <w:vertAlign w:val="baseline"/>
+                <w:lang w:val="en-US"/>
+              </w:rPr>
+            </w:pPr>
+            <w:r>
+              <w:rPr>
+                <w:rFonts w:hint="default"/>
+                <w:sz w:val="32"/>
+                <w:szCs w:val="32"/>
+                <w:vertAlign w:val="baseline"/>
+                <w:lang w:val="en-US"/>
+              </w:rPr>
+              <w:t xml:space="preserve">Dòng sự kiện chính: </w:t>
+            </w:r>
+          </w:p>
+          <w:p>
+            <w:pPr>
+              <w:widowControl w:val="0"/>
+              <w:numPr>
+                <w:ilvl w:val="0"/>
                 <w:numId w:val="60"/>
               </w:numPr>
+              <w:jc w:val="both"/>
+              <w:rPr>
+                <w:rFonts w:hint="default"/>
+                <w:sz w:val="32"/>
+                <w:szCs w:val="32"/>
+                <w:vertAlign w:val="baseline"/>
+                <w:lang w:val="en-US"/>
+              </w:rPr>
+            </w:pPr>
+            <w:r>
+              <w:rPr>
+                <w:rFonts w:hint="default"/>
+                <w:sz w:val="32"/>
+                <w:szCs w:val="32"/>
+                <w:vertAlign w:val="baseline"/>
+                <w:lang w:val="en-US"/>
+              </w:rPr>
+              <w:t>Hệ thống hiện giao diện để người dùng chọn nền tảng muốn chia sẻ đến thành công.</w:t>
+            </w:r>
+          </w:p>
+          <w:p>
+            <w:pPr>
+              <w:widowControl w:val="0"/>
+              <w:numPr>
+                <w:ilvl w:val="0"/>
+                <w:numId w:val="60"/>
+              </w:numPr>
+              <w:ind w:left="0" w:leftChars="0" w:firstLine="0" w:firstLineChars="0"/>
+              <w:jc w:val="both"/>
+              <w:rPr>
+                <w:rFonts w:hint="default"/>
+                <w:sz w:val="32"/>
+                <w:szCs w:val="32"/>
+                <w:vertAlign w:val="baseline"/>
+                <w:lang w:val="en-US"/>
+              </w:rPr>
+            </w:pPr>
+            <w:r>
+              <w:rPr>
+                <w:rFonts w:hint="default"/>
+                <w:sz w:val="32"/>
+                <w:szCs w:val="32"/>
+                <w:vertAlign w:val="baseline"/>
+                <w:lang w:val="en-US"/>
+              </w:rPr>
+              <w:t>Người dùng chọn nền tảng mình muốn chia sẻ.</w:t>
+            </w:r>
+          </w:p>
+          <w:p>
+            <w:pPr>
+              <w:widowControl w:val="0"/>
+              <w:numPr>
+                <w:ilvl w:val="0"/>
+                <w:numId w:val="60"/>
+              </w:numPr>
+              <w:ind w:left="0" w:leftChars="0" w:firstLine="0" w:firstLineChars="0"/>
+              <w:jc w:val="both"/>
+              <w:rPr>
+                <w:rFonts w:hint="default"/>
+                <w:sz w:val="32"/>
+                <w:szCs w:val="32"/>
+                <w:vertAlign w:val="baseline"/>
+                <w:lang w:val="en-US"/>
+              </w:rPr>
+            </w:pPr>
+            <w:r>
+              <w:rPr>
+                <w:rFonts w:hint="default"/>
+                <w:sz w:val="32"/>
+                <w:szCs w:val="32"/>
+                <w:vertAlign w:val="baseline"/>
+                <w:lang w:val="en-US"/>
+              </w:rPr>
+              <w:t>Hệ thống hiện ra các tài khoản trong nền tảng đó mà người dùng muốn chia sẻ đến thành công.</w:t>
+            </w:r>
+          </w:p>
+          <w:p>
+            <w:pPr>
+              <w:widowControl w:val="0"/>
+              <w:numPr>
+                <w:ilvl w:val="0"/>
+                <w:numId w:val="60"/>
+              </w:numPr>
+              <w:ind w:left="0" w:leftChars="0" w:firstLine="0" w:firstLineChars="0"/>
+              <w:jc w:val="both"/>
+              <w:rPr>
+                <w:rFonts w:hint="default"/>
+                <w:sz w:val="32"/>
+                <w:szCs w:val="32"/>
+                <w:vertAlign w:val="baseline"/>
+                <w:lang w:val="en-US"/>
+              </w:rPr>
+            </w:pPr>
+            <w:r>
+              <w:rPr>
+                <w:rFonts w:hint="default"/>
+                <w:sz w:val="32"/>
+                <w:szCs w:val="32"/>
+                <w:vertAlign w:val="baseline"/>
+                <w:lang w:val="en-US"/>
+              </w:rPr>
+              <w:t>Người dùng chọn tài khoản mình muốn chia sẻ và nhấn Chia sẻ.</w:t>
+            </w:r>
+          </w:p>
+          <w:p>
+            <w:pPr>
+              <w:widowControl w:val="0"/>
+              <w:numPr>
+                <w:ilvl w:val="0"/>
+                <w:numId w:val="60"/>
+              </w:numPr>
+              <w:ind w:left="0" w:leftChars="0" w:firstLine="0" w:firstLineChars="0"/>
+              <w:jc w:val="both"/>
+              <w:rPr>
+                <w:rFonts w:hint="default"/>
+                <w:sz w:val="32"/>
+                <w:szCs w:val="32"/>
+                <w:vertAlign w:val="baseline"/>
+                <w:lang w:val="en-US"/>
+              </w:rPr>
+            </w:pPr>
+            <w:r>
+              <w:rPr>
+                <w:rFonts w:hint="default"/>
+                <w:sz w:val="32"/>
+                <w:szCs w:val="32"/>
+                <w:vertAlign w:val="baseline"/>
+                <w:lang w:val="en-US"/>
+              </w:rPr>
+              <w:t>Hệ thống chia sẻ đường dẫn của bài hát đó đến tài khoản của nền tảng mà người dùng chọn thành công.</w:t>
+            </w:r>
+          </w:p>
+          <w:p>
+            <w:pPr>
+              <w:widowControl w:val="0"/>
+              <w:numPr>
+                <w:ilvl w:val="0"/>
+                <w:numId w:val="60"/>
+              </w:numPr>
+              <w:ind w:left="0" w:leftChars="0" w:firstLine="0" w:firstLineChars="0"/>
+              <w:jc w:val="both"/>
+              <w:rPr>
+                <w:rFonts w:hint="default"/>
+                <w:sz w:val="32"/>
+                <w:szCs w:val="32"/>
+                <w:vertAlign w:val="baseline"/>
+                <w:lang w:val="en-US"/>
+              </w:rPr>
+            </w:pPr>
+            <w:r>
+              <w:rPr>
+                <w:rFonts w:hint="default"/>
+                <w:sz w:val="32"/>
+                <w:szCs w:val="32"/>
+                <w:vertAlign w:val="baseline"/>
+                <w:lang w:val="en-US"/>
+              </w:rPr>
+              <w:t>Hệ thống ghi nhận hành động chia sẻ bài hát đến nền tảng đó của người dùng thành công.</w:t>
+            </w:r>
+          </w:p>
+          <w:p>
+            <w:pPr>
+              <w:widowControl w:val="0"/>
+              <w:numPr>
+                <w:ilvl w:val="0"/>
+                <w:numId w:val="60"/>
+              </w:numPr>
+              <w:ind w:left="0" w:leftChars="0" w:firstLine="0" w:firstLineChars="0"/>
+              <w:jc w:val="both"/>
+              <w:rPr>
+                <w:rFonts w:hint="default"/>
+                <w:sz w:val="32"/>
+                <w:szCs w:val="32"/>
+                <w:vertAlign w:val="baseline"/>
+                <w:lang w:val="en-US"/>
+              </w:rPr>
+            </w:pPr>
+            <w:r>
+              <w:rPr>
+                <w:rFonts w:hint="default"/>
+                <w:sz w:val="32"/>
+                <w:szCs w:val="32"/>
+                <w:vertAlign w:val="baseline"/>
+                <w:lang w:val="en-US"/>
+              </w:rPr>
+              <w:t>Hệ thống thông báo “Đã chia sẻ” đến người dùng thành công.</w:t>
+            </w:r>
+          </w:p>
+        </w:tc>
+      </w:tr>
+      <w:tr>
+        <w:tblPrEx>
+          <w:tblBorders>
+            <w:top w:val="single" w:color="auto" w:sz="4" w:space="0"/>
+            <w:left w:val="single" w:color="auto" w:sz="4" w:space="0"/>
+            <w:bottom w:val="single" w:color="auto" w:sz="4" w:space="0"/>
+            <w:right w:val="single" w:color="auto" w:sz="4" w:space="0"/>
+            <w:insideH w:val="single" w:color="auto" w:sz="4" w:space="0"/>
+            <w:insideV w:val="single" w:color="auto" w:sz="4" w:space="0"/>
+          </w:tblBorders>
+          <w:tblCellMar>
+            <w:top w:w="0" w:type="dxa"/>
+            <w:left w:w="108" w:type="dxa"/>
+            <w:bottom w:w="0" w:type="dxa"/>
+            <w:right w:w="108" w:type="dxa"/>
+          </w:tblCellMar>
+        </w:tblPrEx>
+        <w:tc>
+          <w:tcPr>
+            <w:tcW w:w="8522" w:type="dxa"/>
+          </w:tcPr>
+          <w:p>
+            <w:pPr>
+              <w:widowControl w:val="0"/>
+              <w:jc w:val="both"/>
+              <w:rPr>
+                <w:rFonts w:hint="default"/>
+                <w:sz w:val="32"/>
+                <w:szCs w:val="32"/>
+                <w:vertAlign w:val="baseline"/>
+                <w:lang w:val="en-US"/>
+              </w:rPr>
+            </w:pPr>
+            <w:r>
+              <w:rPr>
+                <w:rFonts w:hint="default"/>
+                <w:sz w:val="32"/>
+                <w:szCs w:val="32"/>
+                <w:vertAlign w:val="baseline"/>
+                <w:lang w:val="en-US"/>
+              </w:rPr>
+              <w:t>Dòng sự kiện phụ:</w:t>
+            </w:r>
+          </w:p>
+          <w:p>
+            <w:pPr>
+              <w:widowControl w:val="0"/>
+              <w:numPr>
+                <w:ilvl w:val="0"/>
+                <w:numId w:val="61"/>
+              </w:numPr>
+              <w:jc w:val="both"/>
+              <w:rPr>
+                <w:rFonts w:hint="default"/>
+                <w:sz w:val="32"/>
+                <w:szCs w:val="32"/>
+                <w:vertAlign w:val="baseline"/>
+                <w:lang w:val="en-US"/>
+              </w:rPr>
+            </w:pPr>
+            <w:r>
+              <w:rPr>
+                <w:rFonts w:hint="default"/>
+                <w:sz w:val="32"/>
+                <w:szCs w:val="32"/>
+                <w:vertAlign w:val="baseline"/>
+                <w:lang w:val="en-US"/>
+              </w:rPr>
+              <w:t>Nếu hệ thống hiện giao diện, các tài khoản, chia sẻ đường dẫn, ghi nhận hành đồng, thông báo, hiện lại số lượt chia sẻ sau khi cập nhật không thành công thì hệ thống sẽ thông báo lỗi đến người dùng.</w:t>
+            </w:r>
+          </w:p>
+        </w:tc>
+      </w:tr>
+      <w:tr>
+        <w:tblPrEx>
+          <w:tblBorders>
+            <w:top w:val="single" w:color="auto" w:sz="4" w:space="0"/>
+            <w:left w:val="single" w:color="auto" w:sz="4" w:space="0"/>
+            <w:bottom w:val="single" w:color="auto" w:sz="4" w:space="0"/>
+            <w:right w:val="single" w:color="auto" w:sz="4" w:space="0"/>
+            <w:insideH w:val="single" w:color="auto" w:sz="4" w:space="0"/>
+            <w:insideV w:val="single" w:color="auto" w:sz="4" w:space="0"/>
+          </w:tblBorders>
+          <w:tblCellMar>
+            <w:top w:w="0" w:type="dxa"/>
+            <w:left w:w="108" w:type="dxa"/>
+            <w:bottom w:w="0" w:type="dxa"/>
+            <w:right w:w="108" w:type="dxa"/>
+          </w:tblCellMar>
+        </w:tblPrEx>
+        <w:tc>
+          <w:tcPr>
+            <w:tcW w:w="8522" w:type="dxa"/>
+          </w:tcPr>
+          <w:p>
+            <w:pPr>
+              <w:widowControl w:val="0"/>
+              <w:jc w:val="both"/>
+              <w:rPr>
+                <w:rFonts w:hint="default"/>
+                <w:sz w:val="32"/>
+                <w:szCs w:val="32"/>
+                <w:vertAlign w:val="baseline"/>
+                <w:lang w:val="en-US"/>
+              </w:rPr>
+            </w:pPr>
+            <w:r>
+              <w:rPr>
+                <w:rFonts w:hint="default"/>
+                <w:sz w:val="32"/>
+                <w:szCs w:val="32"/>
+                <w:vertAlign w:val="baseline"/>
+                <w:lang w:val="en-US"/>
+              </w:rPr>
+              <w:t xml:space="preserve">Tiền điều kiện: </w:t>
+            </w:r>
+          </w:p>
+          <w:p>
+            <w:pPr>
+              <w:widowControl w:val="0"/>
+              <w:numPr>
+                <w:ilvl w:val="0"/>
+                <w:numId w:val="62"/>
+              </w:numPr>
+              <w:jc w:val="both"/>
+              <w:rPr>
+                <w:rFonts w:hint="default"/>
+                <w:sz w:val="32"/>
+                <w:szCs w:val="32"/>
+                <w:vertAlign w:val="baseline"/>
+                <w:lang w:val="en-US"/>
+              </w:rPr>
+            </w:pPr>
+            <w:r>
+              <w:rPr>
+                <w:rFonts w:hint="default"/>
+                <w:sz w:val="32"/>
+                <w:szCs w:val="32"/>
+                <w:vertAlign w:val="baseline"/>
+                <w:lang w:val="en-US"/>
+              </w:rPr>
+              <w:t>Người dùng đăng nhập thành công vào hệ thống.</w:t>
+            </w:r>
+          </w:p>
+        </w:tc>
+      </w:tr>
+      <w:tr>
+        <w:tblPrEx>
+          <w:tblBorders>
+            <w:top w:val="single" w:color="auto" w:sz="4" w:space="0"/>
+            <w:left w:val="single" w:color="auto" w:sz="4" w:space="0"/>
+            <w:bottom w:val="single" w:color="auto" w:sz="4" w:space="0"/>
+            <w:right w:val="single" w:color="auto" w:sz="4" w:space="0"/>
+            <w:insideH w:val="single" w:color="auto" w:sz="4" w:space="0"/>
+            <w:insideV w:val="single" w:color="auto" w:sz="4" w:space="0"/>
+          </w:tblBorders>
+          <w:tblCellMar>
+            <w:top w:w="0" w:type="dxa"/>
+            <w:left w:w="108" w:type="dxa"/>
+            <w:bottom w:w="0" w:type="dxa"/>
+            <w:right w:w="108" w:type="dxa"/>
+          </w:tblCellMar>
+        </w:tblPrEx>
+        <w:tc>
+          <w:tcPr>
+            <w:tcW w:w="8522" w:type="dxa"/>
+          </w:tcPr>
+          <w:p>
+            <w:pPr>
+              <w:widowControl w:val="0"/>
+              <w:jc w:val="both"/>
+              <w:rPr>
+                <w:rFonts w:hint="default"/>
+                <w:sz w:val="32"/>
+                <w:szCs w:val="32"/>
+                <w:vertAlign w:val="baseline"/>
+                <w:lang w:val="en-US"/>
+              </w:rPr>
+            </w:pPr>
+            <w:r>
+              <w:rPr>
+                <w:rFonts w:hint="default"/>
+                <w:sz w:val="32"/>
+                <w:szCs w:val="32"/>
+                <w:vertAlign w:val="baseline"/>
+                <w:lang w:val="en-US"/>
+              </w:rPr>
+              <w:t xml:space="preserve">Hậu điều kiện: </w:t>
+            </w:r>
+          </w:p>
+          <w:p>
+            <w:pPr>
+              <w:widowControl w:val="0"/>
+              <w:numPr>
+                <w:ilvl w:val="0"/>
+                <w:numId w:val="63"/>
+              </w:numPr>
               <w:ind w:leftChars="0"/>
               <w:jc w:val="both"/>
               <w:rPr>
@@ -9707,7 +10097,7 @@
                 <w:vertAlign w:val="baseline"/>
                 <w:lang w:val="en-US"/>
               </w:rPr>
-              <w:t>Hệ thống sẵn sàng thực hiện yêu cầu tương tác xã hội tiếp theo mà người dùng yêu cầu.</w:t>
+              <w:t>Hệ thống trở lại giao diện bài hát mà người dùng đã tương tác.</w:t>
             </w:r>
           </w:p>
         </w:tc>
@@ -9864,7 +10254,7 @@
               <w:widowControl w:val="0"/>
               <w:numPr>
                 <w:ilvl w:val="0"/>
-                <w:numId w:val="61"/>
+                <w:numId w:val="64"/>
               </w:numPr>
               <w:ind w:leftChars="0"/>
               <w:jc w:val="both"/>
@@ -9884,15 +10274,15 @@
                 <w:vertAlign w:val="baseline"/>
                 <w:lang w:val="en-US"/>
               </w:rPr>
-              <w:t>Hệ thống hiện giao diện hồ sơ cá nhân của người dùng và các nút chức năng để người dùng chọn.</w:t>
-            </w:r>
-          </w:p>
-          <w:p>
-            <w:pPr>
-              <w:widowControl w:val="0"/>
-              <w:numPr>
-                <w:ilvl w:val="0"/>
-                <w:numId w:val="61"/>
+              <w:t>Hệ thống hiện giao diện hồ sơ cá nhân của người dùng và các nút chức năng để người dùng chọn thành công.</w:t>
+            </w:r>
+          </w:p>
+          <w:p>
+            <w:pPr>
+              <w:widowControl w:val="0"/>
+              <w:numPr>
+                <w:ilvl w:val="0"/>
+                <w:numId w:val="64"/>
               </w:numPr>
               <w:ind w:leftChars="0"/>
               <w:jc w:val="both"/>
@@ -9920,7 +10310,7 @@
               <w:widowControl w:val="0"/>
               <w:numPr>
                 <w:ilvl w:val="0"/>
-                <w:numId w:val="61"/>
+                <w:numId w:val="64"/>
               </w:numPr>
               <w:ind w:leftChars="0"/>
               <w:jc w:val="both"/>
@@ -9994,7 +10384,7 @@
                 <w:vertAlign w:val="baseline"/>
                 <w:lang w:val="en-US"/>
               </w:rPr>
-              <w:t xml:space="preserve">     3.2/ Xem danh sách và tìm kiếm bài hát yêu thích. Hệ thống chuyển sang giao diện gồm danh sách các bài hát mà người dùng đã thích thành công.</w:t>
+              <w:t xml:space="preserve">     3.2/ Xem danh sách và tìm kiếm bài hát yêu thích (chuyển sang Usecase Xem danh sách và tìm kiếm bài hát yêu thích).</w:t>
             </w:r>
           </w:p>
           <w:p>
@@ -10022,6 +10412,34 @@
                 <w:lang w:val="en-US"/>
               </w:rPr>
               <w:t xml:space="preserve">     3.3/ Người dùng có thể thực hiện các chức năng như thích, bình luận, chia sẻ, huỷ đăng lại đối với các bài hát đã đăng lại. Hệ thống sẽ ghi nhận các chức năng người dùng đã thực hiện và hiện lại giao diện hồ sơ cá nhân sau khi cập nhật thành công.</w:t>
+            </w:r>
+          </w:p>
+          <w:p>
+            <w:pPr>
+              <w:widowControl w:val="0"/>
+              <w:numPr>
+                <w:ilvl w:val="0"/>
+                <w:numId w:val="64"/>
+              </w:numPr>
+              <w:ind w:left="0" w:leftChars="0" w:firstLine="0" w:firstLineChars="0"/>
+              <w:jc w:val="both"/>
+              <w:rPr>
+                <w:rFonts w:hint="default"/>
+                <w:sz w:val="32"/>
+                <w:szCs w:val="32"/>
+                <w:vertAlign w:val="baseline"/>
+                <w:lang w:val="en-US"/>
+              </w:rPr>
+            </w:pPr>
+            <w:r>
+              <w:rPr>
+                <w:rFonts w:hint="default"/>
+                <w:sz w:val="32"/>
+                <w:szCs w:val="32"/>
+                <w:vertAlign w:val="baseline"/>
+                <w:lang w:val="en-US"/>
+              </w:rPr>
+              <w:t>Hệ thống hiện lại giao diện với hồ sơ cá nhân sau khi cập nhật thành công.</w:t>
             </w:r>
           </w:p>
         </w:tc>
@@ -10075,7 +10493,7 @@
               <w:widowControl w:val="0"/>
               <w:numPr>
                 <w:ilvl w:val="0"/>
-                <w:numId w:val="62"/>
+                <w:numId w:val="65"/>
               </w:numPr>
               <w:jc w:val="both"/>
               <w:rPr>
@@ -10148,7 +10566,7 @@
               <w:widowControl w:val="0"/>
               <w:numPr>
                 <w:ilvl w:val="0"/>
-                <w:numId w:val="63"/>
+                <w:numId w:val="66"/>
               </w:numPr>
               <w:jc w:val="both"/>
               <w:rPr>
@@ -10221,7 +10639,7 @@
               <w:widowControl w:val="0"/>
               <w:numPr>
                 <w:ilvl w:val="0"/>
-                <w:numId w:val="64"/>
+                <w:numId w:val="67"/>
               </w:numPr>
               <w:ind w:leftChars="0"/>
               <w:jc w:val="both"/>
@@ -10242,6 +10660,485 @@
                 <w:lang w:val="en-US"/>
               </w:rPr>
               <w:t>Hệ thống sẵn sàng thực hiện yêu cầu chỉnh sửa tiếp theo mà người dùng yêu cầu.</w:t>
+            </w:r>
+          </w:p>
+        </w:tc>
+      </w:tr>
+    </w:tbl>
+    <w:p>
+      <w:pPr>
+        <w:rPr>
+          <w:rFonts w:hint="default"/>
+          <w:sz w:val="32"/>
+          <w:szCs w:val="32"/>
+          <w:vertAlign w:val="baseline"/>
+          <w:lang w:val="en-US"/>
+        </w:rPr>
+      </w:pPr>
+    </w:p>
+    <w:p>
+      <w:pPr>
+        <w:rPr>
+          <w:rFonts w:hint="default"/>
+          <w:sz w:val="32"/>
+          <w:szCs w:val="32"/>
+          <w:vertAlign w:val="baseline"/>
+          <w:lang w:val="en-US"/>
+        </w:rPr>
+      </w:pPr>
+      <w:r>
+        <w:rPr>
+          <w:rFonts w:hint="default"/>
+          <w:sz w:val="32"/>
+          <w:szCs w:val="32"/>
+          <w:vertAlign w:val="baseline"/>
+          <w:lang w:val="en-US"/>
+        </w:rPr>
+        <w:t>Đặc tả Usecase Xem danh sách và tìm kiếm bài hát yêu thích</w:t>
+      </w:r>
+    </w:p>
+    <w:tbl>
+      <w:tblPr>
+        <w:tblStyle w:val="4"/>
+        <w:tblW w:w="0" w:type="auto"/>
+        <w:tblInd w:w="0" w:type="dxa"/>
+        <w:tblBorders>
+          <w:top w:val="single" w:color="auto" w:sz="4" w:space="0"/>
+          <w:left w:val="single" w:color="auto" w:sz="4" w:space="0"/>
+          <w:bottom w:val="single" w:color="auto" w:sz="4" w:space="0"/>
+          <w:right w:val="single" w:color="auto" w:sz="4" w:space="0"/>
+          <w:insideH w:val="single" w:color="auto" w:sz="4" w:space="0"/>
+          <w:insideV w:val="single" w:color="auto" w:sz="4" w:space="0"/>
+        </w:tblBorders>
+        <w:tblLayout w:type="autofit"/>
+        <w:tblCellMar>
+          <w:top w:w="0" w:type="dxa"/>
+          <w:left w:w="108" w:type="dxa"/>
+          <w:bottom w:w="0" w:type="dxa"/>
+          <w:right w:w="108" w:type="dxa"/>
+        </w:tblCellMar>
+      </w:tblPr>
+      <w:tblGrid>
+        <w:gridCol w:w="8522"/>
+      </w:tblGrid>
+      <w:tr>
+        <w:tblPrEx>
+          <w:tblBorders>
+            <w:top w:val="single" w:color="auto" w:sz="4" w:space="0"/>
+            <w:left w:val="single" w:color="auto" w:sz="4" w:space="0"/>
+            <w:bottom w:val="single" w:color="auto" w:sz="4" w:space="0"/>
+            <w:right w:val="single" w:color="auto" w:sz="4" w:space="0"/>
+            <w:insideH w:val="single" w:color="auto" w:sz="4" w:space="0"/>
+            <w:insideV w:val="single" w:color="auto" w:sz="4" w:space="0"/>
+          </w:tblBorders>
+          <w:tblCellMar>
+            <w:top w:w="0" w:type="dxa"/>
+            <w:left w:w="108" w:type="dxa"/>
+            <w:bottom w:w="0" w:type="dxa"/>
+            <w:right w:w="108" w:type="dxa"/>
+          </w:tblCellMar>
+        </w:tblPrEx>
+        <w:tc>
+          <w:tcPr>
+            <w:tcW w:w="8522" w:type="dxa"/>
+          </w:tcPr>
+          <w:p>
+            <w:pPr>
+              <w:widowControl w:val="0"/>
+              <w:jc w:val="both"/>
+              <w:rPr>
+                <w:rFonts w:hint="default"/>
+                <w:sz w:val="32"/>
+                <w:szCs w:val="32"/>
+                <w:vertAlign w:val="baseline"/>
+                <w:lang w:val="en-US"/>
+              </w:rPr>
+            </w:pPr>
+            <w:r>
+              <w:rPr>
+                <w:rFonts w:hint="default"/>
+                <w:sz w:val="32"/>
+                <w:szCs w:val="32"/>
+                <w:vertAlign w:val="baseline"/>
+                <w:lang w:val="en-US"/>
+              </w:rPr>
+              <w:t>Tóm tắt: Usecase bắt đầu khi người dùng chọn chức năng Xem danh sách và tìm kiếm bài hát yêu thích trong Quản lý hồ sơ cá nhân. Hệ thống cho phép người dùng xem danh sách và tìm kiếm bài hát yêu thích trong hồ sơ cá nhân.</w:t>
+            </w:r>
+          </w:p>
+        </w:tc>
+      </w:tr>
+      <w:tr>
+        <w:tblPrEx>
+          <w:tblBorders>
+            <w:top w:val="single" w:color="auto" w:sz="4" w:space="0"/>
+            <w:left w:val="single" w:color="auto" w:sz="4" w:space="0"/>
+            <w:bottom w:val="single" w:color="auto" w:sz="4" w:space="0"/>
+            <w:right w:val="single" w:color="auto" w:sz="4" w:space="0"/>
+            <w:insideH w:val="single" w:color="auto" w:sz="4" w:space="0"/>
+            <w:insideV w:val="single" w:color="auto" w:sz="4" w:space="0"/>
+          </w:tblBorders>
+          <w:tblCellMar>
+            <w:top w:w="0" w:type="dxa"/>
+            <w:left w:w="108" w:type="dxa"/>
+            <w:bottom w:w="0" w:type="dxa"/>
+            <w:right w:w="108" w:type="dxa"/>
+          </w:tblCellMar>
+        </w:tblPrEx>
+        <w:tc>
+          <w:tcPr>
+            <w:tcW w:w="8522" w:type="dxa"/>
+          </w:tcPr>
+          <w:p>
+            <w:pPr>
+              <w:widowControl w:val="0"/>
+              <w:jc w:val="both"/>
+              <w:rPr>
+                <w:rFonts w:hint="default"/>
+                <w:sz w:val="32"/>
+                <w:szCs w:val="32"/>
+                <w:vertAlign w:val="baseline"/>
+                <w:lang w:val="en-US"/>
+              </w:rPr>
+            </w:pPr>
+            <w:r>
+              <w:rPr>
+                <w:rFonts w:hint="default"/>
+                <w:sz w:val="32"/>
+                <w:szCs w:val="32"/>
+                <w:vertAlign w:val="baseline"/>
+                <w:lang w:val="en-US"/>
+              </w:rPr>
+              <w:t xml:space="preserve">Dòng sự kiện chính: </w:t>
+            </w:r>
+          </w:p>
+          <w:p>
+            <w:pPr>
+              <w:widowControl w:val="0"/>
+              <w:numPr>
+                <w:ilvl w:val="0"/>
+                <w:numId w:val="68"/>
+              </w:numPr>
+              <w:jc w:val="both"/>
+              <w:rPr>
+                <w:rFonts w:hint="default"/>
+                <w:sz w:val="32"/>
+                <w:szCs w:val="32"/>
+                <w:vertAlign w:val="baseline"/>
+                <w:lang w:val="en-US"/>
+              </w:rPr>
+            </w:pPr>
+            <w:r>
+              <w:rPr>
+                <w:rFonts w:hint="default"/>
+                <w:sz w:val="32"/>
+                <w:szCs w:val="32"/>
+                <w:vertAlign w:val="baseline"/>
+                <w:lang w:val="en-US"/>
+              </w:rPr>
+              <w:t>Hệ thống hiện giao diện gồm danh sách các bài hát mà người dùng đã thích và các nút chức năng thành công.</w:t>
+            </w:r>
+          </w:p>
+          <w:p>
+            <w:pPr>
+              <w:widowControl w:val="0"/>
+              <w:numPr>
+                <w:ilvl w:val="0"/>
+                <w:numId w:val="68"/>
+              </w:numPr>
+              <w:ind w:left="0" w:leftChars="0" w:firstLine="0" w:firstLineChars="0"/>
+              <w:jc w:val="both"/>
+              <w:rPr>
+                <w:rFonts w:hint="default"/>
+                <w:sz w:val="32"/>
+                <w:szCs w:val="32"/>
+                <w:vertAlign w:val="baseline"/>
+                <w:lang w:val="en-US"/>
+              </w:rPr>
+            </w:pPr>
+            <w:r>
+              <w:rPr>
+                <w:rFonts w:hint="default"/>
+                <w:sz w:val="32"/>
+                <w:szCs w:val="32"/>
+                <w:vertAlign w:val="baseline"/>
+                <w:lang w:val="en-US"/>
+              </w:rPr>
+              <w:t>Người dùng xem danh sách và tìm kiếm bài hát yêu thích.</w:t>
+            </w:r>
+          </w:p>
+          <w:p>
+            <w:pPr>
+              <w:widowControl w:val="0"/>
+              <w:numPr>
+                <w:ilvl w:val="0"/>
+                <w:numId w:val="68"/>
+              </w:numPr>
+              <w:ind w:left="0" w:leftChars="0" w:firstLine="0" w:firstLineChars="0"/>
+              <w:jc w:val="both"/>
+              <w:rPr>
+                <w:rFonts w:hint="default"/>
+                <w:sz w:val="32"/>
+                <w:szCs w:val="32"/>
+                <w:vertAlign w:val="baseline"/>
+                <w:lang w:val="en-US"/>
+              </w:rPr>
+            </w:pPr>
+            <w:r>
+              <w:rPr>
+                <w:rFonts w:hint="default"/>
+                <w:sz w:val="32"/>
+                <w:szCs w:val="32"/>
+                <w:vertAlign w:val="baseline"/>
+                <w:lang w:val="en-US"/>
+              </w:rPr>
+              <w:t>Người dùng có thể thực hiện Usecase Quản lý tương tác bài hát khi chọn đúng bài hát mình muốn.</w:t>
+            </w:r>
+          </w:p>
+          <w:p>
+            <w:pPr>
+              <w:widowControl w:val="0"/>
+              <w:numPr>
+                <w:ilvl w:val="0"/>
+                <w:numId w:val="68"/>
+              </w:numPr>
+              <w:ind w:left="0" w:leftChars="0" w:firstLine="0" w:firstLineChars="0"/>
+              <w:jc w:val="both"/>
+              <w:rPr>
+                <w:rFonts w:hint="default"/>
+                <w:sz w:val="32"/>
+                <w:szCs w:val="32"/>
+                <w:vertAlign w:val="baseline"/>
+                <w:lang w:val="en-US"/>
+              </w:rPr>
+            </w:pPr>
+            <w:r>
+              <w:rPr>
+                <w:rFonts w:hint="default"/>
+                <w:sz w:val="32"/>
+                <w:szCs w:val="32"/>
+                <w:vertAlign w:val="baseline"/>
+                <w:lang w:val="en-US"/>
+              </w:rPr>
+              <w:t>Hệ thống ghi nhận hành động của người dùng khi tương tác với bài hát yêu thích đó thành công.</w:t>
+            </w:r>
+          </w:p>
+        </w:tc>
+      </w:tr>
+      <w:tr>
+        <w:tblPrEx>
+          <w:tblBorders>
+            <w:top w:val="single" w:color="auto" w:sz="4" w:space="0"/>
+            <w:left w:val="single" w:color="auto" w:sz="4" w:space="0"/>
+            <w:bottom w:val="single" w:color="auto" w:sz="4" w:space="0"/>
+            <w:right w:val="single" w:color="auto" w:sz="4" w:space="0"/>
+            <w:insideH w:val="single" w:color="auto" w:sz="4" w:space="0"/>
+            <w:insideV w:val="single" w:color="auto" w:sz="4" w:space="0"/>
+          </w:tblBorders>
+          <w:tblCellMar>
+            <w:top w:w="0" w:type="dxa"/>
+            <w:left w:w="108" w:type="dxa"/>
+            <w:bottom w:w="0" w:type="dxa"/>
+            <w:right w:w="108" w:type="dxa"/>
+          </w:tblCellMar>
+        </w:tblPrEx>
+        <w:tc>
+          <w:tcPr>
+            <w:tcW w:w="8522" w:type="dxa"/>
+          </w:tcPr>
+          <w:p>
+            <w:pPr>
+              <w:widowControl w:val="0"/>
+              <w:jc w:val="both"/>
+              <w:rPr>
+                <w:rFonts w:hint="default"/>
+                <w:sz w:val="32"/>
+                <w:szCs w:val="32"/>
+                <w:vertAlign w:val="baseline"/>
+                <w:lang w:val="en-US"/>
+              </w:rPr>
+            </w:pPr>
+            <w:r>
+              <w:rPr>
+                <w:rFonts w:hint="default"/>
+                <w:sz w:val="32"/>
+                <w:szCs w:val="32"/>
+                <w:vertAlign w:val="baseline"/>
+                <w:lang w:val="en-US"/>
+              </w:rPr>
+              <w:t>Dòng sự kiện phụ:</w:t>
+            </w:r>
+          </w:p>
+          <w:p>
+            <w:pPr>
+              <w:widowControl w:val="0"/>
+              <w:numPr>
+                <w:ilvl w:val="0"/>
+                <w:numId w:val="69"/>
+              </w:numPr>
+              <w:jc w:val="both"/>
+              <w:rPr>
+                <w:rFonts w:hint="default"/>
+                <w:sz w:val="32"/>
+                <w:szCs w:val="32"/>
+                <w:vertAlign w:val="baseline"/>
+                <w:lang w:val="en-US"/>
+              </w:rPr>
+            </w:pPr>
+            <w:r>
+              <w:rPr>
+                <w:rFonts w:hint="default"/>
+                <w:sz w:val="32"/>
+                <w:szCs w:val="32"/>
+                <w:vertAlign w:val="baseline"/>
+                <w:lang w:val="en-US"/>
+              </w:rPr>
+              <w:t>Nếu hệ thống hiện giao diện hoặc ghi nhận không thành công thì hệ thống thông báo lỗi đến người dùng.</w:t>
+            </w:r>
+          </w:p>
+        </w:tc>
+      </w:tr>
+      <w:tr>
+        <w:tblPrEx>
+          <w:tblBorders>
+            <w:top w:val="single" w:color="auto" w:sz="4" w:space="0"/>
+            <w:left w:val="single" w:color="auto" w:sz="4" w:space="0"/>
+            <w:bottom w:val="single" w:color="auto" w:sz="4" w:space="0"/>
+            <w:right w:val="single" w:color="auto" w:sz="4" w:space="0"/>
+            <w:insideH w:val="single" w:color="auto" w:sz="4" w:space="0"/>
+            <w:insideV w:val="single" w:color="auto" w:sz="4" w:space="0"/>
+          </w:tblBorders>
+          <w:tblCellMar>
+            <w:top w:w="0" w:type="dxa"/>
+            <w:left w:w="108" w:type="dxa"/>
+            <w:bottom w:w="0" w:type="dxa"/>
+            <w:right w:w="108" w:type="dxa"/>
+          </w:tblCellMar>
+        </w:tblPrEx>
+        <w:tc>
+          <w:tcPr>
+            <w:tcW w:w="8522" w:type="dxa"/>
+          </w:tcPr>
+          <w:p>
+            <w:pPr>
+              <w:widowControl w:val="0"/>
+              <w:jc w:val="both"/>
+              <w:rPr>
+                <w:rFonts w:hint="default"/>
+                <w:sz w:val="32"/>
+                <w:szCs w:val="32"/>
+                <w:vertAlign w:val="baseline"/>
+                <w:lang w:val="en-US"/>
+              </w:rPr>
+            </w:pPr>
+            <w:r>
+              <w:rPr>
+                <w:rFonts w:hint="default"/>
+                <w:sz w:val="32"/>
+                <w:szCs w:val="32"/>
+                <w:vertAlign w:val="baseline"/>
+                <w:lang w:val="en-US"/>
+              </w:rPr>
+              <w:t xml:space="preserve">Tiền điều kiện: </w:t>
+            </w:r>
+          </w:p>
+          <w:p>
+            <w:pPr>
+              <w:widowControl w:val="0"/>
+              <w:numPr>
+                <w:ilvl w:val="0"/>
+                <w:numId w:val="70"/>
+              </w:numPr>
+              <w:jc w:val="both"/>
+              <w:rPr>
+                <w:rFonts w:hint="default"/>
+                <w:sz w:val="32"/>
+                <w:szCs w:val="32"/>
+                <w:vertAlign w:val="baseline"/>
+                <w:lang w:val="en-US"/>
+              </w:rPr>
+            </w:pPr>
+            <w:r>
+              <w:rPr>
+                <w:rFonts w:hint="default"/>
+                <w:sz w:val="32"/>
+                <w:szCs w:val="32"/>
+                <w:vertAlign w:val="baseline"/>
+                <w:lang w:val="en-US"/>
+              </w:rPr>
+              <w:t>Người dùng đăng nhập thành công vào hệ thống.</w:t>
+            </w:r>
+          </w:p>
+        </w:tc>
+      </w:tr>
+      <w:tr>
+        <w:tblPrEx>
+          <w:tblBorders>
+            <w:top w:val="single" w:color="auto" w:sz="4" w:space="0"/>
+            <w:left w:val="single" w:color="auto" w:sz="4" w:space="0"/>
+            <w:bottom w:val="single" w:color="auto" w:sz="4" w:space="0"/>
+            <w:right w:val="single" w:color="auto" w:sz="4" w:space="0"/>
+            <w:insideH w:val="single" w:color="auto" w:sz="4" w:space="0"/>
+            <w:insideV w:val="single" w:color="auto" w:sz="4" w:space="0"/>
+          </w:tblBorders>
+          <w:tblCellMar>
+            <w:top w:w="0" w:type="dxa"/>
+            <w:left w:w="108" w:type="dxa"/>
+            <w:bottom w:w="0" w:type="dxa"/>
+            <w:right w:w="108" w:type="dxa"/>
+          </w:tblCellMar>
+        </w:tblPrEx>
+        <w:tc>
+          <w:tcPr>
+            <w:tcW w:w="8522" w:type="dxa"/>
+          </w:tcPr>
+          <w:p>
+            <w:pPr>
+              <w:widowControl w:val="0"/>
+              <w:jc w:val="both"/>
+              <w:rPr>
+                <w:rFonts w:hint="default"/>
+                <w:sz w:val="32"/>
+                <w:szCs w:val="32"/>
+                <w:vertAlign w:val="baseline"/>
+                <w:lang w:val="en-US"/>
+              </w:rPr>
+            </w:pPr>
+            <w:r>
+              <w:rPr>
+                <w:rFonts w:hint="default"/>
+                <w:sz w:val="32"/>
+                <w:szCs w:val="32"/>
+                <w:vertAlign w:val="baseline"/>
+                <w:lang w:val="en-US"/>
+              </w:rPr>
+              <w:t xml:space="preserve">Hậu điều kiện: </w:t>
+            </w:r>
+          </w:p>
+          <w:p>
+            <w:pPr>
+              <w:widowControl w:val="0"/>
+              <w:numPr>
+                <w:ilvl w:val="0"/>
+                <w:numId w:val="71"/>
+              </w:numPr>
+              <w:jc w:val="both"/>
+              <w:rPr>
+                <w:rFonts w:hint="default"/>
+                <w:sz w:val="32"/>
+                <w:szCs w:val="32"/>
+                <w:vertAlign w:val="baseline"/>
+                <w:lang w:val="en-US"/>
+              </w:rPr>
+            </w:pPr>
+            <w:r>
+              <w:rPr>
+                <w:rFonts w:hint="default"/>
+                <w:sz w:val="32"/>
+                <w:szCs w:val="32"/>
+                <w:vertAlign w:val="baseline"/>
+                <w:lang w:val="en-US"/>
+              </w:rPr>
+              <w:t>Hệ thống sẵn sàng để thực hiện yêu cầu tiếp theo của người dùng khi chọn đúng bài hát mình muốn.</w:t>
             </w:r>
           </w:p>
         </w:tc>
@@ -10395,7 +11292,7 @@
               <w:widowControl w:val="0"/>
               <w:numPr>
                 <w:ilvl w:val="0"/>
-                <w:numId w:val="65"/>
+                <w:numId w:val="72"/>
               </w:numPr>
               <w:jc w:val="both"/>
               <w:rPr>
@@ -10422,7 +11319,7 @@
               <w:widowControl w:val="0"/>
               <w:numPr>
                 <w:ilvl w:val="0"/>
-                <w:numId w:val="65"/>
+                <w:numId w:val="72"/>
               </w:numPr>
               <w:ind w:left="0" w:leftChars="0" w:firstLine="0" w:firstLineChars="0"/>
               <w:jc w:val="both"/>
@@ -10450,7 +11347,7 @@
               <w:widowControl w:val="0"/>
               <w:numPr>
                 <w:ilvl w:val="0"/>
-                <w:numId w:val="65"/>
+                <w:numId w:val="72"/>
               </w:numPr>
               <w:ind w:left="0" w:leftChars="0" w:firstLine="0" w:firstLineChars="0"/>
               <w:jc w:val="both"/>
@@ -10524,7 +11421,7 @@
               <w:widowControl w:val="0"/>
               <w:numPr>
                 <w:ilvl w:val="0"/>
-                <w:numId w:val="66"/>
+                <w:numId w:val="73"/>
               </w:numPr>
               <w:jc w:val="both"/>
               <w:rPr>
@@ -10597,7 +11494,7 @@
               <w:widowControl w:val="0"/>
               <w:numPr>
                 <w:ilvl w:val="0"/>
-                <w:numId w:val="67"/>
+                <w:numId w:val="74"/>
               </w:numPr>
               <w:jc w:val="both"/>
               <w:rPr>
@@ -10670,7 +11567,7 @@
               <w:widowControl w:val="0"/>
               <w:numPr>
                 <w:ilvl w:val="0"/>
-                <w:numId w:val="68"/>
+                <w:numId w:val="75"/>
               </w:numPr>
               <w:jc w:val="both"/>
               <w:rPr>
@@ -10843,7 +11740,7 @@
               <w:widowControl w:val="0"/>
               <w:numPr>
                 <w:ilvl w:val="0"/>
-                <w:numId w:val="69"/>
+                <w:numId w:val="76"/>
               </w:numPr>
               <w:jc w:val="both"/>
               <w:rPr>
@@ -10870,7 +11767,7 @@
               <w:widowControl w:val="0"/>
               <w:numPr>
                 <w:ilvl w:val="0"/>
-                <w:numId w:val="69"/>
+                <w:numId w:val="76"/>
               </w:numPr>
               <w:ind w:left="0" w:leftChars="0" w:firstLine="0" w:firstLineChars="0"/>
               <w:jc w:val="both"/>
@@ -10898,7 +11795,7 @@
               <w:widowControl w:val="0"/>
               <w:numPr>
                 <w:ilvl w:val="0"/>
-                <w:numId w:val="69"/>
+                <w:numId w:val="76"/>
               </w:numPr>
               <w:ind w:left="0" w:leftChars="0" w:firstLine="0" w:firstLineChars="0"/>
               <w:jc w:val="both"/>
@@ -11010,7 +11907,7 @@
               <w:widowControl w:val="0"/>
               <w:numPr>
                 <w:ilvl w:val="0"/>
-                <w:numId w:val="69"/>
+                <w:numId w:val="76"/>
               </w:numPr>
               <w:ind w:left="0" w:leftChars="0" w:firstLine="0" w:firstLineChars="0"/>
               <w:jc w:val="both"/>
@@ -11084,7 +11981,7 @@
               <w:widowControl w:val="0"/>
               <w:numPr>
                 <w:ilvl w:val="0"/>
-                <w:numId w:val="70"/>
+                <w:numId w:val="77"/>
               </w:numPr>
               <w:jc w:val="both"/>
               <w:rPr>
@@ -11157,7 +12054,7 @@
               <w:widowControl w:val="0"/>
               <w:numPr>
                 <w:ilvl w:val="0"/>
-                <w:numId w:val="71"/>
+                <w:numId w:val="78"/>
               </w:numPr>
               <w:jc w:val="both"/>
               <w:rPr>
@@ -11184,7 +12081,7 @@
               <w:widowControl w:val="0"/>
               <w:numPr>
                 <w:ilvl w:val="0"/>
-                <w:numId w:val="71"/>
+                <w:numId w:val="78"/>
               </w:numPr>
               <w:jc w:val="both"/>
               <w:rPr>
@@ -11257,7 +12154,7 @@
               <w:widowControl w:val="0"/>
               <w:numPr>
                 <w:ilvl w:val="0"/>
-                <w:numId w:val="72"/>
+                <w:numId w:val="79"/>
               </w:numPr>
               <w:ind w:leftChars="0"/>
               <w:jc w:val="both"/>
@@ -11431,7 +12328,7 @@
               <w:widowControl w:val="0"/>
               <w:numPr>
                 <w:ilvl w:val="0"/>
-                <w:numId w:val="73"/>
+                <w:numId w:val="80"/>
               </w:numPr>
               <w:jc w:val="both"/>
               <w:rPr>
@@ -11458,7 +12355,7 @@
               <w:widowControl w:val="0"/>
               <w:numPr>
                 <w:ilvl w:val="0"/>
-                <w:numId w:val="73"/>
+                <w:numId w:val="80"/>
               </w:numPr>
               <w:ind w:left="0" w:leftChars="0" w:firstLine="0" w:firstLineChars="0"/>
               <w:jc w:val="both"/>
@@ -11486,7 +12383,7 @@
               <w:widowControl w:val="0"/>
               <w:numPr>
                 <w:ilvl w:val="0"/>
-                <w:numId w:val="73"/>
+                <w:numId w:val="80"/>
               </w:numPr>
               <w:ind w:left="0" w:leftChars="0" w:firstLine="0" w:firstLineChars="0"/>
               <w:jc w:val="both"/>
@@ -11560,7 +12457,7 @@
               <w:widowControl w:val="0"/>
               <w:numPr>
                 <w:ilvl w:val="0"/>
-                <w:numId w:val="74"/>
+                <w:numId w:val="81"/>
               </w:numPr>
               <w:jc w:val="both"/>
               <w:rPr>
@@ -11633,7 +12530,7 @@
               <w:widowControl w:val="0"/>
               <w:numPr>
                 <w:ilvl w:val="0"/>
-                <w:numId w:val="75"/>
+                <w:numId w:val="82"/>
               </w:numPr>
               <w:jc w:val="both"/>
               <w:rPr>
@@ -11706,7 +12603,7 @@
               <w:widowControl w:val="0"/>
               <w:numPr>
                 <w:ilvl w:val="0"/>
-                <w:numId w:val="76"/>
+                <w:numId w:val="83"/>
               </w:numPr>
               <w:ind w:leftChars="0"/>
               <w:jc w:val="both"/>
@@ -11880,7 +12777,7 @@
               <w:widowControl w:val="0"/>
               <w:numPr>
                 <w:ilvl w:val="0"/>
-                <w:numId w:val="77"/>
+                <w:numId w:val="84"/>
               </w:numPr>
               <w:jc w:val="both"/>
               <w:rPr>
@@ -11907,7 +12804,7 @@
               <w:widowControl w:val="0"/>
               <w:numPr>
                 <w:ilvl w:val="0"/>
-                <w:numId w:val="77"/>
+                <w:numId w:val="84"/>
               </w:numPr>
               <w:ind w:left="0" w:leftChars="0" w:firstLine="0" w:firstLineChars="0"/>
               <w:jc w:val="both"/>
@@ -12019,7 +12916,7 @@
               <w:widowControl w:val="0"/>
               <w:numPr>
                 <w:ilvl w:val="0"/>
-                <w:numId w:val="77"/>
+                <w:numId w:val="84"/>
               </w:numPr>
               <w:ind w:left="0" w:leftChars="0" w:firstLine="0" w:firstLineChars="0"/>
               <w:jc w:val="both"/>
@@ -12093,7 +12990,7 @@
               <w:widowControl w:val="0"/>
               <w:numPr>
                 <w:ilvl w:val="0"/>
-                <w:numId w:val="78"/>
+                <w:numId w:val="85"/>
               </w:numPr>
               <w:jc w:val="both"/>
               <w:rPr>
@@ -12166,7 +13063,7 @@
               <w:widowControl w:val="0"/>
               <w:numPr>
                 <w:ilvl w:val="0"/>
-                <w:numId w:val="79"/>
+                <w:numId w:val="86"/>
               </w:numPr>
               <w:jc w:val="both"/>
               <w:rPr>
@@ -12193,7 +13090,7 @@
               <w:widowControl w:val="0"/>
               <w:numPr>
                 <w:ilvl w:val="0"/>
-                <w:numId w:val="79"/>
+                <w:numId w:val="86"/>
               </w:numPr>
               <w:ind w:left="0" w:leftChars="0" w:firstLine="0" w:firstLineChars="0"/>
               <w:jc w:val="both"/>
@@ -12267,7 +13164,7 @@
               <w:widowControl w:val="0"/>
               <w:numPr>
                 <w:ilvl w:val="0"/>
-                <w:numId w:val="80"/>
+                <w:numId w:val="87"/>
               </w:numPr>
               <w:ind w:leftChars="0"/>
               <w:jc w:val="both"/>
@@ -12441,7 +13338,7 @@
               <w:widowControl w:val="0"/>
               <w:numPr>
                 <w:ilvl w:val="0"/>
-                <w:numId w:val="81"/>
+                <w:numId w:val="88"/>
               </w:numPr>
               <w:jc w:val="both"/>
               <w:rPr>
@@ -12468,7 +13365,7 @@
               <w:widowControl w:val="0"/>
               <w:numPr>
                 <w:ilvl w:val="0"/>
-                <w:numId w:val="81"/>
+                <w:numId w:val="88"/>
               </w:numPr>
               <w:ind w:left="0" w:leftChars="0" w:firstLine="0" w:firstLineChars="0"/>
               <w:jc w:val="both"/>
@@ -12496,7 +13393,7 @@
               <w:widowControl w:val="0"/>
               <w:numPr>
                 <w:ilvl w:val="0"/>
-                <w:numId w:val="81"/>
+                <w:numId w:val="88"/>
               </w:numPr>
               <w:ind w:left="0" w:leftChars="0" w:firstLine="0" w:firstLineChars="0"/>
               <w:jc w:val="both"/>
@@ -12569,6 +13466,7 @@
             <w:pPr>
               <w:widowControl w:val="0"/>
               <w:numPr>
+                <w:ilvl w:val="0"/>
                 <w:numId w:val="0"/>
               </w:numPr>
               <w:jc w:val="both"/>
@@ -12642,7 +13540,7 @@
               <w:widowControl w:val="0"/>
               <w:numPr>
                 <w:ilvl w:val="0"/>
-                <w:numId w:val="82"/>
+                <w:numId w:val="89"/>
               </w:numPr>
               <w:jc w:val="both"/>
               <w:rPr>
@@ -12715,7 +13613,7 @@
               <w:widowControl w:val="0"/>
               <w:numPr>
                 <w:ilvl w:val="0"/>
-                <w:numId w:val="83"/>
+                <w:numId w:val="90"/>
               </w:numPr>
               <w:jc w:val="both"/>
               <w:rPr>
@@ -12888,7 +13786,7 @@
               <w:widowControl w:val="0"/>
               <w:numPr>
                 <w:ilvl w:val="0"/>
-                <w:numId w:val="84"/>
+                <w:numId w:val="91"/>
               </w:numPr>
               <w:jc w:val="both"/>
               <w:rPr>
@@ -12915,7 +13813,7 @@
               <w:widowControl w:val="0"/>
               <w:numPr>
                 <w:ilvl w:val="0"/>
-                <w:numId w:val="84"/>
+                <w:numId w:val="91"/>
               </w:numPr>
               <w:ind w:left="0" w:leftChars="0" w:firstLine="0" w:firstLineChars="0"/>
               <w:jc w:val="both"/>
@@ -12943,7 +13841,7 @@
               <w:widowControl w:val="0"/>
               <w:numPr>
                 <w:ilvl w:val="0"/>
-                <w:numId w:val="84"/>
+                <w:numId w:val="91"/>
               </w:numPr>
               <w:ind w:left="0" w:leftChars="0" w:firstLine="0" w:firstLineChars="0"/>
               <w:jc w:val="both"/>
@@ -13017,7 +13915,7 @@
               <w:widowControl w:val="0"/>
               <w:numPr>
                 <w:ilvl w:val="0"/>
-                <w:numId w:val="85"/>
+                <w:numId w:val="92"/>
               </w:numPr>
               <w:jc w:val="both"/>
               <w:rPr>
@@ -13090,7 +13988,7 @@
               <w:widowControl w:val="0"/>
               <w:numPr>
                 <w:ilvl w:val="0"/>
-                <w:numId w:val="86"/>
+                <w:numId w:val="93"/>
               </w:numPr>
               <w:jc w:val="both"/>
               <w:rPr>
@@ -13163,7 +14061,7 @@
               <w:widowControl w:val="0"/>
               <w:numPr>
                 <w:ilvl w:val="0"/>
-                <w:numId w:val="87"/>
+                <w:numId w:val="94"/>
               </w:numPr>
               <w:ind w:leftChars="0"/>
               <w:jc w:val="both"/>
@@ -13270,6 +14168,18 @@
     </w:lvl>
   </w:abstractNum>
   <w:abstractNum w:abstractNumId="5">
+    <w:nsid w:val="86AA190F"/>
+    <w:multiLevelType w:val="singleLevel"/>
+    <w:tmpl w:val="86AA190F"/>
+    <w:lvl w:ilvl="0" w:tentative="0">
+      <w:start w:val="1"/>
+      <w:numFmt w:val="decimal"/>
+      <w:suff w:val="space"/>
+      <w:lvlText w:val="%1."/>
+      <w:lvlJc w:val="left"/>
+    </w:lvl>
+  </w:abstractNum>
+  <w:abstractNum w:abstractNumId="6">
     <w:nsid w:val="87971B54"/>
     <w:multiLevelType w:val="singleLevel"/>
     <w:tmpl w:val="87971B54"/>
@@ -13281,7 +14191,7 @@
       <w:lvlJc w:val="left"/>
     </w:lvl>
   </w:abstractNum>
-  <w:abstractNum w:abstractNumId="6">
+  <w:abstractNum w:abstractNumId="7">
     <w:nsid w:val="88643244"/>
     <w:multiLevelType w:val="singleLevel"/>
     <w:tmpl w:val="88643244"/>
@@ -13293,7 +14203,7 @@
       <w:lvlJc w:val="left"/>
     </w:lvl>
   </w:abstractNum>
-  <w:abstractNum w:abstractNumId="7">
+  <w:abstractNum w:abstractNumId="8">
     <w:nsid w:val="8883A999"/>
     <w:multiLevelType w:val="singleLevel"/>
     <w:tmpl w:val="8883A999"/>
@@ -13305,7 +14215,7 @@
       <w:lvlJc w:val="left"/>
     </w:lvl>
   </w:abstractNum>
-  <w:abstractNum w:abstractNumId="8">
+  <w:abstractNum w:abstractNumId="9">
     <w:nsid w:val="8C749FB7"/>
     <w:multiLevelType w:val="singleLevel"/>
     <w:tmpl w:val="8C749FB7"/>
@@ -13317,7 +14227,7 @@
       <w:lvlJc w:val="left"/>
     </w:lvl>
   </w:abstractNum>
-  <w:abstractNum w:abstractNumId="9">
+  <w:abstractNum w:abstractNumId="10">
     <w:nsid w:val="8DBC8CEF"/>
     <w:multiLevelType w:val="singleLevel"/>
     <w:tmpl w:val="8DBC8CEF"/>
@@ -13329,7 +14239,7 @@
       <w:lvlJc w:val="left"/>
     </w:lvl>
   </w:abstractNum>
-  <w:abstractNum w:abstractNumId="10">
+  <w:abstractNum w:abstractNumId="11">
     <w:nsid w:val="92EF6321"/>
     <w:multiLevelType w:val="singleLevel"/>
     <w:tmpl w:val="92EF6321"/>
@@ -13341,7 +14251,7 @@
       <w:lvlJc w:val="left"/>
     </w:lvl>
   </w:abstractNum>
-  <w:abstractNum w:abstractNumId="11">
+  <w:abstractNum w:abstractNumId="12">
     <w:nsid w:val="94F60664"/>
     <w:multiLevelType w:val="singleLevel"/>
     <w:tmpl w:val="94F60664"/>
@@ -13353,7 +14263,7 @@
       <w:lvlJc w:val="left"/>
     </w:lvl>
   </w:abstractNum>
-  <w:abstractNum w:abstractNumId="12">
+  <w:abstractNum w:abstractNumId="13">
     <w:nsid w:val="98985596"/>
     <w:multiLevelType w:val="singleLevel"/>
     <w:tmpl w:val="98985596"/>
@@ -13365,7 +14275,7 @@
       <w:lvlJc w:val="left"/>
     </w:lvl>
   </w:abstractNum>
-  <w:abstractNum w:abstractNumId="13">
+  <w:abstractNum w:abstractNumId="14">
     <w:nsid w:val="9AE6EC4F"/>
     <w:multiLevelType w:val="singleLevel"/>
     <w:tmpl w:val="9AE6EC4F"/>
@@ -13377,7 +14287,7 @@
       <w:lvlJc w:val="left"/>
     </w:lvl>
   </w:abstractNum>
-  <w:abstractNum w:abstractNumId="14">
+  <w:abstractNum w:abstractNumId="15">
     <w:nsid w:val="9E09ABE2"/>
     <w:multiLevelType w:val="multilevel"/>
     <w:tmpl w:val="9E09ABE2"/>
@@ -13517,7 +14427,7 @@
       </w:rPr>
     </w:lvl>
   </w:abstractNum>
-  <w:abstractNum w:abstractNumId="15">
+  <w:abstractNum w:abstractNumId="16">
     <w:nsid w:val="A3C3D122"/>
     <w:multiLevelType w:val="singleLevel"/>
     <w:tmpl w:val="A3C3D122"/>
@@ -13529,7 +14439,7 @@
       <w:lvlJc w:val="left"/>
     </w:lvl>
   </w:abstractNum>
-  <w:abstractNum w:abstractNumId="16">
+  <w:abstractNum w:abstractNumId="17">
     <w:nsid w:val="A47B5E06"/>
     <w:multiLevelType w:val="singleLevel"/>
     <w:tmpl w:val="A47B5E06"/>
@@ -13541,7 +14451,7 @@
       <w:lvlJc w:val="left"/>
     </w:lvl>
   </w:abstractNum>
-  <w:abstractNum w:abstractNumId="17">
+  <w:abstractNum w:abstractNumId="18">
     <w:nsid w:val="A5D72E53"/>
     <w:multiLevelType w:val="multilevel"/>
     <w:tmpl w:val="A5D72E53"/>
@@ -13681,7 +14591,7 @@
       </w:rPr>
     </w:lvl>
   </w:abstractNum>
-  <w:abstractNum w:abstractNumId="18">
+  <w:abstractNum w:abstractNumId="19">
     <w:nsid w:val="A8A349C5"/>
     <w:multiLevelType w:val="singleLevel"/>
     <w:tmpl w:val="A8A349C5"/>
@@ -13693,7 +14603,7 @@
       <w:lvlJc w:val="left"/>
     </w:lvl>
   </w:abstractNum>
-  <w:abstractNum w:abstractNumId="19">
+  <w:abstractNum w:abstractNumId="20">
     <w:nsid w:val="AB2CD29A"/>
     <w:multiLevelType w:val="singleLevel"/>
     <w:tmpl w:val="AB2CD29A"/>
@@ -13705,7 +14615,7 @@
       <w:lvlJc w:val="left"/>
     </w:lvl>
   </w:abstractNum>
-  <w:abstractNum w:abstractNumId="20">
+  <w:abstractNum w:abstractNumId="21">
     <w:nsid w:val="B0E25511"/>
     <w:multiLevelType w:val="singleLevel"/>
     <w:tmpl w:val="B0E25511"/>
@@ -13721,7 +14631,7 @@
       </w:pPr>
     </w:lvl>
   </w:abstractNum>
-  <w:abstractNum w:abstractNumId="21">
+  <w:abstractNum w:abstractNumId="22">
     <w:nsid w:val="B3C2315F"/>
     <w:multiLevelType w:val="singleLevel"/>
     <w:tmpl w:val="B3C2315F"/>
@@ -13733,7 +14643,7 @@
       <w:lvlJc w:val="left"/>
     </w:lvl>
   </w:abstractNum>
-  <w:abstractNum w:abstractNumId="22">
+  <w:abstractNum w:abstractNumId="23">
     <w:nsid w:val="B52C055F"/>
     <w:multiLevelType w:val="multilevel"/>
     <w:tmpl w:val="B52C055F"/>
@@ -13873,7 +14783,7 @@
       </w:rPr>
     </w:lvl>
   </w:abstractNum>
-  <w:abstractNum w:abstractNumId="23">
+  <w:abstractNum w:abstractNumId="24">
     <w:nsid w:val="B6407F19"/>
     <w:multiLevelType w:val="singleLevel"/>
     <w:tmpl w:val="B6407F19"/>
@@ -13885,7 +14795,7 @@
       <w:lvlJc w:val="left"/>
     </w:lvl>
   </w:abstractNum>
-  <w:abstractNum w:abstractNumId="24">
+  <w:abstractNum w:abstractNumId="25">
     <w:nsid w:val="B7529E00"/>
     <w:multiLevelType w:val="singleLevel"/>
     <w:tmpl w:val="B7529E00"/>
@@ -13897,7 +14807,7 @@
       <w:lvlJc w:val="left"/>
     </w:lvl>
   </w:abstractNum>
-  <w:abstractNum w:abstractNumId="25">
+  <w:abstractNum w:abstractNumId="26">
     <w:nsid w:val="B8276521"/>
     <w:multiLevelType w:val="singleLevel"/>
     <w:tmpl w:val="B8276521"/>
@@ -13909,7 +14819,7 @@
       <w:lvlJc w:val="left"/>
     </w:lvl>
   </w:abstractNum>
-  <w:abstractNum w:abstractNumId="26">
+  <w:abstractNum w:abstractNumId="27">
     <w:nsid w:val="B9B3F82F"/>
     <w:multiLevelType w:val="singleLevel"/>
     <w:tmpl w:val="B9B3F82F"/>
@@ -13921,7 +14831,7 @@
       <w:lvlJc w:val="left"/>
     </w:lvl>
   </w:abstractNum>
-  <w:abstractNum w:abstractNumId="27">
+  <w:abstractNum w:abstractNumId="28">
     <w:nsid w:val="BD3EE326"/>
     <w:multiLevelType w:val="singleLevel"/>
     <w:tmpl w:val="BD3EE326"/>
@@ -13933,7 +14843,7 @@
       <w:lvlJc w:val="left"/>
     </w:lvl>
   </w:abstractNum>
-  <w:abstractNum w:abstractNumId="28">
+  <w:abstractNum w:abstractNumId="29">
     <w:nsid w:val="BF1C10F1"/>
     <w:multiLevelType w:val="singleLevel"/>
     <w:tmpl w:val="BF1C10F1"/>
@@ -13945,7 +14855,7 @@
       <w:lvlJc w:val="left"/>
     </w:lvl>
   </w:abstractNum>
-  <w:abstractNum w:abstractNumId="29">
+  <w:abstractNum w:abstractNumId="30">
     <w:nsid w:val="C1131C82"/>
     <w:multiLevelType w:val="singleLevel"/>
     <w:tmpl w:val="C1131C82"/>
@@ -13957,7 +14867,19 @@
       <w:lvlJc w:val="left"/>
     </w:lvl>
   </w:abstractNum>
-  <w:abstractNum w:abstractNumId="30">
+  <w:abstractNum w:abstractNumId="31">
+    <w:nsid w:val="C50E5F50"/>
+    <w:multiLevelType w:val="singleLevel"/>
+    <w:tmpl w:val="C50E5F50"/>
+    <w:lvl w:ilvl="0" w:tentative="0">
+      <w:start w:val="1"/>
+      <w:numFmt w:val="decimal"/>
+      <w:suff w:val="space"/>
+      <w:lvlText w:val="%1."/>
+      <w:lvlJc w:val="left"/>
+    </w:lvl>
+  </w:abstractNum>
+  <w:abstractNum w:abstractNumId="32">
     <w:nsid w:val="C793915E"/>
     <w:multiLevelType w:val="singleLevel"/>
     <w:tmpl w:val="C793915E"/>
@@ -13969,7 +14891,7 @@
       <w:lvlJc w:val="left"/>
     </w:lvl>
   </w:abstractNum>
-  <w:abstractNum w:abstractNumId="31">
+  <w:abstractNum w:abstractNumId="33">
     <w:nsid w:val="CAD6F3E4"/>
     <w:multiLevelType w:val="singleLevel"/>
     <w:tmpl w:val="CAD6F3E4"/>
@@ -13981,7 +14903,7 @@
       <w:lvlJc w:val="left"/>
     </w:lvl>
   </w:abstractNum>
-  <w:abstractNum w:abstractNumId="32">
+  <w:abstractNum w:abstractNumId="34">
     <w:nsid w:val="CBEC66A5"/>
     <w:multiLevelType w:val="singleLevel"/>
     <w:tmpl w:val="CBEC66A5"/>
@@ -13993,7 +14915,7 @@
       <w:lvlJc w:val="left"/>
     </w:lvl>
   </w:abstractNum>
-  <w:abstractNum w:abstractNumId="33">
+  <w:abstractNum w:abstractNumId="35">
     <w:nsid w:val="CE762D04"/>
     <w:multiLevelType w:val="singleLevel"/>
     <w:tmpl w:val="CE762D04"/>
@@ -14005,7 +14927,7 @@
       <w:lvlJc w:val="left"/>
     </w:lvl>
   </w:abstractNum>
-  <w:abstractNum w:abstractNumId="34">
+  <w:abstractNum w:abstractNumId="36">
     <w:nsid w:val="CFB556DD"/>
     <w:multiLevelType w:val="singleLevel"/>
     <w:tmpl w:val="CFB556DD"/>
@@ -14017,7 +14939,7 @@
       <w:lvlJc w:val="left"/>
     </w:lvl>
   </w:abstractNum>
-  <w:abstractNum w:abstractNumId="35">
+  <w:abstractNum w:abstractNumId="37">
     <w:nsid w:val="D34636E3"/>
     <w:multiLevelType w:val="singleLevel"/>
     <w:tmpl w:val="D34636E3"/>
@@ -14029,7 +14951,7 @@
       <w:lvlJc w:val="left"/>
     </w:lvl>
   </w:abstractNum>
-  <w:abstractNum w:abstractNumId="36">
+  <w:abstractNum w:abstractNumId="38">
     <w:nsid w:val="D4A79DA9"/>
     <w:multiLevelType w:val="multilevel"/>
     <w:tmpl w:val="D4A79DA9"/>
@@ -14169,7 +15091,7 @@
       </w:rPr>
     </w:lvl>
   </w:abstractNum>
-  <w:abstractNum w:abstractNumId="37">
+  <w:abstractNum w:abstractNumId="39">
     <w:nsid w:val="DB2E8F8F"/>
     <w:multiLevelType w:val="singleLevel"/>
     <w:tmpl w:val="DB2E8F8F"/>
@@ -14181,7 +15103,7 @@
       <w:lvlJc w:val="left"/>
     </w:lvl>
   </w:abstractNum>
-  <w:abstractNum w:abstractNumId="38">
+  <w:abstractNum w:abstractNumId="40">
     <w:nsid w:val="E109609F"/>
     <w:multiLevelType w:val="singleLevel"/>
     <w:tmpl w:val="E109609F"/>
@@ -14193,7 +15115,7 @@
       <w:lvlJc w:val="left"/>
     </w:lvl>
   </w:abstractNum>
-  <w:abstractNum w:abstractNumId="39">
+  <w:abstractNum w:abstractNumId="41">
     <w:nsid w:val="E17C0C88"/>
     <w:multiLevelType w:val="singleLevel"/>
     <w:tmpl w:val="E17C0C88"/>
@@ -14205,7 +15127,7 @@
       <w:lvlJc w:val="left"/>
     </w:lvl>
   </w:abstractNum>
-  <w:abstractNum w:abstractNumId="40">
+  <w:abstractNum w:abstractNumId="42">
     <w:nsid w:val="E89A39E4"/>
     <w:multiLevelType w:val="singleLevel"/>
     <w:tmpl w:val="E89A39E4"/>
@@ -14217,7 +15139,7 @@
       <w:lvlJc w:val="left"/>
     </w:lvl>
   </w:abstractNum>
-  <w:abstractNum w:abstractNumId="41">
+  <w:abstractNum w:abstractNumId="43">
     <w:nsid w:val="E9767898"/>
     <w:multiLevelType w:val="singleLevel"/>
     <w:tmpl w:val="E9767898"/>
@@ -14229,7 +15151,7 @@
       <w:lvlJc w:val="left"/>
     </w:lvl>
   </w:abstractNum>
-  <w:abstractNum w:abstractNumId="42">
+  <w:abstractNum w:abstractNumId="44">
     <w:nsid w:val="EA14CDEE"/>
     <w:multiLevelType w:val="singleLevel"/>
     <w:tmpl w:val="EA14CDEE"/>
@@ -14241,7 +15163,7 @@
       <w:lvlJc w:val="left"/>
     </w:lvl>
   </w:abstractNum>
-  <w:abstractNum w:abstractNumId="43">
+  <w:abstractNum w:abstractNumId="45">
     <w:nsid w:val="EA1AA236"/>
     <w:multiLevelType w:val="singleLevel"/>
     <w:tmpl w:val="EA1AA236"/>
@@ -14253,7 +15175,7 @@
       <w:lvlJc w:val="left"/>
     </w:lvl>
   </w:abstractNum>
-  <w:abstractNum w:abstractNumId="44">
+  <w:abstractNum w:abstractNumId="46">
     <w:nsid w:val="ED718AAF"/>
     <w:multiLevelType w:val="singleLevel"/>
     <w:tmpl w:val="ED718AAF"/>
@@ -14265,7 +15187,7 @@
       <w:lvlJc w:val="left"/>
     </w:lvl>
   </w:abstractNum>
-  <w:abstractNum w:abstractNumId="45">
+  <w:abstractNum w:abstractNumId="47">
     <w:nsid w:val="F516EE0D"/>
     <w:multiLevelType w:val="singleLevel"/>
     <w:tmpl w:val="F516EE0D"/>
@@ -14277,7 +15199,7 @@
       <w:lvlJc w:val="left"/>
     </w:lvl>
   </w:abstractNum>
-  <w:abstractNum w:abstractNumId="46">
+  <w:abstractNum w:abstractNumId="48">
     <w:nsid w:val="FC29D630"/>
     <w:multiLevelType w:val="singleLevel"/>
     <w:tmpl w:val="FC29D630"/>
@@ -14289,7 +15211,7 @@
       <w:lvlJc w:val="left"/>
     </w:lvl>
   </w:abstractNum>
-  <w:abstractNum w:abstractNumId="47">
+  <w:abstractNum w:abstractNumId="49">
     <w:nsid w:val="FE24A8A4"/>
     <w:multiLevelType w:val="singleLevel"/>
     <w:tmpl w:val="FE24A8A4"/>
@@ -14301,7 +15223,19 @@
       <w:lvlJc w:val="left"/>
     </w:lvl>
   </w:abstractNum>
-  <w:abstractNum w:abstractNumId="48">
+  <w:abstractNum w:abstractNumId="50">
+    <w:nsid w:val="FE343E4B"/>
+    <w:multiLevelType w:val="singleLevel"/>
+    <w:tmpl w:val="FE343E4B"/>
+    <w:lvl w:ilvl="0" w:tentative="0">
+      <w:start w:val="1"/>
+      <w:numFmt w:val="decimal"/>
+      <w:suff w:val="space"/>
+      <w:lvlText w:val="%1."/>
+      <w:lvlJc w:val="left"/>
+    </w:lvl>
+  </w:abstractNum>
+  <w:abstractNum w:abstractNumId="51">
     <w:nsid w:val="058F7B3C"/>
     <w:multiLevelType w:val="singleLevel"/>
     <w:tmpl w:val="058F7B3C"/>
@@ -14313,7 +15247,7 @@
       <w:lvlJc w:val="left"/>
     </w:lvl>
   </w:abstractNum>
-  <w:abstractNum w:abstractNumId="49">
+  <w:abstractNum w:abstractNumId="52">
     <w:nsid w:val="09005923"/>
     <w:multiLevelType w:val="singleLevel"/>
     <w:tmpl w:val="09005923"/>
@@ -14325,7 +15259,7 @@
       <w:lvlJc w:val="left"/>
     </w:lvl>
   </w:abstractNum>
-  <w:abstractNum w:abstractNumId="50">
+  <w:abstractNum w:abstractNumId="53">
     <w:nsid w:val="091759E5"/>
     <w:multiLevelType w:val="singleLevel"/>
     <w:tmpl w:val="091759E5"/>
@@ -14337,7 +15271,7 @@
       <w:lvlJc w:val="left"/>
     </w:lvl>
   </w:abstractNum>
-  <w:abstractNum w:abstractNumId="51">
+  <w:abstractNum w:abstractNumId="54">
     <w:nsid w:val="0A7C2C92"/>
     <w:multiLevelType w:val="singleLevel"/>
     <w:tmpl w:val="0A7C2C92"/>
@@ -14349,7 +15283,7 @@
       <w:lvlJc w:val="left"/>
     </w:lvl>
   </w:abstractNum>
-  <w:abstractNum w:abstractNumId="52">
+  <w:abstractNum w:abstractNumId="55">
     <w:nsid w:val="0CD92811"/>
     <w:multiLevelType w:val="singleLevel"/>
     <w:tmpl w:val="0CD92811"/>
@@ -14361,7 +15295,7 @@
       <w:lvlJc w:val="left"/>
     </w:lvl>
   </w:abstractNum>
-  <w:abstractNum w:abstractNumId="53">
+  <w:abstractNum w:abstractNumId="56">
     <w:nsid w:val="0E610A28"/>
     <w:multiLevelType w:val="singleLevel"/>
     <w:tmpl w:val="0E610A28"/>
@@ -14373,7 +15307,7 @@
       <w:lvlJc w:val="left"/>
     </w:lvl>
   </w:abstractNum>
-  <w:abstractNum w:abstractNumId="54">
+  <w:abstractNum w:abstractNumId="57">
     <w:nsid w:val="12E3D0E2"/>
     <w:multiLevelType w:val="singleLevel"/>
     <w:tmpl w:val="12E3D0E2"/>
@@ -14385,7 +15319,7 @@
       <w:lvlJc w:val="left"/>
     </w:lvl>
   </w:abstractNum>
-  <w:abstractNum w:abstractNumId="55">
+  <w:abstractNum w:abstractNumId="58">
     <w:nsid w:val="18501BFC"/>
     <w:multiLevelType w:val="singleLevel"/>
     <w:tmpl w:val="18501BFC"/>
@@ -14397,7 +15331,7 @@
       <w:lvlJc w:val="left"/>
     </w:lvl>
   </w:abstractNum>
-  <w:abstractNum w:abstractNumId="56">
+  <w:abstractNum w:abstractNumId="59">
     <w:nsid w:val="211769BA"/>
     <w:multiLevelType w:val="singleLevel"/>
     <w:tmpl w:val="211769BA"/>
@@ -14409,7 +15343,7 @@
       <w:lvlJc w:val="left"/>
     </w:lvl>
   </w:abstractNum>
-  <w:abstractNum w:abstractNumId="57">
+  <w:abstractNum w:abstractNumId="60">
     <w:nsid w:val="2726B058"/>
     <w:multiLevelType w:val="singleLevel"/>
     <w:tmpl w:val="2726B058"/>
@@ -14421,7 +15355,7 @@
       <w:lvlJc w:val="left"/>
     </w:lvl>
   </w:abstractNum>
-  <w:abstractNum w:abstractNumId="58">
+  <w:abstractNum w:abstractNumId="61">
     <w:nsid w:val="27D2B737"/>
     <w:multiLevelType w:val="singleLevel"/>
     <w:tmpl w:val="27D2B737"/>
@@ -14433,7 +15367,7 @@
       <w:lvlJc w:val="left"/>
     </w:lvl>
   </w:abstractNum>
-  <w:abstractNum w:abstractNumId="59">
+  <w:abstractNum w:abstractNumId="62">
     <w:nsid w:val="2DE852F7"/>
     <w:multiLevelType w:val="singleLevel"/>
     <w:tmpl w:val="2DE852F7"/>
@@ -14445,7 +15379,7 @@
       <w:lvlJc w:val="left"/>
     </w:lvl>
   </w:abstractNum>
-  <w:abstractNum w:abstractNumId="60">
+  <w:abstractNum w:abstractNumId="63">
     <w:nsid w:val="30AD9F26"/>
     <w:multiLevelType w:val="singleLevel"/>
     <w:tmpl w:val="30AD9F26"/>
@@ -14457,7 +15391,7 @@
       <w:lvlJc w:val="left"/>
     </w:lvl>
   </w:abstractNum>
-  <w:abstractNum w:abstractNumId="61">
+  <w:abstractNum w:abstractNumId="64">
     <w:nsid w:val="34247F98"/>
     <w:multiLevelType w:val="singleLevel"/>
     <w:tmpl w:val="34247F98"/>
@@ -14469,7 +15403,7 @@
       <w:lvlJc w:val="left"/>
     </w:lvl>
   </w:abstractNum>
-  <w:abstractNum w:abstractNumId="62">
+  <w:abstractNum w:abstractNumId="65">
     <w:nsid w:val="34ACC566"/>
     <w:multiLevelType w:val="singleLevel"/>
     <w:tmpl w:val="34ACC566"/>
@@ -14481,7 +15415,7 @@
       <w:lvlJc w:val="left"/>
     </w:lvl>
   </w:abstractNum>
-  <w:abstractNum w:abstractNumId="63">
+  <w:abstractNum w:abstractNumId="66">
     <w:nsid w:val="36D9EC17"/>
     <w:multiLevelType w:val="singleLevel"/>
     <w:tmpl w:val="36D9EC17"/>
@@ -14493,7 +15427,19 @@
       <w:lvlJc w:val="left"/>
     </w:lvl>
   </w:abstractNum>
-  <w:abstractNum w:abstractNumId="64">
+  <w:abstractNum w:abstractNumId="67">
+    <w:nsid w:val="3755E511"/>
+    <w:multiLevelType w:val="singleLevel"/>
+    <w:tmpl w:val="3755E511"/>
+    <w:lvl w:ilvl="0" w:tentative="0">
+      <w:start w:val="1"/>
+      <w:numFmt w:val="decimal"/>
+      <w:suff w:val="space"/>
+      <w:lvlText w:val="%1."/>
+      <w:lvlJc w:val="left"/>
+    </w:lvl>
+  </w:abstractNum>
+  <w:abstractNum w:abstractNumId="68">
     <w:nsid w:val="3915D7F5"/>
     <w:multiLevelType w:val="singleLevel"/>
     <w:tmpl w:val="3915D7F5"/>
@@ -14505,7 +15451,7 @@
       <w:lvlJc w:val="left"/>
     </w:lvl>
   </w:abstractNum>
-  <w:abstractNum w:abstractNumId="65">
+  <w:abstractNum w:abstractNumId="69">
     <w:nsid w:val="3B3BFDBA"/>
     <w:multiLevelType w:val="singleLevel"/>
     <w:tmpl w:val="3B3BFDBA"/>
@@ -14517,7 +15463,7 @@
       <w:lvlJc w:val="left"/>
     </w:lvl>
   </w:abstractNum>
-  <w:abstractNum w:abstractNumId="66">
+  <w:abstractNum w:abstractNumId="70">
     <w:nsid w:val="3CC99ABE"/>
     <w:multiLevelType w:val="singleLevel"/>
     <w:tmpl w:val="3CC99ABE"/>
@@ -14529,7 +15475,7 @@
       <w:lvlJc w:val="left"/>
     </w:lvl>
   </w:abstractNum>
-  <w:abstractNum w:abstractNumId="67">
+  <w:abstractNum w:abstractNumId="71">
     <w:nsid w:val="3D4BEBA8"/>
     <w:multiLevelType w:val="singleLevel"/>
     <w:tmpl w:val="3D4BEBA8"/>
@@ -14541,7 +15487,19 @@
       <w:lvlJc w:val="left"/>
     </w:lvl>
   </w:abstractNum>
-  <w:abstractNum w:abstractNumId="68">
+  <w:abstractNum w:abstractNumId="72">
+    <w:nsid w:val="428F8CC0"/>
+    <w:multiLevelType w:val="singleLevel"/>
+    <w:tmpl w:val="428F8CC0"/>
+    <w:lvl w:ilvl="0" w:tentative="0">
+      <w:start w:val="1"/>
+      <w:numFmt w:val="decimal"/>
+      <w:suff w:val="space"/>
+      <w:lvlText w:val="%1."/>
+      <w:lvlJc w:val="left"/>
+    </w:lvl>
+  </w:abstractNum>
+  <w:abstractNum w:abstractNumId="73">
     <w:nsid w:val="46D2EDB9"/>
     <w:multiLevelType w:val="multilevel"/>
     <w:tmpl w:val="46D2EDB9"/>
@@ -14681,7 +15639,19 @@
       </w:rPr>
     </w:lvl>
   </w:abstractNum>
-  <w:abstractNum w:abstractNumId="69">
+  <w:abstractNum w:abstractNumId="74">
+    <w:nsid w:val="4A611E4F"/>
+    <w:multiLevelType w:val="singleLevel"/>
+    <w:tmpl w:val="4A611E4F"/>
+    <w:lvl w:ilvl="0" w:tentative="0">
+      <w:start w:val="1"/>
+      <w:numFmt w:val="decimal"/>
+      <w:suff w:val="space"/>
+      <w:lvlText w:val="%1."/>
+      <w:lvlJc w:val="left"/>
+    </w:lvl>
+  </w:abstractNum>
+  <w:abstractNum w:abstractNumId="75">
     <w:nsid w:val="4F2E84C6"/>
     <w:multiLevelType w:val="singleLevel"/>
     <w:tmpl w:val="4F2E84C6"/>
@@ -14693,7 +15663,19 @@
       <w:lvlJc w:val="left"/>
     </w:lvl>
   </w:abstractNum>
-  <w:abstractNum w:abstractNumId="70">
+  <w:abstractNum w:abstractNumId="76">
+    <w:nsid w:val="52BBEC1D"/>
+    <w:multiLevelType w:val="singleLevel"/>
+    <w:tmpl w:val="52BBEC1D"/>
+    <w:lvl w:ilvl="0" w:tentative="0">
+      <w:start w:val="1"/>
+      <w:numFmt w:val="decimal"/>
+      <w:suff w:val="space"/>
+      <w:lvlText w:val="%1."/>
+      <w:lvlJc w:val="left"/>
+    </w:lvl>
+  </w:abstractNum>
+  <w:abstractNum w:abstractNumId="77">
     <w:nsid w:val="537CC0EA"/>
     <w:multiLevelType w:val="singleLevel"/>
     <w:tmpl w:val="537CC0EA"/>
@@ -14705,7 +15687,7 @@
       <w:lvlJc w:val="left"/>
     </w:lvl>
   </w:abstractNum>
-  <w:abstractNum w:abstractNumId="71">
+  <w:abstractNum w:abstractNumId="78">
     <w:nsid w:val="5973A4FA"/>
     <w:multiLevelType w:val="singleLevel"/>
     <w:tmpl w:val="5973A4FA"/>
@@ -14717,7 +15699,7 @@
       <w:lvlJc w:val="left"/>
     </w:lvl>
   </w:abstractNum>
-  <w:abstractNum w:abstractNumId="72">
+  <w:abstractNum w:abstractNumId="79">
     <w:nsid w:val="6024D89E"/>
     <w:multiLevelType w:val="singleLevel"/>
     <w:tmpl w:val="6024D89E"/>
@@ -14729,7 +15711,7 @@
       <w:lvlJc w:val="left"/>
     </w:lvl>
   </w:abstractNum>
-  <w:abstractNum w:abstractNumId="73">
+  <w:abstractNum w:abstractNumId="80">
     <w:nsid w:val="628F328F"/>
     <w:multiLevelType w:val="singleLevel"/>
     <w:tmpl w:val="628F328F"/>
@@ -14741,7 +15723,7 @@
       <w:lvlJc w:val="left"/>
     </w:lvl>
   </w:abstractNum>
-  <w:abstractNum w:abstractNumId="74">
+  <w:abstractNum w:abstractNumId="81">
     <w:nsid w:val="62FD1C74"/>
     <w:multiLevelType w:val="singleLevel"/>
     <w:tmpl w:val="62FD1C74"/>
@@ -14753,7 +15735,7 @@
       <w:lvlJc w:val="left"/>
     </w:lvl>
   </w:abstractNum>
-  <w:abstractNum w:abstractNumId="75">
+  <w:abstractNum w:abstractNumId="82">
     <w:nsid w:val="6578F536"/>
     <w:multiLevelType w:val="singleLevel"/>
     <w:tmpl w:val="6578F536"/>
@@ -14765,7 +15747,7 @@
       <w:lvlJc w:val="left"/>
     </w:lvl>
   </w:abstractNum>
-  <w:abstractNum w:abstractNumId="76">
+  <w:abstractNum w:abstractNumId="83">
     <w:nsid w:val="658783AF"/>
     <w:multiLevelType w:val="singleLevel"/>
     <w:tmpl w:val="658783AF"/>
@@ -14777,7 +15759,7 @@
       <w:lvlJc w:val="left"/>
     </w:lvl>
   </w:abstractNum>
-  <w:abstractNum w:abstractNumId="77">
+  <w:abstractNum w:abstractNumId="84">
     <w:nsid w:val="67A03EFF"/>
     <w:multiLevelType w:val="singleLevel"/>
     <w:tmpl w:val="67A03EFF"/>
@@ -14789,7 +15771,7 @@
       <w:lvlJc w:val="left"/>
     </w:lvl>
   </w:abstractNum>
-  <w:abstractNum w:abstractNumId="78">
+  <w:abstractNum w:abstractNumId="85">
     <w:nsid w:val="687B0014"/>
     <w:multiLevelType w:val="singleLevel"/>
     <w:tmpl w:val="687B0014"/>
@@ -14801,7 +15783,7 @@
       <w:lvlJc w:val="left"/>
     </w:lvl>
   </w:abstractNum>
-  <w:abstractNum w:abstractNumId="79">
+  <w:abstractNum w:abstractNumId="86">
     <w:nsid w:val="69C1C339"/>
     <w:multiLevelType w:val="singleLevel"/>
     <w:tmpl w:val="69C1C339"/>
@@ -14813,7 +15795,7 @@
       <w:lvlJc w:val="left"/>
     </w:lvl>
   </w:abstractNum>
-  <w:abstractNum w:abstractNumId="80">
+  <w:abstractNum w:abstractNumId="87">
     <w:nsid w:val="6AF88BFE"/>
     <w:multiLevelType w:val="singleLevel"/>
     <w:tmpl w:val="6AF88BFE"/>
@@ -14825,7 +15807,7 @@
       <w:lvlJc w:val="left"/>
     </w:lvl>
   </w:abstractNum>
-  <w:abstractNum w:abstractNumId="81">
+  <w:abstractNum w:abstractNumId="88">
     <w:nsid w:val="723B45CE"/>
     <w:multiLevelType w:val="singleLevel"/>
     <w:tmpl w:val="723B45CE"/>
@@ -14837,7 +15819,7 @@
       <w:lvlJc w:val="left"/>
     </w:lvl>
   </w:abstractNum>
-  <w:abstractNum w:abstractNumId="82">
+  <w:abstractNum w:abstractNumId="89">
     <w:nsid w:val="743D4446"/>
     <w:multiLevelType w:val="singleLevel"/>
     <w:tmpl w:val="743D4446"/>
@@ -14849,7 +15831,7 @@
       <w:lvlJc w:val="left"/>
     </w:lvl>
   </w:abstractNum>
-  <w:abstractNum w:abstractNumId="83">
+  <w:abstractNum w:abstractNumId="90">
     <w:nsid w:val="78DA9A54"/>
     <w:multiLevelType w:val="singleLevel"/>
     <w:tmpl w:val="78DA9A54"/>
@@ -14861,7 +15843,7 @@
       <w:lvlJc w:val="left"/>
     </w:lvl>
   </w:abstractNum>
-  <w:abstractNum w:abstractNumId="84">
+  <w:abstractNum w:abstractNumId="91">
     <w:nsid w:val="7CFEE648"/>
     <w:multiLevelType w:val="singleLevel"/>
     <w:tmpl w:val="7CFEE648"/>
@@ -14873,7 +15855,7 @@
       <w:lvlJc w:val="left"/>
     </w:lvl>
   </w:abstractNum>
-  <w:abstractNum w:abstractNumId="85">
+  <w:abstractNum w:abstractNumId="92">
     <w:nsid w:val="7EE9AE89"/>
     <w:multiLevelType w:val="singleLevel"/>
     <w:tmpl w:val="7EE9AE89"/>
@@ -14885,7 +15867,7 @@
       <w:lvlJc w:val="left"/>
     </w:lvl>
   </w:abstractNum>
-  <w:abstractNum w:abstractNumId="86">
+  <w:abstractNum w:abstractNumId="93">
     <w:nsid w:val="7FEFEBD9"/>
     <w:multiLevelType w:val="singleLevel"/>
     <w:tmpl w:val="7FEFEBD9"/>
@@ -14898,265 +15880,286 @@
     </w:lvl>
   </w:abstractNum>
   <w:num w:numId="1">
-    <w:abstractNumId w:val="14"/>
+    <w:abstractNumId w:val="15"/>
   </w:num>
   <w:num w:numId="2">
-    <w:abstractNumId w:val="17"/>
+    <w:abstractNumId w:val="18"/>
   </w:num>
   <w:num w:numId="3">
+    <w:abstractNumId w:val="23"/>
+  </w:num>
+  <w:num w:numId="4">
+    <w:abstractNumId w:val="38"/>
+  </w:num>
+  <w:num w:numId="5">
+    <w:abstractNumId w:val="73"/>
+  </w:num>
+  <w:num w:numId="6">
+    <w:abstractNumId w:val="69"/>
+  </w:num>
+  <w:num w:numId="7">
+    <w:abstractNumId w:val="9"/>
+  </w:num>
+  <w:num w:numId="8">
+    <w:abstractNumId w:val="42"/>
+  </w:num>
+  <w:num w:numId="9">
+    <w:abstractNumId w:val="21"/>
+  </w:num>
+  <w:num w:numId="10">
     <w:abstractNumId w:val="22"/>
   </w:num>
-  <w:num w:numId="4">
-    <w:abstractNumId w:val="36"/>
-  </w:num>
-  <w:num w:numId="5">
-    <w:abstractNumId w:val="68"/>
-  </w:num>
-  <w:num w:numId="6">
-    <w:abstractNumId w:val="65"/>
-  </w:num>
-  <w:num w:numId="7">
-    <w:abstractNumId w:val="8"/>
-  </w:num>
-  <w:num w:numId="8">
-    <w:abstractNumId w:val="40"/>
-  </w:num>
-  <w:num w:numId="9">
-    <w:abstractNumId w:val="20"/>
-  </w:num>
-  <w:num w:numId="10">
-    <w:abstractNumId w:val="21"/>
-  </w:num>
   <w:num w:numId="11">
-    <w:abstractNumId w:val="15"/>
+    <w:abstractNumId w:val="16"/>
   </w:num>
   <w:num w:numId="12">
-    <w:abstractNumId w:val="55"/>
+    <w:abstractNumId w:val="58"/>
   </w:num>
   <w:num w:numId="13">
-    <w:abstractNumId w:val="74"/>
+    <w:abstractNumId w:val="81"/>
   </w:num>
   <w:num w:numId="14">
-    <w:abstractNumId w:val="41"/>
+    <w:abstractNumId w:val="43"/>
   </w:num>
   <w:num w:numId="15">
-    <w:abstractNumId w:val="50"/>
+    <w:abstractNumId w:val="53"/>
   </w:num>
   <w:num w:numId="16">
     <w:abstractNumId w:val="0"/>
   </w:num>
   <w:num w:numId="17">
-    <w:abstractNumId w:val="73"/>
+    <w:abstractNumId w:val="80"/>
   </w:num>
   <w:num w:numId="18">
-    <w:abstractNumId w:val="19"/>
+    <w:abstractNumId w:val="20"/>
   </w:num>
   <w:num w:numId="19">
-    <w:abstractNumId w:val="75"/>
+    <w:abstractNumId w:val="82"/>
   </w:num>
   <w:num w:numId="20">
-    <w:abstractNumId w:val="62"/>
+    <w:abstractNumId w:val="65"/>
   </w:num>
   <w:num w:numId="21">
-    <w:abstractNumId w:val="49"/>
+    <w:abstractNumId w:val="52"/>
   </w:num>
   <w:num w:numId="22">
-    <w:abstractNumId w:val="33"/>
+    <w:abstractNumId w:val="35"/>
   </w:num>
   <w:num w:numId="23">
-    <w:abstractNumId w:val="35"/>
+    <w:abstractNumId w:val="37"/>
   </w:num>
   <w:num w:numId="24">
-    <w:abstractNumId w:val="34"/>
+    <w:abstractNumId w:val="36"/>
   </w:num>
   <w:num w:numId="25">
-    <w:abstractNumId w:val="80"/>
+    <w:abstractNumId w:val="87"/>
   </w:num>
   <w:num w:numId="26">
-    <w:abstractNumId w:val="52"/>
+    <w:abstractNumId w:val="55"/>
   </w:num>
   <w:num w:numId="27">
-    <w:abstractNumId w:val="30"/>
+    <w:abstractNumId w:val="32"/>
   </w:num>
   <w:num w:numId="28">
-    <w:abstractNumId w:val="85"/>
+    <w:abstractNumId w:val="92"/>
   </w:num>
   <w:num w:numId="29">
-    <w:abstractNumId w:val="84"/>
+    <w:abstractNumId w:val="91"/>
   </w:num>
   <w:num w:numId="30">
+    <w:abstractNumId w:val="77"/>
+  </w:num>
+  <w:num w:numId="31">
+    <w:abstractNumId w:val="60"/>
+  </w:num>
+  <w:num w:numId="32">
+    <w:abstractNumId w:val="10"/>
+  </w:num>
+  <w:num w:numId="33">
+    <w:abstractNumId w:val="44"/>
+  </w:num>
+  <w:num w:numId="34">
+    <w:abstractNumId w:val="41"/>
+  </w:num>
+  <w:num w:numId="35">
+    <w:abstractNumId w:val="46"/>
+  </w:num>
+  <w:num w:numId="36">
+    <w:abstractNumId w:val="83"/>
+  </w:num>
+  <w:num w:numId="37">
+    <w:abstractNumId w:val="64"/>
+  </w:num>
+  <w:num w:numId="38">
+    <w:abstractNumId w:val="56"/>
+  </w:num>
+  <w:num w:numId="39">
+    <w:abstractNumId w:val="24"/>
+  </w:num>
+  <w:num w:numId="40">
+    <w:abstractNumId w:val="13"/>
+  </w:num>
+  <w:num w:numId="41">
+    <w:abstractNumId w:val="14"/>
+  </w:num>
+  <w:num w:numId="42">
     <w:abstractNumId w:val="70"/>
   </w:num>
-  <w:num w:numId="31">
-    <w:abstractNumId w:val="57"/>
-  </w:num>
-  <w:num w:numId="32">
-    <w:abstractNumId w:val="9"/>
-  </w:num>
-  <w:num w:numId="33">
-    <w:abstractNumId w:val="42"/>
-  </w:num>
-  <w:num w:numId="34">
-    <w:abstractNumId w:val="39"/>
-  </w:num>
-  <w:num w:numId="35">
-    <w:abstractNumId w:val="44"/>
-  </w:num>
-  <w:num w:numId="36">
-    <w:abstractNumId w:val="76"/>
-  </w:num>
-  <w:num w:numId="37">
+  <w:num w:numId="43">
     <w:abstractNumId w:val="61"/>
-  </w:num>
-  <w:num w:numId="38">
-    <w:abstractNumId w:val="53"/>
-  </w:num>
-  <w:num w:numId="39">
-    <w:abstractNumId w:val="23"/>
-  </w:num>
-  <w:num w:numId="40">
-    <w:abstractNumId w:val="12"/>
-  </w:num>
-  <w:num w:numId="41">
-    <w:abstractNumId w:val="13"/>
-  </w:num>
-  <w:num w:numId="42">
-    <w:abstractNumId w:val="66"/>
-  </w:num>
-  <w:num w:numId="43">
-    <w:abstractNumId w:val="58"/>
   </w:num>
   <w:num w:numId="44">
     <w:abstractNumId w:val="1"/>
   </w:num>
   <w:num w:numId="45">
-    <w:abstractNumId w:val="37"/>
+    <w:abstractNumId w:val="39"/>
   </w:num>
   <w:num w:numId="46">
-    <w:abstractNumId w:val="32"/>
+    <w:abstractNumId w:val="34"/>
   </w:num>
   <w:num w:numId="47">
-    <w:abstractNumId w:val="47"/>
+    <w:abstractNumId w:val="49"/>
   </w:num>
   <w:num w:numId="48">
     <w:abstractNumId w:val="4"/>
   </w:num>
   <w:num w:numId="49">
-    <w:abstractNumId w:val="64"/>
+    <w:abstractNumId w:val="68"/>
   </w:num>
   <w:num w:numId="50">
-    <w:abstractNumId w:val="38"/>
+    <w:abstractNumId w:val="40"/>
   </w:num>
   <w:num w:numId="51">
+    <w:abstractNumId w:val="93"/>
+  </w:num>
+  <w:num w:numId="52">
+    <w:abstractNumId w:val="79"/>
+  </w:num>
+  <w:num w:numId="53">
+    <w:abstractNumId w:val="72"/>
+  </w:num>
+  <w:num w:numId="54">
+    <w:abstractNumId w:val="31"/>
+  </w:num>
+  <w:num w:numId="55">
+    <w:abstractNumId w:val="74"/>
+  </w:num>
+  <w:num w:numId="56">
+    <w:abstractNumId w:val="7"/>
+  </w:num>
+  <w:num w:numId="57">
+    <w:abstractNumId w:val="89"/>
+  </w:num>
+  <w:num w:numId="58">
+    <w:abstractNumId w:val="19"/>
+  </w:num>
+  <w:num w:numId="59">
+    <w:abstractNumId w:val="28"/>
+  </w:num>
+  <w:num w:numId="60">
+    <w:abstractNumId w:val="12"/>
+  </w:num>
+  <w:num w:numId="61">
+    <w:abstractNumId w:val="27"/>
+  </w:num>
+  <w:num w:numId="62">
+    <w:abstractNumId w:val="3"/>
+  </w:num>
+  <w:num w:numId="63">
+    <w:abstractNumId w:val="62"/>
+  </w:num>
+  <w:num w:numId="64">
+    <w:abstractNumId w:val="6"/>
+  </w:num>
+  <w:num w:numId="65">
+    <w:abstractNumId w:val="88"/>
+  </w:num>
+  <w:num w:numId="66">
     <w:abstractNumId w:val="86"/>
   </w:num>
-  <w:num w:numId="52">
-    <w:abstractNumId w:val="72"/>
+  <w:num w:numId="67">
+    <w:abstractNumId w:val="63"/>
   </w:num>
-  <w:num w:numId="53">
-    <w:abstractNumId w:val="6"/>
+  <w:num w:numId="68">
+    <w:abstractNumId w:val="5"/>
   </w:num>
-  <w:num w:numId="54">
-    <w:abstractNumId w:val="82"/>
+  <w:num w:numId="69">
+    <w:abstractNumId w:val="67"/>
   </w:num>
-  <w:num w:numId="55">
-    <w:abstractNumId w:val="18"/>
+  <w:num w:numId="70">
+    <w:abstractNumId w:val="76"/>
   </w:num>
-  <w:num w:numId="56">
-    <w:abstractNumId w:val="27"/>
+  <w:num w:numId="71">
+    <w:abstractNumId w:val="50"/>
   </w:num>
-  <w:num w:numId="57">
+  <w:num w:numId="72">
+    <w:abstractNumId w:val="33"/>
+  </w:num>
+  <w:num w:numId="73">
+    <w:abstractNumId w:val="45"/>
+  </w:num>
+  <w:num w:numId="74">
+    <w:abstractNumId w:val="30"/>
+  </w:num>
+  <w:num w:numId="75">
+    <w:abstractNumId w:val="2"/>
+  </w:num>
+  <w:num w:numId="76">
+    <w:abstractNumId w:val="59"/>
+  </w:num>
+  <w:num w:numId="77">
+    <w:abstractNumId w:val="51"/>
+  </w:num>
+  <w:num w:numId="78">
+    <w:abstractNumId w:val="57"/>
+  </w:num>
+  <w:num w:numId="79">
+    <w:abstractNumId w:val="29"/>
+  </w:num>
+  <w:num w:numId="80">
+    <w:abstractNumId w:val="25"/>
+  </w:num>
+  <w:num w:numId="81">
+    <w:abstractNumId w:val="85"/>
+  </w:num>
+  <w:num w:numId="82">
+    <w:abstractNumId w:val="66"/>
+  </w:num>
+  <w:num w:numId="83">
+    <w:abstractNumId w:val="8"/>
+  </w:num>
+  <w:num w:numId="84">
+    <w:abstractNumId w:val="75"/>
+  </w:num>
+  <w:num w:numId="85">
+    <w:abstractNumId w:val="47"/>
+  </w:num>
+  <w:num w:numId="86">
+    <w:abstractNumId w:val="90"/>
+  </w:num>
+  <w:num w:numId="87">
     <w:abstractNumId w:val="11"/>
   </w:num>
-  <w:num w:numId="58">
+  <w:num w:numId="88">
+    <w:abstractNumId w:val="84"/>
+  </w:num>
+  <w:num w:numId="89">
+    <w:abstractNumId w:val="54"/>
+  </w:num>
+  <w:num w:numId="90">
+    <w:abstractNumId w:val="78"/>
+  </w:num>
+  <w:num w:numId="91">
     <w:abstractNumId w:val="26"/>
   </w:num>
-  <w:num w:numId="59">
-    <w:abstractNumId w:val="3"/>
-  </w:num>
-  <w:num w:numId="60">
-    <w:abstractNumId w:val="59"/>
-  </w:num>
-  <w:num w:numId="61">
-    <w:abstractNumId w:val="5"/>
-  </w:num>
-  <w:num w:numId="62">
-    <w:abstractNumId w:val="81"/>
-  </w:num>
-  <w:num w:numId="63">
-    <w:abstractNumId w:val="79"/>
-  </w:num>
-  <w:num w:numId="64">
-    <w:abstractNumId w:val="60"/>
-  </w:num>
-  <w:num w:numId="65">
-    <w:abstractNumId w:val="31"/>
-  </w:num>
-  <w:num w:numId="66">
-    <w:abstractNumId w:val="43"/>
-  </w:num>
-  <w:num w:numId="67">
-    <w:abstractNumId w:val="29"/>
-  </w:num>
-  <w:num w:numId="68">
-    <w:abstractNumId w:val="2"/>
-  </w:num>
-  <w:num w:numId="69">
-    <w:abstractNumId w:val="56"/>
-  </w:num>
-  <w:num w:numId="70">
+  <w:num w:numId="92">
     <w:abstractNumId w:val="48"/>
   </w:num>
-  <w:num w:numId="71">
-    <w:abstractNumId w:val="54"/>
+  <w:num w:numId="93">
+    <w:abstractNumId w:val="17"/>
   </w:num>
-  <w:num w:numId="72">
-    <w:abstractNumId w:val="28"/>
-  </w:num>
-  <w:num w:numId="73">
-    <w:abstractNumId w:val="24"/>
-  </w:num>
-  <w:num w:numId="74">
-    <w:abstractNumId w:val="78"/>
-  </w:num>
-  <w:num w:numId="75">
-    <w:abstractNumId w:val="63"/>
-  </w:num>
-  <w:num w:numId="76">
-    <w:abstractNumId w:val="7"/>
-  </w:num>
-  <w:num w:numId="77">
-    <w:abstractNumId w:val="69"/>
-  </w:num>
-  <w:num w:numId="78">
-    <w:abstractNumId w:val="45"/>
-  </w:num>
-  <w:num w:numId="79">
-    <w:abstractNumId w:val="83"/>
-  </w:num>
-  <w:num w:numId="80">
-    <w:abstractNumId w:val="10"/>
-  </w:num>
-  <w:num w:numId="81">
-    <w:abstractNumId w:val="77"/>
-  </w:num>
-  <w:num w:numId="82">
-    <w:abstractNumId w:val="51"/>
-  </w:num>
-  <w:num w:numId="83">
+  <w:num w:numId="94">
     <w:abstractNumId w:val="71"/>
-  </w:num>
-  <w:num w:numId="84">
-    <w:abstractNumId w:val="25"/>
-  </w:num>
-  <w:num w:numId="85">
-    <w:abstractNumId w:val="46"/>
-  </w:num>
-  <w:num w:numId="86">
-    <w:abstractNumId w:val="16"/>
-  </w:num>
-  <w:num w:numId="87">
-    <w:abstractNumId w:val="67"/>
   </w:num>
 </w:numbering>
 </file>

</xml_diff>

<commit_message>
Update: Fix Usecase Specification
</commit_message>
<xml_diff>
--- a/Diagrams/UsecaseDiagram/DacTa/DacTaUsecase.docx
+++ b/Diagrams/UsecaseDiagram/DacTa/DacTaUsecase.docx
@@ -67,7 +67,7 @@
           <w:vertAlign w:val="baseline"/>
           <w:lang w:val="en-US"/>
         </w:rPr>
-        <w:t>Dự án nhằm xây dựng một website nghe nhạc trực tuyến cho phép người dùng thưởng thức, quản lý và chia sẻ âm nhạc. Hệ thống phân chia vai trò rõ ràng giữa Người dùng (thính giả), Nghệ sĩ (người sáng tạo nội dung) và Quản trị viên (người vận hành hệ thống), mang lại trải nghiệm chuyên biệt cho từng đối tượng.</w:t>
+        <w:t>Đồ án nhằm xây dựng một website nghe nhạc trực tuyến cho phép người dùng thưởng thức, quản lý và chia sẻ âm nhạc. Hệ thống phân chia vai trò rõ ràng giữa Người dùng (thính giả), Nghệ sĩ (người sáng tạo nội dung) và Quản trị viên (người vận hành hệ thống), mang lại trải nghiệm chuyên biệt cho từng đối tượng.</w:t>
       </w:r>
     </w:p>
     <w:p>
@@ -606,19 +606,7 @@
           <w:vertAlign w:val="baseline"/>
           <w:lang w:val="en-US"/>
         </w:rPr>
-        <w:t>Quản lý tương tác bài hát</w:t>
-      </w:r>
-      <w:bookmarkStart w:id="0" w:name="_GoBack"/>
-      <w:bookmarkEnd w:id="0"/>
-      <w:r>
-        <w:rPr>
-          <w:rFonts w:hint="default"/>
-          <w:sz w:val="32"/>
-          <w:szCs w:val="32"/>
-          <w:vertAlign w:val="baseline"/>
-          <w:lang w:val="en-US"/>
-        </w:rPr>
-        <w:t>:</w:t>
+        <w:t>Quản lý tương tác bài hát:</w:t>
       </w:r>
     </w:p>
     <w:p>
@@ -1276,12 +1264,6 @@
             <w:insideH w:val="single" w:color="auto" w:sz="4" w:space="0"/>
             <w:insideV w:val="single" w:color="auto" w:sz="4" w:space="0"/>
           </w:tblBorders>
-          <w:tblCellMar>
-            <w:top w:w="0" w:type="dxa"/>
-            <w:left w:w="108" w:type="dxa"/>
-            <w:bottom w:w="0" w:type="dxa"/>
-            <w:right w:w="108" w:type="dxa"/>
-          </w:tblCellMar>
         </w:tblPrEx>
         <w:tc>
           <w:tcPr>
@@ -2301,7 +2283,7 @@
                 <w:vertAlign w:val="baseline"/>
                 <w:lang w:val="en-US"/>
               </w:rPr>
-              <w:t>Hệ thống ghi nhận phương thức xử lý của Admin và trạng thái của báo cáo được cập nhật thành “Đã xử lý”.</w:t>
+              <w:t>Hệ thống ghi nhận phương thức xử lý của Admin và trạng thái của báo cáo từ “Chưa xử lý” được cập nhật thành “Đã xử lý”.</w:t>
             </w:r>
           </w:p>
           <w:p>
@@ -2329,6 +2311,34 @@
                 <w:vertAlign w:val="baseline"/>
                 <w:lang w:val="en-US"/>
               </w:rPr>
+              <w:t>Hệ thống thực hiện phương thức xử lý báo mà Admin đã chọn đối với bài hát hoặc người dùng vi phạm thành công.</w:t>
+            </w:r>
+          </w:p>
+          <w:p>
+            <w:pPr>
+              <w:widowControl w:val="0"/>
+              <w:numPr>
+                <w:ilvl w:val="0"/>
+                <w:numId w:val="6"/>
+              </w:numPr>
+              <w:ind w:left="0" w:leftChars="0" w:firstLine="0" w:firstLineChars="0"/>
+              <w:jc w:val="both"/>
+              <w:rPr>
+                <w:rFonts w:hint="default"/>
+                <w:sz w:val="32"/>
+                <w:szCs w:val="32"/>
+                <w:vertAlign w:val="baseline"/>
+                <w:lang w:val="en-US"/>
+              </w:rPr>
+            </w:pPr>
+            <w:r>
+              <w:rPr>
+                <w:rFonts w:hint="default"/>
+                <w:sz w:val="32"/>
+                <w:szCs w:val="32"/>
+                <w:vertAlign w:val="baseline"/>
+                <w:lang w:val="en-US"/>
+              </w:rPr>
               <w:t>Hệ thống sẽ hiện lại giao diện với danh sách báo cáo vi phạm sau khi cập nhật thành công.</w:t>
             </w:r>
           </w:p>
@@ -2357,7 +2367,7 @@
                 <w:vertAlign w:val="baseline"/>
                 <w:lang w:val="en-US"/>
               </w:rPr>
-              <w:t>Hệ thống thông báo đến người báo cáo và người vi phạm.</w:t>
+              <w:t>Hệ thống thông báo đến người báo cáo và người vi phạm thành công.</w:t>
             </w:r>
           </w:p>
         </w:tc>
@@ -2410,27 +2420,52 @@
             <w:pPr>
               <w:widowControl w:val="0"/>
               <w:numPr>
-                <w:ilvl w:val="0"/>
-                <w:numId w:val="7"/>
-              </w:numPr>
-              <w:jc w:val="both"/>
-              <w:rPr>
-                <w:rFonts w:hint="default"/>
-                <w:sz w:val="32"/>
-                <w:szCs w:val="32"/>
-                <w:vertAlign w:val="baseline"/>
-                <w:lang w:val="en-US"/>
-              </w:rPr>
-            </w:pPr>
-            <w:r>
-              <w:rPr>
-                <w:rFonts w:hint="default"/>
-                <w:sz w:val="32"/>
-                <w:szCs w:val="32"/>
-                <w:vertAlign w:val="baseline"/>
-                <w:lang w:val="en-US"/>
-              </w:rPr>
-              <w:t>Nếu hệ thống hiện giao diện, ghi nhận phương thức xử lý của Admin, cập nhật trạng thái, hiện lại danh sách báo cáo hoặc thông báo không thành công thì hệ thống thông báo lỗi đến Admin.</w:t>
+                <w:numId w:val="0"/>
+              </w:numPr>
+              <w:jc w:val="both"/>
+              <w:rPr>
+                <w:rFonts w:hint="default"/>
+                <w:sz w:val="32"/>
+                <w:szCs w:val="32"/>
+                <w:vertAlign w:val="baseline"/>
+                <w:lang w:val="en-US"/>
+              </w:rPr>
+            </w:pPr>
+            <w:r>
+              <w:rPr>
+                <w:rFonts w:hint="default"/>
+                <w:sz w:val="32"/>
+                <w:szCs w:val="32"/>
+                <w:vertAlign w:val="baseline"/>
+                <w:lang w:val="en-US"/>
+              </w:rPr>
+              <w:t>5.1. Nếu hệ thống cập nhật trạng thái của báo cáo không thành công thì hệ thống vẫn giữ trạng thái của báo cáo là “Chưa xử lý” và thông báo “Cập nhật trạng thái của báo cáo thất bại” đến Admin.</w:t>
+            </w:r>
+          </w:p>
+          <w:p>
+            <w:pPr>
+              <w:widowControl w:val="0"/>
+              <w:numPr>
+                <w:numId w:val="0"/>
+              </w:numPr>
+              <w:jc w:val="both"/>
+              <w:rPr>
+                <w:rFonts w:hint="default"/>
+                <w:sz w:val="32"/>
+                <w:szCs w:val="32"/>
+                <w:vertAlign w:val="baseline"/>
+                <w:lang w:val="en-US"/>
+              </w:rPr>
+            </w:pPr>
+            <w:r>
+              <w:rPr>
+                <w:rFonts w:hint="default"/>
+                <w:sz w:val="32"/>
+                <w:szCs w:val="32"/>
+                <w:vertAlign w:val="baseline"/>
+                <w:lang w:val="en-US"/>
+              </w:rPr>
+              <w:t>6.1 Nếu hệ thống thực hiện phương thức xử lý không thành công thì hệ thống thông báo “Xử lý báo cáo thất bại” đến Admin.</w:t>
             </w:r>
           </w:p>
         </w:tc>
@@ -2484,26 +2519,26 @@
               <w:widowControl w:val="0"/>
               <w:numPr>
                 <w:ilvl w:val="0"/>
-                <w:numId w:val="8"/>
-              </w:numPr>
-              <w:jc w:val="both"/>
-              <w:rPr>
-                <w:rFonts w:hint="default"/>
-                <w:sz w:val="32"/>
-                <w:szCs w:val="32"/>
-                <w:vertAlign w:val="baseline"/>
-                <w:lang w:val="en-US"/>
-              </w:rPr>
-            </w:pPr>
-            <w:r>
-              <w:rPr>
-                <w:rFonts w:hint="default"/>
-                <w:sz w:val="32"/>
-                <w:szCs w:val="32"/>
-                <w:vertAlign w:val="baseline"/>
-                <w:lang w:val="en-US"/>
-              </w:rPr>
-              <w:t>Admin đăng nhập thành công vào hệ thống.</w:t>
+                <w:numId w:val="7"/>
+              </w:numPr>
+              <w:jc w:val="both"/>
+              <w:rPr>
+                <w:rFonts w:hint="default"/>
+                <w:sz w:val="32"/>
+                <w:szCs w:val="32"/>
+                <w:vertAlign w:val="baseline"/>
+                <w:lang w:val="en-US"/>
+              </w:rPr>
+            </w:pPr>
+            <w:r>
+              <w:rPr>
+                <w:rFonts w:hint="default"/>
+                <w:sz w:val="32"/>
+                <w:szCs w:val="32"/>
+                <w:vertAlign w:val="baseline"/>
+                <w:lang w:val="en-US"/>
+              </w:rPr>
+              <w:t>Hệ thống đang ở chế độ Admin.</w:t>
             </w:r>
           </w:p>
         </w:tc>
@@ -2557,26 +2592,26 @@
               <w:widowControl w:val="0"/>
               <w:numPr>
                 <w:ilvl w:val="0"/>
-                <w:numId w:val="9"/>
-              </w:numPr>
-              <w:jc w:val="both"/>
-              <w:rPr>
-                <w:rFonts w:hint="default"/>
-                <w:sz w:val="32"/>
-                <w:szCs w:val="32"/>
-                <w:vertAlign w:val="baseline"/>
-                <w:lang w:val="en-US"/>
-              </w:rPr>
-            </w:pPr>
-            <w:r>
-              <w:rPr>
-                <w:rFonts w:hint="default"/>
-                <w:sz w:val="32"/>
-                <w:szCs w:val="32"/>
-                <w:vertAlign w:val="baseline"/>
-                <w:lang w:val="en-US"/>
-              </w:rPr>
-              <w:t>Hệ thống sẵn sàng để xử lý báo cáo mới.</w:t>
+                <w:numId w:val="8"/>
+              </w:numPr>
+              <w:jc w:val="both"/>
+              <w:rPr>
+                <w:rFonts w:hint="default"/>
+                <w:sz w:val="32"/>
+                <w:szCs w:val="32"/>
+                <w:vertAlign w:val="baseline"/>
+                <w:lang w:val="en-US"/>
+              </w:rPr>
+            </w:pPr>
+            <w:r>
+              <w:rPr>
+                <w:rFonts w:hint="default"/>
+                <w:sz w:val="32"/>
+                <w:szCs w:val="32"/>
+                <w:vertAlign w:val="baseline"/>
+                <w:lang w:val="en-US"/>
+              </w:rPr>
+              <w:t>Hệ thống sẵn sàng để Admin xử lý báo cáo mới.</w:t>
             </w:r>
           </w:p>
         </w:tc>
@@ -2730,7 +2765,7 @@
               <w:widowControl w:val="0"/>
               <w:numPr>
                 <w:ilvl w:val="0"/>
-                <w:numId w:val="10"/>
+                <w:numId w:val="9"/>
               </w:numPr>
               <w:jc w:val="both"/>
               <w:rPr>
@@ -2757,7 +2792,7 @@
               <w:widowControl w:val="0"/>
               <w:numPr>
                 <w:ilvl w:val="0"/>
-                <w:numId w:val="10"/>
+                <w:numId w:val="9"/>
               </w:numPr>
               <w:ind w:left="0" w:leftChars="0" w:firstLine="0" w:firstLineChars="0"/>
               <w:jc w:val="both"/>
@@ -2785,7 +2820,7 @@
               <w:widowControl w:val="0"/>
               <w:numPr>
                 <w:ilvl w:val="0"/>
-                <w:numId w:val="10"/>
+                <w:numId w:val="9"/>
               </w:numPr>
               <w:ind w:left="0" w:leftChars="0" w:firstLine="0" w:firstLineChars="0"/>
               <w:jc w:val="both"/>
@@ -2805,15 +2840,15 @@
                 <w:vertAlign w:val="baseline"/>
                 <w:lang w:val="en-US"/>
               </w:rPr>
-              <w:t>Admin chọn 1 tài khoản và khoá nó.</w:t>
-            </w:r>
-          </w:p>
-          <w:p>
-            <w:pPr>
-              <w:widowControl w:val="0"/>
-              <w:numPr>
-                <w:ilvl w:val="0"/>
-                <w:numId w:val="10"/>
+              <w:t>Admin chọn 1 tài khoản và khoá nó hoặc mở khoá nếu tài khoản đang bị khoá.</w:t>
+            </w:r>
+          </w:p>
+          <w:p>
+            <w:pPr>
+              <w:widowControl w:val="0"/>
+              <w:numPr>
+                <w:ilvl w:val="0"/>
+                <w:numId w:val="9"/>
               </w:numPr>
               <w:ind w:left="0" w:leftChars="0" w:firstLine="0" w:firstLineChars="0"/>
               <w:jc w:val="both"/>
@@ -2833,15 +2868,15 @@
                 <w:vertAlign w:val="baseline"/>
                 <w:lang w:val="en-US"/>
               </w:rPr>
-              <w:t>Hệ thống ghi nhận trạng thái mới của tài khoản thành công.</w:t>
-            </w:r>
-          </w:p>
-          <w:p>
-            <w:pPr>
-              <w:widowControl w:val="0"/>
-              <w:numPr>
-                <w:ilvl w:val="0"/>
-                <w:numId w:val="10"/>
+              <w:t>Hệ thống ghi nhận trạng thái mới (Khoá/Mở) của tài khoản thành công.</w:t>
+            </w:r>
+          </w:p>
+          <w:p>
+            <w:pPr>
+              <w:widowControl w:val="0"/>
+              <w:numPr>
+                <w:ilvl w:val="0"/>
+                <w:numId w:val="9"/>
               </w:numPr>
               <w:ind w:left="0" w:leftChars="0" w:firstLine="0" w:firstLineChars="0"/>
               <w:jc w:val="both"/>
@@ -2915,26 +2950,26 @@
               <w:widowControl w:val="0"/>
               <w:numPr>
                 <w:ilvl w:val="0"/>
-                <w:numId w:val="11"/>
-              </w:numPr>
-              <w:jc w:val="both"/>
-              <w:rPr>
-                <w:rFonts w:hint="default"/>
-                <w:sz w:val="32"/>
-                <w:szCs w:val="32"/>
-                <w:vertAlign w:val="baseline"/>
-                <w:lang w:val="en-US"/>
-              </w:rPr>
-            </w:pPr>
-            <w:r>
-              <w:rPr>
-                <w:rFonts w:hint="default"/>
-                <w:sz w:val="32"/>
-                <w:szCs w:val="32"/>
-                <w:vertAlign w:val="baseline"/>
-                <w:lang w:val="en-US"/>
-              </w:rPr>
-              <w:t>Nếu hệ thống hiện giao diện, ghi nhận trạng thái mới của tài khoản hoặc hiện lại danh sách tài khoản người dùng sau khi cập nhật không thành công thì hệ thống thông báo lỗi đến Admin.</w:t>
+                <w:numId w:val="10"/>
+              </w:numPr>
+              <w:jc w:val="both"/>
+              <w:rPr>
+                <w:rFonts w:hint="default"/>
+                <w:sz w:val="32"/>
+                <w:szCs w:val="32"/>
+                <w:vertAlign w:val="baseline"/>
+                <w:lang w:val="en-US"/>
+              </w:rPr>
+            </w:pPr>
+            <w:r>
+              <w:rPr>
+                <w:rFonts w:hint="default"/>
+                <w:sz w:val="32"/>
+                <w:szCs w:val="32"/>
+                <w:vertAlign w:val="baseline"/>
+                <w:lang w:val="en-US"/>
+              </w:rPr>
+              <w:t>Nếu hệ thống ghi nhận trạng thái mới của tài khoản không thành công thì hệ thống thông báo “Khoá(Mở khoá) tài khoản thất bại” đến Admin.</w:t>
             </w:r>
           </w:p>
         </w:tc>
@@ -2988,26 +3023,26 @@
               <w:widowControl w:val="0"/>
               <w:numPr>
                 <w:ilvl w:val="0"/>
-                <w:numId w:val="12"/>
-              </w:numPr>
-              <w:jc w:val="both"/>
-              <w:rPr>
-                <w:rFonts w:hint="default"/>
-                <w:sz w:val="32"/>
-                <w:szCs w:val="32"/>
-                <w:vertAlign w:val="baseline"/>
-                <w:lang w:val="en-US"/>
-              </w:rPr>
-            </w:pPr>
-            <w:r>
-              <w:rPr>
-                <w:rFonts w:hint="default"/>
-                <w:sz w:val="32"/>
-                <w:szCs w:val="32"/>
-                <w:vertAlign w:val="baseline"/>
-                <w:lang w:val="en-US"/>
-              </w:rPr>
-              <w:t>Admin đăng nhập thành công vào hệ thống.</w:t>
+                <w:numId w:val="11"/>
+              </w:numPr>
+              <w:jc w:val="both"/>
+              <w:rPr>
+                <w:rFonts w:hint="default"/>
+                <w:sz w:val="32"/>
+                <w:szCs w:val="32"/>
+                <w:vertAlign w:val="baseline"/>
+                <w:lang w:val="en-US"/>
+              </w:rPr>
+            </w:pPr>
+            <w:r>
+              <w:rPr>
+                <w:rFonts w:hint="default"/>
+                <w:sz w:val="32"/>
+                <w:szCs w:val="32"/>
+                <w:vertAlign w:val="baseline"/>
+                <w:lang w:val="en-US"/>
+              </w:rPr>
+              <w:t>Hệ thống đang ở chế độ Admin.</w:t>
             </w:r>
           </w:p>
         </w:tc>
@@ -3061,7 +3096,7 @@
               <w:widowControl w:val="0"/>
               <w:numPr>
                 <w:ilvl w:val="0"/>
-                <w:numId w:val="13"/>
+                <w:numId w:val="12"/>
               </w:numPr>
               <w:ind w:left="0" w:leftChars="0" w:firstLine="0" w:firstLineChars="0"/>
               <w:jc w:val="both"/>
@@ -3235,7 +3270,7 @@
               <w:widowControl w:val="0"/>
               <w:numPr>
                 <w:ilvl w:val="0"/>
-                <w:numId w:val="14"/>
+                <w:numId w:val="13"/>
               </w:numPr>
               <w:jc w:val="both"/>
               <w:rPr>
@@ -3262,7 +3297,7 @@
               <w:widowControl w:val="0"/>
               <w:numPr>
                 <w:ilvl w:val="0"/>
-                <w:numId w:val="14"/>
+                <w:numId w:val="13"/>
               </w:numPr>
               <w:ind w:left="0" w:leftChars="0" w:firstLine="0" w:firstLineChars="0"/>
               <w:jc w:val="both"/>
@@ -3290,7 +3325,7 @@
               <w:widowControl w:val="0"/>
               <w:numPr>
                 <w:ilvl w:val="0"/>
-                <w:numId w:val="14"/>
+                <w:numId w:val="13"/>
               </w:numPr>
               <w:ind w:left="0" w:leftChars="0" w:firstLine="0" w:firstLineChars="0"/>
               <w:jc w:val="both"/>
@@ -3394,15 +3429,15 @@
                 <w:vertAlign w:val="baseline"/>
                 <w:lang w:val="en-US"/>
               </w:rPr>
-              <w:t>3.3/ Nghệ sĩ chọn 1 bài hát cần ẩn và chọn Ẩn bài hát. Hệ thống cập nhật trạng thái của bài hát thành “Đã ẩn” trong danh sách bài hát thành công.</w:t>
-            </w:r>
-          </w:p>
-          <w:p>
-            <w:pPr>
-              <w:widowControl w:val="0"/>
-              <w:numPr>
-                <w:ilvl w:val="0"/>
-                <w:numId w:val="14"/>
+              <w:t>3.3/ Nghệ sĩ chọn 1 bài hát cần ẩn và chọn Ẩn/Hiện bài hát. Hệ thống cập nhật trạng thái của bài hát thành “Đã ẩn” và “Đã hiện” nếu đang bị ẩn trong danh sách bài hát thành công.</w:t>
+            </w:r>
+          </w:p>
+          <w:p>
+            <w:pPr>
+              <w:widowControl w:val="0"/>
+              <w:numPr>
+                <w:ilvl w:val="0"/>
+                <w:numId w:val="13"/>
               </w:numPr>
               <w:ind w:left="0" w:leftChars="0" w:firstLine="0" w:firstLineChars="0"/>
               <w:jc w:val="both"/>
@@ -3422,7 +3457,7 @@
                 <w:vertAlign w:val="baseline"/>
                 <w:lang w:val="en-US"/>
               </w:rPr>
-              <w:t>Hệ thống sẽ hiện lại giao diện với danh sách bài hát cá nhân sau khi cập nhật thành công.</w:t>
+              <w:t>Hệ thống hiện lại danh sách bài hát sau khi cập nhật.</w:t>
             </w:r>
           </w:p>
         </w:tc>
@@ -3475,27 +3510,26 @@
             <w:pPr>
               <w:widowControl w:val="0"/>
               <w:numPr>
-                <w:ilvl w:val="0"/>
-                <w:numId w:val="15"/>
-              </w:numPr>
-              <w:jc w:val="both"/>
-              <w:rPr>
-                <w:rFonts w:hint="default"/>
-                <w:sz w:val="32"/>
-                <w:szCs w:val="32"/>
-                <w:vertAlign w:val="baseline"/>
-                <w:lang w:val="en-US"/>
-              </w:rPr>
-            </w:pPr>
-            <w:r>
-              <w:rPr>
-                <w:rFonts w:hint="default"/>
-                <w:sz w:val="32"/>
-                <w:szCs w:val="32"/>
-                <w:vertAlign w:val="baseline"/>
-                <w:lang w:val="en-US"/>
-              </w:rPr>
-              <w:t>Nếu hệ thống hiện giao diện, ẩn bài hát hoặc hiện lại danh sách bài hát cá nhân sau khi cập nhật không thành công thì hệ thống sẽ thông báo lỗi đến nghệ sĩ.</w:t>
+                <w:numId w:val="0"/>
+              </w:numPr>
+              <w:jc w:val="both"/>
+              <w:rPr>
+                <w:rFonts w:hint="default"/>
+                <w:sz w:val="32"/>
+                <w:szCs w:val="32"/>
+                <w:vertAlign w:val="baseline"/>
+                <w:lang w:val="en-US"/>
+              </w:rPr>
+            </w:pPr>
+            <w:r>
+              <w:rPr>
+                <w:rFonts w:hint="default"/>
+                <w:sz w:val="32"/>
+                <w:szCs w:val="32"/>
+                <w:vertAlign w:val="baseline"/>
+                <w:lang w:val="en-US"/>
+              </w:rPr>
+              <w:t>3.3.1 Nếu hệ thống cập nhật trạng thái của bài hát không thành công thì thông báo “Cập nhật trạng thái của bài hát thất bại” đến nghệ sĩ.</w:t>
             </w:r>
           </w:p>
         </w:tc>
@@ -3549,7 +3583,7 @@
               <w:widowControl w:val="0"/>
               <w:numPr>
                 <w:ilvl w:val="0"/>
-                <w:numId w:val="16"/>
+                <w:numId w:val="14"/>
               </w:numPr>
               <w:ind w:leftChars="0"/>
               <w:jc w:val="both"/>
@@ -3569,15 +3603,15 @@
                 <w:vertAlign w:val="baseline"/>
                 <w:lang w:val="en-US"/>
               </w:rPr>
-              <w:t>Nghệ sĩ đăng nhập thành công vào hệ thống.</w:t>
-            </w:r>
-          </w:p>
-          <w:p>
-            <w:pPr>
-              <w:widowControl w:val="0"/>
-              <w:numPr>
-                <w:ilvl w:val="0"/>
-                <w:numId w:val="16"/>
+              <w:t>Hệ thống đang ở chế độ Nghệ sĩ.</w:t>
+            </w:r>
+          </w:p>
+          <w:p>
+            <w:pPr>
+              <w:widowControl w:val="0"/>
+              <w:numPr>
+                <w:ilvl w:val="0"/>
+                <w:numId w:val="14"/>
               </w:numPr>
               <w:ind w:leftChars="0"/>
               <w:jc w:val="both"/>
@@ -3597,7 +3631,35 @@
                 <w:vertAlign w:val="baseline"/>
                 <w:lang w:val="en-US"/>
               </w:rPr>
-              <w:t>Nghệ sĩ phải có ít nhất 1 bài hát đã tải lên để thực hiện chức năng Ẩn bài hát.</w:t>
+              <w:t>Hệ thống phải có ít nhất 1 bài hát của nghệ sĩ đó đã tải lên và bài hát không bị Admin ẩn để thực hiện chức năng Ẩn/Hiện bài hát.</w:t>
+            </w:r>
+          </w:p>
+          <w:p>
+            <w:pPr>
+              <w:widowControl w:val="0"/>
+              <w:numPr>
+                <w:ilvl w:val="0"/>
+                <w:numId w:val="14"/>
+              </w:numPr>
+              <w:ind w:leftChars="0"/>
+              <w:jc w:val="both"/>
+              <w:rPr>
+                <w:rFonts w:hint="default"/>
+                <w:sz w:val="32"/>
+                <w:szCs w:val="32"/>
+                <w:vertAlign w:val="baseline"/>
+                <w:lang w:val="en-US"/>
+              </w:rPr>
+            </w:pPr>
+            <w:r>
+              <w:rPr>
+                <w:rFonts w:hint="default"/>
+                <w:sz w:val="32"/>
+                <w:szCs w:val="32"/>
+                <w:vertAlign w:val="baseline"/>
+                <w:lang w:val="en-US"/>
+              </w:rPr>
+              <w:t>Tài khoản của nghệ sĩ không bị khoá.</w:t>
             </w:r>
           </w:p>
         </w:tc>
@@ -3651,7 +3713,7 @@
               <w:widowControl w:val="0"/>
               <w:numPr>
                 <w:ilvl w:val="0"/>
-                <w:numId w:val="17"/>
+                <w:numId w:val="15"/>
               </w:numPr>
               <w:ind w:left="0" w:leftChars="0" w:firstLine="0" w:firstLineChars="0"/>
               <w:jc w:val="both"/>
@@ -3825,7 +3887,7 @@
               <w:widowControl w:val="0"/>
               <w:numPr>
                 <w:ilvl w:val="0"/>
-                <w:numId w:val="18"/>
+                <w:numId w:val="16"/>
               </w:numPr>
               <w:jc w:val="both"/>
               <w:rPr>
@@ -3852,7 +3914,7 @@
               <w:widowControl w:val="0"/>
               <w:numPr>
                 <w:ilvl w:val="0"/>
-                <w:numId w:val="18"/>
+                <w:numId w:val="16"/>
               </w:numPr>
               <w:jc w:val="both"/>
               <w:rPr>
@@ -3879,7 +3941,7 @@
               <w:widowControl w:val="0"/>
               <w:numPr>
                 <w:ilvl w:val="0"/>
-                <w:numId w:val="18"/>
+                <w:numId w:val="16"/>
               </w:numPr>
               <w:jc w:val="both"/>
               <w:rPr>
@@ -3899,6 +3961,33 @@
                 <w:lang w:val="en-US"/>
               </w:rPr>
               <w:t>Hệ thống ghi nhận bài hát mới vào danh sách bài hát cá nhân nghệ sĩ thành công.</w:t>
+            </w:r>
+          </w:p>
+          <w:p>
+            <w:pPr>
+              <w:widowControl w:val="0"/>
+              <w:numPr>
+                <w:ilvl w:val="0"/>
+                <w:numId w:val="16"/>
+              </w:numPr>
+              <w:jc w:val="both"/>
+              <w:rPr>
+                <w:rFonts w:hint="default"/>
+                <w:sz w:val="32"/>
+                <w:szCs w:val="32"/>
+                <w:vertAlign w:val="baseline"/>
+                <w:lang w:val="en-US"/>
+              </w:rPr>
+            </w:pPr>
+            <w:r>
+              <w:rPr>
+                <w:rFonts w:hint="default"/>
+                <w:sz w:val="32"/>
+                <w:szCs w:val="32"/>
+                <w:vertAlign w:val="baseline"/>
+                <w:lang w:val="en-US"/>
+              </w:rPr>
+              <w:t>Hệ thống chuyển sang giao diện Quản lý bài hát cá nhân nghệ sĩ thành công.</w:t>
             </w:r>
           </w:p>
         </w:tc>
@@ -3952,26 +4041,26 @@
               <w:widowControl w:val="0"/>
               <w:numPr>
                 <w:ilvl w:val="0"/>
-                <w:numId w:val="19"/>
-              </w:numPr>
-              <w:jc w:val="both"/>
-              <w:rPr>
-                <w:rFonts w:hint="default"/>
-                <w:sz w:val="32"/>
-                <w:szCs w:val="32"/>
-                <w:vertAlign w:val="baseline"/>
-                <w:lang w:val="en-US"/>
-              </w:rPr>
-            </w:pPr>
-            <w:r>
-              <w:rPr>
-                <w:rFonts w:hint="default"/>
-                <w:sz w:val="32"/>
-                <w:szCs w:val="32"/>
-                <w:vertAlign w:val="baseline"/>
-                <w:lang w:val="en-US"/>
-              </w:rPr>
-              <w:t>Nếu hệ thống hiện giao diện, ghi nhận bài hát mới vào danh sách bài hát cá nhân nghệ sĩ hoặc hiện lại danh sách các bài hát cá nhân nghệ sĩ sau khi cập nhật không thành công thì hệ thống sẽ thông báo lỗi đến nghệ sĩ.</w:t>
+                <w:numId w:val="17"/>
+              </w:numPr>
+              <w:jc w:val="both"/>
+              <w:rPr>
+                <w:rFonts w:hint="default"/>
+                <w:sz w:val="32"/>
+                <w:szCs w:val="32"/>
+                <w:vertAlign w:val="baseline"/>
+                <w:lang w:val="en-US"/>
+              </w:rPr>
+            </w:pPr>
+            <w:r>
+              <w:rPr>
+                <w:rFonts w:hint="default"/>
+                <w:sz w:val="32"/>
+                <w:szCs w:val="32"/>
+                <w:vertAlign w:val="baseline"/>
+                <w:lang w:val="en-US"/>
+              </w:rPr>
+              <w:t>Nếu hệ thống ghi nhận bài hát mới vào danh sách bài hát cá nhân nghệ sĩ không thành công thì hệ thống sẽ thông báo “Tải lên bài hát thất bại” đến nghệ sĩ.</w:t>
             </w:r>
           </w:p>
         </w:tc>
@@ -4025,26 +4114,53 @@
               <w:widowControl w:val="0"/>
               <w:numPr>
                 <w:ilvl w:val="0"/>
-                <w:numId w:val="20"/>
-              </w:numPr>
-              <w:jc w:val="both"/>
-              <w:rPr>
-                <w:rFonts w:hint="default"/>
-                <w:sz w:val="32"/>
-                <w:szCs w:val="32"/>
-                <w:vertAlign w:val="baseline"/>
-                <w:lang w:val="en-US"/>
-              </w:rPr>
-            </w:pPr>
-            <w:r>
-              <w:rPr>
-                <w:rFonts w:hint="default"/>
-                <w:sz w:val="32"/>
-                <w:szCs w:val="32"/>
-                <w:vertAlign w:val="baseline"/>
-                <w:lang w:val="en-US"/>
-              </w:rPr>
-              <w:t>Nghệ sĩ đăng nhập thành công vào hệ thống.</w:t>
+                <w:numId w:val="18"/>
+              </w:numPr>
+              <w:jc w:val="both"/>
+              <w:rPr>
+                <w:rFonts w:hint="default"/>
+                <w:sz w:val="32"/>
+                <w:szCs w:val="32"/>
+                <w:vertAlign w:val="baseline"/>
+                <w:lang w:val="en-US"/>
+              </w:rPr>
+            </w:pPr>
+            <w:r>
+              <w:rPr>
+                <w:rFonts w:hint="default"/>
+                <w:sz w:val="32"/>
+                <w:szCs w:val="32"/>
+                <w:vertAlign w:val="baseline"/>
+                <w:lang w:val="en-US"/>
+              </w:rPr>
+              <w:t>Hệ thống ở chế độ Nghệ sĩ.</w:t>
+            </w:r>
+          </w:p>
+          <w:p>
+            <w:pPr>
+              <w:widowControl w:val="0"/>
+              <w:numPr>
+                <w:ilvl w:val="0"/>
+                <w:numId w:val="18"/>
+              </w:numPr>
+              <w:jc w:val="both"/>
+              <w:rPr>
+                <w:rFonts w:hint="default"/>
+                <w:sz w:val="32"/>
+                <w:szCs w:val="32"/>
+                <w:vertAlign w:val="baseline"/>
+                <w:lang w:val="en-US"/>
+              </w:rPr>
+            </w:pPr>
+            <w:r>
+              <w:rPr>
+                <w:rFonts w:hint="default"/>
+                <w:sz w:val="32"/>
+                <w:szCs w:val="32"/>
+                <w:vertAlign w:val="baseline"/>
+                <w:lang w:val="en-US"/>
+              </w:rPr>
+              <w:t>Tài khoản của nghệ sĩ không bị khoá.</w:t>
             </w:r>
           </w:p>
         </w:tc>
@@ -4098,7 +4214,7 @@
               <w:widowControl w:val="0"/>
               <w:numPr>
                 <w:ilvl w:val="0"/>
-                <w:numId w:val="21"/>
+                <w:numId w:val="19"/>
               </w:numPr>
               <w:ind w:left="0" w:leftChars="0" w:firstLine="0" w:firstLineChars="0"/>
               <w:jc w:val="both"/>
@@ -4118,7 +4234,7 @@
                 <w:vertAlign w:val="baseline"/>
                 <w:lang w:val="en-US"/>
               </w:rPr>
-              <w:t>Hệ thống chuyển sang giao diện Quản lý bài hát cá nhân nghệ sĩ sau khi tải lên bài hát.</w:t>
+              <w:t>Hệ thống ở trạng thái cho nghệ sĩ tải lên 1 bài hát mới.</w:t>
             </w:r>
           </w:p>
         </w:tc>
@@ -4272,7 +4388,7 @@
               <w:widowControl w:val="0"/>
               <w:numPr>
                 <w:ilvl w:val="0"/>
-                <w:numId w:val="22"/>
+                <w:numId w:val="20"/>
               </w:numPr>
               <w:ind w:left="0" w:leftChars="0" w:firstLine="0" w:firstLineChars="0"/>
               <w:jc w:val="both"/>
@@ -4300,7 +4416,7 @@
               <w:widowControl w:val="0"/>
               <w:numPr>
                 <w:ilvl w:val="0"/>
-                <w:numId w:val="22"/>
+                <w:numId w:val="20"/>
               </w:numPr>
               <w:ind w:left="0" w:leftChars="0" w:firstLine="0" w:firstLineChars="0"/>
               <w:jc w:val="both"/>
@@ -4328,7 +4444,7 @@
               <w:widowControl w:val="0"/>
               <w:numPr>
                 <w:ilvl w:val="0"/>
-                <w:numId w:val="22"/>
+                <w:numId w:val="20"/>
               </w:numPr>
               <w:ind w:left="0" w:leftChars="0" w:firstLine="0" w:firstLineChars="0"/>
               <w:jc w:val="both"/>
@@ -4349,6 +4465,34 @@
                 <w:lang w:val="en-US"/>
               </w:rPr>
               <w:t>Hệ thống cập nhật thông tin mới của bài hát đó vào danh sách bài hát cá nhân nghệ sĩ thành công.</w:t>
+            </w:r>
+          </w:p>
+          <w:p>
+            <w:pPr>
+              <w:widowControl w:val="0"/>
+              <w:numPr>
+                <w:ilvl w:val="0"/>
+                <w:numId w:val="20"/>
+              </w:numPr>
+              <w:ind w:left="0" w:leftChars="0" w:firstLine="0" w:firstLineChars="0"/>
+              <w:jc w:val="both"/>
+              <w:rPr>
+                <w:rFonts w:hint="default"/>
+                <w:sz w:val="32"/>
+                <w:szCs w:val="32"/>
+                <w:vertAlign w:val="baseline"/>
+                <w:lang w:val="en-US"/>
+              </w:rPr>
+            </w:pPr>
+            <w:r>
+              <w:rPr>
+                <w:rFonts w:hint="default"/>
+                <w:sz w:val="32"/>
+                <w:szCs w:val="32"/>
+                <w:vertAlign w:val="baseline"/>
+                <w:lang w:val="en-US"/>
+              </w:rPr>
+              <w:t>Hệ thống chuyển sang giao diện Quản lý bài hát cá nhân nghệ sĩ thành công.</w:t>
             </w:r>
           </w:p>
         </w:tc>
@@ -4402,26 +4546,26 @@
               <w:widowControl w:val="0"/>
               <w:numPr>
                 <w:ilvl w:val="0"/>
-                <w:numId w:val="23"/>
-              </w:numPr>
-              <w:jc w:val="both"/>
-              <w:rPr>
-                <w:rFonts w:hint="default"/>
-                <w:sz w:val="32"/>
-                <w:szCs w:val="32"/>
-                <w:vertAlign w:val="baseline"/>
-                <w:lang w:val="en-US"/>
-              </w:rPr>
-            </w:pPr>
-            <w:r>
-              <w:rPr>
-                <w:rFonts w:hint="default"/>
-                <w:sz w:val="32"/>
-                <w:szCs w:val="32"/>
-                <w:vertAlign w:val="baseline"/>
-                <w:lang w:val="en-US"/>
-              </w:rPr>
-              <w:t>Nếu hệ thống hiện giao diện, hiện form, cập nhật thông tin mới của bài hát đó không thành công thì hệ thống sẽ thông báo lỗi đến nghệ sĩ.</w:t>
+                <w:numId w:val="21"/>
+              </w:numPr>
+              <w:jc w:val="both"/>
+              <w:rPr>
+                <w:rFonts w:hint="default"/>
+                <w:sz w:val="32"/>
+                <w:szCs w:val="32"/>
+                <w:vertAlign w:val="baseline"/>
+                <w:lang w:val="en-US"/>
+              </w:rPr>
+            </w:pPr>
+            <w:r>
+              <w:rPr>
+                <w:rFonts w:hint="default"/>
+                <w:sz w:val="32"/>
+                <w:szCs w:val="32"/>
+                <w:vertAlign w:val="baseline"/>
+                <w:lang w:val="en-US"/>
+              </w:rPr>
+              <w:t>Nếu hệ thống cập nhật thông tin mới của bài hát đó không thành công thì hệ thống sẽ thông báo “Cập nhật thông tin bài hát thất bại” đến nghệ sĩ.</w:t>
             </w:r>
           </w:p>
         </w:tc>
@@ -4475,53 +4619,80 @@
               <w:widowControl w:val="0"/>
               <w:numPr>
                 <w:ilvl w:val="0"/>
-                <w:numId w:val="24"/>
-              </w:numPr>
-              <w:jc w:val="both"/>
-              <w:rPr>
-                <w:rFonts w:hint="default"/>
-                <w:sz w:val="32"/>
-                <w:szCs w:val="32"/>
-                <w:vertAlign w:val="baseline"/>
-                <w:lang w:val="en-US"/>
-              </w:rPr>
-            </w:pPr>
-            <w:r>
-              <w:rPr>
-                <w:rFonts w:hint="default"/>
-                <w:sz w:val="32"/>
-                <w:szCs w:val="32"/>
-                <w:vertAlign w:val="baseline"/>
-                <w:lang w:val="en-US"/>
-              </w:rPr>
-              <w:t>Nghệ sĩ đăng nhập thành công vào hệ thống.</w:t>
-            </w:r>
-          </w:p>
-          <w:p>
-            <w:pPr>
-              <w:widowControl w:val="0"/>
-              <w:numPr>
-                <w:ilvl w:val="0"/>
-                <w:numId w:val="24"/>
-              </w:numPr>
-              <w:jc w:val="both"/>
-              <w:rPr>
-                <w:rFonts w:hint="default"/>
-                <w:sz w:val="32"/>
-                <w:szCs w:val="32"/>
-                <w:vertAlign w:val="baseline"/>
-                <w:lang w:val="en-US"/>
-              </w:rPr>
-            </w:pPr>
-            <w:r>
-              <w:rPr>
-                <w:rFonts w:hint="default"/>
-                <w:sz w:val="32"/>
-                <w:szCs w:val="32"/>
-                <w:vertAlign w:val="baseline"/>
-                <w:lang w:val="en-US"/>
-              </w:rPr>
-              <w:t>Nghệ sĩ phải có ít nhất 1 bài hát đã tải lên để thực hiện chức năng Sửa thông tin bài hát.</w:t>
+                <w:numId w:val="22"/>
+              </w:numPr>
+              <w:jc w:val="both"/>
+              <w:rPr>
+                <w:rFonts w:hint="default"/>
+                <w:sz w:val="32"/>
+                <w:szCs w:val="32"/>
+                <w:vertAlign w:val="baseline"/>
+                <w:lang w:val="en-US"/>
+              </w:rPr>
+            </w:pPr>
+            <w:r>
+              <w:rPr>
+                <w:rFonts w:hint="default"/>
+                <w:sz w:val="32"/>
+                <w:szCs w:val="32"/>
+                <w:vertAlign w:val="baseline"/>
+                <w:lang w:val="en-US"/>
+              </w:rPr>
+              <w:t>Hệ thống ở chế độ Nghệ sĩ.</w:t>
+            </w:r>
+          </w:p>
+          <w:p>
+            <w:pPr>
+              <w:widowControl w:val="0"/>
+              <w:numPr>
+                <w:ilvl w:val="0"/>
+                <w:numId w:val="22"/>
+              </w:numPr>
+              <w:jc w:val="both"/>
+              <w:rPr>
+                <w:rFonts w:hint="default"/>
+                <w:sz w:val="32"/>
+                <w:szCs w:val="32"/>
+                <w:vertAlign w:val="baseline"/>
+                <w:lang w:val="en-US"/>
+              </w:rPr>
+            </w:pPr>
+            <w:r>
+              <w:rPr>
+                <w:rFonts w:hint="default"/>
+                <w:sz w:val="32"/>
+                <w:szCs w:val="32"/>
+                <w:vertAlign w:val="baseline"/>
+                <w:lang w:val="en-US"/>
+              </w:rPr>
+              <w:t>Hệ thống phải có ít nhất 1 bài hát của nghệ sĩ đó đã tải lên và bài hát không bị Admin ẩn để thực hiện chức năng Sửa thông tin bài hát.</w:t>
+            </w:r>
+          </w:p>
+          <w:p>
+            <w:pPr>
+              <w:widowControl w:val="0"/>
+              <w:numPr>
+                <w:ilvl w:val="0"/>
+                <w:numId w:val="22"/>
+              </w:numPr>
+              <w:jc w:val="both"/>
+              <w:rPr>
+                <w:rFonts w:hint="default"/>
+                <w:sz w:val="32"/>
+                <w:szCs w:val="32"/>
+                <w:vertAlign w:val="baseline"/>
+                <w:lang w:val="en-US"/>
+              </w:rPr>
+            </w:pPr>
+            <w:r>
+              <w:rPr>
+                <w:rFonts w:hint="default"/>
+                <w:sz w:val="32"/>
+                <w:szCs w:val="32"/>
+                <w:vertAlign w:val="baseline"/>
+                <w:lang w:val="en-US"/>
+              </w:rPr>
+              <w:t>Tài khoản của nghệ sĩ không bị khoá.</w:t>
             </w:r>
           </w:p>
         </w:tc>
@@ -4575,7 +4746,7 @@
               <w:widowControl w:val="0"/>
               <w:numPr>
                 <w:ilvl w:val="0"/>
-                <w:numId w:val="25"/>
+                <w:numId w:val="23"/>
               </w:numPr>
               <w:ind w:left="0" w:leftChars="0" w:firstLine="0" w:firstLineChars="0"/>
               <w:jc w:val="both"/>
@@ -4595,7 +4766,7 @@
                 <w:vertAlign w:val="baseline"/>
                 <w:lang w:val="en-US"/>
               </w:rPr>
-              <w:t>Hệ thống chuyển sang giao diện Quản lý bài hát cá nhân nghệ sĩ sau khi sửa thông tin bài hát.</w:t>
+              <w:t>Hệ thống ở trạng thái cho nghệ sĩ sửa thông tin 1 bài hát khác.</w:t>
             </w:r>
           </w:p>
         </w:tc>
@@ -4749,7 +4920,7 @@
               <w:widowControl w:val="0"/>
               <w:numPr>
                 <w:ilvl w:val="0"/>
-                <w:numId w:val="26"/>
+                <w:numId w:val="24"/>
               </w:numPr>
               <w:ind w:leftChars="0"/>
               <w:jc w:val="both"/>
@@ -4777,7 +4948,7 @@
               <w:widowControl w:val="0"/>
               <w:numPr>
                 <w:ilvl w:val="0"/>
-                <w:numId w:val="26"/>
+                <w:numId w:val="24"/>
               </w:numPr>
               <w:ind w:leftChars="0"/>
               <w:jc w:val="both"/>
@@ -4805,7 +4976,7 @@
               <w:widowControl w:val="0"/>
               <w:numPr>
                 <w:ilvl w:val="0"/>
-                <w:numId w:val="26"/>
+                <w:numId w:val="24"/>
               </w:numPr>
               <w:ind w:leftChars="0"/>
               <w:jc w:val="both"/>
@@ -4833,7 +5004,7 @@
               <w:widowControl w:val="0"/>
               <w:numPr>
                 <w:ilvl w:val="0"/>
-                <w:numId w:val="26"/>
+                <w:numId w:val="24"/>
               </w:numPr>
               <w:ind w:leftChars="0"/>
               <w:jc w:val="both"/>
@@ -4861,7 +5032,7 @@
               <w:widowControl w:val="0"/>
               <w:numPr>
                 <w:ilvl w:val="0"/>
-                <w:numId w:val="26"/>
+                <w:numId w:val="24"/>
               </w:numPr>
               <w:ind w:leftChars="0"/>
               <w:jc w:val="both"/>
@@ -4935,26 +5106,26 @@
               <w:widowControl w:val="0"/>
               <w:numPr>
                 <w:ilvl w:val="0"/>
-                <w:numId w:val="27"/>
-              </w:numPr>
-              <w:jc w:val="both"/>
-              <w:rPr>
-                <w:rFonts w:hint="default"/>
-                <w:sz w:val="32"/>
-                <w:szCs w:val="32"/>
-                <w:vertAlign w:val="baseline"/>
-                <w:lang w:val="en-US"/>
-              </w:rPr>
-            </w:pPr>
-            <w:r>
-              <w:rPr>
-                <w:rFonts w:hint="default"/>
-                <w:sz w:val="32"/>
-                <w:szCs w:val="32"/>
-                <w:vertAlign w:val="baseline"/>
-                <w:lang w:val="en-US"/>
-              </w:rPr>
-              <w:t>Nếu hệ thống hiện giao diện, ghi nhận báo cáo, đưa vào danh sách báo cáo vi phạm của Admin hoặc trở lại giao diện không thành công thì hệ thống sẽ thông báo lỗi đến người dùng.</w:t>
+                <w:numId w:val="25"/>
+              </w:numPr>
+              <w:jc w:val="both"/>
+              <w:rPr>
+                <w:rFonts w:hint="default"/>
+                <w:sz w:val="32"/>
+                <w:szCs w:val="32"/>
+                <w:vertAlign w:val="baseline"/>
+                <w:lang w:val="en-US"/>
+              </w:rPr>
+            </w:pPr>
+            <w:r>
+              <w:rPr>
+                <w:rFonts w:hint="default"/>
+                <w:sz w:val="32"/>
+                <w:szCs w:val="32"/>
+                <w:vertAlign w:val="baseline"/>
+                <w:lang w:val="en-US"/>
+              </w:rPr>
+              <w:t>Nếu hệ thống ghi nhận báo cáo không thành công thì hệ thống sẽ thông báo “Báo cáo thất bại” đến người dùng.</w:t>
             </w:r>
           </w:p>
         </w:tc>
@@ -5008,26 +5179,53 @@
               <w:widowControl w:val="0"/>
               <w:numPr>
                 <w:ilvl w:val="0"/>
-                <w:numId w:val="28"/>
-              </w:numPr>
-              <w:jc w:val="both"/>
-              <w:rPr>
-                <w:rFonts w:hint="default"/>
-                <w:sz w:val="32"/>
-                <w:szCs w:val="32"/>
-                <w:vertAlign w:val="baseline"/>
-                <w:lang w:val="en-US"/>
-              </w:rPr>
-            </w:pPr>
-            <w:r>
-              <w:rPr>
-                <w:rFonts w:hint="default"/>
-                <w:sz w:val="32"/>
-                <w:szCs w:val="32"/>
-                <w:vertAlign w:val="baseline"/>
-                <w:lang w:val="en-US"/>
-              </w:rPr>
-              <w:t>Người dùng đăng nhập thành công vào hệ thống.</w:t>
+                <w:numId w:val="26"/>
+              </w:numPr>
+              <w:jc w:val="both"/>
+              <w:rPr>
+                <w:rFonts w:hint="default"/>
+                <w:sz w:val="32"/>
+                <w:szCs w:val="32"/>
+                <w:vertAlign w:val="baseline"/>
+                <w:lang w:val="en-US"/>
+              </w:rPr>
+            </w:pPr>
+            <w:r>
+              <w:rPr>
+                <w:rFonts w:hint="default"/>
+                <w:sz w:val="32"/>
+                <w:szCs w:val="32"/>
+                <w:vertAlign w:val="baseline"/>
+                <w:lang w:val="en-US"/>
+              </w:rPr>
+              <w:t>Hệ thống ở chế độ Người dùng.</w:t>
+            </w:r>
+          </w:p>
+          <w:p>
+            <w:pPr>
+              <w:widowControl w:val="0"/>
+              <w:numPr>
+                <w:ilvl w:val="0"/>
+                <w:numId w:val="26"/>
+              </w:numPr>
+              <w:jc w:val="both"/>
+              <w:rPr>
+                <w:rFonts w:hint="default"/>
+                <w:sz w:val="32"/>
+                <w:szCs w:val="32"/>
+                <w:vertAlign w:val="baseline"/>
+                <w:lang w:val="en-US"/>
+              </w:rPr>
+            </w:pPr>
+            <w:r>
+              <w:rPr>
+                <w:rFonts w:hint="default"/>
+                <w:sz w:val="32"/>
+                <w:szCs w:val="32"/>
+                <w:vertAlign w:val="baseline"/>
+                <w:lang w:val="en-US"/>
+              </w:rPr>
+              <w:t>Tài khoản của người dùng không bị khoá.</w:t>
             </w:r>
           </w:p>
         </w:tc>
@@ -5081,7 +5279,7 @@
               <w:widowControl w:val="0"/>
               <w:numPr>
                 <w:ilvl w:val="0"/>
-                <w:numId w:val="29"/>
+                <w:numId w:val="27"/>
               </w:numPr>
               <w:ind w:left="0" w:leftChars="0" w:firstLine="0" w:firstLineChars="0"/>
               <w:jc w:val="both"/>
@@ -5255,7 +5453,7 @@
               <w:widowControl w:val="0"/>
               <w:numPr>
                 <w:ilvl w:val="0"/>
-                <w:numId w:val="30"/>
+                <w:numId w:val="28"/>
               </w:numPr>
               <w:jc w:val="both"/>
               <w:rPr>
@@ -5282,7 +5480,7 @@
               <w:widowControl w:val="0"/>
               <w:numPr>
                 <w:ilvl w:val="0"/>
-                <w:numId w:val="30"/>
+                <w:numId w:val="28"/>
               </w:numPr>
               <w:jc w:val="both"/>
               <w:rPr>
@@ -5309,7 +5507,7 @@
               <w:widowControl w:val="0"/>
               <w:numPr>
                 <w:ilvl w:val="0"/>
-                <w:numId w:val="30"/>
+                <w:numId w:val="28"/>
               </w:numPr>
               <w:jc w:val="both"/>
               <w:rPr>
@@ -5336,7 +5534,7 @@
               <w:widowControl w:val="0"/>
               <w:numPr>
                 <w:ilvl w:val="0"/>
-                <w:numId w:val="30"/>
+                <w:numId w:val="28"/>
               </w:numPr>
               <w:jc w:val="both"/>
               <w:rPr>
@@ -5363,34 +5561,34 @@
               <w:widowControl w:val="0"/>
               <w:numPr>
                 <w:ilvl w:val="0"/>
-                <w:numId w:val="30"/>
-              </w:numPr>
-              <w:jc w:val="both"/>
-              <w:rPr>
-                <w:rFonts w:hint="default"/>
-                <w:sz w:val="32"/>
-                <w:szCs w:val="32"/>
-                <w:vertAlign w:val="baseline"/>
-                <w:lang w:val="en-US"/>
-              </w:rPr>
-            </w:pPr>
-            <w:r>
-              <w:rPr>
-                <w:rFonts w:hint="default"/>
-                <w:sz w:val="32"/>
-                <w:szCs w:val="32"/>
-                <w:vertAlign w:val="baseline"/>
-                <w:lang w:val="en-US"/>
-              </w:rPr>
-              <w:t>Hệ thống sẽ đưa nghệ sĩ đó vào danh sách nghệ sĩ đã theo dõi thành công.</w:t>
-            </w:r>
-          </w:p>
-          <w:p>
-            <w:pPr>
-              <w:widowControl w:val="0"/>
-              <w:numPr>
-                <w:ilvl w:val="0"/>
-                <w:numId w:val="30"/>
+                <w:numId w:val="28"/>
+              </w:numPr>
+              <w:jc w:val="both"/>
+              <w:rPr>
+                <w:rFonts w:hint="default"/>
+                <w:sz w:val="32"/>
+                <w:szCs w:val="32"/>
+                <w:vertAlign w:val="baseline"/>
+                <w:lang w:val="en-US"/>
+              </w:rPr>
+            </w:pPr>
+            <w:r>
+              <w:rPr>
+                <w:rFonts w:hint="default"/>
+                <w:sz w:val="32"/>
+                <w:szCs w:val="32"/>
+                <w:vertAlign w:val="baseline"/>
+                <w:lang w:val="en-US"/>
+              </w:rPr>
+              <w:t>Hệ thống sẽ đưa nghệ sĩ đó vào danh sách nghệ sĩ đã theo dõi của người dùng thành công.</w:t>
+            </w:r>
+          </w:p>
+          <w:p>
+            <w:pPr>
+              <w:widowControl w:val="0"/>
+              <w:numPr>
+                <w:ilvl w:val="0"/>
+                <w:numId w:val="28"/>
               </w:numPr>
               <w:jc w:val="both"/>
               <w:rPr>
@@ -5463,26 +5661,26 @@
               <w:widowControl w:val="0"/>
               <w:numPr>
                 <w:ilvl w:val="0"/>
-                <w:numId w:val="31"/>
-              </w:numPr>
-              <w:jc w:val="both"/>
-              <w:rPr>
-                <w:rFonts w:hint="default"/>
-                <w:sz w:val="32"/>
-                <w:szCs w:val="32"/>
-                <w:vertAlign w:val="baseline"/>
-                <w:lang w:val="en-US"/>
-              </w:rPr>
-            </w:pPr>
-            <w:r>
-              <w:rPr>
-                <w:rFonts w:hint="default"/>
-                <w:sz w:val="32"/>
-                <w:szCs w:val="32"/>
-                <w:vertAlign w:val="baseline"/>
-                <w:lang w:val="en-US"/>
-              </w:rPr>
-              <w:t>Nếu hệ thống hiện giao diện, cập nhật trạng thái của nghệ sĩ đó đối với người dùng, đưa nghệ sĩ đó vào danh sách nghệ sĩ đã theo dõi hoặc hiện lại danh sách không thành công thì  hệ thống sẽ thông báo lỗi đến người dùng.</w:t>
+                <w:numId w:val="29"/>
+              </w:numPr>
+              <w:jc w:val="both"/>
+              <w:rPr>
+                <w:rFonts w:hint="default"/>
+                <w:sz w:val="32"/>
+                <w:szCs w:val="32"/>
+                <w:vertAlign w:val="baseline"/>
+                <w:lang w:val="en-US"/>
+              </w:rPr>
+            </w:pPr>
+            <w:r>
+              <w:rPr>
+                <w:rFonts w:hint="default"/>
+                <w:sz w:val="32"/>
+                <w:szCs w:val="32"/>
+                <w:vertAlign w:val="baseline"/>
+                <w:lang w:val="en-US"/>
+              </w:rPr>
+              <w:t>Nếu hệ thống cập nhật trạng thái của nghệ sĩ đó đối với người dùng thành “Đang theo dõi” không thành công thì  hệ thống sẽ thông báo “Theo dõi thất bại” đến người dùng.</w:t>
             </w:r>
           </w:p>
         </w:tc>
@@ -5536,26 +5734,26 @@
               <w:widowControl w:val="0"/>
               <w:numPr>
                 <w:ilvl w:val="0"/>
-                <w:numId w:val="32"/>
-              </w:numPr>
-              <w:jc w:val="both"/>
-              <w:rPr>
-                <w:rFonts w:hint="default"/>
-                <w:sz w:val="32"/>
-                <w:szCs w:val="32"/>
-                <w:vertAlign w:val="baseline"/>
-                <w:lang w:val="en-US"/>
-              </w:rPr>
-            </w:pPr>
-            <w:r>
-              <w:rPr>
-                <w:rFonts w:hint="default"/>
-                <w:sz w:val="32"/>
-                <w:szCs w:val="32"/>
-                <w:vertAlign w:val="baseline"/>
-                <w:lang w:val="en-US"/>
-              </w:rPr>
-              <w:t>Người dùng đăng nhập thành công vào hệ thống.</w:t>
+                <w:numId w:val="30"/>
+              </w:numPr>
+              <w:jc w:val="both"/>
+              <w:rPr>
+                <w:rFonts w:hint="default"/>
+                <w:sz w:val="32"/>
+                <w:szCs w:val="32"/>
+                <w:vertAlign w:val="baseline"/>
+                <w:lang w:val="en-US"/>
+              </w:rPr>
+            </w:pPr>
+            <w:r>
+              <w:rPr>
+                <w:rFonts w:hint="default"/>
+                <w:sz w:val="32"/>
+                <w:szCs w:val="32"/>
+                <w:vertAlign w:val="baseline"/>
+                <w:lang w:val="en-US"/>
+              </w:rPr>
+              <w:t>Hệ thống ở chế độ Người dùng.</w:t>
             </w:r>
           </w:p>
         </w:tc>
@@ -5609,7 +5807,7 @@
               <w:widowControl w:val="0"/>
               <w:numPr>
                 <w:ilvl w:val="0"/>
-                <w:numId w:val="33"/>
+                <w:numId w:val="31"/>
               </w:numPr>
               <w:ind w:leftChars="0"/>
               <w:jc w:val="both"/>
@@ -5783,7 +5981,7 @@
               <w:widowControl w:val="0"/>
               <w:numPr>
                 <w:ilvl w:val="0"/>
-                <w:numId w:val="34"/>
+                <w:numId w:val="32"/>
               </w:numPr>
               <w:jc w:val="both"/>
               <w:rPr>
@@ -5810,7 +6008,7 @@
               <w:widowControl w:val="0"/>
               <w:numPr>
                 <w:ilvl w:val="0"/>
-                <w:numId w:val="34"/>
+                <w:numId w:val="32"/>
               </w:numPr>
               <w:jc w:val="both"/>
               <w:rPr>
@@ -5837,34 +6035,34 @@
               <w:widowControl w:val="0"/>
               <w:numPr>
                 <w:ilvl w:val="0"/>
-                <w:numId w:val="34"/>
-              </w:numPr>
-              <w:jc w:val="both"/>
-              <w:rPr>
-                <w:rFonts w:hint="default"/>
-                <w:sz w:val="32"/>
-                <w:szCs w:val="32"/>
-                <w:vertAlign w:val="baseline"/>
-                <w:lang w:val="en-US"/>
-              </w:rPr>
-            </w:pPr>
-            <w:r>
-              <w:rPr>
-                <w:rFonts w:hint="default"/>
-                <w:sz w:val="32"/>
-                <w:szCs w:val="32"/>
-                <w:vertAlign w:val="baseline"/>
-                <w:lang w:val="en-US"/>
-              </w:rPr>
-              <w:t>Hệ thống kiểm tra xem có trùng email hay mật khẩu quá yếu hay không.</w:t>
-            </w:r>
-          </w:p>
-          <w:p>
-            <w:pPr>
-              <w:widowControl w:val="0"/>
-              <w:numPr>
-                <w:ilvl w:val="0"/>
-                <w:numId w:val="34"/>
+                <w:numId w:val="32"/>
+              </w:numPr>
+              <w:jc w:val="both"/>
+              <w:rPr>
+                <w:rFonts w:hint="default"/>
+                <w:sz w:val="32"/>
+                <w:szCs w:val="32"/>
+                <w:vertAlign w:val="baseline"/>
+                <w:lang w:val="en-US"/>
+              </w:rPr>
+            </w:pPr>
+            <w:r>
+              <w:rPr>
+                <w:rFonts w:hint="default"/>
+                <w:sz w:val="32"/>
+                <w:szCs w:val="32"/>
+                <w:vertAlign w:val="baseline"/>
+                <w:lang w:val="en-US"/>
+              </w:rPr>
+              <w:t>Hệ thống kiểm tra tính hợp lệ của thông tin người dùng nhập và tài khoản có tồn tại không thành công.</w:t>
+            </w:r>
+          </w:p>
+          <w:p>
+            <w:pPr>
+              <w:widowControl w:val="0"/>
+              <w:numPr>
+                <w:ilvl w:val="0"/>
+                <w:numId w:val="32"/>
               </w:numPr>
               <w:jc w:val="both"/>
               <w:rPr>
@@ -5884,6 +6082,33 @@
                 <w:lang w:val="en-US"/>
               </w:rPr>
               <w:t>Nếu thành công thì hệ thống sẽ ghi nhận tài khoản mới và thông báo đến người dùng đăng ký thành công.</w:t>
+            </w:r>
+          </w:p>
+          <w:p>
+            <w:pPr>
+              <w:widowControl w:val="0"/>
+              <w:numPr>
+                <w:ilvl w:val="0"/>
+                <w:numId w:val="32"/>
+              </w:numPr>
+              <w:jc w:val="both"/>
+              <w:rPr>
+                <w:rFonts w:hint="default"/>
+                <w:sz w:val="32"/>
+                <w:szCs w:val="32"/>
+                <w:vertAlign w:val="baseline"/>
+                <w:lang w:val="en-US"/>
+              </w:rPr>
+            </w:pPr>
+            <w:r>
+              <w:rPr>
+                <w:rFonts w:hint="default"/>
+                <w:sz w:val="32"/>
+                <w:szCs w:val="32"/>
+                <w:vertAlign w:val="baseline"/>
+                <w:lang w:val="en-US"/>
+              </w:rPr>
+              <w:t>Hệ thống chuyển sang giao diện đăng nhập</w:t>
             </w:r>
           </w:p>
         </w:tc>
@@ -5935,28 +6160,76 @@
           <w:p>
             <w:pPr>
               <w:widowControl w:val="0"/>
-              <w:numPr>
-                <w:ilvl w:val="0"/>
-                <w:numId w:val="35"/>
-              </w:numPr>
-              <w:jc w:val="both"/>
-              <w:rPr>
-                <w:rFonts w:hint="default"/>
-                <w:sz w:val="32"/>
-                <w:szCs w:val="32"/>
-                <w:vertAlign w:val="baseline"/>
-                <w:lang w:val="en-US"/>
-              </w:rPr>
-            </w:pPr>
-            <w:r>
-              <w:rPr>
-                <w:rFonts w:hint="default"/>
-                <w:sz w:val="32"/>
-                <w:szCs w:val="32"/>
-                <w:vertAlign w:val="baseline"/>
-                <w:lang w:val="en-US"/>
-              </w:rPr>
-              <w:t>Nếu hệ thống hiện giao diện không thành công thì hệ thống sẽ thông báo lỗi đến người dùng hoặc nếu người dùng nhập email không hợp lệ hay mật khẩu quá yếu thì hệ thống sẽ thông báo lỗi và yêu cầu người dùng nhập lại email, mật khẩu.</w:t>
+              <w:jc w:val="both"/>
+              <w:rPr>
+                <w:rFonts w:hint="default"/>
+                <w:sz w:val="32"/>
+                <w:szCs w:val="32"/>
+                <w:vertAlign w:val="baseline"/>
+                <w:lang w:val="en-US"/>
+              </w:rPr>
+            </w:pPr>
+            <w:r>
+              <w:rPr>
+                <w:rFonts w:hint="default"/>
+                <w:sz w:val="32"/>
+                <w:szCs w:val="32"/>
+                <w:vertAlign w:val="baseline"/>
+                <w:lang w:val="en-US"/>
+              </w:rPr>
+              <w:t>3.1 Nếu hệ thống kiểm tra email người dùng nhập không hợp lệ thì hệ thống thông báo “Email không hợp lệ, vui lòng nhập lại” đến người dùng.</w:t>
+            </w:r>
+          </w:p>
+          <w:p>
+            <w:pPr>
+              <w:widowControl w:val="0"/>
+              <w:numPr>
+                <w:numId w:val="0"/>
+              </w:numPr>
+              <w:jc w:val="both"/>
+              <w:rPr>
+                <w:rFonts w:hint="default"/>
+                <w:sz w:val="32"/>
+                <w:szCs w:val="32"/>
+                <w:vertAlign w:val="baseline"/>
+                <w:lang w:val="en-US"/>
+              </w:rPr>
+            </w:pPr>
+            <w:r>
+              <w:rPr>
+                <w:rFonts w:hint="default"/>
+                <w:sz w:val="32"/>
+                <w:szCs w:val="32"/>
+                <w:vertAlign w:val="baseline"/>
+                <w:lang w:val="en-US"/>
+              </w:rPr>
+              <w:t>3.2 Nếu hệ thống kiểm tra email người dùng nhập đã trùng với email của 1 tài khoản đã tồn tại trong hệ thống thì thông báo “Tài khoản đã tồn tại, đăng ký thất bại” đến người dùng.</w:t>
+            </w:r>
+          </w:p>
+          <w:p>
+            <w:pPr>
+              <w:widowControl w:val="0"/>
+              <w:numPr>
+                <w:numId w:val="0"/>
+              </w:numPr>
+              <w:jc w:val="both"/>
+              <w:rPr>
+                <w:rFonts w:hint="default"/>
+                <w:sz w:val="32"/>
+                <w:szCs w:val="32"/>
+                <w:vertAlign w:val="baseline"/>
+                <w:lang w:val="en-US"/>
+              </w:rPr>
+            </w:pPr>
+            <w:r>
+              <w:rPr>
+                <w:rFonts w:hint="default"/>
+                <w:sz w:val="32"/>
+                <w:szCs w:val="32"/>
+                <w:vertAlign w:val="baseline"/>
+                <w:lang w:val="en-US"/>
+              </w:rPr>
+              <w:t xml:space="preserve">3.3 Nếu hệ thống kiểm tra mật khẩu quá yếu thì thông báo “Mật khẩu quá yếu, vui lòng nhập lại” đến người dùng. </w:t>
             </w:r>
           </w:p>
         </w:tc>
@@ -6083,26 +6356,26 @@
               <w:widowControl w:val="0"/>
               <w:numPr>
                 <w:ilvl w:val="0"/>
-                <w:numId w:val="36"/>
-              </w:numPr>
-              <w:jc w:val="both"/>
-              <w:rPr>
-                <w:rFonts w:hint="default"/>
-                <w:sz w:val="32"/>
-                <w:szCs w:val="32"/>
-                <w:vertAlign w:val="baseline"/>
-                <w:lang w:val="en-US"/>
-              </w:rPr>
-            </w:pPr>
-            <w:r>
-              <w:rPr>
-                <w:rFonts w:hint="default"/>
-                <w:sz w:val="32"/>
-                <w:szCs w:val="32"/>
-                <w:vertAlign w:val="baseline"/>
-                <w:lang w:val="en-US"/>
-              </w:rPr>
-              <w:t>Hệ thống chuyển sang giao diện đăng nhập.</w:t>
+                <w:numId w:val="33"/>
+              </w:numPr>
+              <w:jc w:val="both"/>
+              <w:rPr>
+                <w:rFonts w:hint="default"/>
+                <w:sz w:val="32"/>
+                <w:szCs w:val="32"/>
+                <w:vertAlign w:val="baseline"/>
+                <w:lang w:val="en-US"/>
+              </w:rPr>
+            </w:pPr>
+            <w:r>
+              <w:rPr>
+                <w:rFonts w:hint="default"/>
+                <w:sz w:val="32"/>
+                <w:szCs w:val="32"/>
+                <w:vertAlign w:val="baseline"/>
+                <w:lang w:val="en-US"/>
+              </w:rPr>
+              <w:t>Hệ thống sẵn sàng để người dùng đăng nhập.</w:t>
             </w:r>
           </w:p>
         </w:tc>
@@ -6256,7 +6529,7 @@
               <w:widowControl w:val="0"/>
               <w:numPr>
                 <w:ilvl w:val="0"/>
-                <w:numId w:val="37"/>
+                <w:numId w:val="34"/>
               </w:numPr>
               <w:jc w:val="both"/>
               <w:rPr>
@@ -6283,7 +6556,7 @@
               <w:widowControl w:val="0"/>
               <w:numPr>
                 <w:ilvl w:val="0"/>
-                <w:numId w:val="37"/>
+                <w:numId w:val="34"/>
               </w:numPr>
               <w:ind w:left="0" w:leftChars="0" w:firstLine="0" w:firstLineChars="0"/>
               <w:jc w:val="both"/>
@@ -6311,7 +6584,7 @@
               <w:widowControl w:val="0"/>
               <w:numPr>
                 <w:ilvl w:val="0"/>
-                <w:numId w:val="37"/>
+                <w:numId w:val="34"/>
               </w:numPr>
               <w:ind w:left="0" w:leftChars="0" w:firstLine="0" w:firstLineChars="0"/>
               <w:jc w:val="both"/>
@@ -6331,15 +6604,15 @@
                 <w:vertAlign w:val="baseline"/>
                 <w:lang w:val="en-US"/>
               </w:rPr>
-              <w:t>Hệ thống kiểm tra xem email và mật khẩu có khớp với 1 tài khoản đã tồn tại trong hệ thống hay không thành công.</w:t>
-            </w:r>
-          </w:p>
-          <w:p>
-            <w:pPr>
-              <w:widowControl w:val="0"/>
-              <w:numPr>
-                <w:ilvl w:val="0"/>
-                <w:numId w:val="37"/>
+              <w:t>Hệ thống kiểm tra tính hợp lệ và tính đúng của thông tin người dùng nhập .</w:t>
+            </w:r>
+          </w:p>
+          <w:p>
+            <w:pPr>
+              <w:widowControl w:val="0"/>
+              <w:numPr>
+                <w:ilvl w:val="0"/>
+                <w:numId w:val="34"/>
               </w:numPr>
               <w:ind w:left="0" w:leftChars="0" w:firstLine="0" w:firstLineChars="0"/>
               <w:jc w:val="both"/>
@@ -6359,7 +6632,35 @@
                 <w:vertAlign w:val="baseline"/>
                 <w:lang w:val="en-US"/>
               </w:rPr>
-              <w:t>Nếu khớp thì hệ thống sẽ thông báo đến người dùng đăng nhập thành công.</w:t>
+              <w:t>Nếu đúng thì hệ thống sẽ thông báo đến người dùng đăng nhập thành công.</w:t>
+            </w:r>
+          </w:p>
+          <w:p>
+            <w:pPr>
+              <w:widowControl w:val="0"/>
+              <w:numPr>
+                <w:ilvl w:val="0"/>
+                <w:numId w:val="34"/>
+              </w:numPr>
+              <w:ind w:left="0" w:leftChars="0" w:firstLine="0" w:firstLineChars="0"/>
+              <w:jc w:val="both"/>
+              <w:rPr>
+                <w:rFonts w:hint="default"/>
+                <w:sz w:val="32"/>
+                <w:szCs w:val="32"/>
+                <w:vertAlign w:val="baseline"/>
+                <w:lang w:val="en-US"/>
+              </w:rPr>
+            </w:pPr>
+            <w:r>
+              <w:rPr>
+                <w:rFonts w:hint="default"/>
+                <w:sz w:val="32"/>
+                <w:szCs w:val="32"/>
+                <w:vertAlign w:val="baseline"/>
+                <w:lang w:val="en-US"/>
+              </w:rPr>
+              <w:t>Hệ thống chuyển sang giao diện cho người dùng đã đăng nhập.</w:t>
             </w:r>
           </w:p>
         </w:tc>
@@ -6411,29 +6712,78 @@
           <w:p>
             <w:pPr>
               <w:widowControl w:val="0"/>
-              <w:numPr>
-                <w:ilvl w:val="0"/>
-                <w:numId w:val="38"/>
-              </w:numPr>
-              <w:ind w:left="0" w:leftChars="0" w:firstLine="0" w:firstLineChars="0"/>
-              <w:jc w:val="both"/>
-              <w:rPr>
-                <w:rFonts w:hint="default"/>
-                <w:sz w:val="32"/>
-                <w:szCs w:val="32"/>
-                <w:vertAlign w:val="baseline"/>
-                <w:lang w:val="en-US"/>
-              </w:rPr>
-            </w:pPr>
-            <w:r>
-              <w:rPr>
-                <w:rFonts w:hint="default"/>
-                <w:sz w:val="32"/>
-                <w:szCs w:val="32"/>
-                <w:vertAlign w:val="baseline"/>
-                <w:lang w:val="en-US"/>
-              </w:rPr>
-              <w:t>Nếu hệ thống hiện giao diện không thành công thì hệ thống sẽ thông báo lỗi đến người dùng hoặc nếu người dùng nhập email, mật khẩu không khớp thì hệ thống sẽ thông báo người dùng đăng nhập thất bại và yêu cầu người dùng nhập lại email, mật khẩu hay nếu tài khoản không tồn tại thì yêu cầu người dùng đăng ký.</w:t>
+              <w:jc w:val="both"/>
+              <w:rPr>
+                <w:rFonts w:hint="default"/>
+                <w:sz w:val="32"/>
+                <w:szCs w:val="32"/>
+                <w:vertAlign w:val="baseline"/>
+                <w:lang w:val="en-US"/>
+              </w:rPr>
+            </w:pPr>
+            <w:r>
+              <w:rPr>
+                <w:rFonts w:hint="default"/>
+                <w:sz w:val="32"/>
+                <w:szCs w:val="32"/>
+                <w:vertAlign w:val="baseline"/>
+                <w:lang w:val="en-US"/>
+              </w:rPr>
+              <w:t>3.1 Nếu hệ thống kiểm tra email người dùng nhập không hợp lệ thì hệ thống thông báo “Email không hợp lệ, vui lòng nhập lại” đến người dùng.</w:t>
+            </w:r>
+          </w:p>
+          <w:p>
+            <w:pPr>
+              <w:widowControl w:val="0"/>
+              <w:numPr>
+                <w:numId w:val="0"/>
+              </w:numPr>
+              <w:ind w:leftChars="0"/>
+              <w:jc w:val="both"/>
+              <w:rPr>
+                <w:rFonts w:hint="default"/>
+                <w:sz w:val="32"/>
+                <w:szCs w:val="32"/>
+                <w:vertAlign w:val="baseline"/>
+                <w:lang w:val="en-US"/>
+              </w:rPr>
+            </w:pPr>
+            <w:r>
+              <w:rPr>
+                <w:rFonts w:hint="default"/>
+                <w:sz w:val="32"/>
+                <w:szCs w:val="32"/>
+                <w:vertAlign w:val="baseline"/>
+                <w:lang w:val="en-US"/>
+              </w:rPr>
+              <w:t>3.2 Nếu hệ thống kiểm tra thông tin đăng nhập của người dùng nhập không đúng thì hệ thống thông báo “Sai email hoặc mật khẩu, vui lòng nhập lại” đến người dùng.</w:t>
+            </w:r>
+          </w:p>
+          <w:p>
+            <w:pPr>
+              <w:widowControl w:val="0"/>
+              <w:numPr>
+                <w:numId w:val="0"/>
+              </w:numPr>
+              <w:ind w:leftChars="0"/>
+              <w:jc w:val="both"/>
+              <w:rPr>
+                <w:rFonts w:hint="default"/>
+                <w:sz w:val="32"/>
+                <w:szCs w:val="32"/>
+                <w:vertAlign w:val="baseline"/>
+                <w:lang w:val="en-US"/>
+              </w:rPr>
+            </w:pPr>
+            <w:r>
+              <w:rPr>
+                <w:rFonts w:hint="default"/>
+                <w:sz w:val="32"/>
+                <w:szCs w:val="32"/>
+                <w:vertAlign w:val="baseline"/>
+                <w:lang w:val="en-US"/>
+              </w:rPr>
+              <w:t>3.3 Nếu hệ thống kiểm tra tài khoảng của người dùng không tồn tại (email không tồn tại trong cơ sở dữ liệu) thì thông báo “Tài khoản không tồn tại, vui lòng đăng ký tài khoản trước” đến người dùng.</w:t>
             </w:r>
           </w:p>
         </w:tc>
@@ -6560,26 +6910,26 @@
               <w:widowControl w:val="0"/>
               <w:numPr>
                 <w:ilvl w:val="0"/>
-                <w:numId w:val="39"/>
-              </w:numPr>
-              <w:jc w:val="both"/>
-              <w:rPr>
-                <w:rFonts w:hint="default"/>
-                <w:sz w:val="32"/>
-                <w:szCs w:val="32"/>
-                <w:vertAlign w:val="baseline"/>
-                <w:lang w:val="en-US"/>
-              </w:rPr>
-            </w:pPr>
-            <w:r>
-              <w:rPr>
-                <w:rFonts w:hint="default"/>
-                <w:sz w:val="32"/>
-                <w:szCs w:val="32"/>
-                <w:vertAlign w:val="baseline"/>
-                <w:lang w:val="en-US"/>
-              </w:rPr>
-              <w:t>Hệ thống chuyển sang giao diện cho người dùng đã đăng nhập.</w:t>
+                <w:numId w:val="35"/>
+              </w:numPr>
+              <w:jc w:val="both"/>
+              <w:rPr>
+                <w:rFonts w:hint="default"/>
+                <w:sz w:val="32"/>
+                <w:szCs w:val="32"/>
+                <w:vertAlign w:val="baseline"/>
+                <w:lang w:val="en-US"/>
+              </w:rPr>
+            </w:pPr>
+            <w:r>
+              <w:rPr>
+                <w:rFonts w:hint="default"/>
+                <w:sz w:val="32"/>
+                <w:szCs w:val="32"/>
+                <w:vertAlign w:val="baseline"/>
+                <w:lang w:val="en-US"/>
+              </w:rPr>
+              <w:t>Hệ thống sẵn sàng để người dùng thực hiện các chức năng cho người dùng đã đăng nhập của người dùng.</w:t>
             </w:r>
           </w:p>
         </w:tc>
@@ -6733,7 +7083,7 @@
               <w:widowControl w:val="0"/>
               <w:numPr>
                 <w:ilvl w:val="0"/>
-                <w:numId w:val="40"/>
+                <w:numId w:val="36"/>
               </w:numPr>
               <w:jc w:val="both"/>
               <w:rPr>
@@ -6760,7 +7110,7 @@
               <w:widowControl w:val="0"/>
               <w:numPr>
                 <w:ilvl w:val="0"/>
-                <w:numId w:val="36"/>
+                <w:numId w:val="33"/>
               </w:numPr>
               <w:ind w:left="0" w:leftChars="0" w:firstLine="0" w:firstLineChars="0"/>
               <w:jc w:val="both"/>
@@ -6780,7 +7130,19 @@
                 <w:vertAlign w:val="baseline"/>
                 <w:lang w:val="en-US"/>
               </w:rPr>
-              <w:t>Hệ thống sẽ chuyển sang chế độ Khách (dành cho người dùng chưa đăng nhập).</w:t>
+              <w:t>Hệ thống sẽ chuyển sang chế độ Khách (dành cho người dùng chưa đăng nhập) thành công</w:t>
+            </w:r>
+            <w:bookmarkStart w:id="0" w:name="_GoBack"/>
+            <w:bookmarkEnd w:id="0"/>
+            <w:r>
+              <w:rPr>
+                <w:rFonts w:hint="default"/>
+                <w:sz w:val="32"/>
+                <w:szCs w:val="32"/>
+                <w:vertAlign w:val="baseline"/>
+                <w:lang w:val="en-US"/>
+              </w:rPr>
+              <w:t>.</w:t>
             </w:r>
           </w:p>
         </w:tc>
@@ -6834,26 +7196,26 @@
               <w:widowControl w:val="0"/>
               <w:numPr>
                 <w:ilvl w:val="0"/>
-                <w:numId w:val="41"/>
-              </w:numPr>
-              <w:jc w:val="both"/>
-              <w:rPr>
-                <w:rFonts w:hint="default"/>
-                <w:sz w:val="32"/>
-                <w:szCs w:val="32"/>
-                <w:vertAlign w:val="baseline"/>
-                <w:lang w:val="en-US"/>
-              </w:rPr>
-            </w:pPr>
-            <w:r>
-              <w:rPr>
-                <w:rFonts w:hint="default"/>
-                <w:sz w:val="32"/>
-                <w:szCs w:val="32"/>
-                <w:vertAlign w:val="baseline"/>
-                <w:lang w:val="en-US"/>
-              </w:rPr>
-              <w:t>Nếu hệ thống đăng xuất không thành công thì thông báo lỗi đến người dùng.</w:t>
+                <w:numId w:val="37"/>
+              </w:numPr>
+              <w:jc w:val="both"/>
+              <w:rPr>
+                <w:rFonts w:hint="default"/>
+                <w:sz w:val="32"/>
+                <w:szCs w:val="32"/>
+                <w:vertAlign w:val="baseline"/>
+                <w:lang w:val="en-US"/>
+              </w:rPr>
+            </w:pPr>
+            <w:r>
+              <w:rPr>
+                <w:rFonts w:hint="default"/>
+                <w:sz w:val="32"/>
+                <w:szCs w:val="32"/>
+                <w:vertAlign w:val="baseline"/>
+                <w:lang w:val="en-US"/>
+              </w:rPr>
+              <w:t>Nếu hệ thống đăng xuất không thành công thì thông báo “Đăng xuất thất bại” đến người dùng.</w:t>
             </w:r>
           </w:p>
         </w:tc>
@@ -6907,26 +7269,26 @@
               <w:widowControl w:val="0"/>
               <w:numPr>
                 <w:ilvl w:val="0"/>
-                <w:numId w:val="42"/>
-              </w:numPr>
-              <w:jc w:val="both"/>
-              <w:rPr>
-                <w:rFonts w:hint="default"/>
-                <w:sz w:val="32"/>
-                <w:szCs w:val="32"/>
-                <w:vertAlign w:val="baseline"/>
-                <w:lang w:val="en-US"/>
-              </w:rPr>
-            </w:pPr>
-            <w:r>
-              <w:rPr>
-                <w:rFonts w:hint="default"/>
-                <w:sz w:val="32"/>
-                <w:szCs w:val="32"/>
-                <w:vertAlign w:val="baseline"/>
-                <w:lang w:val="en-US"/>
-              </w:rPr>
-              <w:t>Người dùng đăng nhập thành công vào hệ thống.</w:t>
+                <w:numId w:val="38"/>
+              </w:numPr>
+              <w:jc w:val="both"/>
+              <w:rPr>
+                <w:rFonts w:hint="default"/>
+                <w:sz w:val="32"/>
+                <w:szCs w:val="32"/>
+                <w:vertAlign w:val="baseline"/>
+                <w:lang w:val="en-US"/>
+              </w:rPr>
+            </w:pPr>
+            <w:r>
+              <w:rPr>
+                <w:rFonts w:hint="default"/>
+                <w:sz w:val="32"/>
+                <w:szCs w:val="32"/>
+                <w:vertAlign w:val="baseline"/>
+                <w:lang w:val="en-US"/>
+              </w:rPr>
+              <w:t>Hệ thống ở chế độ Đã đăng nhập (Người dùng/Nghệ sĩ/Admin).</w:t>
             </w:r>
           </w:p>
         </w:tc>
@@ -6980,26 +7342,26 @@
               <w:widowControl w:val="0"/>
               <w:numPr>
                 <w:ilvl w:val="0"/>
-                <w:numId w:val="43"/>
-              </w:numPr>
-              <w:jc w:val="both"/>
-              <w:rPr>
-                <w:rFonts w:hint="default"/>
-                <w:sz w:val="32"/>
-                <w:szCs w:val="32"/>
-                <w:vertAlign w:val="baseline"/>
-                <w:lang w:val="en-US"/>
-              </w:rPr>
-            </w:pPr>
-            <w:r>
-              <w:rPr>
-                <w:rFonts w:hint="default"/>
-                <w:sz w:val="32"/>
-                <w:szCs w:val="32"/>
-                <w:vertAlign w:val="baseline"/>
-                <w:lang w:val="en-US"/>
-              </w:rPr>
-              <w:t>Hệ thống chuyển sang giao diện cho Khách (dành cho người dùng chưa đăng nhập).</w:t>
+                <w:numId w:val="39"/>
+              </w:numPr>
+              <w:jc w:val="both"/>
+              <w:rPr>
+                <w:rFonts w:hint="default"/>
+                <w:sz w:val="32"/>
+                <w:szCs w:val="32"/>
+                <w:vertAlign w:val="baseline"/>
+                <w:lang w:val="en-US"/>
+              </w:rPr>
+            </w:pPr>
+            <w:r>
+              <w:rPr>
+                <w:rFonts w:hint="default"/>
+                <w:sz w:val="32"/>
+                <w:szCs w:val="32"/>
+                <w:vertAlign w:val="baseline"/>
+                <w:lang w:val="en-US"/>
+              </w:rPr>
+              <w:t>Hệ thống sẵn sàng để Khách thực hiện các chức năng dành cho người dùng chưa đăng nhập.</w:t>
             </w:r>
           </w:p>
         </w:tc>
@@ -7068,6 +7430,12 @@
             <w:insideH w:val="single" w:color="auto" w:sz="4" w:space="0"/>
             <w:insideV w:val="single" w:color="auto" w:sz="4" w:space="0"/>
           </w:tblBorders>
+          <w:tblCellMar>
+            <w:top w:w="0" w:type="dxa"/>
+            <w:left w:w="108" w:type="dxa"/>
+            <w:bottom w:w="0" w:type="dxa"/>
+            <w:right w:w="108" w:type="dxa"/>
+          </w:tblCellMar>
         </w:tblPrEx>
         <w:tc>
           <w:tcPr>
@@ -7147,7 +7515,7 @@
               <w:widowControl w:val="0"/>
               <w:numPr>
                 <w:ilvl w:val="0"/>
-                <w:numId w:val="44"/>
+                <w:numId w:val="40"/>
               </w:numPr>
               <w:ind w:leftChars="0"/>
               <w:jc w:val="both"/>
@@ -7175,7 +7543,7 @@
               <w:widowControl w:val="0"/>
               <w:numPr>
                 <w:ilvl w:val="0"/>
-                <w:numId w:val="44"/>
+                <w:numId w:val="40"/>
               </w:numPr>
               <w:ind w:leftChars="0"/>
               <w:jc w:val="both"/>
@@ -7203,7 +7571,7 @@
               <w:widowControl w:val="0"/>
               <w:numPr>
                 <w:ilvl w:val="0"/>
-                <w:numId w:val="44"/>
+                <w:numId w:val="40"/>
               </w:numPr>
               <w:ind w:leftChars="0"/>
               <w:jc w:val="both"/>
@@ -7231,7 +7599,7 @@
               <w:widowControl w:val="0"/>
               <w:numPr>
                 <w:ilvl w:val="0"/>
-                <w:numId w:val="44"/>
+                <w:numId w:val="40"/>
               </w:numPr>
               <w:ind w:leftChars="0"/>
               <w:jc w:val="both"/>
@@ -7259,7 +7627,7 @@
               <w:widowControl w:val="0"/>
               <w:numPr>
                 <w:ilvl w:val="0"/>
-                <w:numId w:val="44"/>
+                <w:numId w:val="40"/>
               </w:numPr>
               <w:ind w:leftChars="0"/>
               <w:jc w:val="both"/>
@@ -7333,7 +7701,7 @@
               <w:widowControl w:val="0"/>
               <w:numPr>
                 <w:ilvl w:val="0"/>
-                <w:numId w:val="45"/>
+                <w:numId w:val="41"/>
               </w:numPr>
               <w:jc w:val="both"/>
               <w:rPr>
@@ -7479,7 +7847,7 @@
               <w:widowControl w:val="0"/>
               <w:numPr>
                 <w:ilvl w:val="0"/>
-                <w:numId w:val="46"/>
+                <w:numId w:val="42"/>
               </w:numPr>
               <w:jc w:val="both"/>
               <w:rPr>
@@ -7652,7 +8020,7 @@
               <w:widowControl w:val="0"/>
               <w:numPr>
                 <w:ilvl w:val="0"/>
-                <w:numId w:val="47"/>
+                <w:numId w:val="43"/>
               </w:numPr>
               <w:ind w:leftChars="0"/>
               <w:jc w:val="both"/>
@@ -7680,7 +8048,7 @@
               <w:widowControl w:val="0"/>
               <w:numPr>
                 <w:ilvl w:val="0"/>
-                <w:numId w:val="47"/>
+                <w:numId w:val="43"/>
               </w:numPr>
               <w:ind w:leftChars="0"/>
               <w:jc w:val="both"/>
@@ -7836,7 +8204,7 @@
               <w:widowControl w:val="0"/>
               <w:numPr>
                 <w:ilvl w:val="0"/>
-                <w:numId w:val="48"/>
+                <w:numId w:val="44"/>
               </w:numPr>
               <w:jc w:val="both"/>
               <w:rPr>
@@ -7982,7 +8350,7 @@
               <w:widowControl w:val="0"/>
               <w:numPr>
                 <w:ilvl w:val="0"/>
-                <w:numId w:val="49"/>
+                <w:numId w:val="45"/>
               </w:numPr>
               <w:jc w:val="both"/>
               <w:rPr>
@@ -8155,7 +8523,7 @@
               <w:widowControl w:val="0"/>
               <w:numPr>
                 <w:ilvl w:val="0"/>
-                <w:numId w:val="50"/>
+                <w:numId w:val="46"/>
               </w:numPr>
               <w:ind w:leftChars="0"/>
               <w:jc w:val="both"/>
@@ -8183,7 +8551,7 @@
               <w:widowControl w:val="0"/>
               <w:numPr>
                 <w:ilvl w:val="0"/>
-                <w:numId w:val="49"/>
+                <w:numId w:val="45"/>
               </w:numPr>
               <w:ind w:left="0" w:leftChars="0" w:firstLine="0" w:firstLineChars="0"/>
               <w:jc w:val="both"/>
@@ -8211,7 +8579,7 @@
               <w:widowControl w:val="0"/>
               <w:numPr>
                 <w:ilvl w:val="0"/>
-                <w:numId w:val="49"/>
+                <w:numId w:val="45"/>
               </w:numPr>
               <w:ind w:left="0" w:leftChars="0" w:firstLine="0" w:firstLineChars="0"/>
               <w:jc w:val="both"/>
@@ -8285,7 +8653,7 @@
               <w:widowControl w:val="0"/>
               <w:numPr>
                 <w:ilvl w:val="0"/>
-                <w:numId w:val="51"/>
+                <w:numId w:val="47"/>
               </w:numPr>
               <w:jc w:val="both"/>
               <w:rPr>
@@ -8431,7 +8799,7 @@
               <w:widowControl w:val="0"/>
               <w:numPr>
                 <w:ilvl w:val="0"/>
-                <w:numId w:val="52"/>
+                <w:numId w:val="48"/>
               </w:numPr>
               <w:jc w:val="both"/>
               <w:rPr>
@@ -8604,7 +8972,7 @@
               <w:widowControl w:val="0"/>
               <w:numPr>
                 <w:ilvl w:val="0"/>
-                <w:numId w:val="53"/>
+                <w:numId w:val="49"/>
               </w:numPr>
               <w:jc w:val="both"/>
               <w:rPr>
@@ -8631,7 +8999,7 @@
               <w:widowControl w:val="0"/>
               <w:numPr>
                 <w:ilvl w:val="0"/>
-                <w:numId w:val="53"/>
+                <w:numId w:val="49"/>
               </w:numPr>
               <w:ind w:left="0" w:leftChars="0" w:firstLine="0" w:firstLineChars="0"/>
               <w:jc w:val="both"/>
@@ -8659,7 +9027,7 @@
               <w:widowControl w:val="0"/>
               <w:numPr>
                 <w:ilvl w:val="0"/>
-                <w:numId w:val="53"/>
+                <w:numId w:val="49"/>
               </w:numPr>
               <w:ind w:left="0" w:leftChars="0" w:firstLine="0" w:firstLineChars="0"/>
               <w:jc w:val="both"/>
@@ -8733,7 +9101,7 @@
               <w:widowControl w:val="0"/>
               <w:numPr>
                 <w:ilvl w:val="0"/>
-                <w:numId w:val="54"/>
+                <w:numId w:val="50"/>
               </w:numPr>
               <w:jc w:val="both"/>
               <w:rPr>
@@ -8879,7 +9247,7 @@
               <w:widowControl w:val="0"/>
               <w:numPr>
                 <w:ilvl w:val="0"/>
-                <w:numId w:val="55"/>
+                <w:numId w:val="51"/>
               </w:numPr>
               <w:jc w:val="both"/>
               <w:rPr>
@@ -9052,7 +9420,7 @@
               <w:widowControl w:val="0"/>
               <w:numPr>
                 <w:ilvl w:val="0"/>
-                <w:numId w:val="56"/>
+                <w:numId w:val="52"/>
               </w:numPr>
               <w:jc w:val="both"/>
               <w:rPr>
@@ -9079,7 +9447,7 @@
               <w:widowControl w:val="0"/>
               <w:numPr>
                 <w:ilvl w:val="0"/>
-                <w:numId w:val="56"/>
+                <w:numId w:val="52"/>
               </w:numPr>
               <w:ind w:left="0" w:leftChars="0" w:firstLine="0" w:firstLineChars="0"/>
               <w:jc w:val="both"/>
@@ -9107,7 +9475,7 @@
               <w:widowControl w:val="0"/>
               <w:numPr>
                 <w:ilvl w:val="0"/>
-                <w:numId w:val="56"/>
+                <w:numId w:val="52"/>
               </w:numPr>
               <w:ind w:left="0" w:leftChars="0" w:firstLine="0" w:firstLineChars="0"/>
               <w:jc w:val="both"/>
@@ -9135,7 +9503,7 @@
               <w:widowControl w:val="0"/>
               <w:numPr>
                 <w:ilvl w:val="0"/>
-                <w:numId w:val="56"/>
+                <w:numId w:val="52"/>
               </w:numPr>
               <w:ind w:left="0" w:leftChars="0" w:firstLine="0" w:firstLineChars="0"/>
               <w:jc w:val="both"/>
@@ -9275,7 +9643,7 @@
               <w:widowControl w:val="0"/>
               <w:numPr>
                 <w:ilvl w:val="0"/>
-                <w:numId w:val="56"/>
+                <w:numId w:val="52"/>
               </w:numPr>
               <w:ind w:left="0" w:leftChars="0" w:firstLine="0" w:firstLineChars="0"/>
               <w:jc w:val="both"/>
@@ -9303,7 +9671,7 @@
               <w:widowControl w:val="0"/>
               <w:numPr>
                 <w:ilvl w:val="0"/>
-                <w:numId w:val="56"/>
+                <w:numId w:val="52"/>
               </w:numPr>
               <w:ind w:left="0" w:leftChars="0" w:firstLine="0" w:firstLineChars="0"/>
               <w:jc w:val="both"/>
@@ -9377,7 +9745,7 @@
               <w:widowControl w:val="0"/>
               <w:numPr>
                 <w:ilvl w:val="0"/>
-                <w:numId w:val="57"/>
+                <w:numId w:val="53"/>
               </w:numPr>
               <w:jc w:val="both"/>
               <w:rPr>
@@ -9450,7 +9818,7 @@
               <w:widowControl w:val="0"/>
               <w:numPr>
                 <w:ilvl w:val="0"/>
-                <w:numId w:val="58"/>
+                <w:numId w:val="54"/>
               </w:numPr>
               <w:jc w:val="both"/>
               <w:rPr>
@@ -9523,7 +9891,7 @@
               <w:widowControl w:val="0"/>
               <w:numPr>
                 <w:ilvl w:val="0"/>
-                <w:numId w:val="59"/>
+                <w:numId w:val="55"/>
               </w:numPr>
               <w:jc w:val="both"/>
               <w:rPr>
@@ -9611,6 +9979,12 @@
             <w:insideH w:val="single" w:color="auto" w:sz="4" w:space="0"/>
             <w:insideV w:val="single" w:color="auto" w:sz="4" w:space="0"/>
           </w:tblBorders>
+          <w:tblCellMar>
+            <w:top w:w="0" w:type="dxa"/>
+            <w:left w:w="108" w:type="dxa"/>
+            <w:bottom w:w="0" w:type="dxa"/>
+            <w:right w:w="108" w:type="dxa"/>
+          </w:tblCellMar>
         </w:tblPrEx>
         <w:tc>
           <w:tcPr>
@@ -9690,7 +10064,7 @@
               <w:widowControl w:val="0"/>
               <w:numPr>
                 <w:ilvl w:val="0"/>
-                <w:numId w:val="60"/>
+                <w:numId w:val="56"/>
               </w:numPr>
               <w:jc w:val="both"/>
               <w:rPr>
@@ -9717,7 +10091,7 @@
               <w:widowControl w:val="0"/>
               <w:numPr>
                 <w:ilvl w:val="0"/>
-                <w:numId w:val="60"/>
+                <w:numId w:val="56"/>
               </w:numPr>
               <w:ind w:left="0" w:leftChars="0" w:firstLine="0" w:firstLineChars="0"/>
               <w:jc w:val="both"/>
@@ -9745,7 +10119,7 @@
               <w:widowControl w:val="0"/>
               <w:numPr>
                 <w:ilvl w:val="0"/>
-                <w:numId w:val="60"/>
+                <w:numId w:val="56"/>
               </w:numPr>
               <w:ind w:left="0" w:leftChars="0" w:firstLine="0" w:firstLineChars="0"/>
               <w:jc w:val="both"/>
@@ -9773,7 +10147,7 @@
               <w:widowControl w:val="0"/>
               <w:numPr>
                 <w:ilvl w:val="0"/>
-                <w:numId w:val="60"/>
+                <w:numId w:val="56"/>
               </w:numPr>
               <w:ind w:left="0" w:leftChars="0" w:firstLine="0" w:firstLineChars="0"/>
               <w:jc w:val="both"/>
@@ -9801,7 +10175,7 @@
               <w:widowControl w:val="0"/>
               <w:numPr>
                 <w:ilvl w:val="0"/>
-                <w:numId w:val="60"/>
+                <w:numId w:val="56"/>
               </w:numPr>
               <w:ind w:left="0" w:leftChars="0" w:firstLine="0" w:firstLineChars="0"/>
               <w:jc w:val="both"/>
@@ -9829,7 +10203,7 @@
               <w:widowControl w:val="0"/>
               <w:numPr>
                 <w:ilvl w:val="0"/>
-                <w:numId w:val="60"/>
+                <w:numId w:val="56"/>
               </w:numPr>
               <w:ind w:left="0" w:leftChars="0" w:firstLine="0" w:firstLineChars="0"/>
               <w:jc w:val="both"/>
@@ -9857,7 +10231,7 @@
               <w:widowControl w:val="0"/>
               <w:numPr>
                 <w:ilvl w:val="0"/>
-                <w:numId w:val="60"/>
+                <w:numId w:val="56"/>
               </w:numPr>
               <w:ind w:left="0" w:leftChars="0" w:firstLine="0" w:firstLineChars="0"/>
               <w:jc w:val="both"/>
@@ -9931,7 +10305,7 @@
               <w:widowControl w:val="0"/>
               <w:numPr>
                 <w:ilvl w:val="0"/>
-                <w:numId w:val="61"/>
+                <w:numId w:val="57"/>
               </w:numPr>
               <w:jc w:val="both"/>
               <w:rPr>
@@ -10004,7 +10378,7 @@
               <w:widowControl w:val="0"/>
               <w:numPr>
                 <w:ilvl w:val="0"/>
-                <w:numId w:val="62"/>
+                <w:numId w:val="58"/>
               </w:numPr>
               <w:jc w:val="both"/>
               <w:rPr>
@@ -10077,7 +10451,7 @@
               <w:widowControl w:val="0"/>
               <w:numPr>
                 <w:ilvl w:val="0"/>
-                <w:numId w:val="63"/>
+                <w:numId w:val="59"/>
               </w:numPr>
               <w:ind w:leftChars="0"/>
               <w:jc w:val="both"/>
@@ -10254,7 +10628,7 @@
               <w:widowControl w:val="0"/>
               <w:numPr>
                 <w:ilvl w:val="0"/>
-                <w:numId w:val="64"/>
+                <w:numId w:val="60"/>
               </w:numPr>
               <w:ind w:leftChars="0"/>
               <w:jc w:val="both"/>
@@ -10282,7 +10656,7 @@
               <w:widowControl w:val="0"/>
               <w:numPr>
                 <w:ilvl w:val="0"/>
-                <w:numId w:val="64"/>
+                <w:numId w:val="60"/>
               </w:numPr>
               <w:ind w:leftChars="0"/>
               <w:jc w:val="both"/>
@@ -10310,7 +10684,7 @@
               <w:widowControl w:val="0"/>
               <w:numPr>
                 <w:ilvl w:val="0"/>
-                <w:numId w:val="64"/>
+                <w:numId w:val="60"/>
               </w:numPr>
               <w:ind w:leftChars="0"/>
               <w:jc w:val="both"/>
@@ -10419,7 +10793,7 @@
               <w:widowControl w:val="0"/>
               <w:numPr>
                 <w:ilvl w:val="0"/>
-                <w:numId w:val="64"/>
+                <w:numId w:val="60"/>
               </w:numPr>
               <w:ind w:left="0" w:leftChars="0" w:firstLine="0" w:firstLineChars="0"/>
               <w:jc w:val="both"/>
@@ -10493,7 +10867,7 @@
               <w:widowControl w:val="0"/>
               <w:numPr>
                 <w:ilvl w:val="0"/>
-                <w:numId w:val="65"/>
+                <w:numId w:val="61"/>
               </w:numPr>
               <w:jc w:val="both"/>
               <w:rPr>
@@ -10566,7 +10940,7 @@
               <w:widowControl w:val="0"/>
               <w:numPr>
                 <w:ilvl w:val="0"/>
-                <w:numId w:val="66"/>
+                <w:numId w:val="62"/>
               </w:numPr>
               <w:jc w:val="both"/>
               <w:rPr>
@@ -10639,7 +11013,7 @@
               <w:widowControl w:val="0"/>
               <w:numPr>
                 <w:ilvl w:val="0"/>
-                <w:numId w:val="67"/>
+                <w:numId w:val="63"/>
               </w:numPr>
               <w:ind w:leftChars="0"/>
               <w:jc w:val="both"/>
@@ -10816,7 +11190,7 @@
               <w:widowControl w:val="0"/>
               <w:numPr>
                 <w:ilvl w:val="0"/>
-                <w:numId w:val="68"/>
+                <w:numId w:val="64"/>
               </w:numPr>
               <w:jc w:val="both"/>
               <w:rPr>
@@ -10843,7 +11217,7 @@
               <w:widowControl w:val="0"/>
               <w:numPr>
                 <w:ilvl w:val="0"/>
-                <w:numId w:val="68"/>
+                <w:numId w:val="64"/>
               </w:numPr>
               <w:ind w:left="0" w:leftChars="0" w:firstLine="0" w:firstLineChars="0"/>
               <w:jc w:val="both"/>
@@ -10871,7 +11245,7 @@
               <w:widowControl w:val="0"/>
               <w:numPr>
                 <w:ilvl w:val="0"/>
-                <w:numId w:val="68"/>
+                <w:numId w:val="64"/>
               </w:numPr>
               <w:ind w:left="0" w:leftChars="0" w:firstLine="0" w:firstLineChars="0"/>
               <w:jc w:val="both"/>
@@ -10899,7 +11273,7 @@
               <w:widowControl w:val="0"/>
               <w:numPr>
                 <w:ilvl w:val="0"/>
-                <w:numId w:val="68"/>
+                <w:numId w:val="64"/>
               </w:numPr>
               <w:ind w:left="0" w:leftChars="0" w:firstLine="0" w:firstLineChars="0"/>
               <w:jc w:val="both"/>
@@ -10973,7 +11347,7 @@
               <w:widowControl w:val="0"/>
               <w:numPr>
                 <w:ilvl w:val="0"/>
-                <w:numId w:val="69"/>
+                <w:numId w:val="65"/>
               </w:numPr>
               <w:jc w:val="both"/>
               <w:rPr>
@@ -11046,7 +11420,7 @@
               <w:widowControl w:val="0"/>
               <w:numPr>
                 <w:ilvl w:val="0"/>
-                <w:numId w:val="70"/>
+                <w:numId w:val="66"/>
               </w:numPr>
               <w:jc w:val="both"/>
               <w:rPr>
@@ -11119,7 +11493,7 @@
               <w:widowControl w:val="0"/>
               <w:numPr>
                 <w:ilvl w:val="0"/>
-                <w:numId w:val="71"/>
+                <w:numId w:val="67"/>
               </w:numPr>
               <w:jc w:val="both"/>
               <w:rPr>
@@ -11292,7 +11666,7 @@
               <w:widowControl w:val="0"/>
               <w:numPr>
                 <w:ilvl w:val="0"/>
-                <w:numId w:val="72"/>
+                <w:numId w:val="68"/>
               </w:numPr>
               <w:jc w:val="both"/>
               <w:rPr>
@@ -11319,7 +11693,7 @@
               <w:widowControl w:val="0"/>
               <w:numPr>
                 <w:ilvl w:val="0"/>
-                <w:numId w:val="72"/>
+                <w:numId w:val="68"/>
               </w:numPr>
               <w:ind w:left="0" w:leftChars="0" w:firstLine="0" w:firstLineChars="0"/>
               <w:jc w:val="both"/>
@@ -11347,7 +11721,7 @@
               <w:widowControl w:val="0"/>
               <w:numPr>
                 <w:ilvl w:val="0"/>
-                <w:numId w:val="72"/>
+                <w:numId w:val="68"/>
               </w:numPr>
               <w:ind w:left="0" w:leftChars="0" w:firstLine="0" w:firstLineChars="0"/>
               <w:jc w:val="both"/>
@@ -11421,7 +11795,7 @@
               <w:widowControl w:val="0"/>
               <w:numPr>
                 <w:ilvl w:val="0"/>
-                <w:numId w:val="73"/>
+                <w:numId w:val="69"/>
               </w:numPr>
               <w:jc w:val="both"/>
               <w:rPr>
@@ -11494,7 +11868,7 @@
               <w:widowControl w:val="0"/>
               <w:numPr>
                 <w:ilvl w:val="0"/>
-                <w:numId w:val="74"/>
+                <w:numId w:val="70"/>
               </w:numPr>
               <w:jc w:val="both"/>
               <w:rPr>
@@ -11567,7 +11941,7 @@
               <w:widowControl w:val="0"/>
               <w:numPr>
                 <w:ilvl w:val="0"/>
-                <w:numId w:val="75"/>
+                <w:numId w:val="71"/>
               </w:numPr>
               <w:jc w:val="both"/>
               <w:rPr>
@@ -11740,7 +12114,7 @@
               <w:widowControl w:val="0"/>
               <w:numPr>
                 <w:ilvl w:val="0"/>
-                <w:numId w:val="76"/>
+                <w:numId w:val="72"/>
               </w:numPr>
               <w:jc w:val="both"/>
               <w:rPr>
@@ -11767,7 +12141,7 @@
               <w:widowControl w:val="0"/>
               <w:numPr>
                 <w:ilvl w:val="0"/>
-                <w:numId w:val="76"/>
+                <w:numId w:val="72"/>
               </w:numPr>
               <w:ind w:left="0" w:leftChars="0" w:firstLine="0" w:firstLineChars="0"/>
               <w:jc w:val="both"/>
@@ -11795,7 +12169,7 @@
               <w:widowControl w:val="0"/>
               <w:numPr>
                 <w:ilvl w:val="0"/>
-                <w:numId w:val="76"/>
+                <w:numId w:val="72"/>
               </w:numPr>
               <w:ind w:left="0" w:leftChars="0" w:firstLine="0" w:firstLineChars="0"/>
               <w:jc w:val="both"/>
@@ -11907,7 +12281,7 @@
               <w:widowControl w:val="0"/>
               <w:numPr>
                 <w:ilvl w:val="0"/>
-                <w:numId w:val="76"/>
+                <w:numId w:val="72"/>
               </w:numPr>
               <w:ind w:left="0" w:leftChars="0" w:firstLine="0" w:firstLineChars="0"/>
               <w:jc w:val="both"/>
@@ -11981,7 +12355,7 @@
               <w:widowControl w:val="0"/>
               <w:numPr>
                 <w:ilvl w:val="0"/>
-                <w:numId w:val="77"/>
+                <w:numId w:val="73"/>
               </w:numPr>
               <w:jc w:val="both"/>
               <w:rPr>
@@ -12054,7 +12428,7 @@
               <w:widowControl w:val="0"/>
               <w:numPr>
                 <w:ilvl w:val="0"/>
-                <w:numId w:val="78"/>
+                <w:numId w:val="74"/>
               </w:numPr>
               <w:jc w:val="both"/>
               <w:rPr>
@@ -12081,7 +12455,7 @@
               <w:widowControl w:val="0"/>
               <w:numPr>
                 <w:ilvl w:val="0"/>
-                <w:numId w:val="78"/>
+                <w:numId w:val="74"/>
               </w:numPr>
               <w:jc w:val="both"/>
               <w:rPr>
@@ -12154,7 +12528,7 @@
               <w:widowControl w:val="0"/>
               <w:numPr>
                 <w:ilvl w:val="0"/>
-                <w:numId w:val="79"/>
+                <w:numId w:val="75"/>
               </w:numPr>
               <w:ind w:leftChars="0"/>
               <w:jc w:val="both"/>
@@ -12328,7 +12702,7 @@
               <w:widowControl w:val="0"/>
               <w:numPr>
                 <w:ilvl w:val="0"/>
-                <w:numId w:val="80"/>
+                <w:numId w:val="76"/>
               </w:numPr>
               <w:jc w:val="both"/>
               <w:rPr>
@@ -12355,7 +12729,7 @@
               <w:widowControl w:val="0"/>
               <w:numPr>
                 <w:ilvl w:val="0"/>
-                <w:numId w:val="80"/>
+                <w:numId w:val="76"/>
               </w:numPr>
               <w:ind w:left="0" w:leftChars="0" w:firstLine="0" w:firstLineChars="0"/>
               <w:jc w:val="both"/>
@@ -12383,7 +12757,7 @@
               <w:widowControl w:val="0"/>
               <w:numPr>
                 <w:ilvl w:val="0"/>
-                <w:numId w:val="80"/>
+                <w:numId w:val="76"/>
               </w:numPr>
               <w:ind w:left="0" w:leftChars="0" w:firstLine="0" w:firstLineChars="0"/>
               <w:jc w:val="both"/>
@@ -12457,7 +12831,7 @@
               <w:widowControl w:val="0"/>
               <w:numPr>
                 <w:ilvl w:val="0"/>
-                <w:numId w:val="81"/>
+                <w:numId w:val="77"/>
               </w:numPr>
               <w:jc w:val="both"/>
               <w:rPr>
@@ -12530,7 +12904,7 @@
               <w:widowControl w:val="0"/>
               <w:numPr>
                 <w:ilvl w:val="0"/>
-                <w:numId w:val="82"/>
+                <w:numId w:val="78"/>
               </w:numPr>
               <w:jc w:val="both"/>
               <w:rPr>
@@ -12603,7 +12977,7 @@
               <w:widowControl w:val="0"/>
               <w:numPr>
                 <w:ilvl w:val="0"/>
-                <w:numId w:val="83"/>
+                <w:numId w:val="79"/>
               </w:numPr>
               <w:ind w:leftChars="0"/>
               <w:jc w:val="both"/>
@@ -12777,7 +13151,7 @@
               <w:widowControl w:val="0"/>
               <w:numPr>
                 <w:ilvl w:val="0"/>
-                <w:numId w:val="84"/>
+                <w:numId w:val="80"/>
               </w:numPr>
               <w:jc w:val="both"/>
               <w:rPr>
@@ -12804,7 +13178,7 @@
               <w:widowControl w:val="0"/>
               <w:numPr>
                 <w:ilvl w:val="0"/>
-                <w:numId w:val="84"/>
+                <w:numId w:val="80"/>
               </w:numPr>
               <w:ind w:left="0" w:leftChars="0" w:firstLine="0" w:firstLineChars="0"/>
               <w:jc w:val="both"/>
@@ -12916,7 +13290,7 @@
               <w:widowControl w:val="0"/>
               <w:numPr>
                 <w:ilvl w:val="0"/>
-                <w:numId w:val="84"/>
+                <w:numId w:val="80"/>
               </w:numPr>
               <w:ind w:left="0" w:leftChars="0" w:firstLine="0" w:firstLineChars="0"/>
               <w:jc w:val="both"/>
@@ -12990,7 +13364,7 @@
               <w:widowControl w:val="0"/>
               <w:numPr>
                 <w:ilvl w:val="0"/>
-                <w:numId w:val="85"/>
+                <w:numId w:val="81"/>
               </w:numPr>
               <w:jc w:val="both"/>
               <w:rPr>
@@ -13063,7 +13437,7 @@
               <w:widowControl w:val="0"/>
               <w:numPr>
                 <w:ilvl w:val="0"/>
-                <w:numId w:val="86"/>
+                <w:numId w:val="82"/>
               </w:numPr>
               <w:jc w:val="both"/>
               <w:rPr>
@@ -13090,7 +13464,7 @@
               <w:widowControl w:val="0"/>
               <w:numPr>
                 <w:ilvl w:val="0"/>
-                <w:numId w:val="86"/>
+                <w:numId w:val="82"/>
               </w:numPr>
               <w:ind w:left="0" w:leftChars="0" w:firstLine="0" w:firstLineChars="0"/>
               <w:jc w:val="both"/>
@@ -13164,7 +13538,7 @@
               <w:widowControl w:val="0"/>
               <w:numPr>
                 <w:ilvl w:val="0"/>
-                <w:numId w:val="87"/>
+                <w:numId w:val="83"/>
               </w:numPr>
               <w:ind w:leftChars="0"/>
               <w:jc w:val="both"/>
@@ -13338,7 +13712,7 @@
               <w:widowControl w:val="0"/>
               <w:numPr>
                 <w:ilvl w:val="0"/>
-                <w:numId w:val="88"/>
+                <w:numId w:val="84"/>
               </w:numPr>
               <w:jc w:val="both"/>
               <w:rPr>
@@ -13365,7 +13739,7 @@
               <w:widowControl w:val="0"/>
               <w:numPr>
                 <w:ilvl w:val="0"/>
-                <w:numId w:val="88"/>
+                <w:numId w:val="84"/>
               </w:numPr>
               <w:ind w:left="0" w:leftChars="0" w:firstLine="0" w:firstLineChars="0"/>
               <w:jc w:val="both"/>
@@ -13393,7 +13767,7 @@
               <w:widowControl w:val="0"/>
               <w:numPr>
                 <w:ilvl w:val="0"/>
-                <w:numId w:val="88"/>
+                <w:numId w:val="84"/>
               </w:numPr>
               <w:ind w:left="0" w:leftChars="0" w:firstLine="0" w:firstLineChars="0"/>
               <w:jc w:val="both"/>
@@ -13540,7 +13914,7 @@
               <w:widowControl w:val="0"/>
               <w:numPr>
                 <w:ilvl w:val="0"/>
-                <w:numId w:val="89"/>
+                <w:numId w:val="85"/>
               </w:numPr>
               <w:jc w:val="both"/>
               <w:rPr>
@@ -13613,7 +13987,7 @@
               <w:widowControl w:val="0"/>
               <w:numPr>
                 <w:ilvl w:val="0"/>
-                <w:numId w:val="90"/>
+                <w:numId w:val="86"/>
               </w:numPr>
               <w:jc w:val="both"/>
               <w:rPr>
@@ -13786,7 +14160,7 @@
               <w:widowControl w:val="0"/>
               <w:numPr>
                 <w:ilvl w:val="0"/>
-                <w:numId w:val="91"/>
+                <w:numId w:val="87"/>
               </w:numPr>
               <w:jc w:val="both"/>
               <w:rPr>
@@ -13813,7 +14187,7 @@
               <w:widowControl w:val="0"/>
               <w:numPr>
                 <w:ilvl w:val="0"/>
-                <w:numId w:val="91"/>
+                <w:numId w:val="87"/>
               </w:numPr>
               <w:ind w:left="0" w:leftChars="0" w:firstLine="0" w:firstLineChars="0"/>
               <w:jc w:val="both"/>
@@ -13841,7 +14215,7 @@
               <w:widowControl w:val="0"/>
               <w:numPr>
                 <w:ilvl w:val="0"/>
-                <w:numId w:val="91"/>
+                <w:numId w:val="87"/>
               </w:numPr>
               <w:ind w:left="0" w:leftChars="0" w:firstLine="0" w:firstLineChars="0"/>
               <w:jc w:val="both"/>
@@ -13915,7 +14289,7 @@
               <w:widowControl w:val="0"/>
               <w:numPr>
                 <w:ilvl w:val="0"/>
-                <w:numId w:val="92"/>
+                <w:numId w:val="88"/>
               </w:numPr>
               <w:jc w:val="both"/>
               <w:rPr>
@@ -13988,7 +14362,7 @@
               <w:widowControl w:val="0"/>
               <w:numPr>
                 <w:ilvl w:val="0"/>
-                <w:numId w:val="93"/>
+                <w:numId w:val="89"/>
               </w:numPr>
               <w:jc w:val="both"/>
               <w:rPr>
@@ -14061,7 +14435,7 @@
               <w:widowControl w:val="0"/>
               <w:numPr>
                 <w:ilvl w:val="0"/>
-                <w:numId w:val="94"/>
+                <w:numId w:val="90"/>
               </w:numPr>
               <w:ind w:leftChars="0"/>
               <w:jc w:val="both"/>
@@ -14216,18 +14590,6 @@
     </w:lvl>
   </w:abstractNum>
   <w:abstractNum w:abstractNumId="9">
-    <w:nsid w:val="8C749FB7"/>
-    <w:multiLevelType w:val="singleLevel"/>
-    <w:tmpl w:val="8C749FB7"/>
-    <w:lvl w:ilvl="0" w:tentative="0">
-      <w:start w:val="1"/>
-      <w:numFmt w:val="decimal"/>
-      <w:suff w:val="space"/>
-      <w:lvlText w:val="%1."/>
-      <w:lvlJc w:val="left"/>
-    </w:lvl>
-  </w:abstractNum>
-  <w:abstractNum w:abstractNumId="10">
     <w:nsid w:val="8DBC8CEF"/>
     <w:multiLevelType w:val="singleLevel"/>
     <w:tmpl w:val="8DBC8CEF"/>
@@ -14239,7 +14601,7 @@
       <w:lvlJc w:val="left"/>
     </w:lvl>
   </w:abstractNum>
-  <w:abstractNum w:abstractNumId="11">
+  <w:abstractNum w:abstractNumId="10">
     <w:nsid w:val="92EF6321"/>
     <w:multiLevelType w:val="singleLevel"/>
     <w:tmpl w:val="92EF6321"/>
@@ -14251,7 +14613,7 @@
       <w:lvlJc w:val="left"/>
     </w:lvl>
   </w:abstractNum>
-  <w:abstractNum w:abstractNumId="12">
+  <w:abstractNum w:abstractNumId="11">
     <w:nsid w:val="94F60664"/>
     <w:multiLevelType w:val="singleLevel"/>
     <w:tmpl w:val="94F60664"/>
@@ -14263,7 +14625,7 @@
       <w:lvlJc w:val="left"/>
     </w:lvl>
   </w:abstractNum>
-  <w:abstractNum w:abstractNumId="13">
+  <w:abstractNum w:abstractNumId="12">
     <w:nsid w:val="98985596"/>
     <w:multiLevelType w:val="singleLevel"/>
     <w:tmpl w:val="98985596"/>
@@ -14275,7 +14637,7 @@
       <w:lvlJc w:val="left"/>
     </w:lvl>
   </w:abstractNum>
-  <w:abstractNum w:abstractNumId="14">
+  <w:abstractNum w:abstractNumId="13">
     <w:nsid w:val="9AE6EC4F"/>
     <w:multiLevelType w:val="singleLevel"/>
     <w:tmpl w:val="9AE6EC4F"/>
@@ -14287,7 +14649,7 @@
       <w:lvlJc w:val="left"/>
     </w:lvl>
   </w:abstractNum>
-  <w:abstractNum w:abstractNumId="15">
+  <w:abstractNum w:abstractNumId="14">
     <w:nsid w:val="9E09ABE2"/>
     <w:multiLevelType w:val="multilevel"/>
     <w:tmpl w:val="9E09ABE2"/>
@@ -14427,7 +14789,7 @@
       </w:rPr>
     </w:lvl>
   </w:abstractNum>
-  <w:abstractNum w:abstractNumId="16">
+  <w:abstractNum w:abstractNumId="15">
     <w:nsid w:val="A3C3D122"/>
     <w:multiLevelType w:val="singleLevel"/>
     <w:tmpl w:val="A3C3D122"/>
@@ -14439,7 +14801,7 @@
       <w:lvlJc w:val="left"/>
     </w:lvl>
   </w:abstractNum>
-  <w:abstractNum w:abstractNumId="17">
+  <w:abstractNum w:abstractNumId="16">
     <w:nsid w:val="A47B5E06"/>
     <w:multiLevelType w:val="singleLevel"/>
     <w:tmpl w:val="A47B5E06"/>
@@ -14451,7 +14813,7 @@
       <w:lvlJc w:val="left"/>
     </w:lvl>
   </w:abstractNum>
-  <w:abstractNum w:abstractNumId="18">
+  <w:abstractNum w:abstractNumId="17">
     <w:nsid w:val="A5D72E53"/>
     <w:multiLevelType w:val="multilevel"/>
     <w:tmpl w:val="A5D72E53"/>
@@ -14591,7 +14953,7 @@
       </w:rPr>
     </w:lvl>
   </w:abstractNum>
-  <w:abstractNum w:abstractNumId="19">
+  <w:abstractNum w:abstractNumId="18">
     <w:nsid w:val="A8A349C5"/>
     <w:multiLevelType w:val="singleLevel"/>
     <w:tmpl w:val="A8A349C5"/>
@@ -14603,7 +14965,7 @@
       <w:lvlJc w:val="left"/>
     </w:lvl>
   </w:abstractNum>
-  <w:abstractNum w:abstractNumId="20">
+  <w:abstractNum w:abstractNumId="19">
     <w:nsid w:val="AB2CD29A"/>
     <w:multiLevelType w:val="singleLevel"/>
     <w:tmpl w:val="AB2CD29A"/>
@@ -14615,7 +14977,7 @@
       <w:lvlJc w:val="left"/>
     </w:lvl>
   </w:abstractNum>
-  <w:abstractNum w:abstractNumId="21">
+  <w:abstractNum w:abstractNumId="20">
     <w:nsid w:val="B0E25511"/>
     <w:multiLevelType w:val="singleLevel"/>
     <w:tmpl w:val="B0E25511"/>
@@ -14631,7 +14993,7 @@
       </w:pPr>
     </w:lvl>
   </w:abstractNum>
-  <w:abstractNum w:abstractNumId="22">
+  <w:abstractNum w:abstractNumId="21">
     <w:nsid w:val="B3C2315F"/>
     <w:multiLevelType w:val="singleLevel"/>
     <w:tmpl w:val="B3C2315F"/>
@@ -14643,7 +15005,7 @@
       <w:lvlJc w:val="left"/>
     </w:lvl>
   </w:abstractNum>
-  <w:abstractNum w:abstractNumId="23">
+  <w:abstractNum w:abstractNumId="22">
     <w:nsid w:val="B52C055F"/>
     <w:multiLevelType w:val="multilevel"/>
     <w:tmpl w:val="B52C055F"/>
@@ -14783,7 +15145,7 @@
       </w:rPr>
     </w:lvl>
   </w:abstractNum>
-  <w:abstractNum w:abstractNumId="24">
+  <w:abstractNum w:abstractNumId="23">
     <w:nsid w:val="B6407F19"/>
     <w:multiLevelType w:val="singleLevel"/>
     <w:tmpl w:val="B6407F19"/>
@@ -14795,7 +15157,7 @@
       <w:lvlJc w:val="left"/>
     </w:lvl>
   </w:abstractNum>
-  <w:abstractNum w:abstractNumId="25">
+  <w:abstractNum w:abstractNumId="24">
     <w:nsid w:val="B7529E00"/>
     <w:multiLevelType w:val="singleLevel"/>
     <w:tmpl w:val="B7529E00"/>
@@ -14807,7 +15169,7 @@
       <w:lvlJc w:val="left"/>
     </w:lvl>
   </w:abstractNum>
-  <w:abstractNum w:abstractNumId="26">
+  <w:abstractNum w:abstractNumId="25">
     <w:nsid w:val="B8276521"/>
     <w:multiLevelType w:val="singleLevel"/>
     <w:tmpl w:val="B8276521"/>
@@ -14819,7 +15181,7 @@
       <w:lvlJc w:val="left"/>
     </w:lvl>
   </w:abstractNum>
-  <w:abstractNum w:abstractNumId="27">
+  <w:abstractNum w:abstractNumId="26">
     <w:nsid w:val="B9B3F82F"/>
     <w:multiLevelType w:val="singleLevel"/>
     <w:tmpl w:val="B9B3F82F"/>
@@ -14831,7 +15193,7 @@
       <w:lvlJc w:val="left"/>
     </w:lvl>
   </w:abstractNum>
-  <w:abstractNum w:abstractNumId="28">
+  <w:abstractNum w:abstractNumId="27">
     <w:nsid w:val="BD3EE326"/>
     <w:multiLevelType w:val="singleLevel"/>
     <w:tmpl w:val="BD3EE326"/>
@@ -14843,7 +15205,7 @@
       <w:lvlJc w:val="left"/>
     </w:lvl>
   </w:abstractNum>
-  <w:abstractNum w:abstractNumId="29">
+  <w:abstractNum w:abstractNumId="28">
     <w:nsid w:val="BF1C10F1"/>
     <w:multiLevelType w:val="singleLevel"/>
     <w:tmpl w:val="BF1C10F1"/>
@@ -14855,7 +15217,7 @@
       <w:lvlJc w:val="left"/>
     </w:lvl>
   </w:abstractNum>
-  <w:abstractNum w:abstractNumId="30">
+  <w:abstractNum w:abstractNumId="29">
     <w:nsid w:val="C1131C82"/>
     <w:multiLevelType w:val="singleLevel"/>
     <w:tmpl w:val="C1131C82"/>
@@ -14867,7 +15229,7 @@
       <w:lvlJc w:val="left"/>
     </w:lvl>
   </w:abstractNum>
-  <w:abstractNum w:abstractNumId="31">
+  <w:abstractNum w:abstractNumId="30">
     <w:nsid w:val="C50E5F50"/>
     <w:multiLevelType w:val="singleLevel"/>
     <w:tmpl w:val="C50E5F50"/>
@@ -14879,7 +15241,7 @@
       <w:lvlJc w:val="left"/>
     </w:lvl>
   </w:abstractNum>
-  <w:abstractNum w:abstractNumId="32">
+  <w:abstractNum w:abstractNumId="31">
     <w:nsid w:val="C793915E"/>
     <w:multiLevelType w:val="singleLevel"/>
     <w:tmpl w:val="C793915E"/>
@@ -14891,7 +15253,7 @@
       <w:lvlJc w:val="left"/>
     </w:lvl>
   </w:abstractNum>
-  <w:abstractNum w:abstractNumId="33">
+  <w:abstractNum w:abstractNumId="32">
     <w:nsid w:val="CAD6F3E4"/>
     <w:multiLevelType w:val="singleLevel"/>
     <w:tmpl w:val="CAD6F3E4"/>
@@ -14903,7 +15265,7 @@
       <w:lvlJc w:val="left"/>
     </w:lvl>
   </w:abstractNum>
-  <w:abstractNum w:abstractNumId="34">
+  <w:abstractNum w:abstractNumId="33">
     <w:nsid w:val="CBEC66A5"/>
     <w:multiLevelType w:val="singleLevel"/>
     <w:tmpl w:val="CBEC66A5"/>
@@ -14915,7 +15277,7 @@
       <w:lvlJc w:val="left"/>
     </w:lvl>
   </w:abstractNum>
-  <w:abstractNum w:abstractNumId="35">
+  <w:abstractNum w:abstractNumId="34">
     <w:nsid w:val="CE762D04"/>
     <w:multiLevelType w:val="singleLevel"/>
     <w:tmpl w:val="CE762D04"/>
@@ -14927,7 +15289,7 @@
       <w:lvlJc w:val="left"/>
     </w:lvl>
   </w:abstractNum>
-  <w:abstractNum w:abstractNumId="36">
+  <w:abstractNum w:abstractNumId="35">
     <w:nsid w:val="CFB556DD"/>
     <w:multiLevelType w:val="singleLevel"/>
     <w:tmpl w:val="CFB556DD"/>
@@ -14939,7 +15301,7 @@
       <w:lvlJc w:val="left"/>
     </w:lvl>
   </w:abstractNum>
-  <w:abstractNum w:abstractNumId="37">
+  <w:abstractNum w:abstractNumId="36">
     <w:nsid w:val="D34636E3"/>
     <w:multiLevelType w:val="singleLevel"/>
     <w:tmpl w:val="D34636E3"/>
@@ -14951,7 +15313,7 @@
       <w:lvlJc w:val="left"/>
     </w:lvl>
   </w:abstractNum>
-  <w:abstractNum w:abstractNumId="38">
+  <w:abstractNum w:abstractNumId="37">
     <w:nsid w:val="D4A79DA9"/>
     <w:multiLevelType w:val="multilevel"/>
     <w:tmpl w:val="D4A79DA9"/>
@@ -15091,7 +15453,7 @@
       </w:rPr>
     </w:lvl>
   </w:abstractNum>
-  <w:abstractNum w:abstractNumId="39">
+  <w:abstractNum w:abstractNumId="38">
     <w:nsid w:val="DB2E8F8F"/>
     <w:multiLevelType w:val="singleLevel"/>
     <w:tmpl w:val="DB2E8F8F"/>
@@ -15103,7 +15465,7 @@
       <w:lvlJc w:val="left"/>
     </w:lvl>
   </w:abstractNum>
-  <w:abstractNum w:abstractNumId="40">
+  <w:abstractNum w:abstractNumId="39">
     <w:nsid w:val="E109609F"/>
     <w:multiLevelType w:val="singleLevel"/>
     <w:tmpl w:val="E109609F"/>
@@ -15115,7 +15477,7 @@
       <w:lvlJc w:val="left"/>
     </w:lvl>
   </w:abstractNum>
-  <w:abstractNum w:abstractNumId="41">
+  <w:abstractNum w:abstractNumId="40">
     <w:nsid w:val="E17C0C88"/>
     <w:multiLevelType w:val="singleLevel"/>
     <w:tmpl w:val="E17C0C88"/>
@@ -15127,7 +15489,7 @@
       <w:lvlJc w:val="left"/>
     </w:lvl>
   </w:abstractNum>
-  <w:abstractNum w:abstractNumId="42">
+  <w:abstractNum w:abstractNumId="41">
     <w:nsid w:val="E89A39E4"/>
     <w:multiLevelType w:val="singleLevel"/>
     <w:tmpl w:val="E89A39E4"/>
@@ -15139,7 +15501,7 @@
       <w:lvlJc w:val="left"/>
     </w:lvl>
   </w:abstractNum>
-  <w:abstractNum w:abstractNumId="43">
+  <w:abstractNum w:abstractNumId="42">
     <w:nsid w:val="E9767898"/>
     <w:multiLevelType w:val="singleLevel"/>
     <w:tmpl w:val="E9767898"/>
@@ -15151,7 +15513,7 @@
       <w:lvlJc w:val="left"/>
     </w:lvl>
   </w:abstractNum>
-  <w:abstractNum w:abstractNumId="44">
+  <w:abstractNum w:abstractNumId="43">
     <w:nsid w:val="EA14CDEE"/>
     <w:multiLevelType w:val="singleLevel"/>
     <w:tmpl w:val="EA14CDEE"/>
@@ -15163,7 +15525,7 @@
       <w:lvlJc w:val="left"/>
     </w:lvl>
   </w:abstractNum>
-  <w:abstractNum w:abstractNumId="45">
+  <w:abstractNum w:abstractNumId="44">
     <w:nsid w:val="EA1AA236"/>
     <w:multiLevelType w:val="singleLevel"/>
     <w:tmpl w:val="EA1AA236"/>
@@ -15175,19 +15537,7 @@
       <w:lvlJc w:val="left"/>
     </w:lvl>
   </w:abstractNum>
-  <w:abstractNum w:abstractNumId="46">
-    <w:nsid w:val="ED718AAF"/>
-    <w:multiLevelType w:val="singleLevel"/>
-    <w:tmpl w:val="ED718AAF"/>
-    <w:lvl w:ilvl="0" w:tentative="0">
-      <w:start w:val="1"/>
-      <w:numFmt w:val="decimal"/>
-      <w:suff w:val="space"/>
-      <w:lvlText w:val="%1."/>
-      <w:lvlJc w:val="left"/>
-    </w:lvl>
-  </w:abstractNum>
-  <w:abstractNum w:abstractNumId="47">
+  <w:abstractNum w:abstractNumId="45">
     <w:nsid w:val="F516EE0D"/>
     <w:multiLevelType w:val="singleLevel"/>
     <w:tmpl w:val="F516EE0D"/>
@@ -15199,7 +15549,7 @@
       <w:lvlJc w:val="left"/>
     </w:lvl>
   </w:abstractNum>
-  <w:abstractNum w:abstractNumId="48">
+  <w:abstractNum w:abstractNumId="46">
     <w:nsid w:val="FC29D630"/>
     <w:multiLevelType w:val="singleLevel"/>
     <w:tmpl w:val="FC29D630"/>
@@ -15211,7 +15561,7 @@
       <w:lvlJc w:val="left"/>
     </w:lvl>
   </w:abstractNum>
-  <w:abstractNum w:abstractNumId="49">
+  <w:abstractNum w:abstractNumId="47">
     <w:nsid w:val="FE24A8A4"/>
     <w:multiLevelType w:val="singleLevel"/>
     <w:tmpl w:val="FE24A8A4"/>
@@ -15223,7 +15573,7 @@
       <w:lvlJc w:val="left"/>
     </w:lvl>
   </w:abstractNum>
-  <w:abstractNum w:abstractNumId="50">
+  <w:abstractNum w:abstractNumId="48">
     <w:nsid w:val="FE343E4B"/>
     <w:multiLevelType w:val="singleLevel"/>
     <w:tmpl w:val="FE343E4B"/>
@@ -15235,7 +15585,7 @@
       <w:lvlJc w:val="left"/>
     </w:lvl>
   </w:abstractNum>
-  <w:abstractNum w:abstractNumId="51">
+  <w:abstractNum w:abstractNumId="49">
     <w:nsid w:val="058F7B3C"/>
     <w:multiLevelType w:val="singleLevel"/>
     <w:tmpl w:val="058F7B3C"/>
@@ -15247,7 +15597,7 @@
       <w:lvlJc w:val="left"/>
     </w:lvl>
   </w:abstractNum>
-  <w:abstractNum w:abstractNumId="52">
+  <w:abstractNum w:abstractNumId="50">
     <w:nsid w:val="09005923"/>
     <w:multiLevelType w:val="singleLevel"/>
     <w:tmpl w:val="09005923"/>
@@ -15259,19 +15609,7 @@
       <w:lvlJc w:val="left"/>
     </w:lvl>
   </w:abstractNum>
-  <w:abstractNum w:abstractNumId="53">
-    <w:nsid w:val="091759E5"/>
-    <w:multiLevelType w:val="singleLevel"/>
-    <w:tmpl w:val="091759E5"/>
-    <w:lvl w:ilvl="0" w:tentative="0">
-      <w:start w:val="1"/>
-      <w:numFmt w:val="decimal"/>
-      <w:suff w:val="space"/>
-      <w:lvlText w:val="%1."/>
-      <w:lvlJc w:val="left"/>
-    </w:lvl>
-  </w:abstractNum>
-  <w:abstractNum w:abstractNumId="54">
+  <w:abstractNum w:abstractNumId="51">
     <w:nsid w:val="0A7C2C92"/>
     <w:multiLevelType w:val="singleLevel"/>
     <w:tmpl w:val="0A7C2C92"/>
@@ -15283,7 +15621,7 @@
       <w:lvlJc w:val="left"/>
     </w:lvl>
   </w:abstractNum>
-  <w:abstractNum w:abstractNumId="55">
+  <w:abstractNum w:abstractNumId="52">
     <w:nsid w:val="0CD92811"/>
     <w:multiLevelType w:val="singleLevel"/>
     <w:tmpl w:val="0CD92811"/>
@@ -15295,19 +15633,7 @@
       <w:lvlJc w:val="left"/>
     </w:lvl>
   </w:abstractNum>
-  <w:abstractNum w:abstractNumId="56">
-    <w:nsid w:val="0E610A28"/>
-    <w:multiLevelType w:val="singleLevel"/>
-    <w:tmpl w:val="0E610A28"/>
-    <w:lvl w:ilvl="0" w:tentative="0">
-      <w:start w:val="1"/>
-      <w:numFmt w:val="decimal"/>
-      <w:suff w:val="space"/>
-      <w:lvlText w:val="%1."/>
-      <w:lvlJc w:val="left"/>
-    </w:lvl>
-  </w:abstractNum>
-  <w:abstractNum w:abstractNumId="57">
+  <w:abstractNum w:abstractNumId="53">
     <w:nsid w:val="12E3D0E2"/>
     <w:multiLevelType w:val="singleLevel"/>
     <w:tmpl w:val="12E3D0E2"/>
@@ -15319,7 +15645,7 @@
       <w:lvlJc w:val="left"/>
     </w:lvl>
   </w:abstractNum>
-  <w:abstractNum w:abstractNumId="58">
+  <w:abstractNum w:abstractNumId="54">
     <w:nsid w:val="18501BFC"/>
     <w:multiLevelType w:val="singleLevel"/>
     <w:tmpl w:val="18501BFC"/>
@@ -15331,7 +15657,7 @@
       <w:lvlJc w:val="left"/>
     </w:lvl>
   </w:abstractNum>
-  <w:abstractNum w:abstractNumId="59">
+  <w:abstractNum w:abstractNumId="55">
     <w:nsid w:val="211769BA"/>
     <w:multiLevelType w:val="singleLevel"/>
     <w:tmpl w:val="211769BA"/>
@@ -15343,7 +15669,7 @@
       <w:lvlJc w:val="left"/>
     </w:lvl>
   </w:abstractNum>
-  <w:abstractNum w:abstractNumId="60">
+  <w:abstractNum w:abstractNumId="56">
     <w:nsid w:val="2726B058"/>
     <w:multiLevelType w:val="singleLevel"/>
     <w:tmpl w:val="2726B058"/>
@@ -15355,7 +15681,7 @@
       <w:lvlJc w:val="left"/>
     </w:lvl>
   </w:abstractNum>
-  <w:abstractNum w:abstractNumId="61">
+  <w:abstractNum w:abstractNumId="57">
     <w:nsid w:val="27D2B737"/>
     <w:multiLevelType w:val="singleLevel"/>
     <w:tmpl w:val="27D2B737"/>
@@ -15367,7 +15693,7 @@
       <w:lvlJc w:val="left"/>
     </w:lvl>
   </w:abstractNum>
-  <w:abstractNum w:abstractNumId="62">
+  <w:abstractNum w:abstractNumId="58">
     <w:nsid w:val="2DE852F7"/>
     <w:multiLevelType w:val="singleLevel"/>
     <w:tmpl w:val="2DE852F7"/>
@@ -15379,7 +15705,7 @@
       <w:lvlJc w:val="left"/>
     </w:lvl>
   </w:abstractNum>
-  <w:abstractNum w:abstractNumId="63">
+  <w:abstractNum w:abstractNumId="59">
     <w:nsid w:val="30AD9F26"/>
     <w:multiLevelType w:val="singleLevel"/>
     <w:tmpl w:val="30AD9F26"/>
@@ -15391,7 +15717,7 @@
       <w:lvlJc w:val="left"/>
     </w:lvl>
   </w:abstractNum>
-  <w:abstractNum w:abstractNumId="64">
+  <w:abstractNum w:abstractNumId="60">
     <w:nsid w:val="34247F98"/>
     <w:multiLevelType w:val="singleLevel"/>
     <w:tmpl w:val="34247F98"/>
@@ -15403,7 +15729,7 @@
       <w:lvlJc w:val="left"/>
     </w:lvl>
   </w:abstractNum>
-  <w:abstractNum w:abstractNumId="65">
+  <w:abstractNum w:abstractNumId="61">
     <w:nsid w:val="34ACC566"/>
     <w:multiLevelType w:val="singleLevel"/>
     <w:tmpl w:val="34ACC566"/>
@@ -15415,7 +15741,7 @@
       <w:lvlJc w:val="left"/>
     </w:lvl>
   </w:abstractNum>
-  <w:abstractNum w:abstractNumId="66">
+  <w:abstractNum w:abstractNumId="62">
     <w:nsid w:val="36D9EC17"/>
     <w:multiLevelType w:val="singleLevel"/>
     <w:tmpl w:val="36D9EC17"/>
@@ -15427,7 +15753,7 @@
       <w:lvlJc w:val="left"/>
     </w:lvl>
   </w:abstractNum>
-  <w:abstractNum w:abstractNumId="67">
+  <w:abstractNum w:abstractNumId="63">
     <w:nsid w:val="3755E511"/>
     <w:multiLevelType w:val="singleLevel"/>
     <w:tmpl w:val="3755E511"/>
@@ -15439,7 +15765,7 @@
       <w:lvlJc w:val="left"/>
     </w:lvl>
   </w:abstractNum>
-  <w:abstractNum w:abstractNumId="68">
+  <w:abstractNum w:abstractNumId="64">
     <w:nsid w:val="3915D7F5"/>
     <w:multiLevelType w:val="singleLevel"/>
     <w:tmpl w:val="3915D7F5"/>
@@ -15451,7 +15777,7 @@
       <w:lvlJc w:val="left"/>
     </w:lvl>
   </w:abstractNum>
-  <w:abstractNum w:abstractNumId="69">
+  <w:abstractNum w:abstractNumId="65">
     <w:nsid w:val="3B3BFDBA"/>
     <w:multiLevelType w:val="singleLevel"/>
     <w:tmpl w:val="3B3BFDBA"/>
@@ -15463,7 +15789,7 @@
       <w:lvlJc w:val="left"/>
     </w:lvl>
   </w:abstractNum>
-  <w:abstractNum w:abstractNumId="70">
+  <w:abstractNum w:abstractNumId="66">
     <w:nsid w:val="3CC99ABE"/>
     <w:multiLevelType w:val="singleLevel"/>
     <w:tmpl w:val="3CC99ABE"/>
@@ -15475,7 +15801,7 @@
       <w:lvlJc w:val="left"/>
     </w:lvl>
   </w:abstractNum>
-  <w:abstractNum w:abstractNumId="71">
+  <w:abstractNum w:abstractNumId="67">
     <w:nsid w:val="3D4BEBA8"/>
     <w:multiLevelType w:val="singleLevel"/>
     <w:tmpl w:val="3D4BEBA8"/>
@@ -15487,7 +15813,7 @@
       <w:lvlJc w:val="left"/>
     </w:lvl>
   </w:abstractNum>
-  <w:abstractNum w:abstractNumId="72">
+  <w:abstractNum w:abstractNumId="68">
     <w:nsid w:val="428F8CC0"/>
     <w:multiLevelType w:val="singleLevel"/>
     <w:tmpl w:val="428F8CC0"/>
@@ -15499,7 +15825,7 @@
       <w:lvlJc w:val="left"/>
     </w:lvl>
   </w:abstractNum>
-  <w:abstractNum w:abstractNumId="73">
+  <w:abstractNum w:abstractNumId="69">
     <w:nsid w:val="46D2EDB9"/>
     <w:multiLevelType w:val="multilevel"/>
     <w:tmpl w:val="46D2EDB9"/>
@@ -15639,7 +15965,7 @@
       </w:rPr>
     </w:lvl>
   </w:abstractNum>
-  <w:abstractNum w:abstractNumId="74">
+  <w:abstractNum w:abstractNumId="70">
     <w:nsid w:val="4A611E4F"/>
     <w:multiLevelType w:val="singleLevel"/>
     <w:tmpl w:val="4A611E4F"/>
@@ -15651,7 +15977,7 @@
       <w:lvlJc w:val="left"/>
     </w:lvl>
   </w:abstractNum>
-  <w:abstractNum w:abstractNumId="75">
+  <w:abstractNum w:abstractNumId="71">
     <w:nsid w:val="4F2E84C6"/>
     <w:multiLevelType w:val="singleLevel"/>
     <w:tmpl w:val="4F2E84C6"/>
@@ -15663,7 +15989,7 @@
       <w:lvlJc w:val="left"/>
     </w:lvl>
   </w:abstractNum>
-  <w:abstractNum w:abstractNumId="76">
+  <w:abstractNum w:abstractNumId="72">
     <w:nsid w:val="52BBEC1D"/>
     <w:multiLevelType w:val="singleLevel"/>
     <w:tmpl w:val="52BBEC1D"/>
@@ -15675,7 +16001,7 @@
       <w:lvlJc w:val="left"/>
     </w:lvl>
   </w:abstractNum>
-  <w:abstractNum w:abstractNumId="77">
+  <w:abstractNum w:abstractNumId="73">
     <w:nsid w:val="537CC0EA"/>
     <w:multiLevelType w:val="singleLevel"/>
     <w:tmpl w:val="537CC0EA"/>
@@ -15687,7 +16013,7 @@
       <w:lvlJc w:val="left"/>
     </w:lvl>
   </w:abstractNum>
-  <w:abstractNum w:abstractNumId="78">
+  <w:abstractNum w:abstractNumId="74">
     <w:nsid w:val="5973A4FA"/>
     <w:multiLevelType w:val="singleLevel"/>
     <w:tmpl w:val="5973A4FA"/>
@@ -15699,7 +16025,7 @@
       <w:lvlJc w:val="left"/>
     </w:lvl>
   </w:abstractNum>
-  <w:abstractNum w:abstractNumId="79">
+  <w:abstractNum w:abstractNumId="75">
     <w:nsid w:val="6024D89E"/>
     <w:multiLevelType w:val="singleLevel"/>
     <w:tmpl w:val="6024D89E"/>
@@ -15711,7 +16037,7 @@
       <w:lvlJc w:val="left"/>
     </w:lvl>
   </w:abstractNum>
-  <w:abstractNum w:abstractNumId="80">
+  <w:abstractNum w:abstractNumId="76">
     <w:nsid w:val="628F328F"/>
     <w:multiLevelType w:val="singleLevel"/>
     <w:tmpl w:val="628F328F"/>
@@ -15723,7 +16049,7 @@
       <w:lvlJc w:val="left"/>
     </w:lvl>
   </w:abstractNum>
-  <w:abstractNum w:abstractNumId="81">
+  <w:abstractNum w:abstractNumId="77">
     <w:nsid w:val="62FD1C74"/>
     <w:multiLevelType w:val="singleLevel"/>
     <w:tmpl w:val="62FD1C74"/>
@@ -15735,7 +16061,7 @@
       <w:lvlJc w:val="left"/>
     </w:lvl>
   </w:abstractNum>
-  <w:abstractNum w:abstractNumId="82">
+  <w:abstractNum w:abstractNumId="78">
     <w:nsid w:val="6578F536"/>
     <w:multiLevelType w:val="singleLevel"/>
     <w:tmpl w:val="6578F536"/>
@@ -15747,7 +16073,7 @@
       <w:lvlJc w:val="left"/>
     </w:lvl>
   </w:abstractNum>
-  <w:abstractNum w:abstractNumId="83">
+  <w:abstractNum w:abstractNumId="79">
     <w:nsid w:val="658783AF"/>
     <w:multiLevelType w:val="singleLevel"/>
     <w:tmpl w:val="658783AF"/>
@@ -15759,7 +16085,7 @@
       <w:lvlJc w:val="left"/>
     </w:lvl>
   </w:abstractNum>
-  <w:abstractNum w:abstractNumId="84">
+  <w:abstractNum w:abstractNumId="80">
     <w:nsid w:val="67A03EFF"/>
     <w:multiLevelType w:val="singleLevel"/>
     <w:tmpl w:val="67A03EFF"/>
@@ -15771,7 +16097,7 @@
       <w:lvlJc w:val="left"/>
     </w:lvl>
   </w:abstractNum>
-  <w:abstractNum w:abstractNumId="85">
+  <w:abstractNum w:abstractNumId="81">
     <w:nsid w:val="687B0014"/>
     <w:multiLevelType w:val="singleLevel"/>
     <w:tmpl w:val="687B0014"/>
@@ -15783,7 +16109,7 @@
       <w:lvlJc w:val="left"/>
     </w:lvl>
   </w:abstractNum>
-  <w:abstractNum w:abstractNumId="86">
+  <w:abstractNum w:abstractNumId="82">
     <w:nsid w:val="69C1C339"/>
     <w:multiLevelType w:val="singleLevel"/>
     <w:tmpl w:val="69C1C339"/>
@@ -15795,7 +16121,7 @@
       <w:lvlJc w:val="left"/>
     </w:lvl>
   </w:abstractNum>
-  <w:abstractNum w:abstractNumId="87">
+  <w:abstractNum w:abstractNumId="83">
     <w:nsid w:val="6AF88BFE"/>
     <w:multiLevelType w:val="singleLevel"/>
     <w:tmpl w:val="6AF88BFE"/>
@@ -15807,7 +16133,7 @@
       <w:lvlJc w:val="left"/>
     </w:lvl>
   </w:abstractNum>
-  <w:abstractNum w:abstractNumId="88">
+  <w:abstractNum w:abstractNumId="84">
     <w:nsid w:val="723B45CE"/>
     <w:multiLevelType w:val="singleLevel"/>
     <w:tmpl w:val="723B45CE"/>
@@ -15819,7 +16145,7 @@
       <w:lvlJc w:val="left"/>
     </w:lvl>
   </w:abstractNum>
-  <w:abstractNum w:abstractNumId="89">
+  <w:abstractNum w:abstractNumId="85">
     <w:nsid w:val="743D4446"/>
     <w:multiLevelType w:val="singleLevel"/>
     <w:tmpl w:val="743D4446"/>
@@ -15831,7 +16157,7 @@
       <w:lvlJc w:val="left"/>
     </w:lvl>
   </w:abstractNum>
-  <w:abstractNum w:abstractNumId="90">
+  <w:abstractNum w:abstractNumId="86">
     <w:nsid w:val="78DA9A54"/>
     <w:multiLevelType w:val="singleLevel"/>
     <w:tmpl w:val="78DA9A54"/>
@@ -15843,7 +16169,7 @@
       <w:lvlJc w:val="left"/>
     </w:lvl>
   </w:abstractNum>
-  <w:abstractNum w:abstractNumId="91">
+  <w:abstractNum w:abstractNumId="87">
     <w:nsid w:val="7CFEE648"/>
     <w:multiLevelType w:val="singleLevel"/>
     <w:tmpl w:val="7CFEE648"/>
@@ -15855,7 +16181,7 @@
       <w:lvlJc w:val="left"/>
     </w:lvl>
   </w:abstractNum>
-  <w:abstractNum w:abstractNumId="92">
+  <w:abstractNum w:abstractNumId="88">
     <w:nsid w:val="7EE9AE89"/>
     <w:multiLevelType w:val="singleLevel"/>
     <w:tmpl w:val="7EE9AE89"/>
@@ -15867,7 +16193,7 @@
       <w:lvlJc w:val="left"/>
     </w:lvl>
   </w:abstractNum>
-  <w:abstractNum w:abstractNumId="93">
+  <w:abstractNum w:abstractNumId="89">
     <w:nsid w:val="7FEFEBD9"/>
     <w:multiLevelType w:val="singleLevel"/>
     <w:tmpl w:val="7FEFEBD9"/>
@@ -15880,286 +16206,274 @@
     </w:lvl>
   </w:abstractNum>
   <w:num w:numId="1">
-    <w:abstractNumId w:val="15"/>
+    <w:abstractNumId w:val="14"/>
   </w:num>
   <w:num w:numId="2">
-    <w:abstractNumId w:val="18"/>
+    <w:abstractNumId w:val="17"/>
   </w:num>
   <w:num w:numId="3">
-    <w:abstractNumId w:val="23"/>
+    <w:abstractNumId w:val="22"/>
   </w:num>
   <w:num w:numId="4">
-    <w:abstractNumId w:val="38"/>
+    <w:abstractNumId w:val="37"/>
   </w:num>
   <w:num w:numId="5">
-    <w:abstractNumId w:val="73"/>
+    <w:abstractNumId w:val="69"/>
   </w:num>
   <w:num w:numId="6">
-    <w:abstractNumId w:val="69"/>
+    <w:abstractNumId w:val="65"/>
   </w:num>
   <w:num w:numId="7">
-    <w:abstractNumId w:val="9"/>
+    <w:abstractNumId w:val="41"/>
   </w:num>
   <w:num w:numId="8">
-    <w:abstractNumId w:val="42"/>
+    <w:abstractNumId w:val="20"/>
   </w:num>
   <w:num w:numId="9">
     <w:abstractNumId w:val="21"/>
   </w:num>
   <w:num w:numId="10">
-    <w:abstractNumId w:val="22"/>
+    <w:abstractNumId w:val="15"/>
   </w:num>
   <w:num w:numId="11">
-    <w:abstractNumId w:val="16"/>
+    <w:abstractNumId w:val="54"/>
   </w:num>
   <w:num w:numId="12">
-    <w:abstractNumId w:val="58"/>
+    <w:abstractNumId w:val="77"/>
   </w:num>
   <w:num w:numId="13">
-    <w:abstractNumId w:val="81"/>
+    <w:abstractNumId w:val="42"/>
   </w:num>
   <w:num w:numId="14">
-    <w:abstractNumId w:val="43"/>
+    <w:abstractNumId w:val="0"/>
   </w:num>
   <w:num w:numId="15">
-    <w:abstractNumId w:val="53"/>
+    <w:abstractNumId w:val="76"/>
   </w:num>
   <w:num w:numId="16">
-    <w:abstractNumId w:val="0"/>
+    <w:abstractNumId w:val="19"/>
   </w:num>
   <w:num w:numId="17">
-    <w:abstractNumId w:val="80"/>
+    <w:abstractNumId w:val="78"/>
   </w:num>
   <w:num w:numId="18">
-    <w:abstractNumId w:val="20"/>
+    <w:abstractNumId w:val="61"/>
   </w:num>
   <w:num w:numId="19">
-    <w:abstractNumId w:val="82"/>
+    <w:abstractNumId w:val="50"/>
   </w:num>
   <w:num w:numId="20">
-    <w:abstractNumId w:val="65"/>
+    <w:abstractNumId w:val="34"/>
   </w:num>
   <w:num w:numId="21">
-    <w:abstractNumId w:val="52"/>
+    <w:abstractNumId w:val="36"/>
   </w:num>
   <w:num w:numId="22">
     <w:abstractNumId w:val="35"/>
   </w:num>
   <w:num w:numId="23">
-    <w:abstractNumId w:val="37"/>
+    <w:abstractNumId w:val="83"/>
   </w:num>
   <w:num w:numId="24">
-    <w:abstractNumId w:val="36"/>
+    <w:abstractNumId w:val="52"/>
   </w:num>
   <w:num w:numId="25">
+    <w:abstractNumId w:val="31"/>
+  </w:num>
+  <w:num w:numId="26">
+    <w:abstractNumId w:val="88"/>
+  </w:num>
+  <w:num w:numId="27">
     <w:abstractNumId w:val="87"/>
   </w:num>
-  <w:num w:numId="26">
-    <w:abstractNumId w:val="55"/>
-  </w:num>
-  <w:num w:numId="27">
-    <w:abstractNumId w:val="32"/>
-  </w:num>
   <w:num w:numId="28">
-    <w:abstractNumId w:val="92"/>
+    <w:abstractNumId w:val="73"/>
   </w:num>
   <w:num w:numId="29">
-    <w:abstractNumId w:val="91"/>
+    <w:abstractNumId w:val="56"/>
   </w:num>
   <w:num w:numId="30">
-    <w:abstractNumId w:val="77"/>
+    <w:abstractNumId w:val="9"/>
   </w:num>
   <w:num w:numId="31">
+    <w:abstractNumId w:val="43"/>
+  </w:num>
+  <w:num w:numId="32">
+    <w:abstractNumId w:val="40"/>
+  </w:num>
+  <w:num w:numId="33">
+    <w:abstractNumId w:val="79"/>
+  </w:num>
+  <w:num w:numId="34">
     <w:abstractNumId w:val="60"/>
   </w:num>
-  <w:num w:numId="32">
-    <w:abstractNumId w:val="10"/>
-  </w:num>
-  <w:num w:numId="33">
-    <w:abstractNumId w:val="44"/>
-  </w:num>
-  <w:num w:numId="34">
-    <w:abstractNumId w:val="41"/>
-  </w:num>
   <w:num w:numId="35">
-    <w:abstractNumId w:val="46"/>
+    <w:abstractNumId w:val="23"/>
   </w:num>
   <w:num w:numId="36">
-    <w:abstractNumId w:val="83"/>
+    <w:abstractNumId w:val="12"/>
   </w:num>
   <w:num w:numId="37">
+    <w:abstractNumId w:val="13"/>
+  </w:num>
+  <w:num w:numId="38">
+    <w:abstractNumId w:val="66"/>
+  </w:num>
+  <w:num w:numId="39">
+    <w:abstractNumId w:val="57"/>
+  </w:num>
+  <w:num w:numId="40">
+    <w:abstractNumId w:val="1"/>
+  </w:num>
+  <w:num w:numId="41">
+    <w:abstractNumId w:val="38"/>
+  </w:num>
+  <w:num w:numId="42">
+    <w:abstractNumId w:val="33"/>
+  </w:num>
+  <w:num w:numId="43">
+    <w:abstractNumId w:val="47"/>
+  </w:num>
+  <w:num w:numId="44">
+    <w:abstractNumId w:val="4"/>
+  </w:num>
+  <w:num w:numId="45">
     <w:abstractNumId w:val="64"/>
   </w:num>
-  <w:num w:numId="38">
-    <w:abstractNumId w:val="56"/>
-  </w:num>
-  <w:num w:numId="39">
-    <w:abstractNumId w:val="24"/>
-  </w:num>
-  <w:num w:numId="40">
-    <w:abstractNumId w:val="13"/>
-  </w:num>
-  <w:num w:numId="41">
-    <w:abstractNumId w:val="14"/>
-  </w:num>
-  <w:num w:numId="42">
-    <w:abstractNumId w:val="70"/>
-  </w:num>
-  <w:num w:numId="43">
-    <w:abstractNumId w:val="61"/>
-  </w:num>
-  <w:num w:numId="44">
-    <w:abstractNumId w:val="1"/>
-  </w:num>
-  <w:num w:numId="45">
+  <w:num w:numId="46">
     <w:abstractNumId w:val="39"/>
   </w:num>
-  <w:num w:numId="46">
-    <w:abstractNumId w:val="34"/>
-  </w:num>
   <w:num w:numId="47">
-    <w:abstractNumId w:val="49"/>
+    <w:abstractNumId w:val="89"/>
   </w:num>
   <w:num w:numId="48">
-    <w:abstractNumId w:val="4"/>
+    <w:abstractNumId w:val="75"/>
   </w:num>
   <w:num w:numId="49">
     <w:abstractNumId w:val="68"/>
   </w:num>
   <w:num w:numId="50">
-    <w:abstractNumId w:val="40"/>
+    <w:abstractNumId w:val="30"/>
   </w:num>
   <w:num w:numId="51">
-    <w:abstractNumId w:val="93"/>
+    <w:abstractNumId w:val="70"/>
   </w:num>
   <w:num w:numId="52">
-    <w:abstractNumId w:val="79"/>
+    <w:abstractNumId w:val="7"/>
   </w:num>
   <w:num w:numId="53">
+    <w:abstractNumId w:val="85"/>
+  </w:num>
+  <w:num w:numId="54">
+    <w:abstractNumId w:val="18"/>
+  </w:num>
+  <w:num w:numId="55">
+    <w:abstractNumId w:val="27"/>
+  </w:num>
+  <w:num w:numId="56">
+    <w:abstractNumId w:val="11"/>
+  </w:num>
+  <w:num w:numId="57">
+    <w:abstractNumId w:val="26"/>
+  </w:num>
+  <w:num w:numId="58">
+    <w:abstractNumId w:val="3"/>
+  </w:num>
+  <w:num w:numId="59">
+    <w:abstractNumId w:val="58"/>
+  </w:num>
+  <w:num w:numId="60">
+    <w:abstractNumId w:val="6"/>
+  </w:num>
+  <w:num w:numId="61">
+    <w:abstractNumId w:val="84"/>
+  </w:num>
+  <w:num w:numId="62">
+    <w:abstractNumId w:val="82"/>
+  </w:num>
+  <w:num w:numId="63">
+    <w:abstractNumId w:val="59"/>
+  </w:num>
+  <w:num w:numId="64">
+    <w:abstractNumId w:val="5"/>
+  </w:num>
+  <w:num w:numId="65">
+    <w:abstractNumId w:val="63"/>
+  </w:num>
+  <w:num w:numId="66">
     <w:abstractNumId w:val="72"/>
   </w:num>
-  <w:num w:numId="54">
-    <w:abstractNumId w:val="31"/>
+  <w:num w:numId="67">
+    <w:abstractNumId w:val="48"/>
   </w:num>
-  <w:num w:numId="55">
+  <w:num w:numId="68">
+    <w:abstractNumId w:val="32"/>
+  </w:num>
+  <w:num w:numId="69">
+    <w:abstractNumId w:val="44"/>
+  </w:num>
+  <w:num w:numId="70">
+    <w:abstractNumId w:val="29"/>
+  </w:num>
+  <w:num w:numId="71">
+    <w:abstractNumId w:val="2"/>
+  </w:num>
+  <w:num w:numId="72">
+    <w:abstractNumId w:val="55"/>
+  </w:num>
+  <w:num w:numId="73">
+    <w:abstractNumId w:val="49"/>
+  </w:num>
+  <w:num w:numId="74">
+    <w:abstractNumId w:val="53"/>
+  </w:num>
+  <w:num w:numId="75">
+    <w:abstractNumId w:val="28"/>
+  </w:num>
+  <w:num w:numId="76">
+    <w:abstractNumId w:val="24"/>
+  </w:num>
+  <w:num w:numId="77">
+    <w:abstractNumId w:val="81"/>
+  </w:num>
+  <w:num w:numId="78">
+    <w:abstractNumId w:val="62"/>
+  </w:num>
+  <w:num w:numId="79">
+    <w:abstractNumId w:val="8"/>
+  </w:num>
+  <w:num w:numId="80">
+    <w:abstractNumId w:val="71"/>
+  </w:num>
+  <w:num w:numId="81">
+    <w:abstractNumId w:val="45"/>
+  </w:num>
+  <w:num w:numId="82">
+    <w:abstractNumId w:val="86"/>
+  </w:num>
+  <w:num w:numId="83">
+    <w:abstractNumId w:val="10"/>
+  </w:num>
+  <w:num w:numId="84">
+    <w:abstractNumId w:val="80"/>
+  </w:num>
+  <w:num w:numId="85">
+    <w:abstractNumId w:val="51"/>
+  </w:num>
+  <w:num w:numId="86">
     <w:abstractNumId w:val="74"/>
   </w:num>
-  <w:num w:numId="56">
-    <w:abstractNumId w:val="7"/>
-  </w:num>
-  <w:num w:numId="57">
-    <w:abstractNumId w:val="89"/>
-  </w:num>
-  <w:num w:numId="58">
-    <w:abstractNumId w:val="19"/>
-  </w:num>
-  <w:num w:numId="59">
-    <w:abstractNumId w:val="28"/>
-  </w:num>
-  <w:num w:numId="60">
-    <w:abstractNumId w:val="12"/>
-  </w:num>
-  <w:num w:numId="61">
-    <w:abstractNumId w:val="27"/>
-  </w:num>
-  <w:num w:numId="62">
-    <w:abstractNumId w:val="3"/>
-  </w:num>
-  <w:num w:numId="63">
-    <w:abstractNumId w:val="62"/>
-  </w:num>
-  <w:num w:numId="64">
-    <w:abstractNumId w:val="6"/>
-  </w:num>
-  <w:num w:numId="65">
-    <w:abstractNumId w:val="88"/>
-  </w:num>
-  <w:num w:numId="66">
-    <w:abstractNumId w:val="86"/>
-  </w:num>
-  <w:num w:numId="67">
-    <w:abstractNumId w:val="63"/>
-  </w:num>
-  <w:num w:numId="68">
-    <w:abstractNumId w:val="5"/>
-  </w:num>
-  <w:num w:numId="69">
-    <w:abstractNumId w:val="67"/>
-  </w:num>
-  <w:num w:numId="70">
-    <w:abstractNumId w:val="76"/>
-  </w:num>
-  <w:num w:numId="71">
-    <w:abstractNumId w:val="50"/>
-  </w:num>
-  <w:num w:numId="72">
-    <w:abstractNumId w:val="33"/>
-  </w:num>
-  <w:num w:numId="73">
-    <w:abstractNumId w:val="45"/>
-  </w:num>
-  <w:num w:numId="74">
-    <w:abstractNumId w:val="30"/>
-  </w:num>
-  <w:num w:numId="75">
-    <w:abstractNumId w:val="2"/>
-  </w:num>
-  <w:num w:numId="76">
-    <w:abstractNumId w:val="59"/>
-  </w:num>
-  <w:num w:numId="77">
-    <w:abstractNumId w:val="51"/>
-  </w:num>
-  <w:num w:numId="78">
-    <w:abstractNumId w:val="57"/>
-  </w:num>
-  <w:num w:numId="79">
-    <w:abstractNumId w:val="29"/>
-  </w:num>
-  <w:num w:numId="80">
+  <w:num w:numId="87">
     <w:abstractNumId w:val="25"/>
   </w:num>
-  <w:num w:numId="81">
-    <w:abstractNumId w:val="85"/>
-  </w:num>
-  <w:num w:numId="82">
-    <w:abstractNumId w:val="66"/>
-  </w:num>
-  <w:num w:numId="83">
-    <w:abstractNumId w:val="8"/>
-  </w:num>
-  <w:num w:numId="84">
-    <w:abstractNumId w:val="75"/>
-  </w:num>
-  <w:num w:numId="85">
-    <w:abstractNumId w:val="47"/>
-  </w:num>
-  <w:num w:numId="86">
-    <w:abstractNumId w:val="90"/>
-  </w:num>
-  <w:num w:numId="87">
-    <w:abstractNumId w:val="11"/>
-  </w:num>
   <w:num w:numId="88">
-    <w:abstractNumId w:val="84"/>
+    <w:abstractNumId w:val="46"/>
   </w:num>
   <w:num w:numId="89">
-    <w:abstractNumId w:val="54"/>
+    <w:abstractNumId w:val="16"/>
   </w:num>
   <w:num w:numId="90">
-    <w:abstractNumId w:val="78"/>
-  </w:num>
-  <w:num w:numId="91">
-    <w:abstractNumId w:val="26"/>
-  </w:num>
-  <w:num w:numId="92">
-    <w:abstractNumId w:val="48"/>
-  </w:num>
-  <w:num w:numId="93">
-    <w:abstractNumId w:val="17"/>
-  </w:num>
-  <w:num w:numId="94">
-    <w:abstractNumId w:val="71"/>
+    <w:abstractNumId w:val="67"/>
   </w:num>
 </w:numbering>
 </file>

</xml_diff>

<commit_message>
Update: Add Link Planning Board (Excel)
</commit_message>
<xml_diff>
--- a/Diagrams/UsecaseDiagram/DacTa/DacTaUsecase.docx
+++ b/Diagrams/UsecaseDiagram/DacTa/DacTaUsecase.docx
@@ -162,19 +162,7 @@
           <w:vertAlign w:val="baseline"/>
           <w:lang w:val="en-US"/>
         </w:rPr>
-        <w:t>Đây là các chức năng cơ bản cho phép người dùng trải n</w:t>
-      </w:r>
-      <w:bookmarkStart w:id="0" w:name="_GoBack"/>
-      <w:bookmarkEnd w:id="0"/>
-      <w:r>
-        <w:rPr>
-          <w:rFonts w:hint="default"/>
-          <w:sz w:val="32"/>
-          <w:szCs w:val="32"/>
-          <w:vertAlign w:val="baseline"/>
-          <w:lang w:val="en-US"/>
-        </w:rPr>
-        <w:t>ghiệm dịch vụ mà không cần tài khoản:</w:t>
+        <w:t>Đây là các chức năng cơ bản cho phép người dùng trải nghiệm dịch vụ mà không cần tài khoản:</w:t>
       </w:r>
     </w:p>
     <w:p>
@@ -1232,6 +1220,60 @@
         </w:rPr>
         <w:t>Database: MySQL</w:t>
       </w:r>
+    </w:p>
+    <w:p>
+      <w:pPr>
+        <w:rPr>
+          <w:rFonts w:hint="default"/>
+          <w:sz w:val="32"/>
+          <w:szCs w:val="32"/>
+          <w:vertAlign w:val="baseline"/>
+          <w:lang w:val="en-US"/>
+        </w:rPr>
+      </w:pPr>
+    </w:p>
+    <w:p>
+      <w:pPr>
+        <w:rPr>
+          <w:rFonts w:hint="default"/>
+          <w:sz w:val="32"/>
+          <w:szCs w:val="32"/>
+          <w:vertAlign w:val="baseline"/>
+          <w:lang w:val="en-US"/>
+        </w:rPr>
+      </w:pPr>
+      <w:r>
+        <w:rPr>
+          <w:rFonts w:hint="default"/>
+          <w:sz w:val="32"/>
+          <w:szCs w:val="32"/>
+          <w:vertAlign w:val="baseline"/>
+          <w:lang w:val="en-US"/>
+        </w:rPr>
+        <w:t>Link bảng kế hoạch hàng tuần (Gemini 2.5 Pro làm):</w:t>
+      </w:r>
+      <w:r>
+        <w:rPr>
+          <w:rFonts w:hint="default"/>
+          <w:sz w:val="32"/>
+          <w:szCs w:val="32"/>
+          <w:vertAlign w:val="baseline"/>
+          <w:lang w:val="en-US"/>
+        </w:rPr>
+        <w:br w:type="textWrapping"/>
+      </w:r>
+      <w:r>
+        <w:rPr>
+          <w:rFonts w:hint="default"/>
+          <w:sz w:val="32"/>
+          <w:szCs w:val="32"/>
+          <w:vertAlign w:val="baseline"/>
+          <w:lang w:val="en-US"/>
+        </w:rPr>
+        <w:t>https://docs.google.com/spreadsheets/d/10sSd3CDgrxZJk-w9yGGz3Zb-RII0w4V9W9P_uBepvVM/edit?gid=0#gid=0</w:t>
+      </w:r>
+      <w:bookmarkStart w:id="0" w:name="_GoBack"/>
+      <w:bookmarkEnd w:id="0"/>
     </w:p>
     <w:p>
       <w:pPr>
@@ -2110,12 +2152,6 @@
             <w:insideH w:val="single" w:color="auto" w:sz="4" w:space="0"/>
             <w:insideV w:val="single" w:color="auto" w:sz="4" w:space="0"/>
           </w:tblBorders>
-          <w:tblCellMar>
-            <w:top w:w="0" w:type="dxa"/>
-            <w:left w:w="108" w:type="dxa"/>
-            <w:bottom w:w="0" w:type="dxa"/>
-            <w:right w:w="108" w:type="dxa"/>
-          </w:tblCellMar>
         </w:tblPrEx>
         <w:tc>
           <w:tcPr>
@@ -2995,6 +3031,7 @@
             <w:pPr>
               <w:widowControl w:val="0"/>
               <w:numPr>
+                <w:ilvl w:val="0"/>
                 <w:numId w:val="0"/>
               </w:numPr>
               <w:jc w:val="both"/>
@@ -4086,6 +4123,7 @@
             <w:pPr>
               <w:widowControl w:val="0"/>
               <w:numPr>
+                <w:ilvl w:val="0"/>
                 <w:numId w:val="0"/>
               </w:numPr>
               <w:jc w:val="both"/>
@@ -4590,6 +4628,7 @@
             <w:pPr>
               <w:widowControl w:val="0"/>
               <w:numPr>
+                <w:ilvl w:val="0"/>
                 <w:numId w:val="0"/>
               </w:numPr>
               <w:jc w:val="both"/>
@@ -5149,6 +5188,7 @@
             <w:pPr>
               <w:widowControl w:val="0"/>
               <w:numPr>
+                <w:ilvl w:val="0"/>
                 <w:numId w:val="0"/>
               </w:numPr>
               <w:jc w:val="both"/>
@@ -5703,6 +5743,7 @@
             <w:pPr>
               <w:widowControl w:val="0"/>
               <w:numPr>
+                <w:ilvl w:val="0"/>
                 <w:numId w:val="0"/>
               </w:numPr>
               <w:jc w:val="both"/>
@@ -5938,12 +5979,6 @@
             <w:insideH w:val="single" w:color="auto" w:sz="4" w:space="0"/>
             <w:insideV w:val="single" w:color="auto" w:sz="4" w:space="0"/>
           </w:tblBorders>
-          <w:tblCellMar>
-            <w:top w:w="0" w:type="dxa"/>
-            <w:left w:w="108" w:type="dxa"/>
-            <w:bottom w:w="0" w:type="dxa"/>
-            <w:right w:w="108" w:type="dxa"/>
-          </w:tblCellMar>
         </w:tblPrEx>
         <w:tc>
           <w:tcPr>
@@ -7229,6 +7264,7 @@
             <w:pPr>
               <w:widowControl w:val="0"/>
               <w:numPr>
+                <w:ilvl w:val="0"/>
                 <w:numId w:val="0"/>
               </w:numPr>
               <w:jc w:val="both"/>
@@ -8847,6 +8883,7 @@
             <w:pPr>
               <w:widowControl w:val="0"/>
               <w:numPr>
+                <w:ilvl w:val="0"/>
                 <w:numId w:val="0"/>
               </w:numPr>
               <w:jc w:val="both"/>
@@ -9294,6 +9331,7 @@
             <w:pPr>
               <w:widowControl w:val="0"/>
               <w:numPr>
+                <w:ilvl w:val="0"/>
                 <w:numId w:val="0"/>
               </w:numPr>
               <w:jc w:val="both"/>
@@ -11032,6 +11070,7 @@
             <w:pPr>
               <w:widowControl w:val="0"/>
               <w:numPr>
+                <w:ilvl w:val="0"/>
                 <w:numId w:val="0"/>
               </w:numPr>
               <w:jc w:val="both"/>
@@ -11539,6 +11578,7 @@
             <w:pPr>
               <w:widowControl w:val="0"/>
               <w:numPr>
+                <w:ilvl w:val="0"/>
                 <w:numId w:val="0"/>
               </w:numPr>
               <w:jc w:val="both"/>
@@ -12014,6 +12054,7 @@
             <w:pPr>
               <w:widowControl w:val="0"/>
               <w:numPr>
+                <w:ilvl w:val="0"/>
                 <w:numId w:val="0"/>
               </w:numPr>
               <w:jc w:val="both"/>
@@ -12113,6 +12154,14 @@
       </w:tr>
       <w:tr>
         <w:tblPrEx>
+          <w:tblBorders>
+            <w:top w:val="single" w:color="auto" w:sz="4" w:space="0"/>
+            <w:left w:val="single" w:color="auto" w:sz="4" w:space="0"/>
+            <w:bottom w:val="single" w:color="auto" w:sz="4" w:space="0"/>
+            <w:right w:val="single" w:color="auto" w:sz="4" w:space="0"/>
+            <w:insideH w:val="single" w:color="auto" w:sz="4" w:space="0"/>
+            <w:insideV w:val="single" w:color="auto" w:sz="4" w:space="0"/>
+          </w:tblBorders>
           <w:tblCellMar>
             <w:top w:w="0" w:type="dxa"/>
             <w:left w:w="108" w:type="dxa"/>
@@ -13069,6 +13118,7 @@
             <w:pPr>
               <w:widowControl w:val="0"/>
               <w:numPr>
+                <w:ilvl w:val="0"/>
                 <w:numId w:val="0"/>
               </w:numPr>
               <w:jc w:val="both"/>
@@ -13601,6 +13651,7 @@
             <w:pPr>
               <w:widowControl w:val="0"/>
               <w:numPr>
+                <w:ilvl w:val="0"/>
                 <w:numId w:val="0"/>
               </w:numPr>
               <w:jc w:val="both"/>

</xml_diff>

<commit_message>
Update: Add Sequence Diagrams and Class Diagram(Empty)
</commit_message>
<xml_diff>
--- a/Diagrams/UsecaseDiagram/DacTa/DacTaUsecase.docx
+++ b/Diagrams/UsecaseDiagram/DacTa/DacTaUsecase.docx
@@ -1272,8 +1272,6 @@
         </w:rPr>
         <w:t>https://docs.google.com/spreadsheets/d/10sSd3CDgrxZJk-w9yGGz3Zb-RII0w4V9W9P_uBepvVM/edit?gid=0#gid=0</w:t>
       </w:r>
-      <w:bookmarkStart w:id="0" w:name="_GoBack"/>
-      <w:bookmarkEnd w:id="0"/>
     </w:p>
     <w:p>
       <w:pPr>
@@ -2152,6 +2150,12 @@
             <w:insideH w:val="single" w:color="auto" w:sz="4" w:space="0"/>
             <w:insideV w:val="single" w:color="auto" w:sz="4" w:space="0"/>
           </w:tblBorders>
+          <w:tblCellMar>
+            <w:top w:w="0" w:type="dxa"/>
+            <w:left w:w="108" w:type="dxa"/>
+            <w:bottom w:w="0" w:type="dxa"/>
+            <w:right w:w="108" w:type="dxa"/>
+          </w:tblCellMar>
         </w:tblPrEx>
         <w:tc>
           <w:tcPr>
@@ -5979,6 +5983,12 @@
             <w:insideH w:val="single" w:color="auto" w:sz="4" w:space="0"/>
             <w:insideV w:val="single" w:color="auto" w:sz="4" w:space="0"/>
           </w:tblBorders>
+          <w:tblCellMar>
+            <w:top w:w="0" w:type="dxa"/>
+            <w:left w:w="108" w:type="dxa"/>
+            <w:bottom w:w="0" w:type="dxa"/>
+            <w:right w:w="108" w:type="dxa"/>
+          </w:tblCellMar>
         </w:tblPrEx>
         <w:tc>
           <w:tcPr>
@@ -13878,8 +13888,10 @@
           <w:vertAlign w:val="baseline"/>
           <w:lang w:val="en-US"/>
         </w:rPr>
-        <w:t>Đặc tả Usecase Thêm bài hát</w:t>
+        <w:t>Đặc tả Usecase Thêm bài hát vào Playlist</w:t>
       </w:r>
+      <w:bookmarkStart w:id="0" w:name="_GoBack"/>
+      <w:bookmarkEnd w:id="0"/>
     </w:p>
     <w:tbl>
       <w:tblPr>

</xml_diff>

<commit_message>
Sửa lỗi chính tả trong đặc tả, sửa SD 4 cái tiếp theo, cập nhật CD theo SD
</commit_message>
<xml_diff>
--- a/Diagrams/UsecaseDiagram/DacTa/DacTaUsecase.docx
+++ b/Diagrams/UsecaseDiagram/DacTa/DacTaUsecase.docx
@@ -7899,6 +7899,29 @@
             </w:pPr>
             <w:r>
               <w:rPr>
+                <w:rFonts w:hint="default" w:eastAsia="SimSun" w:cs="SimSun" w:asciiTheme="minorAscii" w:hAnsiTheme="minorAscii"/>
+                <w:sz w:val="32"/>
+                <w:szCs w:val="32"/>
+              </w:rPr>
+              <w:t>2.1 Nếu hệ thống kiểm tra email không tồn tại trong cơ sở dữ liệu thì thông báo “Email không tồn tại, vui lòng kiểm tra lại” đến người dùng.</w:t>
+            </w:r>
+            <w:bookmarkStart w:id="0" w:name="_GoBack"/>
+            <w:bookmarkEnd w:id="0"/>
+          </w:p>
+          <w:p>
+            <w:pPr>
+              <w:widowControl w:val="0"/>
+              <w:jc w:val="both"/>
+              <w:rPr>
+                <w:rFonts w:hint="default"/>
+                <w:sz w:val="32"/>
+                <w:szCs w:val="32"/>
+                <w:vertAlign w:val="baseline"/>
+                <w:lang w:val="en-US"/>
+              </w:rPr>
+            </w:pPr>
+            <w:r>
+              <w:rPr>
                 <w:rFonts w:hint="default"/>
                 <w:sz w:val="32"/>
                 <w:szCs w:val="32"/>
@@ -8725,12 +8748,6 @@
             <w:insideH w:val="single" w:color="auto" w:sz="4" w:space="0"/>
             <w:insideV w:val="single" w:color="auto" w:sz="4" w:space="0"/>
           </w:tblBorders>
-          <w:tblCellMar>
-            <w:top w:w="0" w:type="dxa"/>
-            <w:left w:w="108" w:type="dxa"/>
-            <w:bottom w:w="0" w:type="dxa"/>
-            <w:right w:w="108" w:type="dxa"/>
-          </w:tblCellMar>
         </w:tblPrEx>
         <w:tc>
           <w:tcPr>
@@ -10803,12 +10820,6 @@
             <w:insideH w:val="single" w:color="auto" w:sz="4" w:space="0"/>
             <w:insideV w:val="single" w:color="auto" w:sz="4" w:space="0"/>
           </w:tblBorders>
-          <w:tblCellMar>
-            <w:top w:w="0" w:type="dxa"/>
-            <w:left w:w="108" w:type="dxa"/>
-            <w:bottom w:w="0" w:type="dxa"/>
-            <w:right w:w="108" w:type="dxa"/>
-          </w:tblCellMar>
         </w:tblPrEx>
         <w:tc>
           <w:tcPr>
@@ -13890,8 +13901,6 @@
         </w:rPr>
         <w:t>Đặc tả Usecase Thêm bài hát vào Playlist</w:t>
       </w:r>
-      <w:bookmarkStart w:id="0" w:name="_GoBack"/>
-      <w:bookmarkEnd w:id="0"/>
     </w:p>
     <w:tbl>
       <w:tblPr>
@@ -14434,7 +14443,7 @@
                 <w:vertAlign w:val="baseline"/>
                 <w:lang w:val="en-US"/>
               </w:rPr>
-              <w:t>Tóm tắt: Usecase bắt đầu khi người dùng chọn chức năng Sửa thông tin Playlist trong Sửa Playlist cá nhân. Hệ thống thực hiện chức năng Sửa thông tin bài hát của bài hát mà nghệ sĩ yêu cầu.</w:t>
+              <w:t>Tóm tắt: Usecase bắt đầu khi người dùng chọn chức năng Sửa thông tin Playlist trong Sửa Playlist cá nhân. Hệ thống thực hiện chức năng Sửa thông tin Playlist của Playlist mà nghệ sĩ yêu cầu.</w:t>
             </w:r>
           </w:p>
         </w:tc>

</xml_diff>

<commit_message>
Thêm phần toggle theo dõi vào đặc tả, sửa sequence, sửa class đồng bộ với sequence
</commit_message>
<xml_diff>
--- a/Diagrams/UsecaseDiagram/DacTa/DacTaUsecase.docx
+++ b/Diagrams/UsecaseDiagram/DacTa/DacTaUsecase.docx
@@ -1118,7 +1118,19 @@
           <w:vertAlign w:val="baseline"/>
           <w:lang w:val="en-US"/>
         </w:rPr>
-        <w:t>Dựa trên nội dung báo cáo, quản trị viên có thể đưa ra các quyết định: ẩn nội dung vi phạm, gửi cảnh cáo đến người dùng vi phạm, hoặc bỏ qua nếu báo cáo không hợp lệ.</w:t>
+        <w:t xml:space="preserve">Dựa trên nội dung báo cáo, quản trị viên có thể đưa ra các quyết định: ẩn nội dung vi phạm, gửi cảnh cáo đến người dùng vi phạm, hoặc bỏ qua nếu báo cáo không </w:t>
+      </w:r>
+      <w:bookmarkStart w:id="0" w:name="_GoBack"/>
+      <w:bookmarkEnd w:id="0"/>
+      <w:r>
+        <w:rPr>
+          <w:rFonts w:hint="default"/>
+          <w:sz w:val="32"/>
+          <w:szCs w:val="32"/>
+          <w:vertAlign w:val="baseline"/>
+          <w:lang w:val="en-US"/>
+        </w:rPr>
+        <w:t>hợp lệ.</w:t>
       </w:r>
     </w:p>
     <w:p>
@@ -3271,12 +3283,6 @@
             <w:insideH w:val="single" w:color="auto" w:sz="4" w:space="0"/>
             <w:insideV w:val="single" w:color="auto" w:sz="4" w:space="0"/>
           </w:tblBorders>
-          <w:tblCellMar>
-            <w:top w:w="0" w:type="dxa"/>
-            <w:left w:w="108" w:type="dxa"/>
-            <w:bottom w:w="0" w:type="dxa"/>
-            <w:right w:w="108" w:type="dxa"/>
-          </w:tblCellMar>
         </w:tblPrEx>
         <w:tc>
           <w:tcPr>
@@ -5613,7 +5619,7 @@
                 <w:vertAlign w:val="baseline"/>
                 <w:lang w:val="en-US"/>
               </w:rPr>
-              <w:t>Người dùng chọn 1 nghệ sĩ và nhấn Theo dõi.</w:t>
+              <w:t>Người dùng chọn 1 nghệ sĩ và nhấn Theo dõi hoặc nếu đã theo dõi thì nút sẽ hiển thị “Bỏ theo dõi”.</w:t>
             </w:r>
           </w:p>
           <w:p>
@@ -5640,7 +5646,7 @@
                 <w:vertAlign w:val="baseline"/>
                 <w:lang w:val="en-US"/>
               </w:rPr>
-              <w:t>Hệ thống sẽ cập nhật trạng thái của nghệ sĩ đó đối với người dùng thành “Đang theo dõi” trong cơ sở dữ liệu thành công.</w:t>
+              <w:t>Hệ thống sẽ cập nhật trạng thái của nghệ sĩ đó đối với người dùng thành “Đang theo dõi”/”Không theo dõi” trong cơ sở dữ liệu thành công.</w:t>
             </w:r>
           </w:p>
           <w:p>
@@ -5667,7 +5673,7 @@
                 <w:vertAlign w:val="baseline"/>
                 <w:lang w:val="en-US"/>
               </w:rPr>
-              <w:t>Hệ thống sẽ ghi nhận vào cơ sở dữ liệu và đưa nghệ sĩ đó vào danh sách nghệ sĩ đã theo dõi của người dùng thành công.</w:t>
+              <w:t>Hệ thống sẽ ghi nhận vào cơ sở dữ liệu và đưa/bỏ nghệ sĩ đó vào/ra danh sách nghệ sĩ đã theo dõi của người dùng thành công.</w:t>
             </w:r>
           </w:p>
           <w:p>
@@ -5747,27 +5753,54 @@
             <w:pPr>
               <w:widowControl w:val="0"/>
               <w:numPr>
-                <w:ilvl w:val="0"/>
-                <w:numId w:val="0"/>
-              </w:numPr>
-              <w:jc w:val="both"/>
-              <w:rPr>
-                <w:rFonts w:hint="default"/>
-                <w:sz w:val="32"/>
-                <w:szCs w:val="32"/>
-                <w:vertAlign w:val="baseline"/>
-                <w:lang w:val="en-US"/>
-              </w:rPr>
-            </w:pPr>
-            <w:r>
-              <w:rPr>
-                <w:rFonts w:hint="default"/>
-                <w:sz w:val="32"/>
-                <w:szCs w:val="32"/>
-                <w:vertAlign w:val="baseline"/>
-                <w:lang w:val="en-US"/>
-              </w:rPr>
-              <w:t>4.1 Nếu hệ thống cập nhật trạng thái của nghệ sĩ đó đối với người dùng thành “Đang theo dõi” không thành công thì  hệ thống sẽ thông báo “Theo dõi thất bại, vui lòng thử lại” đến người dùng.</w:t>
+                <w:ilvl w:val="1"/>
+                <w:numId w:val="18"/>
+              </w:numPr>
+              <w:jc w:val="both"/>
+              <w:rPr>
+                <w:rFonts w:hint="default"/>
+                <w:sz w:val="32"/>
+                <w:szCs w:val="32"/>
+                <w:vertAlign w:val="baseline"/>
+                <w:lang w:val="en-US"/>
+              </w:rPr>
+            </w:pPr>
+            <w:r>
+              <w:rPr>
+                <w:rFonts w:hint="default"/>
+                <w:sz w:val="32"/>
+                <w:szCs w:val="32"/>
+                <w:vertAlign w:val="baseline"/>
+                <w:lang w:val="en-US"/>
+              </w:rPr>
+              <w:t>Nếu hệ thống cập nhật trạng thái của nghệ sĩ đó đối với người dùng thành “Đang theo dõi” không thành công thì  hệ thống sẽ thông báo “Theo dõi thất bại, vui lòng thử lại” đến người dùng.</w:t>
+            </w:r>
+          </w:p>
+          <w:p>
+            <w:pPr>
+              <w:widowControl w:val="0"/>
+              <w:numPr>
+                <w:ilvl w:val="1"/>
+                <w:numId w:val="18"/>
+              </w:numPr>
+              <w:jc w:val="both"/>
+              <w:rPr>
+                <w:rFonts w:hint="default"/>
+                <w:sz w:val="32"/>
+                <w:szCs w:val="32"/>
+                <w:vertAlign w:val="baseline"/>
+                <w:lang w:val="en-US"/>
+              </w:rPr>
+            </w:pPr>
+            <w:r>
+              <w:rPr>
+                <w:rFonts w:hint="default"/>
+                <w:sz w:val="32"/>
+                <w:szCs w:val="32"/>
+                <w:vertAlign w:val="baseline"/>
+                <w:lang w:val="en-US"/>
+              </w:rPr>
+              <w:t xml:space="preserve"> Nếu hệ thống cập nhật trạng thái của nghệ sĩ đó đối với người dùng thành “Không theo dõi” không thành công thì  hệ thống sẽ thông báo “Bỏ theo dõi thất bại, vui lòng thử lại” đến người dùng.</w:t>
             </w:r>
           </w:p>
         </w:tc>
@@ -7905,8 +7938,6 @@
               </w:rPr>
               <w:t>2.1 Nếu hệ thống kiểm tra email không tồn tại trong cơ sở dữ liệu thì thông báo “Email không tồn tại, vui lòng kiểm tra lại” đến người dùng.</w:t>
             </w:r>
-            <w:bookmarkStart w:id="0" w:name="_GoBack"/>
-            <w:bookmarkEnd w:id="0"/>
           </w:p>
           <w:p>
             <w:pPr>
@@ -8748,6 +8779,12 @@
             <w:insideH w:val="single" w:color="auto" w:sz="4" w:space="0"/>
             <w:insideV w:val="single" w:color="auto" w:sz="4" w:space="0"/>
           </w:tblBorders>
+          <w:tblCellMar>
+            <w:top w:w="0" w:type="dxa"/>
+            <w:left w:w="108" w:type="dxa"/>
+            <w:bottom w:w="0" w:type="dxa"/>
+            <w:right w:w="108" w:type="dxa"/>
+          </w:tblCellMar>
         </w:tblPrEx>
         <w:tc>
           <w:tcPr>
@@ -10820,6 +10857,12 @@
             <w:insideH w:val="single" w:color="auto" w:sz="4" w:space="0"/>
             <w:insideV w:val="single" w:color="auto" w:sz="4" w:space="0"/>
           </w:tblBorders>
+          <w:tblCellMar>
+            <w:top w:w="0" w:type="dxa"/>
+            <w:left w:w="108" w:type="dxa"/>
+            <w:bottom w:w="0" w:type="dxa"/>
+            <w:right w:w="108" w:type="dxa"/>
+          </w:tblCellMar>
         </w:tblPrEx>
         <w:tc>
           <w:tcPr>
@@ -12310,12 +12353,6 @@
             <w:insideH w:val="single" w:color="auto" w:sz="4" w:space="0"/>
             <w:insideV w:val="single" w:color="auto" w:sz="4" w:space="0"/>
           </w:tblBorders>
-          <w:tblCellMar>
-            <w:top w:w="0" w:type="dxa"/>
-            <w:left w:w="108" w:type="dxa"/>
-            <w:bottom w:w="0" w:type="dxa"/>
-            <w:right w:w="108" w:type="dxa"/>
-          </w:tblCellMar>
         </w:tblPrEx>
         <w:tc>
           <w:tcPr>
@@ -15572,7 +15609,7 @@
   </w:abstractNum>
   <w:abstractNum w:abstractNumId="28">
     <w:nsid w:val="CE762D04"/>
-    <w:multiLevelType w:val="singleLevel"/>
+    <w:multiLevelType w:val="multilevel"/>
     <w:tmpl w:val="CE762D04"/>
     <w:lvl w:ilvl="0" w:tentative="0">
       <w:start w:val="1"/>
@@ -15580,6 +15617,110 @@
       <w:suff w:val="space"/>
       <w:lvlText w:val="%1."/>
       <w:lvlJc w:val="left"/>
+    </w:lvl>
+    <w:lvl w:ilvl="1" w:tentative="0">
+      <w:start w:val="1"/>
+      <w:numFmt w:val="decimal"/>
+      <w:suff w:val="space"/>
+      <w:lvlText w:val="%1.%2"/>
+      <w:lvlJc w:val="left"/>
+      <w:pPr>
+        <w:ind w:left="0" w:leftChars="0" w:firstLine="0" w:firstLineChars="0"/>
+      </w:pPr>
+      <w:rPr>
+        <w:rFonts w:hint="default"/>
+      </w:rPr>
+    </w:lvl>
+    <w:lvl w:ilvl="2" w:tentative="0">
+      <w:start w:val="1"/>
+      <w:numFmt w:val="decimal"/>
+      <w:suff w:val="space"/>
+      <w:lvlText w:val="%1.%2.%3"/>
+      <w:lvlJc w:val="left"/>
+      <w:pPr>
+        <w:ind w:left="0" w:leftChars="0" w:firstLine="0" w:firstLineChars="0"/>
+      </w:pPr>
+      <w:rPr>
+        <w:rFonts w:hint="default"/>
+      </w:rPr>
+    </w:lvl>
+    <w:lvl w:ilvl="3" w:tentative="0">
+      <w:start w:val="1"/>
+      <w:numFmt w:val="decimal"/>
+      <w:suff w:val="space"/>
+      <w:lvlText w:val="%1.%2.%3.%4"/>
+      <w:lvlJc w:val="left"/>
+      <w:pPr>
+        <w:ind w:left="0" w:leftChars="0" w:firstLine="0" w:firstLineChars="0"/>
+      </w:pPr>
+      <w:rPr>
+        <w:rFonts w:hint="default"/>
+      </w:rPr>
+    </w:lvl>
+    <w:lvl w:ilvl="4" w:tentative="0">
+      <w:start w:val="1"/>
+      <w:numFmt w:val="decimal"/>
+      <w:suff w:val="space"/>
+      <w:lvlText w:val="%1.%2.%3.%4.%5"/>
+      <w:lvlJc w:val="left"/>
+      <w:pPr>
+        <w:ind w:left="0" w:leftChars="0" w:firstLine="0" w:firstLineChars="0"/>
+      </w:pPr>
+      <w:rPr>
+        <w:rFonts w:hint="default"/>
+      </w:rPr>
+    </w:lvl>
+    <w:lvl w:ilvl="5" w:tentative="0">
+      <w:start w:val="1"/>
+      <w:numFmt w:val="decimal"/>
+      <w:suff w:val="space"/>
+      <w:lvlText w:val="%1.%2.%3.%4.%5.%6"/>
+      <w:lvlJc w:val="left"/>
+      <w:pPr>
+        <w:ind w:left="0" w:leftChars="0" w:firstLine="0" w:firstLineChars="0"/>
+      </w:pPr>
+      <w:rPr>
+        <w:rFonts w:hint="default"/>
+      </w:rPr>
+    </w:lvl>
+    <w:lvl w:ilvl="6" w:tentative="0">
+      <w:start w:val="1"/>
+      <w:numFmt w:val="decimal"/>
+      <w:suff w:val="space"/>
+      <w:lvlText w:val="%1.%2.%3.%4.%5.%6.%7"/>
+      <w:lvlJc w:val="left"/>
+      <w:pPr>
+        <w:ind w:left="0" w:leftChars="0" w:firstLine="0" w:firstLineChars="0"/>
+      </w:pPr>
+      <w:rPr>
+        <w:rFonts w:hint="default"/>
+      </w:rPr>
+    </w:lvl>
+    <w:lvl w:ilvl="7" w:tentative="0">
+      <w:start w:val="1"/>
+      <w:numFmt w:val="decimal"/>
+      <w:suff w:val="space"/>
+      <w:lvlText w:val="%1.%2.%3.%4.%5.%6.%7.%8"/>
+      <w:lvlJc w:val="left"/>
+      <w:pPr>
+        <w:ind w:left="0" w:leftChars="0" w:firstLine="0" w:firstLineChars="0"/>
+      </w:pPr>
+      <w:rPr>
+        <w:rFonts w:hint="default"/>
+      </w:rPr>
+    </w:lvl>
+    <w:lvl w:ilvl="8" w:tentative="0">
+      <w:start w:val="1"/>
+      <w:numFmt w:val="decimal"/>
+      <w:suff w:val="space"/>
+      <w:lvlText w:val="%1.%2.%3.%4.%5.%6.%7.%8.%9"/>
+      <w:lvlJc w:val="left"/>
+      <w:pPr>
+        <w:ind w:left="0" w:leftChars="0" w:firstLine="0" w:firstLineChars="0"/>
+      </w:pPr>
+      <w:rPr>
+        <w:rFonts w:hint="default"/>
+      </w:rPr>
     </w:lvl>
   </w:abstractNum>
   <w:abstractNum w:abstractNumId="29">

</xml_diff>

<commit_message>
Thêm chức năng cho người dùng sửa email, mật khẩu cho tài khoản
</commit_message>
<xml_diff>
--- a/Diagrams/UsecaseDiagram/DacTa/DacTaUsecase.docx
+++ b/Diagrams/UsecaseDiagram/DacTa/DacTaUsecase.docx
@@ -456,7 +456,19 @@
           <w:vertAlign w:val="baseline"/>
           <w:lang w:val="en-US"/>
         </w:rPr>
-        <w:t>Quản lý hồ sơ cá nhân: Người dùng có thể xem và chỉnh sửa các thông tin cá nhân như tên hiển thị, ảnh đại diện, và các thông tin mô tả khác.</w:t>
+        <w:t>Quản lý hồ sơ cá nhân: Người dùng có thể xem và chỉnh sửa các thông tin cá nhân như tên hiển thị, ảnh đại diện,… và các thông tin tài khoản</w:t>
+      </w:r>
+      <w:bookmarkStart w:id="0" w:name="_GoBack"/>
+      <w:bookmarkEnd w:id="0"/>
+      <w:r>
+        <w:rPr>
+          <w:rFonts w:hint="default"/>
+          <w:sz w:val="32"/>
+          <w:szCs w:val="32"/>
+          <w:vertAlign w:val="baseline"/>
+          <w:lang w:val="en-US"/>
+        </w:rPr>
+        <w:t xml:space="preserve"> khác.</w:t>
       </w:r>
     </w:p>
     <w:p>
@@ -1118,19 +1130,7 @@
           <w:vertAlign w:val="baseline"/>
           <w:lang w:val="en-US"/>
         </w:rPr>
-        <w:t xml:space="preserve">Dựa trên nội dung báo cáo, quản trị viên có thể đưa ra các quyết định: ẩn nội dung vi phạm, gửi cảnh cáo đến người dùng vi phạm, hoặc bỏ qua nếu báo cáo không </w:t>
-      </w:r>
-      <w:bookmarkStart w:id="0" w:name="_GoBack"/>
-      <w:bookmarkEnd w:id="0"/>
-      <w:r>
-        <w:rPr>
-          <w:rFonts w:hint="default"/>
-          <w:sz w:val="32"/>
-          <w:szCs w:val="32"/>
-          <w:vertAlign w:val="baseline"/>
-          <w:lang w:val="en-US"/>
-        </w:rPr>
-        <w:t>hợp lệ.</w:t>
+        <w:t>Dựa trên nội dung báo cáo, quản trị viên có thể đưa ra các quyết định: ẩn nội dung vi phạm, gửi cảnh cáo đến người dùng vi phạm, hoặc bỏ qua nếu báo cáo không hợp lệ.</w:t>
       </w:r>
     </w:p>
     <w:p>
@@ -3283,6 +3283,12 @@
             <w:insideH w:val="single" w:color="auto" w:sz="4" w:space="0"/>
             <w:insideV w:val="single" w:color="auto" w:sz="4" w:space="0"/>
           </w:tblBorders>
+          <w:tblCellMar>
+            <w:top w:w="0" w:type="dxa"/>
+            <w:left w:w="108" w:type="dxa"/>
+            <w:bottom w:w="0" w:type="dxa"/>
+            <w:right w:w="108" w:type="dxa"/>
+          </w:tblCellMar>
         </w:tblPrEx>
         <w:tc>
           <w:tcPr>
@@ -8779,12 +8785,6 @@
             <w:insideH w:val="single" w:color="auto" w:sz="4" w:space="0"/>
             <w:insideV w:val="single" w:color="auto" w:sz="4" w:space="0"/>
           </w:tblBorders>
-          <w:tblCellMar>
-            <w:top w:w="0" w:type="dxa"/>
-            <w:left w:w="108" w:type="dxa"/>
-            <w:bottom w:w="0" w:type="dxa"/>
-            <w:right w:w="108" w:type="dxa"/>
-          </w:tblCellMar>
         </w:tblPrEx>
         <w:tc>
           <w:tcPr>
@@ -11026,7 +11026,7 @@
                 <w:vertAlign w:val="baseline"/>
                 <w:lang w:val="en-US"/>
               </w:rPr>
-              <w:t xml:space="preserve">     3.2/ Xem danh sách và tìm kiếm bài hát yêu thích (chuyển sang Usecase Xem danh sách và tìm kiếm bài hát yêu thích).</w:t>
+              <w:t xml:space="preserve">     3.2/ Sửa tài khoản (chuyển sang Usecase Sửa tài khoản cá nhân).</w:t>
             </w:r>
           </w:p>
           <w:p>
@@ -11053,7 +11053,34 @@
                 <w:vertAlign w:val="baseline"/>
                 <w:lang w:val="en-US"/>
               </w:rPr>
-              <w:t xml:space="preserve">     3.3/ Người dùng có thể thực hiện các chức năng như thích, bình luận, chia sẻ, huỷ đăng lại đối với các bài hát đã đăng lại. Hệ thống sẽ ghi nhận các chức năng người dùng đã thực hiện vào cơ sở dữ liệu thành công.</w:t>
+              <w:t xml:space="preserve">     3.3/ Xem danh sách và tìm kiếm bài hát yêu thích (chuyển sang Usecase Xem danh sách và tìm kiếm bài hát yêu thích).</w:t>
+            </w:r>
+          </w:p>
+          <w:p>
+            <w:pPr>
+              <w:widowControl w:val="0"/>
+              <w:numPr>
+                <w:ilvl w:val="0"/>
+                <w:numId w:val="0"/>
+              </w:numPr>
+              <w:jc w:val="both"/>
+              <w:rPr>
+                <w:rFonts w:hint="default"/>
+                <w:sz w:val="32"/>
+                <w:szCs w:val="32"/>
+                <w:vertAlign w:val="baseline"/>
+                <w:lang w:val="en-US"/>
+              </w:rPr>
+            </w:pPr>
+            <w:r>
+              <w:rPr>
+                <w:rFonts w:hint="default"/>
+                <w:sz w:val="32"/>
+                <w:szCs w:val="32"/>
+                <w:vertAlign w:val="baseline"/>
+                <w:lang w:val="en-US"/>
+              </w:rPr>
+              <w:t xml:space="preserve">     3.4/ Người dùng có thể thực hiện các chức năng như thích, bình luận, chia sẻ, huỷ đăng lại đối với các bài hát đã đăng lại. Hệ thống sẽ ghi nhận các chức năng người dùng đã thực hiện vào cơ sở dữ liệu thành công.</w:t>
             </w:r>
           </w:p>
           <w:p>
@@ -11154,7 +11181,7 @@
                 <w:vertAlign w:val="baseline"/>
                 <w:lang w:val="en-US"/>
               </w:rPr>
-              <w:t>3.3.1 Nếu hệ thống ghi nhận các chức năng người dùng đã thực hiện không thành công thì hệ thống thông báo “Hành động thất bại, vui lòng thử lại” đến người dùng.</w:t>
+              <w:t>3.4.1 Nếu hệ thống ghi nhận các chức năng người dùng đã thực hiện không thành công thì hệ thống thông báo “Hành động thất bại, vui lòng thử lại” đến người dùng.</w:t>
             </w:r>
           </w:p>
         </w:tc>
@@ -12316,6 +12343,482 @@
           <w:vertAlign w:val="baseline"/>
           <w:lang w:val="en-US"/>
         </w:rPr>
+        <w:t>Đặc tả Usecase Sửa tài khoản cá nhân</w:t>
+      </w:r>
+    </w:p>
+    <w:tbl>
+      <w:tblPr>
+        <w:tblStyle w:val="4"/>
+        <w:tblW w:w="0" w:type="auto"/>
+        <w:tblInd w:w="0" w:type="dxa"/>
+        <w:tblBorders>
+          <w:top w:val="single" w:color="auto" w:sz="4" w:space="0"/>
+          <w:left w:val="single" w:color="auto" w:sz="4" w:space="0"/>
+          <w:bottom w:val="single" w:color="auto" w:sz="4" w:space="0"/>
+          <w:right w:val="single" w:color="auto" w:sz="4" w:space="0"/>
+          <w:insideH w:val="single" w:color="auto" w:sz="4" w:space="0"/>
+          <w:insideV w:val="single" w:color="auto" w:sz="4" w:space="0"/>
+        </w:tblBorders>
+        <w:tblLayout w:type="autofit"/>
+        <w:tblCellMar>
+          <w:top w:w="0" w:type="dxa"/>
+          <w:left w:w="108" w:type="dxa"/>
+          <w:bottom w:w="0" w:type="dxa"/>
+          <w:right w:w="108" w:type="dxa"/>
+        </w:tblCellMar>
+      </w:tblPr>
+      <w:tblGrid>
+        <w:gridCol w:w="8522"/>
+      </w:tblGrid>
+      <w:tr>
+        <w:tblPrEx>
+          <w:tblBorders>
+            <w:top w:val="single" w:color="auto" w:sz="4" w:space="0"/>
+            <w:left w:val="single" w:color="auto" w:sz="4" w:space="0"/>
+            <w:bottom w:val="single" w:color="auto" w:sz="4" w:space="0"/>
+            <w:right w:val="single" w:color="auto" w:sz="4" w:space="0"/>
+            <w:insideH w:val="single" w:color="auto" w:sz="4" w:space="0"/>
+            <w:insideV w:val="single" w:color="auto" w:sz="4" w:space="0"/>
+          </w:tblBorders>
+          <w:tblCellMar>
+            <w:top w:w="0" w:type="dxa"/>
+            <w:left w:w="108" w:type="dxa"/>
+            <w:bottom w:w="0" w:type="dxa"/>
+            <w:right w:w="108" w:type="dxa"/>
+          </w:tblCellMar>
+        </w:tblPrEx>
+        <w:tc>
+          <w:tcPr>
+            <w:tcW w:w="8522" w:type="dxa"/>
+          </w:tcPr>
+          <w:p>
+            <w:pPr>
+              <w:widowControl w:val="0"/>
+              <w:jc w:val="both"/>
+              <w:rPr>
+                <w:rFonts w:hint="default"/>
+                <w:sz w:val="32"/>
+                <w:szCs w:val="32"/>
+                <w:vertAlign w:val="baseline"/>
+                <w:lang w:val="en-US"/>
+              </w:rPr>
+            </w:pPr>
+            <w:r>
+              <w:rPr>
+                <w:rFonts w:hint="default"/>
+                <w:sz w:val="32"/>
+                <w:szCs w:val="32"/>
+                <w:vertAlign w:val="baseline"/>
+                <w:lang w:val="en-US"/>
+              </w:rPr>
+              <w:t>Tóm tắt: Usecase bắt đầu khi người dùng chọn chức năng Sửa tài khoản cá nhân trong Quản lý hồ sơ cá nhân. Hệ thống sẽ cho phép người dùng thực hiện các chỉnh sửa đối với tài khoản cá nhân của mình.</w:t>
+            </w:r>
+          </w:p>
+        </w:tc>
+      </w:tr>
+      <w:tr>
+        <w:tblPrEx>
+          <w:tblBorders>
+            <w:top w:val="single" w:color="auto" w:sz="4" w:space="0"/>
+            <w:left w:val="single" w:color="auto" w:sz="4" w:space="0"/>
+            <w:bottom w:val="single" w:color="auto" w:sz="4" w:space="0"/>
+            <w:right w:val="single" w:color="auto" w:sz="4" w:space="0"/>
+            <w:insideH w:val="single" w:color="auto" w:sz="4" w:space="0"/>
+            <w:insideV w:val="single" w:color="auto" w:sz="4" w:space="0"/>
+          </w:tblBorders>
+          <w:tblCellMar>
+            <w:top w:w="0" w:type="dxa"/>
+            <w:left w:w="108" w:type="dxa"/>
+            <w:bottom w:w="0" w:type="dxa"/>
+            <w:right w:w="108" w:type="dxa"/>
+          </w:tblCellMar>
+        </w:tblPrEx>
+        <w:tc>
+          <w:tcPr>
+            <w:tcW w:w="8522" w:type="dxa"/>
+          </w:tcPr>
+          <w:p>
+            <w:pPr>
+              <w:widowControl w:val="0"/>
+              <w:jc w:val="both"/>
+              <w:rPr>
+                <w:rFonts w:hint="default"/>
+                <w:sz w:val="32"/>
+                <w:szCs w:val="32"/>
+                <w:vertAlign w:val="baseline"/>
+                <w:lang w:val="en-US"/>
+              </w:rPr>
+            </w:pPr>
+            <w:r>
+              <w:rPr>
+                <w:rFonts w:hint="default"/>
+                <w:sz w:val="32"/>
+                <w:szCs w:val="32"/>
+                <w:vertAlign w:val="baseline"/>
+                <w:lang w:val="en-US"/>
+              </w:rPr>
+              <w:t xml:space="preserve">Dòng sự kiện chính: </w:t>
+            </w:r>
+          </w:p>
+          <w:p>
+            <w:pPr>
+              <w:widowControl w:val="0"/>
+              <w:numPr>
+                <w:ilvl w:val="0"/>
+                <w:numId w:val="58"/>
+              </w:numPr>
+              <w:jc w:val="both"/>
+              <w:rPr>
+                <w:rFonts w:hint="default"/>
+                <w:sz w:val="32"/>
+                <w:szCs w:val="32"/>
+                <w:vertAlign w:val="baseline"/>
+                <w:lang w:val="en-US"/>
+              </w:rPr>
+            </w:pPr>
+            <w:r>
+              <w:rPr>
+                <w:rFonts w:hint="default"/>
+                <w:sz w:val="32"/>
+                <w:szCs w:val="32"/>
+                <w:vertAlign w:val="baseline"/>
+                <w:lang w:val="en-US"/>
+              </w:rPr>
+              <w:t>Hệ thống hiện giao diện gồm form để người dùng nhập các thông tin mới cho tài khoản cá nhân của mình (Email, mật khẩu) thành công.</w:t>
+            </w:r>
+          </w:p>
+          <w:p>
+            <w:pPr>
+              <w:widowControl w:val="0"/>
+              <w:numPr>
+                <w:ilvl w:val="0"/>
+                <w:numId w:val="58"/>
+              </w:numPr>
+              <w:ind w:left="0" w:leftChars="0" w:firstLine="0" w:firstLineChars="0"/>
+              <w:jc w:val="both"/>
+              <w:rPr>
+                <w:rFonts w:hint="default"/>
+                <w:sz w:val="32"/>
+                <w:szCs w:val="32"/>
+                <w:vertAlign w:val="baseline"/>
+                <w:lang w:val="en-US"/>
+              </w:rPr>
+            </w:pPr>
+            <w:r>
+              <w:rPr>
+                <w:rFonts w:hint="default"/>
+                <w:sz w:val="32"/>
+                <w:szCs w:val="32"/>
+                <w:vertAlign w:val="baseline"/>
+                <w:lang w:val="en-US"/>
+              </w:rPr>
+              <w:t>Người dùng nhập thông tin mới và nhấn Lưu.</w:t>
+            </w:r>
+          </w:p>
+          <w:p>
+            <w:pPr>
+              <w:widowControl w:val="0"/>
+              <w:numPr>
+                <w:ilvl w:val="0"/>
+                <w:numId w:val="58"/>
+              </w:numPr>
+              <w:ind w:left="0" w:leftChars="0" w:firstLine="0" w:firstLineChars="0"/>
+              <w:jc w:val="both"/>
+              <w:rPr>
+                <w:rFonts w:hint="default"/>
+                <w:sz w:val="32"/>
+                <w:szCs w:val="32"/>
+                <w:vertAlign w:val="baseline"/>
+                <w:lang w:val="en-US"/>
+              </w:rPr>
+            </w:pPr>
+            <w:r>
+              <w:rPr>
+                <w:rFonts w:hint="default"/>
+                <w:sz w:val="32"/>
+                <w:szCs w:val="32"/>
+                <w:vertAlign w:val="baseline"/>
+                <w:lang w:val="en-US"/>
+              </w:rPr>
+              <w:t>Hệ thống ghi nhận các thông tin mới của tài khoản cá nhân vào cơ sở dữ liệu thành công.</w:t>
+            </w:r>
+          </w:p>
+          <w:p>
+            <w:pPr>
+              <w:widowControl w:val="0"/>
+              <w:numPr>
+                <w:ilvl w:val="0"/>
+                <w:numId w:val="58"/>
+              </w:numPr>
+              <w:ind w:left="0" w:leftChars="0" w:firstLine="0" w:firstLineChars="0"/>
+              <w:jc w:val="both"/>
+              <w:rPr>
+                <w:rFonts w:hint="default"/>
+                <w:sz w:val="32"/>
+                <w:szCs w:val="32"/>
+                <w:vertAlign w:val="baseline"/>
+                <w:lang w:val="en-US"/>
+              </w:rPr>
+            </w:pPr>
+            <w:r>
+              <w:rPr>
+                <w:rFonts w:hint="default"/>
+                <w:sz w:val="32"/>
+                <w:szCs w:val="32"/>
+                <w:vertAlign w:val="baseline"/>
+                <w:lang w:val="en-US"/>
+              </w:rPr>
+              <w:t>Hệ thống chuyển sang giao diện Quản lý hồ sơ cá nhân sau khi chỉnh sửa thành công.</w:t>
+            </w:r>
+          </w:p>
+        </w:tc>
+      </w:tr>
+      <w:tr>
+        <w:tblPrEx>
+          <w:tblBorders>
+            <w:top w:val="single" w:color="auto" w:sz="4" w:space="0"/>
+            <w:left w:val="single" w:color="auto" w:sz="4" w:space="0"/>
+            <w:bottom w:val="single" w:color="auto" w:sz="4" w:space="0"/>
+            <w:right w:val="single" w:color="auto" w:sz="4" w:space="0"/>
+            <w:insideH w:val="single" w:color="auto" w:sz="4" w:space="0"/>
+            <w:insideV w:val="single" w:color="auto" w:sz="4" w:space="0"/>
+          </w:tblBorders>
+          <w:tblCellMar>
+            <w:top w:w="0" w:type="dxa"/>
+            <w:left w:w="108" w:type="dxa"/>
+            <w:bottom w:w="0" w:type="dxa"/>
+            <w:right w:w="108" w:type="dxa"/>
+          </w:tblCellMar>
+        </w:tblPrEx>
+        <w:tc>
+          <w:tcPr>
+            <w:tcW w:w="8522" w:type="dxa"/>
+          </w:tcPr>
+          <w:p>
+            <w:pPr>
+              <w:widowControl w:val="0"/>
+              <w:jc w:val="both"/>
+              <w:rPr>
+                <w:rFonts w:hint="default"/>
+                <w:sz w:val="32"/>
+                <w:szCs w:val="32"/>
+                <w:vertAlign w:val="baseline"/>
+                <w:lang w:val="en-US"/>
+              </w:rPr>
+            </w:pPr>
+            <w:r>
+              <w:rPr>
+                <w:rFonts w:hint="default"/>
+                <w:sz w:val="32"/>
+                <w:szCs w:val="32"/>
+                <w:vertAlign w:val="baseline"/>
+                <w:lang w:val="en-US"/>
+              </w:rPr>
+              <w:t>Dòng sự kiện phụ:</w:t>
+            </w:r>
+          </w:p>
+          <w:p>
+            <w:pPr>
+              <w:widowControl w:val="0"/>
+              <w:numPr>
+                <w:ilvl w:val="0"/>
+                <w:numId w:val="0"/>
+              </w:numPr>
+              <w:jc w:val="both"/>
+              <w:rPr>
+                <w:rFonts w:hint="default"/>
+                <w:sz w:val="32"/>
+                <w:szCs w:val="32"/>
+                <w:vertAlign w:val="baseline"/>
+                <w:lang w:val="en-US"/>
+              </w:rPr>
+            </w:pPr>
+            <w:r>
+              <w:rPr>
+                <w:rFonts w:hint="default"/>
+                <w:sz w:val="32"/>
+                <w:szCs w:val="32"/>
+                <w:vertAlign w:val="baseline"/>
+                <w:lang w:val="en-US"/>
+              </w:rPr>
+              <w:t>3.1 Nếu hệ thống ghi nhận các thông tin mới không thành công thì hệ thống thông báo “Cập nhật tài khoản thất bại, vui lòng thử lại” đến người dùng.</w:t>
+            </w:r>
+          </w:p>
+        </w:tc>
+      </w:tr>
+      <w:tr>
+        <w:tblPrEx>
+          <w:tblBorders>
+            <w:top w:val="single" w:color="auto" w:sz="4" w:space="0"/>
+            <w:left w:val="single" w:color="auto" w:sz="4" w:space="0"/>
+            <w:bottom w:val="single" w:color="auto" w:sz="4" w:space="0"/>
+            <w:right w:val="single" w:color="auto" w:sz="4" w:space="0"/>
+            <w:insideH w:val="single" w:color="auto" w:sz="4" w:space="0"/>
+            <w:insideV w:val="single" w:color="auto" w:sz="4" w:space="0"/>
+          </w:tblBorders>
+          <w:tblCellMar>
+            <w:top w:w="0" w:type="dxa"/>
+            <w:left w:w="108" w:type="dxa"/>
+            <w:bottom w:w="0" w:type="dxa"/>
+            <w:right w:w="108" w:type="dxa"/>
+          </w:tblCellMar>
+        </w:tblPrEx>
+        <w:tc>
+          <w:tcPr>
+            <w:tcW w:w="8522" w:type="dxa"/>
+          </w:tcPr>
+          <w:p>
+            <w:pPr>
+              <w:widowControl w:val="0"/>
+              <w:jc w:val="both"/>
+              <w:rPr>
+                <w:rFonts w:hint="default"/>
+                <w:sz w:val="32"/>
+                <w:szCs w:val="32"/>
+                <w:vertAlign w:val="baseline"/>
+                <w:lang w:val="en-US"/>
+              </w:rPr>
+            </w:pPr>
+            <w:r>
+              <w:rPr>
+                <w:rFonts w:hint="default"/>
+                <w:sz w:val="32"/>
+                <w:szCs w:val="32"/>
+                <w:vertAlign w:val="baseline"/>
+                <w:lang w:val="en-US"/>
+              </w:rPr>
+              <w:t xml:space="preserve">Tiền điều kiện: </w:t>
+            </w:r>
+          </w:p>
+          <w:p>
+            <w:pPr>
+              <w:widowControl w:val="0"/>
+              <w:numPr>
+                <w:ilvl w:val="0"/>
+                <w:numId w:val="59"/>
+              </w:numPr>
+              <w:jc w:val="both"/>
+              <w:rPr>
+                <w:rFonts w:hint="default"/>
+                <w:sz w:val="32"/>
+                <w:szCs w:val="32"/>
+                <w:vertAlign w:val="baseline"/>
+                <w:lang w:val="en-US"/>
+              </w:rPr>
+            </w:pPr>
+            <w:r>
+              <w:rPr>
+                <w:rFonts w:hint="default"/>
+                <w:sz w:val="32"/>
+                <w:szCs w:val="32"/>
+                <w:vertAlign w:val="baseline"/>
+                <w:lang w:val="en-US"/>
+              </w:rPr>
+              <w:t>Hệ thống ở chế độ Người dùng.</w:t>
+            </w:r>
+          </w:p>
+        </w:tc>
+      </w:tr>
+      <w:tr>
+        <w:tblPrEx>
+          <w:tblBorders>
+            <w:top w:val="single" w:color="auto" w:sz="4" w:space="0"/>
+            <w:left w:val="single" w:color="auto" w:sz="4" w:space="0"/>
+            <w:bottom w:val="single" w:color="auto" w:sz="4" w:space="0"/>
+            <w:right w:val="single" w:color="auto" w:sz="4" w:space="0"/>
+            <w:insideH w:val="single" w:color="auto" w:sz="4" w:space="0"/>
+            <w:insideV w:val="single" w:color="auto" w:sz="4" w:space="0"/>
+          </w:tblBorders>
+          <w:tblCellMar>
+            <w:top w:w="0" w:type="dxa"/>
+            <w:left w:w="108" w:type="dxa"/>
+            <w:bottom w:w="0" w:type="dxa"/>
+            <w:right w:w="108" w:type="dxa"/>
+          </w:tblCellMar>
+        </w:tblPrEx>
+        <w:tc>
+          <w:tcPr>
+            <w:tcW w:w="8522" w:type="dxa"/>
+          </w:tcPr>
+          <w:p>
+            <w:pPr>
+              <w:widowControl w:val="0"/>
+              <w:jc w:val="both"/>
+              <w:rPr>
+                <w:rFonts w:hint="default"/>
+                <w:sz w:val="32"/>
+                <w:szCs w:val="32"/>
+                <w:vertAlign w:val="baseline"/>
+                <w:lang w:val="en-US"/>
+              </w:rPr>
+            </w:pPr>
+            <w:r>
+              <w:rPr>
+                <w:rFonts w:hint="default"/>
+                <w:sz w:val="32"/>
+                <w:szCs w:val="32"/>
+                <w:vertAlign w:val="baseline"/>
+                <w:lang w:val="en-US"/>
+              </w:rPr>
+              <w:t xml:space="preserve">Hậu điều kiện: </w:t>
+            </w:r>
+          </w:p>
+          <w:p>
+            <w:pPr>
+              <w:widowControl w:val="0"/>
+              <w:numPr>
+                <w:ilvl w:val="0"/>
+                <w:numId w:val="60"/>
+              </w:numPr>
+              <w:jc w:val="both"/>
+              <w:rPr>
+                <w:rFonts w:hint="default"/>
+                <w:sz w:val="32"/>
+                <w:szCs w:val="32"/>
+                <w:vertAlign w:val="baseline"/>
+                <w:lang w:val="en-US"/>
+              </w:rPr>
+            </w:pPr>
+            <w:r>
+              <w:rPr>
+                <w:rFonts w:hint="default"/>
+                <w:sz w:val="32"/>
+                <w:szCs w:val="32"/>
+                <w:vertAlign w:val="baseline"/>
+                <w:lang w:val="en-US"/>
+              </w:rPr>
+              <w:t>Hệ thống sẵn sàng để thực hiện yêu cầu chỉnh sửa tiếp theo của người dùng với hồ sơ cá nhân của mình.</w:t>
+            </w:r>
+          </w:p>
+        </w:tc>
+      </w:tr>
+    </w:tbl>
+    <w:p>
+      <w:pPr>
+        <w:rPr>
+          <w:sz w:val="32"/>
+          <w:szCs w:val="32"/>
+        </w:rPr>
+      </w:pPr>
+    </w:p>
+    <w:p>
+      <w:pPr>
+        <w:rPr>
+          <w:rFonts w:hint="default"/>
+          <w:sz w:val="32"/>
+          <w:szCs w:val="32"/>
+          <w:vertAlign w:val="baseline"/>
+          <w:lang w:val="en-US"/>
+        </w:rPr>
+      </w:pPr>
+      <w:r>
+        <w:rPr>
+          <w:rFonts w:hint="default"/>
+          <w:sz w:val="32"/>
+          <w:szCs w:val="32"/>
+          <w:vertAlign w:val="baseline"/>
+          <w:lang w:val="en-US"/>
+        </w:rPr>
         <w:t>Đặc tả Usecase Quản lý Playlist cá nhân</w:t>
       </w:r>
     </w:p>
@@ -12353,6 +12856,12 @@
             <w:insideH w:val="single" w:color="auto" w:sz="4" w:space="0"/>
             <w:insideV w:val="single" w:color="auto" w:sz="4" w:space="0"/>
           </w:tblBorders>
+          <w:tblCellMar>
+            <w:top w:w="0" w:type="dxa"/>
+            <w:left w:w="108" w:type="dxa"/>
+            <w:bottom w:w="0" w:type="dxa"/>
+            <w:right w:w="108" w:type="dxa"/>
+          </w:tblCellMar>
         </w:tblPrEx>
         <w:tc>
           <w:tcPr>
@@ -12432,7 +12941,7 @@
               <w:widowControl w:val="0"/>
               <w:numPr>
                 <w:ilvl w:val="0"/>
-                <w:numId w:val="58"/>
+                <w:numId w:val="61"/>
               </w:numPr>
               <w:jc w:val="both"/>
               <w:rPr>
@@ -12459,7 +12968,7 @@
               <w:widowControl w:val="0"/>
               <w:numPr>
                 <w:ilvl w:val="0"/>
-                <w:numId w:val="58"/>
+                <w:numId w:val="61"/>
               </w:numPr>
               <w:ind w:left="0" w:leftChars="0" w:firstLine="0" w:firstLineChars="0"/>
               <w:jc w:val="both"/>
@@ -12487,7 +12996,7 @@
               <w:widowControl w:val="0"/>
               <w:numPr>
                 <w:ilvl w:val="0"/>
-                <w:numId w:val="58"/>
+                <w:numId w:val="61"/>
               </w:numPr>
               <w:ind w:left="0" w:leftChars="0" w:firstLine="0" w:firstLineChars="0"/>
               <w:jc w:val="both"/>
@@ -12599,7 +13108,7 @@
               <w:widowControl w:val="0"/>
               <w:numPr>
                 <w:ilvl w:val="0"/>
-                <w:numId w:val="58"/>
+                <w:numId w:val="61"/>
               </w:numPr>
               <w:ind w:left="0" w:leftChars="0" w:firstLine="0" w:firstLineChars="0"/>
               <w:jc w:val="both"/>
@@ -12746,7 +13255,7 @@
               <w:widowControl w:val="0"/>
               <w:numPr>
                 <w:ilvl w:val="0"/>
-                <w:numId w:val="59"/>
+                <w:numId w:val="62"/>
               </w:numPr>
               <w:jc w:val="both"/>
               <w:rPr>
@@ -12773,7 +13282,7 @@
               <w:widowControl w:val="0"/>
               <w:numPr>
                 <w:ilvl w:val="0"/>
-                <w:numId w:val="59"/>
+                <w:numId w:val="62"/>
               </w:numPr>
               <w:jc w:val="both"/>
               <w:rPr>
@@ -12846,7 +13355,7 @@
               <w:widowControl w:val="0"/>
               <w:numPr>
                 <w:ilvl w:val="0"/>
-                <w:numId w:val="60"/>
+                <w:numId w:val="63"/>
               </w:numPr>
               <w:ind w:leftChars="0"/>
               <w:jc w:val="both"/>
@@ -13020,7 +13529,7 @@
               <w:widowControl w:val="0"/>
               <w:numPr>
                 <w:ilvl w:val="0"/>
-                <w:numId w:val="61"/>
+                <w:numId w:val="64"/>
               </w:numPr>
               <w:jc w:val="both"/>
               <w:rPr>
@@ -13047,7 +13556,7 @@
               <w:widowControl w:val="0"/>
               <w:numPr>
                 <w:ilvl w:val="0"/>
-                <w:numId w:val="61"/>
+                <w:numId w:val="64"/>
               </w:numPr>
               <w:ind w:left="0" w:leftChars="0" w:firstLine="0" w:firstLineChars="0"/>
               <w:jc w:val="both"/>
@@ -13075,7 +13584,7 @@
               <w:widowControl w:val="0"/>
               <w:numPr>
                 <w:ilvl w:val="0"/>
-                <w:numId w:val="61"/>
+                <w:numId w:val="64"/>
               </w:numPr>
               <w:ind w:left="0" w:leftChars="0" w:firstLine="0" w:firstLineChars="0"/>
               <w:jc w:val="both"/>
@@ -13103,7 +13612,7 @@
               <w:widowControl w:val="0"/>
               <w:numPr>
                 <w:ilvl w:val="0"/>
-                <w:numId w:val="61"/>
+                <w:numId w:val="64"/>
               </w:numPr>
               <w:ind w:left="0" w:leftChars="0" w:firstLine="0" w:firstLineChars="0"/>
               <w:jc w:val="both"/>
@@ -13250,7 +13759,7 @@
               <w:widowControl w:val="0"/>
               <w:numPr>
                 <w:ilvl w:val="0"/>
-                <w:numId w:val="62"/>
+                <w:numId w:val="65"/>
               </w:numPr>
               <w:jc w:val="both"/>
               <w:rPr>
@@ -13323,7 +13832,7 @@
               <w:widowControl w:val="0"/>
               <w:numPr>
                 <w:ilvl w:val="0"/>
-                <w:numId w:val="63"/>
+                <w:numId w:val="66"/>
               </w:numPr>
               <w:ind w:leftChars="0"/>
               <w:jc w:val="both"/>
@@ -13497,7 +14006,7 @@
               <w:widowControl w:val="0"/>
               <w:numPr>
                 <w:ilvl w:val="0"/>
-                <w:numId w:val="64"/>
+                <w:numId w:val="67"/>
               </w:numPr>
               <w:jc w:val="both"/>
               <w:rPr>
@@ -13524,7 +14033,7 @@
               <w:widowControl w:val="0"/>
               <w:numPr>
                 <w:ilvl w:val="0"/>
-                <w:numId w:val="64"/>
+                <w:numId w:val="67"/>
               </w:numPr>
               <w:ind w:left="0" w:leftChars="0" w:firstLine="0" w:firstLineChars="0"/>
               <w:jc w:val="both"/>
@@ -13636,7 +14145,7 @@
               <w:widowControl w:val="0"/>
               <w:numPr>
                 <w:ilvl w:val="0"/>
-                <w:numId w:val="64"/>
+                <w:numId w:val="67"/>
               </w:numPr>
               <w:ind w:left="0" w:leftChars="0" w:firstLine="0" w:firstLineChars="0"/>
               <w:jc w:val="both"/>
@@ -13783,7 +14292,7 @@
               <w:widowControl w:val="0"/>
               <w:numPr>
                 <w:ilvl w:val="0"/>
-                <w:numId w:val="65"/>
+                <w:numId w:val="68"/>
               </w:numPr>
               <w:jc w:val="both"/>
               <w:rPr>
@@ -13810,7 +14319,7 @@
               <w:widowControl w:val="0"/>
               <w:numPr>
                 <w:ilvl w:val="0"/>
-                <w:numId w:val="65"/>
+                <w:numId w:val="68"/>
               </w:numPr>
               <w:ind w:left="0" w:leftChars="0" w:firstLine="0" w:firstLineChars="0"/>
               <w:jc w:val="both"/>
@@ -13884,7 +14393,7 @@
               <w:widowControl w:val="0"/>
               <w:numPr>
                 <w:ilvl w:val="0"/>
-                <w:numId w:val="66"/>
+                <w:numId w:val="69"/>
               </w:numPr>
               <w:ind w:leftChars="0"/>
               <w:jc w:val="both"/>
@@ -13973,12 +14482,6 @@
             <w:insideH w:val="single" w:color="auto" w:sz="4" w:space="0"/>
             <w:insideV w:val="single" w:color="auto" w:sz="4" w:space="0"/>
           </w:tblBorders>
-          <w:tblCellMar>
-            <w:top w:w="0" w:type="dxa"/>
-            <w:left w:w="108" w:type="dxa"/>
-            <w:bottom w:w="0" w:type="dxa"/>
-            <w:right w:w="108" w:type="dxa"/>
-          </w:tblCellMar>
         </w:tblPrEx>
         <w:tc>
           <w:tcPr>
@@ -14058,7 +14561,7 @@
               <w:widowControl w:val="0"/>
               <w:numPr>
                 <w:ilvl w:val="0"/>
-                <w:numId w:val="67"/>
+                <w:numId w:val="70"/>
               </w:numPr>
               <w:jc w:val="both"/>
               <w:rPr>
@@ -14085,7 +14588,7 @@
               <w:widowControl w:val="0"/>
               <w:numPr>
                 <w:ilvl w:val="0"/>
-                <w:numId w:val="67"/>
+                <w:numId w:val="70"/>
               </w:numPr>
               <w:ind w:left="0" w:leftChars="0" w:firstLine="0" w:firstLineChars="0"/>
               <w:jc w:val="both"/>
@@ -14113,7 +14616,7 @@
               <w:widowControl w:val="0"/>
               <w:numPr>
                 <w:ilvl w:val="0"/>
-                <w:numId w:val="67"/>
+                <w:numId w:val="70"/>
               </w:numPr>
               <w:ind w:left="0" w:leftChars="0" w:firstLine="0" w:firstLineChars="0"/>
               <w:jc w:val="both"/>
@@ -14141,7 +14644,7 @@
               <w:widowControl w:val="0"/>
               <w:numPr>
                 <w:ilvl w:val="0"/>
-                <w:numId w:val="67"/>
+                <w:numId w:val="70"/>
               </w:numPr>
               <w:ind w:left="0" w:leftChars="0" w:firstLine="0" w:firstLineChars="0"/>
               <w:jc w:val="both"/>
@@ -14288,7 +14791,7 @@
               <w:widowControl w:val="0"/>
               <w:numPr>
                 <w:ilvl w:val="0"/>
-                <w:numId w:val="68"/>
+                <w:numId w:val="71"/>
               </w:numPr>
               <w:jc w:val="both"/>
               <w:rPr>
@@ -14361,7 +14864,7 @@
               <w:widowControl w:val="0"/>
               <w:numPr>
                 <w:ilvl w:val="0"/>
-                <w:numId w:val="69"/>
+                <w:numId w:val="72"/>
               </w:numPr>
               <w:jc w:val="both"/>
               <w:rPr>
@@ -14534,7 +15037,7 @@
               <w:widowControl w:val="0"/>
               <w:numPr>
                 <w:ilvl w:val="0"/>
-                <w:numId w:val="70"/>
+                <w:numId w:val="73"/>
               </w:numPr>
               <w:jc w:val="both"/>
               <w:rPr>
@@ -14561,7 +15064,7 @@
               <w:widowControl w:val="0"/>
               <w:numPr>
                 <w:ilvl w:val="0"/>
-                <w:numId w:val="70"/>
+                <w:numId w:val="73"/>
               </w:numPr>
               <w:ind w:left="0" w:leftChars="0" w:firstLine="0" w:firstLineChars="0"/>
               <w:jc w:val="both"/>
@@ -14589,7 +15092,7 @@
               <w:widowControl w:val="0"/>
               <w:numPr>
                 <w:ilvl w:val="0"/>
-                <w:numId w:val="70"/>
+                <w:numId w:val="73"/>
               </w:numPr>
               <w:ind w:left="0" w:leftChars="0" w:firstLine="0" w:firstLineChars="0"/>
               <w:jc w:val="both"/>
@@ -14617,7 +15120,7 @@
               <w:widowControl w:val="0"/>
               <w:numPr>
                 <w:ilvl w:val="0"/>
-                <w:numId w:val="70"/>
+                <w:numId w:val="73"/>
               </w:numPr>
               <w:ind w:left="0" w:leftChars="0" w:firstLine="0" w:firstLineChars="0"/>
               <w:jc w:val="both"/>
@@ -14691,7 +15194,7 @@
               <w:widowControl w:val="0"/>
               <w:numPr>
                 <w:ilvl w:val="0"/>
-                <w:numId w:val="71"/>
+                <w:numId w:val="74"/>
               </w:numPr>
               <w:jc w:val="both"/>
               <w:rPr>
@@ -14764,7 +15267,7 @@
               <w:widowControl w:val="0"/>
               <w:numPr>
                 <w:ilvl w:val="0"/>
-                <w:numId w:val="72"/>
+                <w:numId w:val="75"/>
               </w:numPr>
               <w:jc w:val="both"/>
               <w:rPr>
@@ -14837,7 +15340,7 @@
               <w:widowControl w:val="0"/>
               <w:numPr>
                 <w:ilvl w:val="0"/>
-                <w:numId w:val="73"/>
+                <w:numId w:val="76"/>
               </w:numPr>
               <w:ind w:leftChars="0"/>
               <w:jc w:val="both"/>
@@ -15016,6 +15519,18 @@
     </w:lvl>
   </w:abstractNum>
   <w:abstractNum w:abstractNumId="11">
+    <w:nsid w:val="98827319"/>
+    <w:multiLevelType w:val="singleLevel"/>
+    <w:tmpl w:val="98827319"/>
+    <w:lvl w:ilvl="0" w:tentative="0">
+      <w:start w:val="1"/>
+      <w:numFmt w:val="decimal"/>
+      <w:suff w:val="space"/>
+      <w:lvlText w:val="%1."/>
+      <w:lvlJc w:val="left"/>
+    </w:lvl>
+  </w:abstractNum>
+  <w:abstractNum w:abstractNumId="12">
     <w:nsid w:val="98985596"/>
     <w:multiLevelType w:val="singleLevel"/>
     <w:tmpl w:val="98985596"/>
@@ -15027,7 +15542,7 @@
       <w:lvlJc w:val="left"/>
     </w:lvl>
   </w:abstractNum>
-  <w:abstractNum w:abstractNumId="12">
+  <w:abstractNum w:abstractNumId="13">
     <w:nsid w:val="9E09ABE2"/>
     <w:multiLevelType w:val="multilevel"/>
     <w:tmpl w:val="9E09ABE2"/>
@@ -15167,7 +15682,19 @@
       </w:rPr>
     </w:lvl>
   </w:abstractNum>
-  <w:abstractNum w:abstractNumId="13">
+  <w:abstractNum w:abstractNumId="14">
+    <w:nsid w:val="A0B38EB9"/>
+    <w:multiLevelType w:val="singleLevel"/>
+    <w:tmpl w:val="A0B38EB9"/>
+    <w:lvl w:ilvl="0" w:tentative="0">
+      <w:start w:val="1"/>
+      <w:numFmt w:val="decimal"/>
+      <w:suff w:val="space"/>
+      <w:lvlText w:val="%1."/>
+      <w:lvlJc w:val="left"/>
+    </w:lvl>
+  </w:abstractNum>
+  <w:abstractNum w:abstractNumId="15">
     <w:nsid w:val="A47B5E06"/>
     <w:multiLevelType w:val="singleLevel"/>
     <w:tmpl w:val="A47B5E06"/>
@@ -15179,7 +15706,7 @@
       <w:lvlJc w:val="left"/>
     </w:lvl>
   </w:abstractNum>
-  <w:abstractNum w:abstractNumId="14">
+  <w:abstractNum w:abstractNumId="16">
     <w:nsid w:val="A5D72E53"/>
     <w:multiLevelType w:val="multilevel"/>
     <w:tmpl w:val="A5D72E53"/>
@@ -15319,7 +15846,7 @@
       </w:rPr>
     </w:lvl>
   </w:abstractNum>
-  <w:abstractNum w:abstractNumId="15">
+  <w:abstractNum w:abstractNumId="17">
     <w:nsid w:val="A8A349C5"/>
     <w:multiLevelType w:val="singleLevel"/>
     <w:tmpl w:val="A8A349C5"/>
@@ -15331,7 +15858,7 @@
       <w:lvlJc w:val="left"/>
     </w:lvl>
   </w:abstractNum>
-  <w:abstractNum w:abstractNumId="16">
+  <w:abstractNum w:abstractNumId="18">
     <w:nsid w:val="AB2CD29A"/>
     <w:multiLevelType w:val="singleLevel"/>
     <w:tmpl w:val="AB2CD29A"/>
@@ -15343,7 +15870,7 @@
       <w:lvlJc w:val="left"/>
     </w:lvl>
   </w:abstractNum>
-  <w:abstractNum w:abstractNumId="17">
+  <w:abstractNum w:abstractNumId="19">
     <w:nsid w:val="B0E25511"/>
     <w:multiLevelType w:val="singleLevel"/>
     <w:tmpl w:val="B0E25511"/>
@@ -15359,7 +15886,7 @@
       </w:pPr>
     </w:lvl>
   </w:abstractNum>
-  <w:abstractNum w:abstractNumId="18">
+  <w:abstractNum w:abstractNumId="20">
     <w:nsid w:val="B3C2315F"/>
     <w:multiLevelType w:val="singleLevel"/>
     <w:tmpl w:val="B3C2315F"/>
@@ -15371,7 +15898,7 @@
       <w:lvlJc w:val="left"/>
     </w:lvl>
   </w:abstractNum>
-  <w:abstractNum w:abstractNumId="19">
+  <w:abstractNum w:abstractNumId="21">
     <w:nsid w:val="B52C055F"/>
     <w:multiLevelType w:val="multilevel"/>
     <w:tmpl w:val="B52C055F"/>
@@ -15511,7 +16038,7 @@
       </w:rPr>
     </w:lvl>
   </w:abstractNum>
-  <w:abstractNum w:abstractNumId="20">
+  <w:abstractNum w:abstractNumId="22">
     <w:nsid w:val="B6407F19"/>
     <w:multiLevelType w:val="singleLevel"/>
     <w:tmpl w:val="B6407F19"/>
@@ -15523,7 +16050,7 @@
       <w:lvlJc w:val="left"/>
     </w:lvl>
   </w:abstractNum>
-  <w:abstractNum w:abstractNumId="21">
+  <w:abstractNum w:abstractNumId="23">
     <w:nsid w:val="B7529E00"/>
     <w:multiLevelType w:val="singleLevel"/>
     <w:tmpl w:val="B7529E00"/>
@@ -15535,7 +16062,7 @@
       <w:lvlJc w:val="left"/>
     </w:lvl>
   </w:abstractNum>
-  <w:abstractNum w:abstractNumId="22">
+  <w:abstractNum w:abstractNumId="24">
     <w:nsid w:val="B8276521"/>
     <w:multiLevelType w:val="singleLevel"/>
     <w:tmpl w:val="B8276521"/>
@@ -15547,7 +16074,7 @@
       <w:lvlJc w:val="left"/>
     </w:lvl>
   </w:abstractNum>
-  <w:abstractNum w:abstractNumId="23">
+  <w:abstractNum w:abstractNumId="25">
     <w:nsid w:val="BD3EE326"/>
     <w:multiLevelType w:val="singleLevel"/>
     <w:tmpl w:val="BD3EE326"/>
@@ -15559,7 +16086,7 @@
       <w:lvlJc w:val="left"/>
     </w:lvl>
   </w:abstractNum>
-  <w:abstractNum w:abstractNumId="24">
+  <w:abstractNum w:abstractNumId="26">
     <w:nsid w:val="BF1C10F1"/>
     <w:multiLevelType w:val="singleLevel"/>
     <w:tmpl w:val="BF1C10F1"/>
@@ -15571,7 +16098,7 @@
       <w:lvlJc w:val="left"/>
     </w:lvl>
   </w:abstractNum>
-  <w:abstractNum w:abstractNumId="25">
+  <w:abstractNum w:abstractNumId="27">
     <w:nsid w:val="C1131C82"/>
     <w:multiLevelType w:val="singleLevel"/>
     <w:tmpl w:val="C1131C82"/>
@@ -15583,7 +16110,7 @@
       <w:lvlJc w:val="left"/>
     </w:lvl>
   </w:abstractNum>
-  <w:abstractNum w:abstractNumId="26">
+  <w:abstractNum w:abstractNumId="28">
     <w:nsid w:val="CAD6F3E4"/>
     <w:multiLevelType w:val="singleLevel"/>
     <w:tmpl w:val="CAD6F3E4"/>
@@ -15595,7 +16122,7 @@
       <w:lvlJc w:val="left"/>
     </w:lvl>
   </w:abstractNum>
-  <w:abstractNum w:abstractNumId="27">
+  <w:abstractNum w:abstractNumId="29">
     <w:nsid w:val="CBEC66A5"/>
     <w:multiLevelType w:val="singleLevel"/>
     <w:tmpl w:val="CBEC66A5"/>
@@ -15607,7 +16134,7 @@
       <w:lvlJc w:val="left"/>
     </w:lvl>
   </w:abstractNum>
-  <w:abstractNum w:abstractNumId="28">
+  <w:abstractNum w:abstractNumId="30">
     <w:nsid w:val="CE762D04"/>
     <w:multiLevelType w:val="multilevel"/>
     <w:tmpl w:val="CE762D04"/>
@@ -15723,7 +16250,7 @@
       </w:rPr>
     </w:lvl>
   </w:abstractNum>
-  <w:abstractNum w:abstractNumId="29">
+  <w:abstractNum w:abstractNumId="31">
     <w:nsid w:val="CFB556DD"/>
     <w:multiLevelType w:val="singleLevel"/>
     <w:tmpl w:val="CFB556DD"/>
@@ -15735,7 +16262,7 @@
       <w:lvlJc w:val="left"/>
     </w:lvl>
   </w:abstractNum>
-  <w:abstractNum w:abstractNumId="30">
+  <w:abstractNum w:abstractNumId="32">
     <w:nsid w:val="D4A79DA9"/>
     <w:multiLevelType w:val="multilevel"/>
     <w:tmpl w:val="D4A79DA9"/>
@@ -15875,7 +16402,7 @@
       </w:rPr>
     </w:lvl>
   </w:abstractNum>
-  <w:abstractNum w:abstractNumId="31">
+  <w:abstractNum w:abstractNumId="33">
     <w:nsid w:val="E109609F"/>
     <w:multiLevelType w:val="singleLevel"/>
     <w:tmpl w:val="E109609F"/>
@@ -15887,7 +16414,7 @@
       <w:lvlJc w:val="left"/>
     </w:lvl>
   </w:abstractNum>
-  <w:abstractNum w:abstractNumId="32">
+  <w:abstractNum w:abstractNumId="34">
     <w:nsid w:val="E17C0C88"/>
     <w:multiLevelType w:val="singleLevel"/>
     <w:tmpl w:val="E17C0C88"/>
@@ -15899,7 +16426,7 @@
       <w:lvlJc w:val="left"/>
     </w:lvl>
   </w:abstractNum>
-  <w:abstractNum w:abstractNumId="33">
+  <w:abstractNum w:abstractNumId="35">
     <w:nsid w:val="E89A39E4"/>
     <w:multiLevelType w:val="singleLevel"/>
     <w:tmpl w:val="E89A39E4"/>
@@ -15911,7 +16438,7 @@
       <w:lvlJc w:val="left"/>
     </w:lvl>
   </w:abstractNum>
-  <w:abstractNum w:abstractNumId="34">
+  <w:abstractNum w:abstractNumId="36">
     <w:nsid w:val="E9767898"/>
     <w:multiLevelType w:val="singleLevel"/>
     <w:tmpl w:val="E9767898"/>
@@ -15923,7 +16450,7 @@
       <w:lvlJc w:val="left"/>
     </w:lvl>
   </w:abstractNum>
-  <w:abstractNum w:abstractNumId="35">
+  <w:abstractNum w:abstractNumId="37">
     <w:nsid w:val="EA14CDEE"/>
     <w:multiLevelType w:val="singleLevel"/>
     <w:tmpl w:val="EA14CDEE"/>
@@ -15935,7 +16462,7 @@
       <w:lvlJc w:val="left"/>
     </w:lvl>
   </w:abstractNum>
-  <w:abstractNum w:abstractNumId="36">
+  <w:abstractNum w:abstractNumId="38">
     <w:nsid w:val="FC29D630"/>
     <w:multiLevelType w:val="singleLevel"/>
     <w:tmpl w:val="FC29D630"/>
@@ -15947,7 +16474,7 @@
       <w:lvlJc w:val="left"/>
     </w:lvl>
   </w:abstractNum>
-  <w:abstractNum w:abstractNumId="37">
+  <w:abstractNum w:abstractNumId="39">
     <w:nsid w:val="FE24A8A4"/>
     <w:multiLevelType w:val="singleLevel"/>
     <w:tmpl w:val="FE24A8A4"/>
@@ -15959,7 +16486,7 @@
       <w:lvlJc w:val="left"/>
     </w:lvl>
   </w:abstractNum>
-  <w:abstractNum w:abstractNumId="38">
+  <w:abstractNum w:abstractNumId="40">
     <w:nsid w:val="FE343E4B"/>
     <w:multiLevelType w:val="singleLevel"/>
     <w:tmpl w:val="FE343E4B"/>
@@ -15971,7 +16498,19 @@
       <w:lvlJc w:val="left"/>
     </w:lvl>
   </w:abstractNum>
-  <w:abstractNum w:abstractNumId="39">
+  <w:abstractNum w:abstractNumId="41">
+    <w:nsid w:val="04DAEE11"/>
+    <w:multiLevelType w:val="singleLevel"/>
+    <w:tmpl w:val="04DAEE11"/>
+    <w:lvl w:ilvl="0" w:tentative="0">
+      <w:start w:val="1"/>
+      <w:numFmt w:val="decimal"/>
+      <w:suff w:val="space"/>
+      <w:lvlText w:val="%1."/>
+      <w:lvlJc w:val="left"/>
+    </w:lvl>
+  </w:abstractNum>
+  <w:abstractNum w:abstractNumId="42">
     <w:nsid w:val="09005923"/>
     <w:multiLevelType w:val="singleLevel"/>
     <w:tmpl w:val="09005923"/>
@@ -15983,7 +16522,7 @@
       <w:lvlJc w:val="left"/>
     </w:lvl>
   </w:abstractNum>
-  <w:abstractNum w:abstractNumId="40">
+  <w:abstractNum w:abstractNumId="43">
     <w:nsid w:val="0A7C2C92"/>
     <w:multiLevelType w:val="singleLevel"/>
     <w:tmpl w:val="0A7C2C92"/>
@@ -15995,7 +16534,7 @@
       <w:lvlJc w:val="left"/>
     </w:lvl>
   </w:abstractNum>
-  <w:abstractNum w:abstractNumId="41">
+  <w:abstractNum w:abstractNumId="44">
     <w:nsid w:val="0CD92811"/>
     <w:multiLevelType w:val="singleLevel"/>
     <w:tmpl w:val="0CD92811"/>
@@ -16007,7 +16546,7 @@
       <w:lvlJc w:val="left"/>
     </w:lvl>
   </w:abstractNum>
-  <w:abstractNum w:abstractNumId="42">
+  <w:abstractNum w:abstractNumId="45">
     <w:nsid w:val="12E3D0E2"/>
     <w:multiLevelType w:val="singleLevel"/>
     <w:tmpl w:val="12E3D0E2"/>
@@ -16019,7 +16558,7 @@
       <w:lvlJc w:val="left"/>
     </w:lvl>
   </w:abstractNum>
-  <w:abstractNum w:abstractNumId="43">
+  <w:abstractNum w:abstractNumId="46">
     <w:nsid w:val="18501BFC"/>
     <w:multiLevelType w:val="singleLevel"/>
     <w:tmpl w:val="18501BFC"/>
@@ -16031,7 +16570,7 @@
       <w:lvlJc w:val="left"/>
     </w:lvl>
   </w:abstractNum>
-  <w:abstractNum w:abstractNumId="44">
+  <w:abstractNum w:abstractNumId="47">
     <w:nsid w:val="211769BA"/>
     <w:multiLevelType w:val="singleLevel"/>
     <w:tmpl w:val="211769BA"/>
@@ -16043,7 +16582,7 @@
       <w:lvlJc w:val="left"/>
     </w:lvl>
   </w:abstractNum>
-  <w:abstractNum w:abstractNumId="45">
+  <w:abstractNum w:abstractNumId="48">
     <w:nsid w:val="27D2B737"/>
     <w:multiLevelType w:val="singleLevel"/>
     <w:tmpl w:val="27D2B737"/>
@@ -16055,7 +16594,7 @@
       <w:lvlJc w:val="left"/>
     </w:lvl>
   </w:abstractNum>
-  <w:abstractNum w:abstractNumId="46">
+  <w:abstractNum w:abstractNumId="49">
     <w:nsid w:val="2DE852F7"/>
     <w:multiLevelType w:val="singleLevel"/>
     <w:tmpl w:val="2DE852F7"/>
@@ -16067,7 +16606,7 @@
       <w:lvlJc w:val="left"/>
     </w:lvl>
   </w:abstractNum>
-  <w:abstractNum w:abstractNumId="47">
+  <w:abstractNum w:abstractNumId="50">
     <w:nsid w:val="30AD9F26"/>
     <w:multiLevelType w:val="singleLevel"/>
     <w:tmpl w:val="30AD9F26"/>
@@ -16079,7 +16618,7 @@
       <w:lvlJc w:val="left"/>
     </w:lvl>
   </w:abstractNum>
-  <w:abstractNum w:abstractNumId="48">
+  <w:abstractNum w:abstractNumId="51">
     <w:nsid w:val="34247F98"/>
     <w:multiLevelType w:val="singleLevel"/>
     <w:tmpl w:val="34247F98"/>
@@ -16091,7 +16630,7 @@
       <w:lvlJc w:val="left"/>
     </w:lvl>
   </w:abstractNum>
-  <w:abstractNum w:abstractNumId="49">
+  <w:abstractNum w:abstractNumId="52">
     <w:nsid w:val="34ACC566"/>
     <w:multiLevelType w:val="singleLevel"/>
     <w:tmpl w:val="34ACC566"/>
@@ -16103,7 +16642,7 @@
       <w:lvlJc w:val="left"/>
     </w:lvl>
   </w:abstractNum>
-  <w:abstractNum w:abstractNumId="50">
+  <w:abstractNum w:abstractNumId="53">
     <w:nsid w:val="36D9EC17"/>
     <w:multiLevelType w:val="singleLevel"/>
     <w:tmpl w:val="36D9EC17"/>
@@ -16115,7 +16654,7 @@
       <w:lvlJc w:val="left"/>
     </w:lvl>
   </w:abstractNum>
-  <w:abstractNum w:abstractNumId="51">
+  <w:abstractNum w:abstractNumId="54">
     <w:nsid w:val="3915D7F5"/>
     <w:multiLevelType w:val="singleLevel"/>
     <w:tmpl w:val="3915D7F5"/>
@@ -16127,7 +16666,7 @@
       <w:lvlJc w:val="left"/>
     </w:lvl>
   </w:abstractNum>
-  <w:abstractNum w:abstractNumId="52">
+  <w:abstractNum w:abstractNumId="55">
     <w:nsid w:val="3B3BFDBA"/>
     <w:multiLevelType w:val="singleLevel"/>
     <w:tmpl w:val="3B3BFDBA"/>
@@ -16139,7 +16678,7 @@
       <w:lvlJc w:val="left"/>
     </w:lvl>
   </w:abstractNum>
-  <w:abstractNum w:abstractNumId="53">
+  <w:abstractNum w:abstractNumId="56">
     <w:nsid w:val="3CC99ABE"/>
     <w:multiLevelType w:val="singleLevel"/>
     <w:tmpl w:val="3CC99ABE"/>
@@ -16151,7 +16690,7 @@
       <w:lvlJc w:val="left"/>
     </w:lvl>
   </w:abstractNum>
-  <w:abstractNum w:abstractNumId="54">
+  <w:abstractNum w:abstractNumId="57">
     <w:nsid w:val="3D4BEBA8"/>
     <w:multiLevelType w:val="singleLevel"/>
     <w:tmpl w:val="3D4BEBA8"/>
@@ -16163,7 +16702,7 @@
       <w:lvlJc w:val="left"/>
     </w:lvl>
   </w:abstractNum>
-  <w:abstractNum w:abstractNumId="55">
+  <w:abstractNum w:abstractNumId="58">
     <w:nsid w:val="428F8CC0"/>
     <w:multiLevelType w:val="singleLevel"/>
     <w:tmpl w:val="428F8CC0"/>
@@ -16175,7 +16714,7 @@
       <w:lvlJc w:val="left"/>
     </w:lvl>
   </w:abstractNum>
-  <w:abstractNum w:abstractNumId="56">
+  <w:abstractNum w:abstractNumId="59">
     <w:nsid w:val="46D2EDB9"/>
     <w:multiLevelType w:val="multilevel"/>
     <w:tmpl w:val="46D2EDB9"/>
@@ -16315,7 +16854,7 @@
       </w:rPr>
     </w:lvl>
   </w:abstractNum>
-  <w:abstractNum w:abstractNumId="57">
+  <w:abstractNum w:abstractNumId="60">
     <w:nsid w:val="4A611E4F"/>
     <w:multiLevelType w:val="singleLevel"/>
     <w:tmpl w:val="4A611E4F"/>
@@ -16327,7 +16866,7 @@
       <w:lvlJc w:val="left"/>
     </w:lvl>
   </w:abstractNum>
-  <w:abstractNum w:abstractNumId="58">
+  <w:abstractNum w:abstractNumId="61">
     <w:nsid w:val="4F2E84C6"/>
     <w:multiLevelType w:val="singleLevel"/>
     <w:tmpl w:val="4F2E84C6"/>
@@ -16339,7 +16878,7 @@
       <w:lvlJc w:val="left"/>
     </w:lvl>
   </w:abstractNum>
-  <w:abstractNum w:abstractNumId="59">
+  <w:abstractNum w:abstractNumId="62">
     <w:nsid w:val="52BBEC1D"/>
     <w:multiLevelType w:val="singleLevel"/>
     <w:tmpl w:val="52BBEC1D"/>
@@ -16351,7 +16890,7 @@
       <w:lvlJc w:val="left"/>
     </w:lvl>
   </w:abstractNum>
-  <w:abstractNum w:abstractNumId="60">
+  <w:abstractNum w:abstractNumId="63">
     <w:nsid w:val="537CC0EA"/>
     <w:multiLevelType w:val="singleLevel"/>
     <w:tmpl w:val="537CC0EA"/>
@@ -16363,7 +16902,7 @@
       <w:lvlJc w:val="left"/>
     </w:lvl>
   </w:abstractNum>
-  <w:abstractNum w:abstractNumId="61">
+  <w:abstractNum w:abstractNumId="64">
     <w:nsid w:val="5973A4FA"/>
     <w:multiLevelType w:val="singleLevel"/>
     <w:tmpl w:val="5973A4FA"/>
@@ -16375,7 +16914,7 @@
       <w:lvlJc w:val="left"/>
     </w:lvl>
   </w:abstractNum>
-  <w:abstractNum w:abstractNumId="62">
+  <w:abstractNum w:abstractNumId="65">
     <w:nsid w:val="6024D89E"/>
     <w:multiLevelType w:val="singleLevel"/>
     <w:tmpl w:val="6024D89E"/>
@@ -16387,7 +16926,7 @@
       <w:lvlJc w:val="left"/>
     </w:lvl>
   </w:abstractNum>
-  <w:abstractNum w:abstractNumId="63">
+  <w:abstractNum w:abstractNumId="66">
     <w:nsid w:val="628F328F"/>
     <w:multiLevelType w:val="singleLevel"/>
     <w:tmpl w:val="628F328F"/>
@@ -16399,7 +16938,7 @@
       <w:lvlJc w:val="left"/>
     </w:lvl>
   </w:abstractNum>
-  <w:abstractNum w:abstractNumId="64">
+  <w:abstractNum w:abstractNumId="67">
     <w:nsid w:val="62FD1C74"/>
     <w:multiLevelType w:val="singleLevel"/>
     <w:tmpl w:val="62FD1C74"/>
@@ -16411,7 +16950,7 @@
       <w:lvlJc w:val="left"/>
     </w:lvl>
   </w:abstractNum>
-  <w:abstractNum w:abstractNumId="65">
+  <w:abstractNum w:abstractNumId="68">
     <w:nsid w:val="658783AF"/>
     <w:multiLevelType w:val="singleLevel"/>
     <w:tmpl w:val="658783AF"/>
@@ -16423,7 +16962,7 @@
       <w:lvlJc w:val="left"/>
     </w:lvl>
   </w:abstractNum>
-  <w:abstractNum w:abstractNumId="66">
+  <w:abstractNum w:abstractNumId="69">
     <w:nsid w:val="67A03EFF"/>
     <w:multiLevelType w:val="singleLevel"/>
     <w:tmpl w:val="67A03EFF"/>
@@ -16435,7 +16974,7 @@
       <w:lvlJc w:val="left"/>
     </w:lvl>
   </w:abstractNum>
-  <w:abstractNum w:abstractNumId="67">
+  <w:abstractNum w:abstractNumId="70">
     <w:nsid w:val="69C1C339"/>
     <w:multiLevelType w:val="singleLevel"/>
     <w:tmpl w:val="69C1C339"/>
@@ -16447,7 +16986,7 @@
       <w:lvlJc w:val="left"/>
     </w:lvl>
   </w:abstractNum>
-  <w:abstractNum w:abstractNumId="68">
+  <w:abstractNum w:abstractNumId="71">
     <w:nsid w:val="6AF88BFE"/>
     <w:multiLevelType w:val="singleLevel"/>
     <w:tmpl w:val="6AF88BFE"/>
@@ -16459,7 +16998,7 @@
       <w:lvlJc w:val="left"/>
     </w:lvl>
   </w:abstractNum>
-  <w:abstractNum w:abstractNumId="69">
+  <w:abstractNum w:abstractNumId="72">
     <w:nsid w:val="779FF94F"/>
     <w:multiLevelType w:val="singleLevel"/>
     <w:tmpl w:val="779FF94F"/>
@@ -16471,7 +17010,7 @@
       <w:lvlJc w:val="left"/>
     </w:lvl>
   </w:abstractNum>
-  <w:abstractNum w:abstractNumId="70">
+  <w:abstractNum w:abstractNumId="73">
     <w:nsid w:val="78DA9A54"/>
     <w:multiLevelType w:val="singleLevel"/>
     <w:tmpl w:val="78DA9A54"/>
@@ -16483,7 +17022,7 @@
       <w:lvlJc w:val="left"/>
     </w:lvl>
   </w:abstractNum>
-  <w:abstractNum w:abstractNumId="71">
+  <w:abstractNum w:abstractNumId="74">
     <w:nsid w:val="7CFEE648"/>
     <w:multiLevelType w:val="singleLevel"/>
     <w:tmpl w:val="7CFEE648"/>
@@ -16495,7 +17034,7 @@
       <w:lvlJc w:val="left"/>
     </w:lvl>
   </w:abstractNum>
-  <w:abstractNum w:abstractNumId="72">
+  <w:abstractNum w:abstractNumId="75">
     <w:nsid w:val="7EE9AE89"/>
     <w:multiLevelType w:val="singleLevel"/>
     <w:tmpl w:val="7EE9AE89"/>
@@ -16508,139 +17047,139 @@
     </w:lvl>
   </w:abstractNum>
   <w:num w:numId="1">
-    <w:abstractNumId w:val="12"/>
+    <w:abstractNumId w:val="13"/>
   </w:num>
   <w:num w:numId="2">
-    <w:abstractNumId w:val="14"/>
+    <w:abstractNumId w:val="16"/>
   </w:num>
   <w:num w:numId="3">
+    <w:abstractNumId w:val="21"/>
+  </w:num>
+  <w:num w:numId="4">
+    <w:abstractNumId w:val="32"/>
+  </w:num>
+  <w:num w:numId="5">
+    <w:abstractNumId w:val="59"/>
+  </w:num>
+  <w:num w:numId="6">
+    <w:abstractNumId w:val="55"/>
+  </w:num>
+  <w:num w:numId="7">
+    <w:abstractNumId w:val="35"/>
+  </w:num>
+  <w:num w:numId="8">
     <w:abstractNumId w:val="19"/>
   </w:num>
-  <w:num w:numId="4">
-    <w:abstractNumId w:val="30"/>
-  </w:num>
-  <w:num w:numId="5">
-    <w:abstractNumId w:val="56"/>
-  </w:num>
-  <w:num w:numId="6">
-    <w:abstractNumId w:val="52"/>
-  </w:num>
-  <w:num w:numId="7">
-    <w:abstractNumId w:val="33"/>
-  </w:num>
-  <w:num w:numId="8">
-    <w:abstractNumId w:val="17"/>
-  </w:num>
   <w:num w:numId="9">
-    <w:abstractNumId w:val="18"/>
+    <w:abstractNumId w:val="20"/>
   </w:num>
   <w:num w:numId="10">
-    <w:abstractNumId w:val="43"/>
+    <w:abstractNumId w:val="46"/>
   </w:num>
   <w:num w:numId="11">
-    <w:abstractNumId w:val="64"/>
+    <w:abstractNumId w:val="67"/>
   </w:num>
   <w:num w:numId="12">
-    <w:abstractNumId w:val="34"/>
+    <w:abstractNumId w:val="36"/>
   </w:num>
   <w:num w:numId="13">
     <w:abstractNumId w:val="0"/>
   </w:num>
   <w:num w:numId="14">
-    <w:abstractNumId w:val="63"/>
+    <w:abstractNumId w:val="66"/>
   </w:num>
   <w:num w:numId="15">
-    <w:abstractNumId w:val="16"/>
+    <w:abstractNumId w:val="18"/>
   </w:num>
   <w:num w:numId="16">
-    <w:abstractNumId w:val="49"/>
+    <w:abstractNumId w:val="52"/>
   </w:num>
   <w:num w:numId="17">
-    <w:abstractNumId w:val="39"/>
+    <w:abstractNumId w:val="42"/>
   </w:num>
   <w:num w:numId="18">
-    <w:abstractNumId w:val="28"/>
+    <w:abstractNumId w:val="30"/>
   </w:num>
   <w:num w:numId="19">
-    <w:abstractNumId w:val="29"/>
+    <w:abstractNumId w:val="31"/>
   </w:num>
   <w:num w:numId="20">
-    <w:abstractNumId w:val="68"/>
+    <w:abstractNumId w:val="71"/>
   </w:num>
   <w:num w:numId="21">
-    <w:abstractNumId w:val="41"/>
+    <w:abstractNumId w:val="44"/>
   </w:num>
   <w:num w:numId="22">
-    <w:abstractNumId w:val="72"/>
+    <w:abstractNumId w:val="75"/>
   </w:num>
   <w:num w:numId="23">
-    <w:abstractNumId w:val="71"/>
+    <w:abstractNumId w:val="74"/>
   </w:num>
   <w:num w:numId="24">
-    <w:abstractNumId w:val="60"/>
+    <w:abstractNumId w:val="63"/>
   </w:num>
   <w:num w:numId="25">
     <w:abstractNumId w:val="8"/>
   </w:num>
   <w:num w:numId="26">
-    <w:abstractNumId w:val="35"/>
+    <w:abstractNumId w:val="37"/>
   </w:num>
   <w:num w:numId="27">
-    <w:abstractNumId w:val="32"/>
+    <w:abstractNumId w:val="34"/>
   </w:num>
   <w:num w:numId="28">
-    <w:abstractNumId w:val="65"/>
+    <w:abstractNumId w:val="68"/>
   </w:num>
   <w:num w:numId="29">
+    <w:abstractNumId w:val="51"/>
+  </w:num>
+  <w:num w:numId="30">
+    <w:abstractNumId w:val="22"/>
+  </w:num>
+  <w:num w:numId="31">
+    <w:abstractNumId w:val="12"/>
+  </w:num>
+  <w:num w:numId="32">
+    <w:abstractNumId w:val="56"/>
+  </w:num>
+  <w:num w:numId="33">
     <w:abstractNumId w:val="48"/>
   </w:num>
-  <w:num w:numId="30">
-    <w:abstractNumId w:val="20"/>
-  </w:num>
-  <w:num w:numId="31">
-    <w:abstractNumId w:val="11"/>
-  </w:num>
-  <w:num w:numId="32">
-    <w:abstractNumId w:val="53"/>
-  </w:num>
-  <w:num w:numId="33">
-    <w:abstractNumId w:val="45"/>
-  </w:num>
   <w:num w:numId="34">
-    <w:abstractNumId w:val="69"/>
+    <w:abstractNumId w:val="72"/>
   </w:num>
   <w:num w:numId="35">
-    <w:abstractNumId w:val="27"/>
+    <w:abstractNumId w:val="29"/>
   </w:num>
   <w:num w:numId="36">
-    <w:abstractNumId w:val="37"/>
+    <w:abstractNumId w:val="39"/>
   </w:num>
   <w:num w:numId="37">
     <w:abstractNumId w:val="3"/>
   </w:num>
   <w:num w:numId="38">
-    <w:abstractNumId w:val="51"/>
+    <w:abstractNumId w:val="54"/>
   </w:num>
   <w:num w:numId="39">
-    <w:abstractNumId w:val="31"/>
+    <w:abstractNumId w:val="33"/>
   </w:num>
   <w:num w:numId="40">
-    <w:abstractNumId w:val="62"/>
+    <w:abstractNumId w:val="65"/>
   </w:num>
   <w:num w:numId="41">
-    <w:abstractNumId w:val="55"/>
+    <w:abstractNumId w:val="58"/>
   </w:num>
   <w:num w:numId="42">
-    <w:abstractNumId w:val="57"/>
+    <w:abstractNumId w:val="60"/>
   </w:num>
   <w:num w:numId="43">
     <w:abstractNumId w:val="6"/>
   </w:num>
   <w:num w:numId="44">
-    <w:abstractNumId w:val="15"/>
+    <w:abstractNumId w:val="17"/>
   </w:num>
   <w:num w:numId="45">
-    <w:abstractNumId w:val="23"/>
+    <w:abstractNumId w:val="25"/>
   </w:num>
   <w:num w:numId="46">
     <w:abstractNumId w:val="10"/>
@@ -16649,82 +17188,91 @@
     <w:abstractNumId w:val="2"/>
   </w:num>
   <w:num w:numId="48">
-    <w:abstractNumId w:val="46"/>
+    <w:abstractNumId w:val="49"/>
   </w:num>
   <w:num w:numId="49">
     <w:abstractNumId w:val="5"/>
   </w:num>
   <w:num w:numId="50">
-    <w:abstractNumId w:val="67"/>
+    <w:abstractNumId w:val="70"/>
   </w:num>
   <w:num w:numId="51">
-    <w:abstractNumId w:val="47"/>
+    <w:abstractNumId w:val="50"/>
   </w:num>
   <w:num w:numId="52">
     <w:abstractNumId w:val="4"/>
   </w:num>
   <w:num w:numId="53">
-    <w:abstractNumId w:val="59"/>
+    <w:abstractNumId w:val="62"/>
   </w:num>
   <w:num w:numId="54">
-    <w:abstractNumId w:val="38"/>
+    <w:abstractNumId w:val="40"/>
   </w:num>
   <w:num w:numId="55">
-    <w:abstractNumId w:val="26"/>
+    <w:abstractNumId w:val="28"/>
   </w:num>
   <w:num w:numId="56">
-    <w:abstractNumId w:val="25"/>
+    <w:abstractNumId w:val="27"/>
   </w:num>
   <w:num w:numId="57">
     <w:abstractNumId w:val="1"/>
   </w:num>
   <w:num w:numId="58">
-    <w:abstractNumId w:val="44"/>
+    <w:abstractNumId w:val="41"/>
   </w:num>
   <w:num w:numId="59">
-    <w:abstractNumId w:val="42"/>
+    <w:abstractNumId w:val="14"/>
   </w:num>
   <w:num w:numId="60">
+    <w:abstractNumId w:val="11"/>
+  </w:num>
+  <w:num w:numId="61">
+    <w:abstractNumId w:val="47"/>
+  </w:num>
+  <w:num w:numId="62">
+    <w:abstractNumId w:val="45"/>
+  </w:num>
+  <w:num w:numId="63">
+    <w:abstractNumId w:val="26"/>
+  </w:num>
+  <w:num w:numId="64">
+    <w:abstractNumId w:val="23"/>
+  </w:num>
+  <w:num w:numId="65">
+    <w:abstractNumId w:val="53"/>
+  </w:num>
+  <w:num w:numId="66">
+    <w:abstractNumId w:val="7"/>
+  </w:num>
+  <w:num w:numId="67">
+    <w:abstractNumId w:val="61"/>
+  </w:num>
+  <w:num w:numId="68">
+    <w:abstractNumId w:val="73"/>
+  </w:num>
+  <w:num w:numId="69">
+    <w:abstractNumId w:val="9"/>
+  </w:num>
+  <w:num w:numId="70">
+    <w:abstractNumId w:val="69"/>
+  </w:num>
+  <w:num w:numId="71">
+    <w:abstractNumId w:val="43"/>
+  </w:num>
+  <w:num w:numId="72">
+    <w:abstractNumId w:val="64"/>
+  </w:num>
+  <w:num w:numId="73">
     <w:abstractNumId w:val="24"/>
   </w:num>
-  <w:num w:numId="61">
-    <w:abstractNumId w:val="21"/>
+  <w:num w:numId="74">
+    <w:abstractNumId w:val="38"/>
   </w:num>
-  <w:num w:numId="62">
-    <w:abstractNumId w:val="50"/>
+  <w:num w:numId="75">
+    <w:abstractNumId w:val="15"/>
   </w:num>
-  <w:num w:numId="63">
-    <w:abstractNumId w:val="7"/>
-  </w:num>
-  <w:num w:numId="64">
-    <w:abstractNumId w:val="58"/>
-  </w:num>
-  <w:num w:numId="65">
-    <w:abstractNumId w:val="70"/>
-  </w:num>
-  <w:num w:numId="66">
-    <w:abstractNumId w:val="9"/>
-  </w:num>
-  <w:num w:numId="67">
-    <w:abstractNumId w:val="66"/>
-  </w:num>
-  <w:num w:numId="68">
-    <w:abstractNumId w:val="40"/>
-  </w:num>
-  <w:num w:numId="69">
-    <w:abstractNumId w:val="61"/>
-  </w:num>
-  <w:num w:numId="70">
-    <w:abstractNumId w:val="22"/>
-  </w:num>
-  <w:num w:numId="71">
-    <w:abstractNumId w:val="36"/>
-  </w:num>
-  <w:num w:numId="72">
-    <w:abstractNumId w:val="13"/>
-  </w:num>
-  <w:num w:numId="73">
-    <w:abstractNumId w:val="54"/>
+  <w:num w:numId="76">
+    <w:abstractNumId w:val="57"/>
   </w:num>
 </w:numbering>
 </file>

</xml_diff>

<commit_message>
Sửa lỗi chính tả BFD, Đặc tả, hoàn chỉnh Class
</commit_message>
<xml_diff>
--- a/Diagrams/UsecaseDiagram/DacTa/DacTaUsecase.docx
+++ b/Diagrams/UsecaseDiagram/DacTa/DacTaUsecase.docx
@@ -191,12 +191,25 @@
           <w:vertAlign w:val="baseline"/>
           <w:lang w:val="en-US"/>
         </w:rPr>
-        <w:t>Lắng nghe và khám phá: Hệ thống cung cấp công cụ tìm kiếm mạnh mẽ, cho phép tìm kiếm bài hát, nghệ sĩ dựa trên từ khóa. Sau khi chọn được bài hát ưng ý, người dùng có thể nghe nhạc với giao diện điều khiển trình phát nhạc đầy đủ.</w:t>
+        <w:t>K</w:t>
+      </w:r>
+      <w:bookmarkStart w:id="0" w:name="_GoBack"/>
+      <w:bookmarkEnd w:id="0"/>
+      <w:r>
+        <w:rPr>
+          <w:rFonts w:hint="default"/>
+          <w:sz w:val="32"/>
+          <w:szCs w:val="32"/>
+          <w:vertAlign w:val="baseline"/>
+          <w:lang w:val="en-US"/>
+        </w:rPr>
+        <w:t>hám phá: Hệ thống cung cấp công cụ tìm kiếm mạnh mẽ, cho phép tìm kiếm bài hát, nghệ sĩ dựa trên từ khóa. Sau khi chọn được bài hát ưng ý, người dùng có thể nghe nhạc với giao diện điều khiển trình phát nhạc đầy đủ.</w:t>
       </w:r>
     </w:p>
     <w:p>
       <w:pPr>
         <w:numPr>
+          <w:ilvl w:val="0"/>
           <w:numId w:val="0"/>
         </w:numPr>
         <w:ind w:leftChars="0"/>
@@ -515,19 +528,7 @@
           <w:vertAlign w:val="baseline"/>
           <w:lang w:val="en-US"/>
         </w:rPr>
-        <w:t>Quản lý chi tiết Playlist cá nhân</w:t>
-      </w:r>
-      <w:bookmarkStart w:id="0" w:name="_GoBack"/>
-      <w:bookmarkEnd w:id="0"/>
-      <w:r>
-        <w:rPr>
-          <w:rFonts w:hint="default"/>
-          <w:sz w:val="32"/>
-          <w:szCs w:val="32"/>
-          <w:vertAlign w:val="baseline"/>
-          <w:lang w:val="en-US"/>
-        </w:rPr>
-        <w:t>: Người dùng có thể thay đổi tên, ảnh đại diện, mô tả của playlist, cũng như thêm hoặc xóa các bài hát khỏi playlist đó.</w:t>
+        <w:t>Quản lý chi tiết Playlist cá nhân: Người dùng có thể thay đổi tên, ảnh đại diện, mô tả của playlist, cũng như thêm hoặc xóa các bài hát khỏi playlist đó.</w:t>
       </w:r>
     </w:p>
     <w:p>
@@ -970,6 +971,7 @@
     <w:p>
       <w:pPr>
         <w:numPr>
+          <w:ilvl w:val="0"/>
           <w:numId w:val="0"/>
         </w:numPr>
         <w:ind w:left="420" w:leftChars="0"/>
@@ -2815,12 +2817,6 @@
             <w:insideH w:val="single" w:color="auto" w:sz="4" w:space="0"/>
             <w:insideV w:val="single" w:color="auto" w:sz="4" w:space="0"/>
           </w:tblBorders>
-          <w:tblCellMar>
-            <w:top w:w="0" w:type="dxa"/>
-            <w:left w:w="108" w:type="dxa"/>
-            <w:bottom w:w="0" w:type="dxa"/>
-            <w:right w:w="108" w:type="dxa"/>
-          </w:tblCellMar>
         </w:tblPrEx>
         <w:tc>
           <w:tcPr>
@@ -4971,12 +4967,6 @@
             <w:insideH w:val="single" w:color="auto" w:sz="4" w:space="0"/>
             <w:insideV w:val="single" w:color="auto" w:sz="4" w:space="0"/>
           </w:tblBorders>
-          <w:tblCellMar>
-            <w:top w:w="0" w:type="dxa"/>
-            <w:left w:w="108" w:type="dxa"/>
-            <w:bottom w:w="0" w:type="dxa"/>
-            <w:right w:w="108" w:type="dxa"/>
-          </w:tblCellMar>
         </w:tblPrEx>
         <w:tc>
           <w:tcPr>
@@ -14184,12 +14174,6 @@
             <w:insideH w:val="single" w:color="auto" w:sz="4" w:space="0"/>
             <w:insideV w:val="single" w:color="auto" w:sz="4" w:space="0"/>
           </w:tblBorders>
-          <w:tblCellMar>
-            <w:top w:w="0" w:type="dxa"/>
-            <w:left w:w="108" w:type="dxa"/>
-            <w:bottom w:w="0" w:type="dxa"/>
-            <w:right w:w="108" w:type="dxa"/>
-          </w:tblCellMar>
         </w:tblPrEx>
         <w:tc>
           <w:tcPr>

</xml_diff>

<commit_message>
Sửa đặc tả UC (Chia sẻ lên platform thôi,...), đơn giản hoá Sequence, sửa CD và thêm mô tả CD
</commit_message>
<xml_diff>
--- a/Diagrams/UsecaseDiagram/DacTa/DacTaUsecase.docx
+++ b/Diagrams/UsecaseDiagram/DacTa/DacTaUsecase.docx
@@ -191,19 +191,7 @@
           <w:vertAlign w:val="baseline"/>
           <w:lang w:val="en-US"/>
         </w:rPr>
-        <w:t>K</w:t>
-      </w:r>
-      <w:bookmarkStart w:id="0" w:name="_GoBack"/>
-      <w:bookmarkEnd w:id="0"/>
-      <w:r>
-        <w:rPr>
-          <w:rFonts w:hint="default"/>
-          <w:sz w:val="32"/>
-          <w:szCs w:val="32"/>
-          <w:vertAlign w:val="baseline"/>
-          <w:lang w:val="en-US"/>
-        </w:rPr>
-        <w:t>hám phá: Hệ thống cung cấp công cụ tìm kiếm mạnh mẽ, cho phép tìm kiếm bài hát, nghệ sĩ dựa trên từ khóa. Sau khi chọn được bài hát ưng ý, người dùng có thể nghe nhạc với giao diện điều khiển trình phát nhạc đầy đủ.</w:t>
+        <w:t>Khám phá: Hệ thống cung cấp công cụ tìm kiếm mạnh mẽ, cho phép tìm kiếm bài hát, nghệ sĩ dựa trên từ khóa. Sau khi chọn được bài hát ưng ý, người dùng có thể nghe nhạc với giao diện điều khiển trình phát nhạc đầy đủ.</w:t>
       </w:r>
     </w:p>
     <w:p>
@@ -2306,7 +2294,7 @@
                 <w:vertAlign w:val="baseline"/>
                 <w:lang w:val="en-US"/>
               </w:rPr>
-              <w:t>Hệ thống hiện giao diện gồm danh sách các báo cáo vi phạm và các nút chức năng để Admin chọn thành công.</w:t>
+              <w:t>Hệ thống hiện giao diện Quản lý báo cáo vi phạm thành công.</w:t>
             </w:r>
           </w:p>
           <w:p>
@@ -2362,7 +2350,7 @@
                 <w:vertAlign w:val="baseline"/>
                 <w:lang w:val="en-US"/>
               </w:rPr>
-              <w:t>Admin đánh giá nội dung báo cáo.</w:t>
+              <w:t>Admin chọn 1 trong 3 phương thức xử lý và nhấn Nút: Ẩn bài hát vi phạm, gửi cảnh cáo đến người vi phạm hoặc bỏ qua nếu báo cáo không đúng.</w:t>
             </w:r>
           </w:p>
           <w:p>
@@ -2390,7 +2378,7 @@
                 <w:vertAlign w:val="baseline"/>
                 <w:lang w:val="en-US"/>
               </w:rPr>
-              <w:t>Admin chọn 1 trong 3 phương thức xử lý: Ẩn bài hát vi phạm, gửi cảnh cáo đến người vi phạm hoặc bỏ qua nếu báo cáo không đúng.</w:t>
+              <w:t>Hệ thống ghi nhận phương thức xử lý của Admin và trạng thái của báo cáo từ “Chưa xử lý” được cập nhật thành “Đã xử lý” thành công.</w:t>
             </w:r>
           </w:p>
           <w:p>
@@ -2418,7 +2406,7 @@
                 <w:vertAlign w:val="baseline"/>
                 <w:lang w:val="en-US"/>
               </w:rPr>
-              <w:t>Hệ thống ghi nhận phương thức xử lý của Admin và trạng thái của báo cáo từ “Chưa xử lý” được cập nhật thành “Đã xử lý” vào cơ sở dữ liệu thành công.</w:t>
+              <w:t>Hệ thống thực hiện phương thức xử lý báo cáo mà Admin đã chọn đối với bài hát hoặc người dùng vi phạm thành công.</w:t>
             </w:r>
           </w:p>
           <w:p>
@@ -2446,7 +2434,7 @@
                 <w:vertAlign w:val="baseline"/>
                 <w:lang w:val="en-US"/>
               </w:rPr>
-              <w:t>Hệ thống thực hiện phương thức xử lý báo cáo mà Admin đã chọn đối với bài hát hoặc người dùng vi phạm thành công.</w:t>
+              <w:t>Hệ thống thông báo thành công cho Admin.</w:t>
             </w:r>
           </w:p>
           <w:p>
@@ -2502,7 +2490,7 @@
                 <w:vertAlign w:val="baseline"/>
                 <w:lang w:val="en-US"/>
               </w:rPr>
-              <w:t>Hệ thống thông báo đến người báo cáo và người vi phạm thành công.</w:t>
+              <w:t>Hệ thống thông báo đến người báo cáo và người đăng bài hát bị báo cáo thành công.</w:t>
             </w:r>
           </w:p>
         </w:tc>
@@ -2575,7 +2563,7 @@
                 <w:vertAlign w:val="baseline"/>
                 <w:lang w:val="en-US"/>
               </w:rPr>
-              <w:t>5.1. Nếu hệ thống ghi nhận hoặc cập nhật trạng thái của báo cáo không thành công thì hệ thống vẫn giữ trạng thái của báo cáo là “Chưa xử lý” và thông báo “Cập nhật trạng thái của báo cáo thất bại” đến Admin.</w:t>
+              <w:t>4.1. Nếu hệ thống ghi nhận hoặc cập nhật trạng thái của báo cáo không thành công thì hệ thống vẫn giữ trạng thái của báo cáo là “Chưa xử lý” và thông báo “Cập nhật trạng thái của báo cáo thất bại” đến Admin.</w:t>
             </w:r>
           </w:p>
           <w:p>
@@ -2602,7 +2590,7 @@
                 <w:vertAlign w:val="baseline"/>
                 <w:lang w:val="en-US"/>
               </w:rPr>
-              <w:t>6.1 Nếu hệ thống thực hiện phương thức xử lý không thành công thì hệ thống thông báo “Xử lý báo cáo thất bại” đến Admin.</w:t>
+              <w:t>5.1 Nếu hệ thống thực hiện phương thức xử lý không thành công thì hệ thống thông báo “Xử lý báo cáo thất bại” đến Admin.</w:t>
             </w:r>
           </w:p>
         </w:tc>
@@ -2817,6 +2805,12 @@
             <w:insideH w:val="single" w:color="auto" w:sz="4" w:space="0"/>
             <w:insideV w:val="single" w:color="auto" w:sz="4" w:space="0"/>
           </w:tblBorders>
+          <w:tblCellMar>
+            <w:top w:w="0" w:type="dxa"/>
+            <w:left w:w="108" w:type="dxa"/>
+            <w:bottom w:w="0" w:type="dxa"/>
+            <w:right w:w="108" w:type="dxa"/>
+          </w:tblCellMar>
         </w:tblPrEx>
         <w:tc>
           <w:tcPr>
@@ -2915,7 +2909,7 @@
                 <w:vertAlign w:val="baseline"/>
                 <w:lang w:val="en-US"/>
               </w:rPr>
-              <w:t>Hệ thống hiện giao diện danh sách tài khoản người dùng và nút Khoá thành công.</w:t>
+              <w:t>Hệ thống hiện giao diện Quản lý tài khoản người dùng thành công.</w:t>
             </w:r>
           </w:p>
           <w:p>
@@ -2999,7 +2993,35 @@
                 <w:vertAlign w:val="baseline"/>
                 <w:lang w:val="en-US"/>
               </w:rPr>
-              <w:t>Hệ thống ghi nhận trạng thái mới (Khoá/Mở) của tài khoản vào cơ sở dữ liệu thành công.</w:t>
+              <w:t>Hệ thống ghi nhận trạng thái mới (Khoá/Mở) của tài khoản  thành công.</w:t>
+            </w:r>
+          </w:p>
+          <w:p>
+            <w:pPr>
+              <w:widowControl w:val="0"/>
+              <w:numPr>
+                <w:ilvl w:val="0"/>
+                <w:numId w:val="9"/>
+              </w:numPr>
+              <w:ind w:left="0" w:leftChars="0" w:firstLine="0" w:firstLineChars="0"/>
+              <w:jc w:val="both"/>
+              <w:rPr>
+                <w:rFonts w:hint="default"/>
+                <w:sz w:val="32"/>
+                <w:szCs w:val="32"/>
+                <w:vertAlign w:val="baseline"/>
+                <w:lang w:val="en-US"/>
+              </w:rPr>
+            </w:pPr>
+            <w:r>
+              <w:rPr>
+                <w:rFonts w:hint="default"/>
+                <w:sz w:val="32"/>
+                <w:szCs w:val="32"/>
+                <w:vertAlign w:val="baseline"/>
+                <w:lang w:val="en-US"/>
+              </w:rPr>
+              <w:t>Hệ thống thông báo thành công cho Admin.</w:t>
             </w:r>
           </w:p>
           <w:p>
@@ -3420,7 +3442,7 @@
                 <w:vertAlign w:val="baseline"/>
                 <w:lang w:val="en-US"/>
               </w:rPr>
-              <w:t>Hệ thống hiện giao diện gồm danh sách bài hát cá nhân và các nút chức năng để người dùng chọn thành công.</w:t>
+              <w:t>Hệ thống hiện giao diện Quản lý bài hát cá nhân thành công.</w:t>
             </w:r>
           </w:p>
           <w:p>
@@ -3560,7 +3582,7 @@
                 <w:vertAlign w:val="baseline"/>
                 <w:lang w:val="en-US"/>
               </w:rPr>
-              <w:t>3.3/ Người dùng chọn 1 bài hát cần ẩn và chọn Ẩn/Hiện bài hát. Hệ thống ghi nhận trạng thái của bài hát thành “Đã ẩn” và “Đã hiện” nếu đang bị ẩn trong danh sách bài hát vào cơ sở dữ liệu thành công.</w:t>
+              <w:t>3.3/ Người dùng chọn 1 bài hát cần ẩn và chọn Ẩn/Hiện bài hát. Hệ thống ghi nhận trạng thái của bài hát thành “Đã ẩn” và “Đã hiện” nếu đang bị ẩn trong danh sách bài hát và thông báo thành công cho người dùng.</w:t>
             </w:r>
           </w:p>
           <w:p>
@@ -3661,7 +3683,7 @@
                 <w:vertAlign w:val="baseline"/>
                 <w:lang w:val="en-US"/>
               </w:rPr>
-              <w:t>3.3.1 Nếu hệ thống ghi nhận trạng thái của bài hát không thành công thì thông báo “Cập nhật trạng thái của bài hát thất bại” đến người dùng.</w:t>
+              <w:t>3.3.1 Nếu hệ thống ghi nhận trạng thái của bài hát không thành công thì hiển thị “Cập nhật trạng thái của bài hát thất bại, vui lòng thử lại” đến người dùng.</w:t>
             </w:r>
           </w:p>
         </w:tc>
@@ -4092,7 +4114,34 @@
                 <w:vertAlign w:val="baseline"/>
                 <w:lang w:val="en-US"/>
               </w:rPr>
-              <w:t>Hệ thống ghi nhận bài hát mới vào cơ sở dữ liệu thành công.</w:t>
+              <w:t>Hệ thống ghi nhận bài hát mới  thành công.</w:t>
+            </w:r>
+          </w:p>
+          <w:p>
+            <w:pPr>
+              <w:widowControl w:val="0"/>
+              <w:numPr>
+                <w:ilvl w:val="0"/>
+                <w:numId w:val="15"/>
+              </w:numPr>
+              <w:jc w:val="both"/>
+              <w:rPr>
+                <w:rFonts w:hint="default"/>
+                <w:sz w:val="32"/>
+                <w:szCs w:val="32"/>
+                <w:vertAlign w:val="baseline"/>
+                <w:lang w:val="en-US"/>
+              </w:rPr>
+            </w:pPr>
+            <w:r>
+              <w:rPr>
+                <w:rFonts w:hint="default"/>
+                <w:sz w:val="32"/>
+                <w:szCs w:val="32"/>
+                <w:vertAlign w:val="baseline"/>
+                <w:lang w:val="en-US"/>
+              </w:rPr>
+              <w:t>Hệ thống thông báo tạo thành công.</w:t>
             </w:r>
           </w:p>
           <w:p>
@@ -4192,7 +4241,7 @@
                 <w:vertAlign w:val="baseline"/>
                 <w:lang w:val="en-US"/>
               </w:rPr>
-              <w:t>3.1 Nếu hệ thống ghi nhận bài hát mới không thành công thì hệ thống sẽ thông báo “Tải lên bài hát thất bại” đến người dùng.</w:t>
+              <w:t>3.1 Nếu hệ thống ghi nhận bài hát mới không thành công thì hệ thống sẽ thông báo “Tải lên bài hát thất bại, vui lòng thử lại” đến người dùng.</w:t>
             </w:r>
           </w:p>
         </w:tc>
@@ -4540,7 +4589,7 @@
                 <w:vertAlign w:val="baseline"/>
                 <w:lang w:val="en-US"/>
               </w:rPr>
-              <w:t>Hệ thống hiện form để người dùng sửa thông tin bài hát (Ảnh nền, tên bài hát, thể loại, mô tả bài hát,….) và file âm nhạc thành công (có sẵn thông tin hiện tại của bài hát).</w:t>
+              <w:t>Hệ thống hiện form để người dùng sửa thông tin bài hát (Ảnh nền, tên bài hát, thể loại, mô tả bài hát,….) và file âm nhạc thành công.</w:t>
             </w:r>
           </w:p>
           <w:p>
@@ -4568,7 +4617,7 @@
                 <w:vertAlign w:val="baseline"/>
                 <w:lang w:val="en-US"/>
               </w:rPr>
-              <w:t>Người dùng thay đổi thông tin bài hát hoặc tải lên file âm nhạc mới và chọn Lưu.</w:t>
+              <w:t>Người dùng nhập thông tin mới và chọn Lưu.</w:t>
             </w:r>
           </w:p>
           <w:p>
@@ -4596,7 +4645,35 @@
                 <w:vertAlign w:val="baseline"/>
                 <w:lang w:val="en-US"/>
               </w:rPr>
-              <w:t>Hệ thống ghi nhận thông tin mới của bài hát đó vào cơ sở dữ liệu thành công.</w:t>
+              <w:t>Hệ thống ghi nhận thông tin mới của bài hát đó thành công.</w:t>
+            </w:r>
+          </w:p>
+          <w:p>
+            <w:pPr>
+              <w:widowControl w:val="0"/>
+              <w:numPr>
+                <w:ilvl w:val="0"/>
+                <w:numId w:val="18"/>
+              </w:numPr>
+              <w:ind w:left="0" w:leftChars="0" w:firstLine="0" w:firstLineChars="0"/>
+              <w:jc w:val="both"/>
+              <w:rPr>
+                <w:rFonts w:hint="default"/>
+                <w:sz w:val="32"/>
+                <w:szCs w:val="32"/>
+                <w:vertAlign w:val="baseline"/>
+                <w:lang w:val="en-US"/>
+              </w:rPr>
+            </w:pPr>
+            <w:r>
+              <w:rPr>
+                <w:rFonts w:hint="default"/>
+                <w:sz w:val="32"/>
+                <w:szCs w:val="32"/>
+                <w:vertAlign w:val="baseline"/>
+                <w:lang w:val="en-US"/>
+              </w:rPr>
+              <w:t>Hệ thống thông báo sửa thành công.</w:t>
             </w:r>
           </w:p>
           <w:p>
@@ -4697,7 +4774,7 @@
                 <w:vertAlign w:val="baseline"/>
                 <w:lang w:val="en-US"/>
               </w:rPr>
-              <w:t>3.1 Nếu hệ thống ghi nhận thông tin mới của bài hát đó không thành công thì hệ thống sẽ thông báo “Cập nhật thông tin bài hát thất bại” đến người dùng.</w:t>
+              <w:t>3.1 Nếu hệ thống ghi nhận thông tin mới của bài hát đó không thành công thì hệ thống sẽ thông báo “Sửa thông tin bài hát thất bại, vui lòng thử lại” đến người dùng.</w:t>
             </w:r>
           </w:p>
         </w:tc>
@@ -4967,6 +5044,12 @@
             <w:insideH w:val="single" w:color="auto" w:sz="4" w:space="0"/>
             <w:insideV w:val="single" w:color="auto" w:sz="4" w:space="0"/>
           </w:tblBorders>
+          <w:tblCellMar>
+            <w:top w:w="0" w:type="dxa"/>
+            <w:left w:w="108" w:type="dxa"/>
+            <w:bottom w:w="0" w:type="dxa"/>
+            <w:right w:w="108" w:type="dxa"/>
+          </w:tblCellMar>
         </w:tblPrEx>
         <w:tc>
           <w:tcPr>
@@ -5066,7 +5149,7 @@
                 <w:vertAlign w:val="baseline"/>
                 <w:lang w:val="en-US"/>
               </w:rPr>
-              <w:t>Hệ thống hiện form để người dùng đưa lý do về bài hát cần báo cáo thành công (có sẵn tên hiện tại của bài hát).</w:t>
+              <w:t>Hệ thống hiện form để người dùng nhập lý do về bài hát cần báo cáo thành công.</w:t>
             </w:r>
           </w:p>
           <w:p>
@@ -5122,7 +5205,7 @@
                 <w:vertAlign w:val="baseline"/>
                 <w:lang w:val="en-US"/>
               </w:rPr>
-              <w:t>Hệ thống ghi nhận báo cáo vào cơ sở dữ liệu và đưa vào danh sách báo cáo vi phạm của Admin thành công.</w:t>
+              <w:t>Hệ thống ghi nhận báo cáo thành công.</w:t>
             </w:r>
           </w:p>
           <w:p>
@@ -5598,7 +5681,7 @@
                 <w:vertAlign w:val="baseline"/>
                 <w:lang w:val="en-US"/>
               </w:rPr>
-              <w:t>Hệ thống hiện giao diện gồm danh sách nghệ sĩ và nút Theo dõi thành công.</w:t>
+              <w:t>Hệ thống hiện giao diện Khám phá nghệ sĩ thành công.</w:t>
             </w:r>
           </w:p>
           <w:p>
@@ -5679,7 +5762,7 @@
                 <w:vertAlign w:val="baseline"/>
                 <w:lang w:val="en-US"/>
               </w:rPr>
-              <w:t>Hệ thống sẽ cập nhật trạng thái của nghệ sĩ đó đối với người dùng thành “Đang theo dõi”/”Không theo dõi” trong cơ sở dữ liệu thành công.</w:t>
+              <w:t>Hệ thống ghi nhận trạng thái của nghệ sĩ thành công.</w:t>
             </w:r>
           </w:p>
           <w:p>
@@ -5706,7 +5789,34 @@
                 <w:vertAlign w:val="baseline"/>
                 <w:lang w:val="en-US"/>
               </w:rPr>
-              <w:t>Hệ thống sẽ ghi nhận vào cơ sở dữ liệu và đưa/bỏ nghệ sĩ đó vào/ra danh sách nghệ sĩ đã theo dõi của người dùng thành công.</w:t>
+              <w:t>Hệ thống thông báo theo dõi thành công.</w:t>
+            </w:r>
+          </w:p>
+          <w:p>
+            <w:pPr>
+              <w:widowControl w:val="0"/>
+              <w:numPr>
+                <w:ilvl w:val="0"/>
+                <w:numId w:val="24"/>
+              </w:numPr>
+              <w:jc w:val="both"/>
+              <w:rPr>
+                <w:rFonts w:hint="default"/>
+                <w:sz w:val="32"/>
+                <w:szCs w:val="32"/>
+                <w:vertAlign w:val="baseline"/>
+                <w:lang w:val="en-US"/>
+              </w:rPr>
+            </w:pPr>
+            <w:r>
+              <w:rPr>
+                <w:rFonts w:hint="default"/>
+                <w:sz w:val="32"/>
+                <w:szCs w:val="32"/>
+                <w:vertAlign w:val="baseline"/>
+                <w:lang w:val="en-US"/>
+              </w:rPr>
+              <w:t>Hệ thống cập nhật danh sách nghệ sĩ thành công.</w:t>
             </w:r>
           </w:p>
         </w:tc>
@@ -5759,54 +5869,56 @@
             <w:pPr>
               <w:widowControl w:val="0"/>
               <w:numPr>
-                <w:ilvl w:val="1"/>
-                <w:numId w:val="18"/>
-              </w:numPr>
-              <w:jc w:val="both"/>
-              <w:rPr>
-                <w:rFonts w:hint="default"/>
-                <w:sz w:val="32"/>
-                <w:szCs w:val="32"/>
-                <w:vertAlign w:val="baseline"/>
-                <w:lang w:val="en-US"/>
-              </w:rPr>
-            </w:pPr>
-            <w:r>
-              <w:rPr>
-                <w:rFonts w:hint="default"/>
-                <w:sz w:val="32"/>
-                <w:szCs w:val="32"/>
-                <w:vertAlign w:val="baseline"/>
-                <w:lang w:val="en-US"/>
-              </w:rPr>
-              <w:t>Nếu hệ thống cập nhật trạng thái của nghệ sĩ đó đối với người dùng thành “Đang theo dõi” không thành công thì  hệ thống sẽ thông báo “Theo dõi thất bại, vui lòng thử lại” đến người dùng.</w:t>
-            </w:r>
-          </w:p>
-          <w:p>
-            <w:pPr>
-              <w:widowControl w:val="0"/>
-              <w:numPr>
-                <w:ilvl w:val="1"/>
-                <w:numId w:val="18"/>
-              </w:numPr>
-              <w:jc w:val="both"/>
-              <w:rPr>
-                <w:rFonts w:hint="default"/>
-                <w:sz w:val="32"/>
-                <w:szCs w:val="32"/>
-                <w:vertAlign w:val="baseline"/>
-                <w:lang w:val="en-US"/>
-              </w:rPr>
-            </w:pPr>
-            <w:r>
-              <w:rPr>
-                <w:rFonts w:hint="default"/>
-                <w:sz w:val="32"/>
-                <w:szCs w:val="32"/>
-                <w:vertAlign w:val="baseline"/>
-                <w:lang w:val="en-US"/>
-              </w:rPr>
-              <w:t xml:space="preserve"> Nếu hệ thống cập nhật trạng thái của nghệ sĩ đó đối với người dùng thành “Không theo dõi” không thành công thì  hệ thống sẽ thông báo “Bỏ theo dõi thất bại, vui lòng thử lại” đến người dùng.</w:t>
+                <w:ilvl w:val="0"/>
+                <w:numId w:val="0"/>
+              </w:numPr>
+              <w:ind w:leftChars="0"/>
+              <w:jc w:val="both"/>
+              <w:rPr>
+                <w:rFonts w:hint="default"/>
+                <w:sz w:val="32"/>
+                <w:szCs w:val="32"/>
+                <w:vertAlign w:val="baseline"/>
+                <w:lang w:val="en-US"/>
+              </w:rPr>
+            </w:pPr>
+            <w:r>
+              <w:rPr>
+                <w:rFonts w:hint="default"/>
+                <w:sz w:val="32"/>
+                <w:szCs w:val="32"/>
+                <w:vertAlign w:val="baseline"/>
+                <w:lang w:val="en-US"/>
+              </w:rPr>
+              <w:t>4.1 Nếu hệ thống ghi nhận trạng thái của nghệ sĩ đó đối với người dùng thành “Đang theo dõi” không thành công thì  hệ thống sẽ thông báo “Theo dõi thất bại, vui lòng thử lại” đến người dùng.</w:t>
+            </w:r>
+          </w:p>
+          <w:p>
+            <w:pPr>
+              <w:widowControl w:val="0"/>
+              <w:numPr>
+                <w:ilvl w:val="0"/>
+                <w:numId w:val="0"/>
+              </w:numPr>
+              <w:ind w:leftChars="0"/>
+              <w:jc w:val="both"/>
+              <w:rPr>
+                <w:rFonts w:hint="default"/>
+                <w:sz w:val="32"/>
+                <w:szCs w:val="32"/>
+                <w:vertAlign w:val="baseline"/>
+                <w:lang w:val="en-US"/>
+              </w:rPr>
+            </w:pPr>
+            <w:r>
+              <w:rPr>
+                <w:rFonts w:hint="default"/>
+                <w:sz w:val="32"/>
+                <w:szCs w:val="32"/>
+                <w:vertAlign w:val="baseline"/>
+                <w:lang w:val="en-US"/>
+              </w:rPr>
+              <w:t>4.2 Nếu hệ thống ghi nhận trạng thái của nghệ sĩ đó đối với người dùng thành “Không theo dõi” không thành công thì  hệ thống sẽ thông báo “Bỏ theo dõi thất bại, vui lòng thử lại” đến người dùng.</w:t>
             </w:r>
           </w:p>
         </w:tc>
@@ -6126,7 +6238,7 @@
                 <w:vertAlign w:val="baseline"/>
                 <w:lang w:val="en-US"/>
               </w:rPr>
-              <w:t>Hệ thống hiện giao diện form đăng ký gồm email, mật khẩu thành công.</w:t>
+              <w:t>Hệ thống hiện form đăng ký gồm email, mật khẩu thành công.</w:t>
             </w:r>
           </w:p>
           <w:p>
@@ -6180,7 +6292,7 @@
                 <w:vertAlign w:val="baseline"/>
                 <w:lang w:val="en-US"/>
               </w:rPr>
-              <w:t>Hệ thống kiểm tra tính hợp lệ của thông tin người dùng nhập và tài khoản có tồn tại không thành công.</w:t>
+              <w:t>Hệ thống kiểm tra thông tin đăng ký thành công.</w:t>
             </w:r>
           </w:p>
           <w:p>
@@ -6207,7 +6319,7 @@
                 <w:vertAlign w:val="baseline"/>
                 <w:lang w:val="en-US"/>
               </w:rPr>
-              <w:t>Nếu thành công thì hệ thống sẽ ghi nhận tài khoản mới vào cơ sở dữ liệu và thông báo đến người dùng đăng ký thành công.</w:t>
+              <w:t>Hệ thống sẽ ghi nhận tài khoản mới và thông báo đến người dùng đăng ký thành công.</w:t>
             </w:r>
           </w:p>
           <w:p>
@@ -6234,7 +6346,7 @@
                 <w:vertAlign w:val="baseline"/>
                 <w:lang w:val="en-US"/>
               </w:rPr>
-              <w:t>Hệ thống chuyển sang giao diện đăng nhập</w:t>
+              <w:t>Hệ thống chuyển sang giao diện đăng nhập thành công.</w:t>
             </w:r>
           </w:p>
         </w:tc>
@@ -6286,24 +6398,28 @@
           <w:p>
             <w:pPr>
               <w:widowControl w:val="0"/>
-              <w:jc w:val="both"/>
-              <w:rPr>
-                <w:rFonts w:hint="default"/>
-                <w:sz w:val="32"/>
-                <w:szCs w:val="32"/>
-                <w:vertAlign w:val="baseline"/>
-                <w:lang w:val="en-US"/>
-              </w:rPr>
-            </w:pPr>
-            <w:r>
-              <w:rPr>
-                <w:rFonts w:hint="default"/>
-                <w:sz w:val="32"/>
-                <w:szCs w:val="32"/>
-                <w:vertAlign w:val="baseline"/>
-                <w:lang w:val="en-US"/>
-              </w:rPr>
-              <w:t>3.1 Nếu hệ thống kiểm tra email người dùng nhập không hợp lệ thì hệ thống thông báo “Email không hợp lệ, vui lòng nhập lại” đến người dùng.</w:t>
+              <w:numPr>
+                <w:ilvl w:val="1"/>
+                <w:numId w:val="19"/>
+              </w:numPr>
+              <w:jc w:val="both"/>
+              <w:rPr>
+                <w:rFonts w:hint="default"/>
+                <w:sz w:val="32"/>
+                <w:szCs w:val="32"/>
+                <w:vertAlign w:val="baseline"/>
+                <w:lang w:val="en-US"/>
+              </w:rPr>
+            </w:pPr>
+            <w:r>
+              <w:rPr>
+                <w:rFonts w:hint="default"/>
+                <w:sz w:val="32"/>
+                <w:szCs w:val="32"/>
+                <w:vertAlign w:val="baseline"/>
+                <w:lang w:val="en-US"/>
+              </w:rPr>
+              <w:t>Nếu hệ thống kiểm tra thông tin người dùng nhập không hợp lệ thì hệ thống thông báo “Thông tin không hợp lệ, vui lòng nhập lại” đến người dùng.</w:t>
             </w:r>
           </w:p>
           <w:p>
@@ -6313,51 +6429,25 @@
                 <w:ilvl w:val="0"/>
                 <w:numId w:val="0"/>
               </w:numPr>
-              <w:jc w:val="both"/>
-              <w:rPr>
-                <w:rFonts w:hint="default"/>
-                <w:sz w:val="32"/>
-                <w:szCs w:val="32"/>
-                <w:vertAlign w:val="baseline"/>
-                <w:lang w:val="en-US"/>
-              </w:rPr>
-            </w:pPr>
-            <w:r>
-              <w:rPr>
-                <w:rFonts w:hint="default"/>
-                <w:sz w:val="32"/>
-                <w:szCs w:val="32"/>
-                <w:vertAlign w:val="baseline"/>
-                <w:lang w:val="en-US"/>
-              </w:rPr>
-              <w:t>3.2 Nếu hệ thống kiểm tra email người dùng nhập đã trùng với email của 1 tài khoản đã tồn tại trong hệ thống thì thông báo “Tài khoản đã tồn tại, đăng ký thất bại” đến người dùng.</w:t>
-            </w:r>
-          </w:p>
-          <w:p>
-            <w:pPr>
-              <w:widowControl w:val="0"/>
-              <w:numPr>
-                <w:ilvl w:val="0"/>
-                <w:numId w:val="0"/>
-              </w:numPr>
-              <w:jc w:val="both"/>
-              <w:rPr>
-                <w:rFonts w:hint="default"/>
-                <w:sz w:val="32"/>
-                <w:szCs w:val="32"/>
-                <w:vertAlign w:val="baseline"/>
-                <w:lang w:val="en-US"/>
-              </w:rPr>
-            </w:pPr>
-            <w:r>
-              <w:rPr>
-                <w:rFonts w:hint="default"/>
-                <w:sz w:val="32"/>
-                <w:szCs w:val="32"/>
-                <w:vertAlign w:val="baseline"/>
-                <w:lang w:val="en-US"/>
-              </w:rPr>
-              <w:t xml:space="preserve">3.3 Nếu hệ thống kiểm tra mật khẩu quá yếu thì thông báo “Mật khẩu quá yếu, vui lòng nhập lại” đến người dùng. </w:t>
+              <w:ind w:leftChars="0"/>
+              <w:jc w:val="both"/>
+              <w:rPr>
+                <w:rFonts w:hint="default"/>
+                <w:sz w:val="32"/>
+                <w:szCs w:val="32"/>
+                <w:vertAlign w:val="baseline"/>
+                <w:lang w:val="en-US"/>
+              </w:rPr>
+            </w:pPr>
+            <w:r>
+              <w:rPr>
+                <w:rFonts w:hint="default"/>
+                <w:sz w:val="32"/>
+                <w:szCs w:val="32"/>
+                <w:vertAlign w:val="baseline"/>
+                <w:lang w:val="en-US"/>
+              </w:rPr>
+              <w:t>4.1 Nếu hệ thống ghi nhận tài khoản mới không thành công thì thông báo “Đăng ký thất bại, vui lòng thử lại” đến người dùng.</w:t>
             </w:r>
           </w:p>
         </w:tc>
@@ -6572,12 +6662,6 @@
             <w:insideH w:val="single" w:color="auto" w:sz="4" w:space="0"/>
             <w:insideV w:val="single" w:color="auto" w:sz="4" w:space="0"/>
           </w:tblBorders>
-          <w:tblCellMar>
-            <w:top w:w="0" w:type="dxa"/>
-            <w:left w:w="108" w:type="dxa"/>
-            <w:bottom w:w="0" w:type="dxa"/>
-            <w:right w:w="108" w:type="dxa"/>
-          </w:tblCellMar>
         </w:tblPrEx>
         <w:tc>
           <w:tcPr>
@@ -6676,7 +6760,7 @@
                 <w:vertAlign w:val="baseline"/>
                 <w:lang w:val="en-US"/>
               </w:rPr>
-              <w:t>Hệ thống hiện giao diện form đăng nhập gồm email, mật khẩu thành công.</w:t>
+              <w:t>Hệ thống hiện form đăng nhập gồm email, mật khẩu thành công.</w:t>
             </w:r>
           </w:p>
           <w:p>
@@ -6732,7 +6816,7 @@
                 <w:vertAlign w:val="baseline"/>
                 <w:lang w:val="en-US"/>
               </w:rPr>
-              <w:t>Hệ thống kiểm tra tính hợp lệ và tính đúng của thông tin người dùng nhập .</w:t>
+              <w:t>Hệ thống kiểm tra thông tin người dùng nhập.</w:t>
             </w:r>
           </w:p>
           <w:p>
@@ -6760,7 +6844,7 @@
                 <w:vertAlign w:val="baseline"/>
                 <w:lang w:val="en-US"/>
               </w:rPr>
-              <w:t>Nếu đúng thì hệ thống sẽ thông báo đến người dùng đăng nhập thành công.</w:t>
+              <w:t>Hệ thống xác thực thông tin người dùng nhập.</w:t>
             </w:r>
           </w:p>
           <w:p>
@@ -6788,7 +6872,35 @@
                 <w:vertAlign w:val="baseline"/>
                 <w:lang w:val="en-US"/>
               </w:rPr>
-              <w:t>Hệ thống chuyển sang giao diện cho người dùng đã đăng nhập.</w:t>
+              <w:t>Hệ thống sẽ thông báo đến người dùng đăng nhập thành công.</w:t>
+            </w:r>
+          </w:p>
+          <w:p>
+            <w:pPr>
+              <w:widowControl w:val="0"/>
+              <w:numPr>
+                <w:ilvl w:val="0"/>
+                <w:numId w:val="29"/>
+              </w:numPr>
+              <w:ind w:left="0" w:leftChars="0" w:firstLine="0" w:firstLineChars="0"/>
+              <w:jc w:val="both"/>
+              <w:rPr>
+                <w:rFonts w:hint="default"/>
+                <w:sz w:val="32"/>
+                <w:szCs w:val="32"/>
+                <w:vertAlign w:val="baseline"/>
+                <w:lang w:val="en-US"/>
+              </w:rPr>
+            </w:pPr>
+            <w:r>
+              <w:rPr>
+                <w:rFonts w:hint="default"/>
+                <w:sz w:val="32"/>
+                <w:szCs w:val="32"/>
+                <w:vertAlign w:val="baseline"/>
+                <w:lang w:val="en-US"/>
+              </w:rPr>
+              <w:t>Hệ thống chuyển sang giao diện cho người dùng đã đăng nhập thành công.</w:t>
             </w:r>
           </w:p>
         </w:tc>
@@ -6840,24 +6952,28 @@
           <w:p>
             <w:pPr>
               <w:widowControl w:val="0"/>
-              <w:jc w:val="both"/>
-              <w:rPr>
-                <w:rFonts w:hint="default"/>
-                <w:sz w:val="32"/>
-                <w:szCs w:val="32"/>
-                <w:vertAlign w:val="baseline"/>
-                <w:lang w:val="en-US"/>
-              </w:rPr>
-            </w:pPr>
-            <w:r>
-              <w:rPr>
-                <w:rFonts w:hint="default"/>
-                <w:sz w:val="32"/>
-                <w:szCs w:val="32"/>
-                <w:vertAlign w:val="baseline"/>
-                <w:lang w:val="en-US"/>
-              </w:rPr>
-              <w:t>3.1 Nếu hệ thống kiểm tra email người dùng nhập không hợp lệ thì hệ thống thông báo “Email không hợp lệ, vui lòng nhập lại” đến người dùng.</w:t>
+              <w:numPr>
+                <w:ilvl w:val="1"/>
+                <w:numId w:val="13"/>
+              </w:numPr>
+              <w:jc w:val="both"/>
+              <w:rPr>
+                <w:rFonts w:hint="default"/>
+                <w:sz w:val="32"/>
+                <w:szCs w:val="32"/>
+                <w:vertAlign w:val="baseline"/>
+                <w:lang w:val="en-US"/>
+              </w:rPr>
+            </w:pPr>
+            <w:r>
+              <w:rPr>
+                <w:rFonts w:hint="default"/>
+                <w:sz w:val="32"/>
+                <w:szCs w:val="32"/>
+                <w:vertAlign w:val="baseline"/>
+                <w:lang w:val="en-US"/>
+              </w:rPr>
+              <w:t>Nếu hệ thống kiểm tra thông tin đăng nhập không hợp lệ thì hệ thống thông báo “Thông tin không hợp lệ, vui lòng nhập lại” đến người dùng.</w:t>
             </w:r>
           </w:p>
           <w:p>
@@ -6885,35 +7001,7 @@
                 <w:vertAlign w:val="baseline"/>
                 <w:lang w:val="en-US"/>
               </w:rPr>
-              <w:t>3.2 Nếu hệ thống kiểm tra thông tin đăng nhập của người dùng nhập không đúng thì hệ thống thông báo “Sai email hoặc mật khẩu, vui lòng nhập lại” đến người dùng.</w:t>
-            </w:r>
-          </w:p>
-          <w:p>
-            <w:pPr>
-              <w:widowControl w:val="0"/>
-              <w:numPr>
-                <w:ilvl w:val="0"/>
-                <w:numId w:val="0"/>
-              </w:numPr>
-              <w:ind w:leftChars="0"/>
-              <w:jc w:val="both"/>
-              <w:rPr>
-                <w:rFonts w:hint="default"/>
-                <w:sz w:val="32"/>
-                <w:szCs w:val="32"/>
-                <w:vertAlign w:val="baseline"/>
-                <w:lang w:val="en-US"/>
-              </w:rPr>
-            </w:pPr>
-            <w:r>
-              <w:rPr>
-                <w:rFonts w:hint="default"/>
-                <w:sz w:val="32"/>
-                <w:szCs w:val="32"/>
-                <w:vertAlign w:val="baseline"/>
-                <w:lang w:val="en-US"/>
-              </w:rPr>
-              <w:t>3.3 Nếu hệ thống kiểm tra tài khoản của người dùng không tồn tại (email không tồn tại trong cơ sở dữ liệu) thì thông báo “Tài khoản không tồn tại, vui lòng đăng ký tài khoản trước” đến người dùng.</w:t>
+              <w:t>4.1 Nếu hệ thống xác thực thông tin đăng nhập không đúng thì thông báo “Sai email hoặc mật khẩu, vui lòng thử lại” đến người dùng.</w:t>
             </w:r>
           </w:p>
         </w:tc>
@@ -7260,7 +7348,7 @@
                 <w:vertAlign w:val="baseline"/>
                 <w:lang w:val="en-US"/>
               </w:rPr>
-              <w:t>Người dùng nhập email, mật khẩu và nhấn Đăng nhập.</w:t>
+              <w:t>Admin nhập email, mật khẩu và nhấn Đăng nhập.</w:t>
             </w:r>
           </w:p>
           <w:p>
@@ -7288,7 +7376,7 @@
                 <w:vertAlign w:val="baseline"/>
                 <w:lang w:val="en-US"/>
               </w:rPr>
-              <w:t>Hệ thống kiểm tra tính hợp lệ và tính đúng của thông tin người dùng nhập .</w:t>
+              <w:t>Hệ thống kiểm tra thông tin Admin nhập .</w:t>
             </w:r>
           </w:p>
           <w:p>
@@ -7316,7 +7404,7 @@
                 <w:vertAlign w:val="baseline"/>
                 <w:lang w:val="en-US"/>
               </w:rPr>
-              <w:t>Nếu đúng thì hệ thống sẽ thông báo đến người dùng đăng nhập thành công.</w:t>
+              <w:t>Hệ thống xác thực thông tin Admin nhập.</w:t>
             </w:r>
           </w:p>
           <w:p>
@@ -7344,7 +7432,35 @@
                 <w:vertAlign w:val="baseline"/>
                 <w:lang w:val="en-US"/>
               </w:rPr>
-              <w:t>Hệ thống chuyển sang giao diện cho người dùng đã đăng nhập.</w:t>
+              <w:t>Nếu đúng thì hệ thống sẽ thông báo đến Admin đăng nhập thành công.</w:t>
+            </w:r>
+          </w:p>
+          <w:p>
+            <w:pPr>
+              <w:widowControl w:val="0"/>
+              <w:numPr>
+                <w:ilvl w:val="0"/>
+                <w:numId w:val="31"/>
+              </w:numPr>
+              <w:ind w:left="0" w:leftChars="0" w:firstLine="0" w:firstLineChars="0"/>
+              <w:jc w:val="both"/>
+              <w:rPr>
+                <w:rFonts w:hint="default"/>
+                <w:sz w:val="32"/>
+                <w:szCs w:val="32"/>
+                <w:vertAlign w:val="baseline"/>
+                <w:lang w:val="en-US"/>
+              </w:rPr>
+            </w:pPr>
+            <w:r>
+              <w:rPr>
+                <w:rFonts w:hint="default"/>
+                <w:sz w:val="32"/>
+                <w:szCs w:val="32"/>
+                <w:vertAlign w:val="baseline"/>
+                <w:lang w:val="en-US"/>
+              </w:rPr>
+              <w:t>Hệ thống chuyển sang giao diện cho Admin.</w:t>
             </w:r>
           </w:p>
         </w:tc>
@@ -7413,7 +7529,7 @@
                 <w:vertAlign w:val="baseline"/>
                 <w:lang w:val="en-US"/>
               </w:rPr>
-              <w:t>3.1 Nếu hệ thống kiểm tra email Admin nhập không hợp lệ thì hệ thống thông báo “Email không hợp lệ, vui lòng nhập lại” đến người dùng.</w:t>
+              <w:t>3.1 Nếu hệ thống kiểm tra thông tin đăng nhập không hợp lệ thì hệ thống thông báo “Thông tin không hợp lệ, vui lòng nhập lại” đến Admin.</w:t>
             </w:r>
           </w:p>
           <w:p>
@@ -7441,7 +7557,7 @@
                 <w:vertAlign w:val="baseline"/>
                 <w:lang w:val="en-US"/>
               </w:rPr>
-              <w:t>3.2 Nếu hệ thống kiểm tra thông tin đăng nhập của Admin nhập không đúng thì hệ thống thông báo “Sai email hoặc mật khẩu, vui lòng nhập lại” đến Admin.</w:t>
+              <w:t>4.1 Nếu hệ thống xác thực thông tin đăng nhập không đúng thì thông báo “Sai email hoặc mật khẩu, vui lòng thử lại” đến Admin.</w:t>
             </w:r>
           </w:p>
         </w:tc>
@@ -7837,33 +7953,6 @@
               <w:t>Dòng sự kiện phụ:</w:t>
             </w:r>
           </w:p>
-          <w:p>
-            <w:pPr>
-              <w:widowControl w:val="0"/>
-              <w:numPr>
-                <w:ilvl w:val="0"/>
-                <w:numId w:val="0"/>
-              </w:numPr>
-              <w:jc w:val="both"/>
-              <w:rPr>
-                <w:rFonts w:hint="default"/>
-                <w:sz w:val="32"/>
-                <w:szCs w:val="32"/>
-                <w:vertAlign w:val="baseline"/>
-                <w:lang w:val="en-US"/>
-              </w:rPr>
-            </w:pPr>
-            <w:r>
-              <w:rPr>
-                <w:rFonts w:hint="default"/>
-                <w:sz w:val="32"/>
-                <w:szCs w:val="32"/>
-                <w:vertAlign w:val="baseline"/>
-                <w:lang w:val="en-US"/>
-              </w:rPr>
-              <w:t>1.1 Nếu hệ thống đăng xuất không thành công thì thông báo “Đăng xuất thất bại, vui lòng thử lại” đến người dùng.</w:t>
-            </w:r>
-          </w:p>
         </w:tc>
       </w:tr>
       <w:tr>
@@ -8263,7 +8352,7 @@
                 <w:vertAlign w:val="baseline"/>
                 <w:lang w:val="en-US"/>
               </w:rPr>
-              <w:t>Người dùng lấy mã số hệ thống gửi thông qua email.</w:t>
+              <w:t>Hệ thống hiện form để người dùng điền mã số thành công.</w:t>
             </w:r>
           </w:p>
           <w:p>
@@ -8291,7 +8380,7 @@
                 <w:vertAlign w:val="baseline"/>
                 <w:lang w:val="en-US"/>
               </w:rPr>
-              <w:t>Hệ thống hiện form để người dùng điền mã số thành công.</w:t>
+              <w:t>Người dùng nhập mã số và nhấn Đồng ý.</w:t>
             </w:r>
           </w:p>
           <w:p>
@@ -8319,7 +8408,7 @@
                 <w:vertAlign w:val="baseline"/>
                 <w:lang w:val="en-US"/>
               </w:rPr>
-              <w:t>Người dùng nhập mã số và nhấn Đồng ý.</w:t>
+              <w:t>Hệ thống tắt form điền mã số và xác thực mã số người dùng nhập với mã số hệ thống đã gửi thành công.</w:t>
             </w:r>
           </w:p>
           <w:p>
@@ -8347,7 +8436,7 @@
                 <w:vertAlign w:val="baseline"/>
                 <w:lang w:val="en-US"/>
               </w:rPr>
-              <w:t>Hệ thống tắt form điền mã số và xác thực mã số người dùng nhập với mã số hệ thống đã gửi thành công.</w:t>
+              <w:t>Hệ thống hiện form để người dùng điền mật khẩu mới thành công.</w:t>
             </w:r>
           </w:p>
           <w:p>
@@ -8403,7 +8492,7 @@
                 <w:vertAlign w:val="baseline"/>
                 <w:lang w:val="en-US"/>
               </w:rPr>
-              <w:t>Hệ thống lưu lại mật khẩu mới của người dùng vào cơ sở dữ liệu thành công.</w:t>
+              <w:t>Hệ thống lưu lại mật khẩu mới của người dùng thành công.</w:t>
             </w:r>
           </w:p>
         </w:tc>
@@ -8476,29 +8565,6 @@
           <w:p>
             <w:pPr>
               <w:widowControl w:val="0"/>
-              <w:jc w:val="both"/>
-              <w:rPr>
-                <w:rFonts w:hint="default"/>
-                <w:sz w:val="32"/>
-                <w:szCs w:val="32"/>
-                <w:vertAlign w:val="baseline"/>
-                <w:lang w:val="en-US"/>
-              </w:rPr>
-            </w:pPr>
-            <w:r>
-              <w:rPr>
-                <w:rFonts w:hint="default"/>
-                <w:sz w:val="32"/>
-                <w:szCs w:val="32"/>
-                <w:vertAlign w:val="baseline"/>
-                <w:lang w:val="en-US"/>
-              </w:rPr>
-              <w:t>3.1 Nếu hệ thống gửi mã số không thành công hoặc người dùng không nhận được mã số thì hệ thống cho phép người dùng chọn Gửi lại mã số.</w:t>
-            </w:r>
-          </w:p>
-          <w:p>
-            <w:pPr>
-              <w:widowControl w:val="0"/>
               <w:numPr>
                 <w:ilvl w:val="0"/>
                 <w:numId w:val="0"/>
@@ -8521,7 +8587,7 @@
                 <w:vertAlign w:val="baseline"/>
                 <w:lang w:val="en-US"/>
               </w:rPr>
-              <w:t>7.1 Nếu hệ thống xác thực mã số không thành công thì thông báo “Mã số không đúng, vui lòng nhập lại” đến người dùng.</w:t>
+              <w:t>6.1 Nếu hệ thống xác thực mã số không thành công thì thông báo “Mã số không đúng, vui lòng nhập lại” đến người dùng.</w:t>
             </w:r>
           </w:p>
           <w:p>
@@ -8764,12 +8830,6 @@
             <w:insideH w:val="single" w:color="auto" w:sz="4" w:space="0"/>
             <w:insideV w:val="single" w:color="auto" w:sz="4" w:space="0"/>
           </w:tblBorders>
-          <w:tblCellMar>
-            <w:top w:w="0" w:type="dxa"/>
-            <w:left w:w="108" w:type="dxa"/>
-            <w:bottom w:w="0" w:type="dxa"/>
-            <w:right w:w="108" w:type="dxa"/>
-          </w:tblCellMar>
         </w:tblPrEx>
         <w:tc>
           <w:tcPr>
@@ -8869,7 +8929,7 @@
                 <w:vertAlign w:val="baseline"/>
                 <w:lang w:val="en-US"/>
               </w:rPr>
-              <w:t>Hệ thống hiện giao diện gồm các nút chức năng và bắt đầu phát bài hát thành công.</w:t>
+              <w:t>Hệ thống hiện giao diện Nghe nhạc thành công.</w:t>
             </w:r>
           </w:p>
           <w:p>
@@ -9032,27 +9092,26 @@
             <w:pPr>
               <w:widowControl w:val="0"/>
               <w:numPr>
-                <w:ilvl w:val="0"/>
-                <w:numId w:val="39"/>
-              </w:numPr>
-              <w:jc w:val="both"/>
-              <w:rPr>
-                <w:rFonts w:hint="default"/>
-                <w:sz w:val="32"/>
-                <w:szCs w:val="32"/>
-                <w:vertAlign w:val="baseline"/>
-                <w:lang w:val="en-US"/>
-              </w:rPr>
-            </w:pPr>
-            <w:r>
-              <w:rPr>
-                <w:rFonts w:hint="default"/>
-                <w:sz w:val="32"/>
-                <w:szCs w:val="32"/>
-                <w:vertAlign w:val="baseline"/>
-                <w:lang w:val="en-US"/>
-              </w:rPr>
-              <w:t>Nếu hệ thống phát bài hát không thành công thì hệ thống thông báo “Phát nhạc thất bại, vui lòng thử lại” đến người dùng.</w:t>
+                <w:numId w:val="0"/>
+              </w:numPr>
+              <w:jc w:val="both"/>
+              <w:rPr>
+                <w:rFonts w:hint="default"/>
+                <w:sz w:val="32"/>
+                <w:szCs w:val="32"/>
+                <w:vertAlign w:val="baseline"/>
+                <w:lang w:val="en-US"/>
+              </w:rPr>
+            </w:pPr>
+            <w:r>
+              <w:rPr>
+                <w:rFonts w:hint="default"/>
+                <w:sz w:val="32"/>
+                <w:szCs w:val="32"/>
+                <w:vertAlign w:val="baseline"/>
+                <w:lang w:val="en-US"/>
+              </w:rPr>
+              <w:t>2.1 Nếu hệ thống phát bài hát không thành công thì hệ thống thông báo “Phát nhạc thất bại, vui lòng thử lại” đến người dùng.</w:t>
             </w:r>
           </w:p>
         </w:tc>
@@ -9179,7 +9238,7 @@
               <w:widowControl w:val="0"/>
               <w:numPr>
                 <w:ilvl w:val="0"/>
-                <w:numId w:val="40"/>
+                <w:numId w:val="39"/>
               </w:numPr>
               <w:jc w:val="both"/>
               <w:rPr>
@@ -9352,7 +9411,7 @@
               <w:widowControl w:val="0"/>
               <w:numPr>
                 <w:ilvl w:val="0"/>
-                <w:numId w:val="41"/>
+                <w:numId w:val="40"/>
               </w:numPr>
               <w:ind w:leftChars="0"/>
               <w:jc w:val="both"/>
@@ -9372,15 +9431,15 @@
                 <w:vertAlign w:val="baseline"/>
                 <w:lang w:val="en-US"/>
               </w:rPr>
-              <w:t>Hệ thống hiện giao diện gồm danh sách bài hát và ô tìm kiếm thành công.</w:t>
-            </w:r>
-          </w:p>
-          <w:p>
-            <w:pPr>
-              <w:widowControl w:val="0"/>
-              <w:numPr>
-                <w:ilvl w:val="0"/>
-                <w:numId w:val="40"/>
+              <w:t>Hệ thống hiện giao diện Khám phá bài hát thành công.</w:t>
+            </w:r>
+          </w:p>
+          <w:p>
+            <w:pPr>
+              <w:widowControl w:val="0"/>
+              <w:numPr>
+                <w:ilvl w:val="0"/>
+                <w:numId w:val="39"/>
               </w:numPr>
               <w:ind w:left="0" w:leftChars="0" w:firstLine="0" w:firstLineChars="0"/>
               <w:jc w:val="both"/>
@@ -9408,7 +9467,7 @@
               <w:widowControl w:val="0"/>
               <w:numPr>
                 <w:ilvl w:val="0"/>
-                <w:numId w:val="40"/>
+                <w:numId w:val="39"/>
               </w:numPr>
               <w:ind w:left="0" w:leftChars="0" w:firstLine="0" w:firstLineChars="0"/>
               <w:jc w:val="both"/>
@@ -9436,7 +9495,7 @@
               <w:widowControl w:val="0"/>
               <w:numPr>
                 <w:ilvl w:val="1"/>
-                <w:numId w:val="40"/>
+                <w:numId w:val="39"/>
               </w:numPr>
               <w:ind w:left="361" w:leftChars="0" w:firstLine="0" w:firstLineChars="0"/>
               <w:jc w:val="both"/>
@@ -9464,7 +9523,7 @@
               <w:widowControl w:val="0"/>
               <w:numPr>
                 <w:ilvl w:val="1"/>
-                <w:numId w:val="40"/>
+                <w:numId w:val="39"/>
               </w:numPr>
               <w:ind w:left="361" w:leftChars="0" w:firstLine="0" w:firstLineChars="0"/>
               <w:jc w:val="both"/>
@@ -9492,7 +9551,7 @@
               <w:widowControl w:val="0"/>
               <w:numPr>
                 <w:ilvl w:val="1"/>
-                <w:numId w:val="40"/>
+                <w:numId w:val="39"/>
               </w:numPr>
               <w:ind w:left="361" w:leftChars="0" w:firstLine="0" w:firstLineChars="0"/>
               <w:jc w:val="both"/>
@@ -9520,7 +9579,7 @@
               <w:widowControl w:val="0"/>
               <w:numPr>
                 <w:ilvl w:val="1"/>
-                <w:numId w:val="40"/>
+                <w:numId w:val="39"/>
               </w:numPr>
               <w:ind w:left="361" w:leftChars="0" w:firstLine="0" w:firstLineChars="0"/>
               <w:jc w:val="both"/>
@@ -9548,7 +9607,7 @@
               <w:widowControl w:val="0"/>
               <w:numPr>
                 <w:ilvl w:val="1"/>
-                <w:numId w:val="40"/>
+                <w:numId w:val="39"/>
               </w:numPr>
               <w:ind w:left="361" w:leftChars="0" w:firstLine="0" w:firstLineChars="0"/>
               <w:jc w:val="both"/>
@@ -9576,7 +9635,7 @@
               <w:widowControl w:val="0"/>
               <w:numPr>
                 <w:ilvl w:val="0"/>
-                <w:numId w:val="40"/>
+                <w:numId w:val="39"/>
               </w:numPr>
               <w:ind w:left="0" w:leftChars="0" w:firstLine="0" w:firstLineChars="0"/>
               <w:jc w:val="both"/>
@@ -9596,15 +9655,15 @@
                 <w:vertAlign w:val="baseline"/>
                 <w:lang w:val="en-US"/>
               </w:rPr>
-              <w:t>Hệ thống ghi nhận hành động của người dùng vào cơ sở dữ liệu thành công.</w:t>
-            </w:r>
-          </w:p>
-          <w:p>
-            <w:pPr>
-              <w:widowControl w:val="0"/>
-              <w:numPr>
-                <w:ilvl w:val="0"/>
-                <w:numId w:val="40"/>
+              <w:t>Hệ thống ghi nhận hành động của người dùng thành công.</w:t>
+            </w:r>
+          </w:p>
+          <w:p>
+            <w:pPr>
+              <w:widowControl w:val="0"/>
+              <w:numPr>
+                <w:ilvl w:val="0"/>
+                <w:numId w:val="39"/>
               </w:numPr>
               <w:ind w:left="0" w:leftChars="0" w:firstLine="0" w:firstLineChars="0"/>
               <w:jc w:val="both"/>
@@ -9697,7 +9756,7 @@
                 <w:vertAlign w:val="baseline"/>
                 <w:lang w:val="en-US"/>
               </w:rPr>
-              <w:t>1.1 Nếu hệ thống hiện giao diện hoặc lấy danh sách bài hát từ cơ sở dữ liệu không thành công thì hệ thống thông báo “Hiện danh sách bài hát thất bại, vui lòng thử lại” đến người dùng.</w:t>
+              <w:t>1.1 Nếu hệ thống lấy danh sách bài hát  không thành công thì hệ thống thông báo “Lấy danh sách bài hát thất bại, vui lòng thử lại” đến người dùng.</w:t>
             </w:r>
           </w:p>
         </w:tc>
@@ -9751,7 +9810,7 @@
               <w:widowControl w:val="0"/>
               <w:numPr>
                 <w:ilvl w:val="0"/>
-                <w:numId w:val="42"/>
+                <w:numId w:val="41"/>
               </w:numPr>
               <w:jc w:val="both"/>
               <w:rPr>
@@ -9824,7 +9883,7 @@
               <w:widowControl w:val="0"/>
               <w:numPr>
                 <w:ilvl w:val="0"/>
-                <w:numId w:val="43"/>
+                <w:numId w:val="42"/>
               </w:numPr>
               <w:jc w:val="both"/>
               <w:rPr>
@@ -9912,12 +9971,6 @@
             <w:insideH w:val="single" w:color="auto" w:sz="4" w:space="0"/>
             <w:insideV w:val="single" w:color="auto" w:sz="4" w:space="0"/>
           </w:tblBorders>
-          <w:tblCellMar>
-            <w:top w:w="0" w:type="dxa"/>
-            <w:left w:w="108" w:type="dxa"/>
-            <w:bottom w:w="0" w:type="dxa"/>
-            <w:right w:w="108" w:type="dxa"/>
-          </w:tblCellMar>
         </w:tblPrEx>
         <w:tc>
           <w:tcPr>
@@ -9997,7 +10050,7 @@
               <w:widowControl w:val="0"/>
               <w:numPr>
                 <w:ilvl w:val="0"/>
-                <w:numId w:val="44"/>
+                <w:numId w:val="43"/>
               </w:numPr>
               <w:jc w:val="both"/>
               <w:rPr>
@@ -10024,7 +10077,7 @@
               <w:widowControl w:val="0"/>
               <w:numPr>
                 <w:ilvl w:val="0"/>
-                <w:numId w:val="44"/>
+                <w:numId w:val="43"/>
               </w:numPr>
               <w:ind w:left="0" w:leftChars="0" w:firstLine="0" w:firstLineChars="0"/>
               <w:jc w:val="both"/>
@@ -10052,7 +10105,7 @@
               <w:widowControl w:val="0"/>
               <w:numPr>
                 <w:ilvl w:val="0"/>
-                <w:numId w:val="44"/>
+                <w:numId w:val="43"/>
               </w:numPr>
               <w:ind w:left="0" w:leftChars="0" w:firstLine="0" w:firstLineChars="0"/>
               <w:jc w:val="both"/>
@@ -10072,15 +10125,15 @@
                 <w:vertAlign w:val="baseline"/>
                 <w:lang w:val="en-US"/>
               </w:rPr>
-              <w:t>Hệ thống hiện ra các tài khoản trong nền tảng đó mà người dùng muốn chia sẻ đến thành công.</w:t>
-            </w:r>
-          </w:p>
-          <w:p>
-            <w:pPr>
-              <w:widowControl w:val="0"/>
-              <w:numPr>
-                <w:ilvl w:val="0"/>
-                <w:numId w:val="44"/>
+              <w:t>Hệ thống chia sẻ đường dẫn của bài hát đó đến tài khoản của nền tảng mà người dùng chọn thành công.</w:t>
+            </w:r>
+          </w:p>
+          <w:p>
+            <w:pPr>
+              <w:widowControl w:val="0"/>
+              <w:numPr>
+                <w:ilvl w:val="0"/>
+                <w:numId w:val="43"/>
               </w:numPr>
               <w:ind w:left="0" w:leftChars="0" w:firstLine="0" w:firstLineChars="0"/>
               <w:jc w:val="both"/>
@@ -10100,15 +10153,15 @@
                 <w:vertAlign w:val="baseline"/>
                 <w:lang w:val="en-US"/>
               </w:rPr>
-              <w:t>Người dùng chọn tài khoản mình muốn chia sẻ và nhấn Chia sẻ.</w:t>
-            </w:r>
-          </w:p>
-          <w:p>
-            <w:pPr>
-              <w:widowControl w:val="0"/>
-              <w:numPr>
-                <w:ilvl w:val="0"/>
-                <w:numId w:val="44"/>
+              <w:t>Hệ thống ghi nhận hành động chia sẻ bài hát đến nền tảng đó của người dùng thành công.</w:t>
+            </w:r>
+          </w:p>
+          <w:p>
+            <w:pPr>
+              <w:widowControl w:val="0"/>
+              <w:numPr>
+                <w:ilvl w:val="0"/>
+                <w:numId w:val="43"/>
               </w:numPr>
               <w:ind w:left="0" w:leftChars="0" w:firstLine="0" w:firstLineChars="0"/>
               <w:jc w:val="both"/>
@@ -10128,62 +10181,6 @@
                 <w:vertAlign w:val="baseline"/>
                 <w:lang w:val="en-US"/>
               </w:rPr>
-              <w:t>Hệ thống chia sẻ đường dẫn của bài hát đó đến tài khoản của nền tảng mà người dùng chọn thành công.</w:t>
-            </w:r>
-          </w:p>
-          <w:p>
-            <w:pPr>
-              <w:widowControl w:val="0"/>
-              <w:numPr>
-                <w:ilvl w:val="0"/>
-                <w:numId w:val="44"/>
-              </w:numPr>
-              <w:ind w:left="0" w:leftChars="0" w:firstLine="0" w:firstLineChars="0"/>
-              <w:jc w:val="both"/>
-              <w:rPr>
-                <w:rFonts w:hint="default"/>
-                <w:sz w:val="32"/>
-                <w:szCs w:val="32"/>
-                <w:vertAlign w:val="baseline"/>
-                <w:lang w:val="en-US"/>
-              </w:rPr>
-            </w:pPr>
-            <w:r>
-              <w:rPr>
-                <w:rFonts w:hint="default"/>
-                <w:sz w:val="32"/>
-                <w:szCs w:val="32"/>
-                <w:vertAlign w:val="baseline"/>
-                <w:lang w:val="en-US"/>
-              </w:rPr>
-              <w:t>Hệ thống ghi nhận hành động chia sẻ bài hát đến nền tảng đó của người dùng thành công.</w:t>
-            </w:r>
-          </w:p>
-          <w:p>
-            <w:pPr>
-              <w:widowControl w:val="0"/>
-              <w:numPr>
-                <w:ilvl w:val="0"/>
-                <w:numId w:val="44"/>
-              </w:numPr>
-              <w:ind w:left="0" w:leftChars="0" w:firstLine="0" w:firstLineChars="0"/>
-              <w:jc w:val="both"/>
-              <w:rPr>
-                <w:rFonts w:hint="default"/>
-                <w:sz w:val="32"/>
-                <w:szCs w:val="32"/>
-                <w:vertAlign w:val="baseline"/>
-                <w:lang w:val="en-US"/>
-              </w:rPr>
-            </w:pPr>
-            <w:r>
-              <w:rPr>
-                <w:rFonts w:hint="default"/>
-                <w:sz w:val="32"/>
-                <w:szCs w:val="32"/>
-                <w:vertAlign w:val="baseline"/>
-                <w:lang w:val="en-US"/>
-              </w:rPr>
               <w:t>Hệ thống thông báo “Đã chia sẻ” đến người dùng thành công.</w:t>
             </w:r>
           </w:p>
@@ -10192,7 +10189,7 @@
               <w:widowControl w:val="0"/>
               <w:numPr>
                 <w:ilvl w:val="0"/>
-                <w:numId w:val="44"/>
+                <w:numId w:val="43"/>
               </w:numPr>
               <w:ind w:left="0" w:leftChars="0" w:firstLine="0" w:firstLineChars="0"/>
               <w:jc w:val="both"/>
@@ -10339,7 +10336,7 @@
               <w:widowControl w:val="0"/>
               <w:numPr>
                 <w:ilvl w:val="0"/>
-                <w:numId w:val="45"/>
+                <w:numId w:val="44"/>
               </w:numPr>
               <w:jc w:val="both"/>
               <w:rPr>
@@ -10412,7 +10409,7 @@
               <w:widowControl w:val="0"/>
               <w:numPr>
                 <w:ilvl w:val="0"/>
-                <w:numId w:val="46"/>
+                <w:numId w:val="45"/>
               </w:numPr>
               <w:ind w:leftChars="0"/>
               <w:jc w:val="both"/>
@@ -10589,7 +10586,7 @@
               <w:widowControl w:val="0"/>
               <w:numPr>
                 <w:ilvl w:val="0"/>
-                <w:numId w:val="47"/>
+                <w:numId w:val="46"/>
               </w:numPr>
               <w:ind w:leftChars="0"/>
               <w:jc w:val="both"/>
@@ -10609,15 +10606,15 @@
                 <w:vertAlign w:val="baseline"/>
                 <w:lang w:val="en-US"/>
               </w:rPr>
-              <w:t>Hệ thống hiện giao diện hồ sơ cá nhân của người dùng và các nút chức năng để người dùng chọn thành công.</w:t>
-            </w:r>
-          </w:p>
-          <w:p>
-            <w:pPr>
-              <w:widowControl w:val="0"/>
-              <w:numPr>
-                <w:ilvl w:val="0"/>
-                <w:numId w:val="47"/>
+              <w:t>Hệ thống hiện giao diện Quản lý hồ sơ cá nhân thành công.</w:t>
+            </w:r>
+          </w:p>
+          <w:p>
+            <w:pPr>
+              <w:widowControl w:val="0"/>
+              <w:numPr>
+                <w:ilvl w:val="0"/>
+                <w:numId w:val="46"/>
               </w:numPr>
               <w:ind w:leftChars="0"/>
               <w:jc w:val="both"/>
@@ -10645,7 +10642,7 @@
               <w:widowControl w:val="0"/>
               <w:numPr>
                 <w:ilvl w:val="0"/>
-                <w:numId w:val="47"/>
+                <w:numId w:val="46"/>
               </w:numPr>
               <w:ind w:leftChars="0"/>
               <w:jc w:val="both"/>
@@ -10719,7 +10716,7 @@
                 <w:vertAlign w:val="baseline"/>
                 <w:lang w:val="en-US"/>
               </w:rPr>
-              <w:t xml:space="preserve">     3.2/ Sửa tài khoản (chuyển sang Usecase Sửa tài khoản cá nhân).</w:t>
+              <w:t xml:space="preserve">     3.2/ Xem danh sách và tìm kiếm bài hát yêu thích (chuyển sang Usecase Xem danh sách và tìm kiếm bài hát yêu thích).</w:t>
             </w:r>
           </w:p>
           <w:p>
@@ -10746,42 +10743,15 @@
                 <w:vertAlign w:val="baseline"/>
                 <w:lang w:val="en-US"/>
               </w:rPr>
-              <w:t xml:space="preserve">     3.3/ Xem danh sách và tìm kiếm bài hát yêu thích (chuyển sang Usecase Xem danh sách và tìm kiếm bài hát yêu thích).</w:t>
-            </w:r>
-          </w:p>
-          <w:p>
-            <w:pPr>
-              <w:widowControl w:val="0"/>
-              <w:numPr>
-                <w:ilvl w:val="0"/>
-                <w:numId w:val="0"/>
-              </w:numPr>
-              <w:jc w:val="both"/>
-              <w:rPr>
-                <w:rFonts w:hint="default"/>
-                <w:sz w:val="32"/>
-                <w:szCs w:val="32"/>
-                <w:vertAlign w:val="baseline"/>
-                <w:lang w:val="en-US"/>
-              </w:rPr>
-            </w:pPr>
-            <w:r>
-              <w:rPr>
-                <w:rFonts w:hint="default"/>
-                <w:sz w:val="32"/>
-                <w:szCs w:val="32"/>
-                <w:vertAlign w:val="baseline"/>
-                <w:lang w:val="en-US"/>
-              </w:rPr>
-              <w:t xml:space="preserve">     3.4/ Người dùng có thể thực hiện các chức năng như thích, bình luận, chia sẻ, huỷ đăng lại đối với các bài hát đã đăng lại. </w:t>
-            </w:r>
-          </w:p>
-          <w:p>
-            <w:pPr>
-              <w:widowControl w:val="0"/>
-              <w:numPr>
-                <w:ilvl w:val="0"/>
-                <w:numId w:val="47"/>
+              <w:t xml:space="preserve">     3.3/ Người dùng có thể thực hiện các chức năng như thích, bình luận, chia sẻ, huỷ đăng lại đối với các bài hát đã đăng lại. </w:t>
+            </w:r>
+          </w:p>
+          <w:p>
+            <w:pPr>
+              <w:widowControl w:val="0"/>
+              <w:numPr>
+                <w:ilvl w:val="0"/>
+                <w:numId w:val="46"/>
               </w:numPr>
               <w:ind w:left="0" w:leftChars="0" w:firstLine="0" w:firstLineChars="0"/>
               <w:jc w:val="both"/>
@@ -10801,7 +10771,7 @@
                 <w:vertAlign w:val="baseline"/>
                 <w:lang w:val="en-US"/>
               </w:rPr>
-              <w:t>Hệ thống sẽ ghi nhận các chức năng người dùng đã thực hiện vào cơ sở dữ liệu và cập nhật số lượt tương tác của bài hát thành công.</w:t>
+              <w:t>Hệ thống sẽ ghi nhận các chức năng người dùng đã thực hiện  và cập nhật số lượt tương tác của bài hát thành công.</w:t>
             </w:r>
           </w:p>
         </w:tc>
@@ -10874,7 +10844,7 @@
                 <w:vertAlign w:val="baseline"/>
                 <w:lang w:val="en-US"/>
               </w:rPr>
-              <w:t>3.4.1 Nếu hệ thống ghi nhận các chức năng người dùng đã thực hiện không thành công thì hệ thống thông báo “Hành động thất bại, vui lòng thử lại” đến người dùng.</w:t>
+              <w:t>3.3.1 Nếu hệ thống ghi nhận các chức năng người dùng đã thực hiện không thành công thì hệ thống thông báo “Hành động thất bại, vui lòng thử lại” đến người dùng.</w:t>
             </w:r>
           </w:p>
         </w:tc>
@@ -10928,7 +10898,7 @@
               <w:widowControl w:val="0"/>
               <w:numPr>
                 <w:ilvl w:val="0"/>
-                <w:numId w:val="48"/>
+                <w:numId w:val="47"/>
               </w:numPr>
               <w:jc w:val="both"/>
               <w:rPr>
@@ -11001,7 +10971,7 @@
               <w:widowControl w:val="0"/>
               <w:numPr>
                 <w:ilvl w:val="0"/>
-                <w:numId w:val="49"/>
+                <w:numId w:val="48"/>
               </w:numPr>
               <w:ind w:leftChars="0"/>
               <w:jc w:val="both"/>
@@ -11178,34 +11148,34 @@
               <w:widowControl w:val="0"/>
               <w:numPr>
                 <w:ilvl w:val="0"/>
-                <w:numId w:val="50"/>
-              </w:numPr>
-              <w:jc w:val="both"/>
-              <w:rPr>
-                <w:rFonts w:hint="default"/>
-                <w:sz w:val="32"/>
-                <w:szCs w:val="32"/>
-                <w:vertAlign w:val="baseline"/>
-                <w:lang w:val="en-US"/>
-              </w:rPr>
-            </w:pPr>
-            <w:r>
-              <w:rPr>
-                <w:rFonts w:hint="default"/>
-                <w:sz w:val="32"/>
-                <w:szCs w:val="32"/>
-                <w:vertAlign w:val="baseline"/>
-                <w:lang w:val="en-US"/>
-              </w:rPr>
-              <w:t>Hệ thống hiện giao diện gồm danh sách các bài hát mà người dùng đã thích và các nút chức năng thành công.</w:t>
-            </w:r>
-          </w:p>
-          <w:p>
-            <w:pPr>
-              <w:widowControl w:val="0"/>
-              <w:numPr>
-                <w:ilvl w:val="0"/>
-                <w:numId w:val="50"/>
+                <w:numId w:val="49"/>
+              </w:numPr>
+              <w:jc w:val="both"/>
+              <w:rPr>
+                <w:rFonts w:hint="default"/>
+                <w:sz w:val="32"/>
+                <w:szCs w:val="32"/>
+                <w:vertAlign w:val="baseline"/>
+                <w:lang w:val="en-US"/>
+              </w:rPr>
+            </w:pPr>
+            <w:r>
+              <w:rPr>
+                <w:rFonts w:hint="default"/>
+                <w:sz w:val="32"/>
+                <w:szCs w:val="32"/>
+                <w:vertAlign w:val="baseline"/>
+                <w:lang w:val="en-US"/>
+              </w:rPr>
+              <w:t>Hệ thống hiện giao diện Xem danh sách và tìm kiếm bài hất yêu thích thành công.</w:t>
+            </w:r>
+          </w:p>
+          <w:p>
+            <w:pPr>
+              <w:widowControl w:val="0"/>
+              <w:numPr>
+                <w:ilvl w:val="0"/>
+                <w:numId w:val="49"/>
               </w:numPr>
               <w:ind w:left="0" w:leftChars="0" w:firstLine="0" w:firstLineChars="0"/>
               <w:jc w:val="both"/>
@@ -11233,7 +11203,7 @@
               <w:widowControl w:val="0"/>
               <w:numPr>
                 <w:ilvl w:val="0"/>
-                <w:numId w:val="50"/>
+                <w:numId w:val="49"/>
               </w:numPr>
               <w:ind w:left="0" w:leftChars="0" w:firstLine="0" w:firstLineChars="0"/>
               <w:jc w:val="both"/>
@@ -11261,7 +11231,7 @@
               <w:widowControl w:val="0"/>
               <w:numPr>
                 <w:ilvl w:val="0"/>
-                <w:numId w:val="50"/>
+                <w:numId w:val="49"/>
               </w:numPr>
               <w:ind w:left="0" w:leftChars="0" w:firstLine="0" w:firstLineChars="0"/>
               <w:jc w:val="both"/>
@@ -11281,15 +11251,15 @@
                 <w:vertAlign w:val="baseline"/>
                 <w:lang w:val="en-US"/>
               </w:rPr>
-              <w:t>Hệ thống ghi nhận các chức năng người dùng đã thực hiện  với bài hát yêu thích đó vào cơ sở dữ liệu thành công.</w:t>
-            </w:r>
-          </w:p>
-          <w:p>
-            <w:pPr>
-              <w:widowControl w:val="0"/>
-              <w:numPr>
-                <w:ilvl w:val="0"/>
-                <w:numId w:val="50"/>
+              <w:t>Hệ thống ghi nhận các chức năng người dùng đã thực hiện  với bài hát yêu thích đó thành công.</w:t>
+            </w:r>
+          </w:p>
+          <w:p>
+            <w:pPr>
+              <w:widowControl w:val="0"/>
+              <w:numPr>
+                <w:ilvl w:val="0"/>
+                <w:numId w:val="49"/>
               </w:numPr>
               <w:ind w:left="0" w:leftChars="0" w:firstLine="0" w:firstLineChars="0"/>
               <w:jc w:val="both"/>
@@ -11436,7 +11406,7 @@
               <w:widowControl w:val="0"/>
               <w:numPr>
                 <w:ilvl w:val="0"/>
-                <w:numId w:val="51"/>
+                <w:numId w:val="50"/>
               </w:numPr>
               <w:jc w:val="both"/>
               <w:rPr>
@@ -11509,7 +11479,7 @@
               <w:widowControl w:val="0"/>
               <w:numPr>
                 <w:ilvl w:val="0"/>
-                <w:numId w:val="52"/>
+                <w:numId w:val="51"/>
               </w:numPr>
               <w:jc w:val="both"/>
               <w:rPr>
@@ -11682,34 +11652,34 @@
               <w:widowControl w:val="0"/>
               <w:numPr>
                 <w:ilvl w:val="0"/>
-                <w:numId w:val="53"/>
-              </w:numPr>
-              <w:jc w:val="both"/>
-              <w:rPr>
-                <w:rFonts w:hint="default"/>
-                <w:sz w:val="32"/>
-                <w:szCs w:val="32"/>
-                <w:vertAlign w:val="baseline"/>
-                <w:lang w:val="en-US"/>
-              </w:rPr>
-            </w:pPr>
-            <w:r>
-              <w:rPr>
-                <w:rFonts w:hint="default"/>
-                <w:sz w:val="32"/>
-                <w:szCs w:val="32"/>
-                <w:vertAlign w:val="baseline"/>
-                <w:lang w:val="en-US"/>
-              </w:rPr>
-              <w:t>Hệ thống hiện giao diện gồm danh sách các bài hát mà người dùng đã thích và các nút chức năng thành công.</w:t>
-            </w:r>
-          </w:p>
-          <w:p>
-            <w:pPr>
-              <w:widowControl w:val="0"/>
-              <w:numPr>
-                <w:ilvl w:val="0"/>
-                <w:numId w:val="53"/>
+                <w:numId w:val="52"/>
+              </w:numPr>
+              <w:jc w:val="both"/>
+              <w:rPr>
+                <w:rFonts w:hint="default"/>
+                <w:sz w:val="32"/>
+                <w:szCs w:val="32"/>
+                <w:vertAlign w:val="baseline"/>
+                <w:lang w:val="en-US"/>
+              </w:rPr>
+            </w:pPr>
+            <w:r>
+              <w:rPr>
+                <w:rFonts w:hint="default"/>
+                <w:sz w:val="32"/>
+                <w:szCs w:val="32"/>
+                <w:vertAlign w:val="baseline"/>
+                <w:lang w:val="en-US"/>
+              </w:rPr>
+              <w:t>Hệ thống hiện giao diện Xem danh sách và tìm kiếm bài hát đăng lại thành công.</w:t>
+            </w:r>
+          </w:p>
+          <w:p>
+            <w:pPr>
+              <w:widowControl w:val="0"/>
+              <w:numPr>
+                <w:ilvl w:val="0"/>
+                <w:numId w:val="52"/>
               </w:numPr>
               <w:ind w:left="0" w:leftChars="0" w:firstLine="0" w:firstLineChars="0"/>
               <w:jc w:val="both"/>
@@ -11729,15 +11699,15 @@
                 <w:vertAlign w:val="baseline"/>
                 <w:lang w:val="en-US"/>
               </w:rPr>
-              <w:t>Người dùng xem danh sách và tìm kiếm bài hát yêu thích.</w:t>
-            </w:r>
-          </w:p>
-          <w:p>
-            <w:pPr>
-              <w:widowControl w:val="0"/>
-              <w:numPr>
-                <w:ilvl w:val="0"/>
-                <w:numId w:val="53"/>
+              <w:t>Người dùng xem danh sách và tìm kiếm bài hát đăng lại.</w:t>
+            </w:r>
+          </w:p>
+          <w:p>
+            <w:pPr>
+              <w:widowControl w:val="0"/>
+              <w:numPr>
+                <w:ilvl w:val="0"/>
+                <w:numId w:val="52"/>
               </w:numPr>
               <w:ind w:left="0" w:leftChars="0" w:firstLine="0" w:firstLineChars="0"/>
               <w:jc w:val="both"/>
@@ -11765,7 +11735,7 @@
               <w:widowControl w:val="0"/>
               <w:numPr>
                 <w:ilvl w:val="0"/>
-                <w:numId w:val="53"/>
+                <w:numId w:val="52"/>
               </w:numPr>
               <w:ind w:left="0" w:leftChars="0" w:firstLine="0" w:firstLineChars="0"/>
               <w:jc w:val="both"/>
@@ -11785,15 +11755,15 @@
                 <w:vertAlign w:val="baseline"/>
                 <w:lang w:val="en-US"/>
               </w:rPr>
-              <w:t>Hệ thống ghi nhận các chức năng người dùng đã thực hiện  với bài hát đăng lại đó vào cơ sở dữ liệu thành công.</w:t>
-            </w:r>
-          </w:p>
-          <w:p>
-            <w:pPr>
-              <w:widowControl w:val="0"/>
-              <w:numPr>
-                <w:ilvl w:val="0"/>
-                <w:numId w:val="53"/>
+              <w:t>Hệ thống ghi nhận các chức năng người dùng đã thực hiện  với bài hát đăng lại đó thành công.</w:t>
+            </w:r>
+          </w:p>
+          <w:p>
+            <w:pPr>
+              <w:widowControl w:val="0"/>
+              <w:numPr>
+                <w:ilvl w:val="0"/>
+                <w:numId w:val="52"/>
               </w:numPr>
               <w:ind w:left="0" w:leftChars="0" w:firstLine="0" w:firstLineChars="0"/>
               <w:jc w:val="both"/>
@@ -11940,7 +11910,7 @@
               <w:widowControl w:val="0"/>
               <w:numPr>
                 <w:ilvl w:val="0"/>
-                <w:numId w:val="54"/>
+                <w:numId w:val="53"/>
               </w:numPr>
               <w:jc w:val="both"/>
               <w:rPr>
@@ -12013,7 +11983,7 @@
               <w:widowControl w:val="0"/>
               <w:numPr>
                 <w:ilvl w:val="0"/>
-                <w:numId w:val="55"/>
+                <w:numId w:val="54"/>
               </w:numPr>
               <w:jc w:val="both"/>
               <w:rPr>
@@ -12101,12 +12071,6 @@
             <w:insideH w:val="single" w:color="auto" w:sz="4" w:space="0"/>
             <w:insideV w:val="single" w:color="auto" w:sz="4" w:space="0"/>
           </w:tblBorders>
-          <w:tblCellMar>
-            <w:top w:w="0" w:type="dxa"/>
-            <w:left w:w="108" w:type="dxa"/>
-            <w:bottom w:w="0" w:type="dxa"/>
-            <w:right w:w="108" w:type="dxa"/>
-          </w:tblCellMar>
         </w:tblPrEx>
         <w:tc>
           <w:tcPr>
@@ -12186,7 +12150,7 @@
               <w:widowControl w:val="0"/>
               <w:numPr>
                 <w:ilvl w:val="0"/>
-                <w:numId w:val="56"/>
+                <w:numId w:val="55"/>
               </w:numPr>
               <w:jc w:val="both"/>
               <w:rPr>
@@ -12213,7 +12177,7 @@
               <w:widowControl w:val="0"/>
               <w:numPr>
                 <w:ilvl w:val="0"/>
-                <w:numId w:val="56"/>
+                <w:numId w:val="55"/>
               </w:numPr>
               <w:ind w:left="0" w:leftChars="0" w:firstLine="0" w:firstLineChars="0"/>
               <w:jc w:val="both"/>
@@ -12241,7 +12205,7 @@
               <w:widowControl w:val="0"/>
               <w:numPr>
                 <w:ilvl w:val="0"/>
-                <w:numId w:val="56"/>
+                <w:numId w:val="55"/>
               </w:numPr>
               <w:ind w:left="0" w:leftChars="0" w:firstLine="0" w:firstLineChars="0"/>
               <w:jc w:val="both"/>
@@ -12261,15 +12225,15 @@
                 <w:vertAlign w:val="baseline"/>
                 <w:lang w:val="en-US"/>
               </w:rPr>
-              <w:t>Hệ thống ghi nhận các thông tin mới của hồ sơ cá nhân vào cơ sở dữ liệu thành công.</w:t>
-            </w:r>
-          </w:p>
-          <w:p>
-            <w:pPr>
-              <w:widowControl w:val="0"/>
-              <w:numPr>
-                <w:ilvl w:val="0"/>
-                <w:numId w:val="56"/>
+              <w:t>Hệ thống ghi nhận và cập nhật các thông tin mới của hồ sơ cá nhân thành công.</w:t>
+            </w:r>
+          </w:p>
+          <w:p>
+            <w:pPr>
+              <w:widowControl w:val="0"/>
+              <w:numPr>
+                <w:ilvl w:val="0"/>
+                <w:numId w:val="55"/>
               </w:numPr>
               <w:ind w:left="0" w:leftChars="0" w:firstLine="0" w:firstLineChars="0"/>
               <w:jc w:val="both"/>
@@ -12362,7 +12326,7 @@
                 <w:vertAlign w:val="baseline"/>
                 <w:lang w:val="en-US"/>
               </w:rPr>
-              <w:t>3.1 Nếu hệ thống ghi nhận các thông tin mới không thành công thì hệ thống thông báo “Cập nhật hồ sơ thất bại, vui lòng thử lại” đến người dùng.</w:t>
+              <w:t>3.1 Nếu hệ thống ghi nhận và cập nhật các thông tin mới không thành công thì hệ thống thông báo “Sửa hồ sơ thất bại, vui lòng thử lại” đến người dùng.</w:t>
             </w:r>
           </w:p>
         </w:tc>
@@ -12416,7 +12380,7 @@
               <w:widowControl w:val="0"/>
               <w:numPr>
                 <w:ilvl w:val="0"/>
-                <w:numId w:val="57"/>
+                <w:numId w:val="56"/>
               </w:numPr>
               <w:jc w:val="both"/>
               <w:rPr>
@@ -12489,7 +12453,7 @@
               <w:widowControl w:val="0"/>
               <w:numPr>
                 <w:ilvl w:val="0"/>
-                <w:numId w:val="58"/>
+                <w:numId w:val="57"/>
               </w:numPr>
               <w:jc w:val="both"/>
               <w:rPr>
@@ -12662,7 +12626,7 @@
               <w:widowControl w:val="0"/>
               <w:numPr>
                 <w:ilvl w:val="0"/>
-                <w:numId w:val="59"/>
+                <w:numId w:val="58"/>
               </w:numPr>
               <w:jc w:val="both"/>
               <w:rPr>
@@ -12689,7 +12653,7 @@
               <w:widowControl w:val="0"/>
               <w:numPr>
                 <w:ilvl w:val="0"/>
-                <w:numId w:val="59"/>
+                <w:numId w:val="58"/>
               </w:numPr>
               <w:ind w:left="0" w:leftChars="0" w:firstLine="0" w:firstLineChars="0"/>
               <w:jc w:val="both"/>
@@ -12717,7 +12681,7 @@
               <w:widowControl w:val="0"/>
               <w:numPr>
                 <w:ilvl w:val="0"/>
-                <w:numId w:val="59"/>
+                <w:numId w:val="58"/>
               </w:numPr>
               <w:ind w:left="0" w:leftChars="0" w:firstLine="0" w:firstLineChars="0"/>
               <w:jc w:val="both"/>
@@ -12745,7 +12709,7 @@
               <w:widowControl w:val="0"/>
               <w:numPr>
                 <w:ilvl w:val="0"/>
-                <w:numId w:val="59"/>
+                <w:numId w:val="58"/>
               </w:numPr>
               <w:ind w:left="0" w:leftChars="0" w:firstLine="0" w:firstLineChars="0"/>
               <w:jc w:val="both"/>
@@ -12773,7 +12737,7 @@
               <w:widowControl w:val="0"/>
               <w:numPr>
                 <w:ilvl w:val="0"/>
-                <w:numId w:val="59"/>
+                <w:numId w:val="58"/>
               </w:numPr>
               <w:ind w:left="0" w:leftChars="0" w:firstLine="0" w:firstLineChars="0"/>
               <w:jc w:val="both"/>
@@ -12793,15 +12757,15 @@
                 <w:vertAlign w:val="baseline"/>
                 <w:lang w:val="en-US"/>
               </w:rPr>
-              <w:t>Hệ thống ghi nhận các thông tin mới của tài khoản cá nhân vào cơ sở dữ liệu thành công.</w:t>
-            </w:r>
-          </w:p>
-          <w:p>
-            <w:pPr>
-              <w:widowControl w:val="0"/>
-              <w:numPr>
-                <w:ilvl w:val="0"/>
-                <w:numId w:val="59"/>
+              <w:t>Hệ thống ghi nhận các thông tin mới của tài khoản cá nhân  thành công.</w:t>
+            </w:r>
+          </w:p>
+          <w:p>
+            <w:pPr>
+              <w:widowControl w:val="0"/>
+              <w:numPr>
+                <w:ilvl w:val="0"/>
+                <w:numId w:val="58"/>
               </w:numPr>
               <w:ind w:left="0" w:leftChars="0" w:firstLine="0" w:firstLineChars="0"/>
               <w:jc w:val="both"/>
@@ -12894,7 +12858,7 @@
                 <w:vertAlign w:val="baseline"/>
                 <w:lang w:val="en-US"/>
               </w:rPr>
-              <w:t>5.1 Nếu hệ thống ghi nhận các thông tin mới không thành công thì hệ thống thông báo “Cập nhật tài khoản thất bại, vui lòng thử lại” đến người dùng.</w:t>
+              <w:t>5.1 Nếu hệ thống ghi nhận các thông tin mới không thành công thì hệ thống thông báo “Sửa tài khoản thất bại, vui lòng thử lại” đến người dùng.</w:t>
             </w:r>
           </w:p>
         </w:tc>
@@ -12948,7 +12912,7 @@
               <w:widowControl w:val="0"/>
               <w:numPr>
                 <w:ilvl w:val="0"/>
-                <w:numId w:val="60"/>
+                <w:numId w:val="59"/>
               </w:numPr>
               <w:jc w:val="both"/>
               <w:rPr>
@@ -13021,7 +12985,7 @@
               <w:widowControl w:val="0"/>
               <w:numPr>
                 <w:ilvl w:val="0"/>
-                <w:numId w:val="61"/>
+                <w:numId w:val="60"/>
               </w:numPr>
               <w:jc w:val="both"/>
               <w:rPr>
@@ -13194,34 +13158,34 @@
               <w:widowControl w:val="0"/>
               <w:numPr>
                 <w:ilvl w:val="0"/>
-                <w:numId w:val="62"/>
-              </w:numPr>
-              <w:jc w:val="both"/>
-              <w:rPr>
-                <w:rFonts w:hint="default"/>
-                <w:sz w:val="32"/>
-                <w:szCs w:val="32"/>
-                <w:vertAlign w:val="baseline"/>
-                <w:lang w:val="en-US"/>
-              </w:rPr>
-            </w:pPr>
-            <w:r>
-              <w:rPr>
-                <w:rFonts w:hint="default"/>
-                <w:sz w:val="32"/>
-                <w:szCs w:val="32"/>
-                <w:vertAlign w:val="baseline"/>
-                <w:lang w:val="en-US"/>
-              </w:rPr>
-              <w:t>Hệ thống hiện giao diện gồm danh sách Playlist cá nhân và các nút chức năng để người dùng chọn thành công.</w:t>
-            </w:r>
-          </w:p>
-          <w:p>
-            <w:pPr>
-              <w:widowControl w:val="0"/>
-              <w:numPr>
-                <w:ilvl w:val="0"/>
-                <w:numId w:val="62"/>
+                <w:numId w:val="61"/>
+              </w:numPr>
+              <w:jc w:val="both"/>
+              <w:rPr>
+                <w:rFonts w:hint="default"/>
+                <w:sz w:val="32"/>
+                <w:szCs w:val="32"/>
+                <w:vertAlign w:val="baseline"/>
+                <w:lang w:val="en-US"/>
+              </w:rPr>
+            </w:pPr>
+            <w:r>
+              <w:rPr>
+                <w:rFonts w:hint="default"/>
+                <w:sz w:val="32"/>
+                <w:szCs w:val="32"/>
+                <w:vertAlign w:val="baseline"/>
+                <w:lang w:val="en-US"/>
+              </w:rPr>
+              <w:t>Hệ thống hiện giao diện Quản lý Playlist thành công.</w:t>
+            </w:r>
+          </w:p>
+          <w:p>
+            <w:pPr>
+              <w:widowControl w:val="0"/>
+              <w:numPr>
+                <w:ilvl w:val="0"/>
+                <w:numId w:val="61"/>
               </w:numPr>
               <w:ind w:left="0" w:leftChars="0" w:firstLine="0" w:firstLineChars="0"/>
               <w:jc w:val="both"/>
@@ -13249,7 +13213,7 @@
               <w:widowControl w:val="0"/>
               <w:numPr>
                 <w:ilvl w:val="0"/>
-                <w:numId w:val="62"/>
+                <w:numId w:val="61"/>
               </w:numPr>
               <w:ind w:left="0" w:leftChars="0" w:firstLine="0" w:firstLineChars="0"/>
               <w:jc w:val="both"/>
@@ -13353,15 +13317,15 @@
                 <w:vertAlign w:val="baseline"/>
                 <w:lang w:val="en-US"/>
               </w:rPr>
-              <w:t>3.3/ Người dùng chọn 1 Playlist cần xoá và chọn Xoá Playlist cá nhân. Hệ thống ghi nhận vào cơ sở dữ liệu và xoá Playlist đó ra khỏi danh sách Playlist cá nhân thành công.</w:t>
-            </w:r>
-          </w:p>
-          <w:p>
-            <w:pPr>
-              <w:widowControl w:val="0"/>
-              <w:numPr>
-                <w:ilvl w:val="0"/>
-                <w:numId w:val="62"/>
+              <w:t>3.3/ Người dùng chọn 1 Playlist cần xoá và chọn Xoá Playlist cá nhân. Hệ thống ghi nhận và xoá Playlist đó ra khỏi danh sách Playlist cá nhân thành công.</w:t>
+            </w:r>
+          </w:p>
+          <w:p>
+            <w:pPr>
+              <w:widowControl w:val="0"/>
+              <w:numPr>
+                <w:ilvl w:val="0"/>
+                <w:numId w:val="61"/>
               </w:numPr>
               <w:ind w:left="0" w:leftChars="0" w:firstLine="0" w:firstLineChars="0"/>
               <w:jc w:val="both"/>
@@ -13508,7 +13472,7 @@
               <w:widowControl w:val="0"/>
               <w:numPr>
                 <w:ilvl w:val="0"/>
-                <w:numId w:val="63"/>
+                <w:numId w:val="62"/>
               </w:numPr>
               <w:jc w:val="both"/>
               <w:rPr>
@@ -13535,7 +13499,7 @@
               <w:widowControl w:val="0"/>
               <w:numPr>
                 <w:ilvl w:val="0"/>
-                <w:numId w:val="63"/>
+                <w:numId w:val="62"/>
               </w:numPr>
               <w:jc w:val="both"/>
               <w:rPr>
@@ -13608,7 +13572,7 @@
               <w:widowControl w:val="0"/>
               <w:numPr>
                 <w:ilvl w:val="0"/>
-                <w:numId w:val="64"/>
+                <w:numId w:val="63"/>
               </w:numPr>
               <w:ind w:leftChars="0"/>
               <w:jc w:val="both"/>
@@ -13782,7 +13746,7 @@
               <w:widowControl w:val="0"/>
               <w:numPr>
                 <w:ilvl w:val="0"/>
-                <w:numId w:val="65"/>
+                <w:numId w:val="64"/>
               </w:numPr>
               <w:jc w:val="both"/>
               <w:rPr>
@@ -13809,7 +13773,7 @@
               <w:widowControl w:val="0"/>
               <w:numPr>
                 <w:ilvl w:val="0"/>
-                <w:numId w:val="65"/>
+                <w:numId w:val="64"/>
               </w:numPr>
               <w:ind w:left="0" w:leftChars="0" w:firstLine="0" w:firstLineChars="0"/>
               <w:jc w:val="both"/>
@@ -13837,7 +13801,7 @@
               <w:widowControl w:val="0"/>
               <w:numPr>
                 <w:ilvl w:val="0"/>
-                <w:numId w:val="65"/>
+                <w:numId w:val="64"/>
               </w:numPr>
               <w:ind w:left="0" w:leftChars="0" w:firstLine="0" w:firstLineChars="0"/>
               <w:jc w:val="both"/>
@@ -13857,15 +13821,15 @@
                 <w:vertAlign w:val="baseline"/>
                 <w:lang w:val="en-US"/>
               </w:rPr>
-              <w:t>Hệ thống ghi nhận Playlist mới vào danh sách Playlist cá nhân của người dùng trong cơ sở dữ liệu thành công.</w:t>
-            </w:r>
-          </w:p>
-          <w:p>
-            <w:pPr>
-              <w:widowControl w:val="0"/>
-              <w:numPr>
-                <w:ilvl w:val="0"/>
-                <w:numId w:val="65"/>
+              <w:t>Hệ thống ghi nhận Playlist mới vào danh sách Playlist cá nhân của người dùng thành công.</w:t>
+            </w:r>
+          </w:p>
+          <w:p>
+            <w:pPr>
+              <w:widowControl w:val="0"/>
+              <w:numPr>
+                <w:ilvl w:val="0"/>
+                <w:numId w:val="64"/>
               </w:numPr>
               <w:ind w:left="0" w:leftChars="0" w:firstLine="0" w:firstLineChars="0"/>
               <w:jc w:val="both"/>
@@ -14012,7 +13976,7 @@
               <w:widowControl w:val="0"/>
               <w:numPr>
                 <w:ilvl w:val="0"/>
-                <w:numId w:val="66"/>
+                <w:numId w:val="65"/>
               </w:numPr>
               <w:jc w:val="both"/>
               <w:rPr>
@@ -14085,7 +14049,7 @@
               <w:widowControl w:val="0"/>
               <w:numPr>
                 <w:ilvl w:val="0"/>
-                <w:numId w:val="67"/>
+                <w:numId w:val="66"/>
               </w:numPr>
               <w:ind w:leftChars="0"/>
               <w:jc w:val="both"/>
@@ -14174,6 +14138,12 @@
             <w:insideH w:val="single" w:color="auto" w:sz="4" w:space="0"/>
             <w:insideV w:val="single" w:color="auto" w:sz="4" w:space="0"/>
           </w:tblBorders>
+          <w:tblCellMar>
+            <w:top w:w="0" w:type="dxa"/>
+            <w:left w:w="108" w:type="dxa"/>
+            <w:bottom w:w="0" w:type="dxa"/>
+            <w:right w:w="108" w:type="dxa"/>
+          </w:tblCellMar>
         </w:tblPrEx>
         <w:tc>
           <w:tcPr>
@@ -14253,34 +14223,34 @@
               <w:widowControl w:val="0"/>
               <w:numPr>
                 <w:ilvl w:val="0"/>
-                <w:numId w:val="68"/>
-              </w:numPr>
-              <w:jc w:val="both"/>
-              <w:rPr>
-                <w:rFonts w:hint="default"/>
-                <w:sz w:val="32"/>
-                <w:szCs w:val="32"/>
-                <w:vertAlign w:val="baseline"/>
-                <w:lang w:val="en-US"/>
-              </w:rPr>
-            </w:pPr>
-            <w:r>
-              <w:rPr>
-                <w:rFonts w:hint="default"/>
-                <w:sz w:val="32"/>
-                <w:szCs w:val="32"/>
-                <w:vertAlign w:val="baseline"/>
-                <w:lang w:val="en-US"/>
-              </w:rPr>
-              <w:t>Hệ thống hiện giao diện gồm danh sách bài hát trong Playlist và các nút chức năng để người dùng chọn thành công.</w:t>
-            </w:r>
-          </w:p>
-          <w:p>
-            <w:pPr>
-              <w:widowControl w:val="0"/>
-              <w:numPr>
-                <w:ilvl w:val="0"/>
-                <w:numId w:val="68"/>
+                <w:numId w:val="67"/>
+              </w:numPr>
+              <w:jc w:val="both"/>
+              <w:rPr>
+                <w:rFonts w:hint="default"/>
+                <w:sz w:val="32"/>
+                <w:szCs w:val="32"/>
+                <w:vertAlign w:val="baseline"/>
+                <w:lang w:val="en-US"/>
+              </w:rPr>
+            </w:pPr>
+            <w:r>
+              <w:rPr>
+                <w:rFonts w:hint="default"/>
+                <w:sz w:val="32"/>
+                <w:szCs w:val="32"/>
+                <w:vertAlign w:val="baseline"/>
+                <w:lang w:val="en-US"/>
+              </w:rPr>
+              <w:t>Hệ thống hiện giao diện Quản lý chi tiết Playlist cá nhân thành công.</w:t>
+            </w:r>
+          </w:p>
+          <w:p>
+            <w:pPr>
+              <w:widowControl w:val="0"/>
+              <w:numPr>
+                <w:ilvl w:val="0"/>
+                <w:numId w:val="67"/>
               </w:numPr>
               <w:ind w:left="0" w:leftChars="0" w:firstLine="0" w:firstLineChars="0"/>
               <w:jc w:val="both"/>
@@ -14392,7 +14362,7 @@
               <w:widowControl w:val="0"/>
               <w:numPr>
                 <w:ilvl w:val="0"/>
-                <w:numId w:val="68"/>
+                <w:numId w:val="67"/>
               </w:numPr>
               <w:ind w:left="0" w:leftChars="0" w:firstLine="0" w:firstLineChars="0"/>
               <w:jc w:val="both"/>
@@ -14539,7 +14509,7 @@
               <w:widowControl w:val="0"/>
               <w:numPr>
                 <w:ilvl w:val="0"/>
-                <w:numId w:val="69"/>
+                <w:numId w:val="68"/>
               </w:numPr>
               <w:jc w:val="both"/>
               <w:rPr>
@@ -14566,7 +14536,7 @@
               <w:widowControl w:val="0"/>
               <w:numPr>
                 <w:ilvl w:val="0"/>
-                <w:numId w:val="69"/>
+                <w:numId w:val="68"/>
               </w:numPr>
               <w:ind w:left="0" w:leftChars="0" w:firstLine="0" w:firstLineChars="0"/>
               <w:jc w:val="both"/>
@@ -14640,7 +14610,7 @@
               <w:widowControl w:val="0"/>
               <w:numPr>
                 <w:ilvl w:val="0"/>
-                <w:numId w:val="70"/>
+                <w:numId w:val="69"/>
               </w:numPr>
               <w:ind w:leftChars="0"/>
               <w:jc w:val="both"/>
@@ -14814,7 +14784,7 @@
               <w:widowControl w:val="0"/>
               <w:numPr>
                 <w:ilvl w:val="0"/>
-                <w:numId w:val="71"/>
+                <w:numId w:val="70"/>
               </w:numPr>
               <w:jc w:val="both"/>
               <w:rPr>
@@ -14841,7 +14811,7 @@
               <w:widowControl w:val="0"/>
               <w:numPr>
                 <w:ilvl w:val="0"/>
-                <w:numId w:val="71"/>
+                <w:numId w:val="70"/>
               </w:numPr>
               <w:ind w:left="0" w:leftChars="0" w:firstLine="0" w:firstLineChars="0"/>
               <w:jc w:val="both"/>
@@ -14869,7 +14839,7 @@
               <w:widowControl w:val="0"/>
               <w:numPr>
                 <w:ilvl w:val="0"/>
-                <w:numId w:val="71"/>
+                <w:numId w:val="70"/>
               </w:numPr>
               <w:ind w:left="0" w:leftChars="0" w:firstLine="0" w:firstLineChars="0"/>
               <w:jc w:val="both"/>
@@ -14889,15 +14859,15 @@
                 <w:vertAlign w:val="baseline"/>
                 <w:lang w:val="en-US"/>
               </w:rPr>
-              <w:t>Hệ thống ghi nhận bài hát mới vào danh sách bài hát của Playlist vào cơ sở dữ liệu thành công.</w:t>
-            </w:r>
-          </w:p>
-          <w:p>
-            <w:pPr>
-              <w:widowControl w:val="0"/>
-              <w:numPr>
-                <w:ilvl w:val="0"/>
-                <w:numId w:val="71"/>
+              <w:t>Hệ thống ghi nhận bài hát mới vào danh sách bài hát của Playlist thành công.</w:t>
+            </w:r>
+          </w:p>
+          <w:p>
+            <w:pPr>
+              <w:widowControl w:val="0"/>
+              <w:numPr>
+                <w:ilvl w:val="0"/>
+                <w:numId w:val="70"/>
               </w:numPr>
               <w:ind w:left="0" w:leftChars="0" w:firstLine="0" w:firstLineChars="0"/>
               <w:jc w:val="both"/>
@@ -15044,7 +15014,7 @@
               <w:widowControl w:val="0"/>
               <w:numPr>
                 <w:ilvl w:val="0"/>
-                <w:numId w:val="72"/>
+                <w:numId w:val="71"/>
               </w:numPr>
               <w:jc w:val="both"/>
               <w:rPr>
@@ -15117,7 +15087,7 @@
               <w:widowControl w:val="0"/>
               <w:numPr>
                 <w:ilvl w:val="0"/>
-                <w:numId w:val="73"/>
+                <w:numId w:val="72"/>
               </w:numPr>
               <w:jc w:val="both"/>
               <w:rPr>
@@ -15290,7 +15260,7 @@
               <w:widowControl w:val="0"/>
               <w:numPr>
                 <w:ilvl w:val="0"/>
-                <w:numId w:val="74"/>
+                <w:numId w:val="73"/>
               </w:numPr>
               <w:jc w:val="both"/>
               <w:rPr>
@@ -15317,7 +15287,7 @@
               <w:widowControl w:val="0"/>
               <w:numPr>
                 <w:ilvl w:val="0"/>
-                <w:numId w:val="74"/>
+                <w:numId w:val="73"/>
               </w:numPr>
               <w:ind w:left="0" w:leftChars="0" w:firstLine="0" w:firstLineChars="0"/>
               <w:jc w:val="both"/>
@@ -15345,7 +15315,7 @@
               <w:widowControl w:val="0"/>
               <w:numPr>
                 <w:ilvl w:val="0"/>
-                <w:numId w:val="74"/>
+                <w:numId w:val="73"/>
               </w:numPr>
               <w:ind w:left="0" w:leftChars="0" w:firstLine="0" w:firstLineChars="0"/>
               <w:jc w:val="both"/>
@@ -15365,15 +15335,15 @@
                 <w:vertAlign w:val="baseline"/>
                 <w:lang w:val="en-US"/>
               </w:rPr>
-              <w:t>Hệ thống ghi nhận thông tin mới của Playlist vào cơ sở dữ liệu thành công.</w:t>
-            </w:r>
-          </w:p>
-          <w:p>
-            <w:pPr>
-              <w:widowControl w:val="0"/>
-              <w:numPr>
-                <w:ilvl w:val="0"/>
-                <w:numId w:val="74"/>
+              <w:t>Hệ thống ghi nhận thông tin mới của Playlist thành công.</w:t>
+            </w:r>
+          </w:p>
+          <w:p>
+            <w:pPr>
+              <w:widowControl w:val="0"/>
+              <w:numPr>
+                <w:ilvl w:val="0"/>
+                <w:numId w:val="73"/>
               </w:numPr>
               <w:ind w:left="0" w:leftChars="0" w:firstLine="0" w:firstLineChars="0"/>
               <w:jc w:val="both"/>
@@ -15447,7 +15417,7 @@
               <w:widowControl w:val="0"/>
               <w:numPr>
                 <w:ilvl w:val="0"/>
-                <w:numId w:val="75"/>
+                <w:numId w:val="74"/>
               </w:numPr>
               <w:jc w:val="both"/>
               <w:rPr>
@@ -15520,7 +15490,7 @@
               <w:widowControl w:val="0"/>
               <w:numPr>
                 <w:ilvl w:val="0"/>
-                <w:numId w:val="76"/>
+                <w:numId w:val="75"/>
               </w:numPr>
               <w:jc w:val="both"/>
               <w:rPr>
@@ -15593,7 +15563,7 @@
               <w:widowControl w:val="0"/>
               <w:numPr>
                 <w:ilvl w:val="0"/>
-                <w:numId w:val="77"/>
+                <w:numId w:val="76"/>
               </w:numPr>
               <w:ind w:leftChars="0"/>
               <w:jc w:val="both"/>
@@ -15615,6 +15585,8 @@
               </w:rPr>
               <w:t>Hệ thống sẵn sàng để thực hiện chức năng Sửa thông tin Playlist tiếp theo mà người dùng yêu cầu.</w:t>
             </w:r>
+            <w:bookmarkStart w:id="0" w:name="_GoBack"/>
+            <w:bookmarkEnd w:id="0"/>
           </w:p>
         </w:tc>
       </w:tr>
@@ -15641,7 +15613,7 @@
 <w:numbering xmlns:wpc="http://schemas.microsoft.com/office/word/2010/wordprocessingCanvas" xmlns:mc="http://schemas.openxmlformats.org/markup-compatibility/2006" xmlns:o="urn:schemas-microsoft-com:office:office" xmlns:r="http://schemas.openxmlformats.org/officeDocument/2006/relationships" xmlns:m="http://schemas.openxmlformats.org/officeDocument/2006/math" xmlns:v="urn:schemas-microsoft-com:vml" xmlns:wp14="http://schemas.microsoft.com/office/word/2010/wordprocessingDrawing" xmlns:wp="http://schemas.openxmlformats.org/drawingml/2006/wordprocessingDrawing" xmlns:w10="urn:schemas-microsoft-com:office:word" xmlns:w="http://schemas.openxmlformats.org/wordprocessingml/2006/main" xmlns:w14="http://schemas.microsoft.com/office/word/2010/wordml" xmlns:wpg="http://schemas.microsoft.com/office/word/2010/wordprocessingGroup" xmlns:wpi="http://schemas.microsoft.com/office/word/2010/wordprocessingInk" xmlns:wne="http://schemas.microsoft.com/office/word/2006/wordml" xmlns:wps="http://schemas.microsoft.com/office/word/2010/wordprocessingShape" xmlns:wpsCustomData="http://www.wps.cn/officeDocument/2013/wpsCustomData" mc:Ignorable="w14 wp14">
   <w:abstractNum w:abstractNumId="0">
     <w:nsid w:val="82846593"/>
-    <w:multiLevelType w:val="singleLevel"/>
+    <w:multiLevelType w:val="multilevel"/>
     <w:tmpl w:val="82846593"/>
     <w:lvl w:ilvl="0" w:tentative="0">
       <w:start w:val="1"/>
@@ -15649,6 +15621,110 @@
       <w:suff w:val="space"/>
       <w:lvlText w:val="%1."/>
       <w:lvlJc w:val="left"/>
+    </w:lvl>
+    <w:lvl w:ilvl="1" w:tentative="0">
+      <w:start w:val="1"/>
+      <w:numFmt w:val="decimal"/>
+      <w:suff w:val="space"/>
+      <w:lvlText w:val="%1.%2"/>
+      <w:lvlJc w:val="left"/>
+      <w:pPr>
+        <w:ind w:left="0" w:leftChars="0" w:firstLine="0" w:firstLineChars="0"/>
+      </w:pPr>
+      <w:rPr>
+        <w:rFonts w:hint="default"/>
+      </w:rPr>
+    </w:lvl>
+    <w:lvl w:ilvl="2" w:tentative="0">
+      <w:start w:val="1"/>
+      <w:numFmt w:val="decimal"/>
+      <w:suff w:val="space"/>
+      <w:lvlText w:val="%1.%2.%3"/>
+      <w:lvlJc w:val="left"/>
+      <w:pPr>
+        <w:ind w:left="0" w:leftChars="0" w:firstLine="0" w:firstLineChars="0"/>
+      </w:pPr>
+      <w:rPr>
+        <w:rFonts w:hint="default"/>
+      </w:rPr>
+    </w:lvl>
+    <w:lvl w:ilvl="3" w:tentative="0">
+      <w:start w:val="1"/>
+      <w:numFmt w:val="decimal"/>
+      <w:suff w:val="space"/>
+      <w:lvlText w:val="%1.%2.%3.%4"/>
+      <w:lvlJc w:val="left"/>
+      <w:pPr>
+        <w:ind w:left="0" w:leftChars="0" w:firstLine="0" w:firstLineChars="0"/>
+      </w:pPr>
+      <w:rPr>
+        <w:rFonts w:hint="default"/>
+      </w:rPr>
+    </w:lvl>
+    <w:lvl w:ilvl="4" w:tentative="0">
+      <w:start w:val="1"/>
+      <w:numFmt w:val="decimal"/>
+      <w:suff w:val="space"/>
+      <w:lvlText w:val="%1.%2.%3.%4.%5"/>
+      <w:lvlJc w:val="left"/>
+      <w:pPr>
+        <w:ind w:left="0" w:leftChars="0" w:firstLine="0" w:firstLineChars="0"/>
+      </w:pPr>
+      <w:rPr>
+        <w:rFonts w:hint="default"/>
+      </w:rPr>
+    </w:lvl>
+    <w:lvl w:ilvl="5" w:tentative="0">
+      <w:start w:val="1"/>
+      <w:numFmt w:val="decimal"/>
+      <w:suff w:val="space"/>
+      <w:lvlText w:val="%1.%2.%3.%4.%5.%6"/>
+      <w:lvlJc w:val="left"/>
+      <w:pPr>
+        <w:ind w:left="0" w:leftChars="0" w:firstLine="0" w:firstLineChars="0"/>
+      </w:pPr>
+      <w:rPr>
+        <w:rFonts w:hint="default"/>
+      </w:rPr>
+    </w:lvl>
+    <w:lvl w:ilvl="6" w:tentative="0">
+      <w:start w:val="1"/>
+      <w:numFmt w:val="decimal"/>
+      <w:suff w:val="space"/>
+      <w:lvlText w:val="%1.%2.%3.%4.%5.%6.%7"/>
+      <w:lvlJc w:val="left"/>
+      <w:pPr>
+        <w:ind w:left="0" w:leftChars="0" w:firstLine="0" w:firstLineChars="0"/>
+      </w:pPr>
+      <w:rPr>
+        <w:rFonts w:hint="default"/>
+      </w:rPr>
+    </w:lvl>
+    <w:lvl w:ilvl="7" w:tentative="0">
+      <w:start w:val="1"/>
+      <w:numFmt w:val="decimal"/>
+      <w:suff w:val="space"/>
+      <w:lvlText w:val="%1.%2.%3.%4.%5.%6.%7.%8"/>
+      <w:lvlJc w:val="left"/>
+      <w:pPr>
+        <w:ind w:left="0" w:leftChars="0" w:firstLine="0" w:firstLineChars="0"/>
+      </w:pPr>
+      <w:rPr>
+        <w:rFonts w:hint="default"/>
+      </w:rPr>
+    </w:lvl>
+    <w:lvl w:ilvl="8" w:tentative="0">
+      <w:start w:val="1"/>
+      <w:numFmt w:val="decimal"/>
+      <w:suff w:val="space"/>
+      <w:lvlText w:val="%1.%2.%3.%4.%5.%6.%7.%8.%9"/>
+      <w:lvlJc w:val="left"/>
+      <w:pPr>
+        <w:ind w:left="0" w:leftChars="0" w:firstLine="0" w:firstLineChars="0"/>
+      </w:pPr>
+      <w:rPr>
+        <w:rFonts w:hint="default"/>
+      </w:rPr>
     </w:lvl>
   </w:abstractNum>
   <w:abstractNum w:abstractNumId="1">
@@ -15676,18 +15752,6 @@
     </w:lvl>
   </w:abstractNum>
   <w:abstractNum w:abstractNumId="3">
-    <w:nsid w:val="84CB2D7B"/>
-    <w:multiLevelType w:val="singleLevel"/>
-    <w:tmpl w:val="84CB2D7B"/>
-    <w:lvl w:ilvl="0" w:tentative="0">
-      <w:start w:val="1"/>
-      <w:numFmt w:val="decimal"/>
-      <w:suff w:val="space"/>
-      <w:lvlText w:val="%1."/>
-      <w:lvlJc w:val="left"/>
-    </w:lvl>
-  </w:abstractNum>
-  <w:abstractNum w:abstractNumId="4">
     <w:nsid w:val="86AA190F"/>
     <w:multiLevelType w:val="singleLevel"/>
     <w:tmpl w:val="86AA190F"/>
@@ -15699,7 +15763,7 @@
       <w:lvlJc w:val="left"/>
     </w:lvl>
   </w:abstractNum>
-  <w:abstractNum w:abstractNumId="5">
+  <w:abstractNum w:abstractNumId="4">
     <w:nsid w:val="87971B54"/>
     <w:multiLevelType w:val="singleLevel"/>
     <w:tmpl w:val="87971B54"/>
@@ -15711,7 +15775,7 @@
       <w:lvlJc w:val="left"/>
     </w:lvl>
   </w:abstractNum>
-  <w:abstractNum w:abstractNumId="6">
+  <w:abstractNum w:abstractNumId="5">
     <w:nsid w:val="8883A999"/>
     <w:multiLevelType w:val="singleLevel"/>
     <w:tmpl w:val="8883A999"/>
@@ -15723,7 +15787,7 @@
       <w:lvlJc w:val="left"/>
     </w:lvl>
   </w:abstractNum>
-  <w:abstractNum w:abstractNumId="7">
+  <w:abstractNum w:abstractNumId="6">
     <w:nsid w:val="8DBC8CEF"/>
     <w:multiLevelType w:val="singleLevel"/>
     <w:tmpl w:val="8DBC8CEF"/>
@@ -15735,7 +15799,7 @@
       <w:lvlJc w:val="left"/>
     </w:lvl>
   </w:abstractNum>
-  <w:abstractNum w:abstractNumId="8">
+  <w:abstractNum w:abstractNumId="7">
     <w:nsid w:val="92EF6321"/>
     <w:multiLevelType w:val="singleLevel"/>
     <w:tmpl w:val="92EF6321"/>
@@ -15747,7 +15811,7 @@
       <w:lvlJc w:val="left"/>
     </w:lvl>
   </w:abstractNum>
-  <w:abstractNum w:abstractNumId="9">
+  <w:abstractNum w:abstractNumId="8">
     <w:nsid w:val="94F60664"/>
     <w:multiLevelType w:val="singleLevel"/>
     <w:tmpl w:val="94F60664"/>
@@ -15759,7 +15823,7 @@
       <w:lvlJc w:val="left"/>
     </w:lvl>
   </w:abstractNum>
-  <w:abstractNum w:abstractNumId="10">
+  <w:abstractNum w:abstractNumId="9">
     <w:nsid w:val="98827319"/>
     <w:multiLevelType w:val="singleLevel"/>
     <w:tmpl w:val="98827319"/>
@@ -15771,7 +15835,7 @@
       <w:lvlJc w:val="left"/>
     </w:lvl>
   </w:abstractNum>
-  <w:abstractNum w:abstractNumId="11">
+  <w:abstractNum w:abstractNumId="10">
     <w:nsid w:val="98985596"/>
     <w:multiLevelType w:val="singleLevel"/>
     <w:tmpl w:val="98985596"/>
@@ -15783,7 +15847,7 @@
       <w:lvlJc w:val="left"/>
     </w:lvl>
   </w:abstractNum>
-  <w:abstractNum w:abstractNumId="12">
+  <w:abstractNum w:abstractNumId="11">
     <w:nsid w:val="9E09ABE2"/>
     <w:multiLevelType w:val="multilevel"/>
     <w:tmpl w:val="9E09ABE2"/>
@@ -15923,7 +15987,7 @@
       </w:rPr>
     </w:lvl>
   </w:abstractNum>
-  <w:abstractNum w:abstractNumId="13">
+  <w:abstractNum w:abstractNumId="12">
     <w:nsid w:val="A0B38EB9"/>
     <w:multiLevelType w:val="singleLevel"/>
     <w:tmpl w:val="A0B38EB9"/>
@@ -15935,7 +15999,7 @@
       <w:lvlJc w:val="left"/>
     </w:lvl>
   </w:abstractNum>
-  <w:abstractNum w:abstractNumId="14">
+  <w:abstractNum w:abstractNumId="13">
     <w:nsid w:val="A47B5E06"/>
     <w:multiLevelType w:val="singleLevel"/>
     <w:tmpl w:val="A47B5E06"/>
@@ -15947,7 +16011,7 @@
       <w:lvlJc w:val="left"/>
     </w:lvl>
   </w:abstractNum>
-  <w:abstractNum w:abstractNumId="15">
+  <w:abstractNum w:abstractNumId="14">
     <w:nsid w:val="A5D72E53"/>
     <w:multiLevelType w:val="multilevel"/>
     <w:tmpl w:val="A5D72E53"/>
@@ -16087,7 +16151,7 @@
       </w:rPr>
     </w:lvl>
   </w:abstractNum>
-  <w:abstractNum w:abstractNumId="16">
+  <w:abstractNum w:abstractNumId="15">
     <w:nsid w:val="AB2CD29A"/>
     <w:multiLevelType w:val="singleLevel"/>
     <w:tmpl w:val="AB2CD29A"/>
@@ -16099,7 +16163,7 @@
       <w:lvlJc w:val="left"/>
     </w:lvl>
   </w:abstractNum>
-  <w:abstractNum w:abstractNumId="17">
+  <w:abstractNum w:abstractNumId="16">
     <w:nsid w:val="B0E25511"/>
     <w:multiLevelType w:val="singleLevel"/>
     <w:tmpl w:val="B0E25511"/>
@@ -16115,7 +16179,7 @@
       </w:pPr>
     </w:lvl>
   </w:abstractNum>
-  <w:abstractNum w:abstractNumId="18">
+  <w:abstractNum w:abstractNumId="17">
     <w:nsid w:val="B3C2315F"/>
     <w:multiLevelType w:val="singleLevel"/>
     <w:tmpl w:val="B3C2315F"/>
@@ -16127,7 +16191,7 @@
       <w:lvlJc w:val="left"/>
     </w:lvl>
   </w:abstractNum>
-  <w:abstractNum w:abstractNumId="19">
+  <w:abstractNum w:abstractNumId="18">
     <w:nsid w:val="B52C055F"/>
     <w:multiLevelType w:val="multilevel"/>
     <w:tmpl w:val="B52C055F"/>
@@ -16267,7 +16331,7 @@
       </w:rPr>
     </w:lvl>
   </w:abstractNum>
-  <w:abstractNum w:abstractNumId="20">
+  <w:abstractNum w:abstractNumId="19">
     <w:nsid w:val="B6407F19"/>
     <w:multiLevelType w:val="singleLevel"/>
     <w:tmpl w:val="B6407F19"/>
@@ -16279,7 +16343,7 @@
       <w:lvlJc w:val="left"/>
     </w:lvl>
   </w:abstractNum>
-  <w:abstractNum w:abstractNumId="21">
+  <w:abstractNum w:abstractNumId="20">
     <w:nsid w:val="B7529E00"/>
     <w:multiLevelType w:val="singleLevel"/>
     <w:tmpl w:val="B7529E00"/>
@@ -16291,7 +16355,7 @@
       <w:lvlJc w:val="left"/>
     </w:lvl>
   </w:abstractNum>
-  <w:abstractNum w:abstractNumId="22">
+  <w:abstractNum w:abstractNumId="21">
     <w:nsid w:val="B8276521"/>
     <w:multiLevelType w:val="singleLevel"/>
     <w:tmpl w:val="B8276521"/>
@@ -16303,7 +16367,7 @@
       <w:lvlJc w:val="left"/>
     </w:lvl>
   </w:abstractNum>
-  <w:abstractNum w:abstractNumId="23">
+  <w:abstractNum w:abstractNumId="22">
     <w:nsid w:val="BF1C10F1"/>
     <w:multiLevelType w:val="singleLevel"/>
     <w:tmpl w:val="BF1C10F1"/>
@@ -16315,7 +16379,7 @@
       <w:lvlJc w:val="left"/>
     </w:lvl>
   </w:abstractNum>
-  <w:abstractNum w:abstractNumId="24">
+  <w:abstractNum w:abstractNumId="23">
     <w:nsid w:val="C1131C82"/>
     <w:multiLevelType w:val="singleLevel"/>
     <w:tmpl w:val="C1131C82"/>
@@ -16327,7 +16391,7 @@
       <w:lvlJc w:val="left"/>
     </w:lvl>
   </w:abstractNum>
-  <w:abstractNum w:abstractNumId="25">
+  <w:abstractNum w:abstractNumId="24">
     <w:nsid w:val="C878FD22"/>
     <w:multiLevelType w:val="singleLevel"/>
     <w:tmpl w:val="C878FD22"/>
@@ -16339,7 +16403,7 @@
       <w:lvlJc w:val="left"/>
     </w:lvl>
   </w:abstractNum>
-  <w:abstractNum w:abstractNumId="26">
+  <w:abstractNum w:abstractNumId="25">
     <w:nsid w:val="CAD6F3E4"/>
     <w:multiLevelType w:val="singleLevel"/>
     <w:tmpl w:val="CAD6F3E4"/>
@@ -16351,7 +16415,7 @@
       <w:lvlJc w:val="left"/>
     </w:lvl>
   </w:abstractNum>
-  <w:abstractNum w:abstractNumId="27">
+  <w:abstractNum w:abstractNumId="26">
     <w:nsid w:val="CBEC66A5"/>
     <w:multiLevelType w:val="singleLevel"/>
     <w:tmpl w:val="CBEC66A5"/>
@@ -16363,7 +16427,7 @@
       <w:lvlJc w:val="left"/>
     </w:lvl>
   </w:abstractNum>
-  <w:abstractNum w:abstractNumId="28">
+  <w:abstractNum w:abstractNumId="27">
     <w:nsid w:val="CE762D04"/>
     <w:multiLevelType w:val="multilevel"/>
     <w:tmpl w:val="CE762D04"/>
@@ -16479,9 +16543,9 @@
       </w:rPr>
     </w:lvl>
   </w:abstractNum>
-  <w:abstractNum w:abstractNumId="29">
+  <w:abstractNum w:abstractNumId="28">
     <w:nsid w:val="CFB556DD"/>
-    <w:multiLevelType w:val="singleLevel"/>
+    <w:multiLevelType w:val="multilevel"/>
     <w:tmpl w:val="CFB556DD"/>
     <w:lvl w:ilvl="0" w:tentative="0">
       <w:start w:val="1"/>
@@ -16490,8 +16554,112 @@
       <w:lvlText w:val="%1."/>
       <w:lvlJc w:val="left"/>
     </w:lvl>
+    <w:lvl w:ilvl="1" w:tentative="0">
+      <w:start w:val="1"/>
+      <w:numFmt w:val="decimal"/>
+      <w:suff w:val="space"/>
+      <w:lvlText w:val="%1.%2"/>
+      <w:lvlJc w:val="left"/>
+      <w:pPr>
+        <w:ind w:left="0" w:leftChars="0" w:firstLine="0" w:firstLineChars="0"/>
+      </w:pPr>
+      <w:rPr>
+        <w:rFonts w:hint="default"/>
+      </w:rPr>
+    </w:lvl>
+    <w:lvl w:ilvl="2" w:tentative="0">
+      <w:start w:val="1"/>
+      <w:numFmt w:val="decimal"/>
+      <w:suff w:val="space"/>
+      <w:lvlText w:val="%1.%2.%3"/>
+      <w:lvlJc w:val="left"/>
+      <w:pPr>
+        <w:ind w:left="0" w:leftChars="0" w:firstLine="0" w:firstLineChars="0"/>
+      </w:pPr>
+      <w:rPr>
+        <w:rFonts w:hint="default"/>
+      </w:rPr>
+    </w:lvl>
+    <w:lvl w:ilvl="3" w:tentative="0">
+      <w:start w:val="1"/>
+      <w:numFmt w:val="decimal"/>
+      <w:suff w:val="space"/>
+      <w:lvlText w:val="%1.%2.%3.%4"/>
+      <w:lvlJc w:val="left"/>
+      <w:pPr>
+        <w:ind w:left="0" w:leftChars="0" w:firstLine="0" w:firstLineChars="0"/>
+      </w:pPr>
+      <w:rPr>
+        <w:rFonts w:hint="default"/>
+      </w:rPr>
+    </w:lvl>
+    <w:lvl w:ilvl="4" w:tentative="0">
+      <w:start w:val="1"/>
+      <w:numFmt w:val="decimal"/>
+      <w:suff w:val="space"/>
+      <w:lvlText w:val="%1.%2.%3.%4.%5"/>
+      <w:lvlJc w:val="left"/>
+      <w:pPr>
+        <w:ind w:left="0" w:leftChars="0" w:firstLine="0" w:firstLineChars="0"/>
+      </w:pPr>
+      <w:rPr>
+        <w:rFonts w:hint="default"/>
+      </w:rPr>
+    </w:lvl>
+    <w:lvl w:ilvl="5" w:tentative="0">
+      <w:start w:val="1"/>
+      <w:numFmt w:val="decimal"/>
+      <w:suff w:val="space"/>
+      <w:lvlText w:val="%1.%2.%3.%4.%5.%6"/>
+      <w:lvlJc w:val="left"/>
+      <w:pPr>
+        <w:ind w:left="0" w:leftChars="0" w:firstLine="0" w:firstLineChars="0"/>
+      </w:pPr>
+      <w:rPr>
+        <w:rFonts w:hint="default"/>
+      </w:rPr>
+    </w:lvl>
+    <w:lvl w:ilvl="6" w:tentative="0">
+      <w:start w:val="1"/>
+      <w:numFmt w:val="decimal"/>
+      <w:suff w:val="space"/>
+      <w:lvlText w:val="%1.%2.%3.%4.%5.%6.%7"/>
+      <w:lvlJc w:val="left"/>
+      <w:pPr>
+        <w:ind w:left="0" w:leftChars="0" w:firstLine="0" w:firstLineChars="0"/>
+      </w:pPr>
+      <w:rPr>
+        <w:rFonts w:hint="default"/>
+      </w:rPr>
+    </w:lvl>
+    <w:lvl w:ilvl="7" w:tentative="0">
+      <w:start w:val="1"/>
+      <w:numFmt w:val="decimal"/>
+      <w:suff w:val="space"/>
+      <w:lvlText w:val="%1.%2.%3.%4.%5.%6.%7.%8"/>
+      <w:lvlJc w:val="left"/>
+      <w:pPr>
+        <w:ind w:left="0" w:leftChars="0" w:firstLine="0" w:firstLineChars="0"/>
+      </w:pPr>
+      <w:rPr>
+        <w:rFonts w:hint="default"/>
+      </w:rPr>
+    </w:lvl>
+    <w:lvl w:ilvl="8" w:tentative="0">
+      <w:start w:val="1"/>
+      <w:numFmt w:val="decimal"/>
+      <w:suff w:val="space"/>
+      <w:lvlText w:val="%1.%2.%3.%4.%5.%6.%7.%8.%9"/>
+      <w:lvlJc w:val="left"/>
+      <w:pPr>
+        <w:ind w:left="0" w:leftChars="0" w:firstLine="0" w:firstLineChars="0"/>
+      </w:pPr>
+      <w:rPr>
+        <w:rFonts w:hint="default"/>
+      </w:rPr>
+    </w:lvl>
   </w:abstractNum>
-  <w:abstractNum w:abstractNumId="30">
+  <w:abstractNum w:abstractNumId="29">
     <w:nsid w:val="D4A79DA9"/>
     <w:multiLevelType w:val="multilevel"/>
     <w:tmpl w:val="D4A79DA9"/>
@@ -16631,7 +16799,7 @@
       </w:rPr>
     </w:lvl>
   </w:abstractNum>
-  <w:abstractNum w:abstractNumId="31">
+  <w:abstractNum w:abstractNumId="30">
     <w:nsid w:val="D84C24CF"/>
     <w:multiLevelType w:val="singleLevel"/>
     <w:tmpl w:val="D84C24CF"/>
@@ -16643,7 +16811,7 @@
       <w:lvlJc w:val="left"/>
     </w:lvl>
   </w:abstractNum>
-  <w:abstractNum w:abstractNumId="32">
+  <w:abstractNum w:abstractNumId="31">
     <w:nsid w:val="E109609F"/>
     <w:multiLevelType w:val="singleLevel"/>
     <w:tmpl w:val="E109609F"/>
@@ -16655,7 +16823,7 @@
       <w:lvlJc w:val="left"/>
     </w:lvl>
   </w:abstractNum>
-  <w:abstractNum w:abstractNumId="33">
+  <w:abstractNum w:abstractNumId="32">
     <w:nsid w:val="E17C0C88"/>
     <w:multiLevelType w:val="singleLevel"/>
     <w:tmpl w:val="E17C0C88"/>
@@ -16667,7 +16835,7 @@
       <w:lvlJc w:val="left"/>
     </w:lvl>
   </w:abstractNum>
-  <w:abstractNum w:abstractNumId="34">
+  <w:abstractNum w:abstractNumId="33">
     <w:nsid w:val="E89A39E4"/>
     <w:multiLevelType w:val="singleLevel"/>
     <w:tmpl w:val="E89A39E4"/>
@@ -16679,7 +16847,7 @@
       <w:lvlJc w:val="left"/>
     </w:lvl>
   </w:abstractNum>
-  <w:abstractNum w:abstractNumId="35">
+  <w:abstractNum w:abstractNumId="34">
     <w:nsid w:val="E8BBC779"/>
     <w:multiLevelType w:val="singleLevel"/>
     <w:tmpl w:val="E8BBC779"/>
@@ -16691,7 +16859,7 @@
       <w:lvlJc w:val="left"/>
     </w:lvl>
   </w:abstractNum>
-  <w:abstractNum w:abstractNumId="36">
+  <w:abstractNum w:abstractNumId="35">
     <w:nsid w:val="E9767898"/>
     <w:multiLevelType w:val="singleLevel"/>
     <w:tmpl w:val="E9767898"/>
@@ -16703,7 +16871,7 @@
       <w:lvlJc w:val="left"/>
     </w:lvl>
   </w:abstractNum>
-  <w:abstractNum w:abstractNumId="37">
+  <w:abstractNum w:abstractNumId="36">
     <w:nsid w:val="EA14CDEE"/>
     <w:multiLevelType w:val="singleLevel"/>
     <w:tmpl w:val="EA14CDEE"/>
@@ -16715,7 +16883,7 @@
       <w:lvlJc w:val="left"/>
     </w:lvl>
   </w:abstractNum>
-  <w:abstractNum w:abstractNumId="38">
+  <w:abstractNum w:abstractNumId="37">
     <w:nsid w:val="FC29D630"/>
     <w:multiLevelType w:val="singleLevel"/>
     <w:tmpl w:val="FC29D630"/>
@@ -16727,7 +16895,7 @@
       <w:lvlJc w:val="left"/>
     </w:lvl>
   </w:abstractNum>
-  <w:abstractNum w:abstractNumId="39">
+  <w:abstractNum w:abstractNumId="38">
     <w:nsid w:val="FE24A8A4"/>
     <w:multiLevelType w:val="singleLevel"/>
     <w:tmpl w:val="FE24A8A4"/>
@@ -16739,7 +16907,7 @@
       <w:lvlJc w:val="left"/>
     </w:lvl>
   </w:abstractNum>
-  <w:abstractNum w:abstractNumId="40">
+  <w:abstractNum w:abstractNumId="39">
     <w:nsid w:val="FE343E4B"/>
     <w:multiLevelType w:val="singleLevel"/>
     <w:tmpl w:val="FE343E4B"/>
@@ -16751,7 +16919,7 @@
       <w:lvlJc w:val="left"/>
     </w:lvl>
   </w:abstractNum>
-  <w:abstractNum w:abstractNumId="41">
+  <w:abstractNum w:abstractNumId="40">
     <w:nsid w:val="09005923"/>
     <w:multiLevelType w:val="singleLevel"/>
     <w:tmpl w:val="09005923"/>
@@ -16763,7 +16931,7 @@
       <w:lvlJc w:val="left"/>
     </w:lvl>
   </w:abstractNum>
-  <w:abstractNum w:abstractNumId="42">
+  <w:abstractNum w:abstractNumId="41">
     <w:nsid w:val="0A7C2C92"/>
     <w:multiLevelType w:val="singleLevel"/>
     <w:tmpl w:val="0A7C2C92"/>
@@ -16775,7 +16943,7 @@
       <w:lvlJc w:val="left"/>
     </w:lvl>
   </w:abstractNum>
-  <w:abstractNum w:abstractNumId="43">
+  <w:abstractNum w:abstractNumId="42">
     <w:nsid w:val="0CD92811"/>
     <w:multiLevelType w:val="singleLevel"/>
     <w:tmpl w:val="0CD92811"/>
@@ -16787,7 +16955,7 @@
       <w:lvlJc w:val="left"/>
     </w:lvl>
   </w:abstractNum>
-  <w:abstractNum w:abstractNumId="44">
+  <w:abstractNum w:abstractNumId="43">
     <w:nsid w:val="12E3D0E2"/>
     <w:multiLevelType w:val="singleLevel"/>
     <w:tmpl w:val="12E3D0E2"/>
@@ -16799,7 +16967,7 @@
       <w:lvlJc w:val="left"/>
     </w:lvl>
   </w:abstractNum>
-  <w:abstractNum w:abstractNumId="45">
+  <w:abstractNum w:abstractNumId="44">
     <w:nsid w:val="18501BFC"/>
     <w:multiLevelType w:val="singleLevel"/>
     <w:tmpl w:val="18501BFC"/>
@@ -16811,7 +16979,7 @@
       <w:lvlJc w:val="left"/>
     </w:lvl>
   </w:abstractNum>
-  <w:abstractNum w:abstractNumId="46">
+  <w:abstractNum w:abstractNumId="45">
     <w:nsid w:val="211769BA"/>
     <w:multiLevelType w:val="singleLevel"/>
     <w:tmpl w:val="211769BA"/>
@@ -16823,7 +16991,7 @@
       <w:lvlJc w:val="left"/>
     </w:lvl>
   </w:abstractNum>
-  <w:abstractNum w:abstractNumId="47">
+  <w:abstractNum w:abstractNumId="46">
     <w:nsid w:val="27D2B737"/>
     <w:multiLevelType w:val="singleLevel"/>
     <w:tmpl w:val="27D2B737"/>
@@ -16835,7 +17003,7 @@
       <w:lvlJc w:val="left"/>
     </w:lvl>
   </w:abstractNum>
-  <w:abstractNum w:abstractNumId="48">
+  <w:abstractNum w:abstractNumId="47">
     <w:nsid w:val="2DE852F7"/>
     <w:multiLevelType w:val="singleLevel"/>
     <w:tmpl w:val="2DE852F7"/>
@@ -16847,7 +17015,7 @@
       <w:lvlJc w:val="left"/>
     </w:lvl>
   </w:abstractNum>
-  <w:abstractNum w:abstractNumId="49">
+  <w:abstractNum w:abstractNumId="48">
     <w:nsid w:val="30AD9F26"/>
     <w:multiLevelType w:val="singleLevel"/>
     <w:tmpl w:val="30AD9F26"/>
@@ -16859,7 +17027,7 @@
       <w:lvlJc w:val="left"/>
     </w:lvl>
   </w:abstractNum>
-  <w:abstractNum w:abstractNumId="50">
+  <w:abstractNum w:abstractNumId="49">
     <w:nsid w:val="34247F98"/>
     <w:multiLevelType w:val="singleLevel"/>
     <w:tmpl w:val="34247F98"/>
@@ -16871,7 +17039,7 @@
       <w:lvlJc w:val="left"/>
     </w:lvl>
   </w:abstractNum>
-  <w:abstractNum w:abstractNumId="51">
+  <w:abstractNum w:abstractNumId="50">
     <w:nsid w:val="34ACC566"/>
     <w:multiLevelType w:val="singleLevel"/>
     <w:tmpl w:val="34ACC566"/>
@@ -16883,7 +17051,7 @@
       <w:lvlJc w:val="left"/>
     </w:lvl>
   </w:abstractNum>
-  <w:abstractNum w:abstractNumId="52">
+  <w:abstractNum w:abstractNumId="51">
     <w:nsid w:val="36D9EC17"/>
     <w:multiLevelType w:val="singleLevel"/>
     <w:tmpl w:val="36D9EC17"/>
@@ -16895,7 +17063,7 @@
       <w:lvlJc w:val="left"/>
     </w:lvl>
   </w:abstractNum>
-  <w:abstractNum w:abstractNumId="53">
+  <w:abstractNum w:abstractNumId="52">
     <w:nsid w:val="3915D7F5"/>
     <w:multiLevelType w:val="multilevel"/>
     <w:tmpl w:val="3915D7F5"/>
@@ -17011,7 +17179,7 @@
       </w:rPr>
     </w:lvl>
   </w:abstractNum>
-  <w:abstractNum w:abstractNumId="54">
+  <w:abstractNum w:abstractNumId="53">
     <w:nsid w:val="3B3BFDBA"/>
     <w:multiLevelType w:val="singleLevel"/>
     <w:tmpl w:val="3B3BFDBA"/>
@@ -17023,7 +17191,7 @@
       <w:lvlJc w:val="left"/>
     </w:lvl>
   </w:abstractNum>
-  <w:abstractNum w:abstractNumId="55">
+  <w:abstractNum w:abstractNumId="54">
     <w:nsid w:val="3CBCE474"/>
     <w:multiLevelType w:val="singleLevel"/>
     <w:tmpl w:val="3CBCE474"/>
@@ -17035,7 +17203,7 @@
       <w:lvlJc w:val="left"/>
     </w:lvl>
   </w:abstractNum>
-  <w:abstractNum w:abstractNumId="56">
+  <w:abstractNum w:abstractNumId="55">
     <w:nsid w:val="3CC99ABE"/>
     <w:multiLevelType w:val="singleLevel"/>
     <w:tmpl w:val="3CC99ABE"/>
@@ -17047,7 +17215,7 @@
       <w:lvlJc w:val="left"/>
     </w:lvl>
   </w:abstractNum>
-  <w:abstractNum w:abstractNumId="57">
+  <w:abstractNum w:abstractNumId="56">
     <w:nsid w:val="3D4BEBA8"/>
     <w:multiLevelType w:val="singleLevel"/>
     <w:tmpl w:val="3D4BEBA8"/>
@@ -17059,7 +17227,7 @@
       <w:lvlJc w:val="left"/>
     </w:lvl>
   </w:abstractNum>
-  <w:abstractNum w:abstractNumId="58">
+  <w:abstractNum w:abstractNumId="57">
     <w:nsid w:val="43814378"/>
     <w:multiLevelType w:val="singleLevel"/>
     <w:tmpl w:val="43814378"/>
@@ -17071,7 +17239,7 @@
       <w:lvlJc w:val="left"/>
     </w:lvl>
   </w:abstractNum>
-  <w:abstractNum w:abstractNumId="59">
+  <w:abstractNum w:abstractNumId="58">
     <w:nsid w:val="46D2EDB9"/>
     <w:multiLevelType w:val="multilevel"/>
     <w:tmpl w:val="46D2EDB9"/>
@@ -17211,7 +17379,7 @@
       </w:rPr>
     </w:lvl>
   </w:abstractNum>
-  <w:abstractNum w:abstractNumId="60">
+  <w:abstractNum w:abstractNumId="59">
     <w:nsid w:val="4F2E84C6"/>
     <w:multiLevelType w:val="singleLevel"/>
     <w:tmpl w:val="4F2E84C6"/>
@@ -17223,7 +17391,7 @@
       <w:lvlJc w:val="left"/>
     </w:lvl>
   </w:abstractNum>
-  <w:abstractNum w:abstractNumId="61">
+  <w:abstractNum w:abstractNumId="60">
     <w:nsid w:val="52BBEC1D"/>
     <w:multiLevelType w:val="singleLevel"/>
     <w:tmpl w:val="52BBEC1D"/>
@@ -17235,7 +17403,7 @@
       <w:lvlJc w:val="left"/>
     </w:lvl>
   </w:abstractNum>
-  <w:abstractNum w:abstractNumId="62">
+  <w:abstractNum w:abstractNumId="61">
     <w:nsid w:val="537CC0EA"/>
     <w:multiLevelType w:val="singleLevel"/>
     <w:tmpl w:val="537CC0EA"/>
@@ -17247,7 +17415,7 @@
       <w:lvlJc w:val="left"/>
     </w:lvl>
   </w:abstractNum>
-  <w:abstractNum w:abstractNumId="63">
+  <w:abstractNum w:abstractNumId="62">
     <w:nsid w:val="5823DDE9"/>
     <w:multiLevelType w:val="singleLevel"/>
     <w:tmpl w:val="5823DDE9"/>
@@ -17259,7 +17427,7 @@
       <w:lvlJc w:val="left"/>
     </w:lvl>
   </w:abstractNum>
-  <w:abstractNum w:abstractNumId="64">
+  <w:abstractNum w:abstractNumId="63">
     <w:nsid w:val="5973A4FA"/>
     <w:multiLevelType w:val="singleLevel"/>
     <w:tmpl w:val="5973A4FA"/>
@@ -17271,7 +17439,7 @@
       <w:lvlJc w:val="left"/>
     </w:lvl>
   </w:abstractNum>
-  <w:abstractNum w:abstractNumId="65">
+  <w:abstractNum w:abstractNumId="64">
     <w:nsid w:val="6024D89E"/>
     <w:multiLevelType w:val="singleLevel"/>
     <w:tmpl w:val="6024D89E"/>
@@ -17283,7 +17451,7 @@
       <w:lvlJc w:val="left"/>
     </w:lvl>
   </w:abstractNum>
-  <w:abstractNum w:abstractNumId="66">
+  <w:abstractNum w:abstractNumId="65">
     <w:nsid w:val="628F328F"/>
     <w:multiLevelType w:val="singleLevel"/>
     <w:tmpl w:val="628F328F"/>
@@ -17295,7 +17463,7 @@
       <w:lvlJc w:val="left"/>
     </w:lvl>
   </w:abstractNum>
-  <w:abstractNum w:abstractNumId="67">
+  <w:abstractNum w:abstractNumId="66">
     <w:nsid w:val="62FD1C74"/>
     <w:multiLevelType w:val="singleLevel"/>
     <w:tmpl w:val="62FD1C74"/>
@@ -17307,7 +17475,7 @@
       <w:lvlJc w:val="left"/>
     </w:lvl>
   </w:abstractNum>
-  <w:abstractNum w:abstractNumId="68">
+  <w:abstractNum w:abstractNumId="67">
     <w:nsid w:val="658783AF"/>
     <w:multiLevelType w:val="singleLevel"/>
     <w:tmpl w:val="658783AF"/>
@@ -17319,7 +17487,7 @@
       <w:lvlJc w:val="left"/>
     </w:lvl>
   </w:abstractNum>
-  <w:abstractNum w:abstractNumId="69">
+  <w:abstractNum w:abstractNumId="68">
     <w:nsid w:val="65A2A8DF"/>
     <w:multiLevelType w:val="singleLevel"/>
     <w:tmpl w:val="65A2A8DF"/>
@@ -17331,7 +17499,7 @@
       <w:lvlJc w:val="left"/>
     </w:lvl>
   </w:abstractNum>
-  <w:abstractNum w:abstractNumId="70">
+  <w:abstractNum w:abstractNumId="69">
     <w:nsid w:val="67A03EFF"/>
     <w:multiLevelType w:val="singleLevel"/>
     <w:tmpl w:val="67A03EFF"/>
@@ -17343,7 +17511,7 @@
       <w:lvlJc w:val="left"/>
     </w:lvl>
   </w:abstractNum>
-  <w:abstractNum w:abstractNumId="71">
+  <w:abstractNum w:abstractNumId="70">
     <w:nsid w:val="69C1C339"/>
     <w:multiLevelType w:val="singleLevel"/>
     <w:tmpl w:val="69C1C339"/>
@@ -17355,7 +17523,7 @@
       <w:lvlJc w:val="left"/>
     </w:lvl>
   </w:abstractNum>
-  <w:abstractNum w:abstractNumId="72">
+  <w:abstractNum w:abstractNumId="71">
     <w:nsid w:val="6AF88BFE"/>
     <w:multiLevelType w:val="singleLevel"/>
     <w:tmpl w:val="6AF88BFE"/>
@@ -17367,7 +17535,7 @@
       <w:lvlJc w:val="left"/>
     </w:lvl>
   </w:abstractNum>
-  <w:abstractNum w:abstractNumId="73">
+  <w:abstractNum w:abstractNumId="72">
     <w:nsid w:val="779FF94F"/>
     <w:multiLevelType w:val="singleLevel"/>
     <w:tmpl w:val="779FF94F"/>
@@ -17379,7 +17547,7 @@
       <w:lvlJc w:val="left"/>
     </w:lvl>
   </w:abstractNum>
-  <w:abstractNum w:abstractNumId="74">
+  <w:abstractNum w:abstractNumId="73">
     <w:nsid w:val="78DA9A54"/>
     <w:multiLevelType w:val="singleLevel"/>
     <w:tmpl w:val="78DA9A54"/>
@@ -17391,7 +17559,7 @@
       <w:lvlJc w:val="left"/>
     </w:lvl>
   </w:abstractNum>
-  <w:abstractNum w:abstractNumId="75">
+  <w:abstractNum w:abstractNumId="74">
     <w:nsid w:val="7CFEE648"/>
     <w:multiLevelType w:val="singleLevel"/>
     <w:tmpl w:val="7CFEE648"/>
@@ -17403,7 +17571,7 @@
       <w:lvlJc w:val="left"/>
     </w:lvl>
   </w:abstractNum>
-  <w:abstractNum w:abstractNumId="76">
+  <w:abstractNum w:abstractNumId="75">
     <w:nsid w:val="7EE9AE89"/>
     <w:multiLevelType w:val="singleLevel"/>
     <w:tmpl w:val="7EE9AE89"/>
@@ -17416,235 +17584,232 @@
     </w:lvl>
   </w:abstractNum>
   <w:num w:numId="1">
-    <w:abstractNumId w:val="12"/>
+    <w:abstractNumId w:val="11"/>
   </w:num>
   <w:num w:numId="2">
-    <w:abstractNumId w:val="15"/>
+    <w:abstractNumId w:val="14"/>
   </w:num>
   <w:num w:numId="3">
-    <w:abstractNumId w:val="19"/>
+    <w:abstractNumId w:val="18"/>
   </w:num>
   <w:num w:numId="4">
-    <w:abstractNumId w:val="30"/>
+    <w:abstractNumId w:val="29"/>
   </w:num>
   <w:num w:numId="5">
-    <w:abstractNumId w:val="59"/>
+    <w:abstractNumId w:val="58"/>
   </w:num>
   <w:num w:numId="6">
-    <w:abstractNumId w:val="54"/>
+    <w:abstractNumId w:val="53"/>
   </w:num>
   <w:num w:numId="7">
-    <w:abstractNumId w:val="34"/>
+    <w:abstractNumId w:val="33"/>
   </w:num>
   <w:num w:numId="8">
+    <w:abstractNumId w:val="16"/>
+  </w:num>
+  <w:num w:numId="9">
     <w:abstractNumId w:val="17"/>
   </w:num>
-  <w:num w:numId="9">
-    <w:abstractNumId w:val="18"/>
-  </w:num>
   <w:num w:numId="10">
-    <w:abstractNumId w:val="45"/>
+    <w:abstractNumId w:val="44"/>
   </w:num>
   <w:num w:numId="11">
-    <w:abstractNumId w:val="67"/>
+    <w:abstractNumId w:val="66"/>
   </w:num>
   <w:num w:numId="12">
-    <w:abstractNumId w:val="36"/>
+    <w:abstractNumId w:val="35"/>
   </w:num>
   <w:num w:numId="13">
     <w:abstractNumId w:val="0"/>
   </w:num>
   <w:num w:numId="14">
-    <w:abstractNumId w:val="66"/>
+    <w:abstractNumId w:val="65"/>
   </w:num>
   <w:num w:numId="15">
-    <w:abstractNumId w:val="16"/>
+    <w:abstractNumId w:val="15"/>
   </w:num>
   <w:num w:numId="16">
+    <w:abstractNumId w:val="50"/>
+  </w:num>
+  <w:num w:numId="17">
+    <w:abstractNumId w:val="40"/>
+  </w:num>
+  <w:num w:numId="18">
+    <w:abstractNumId w:val="27"/>
+  </w:num>
+  <w:num w:numId="19">
+    <w:abstractNumId w:val="28"/>
+  </w:num>
+  <w:num w:numId="20">
+    <w:abstractNumId w:val="71"/>
+  </w:num>
+  <w:num w:numId="21">
+    <w:abstractNumId w:val="42"/>
+  </w:num>
+  <w:num w:numId="22">
+    <w:abstractNumId w:val="75"/>
+  </w:num>
+  <w:num w:numId="23">
+    <w:abstractNumId w:val="74"/>
+  </w:num>
+  <w:num w:numId="24">
+    <w:abstractNumId w:val="61"/>
+  </w:num>
+  <w:num w:numId="25">
+    <w:abstractNumId w:val="6"/>
+  </w:num>
+  <w:num w:numId="26">
+    <w:abstractNumId w:val="36"/>
+  </w:num>
+  <w:num w:numId="27">
+    <w:abstractNumId w:val="32"/>
+  </w:num>
+  <w:num w:numId="28">
+    <w:abstractNumId w:val="67"/>
+  </w:num>
+  <w:num w:numId="29">
+    <w:abstractNumId w:val="49"/>
+  </w:num>
+  <w:num w:numId="30">
+    <w:abstractNumId w:val="19"/>
+  </w:num>
+  <w:num w:numId="31">
+    <w:abstractNumId w:val="62"/>
+  </w:num>
+  <w:num w:numId="32">
+    <w:abstractNumId w:val="24"/>
+  </w:num>
+  <w:num w:numId="33">
+    <w:abstractNumId w:val="10"/>
+  </w:num>
+  <w:num w:numId="34">
+    <w:abstractNumId w:val="55"/>
+  </w:num>
+  <w:num w:numId="35">
+    <w:abstractNumId w:val="46"/>
+  </w:num>
+  <w:num w:numId="36">
+    <w:abstractNumId w:val="72"/>
+  </w:num>
+  <w:num w:numId="37">
+    <w:abstractNumId w:val="26"/>
+  </w:num>
+  <w:num w:numId="38">
+    <w:abstractNumId w:val="38"/>
+  </w:num>
+  <w:num w:numId="39">
+    <w:abstractNumId w:val="52"/>
+  </w:num>
+  <w:num w:numId="40">
+    <w:abstractNumId w:val="31"/>
+  </w:num>
+  <w:num w:numId="41">
+    <w:abstractNumId w:val="34"/>
+  </w:num>
+  <w:num w:numId="42">
+    <w:abstractNumId w:val="64"/>
+  </w:num>
+  <w:num w:numId="43">
+    <w:abstractNumId w:val="8"/>
+  </w:num>
+  <w:num w:numId="44">
+    <w:abstractNumId w:val="2"/>
+  </w:num>
+  <w:num w:numId="45">
+    <w:abstractNumId w:val="47"/>
+  </w:num>
+  <w:num w:numId="46">
+    <w:abstractNumId w:val="4"/>
+  </w:num>
+  <w:num w:numId="47">
+    <w:abstractNumId w:val="70"/>
+  </w:num>
+  <w:num w:numId="48">
+    <w:abstractNumId w:val="48"/>
+  </w:num>
+  <w:num w:numId="49">
+    <w:abstractNumId w:val="3"/>
+  </w:num>
+  <w:num w:numId="50">
+    <w:abstractNumId w:val="60"/>
+  </w:num>
+  <w:num w:numId="51">
+    <w:abstractNumId w:val="39"/>
+  </w:num>
+  <w:num w:numId="52">
+    <w:abstractNumId w:val="68"/>
+  </w:num>
+  <w:num w:numId="53">
+    <w:abstractNumId w:val="54"/>
+  </w:num>
+  <w:num w:numId="54">
+    <w:abstractNumId w:val="57"/>
+  </w:num>
+  <w:num w:numId="55">
+    <w:abstractNumId w:val="25"/>
+  </w:num>
+  <w:num w:numId="56">
+    <w:abstractNumId w:val="23"/>
+  </w:num>
+  <w:num w:numId="57">
+    <w:abstractNumId w:val="1"/>
+  </w:num>
+  <w:num w:numId="58">
+    <w:abstractNumId w:val="30"/>
+  </w:num>
+  <w:num w:numId="59">
+    <w:abstractNumId w:val="12"/>
+  </w:num>
+  <w:num w:numId="60">
+    <w:abstractNumId w:val="9"/>
+  </w:num>
+  <w:num w:numId="61">
+    <w:abstractNumId w:val="45"/>
+  </w:num>
+  <w:num w:numId="62">
+    <w:abstractNumId w:val="43"/>
+  </w:num>
+  <w:num w:numId="63">
+    <w:abstractNumId w:val="22"/>
+  </w:num>
+  <w:num w:numId="64">
+    <w:abstractNumId w:val="20"/>
+  </w:num>
+  <w:num w:numId="65">
     <w:abstractNumId w:val="51"/>
   </w:num>
-  <w:num w:numId="17">
+  <w:num w:numId="66">
+    <w:abstractNumId w:val="5"/>
+  </w:num>
+  <w:num w:numId="67">
+    <w:abstractNumId w:val="59"/>
+  </w:num>
+  <w:num w:numId="68">
+    <w:abstractNumId w:val="73"/>
+  </w:num>
+  <w:num w:numId="69">
+    <w:abstractNumId w:val="7"/>
+  </w:num>
+  <w:num w:numId="70">
+    <w:abstractNumId w:val="69"/>
+  </w:num>
+  <w:num w:numId="71">
     <w:abstractNumId w:val="41"/>
   </w:num>
-  <w:num w:numId="18">
-    <w:abstractNumId w:val="28"/>
+  <w:num w:numId="72">
+    <w:abstractNumId w:val="63"/>
   </w:num>
-  <w:num w:numId="19">
-    <w:abstractNumId w:val="29"/>
+  <w:num w:numId="73">
+    <w:abstractNumId w:val="21"/>
   </w:num>
-  <w:num w:numId="20">
-    <w:abstractNumId w:val="72"/>
-  </w:num>
-  <w:num w:numId="21">
-    <w:abstractNumId w:val="43"/>
-  </w:num>
-  <w:num w:numId="22">
-    <w:abstractNumId w:val="76"/>
-  </w:num>
-  <w:num w:numId="23">
-    <w:abstractNumId w:val="75"/>
-  </w:num>
-  <w:num w:numId="24">
-    <w:abstractNumId w:val="62"/>
-  </w:num>
-  <w:num w:numId="25">
-    <w:abstractNumId w:val="7"/>
-  </w:num>
-  <w:num w:numId="26">
+  <w:num w:numId="74">
     <w:abstractNumId w:val="37"/>
   </w:num>
-  <w:num w:numId="27">
-    <w:abstractNumId w:val="33"/>
-  </w:num>
-  <w:num w:numId="28">
-    <w:abstractNumId w:val="68"/>
-  </w:num>
-  <w:num w:numId="29">
-    <w:abstractNumId w:val="50"/>
-  </w:num>
-  <w:num w:numId="30">
-    <w:abstractNumId w:val="20"/>
-  </w:num>
-  <w:num w:numId="31">
-    <w:abstractNumId w:val="63"/>
-  </w:num>
-  <w:num w:numId="32">
-    <w:abstractNumId w:val="25"/>
-  </w:num>
-  <w:num w:numId="33">
-    <w:abstractNumId w:val="11"/>
-  </w:num>
-  <w:num w:numId="34">
-    <w:abstractNumId w:val="56"/>
-  </w:num>
-  <w:num w:numId="35">
-    <w:abstractNumId w:val="47"/>
-  </w:num>
-  <w:num w:numId="36">
-    <w:abstractNumId w:val="73"/>
-  </w:num>
-  <w:num w:numId="37">
-    <w:abstractNumId w:val="27"/>
-  </w:num>
-  <w:num w:numId="38">
-    <w:abstractNumId w:val="39"/>
-  </w:num>
-  <w:num w:numId="39">
-    <w:abstractNumId w:val="3"/>
-  </w:num>
-  <w:num w:numId="40">
-    <w:abstractNumId w:val="53"/>
-  </w:num>
-  <w:num w:numId="41">
-    <w:abstractNumId w:val="32"/>
-  </w:num>
-  <w:num w:numId="42">
-    <w:abstractNumId w:val="35"/>
-  </w:num>
-  <w:num w:numId="43">
-    <w:abstractNumId w:val="65"/>
-  </w:num>
-  <w:num w:numId="44">
-    <w:abstractNumId w:val="9"/>
-  </w:num>
-  <w:num w:numId="45">
-    <w:abstractNumId w:val="2"/>
-  </w:num>
-  <w:num w:numId="46">
-    <w:abstractNumId w:val="48"/>
-  </w:num>
-  <w:num w:numId="47">
-    <w:abstractNumId w:val="5"/>
-  </w:num>
-  <w:num w:numId="48">
-    <w:abstractNumId w:val="71"/>
-  </w:num>
-  <w:num w:numId="49">
-    <w:abstractNumId w:val="49"/>
-  </w:num>
-  <w:num w:numId="50">
-    <w:abstractNumId w:val="4"/>
-  </w:num>
-  <w:num w:numId="51">
-    <w:abstractNumId w:val="61"/>
-  </w:num>
-  <w:num w:numId="52">
-    <w:abstractNumId w:val="40"/>
-  </w:num>
-  <w:num w:numId="53">
-    <w:abstractNumId w:val="69"/>
-  </w:num>
-  <w:num w:numId="54">
-    <w:abstractNumId w:val="55"/>
-  </w:num>
-  <w:num w:numId="55">
-    <w:abstractNumId w:val="58"/>
-  </w:num>
-  <w:num w:numId="56">
-    <w:abstractNumId w:val="26"/>
-  </w:num>
-  <w:num w:numId="57">
-    <w:abstractNumId w:val="24"/>
-  </w:num>
-  <w:num w:numId="58">
-    <w:abstractNumId w:val="1"/>
-  </w:num>
-  <w:num w:numId="59">
-    <w:abstractNumId w:val="31"/>
-  </w:num>
-  <w:num w:numId="60">
+  <w:num w:numId="75">
     <w:abstractNumId w:val="13"/>
   </w:num>
-  <w:num w:numId="61">
-    <w:abstractNumId w:val="10"/>
-  </w:num>
-  <w:num w:numId="62">
-    <w:abstractNumId w:val="46"/>
-  </w:num>
-  <w:num w:numId="63">
-    <w:abstractNumId w:val="44"/>
-  </w:num>
-  <w:num w:numId="64">
-    <w:abstractNumId w:val="23"/>
-  </w:num>
-  <w:num w:numId="65">
-    <w:abstractNumId w:val="21"/>
-  </w:num>
-  <w:num w:numId="66">
-    <w:abstractNumId w:val="52"/>
-  </w:num>
-  <w:num w:numId="67">
-    <w:abstractNumId w:val="6"/>
-  </w:num>
-  <w:num w:numId="68">
-    <w:abstractNumId w:val="60"/>
-  </w:num>
-  <w:num w:numId="69">
-    <w:abstractNumId w:val="74"/>
-  </w:num>
-  <w:num w:numId="70">
-    <w:abstractNumId w:val="8"/>
-  </w:num>
-  <w:num w:numId="71">
-    <w:abstractNumId w:val="70"/>
-  </w:num>
-  <w:num w:numId="72">
-    <w:abstractNumId w:val="42"/>
-  </w:num>
-  <w:num w:numId="73">
-    <w:abstractNumId w:val="64"/>
-  </w:num>
-  <w:num w:numId="74">
-    <w:abstractNumId w:val="22"/>
-  </w:num>
-  <w:num w:numId="75">
-    <w:abstractNumId w:val="38"/>
-  </w:num>
   <w:num w:numId="76">
-    <w:abstractNumId w:val="14"/>
-  </w:num>
-  <w:num w:numId="77">
-    <w:abstractNumId w:val="57"/>
+    <w:abstractNumId w:val="56"/>
   </w:num>
 </w:numbering>
 </file>

</xml_diff>

<commit_message>
Sửa lỗi chính tả trong đặc tả UC và ManageReportSD
</commit_message>
<xml_diff>
--- a/Diagrams/UsecaseDiagram/DacTa/DacTaUsecase.docx
+++ b/Diagrams/UsecaseDiagram/DacTa/DacTaUsecase.docx
@@ -487,7 +487,7 @@
           <w:vertAlign w:val="baseline"/>
           <w:lang w:val="en-US"/>
         </w:rPr>
-        <w:t>Tạo playlist cá nhâ: Cho phép tạo các danh sách phát nhạc mới theo sở thích cá nhân.</w:t>
+        <w:t>Tạo playlist cá nhân: Cho phép tạo các danh sách phát nhạc mới theo sở thích cá nhân.</w:t>
       </w:r>
     </w:p>
     <w:p>
@@ -2350,7 +2350,19 @@
                 <w:vertAlign w:val="baseline"/>
                 <w:lang w:val="en-US"/>
               </w:rPr>
-              <w:t>Admin chọn 1 trong 3 phương thức xử lý và nhấn Nút: Ẩn bài hát vi phạm, gửi cảnh cáo đến người vi phạm hoặc bỏ qua nếu báo cáo không đúng.</w:t>
+              <w:t>Admin chọn 1 trong 3 phương thức xử lý và nhấn N</w:t>
+            </w:r>
+            <w:bookmarkStart w:id="0" w:name="_GoBack"/>
+            <w:bookmarkEnd w:id="0"/>
+            <w:r>
+              <w:rPr>
+                <w:rFonts w:hint="default"/>
+                <w:sz w:val="32"/>
+                <w:szCs w:val="32"/>
+                <w:vertAlign w:val="baseline"/>
+                <w:lang w:val="en-US"/>
+              </w:rPr>
+              <w:t>út: Ẩn bài hát vi phạm, gửi cảnh cáo đến người vi phạm hoặc bỏ qua nếu báo cáo không đúng.</w:t>
             </w:r>
           </w:p>
           <w:p>
@@ -6662,6 +6674,12 @@
             <w:insideH w:val="single" w:color="auto" w:sz="4" w:space="0"/>
             <w:insideV w:val="single" w:color="auto" w:sz="4" w:space="0"/>
           </w:tblBorders>
+          <w:tblCellMar>
+            <w:top w:w="0" w:type="dxa"/>
+            <w:left w:w="108" w:type="dxa"/>
+            <w:bottom w:w="0" w:type="dxa"/>
+            <w:right w:w="108" w:type="dxa"/>
+          </w:tblCellMar>
         </w:tblPrEx>
         <w:tc>
           <w:tcPr>
@@ -8165,12 +8183,6 @@
             <w:insideH w:val="single" w:color="auto" w:sz="4" w:space="0"/>
             <w:insideV w:val="single" w:color="auto" w:sz="4" w:space="0"/>
           </w:tblBorders>
-          <w:tblCellMar>
-            <w:top w:w="0" w:type="dxa"/>
-            <w:left w:w="108" w:type="dxa"/>
-            <w:bottom w:w="0" w:type="dxa"/>
-            <w:right w:w="108" w:type="dxa"/>
-          </w:tblCellMar>
         </w:tblPrEx>
         <w:tc>
           <w:tcPr>
@@ -8830,6 +8842,12 @@
             <w:insideH w:val="single" w:color="auto" w:sz="4" w:space="0"/>
             <w:insideV w:val="single" w:color="auto" w:sz="4" w:space="0"/>
           </w:tblBorders>
+          <w:tblCellMar>
+            <w:top w:w="0" w:type="dxa"/>
+            <w:left w:w="108" w:type="dxa"/>
+            <w:bottom w:w="0" w:type="dxa"/>
+            <w:right w:w="108" w:type="dxa"/>
+          </w:tblCellMar>
         </w:tblPrEx>
         <w:tc>
           <w:tcPr>
@@ -9092,6 +9110,7 @@
             <w:pPr>
               <w:widowControl w:val="0"/>
               <w:numPr>
+                <w:ilvl w:val="0"/>
                 <w:numId w:val="0"/>
               </w:numPr>
               <w:jc w:val="both"/>
@@ -9971,6 +9990,12 @@
             <w:insideH w:val="single" w:color="auto" w:sz="4" w:space="0"/>
             <w:insideV w:val="single" w:color="auto" w:sz="4" w:space="0"/>
           </w:tblBorders>
+          <w:tblCellMar>
+            <w:top w:w="0" w:type="dxa"/>
+            <w:left w:w="108" w:type="dxa"/>
+            <w:bottom w:w="0" w:type="dxa"/>
+            <w:right w:w="108" w:type="dxa"/>
+          </w:tblCellMar>
         </w:tblPrEx>
         <w:tc>
           <w:tcPr>
@@ -13073,12 +13098,6 @@
             <w:insideH w:val="single" w:color="auto" w:sz="4" w:space="0"/>
             <w:insideV w:val="single" w:color="auto" w:sz="4" w:space="0"/>
           </w:tblBorders>
-          <w:tblCellMar>
-            <w:top w:w="0" w:type="dxa"/>
-            <w:left w:w="108" w:type="dxa"/>
-            <w:bottom w:w="0" w:type="dxa"/>
-            <w:right w:w="108" w:type="dxa"/>
-          </w:tblCellMar>
         </w:tblPrEx>
         <w:tc>
           <w:tcPr>
@@ -15585,8 +15604,6 @@
               </w:rPr>
               <w:t>Hệ thống sẵn sàng để thực hiện chức năng Sửa thông tin Playlist tiếp theo mà người dùng yêu cầu.</w:t>
             </w:r>
-            <w:bookmarkStart w:id="0" w:name="_GoBack"/>
-            <w:bookmarkEnd w:id="0"/>
           </w:p>
         </w:tc>
       </w:tr>

</xml_diff>

<commit_message>
Thêm chức năng Quản lý thư viện vào sơ đồ
</commit_message>
<xml_diff>
--- a/Diagrams/UsecaseDiagram/DacTa/DacTaUsecase.docx
+++ b/Diagrams/UsecaseDiagram/DacTa/DacTaUsecase.docx
@@ -275,7 +275,7 @@
           <w:vertAlign w:val="baseline"/>
           <w:lang w:val="en-US"/>
         </w:rPr>
-        <w:t>Đăng ký: Người dùng có thể tạo một tài khoản mới bằng email và mật khẩu, chọn vai trò (Người dùng, Nghệ sĩ). Hệ thống sẽ kiểm tra tính hợp lệ của thông tin trước khi tạo tài khoản.</w:t>
+        <w:t>Đăng ký: Người dùng có thể tạo một tài khoản mới bằng email và mật khẩu. Hệ thống sẽ kiểm tra tính hợp lệ của thông tin trước khi tạo tài khoản.</w:t>
       </w:r>
     </w:p>
     <w:p>
@@ -432,8 +432,66 @@
           <w:vertAlign w:val="baseline"/>
           <w:lang w:val="en-US"/>
         </w:rPr>
-        <w:t>Quản lý hồ sơ cá nhân: Người dùng có thể xem và chỉnh sửa các thông tin cá nhân như tên hiển thị, ảnh đại diện,… và các thông tin khác.</w:t>
+        <w:t>Quản lý hồ sơ cá nhân: Người dùng có thể xem và chỉnh sửa các thông tin cá nhân như tên hiển thị, ảnh đại diện, xem các bài hát đăng lại,… và các thông tin khác.</w:t>
       </w:r>
+      <w:bookmarkStart w:id="0" w:name="_GoBack"/>
+      <w:bookmarkEnd w:id="0"/>
+    </w:p>
+    <w:p>
+      <w:pPr>
+        <w:numPr>
+          <w:numId w:val="0"/>
+        </w:numPr>
+        <w:ind w:leftChars="0"/>
+        <w:rPr>
+          <w:rFonts w:hint="default"/>
+          <w:sz w:val="32"/>
+          <w:szCs w:val="32"/>
+          <w:vertAlign w:val="baseline"/>
+          <w:lang w:val="en-US"/>
+        </w:rPr>
+      </w:pPr>
+    </w:p>
+    <w:p>
+      <w:pPr>
+        <w:numPr>
+          <w:ilvl w:val="0"/>
+          <w:numId w:val="1"/>
+        </w:numPr>
+        <w:ind w:left="420" w:leftChars="0" w:hanging="420" w:firstLineChars="0"/>
+        <w:rPr>
+          <w:rFonts w:hint="default"/>
+          <w:sz w:val="32"/>
+          <w:szCs w:val="32"/>
+          <w:vertAlign w:val="baseline"/>
+          <w:lang w:val="en-US"/>
+        </w:rPr>
+      </w:pPr>
+      <w:r>
+        <w:rPr>
+          <w:rFonts w:hint="default"/>
+          <w:sz w:val="32"/>
+          <w:szCs w:val="32"/>
+          <w:vertAlign w:val="baseline"/>
+          <w:lang w:val="en-US"/>
+        </w:rPr>
+        <w:t>Quản lý thư viện cá nhân: Người dùng có thể xem các bài hát đã thích, danh sách người dùng theo dõi mình và mình đã theo dõi ai.</w:t>
+      </w:r>
+    </w:p>
+    <w:p>
+      <w:pPr>
+        <w:numPr>
+          <w:numId w:val="0"/>
+        </w:numPr>
+        <w:ind w:leftChars="0"/>
+        <w:rPr>
+          <w:rFonts w:hint="default"/>
+          <w:sz w:val="32"/>
+          <w:szCs w:val="32"/>
+          <w:vertAlign w:val="baseline"/>
+          <w:lang w:val="en-US"/>
+        </w:rPr>
+      </w:pPr>
     </w:p>
     <w:p>
       <w:pPr>
@@ -2350,19 +2408,7 @@
                 <w:vertAlign w:val="baseline"/>
                 <w:lang w:val="en-US"/>
               </w:rPr>
-              <w:t>Admin chọn 1 trong 3 phương thức xử lý và nhấn N</w:t>
-            </w:r>
-            <w:bookmarkStart w:id="0" w:name="_GoBack"/>
-            <w:bookmarkEnd w:id="0"/>
-            <w:r>
-              <w:rPr>
-                <w:rFonts w:hint="default"/>
-                <w:sz w:val="32"/>
-                <w:szCs w:val="32"/>
-                <w:vertAlign w:val="baseline"/>
-                <w:lang w:val="en-US"/>
-              </w:rPr>
-              <w:t>út: Ẩn bài hát vi phạm, gửi cảnh cáo đến người vi phạm hoặc bỏ qua nếu báo cáo không đúng.</w:t>
+              <w:t>Admin chọn 1 trong 3 phương thức xử lý và nhấn Nút: Ẩn bài hát vi phạm, gửi cảnh cáo đến người vi phạm hoặc bỏ qua nếu báo cáo không đúng.</w:t>
             </w:r>
           </w:p>
           <w:p>
@@ -6358,7 +6404,7 @@
                 <w:vertAlign w:val="baseline"/>
                 <w:lang w:val="en-US"/>
               </w:rPr>
-              <w:t>Hệ thống chuyển sang giao diện đăng nhập thành công.</w:t>
+              <w:t>Hệ thống Chuyển sang giao diện đăng nhập thành công.</w:t>
             </w:r>
           </w:p>
         </w:tc>
@@ -6918,7 +6964,7 @@
                 <w:vertAlign w:val="baseline"/>
                 <w:lang w:val="en-US"/>
               </w:rPr>
-              <w:t>Hệ thống chuyển sang giao diện cho người dùng đã đăng nhập thành công.</w:t>
+              <w:t>Hệ thống Chuyển sang giao diện cho người dùng đã đăng nhập thành công.</w:t>
             </w:r>
           </w:p>
         </w:tc>
@@ -7478,7 +7524,7 @@
                 <w:vertAlign w:val="baseline"/>
                 <w:lang w:val="en-US"/>
               </w:rPr>
-              <w:t>Hệ thống chuyển sang giao diện cho Admin.</w:t>
+              <w:t>Hệ thống Chuyển sang giao diện cho Admin.</w:t>
             </w:r>
           </w:p>
         </w:tc>
@@ -7922,7 +7968,7 @@
                 <w:vertAlign w:val="baseline"/>
                 <w:lang w:val="en-US"/>
               </w:rPr>
-              <w:t>Hệ thống sẽ chuyển sang chế độ Khách (dành cho người dùng chưa đăng nhập) thành công.</w:t>
+              <w:t>Hệ thống sẽ Chuyển sang chế độ Khách (dành cho người dùng chưa đăng nhập) thành công.</w:t>
             </w:r>
           </w:p>
         </w:tc>
@@ -8183,6 +8229,12 @@
             <w:insideH w:val="single" w:color="auto" w:sz="4" w:space="0"/>
             <w:insideV w:val="single" w:color="auto" w:sz="4" w:space="0"/>
           </w:tblBorders>
+          <w:tblCellMar>
+            <w:top w:w="0" w:type="dxa"/>
+            <w:left w:w="108" w:type="dxa"/>
+            <w:bottom w:w="0" w:type="dxa"/>
+            <w:right w:w="108" w:type="dxa"/>
+          </w:tblCellMar>
         </w:tblPrEx>
         <w:tc>
           <w:tcPr>
@@ -10489,6 +10541,1554 @@
           <w:vertAlign w:val="baseline"/>
           <w:lang w:val="en-US"/>
         </w:rPr>
+        <w:t>Đặc tả Usecase Quản lý thư viện cá nhân</w:t>
+      </w:r>
+    </w:p>
+    <w:tbl>
+      <w:tblPr>
+        <w:tblStyle w:val="4"/>
+        <w:tblW w:w="0" w:type="auto"/>
+        <w:tblInd w:w="0" w:type="dxa"/>
+        <w:tblBorders>
+          <w:top w:val="single" w:color="auto" w:sz="4" w:space="0"/>
+          <w:left w:val="single" w:color="auto" w:sz="4" w:space="0"/>
+          <w:bottom w:val="single" w:color="auto" w:sz="4" w:space="0"/>
+          <w:right w:val="single" w:color="auto" w:sz="4" w:space="0"/>
+          <w:insideH w:val="single" w:color="auto" w:sz="4" w:space="0"/>
+          <w:insideV w:val="single" w:color="auto" w:sz="4" w:space="0"/>
+        </w:tblBorders>
+        <w:tblLayout w:type="autofit"/>
+        <w:tblCellMar>
+          <w:top w:w="0" w:type="dxa"/>
+          <w:left w:w="108" w:type="dxa"/>
+          <w:bottom w:w="0" w:type="dxa"/>
+          <w:right w:w="108" w:type="dxa"/>
+        </w:tblCellMar>
+      </w:tblPr>
+      <w:tblGrid>
+        <w:gridCol w:w="8522"/>
+      </w:tblGrid>
+      <w:tr>
+        <w:tblPrEx>
+          <w:tblBorders>
+            <w:top w:val="single" w:color="auto" w:sz="4" w:space="0"/>
+            <w:left w:val="single" w:color="auto" w:sz="4" w:space="0"/>
+            <w:bottom w:val="single" w:color="auto" w:sz="4" w:space="0"/>
+            <w:right w:val="single" w:color="auto" w:sz="4" w:space="0"/>
+            <w:insideH w:val="single" w:color="auto" w:sz="4" w:space="0"/>
+            <w:insideV w:val="single" w:color="auto" w:sz="4" w:space="0"/>
+          </w:tblBorders>
+          <w:tblCellMar>
+            <w:top w:w="0" w:type="dxa"/>
+            <w:left w:w="108" w:type="dxa"/>
+            <w:bottom w:w="0" w:type="dxa"/>
+            <w:right w:w="108" w:type="dxa"/>
+          </w:tblCellMar>
+        </w:tblPrEx>
+        <w:tc>
+          <w:tcPr>
+            <w:tcW w:w="8522" w:type="dxa"/>
+          </w:tcPr>
+          <w:p>
+            <w:pPr>
+              <w:widowControl w:val="0"/>
+              <w:jc w:val="both"/>
+              <w:rPr>
+                <w:rFonts w:hint="default"/>
+                <w:sz w:val="32"/>
+                <w:szCs w:val="32"/>
+                <w:vertAlign w:val="baseline"/>
+                <w:lang w:val="en-US"/>
+              </w:rPr>
+            </w:pPr>
+            <w:r>
+              <w:rPr>
+                <w:rFonts w:hint="default"/>
+                <w:sz w:val="32"/>
+                <w:szCs w:val="32"/>
+                <w:vertAlign w:val="baseline"/>
+                <w:lang w:val="en-US"/>
+              </w:rPr>
+              <w:t>Tóm tắt: Usecase bắt đầu khi người dùng chọn chức năng Quản lý hồ sơ cá nhân. Hệ thống sẽ cho phép người dùng xem và thực hiện các chỉnh sửa đối với hồ sơ cá nhân của mình.</w:t>
+            </w:r>
+          </w:p>
+        </w:tc>
+      </w:tr>
+      <w:tr>
+        <w:tblPrEx>
+          <w:tblBorders>
+            <w:top w:val="single" w:color="auto" w:sz="4" w:space="0"/>
+            <w:left w:val="single" w:color="auto" w:sz="4" w:space="0"/>
+            <w:bottom w:val="single" w:color="auto" w:sz="4" w:space="0"/>
+            <w:right w:val="single" w:color="auto" w:sz="4" w:space="0"/>
+            <w:insideH w:val="single" w:color="auto" w:sz="4" w:space="0"/>
+            <w:insideV w:val="single" w:color="auto" w:sz="4" w:space="0"/>
+          </w:tblBorders>
+          <w:tblCellMar>
+            <w:top w:w="0" w:type="dxa"/>
+            <w:left w:w="108" w:type="dxa"/>
+            <w:bottom w:w="0" w:type="dxa"/>
+            <w:right w:w="108" w:type="dxa"/>
+          </w:tblCellMar>
+        </w:tblPrEx>
+        <w:tc>
+          <w:tcPr>
+            <w:tcW w:w="8522" w:type="dxa"/>
+          </w:tcPr>
+          <w:p>
+            <w:pPr>
+              <w:widowControl w:val="0"/>
+              <w:jc w:val="both"/>
+              <w:rPr>
+                <w:rFonts w:hint="default"/>
+                <w:sz w:val="32"/>
+                <w:szCs w:val="32"/>
+                <w:vertAlign w:val="baseline"/>
+                <w:lang w:val="en-US"/>
+              </w:rPr>
+            </w:pPr>
+            <w:r>
+              <w:rPr>
+                <w:rFonts w:hint="default"/>
+                <w:sz w:val="32"/>
+                <w:szCs w:val="32"/>
+                <w:vertAlign w:val="baseline"/>
+                <w:lang w:val="en-US"/>
+              </w:rPr>
+              <w:t xml:space="preserve">Dòng sự kiện chính: </w:t>
+            </w:r>
+          </w:p>
+          <w:p>
+            <w:pPr>
+              <w:widowControl w:val="0"/>
+              <w:numPr>
+                <w:ilvl w:val="0"/>
+                <w:numId w:val="46"/>
+              </w:numPr>
+              <w:ind w:leftChars="0"/>
+              <w:jc w:val="both"/>
+              <w:rPr>
+                <w:rFonts w:hint="default"/>
+                <w:sz w:val="32"/>
+                <w:szCs w:val="32"/>
+                <w:vertAlign w:val="baseline"/>
+                <w:lang w:val="en-US"/>
+              </w:rPr>
+            </w:pPr>
+            <w:r>
+              <w:rPr>
+                <w:rFonts w:hint="default"/>
+                <w:sz w:val="32"/>
+                <w:szCs w:val="32"/>
+                <w:vertAlign w:val="baseline"/>
+                <w:lang w:val="en-US"/>
+              </w:rPr>
+              <w:t>Hệ thống hiện giao diện Quản lý hồ sơ cá nhân thành công.</w:t>
+            </w:r>
+          </w:p>
+          <w:p>
+            <w:pPr>
+              <w:widowControl w:val="0"/>
+              <w:numPr>
+                <w:ilvl w:val="0"/>
+                <w:numId w:val="46"/>
+              </w:numPr>
+              <w:ind w:leftChars="0"/>
+              <w:jc w:val="both"/>
+              <w:rPr>
+                <w:rFonts w:hint="default"/>
+                <w:sz w:val="32"/>
+                <w:szCs w:val="32"/>
+                <w:vertAlign w:val="baseline"/>
+                <w:lang w:val="en-US"/>
+              </w:rPr>
+            </w:pPr>
+            <w:r>
+              <w:rPr>
+                <w:rFonts w:hint="default"/>
+                <w:sz w:val="32"/>
+                <w:szCs w:val="32"/>
+                <w:vertAlign w:val="baseline"/>
+                <w:lang w:val="en-US"/>
+              </w:rPr>
+              <w:t>Người dùng có thể chọn 1 trong 3 chức năng:</w:t>
+            </w:r>
+          </w:p>
+          <w:p>
+            <w:pPr>
+              <w:widowControl w:val="0"/>
+              <w:numPr>
+                <w:ilvl w:val="0"/>
+                <w:numId w:val="0"/>
+              </w:numPr>
+              <w:jc w:val="both"/>
+              <w:rPr>
+                <w:rFonts w:hint="default"/>
+                <w:sz w:val="32"/>
+                <w:szCs w:val="32"/>
+                <w:vertAlign w:val="baseline"/>
+                <w:lang w:val="en-US"/>
+              </w:rPr>
+            </w:pPr>
+            <w:r>
+              <w:rPr>
+                <w:rFonts w:hint="default"/>
+                <w:sz w:val="32"/>
+                <w:szCs w:val="32"/>
+                <w:vertAlign w:val="baseline"/>
+                <w:lang w:val="en-US"/>
+              </w:rPr>
+              <w:t xml:space="preserve">     2.1/ Xem danh sách và tìm kiếm bài hát yêu thích (Chuyển sang Usecase Xem danh sách và tìm kiếm bài hát yêu thích).</w:t>
+            </w:r>
+          </w:p>
+          <w:p>
+            <w:pPr>
+              <w:widowControl w:val="0"/>
+              <w:numPr>
+                <w:ilvl w:val="0"/>
+                <w:numId w:val="0"/>
+              </w:numPr>
+              <w:jc w:val="both"/>
+              <w:rPr>
+                <w:rFonts w:hint="default"/>
+                <w:sz w:val="32"/>
+                <w:szCs w:val="32"/>
+                <w:vertAlign w:val="baseline"/>
+                <w:lang w:val="en-US"/>
+              </w:rPr>
+            </w:pPr>
+            <w:r>
+              <w:rPr>
+                <w:rFonts w:hint="default"/>
+                <w:sz w:val="32"/>
+                <w:szCs w:val="32"/>
+                <w:vertAlign w:val="baseline"/>
+                <w:lang w:val="en-US"/>
+              </w:rPr>
+              <w:t xml:space="preserve">     2.2/ Xem danh sách và tìm kiếm Follower. Hệ thống hiện danh sách Follower và ô tìm kiếm thành công.</w:t>
+            </w:r>
+          </w:p>
+          <w:p>
+            <w:pPr>
+              <w:widowControl w:val="0"/>
+              <w:numPr>
+                <w:ilvl w:val="0"/>
+                <w:numId w:val="0"/>
+              </w:numPr>
+              <w:jc w:val="both"/>
+              <w:rPr>
+                <w:rFonts w:hint="default"/>
+                <w:sz w:val="32"/>
+                <w:szCs w:val="32"/>
+                <w:vertAlign w:val="baseline"/>
+                <w:lang w:val="en-US"/>
+              </w:rPr>
+            </w:pPr>
+            <w:r>
+              <w:rPr>
+                <w:rFonts w:hint="default"/>
+                <w:sz w:val="32"/>
+                <w:szCs w:val="32"/>
+                <w:vertAlign w:val="baseline"/>
+                <w:lang w:val="en-US"/>
+              </w:rPr>
+              <w:t xml:space="preserve">     2.3/ Xem danh sách và tìm kiếm Following (Chuyển sang Usecase Xem danh sách  và tìm kiếm Following).</w:t>
+            </w:r>
+          </w:p>
+          <w:p>
+            <w:pPr>
+              <w:widowControl w:val="0"/>
+              <w:numPr>
+                <w:ilvl w:val="0"/>
+                <w:numId w:val="46"/>
+              </w:numPr>
+              <w:ind w:left="0" w:leftChars="0" w:firstLine="0" w:firstLineChars="0"/>
+              <w:jc w:val="both"/>
+              <w:rPr>
+                <w:rFonts w:hint="default"/>
+                <w:sz w:val="32"/>
+                <w:szCs w:val="32"/>
+                <w:vertAlign w:val="baseline"/>
+                <w:lang w:val="en-US"/>
+              </w:rPr>
+            </w:pPr>
+            <w:r>
+              <w:rPr>
+                <w:rFonts w:hint="default"/>
+                <w:sz w:val="32"/>
+                <w:szCs w:val="32"/>
+                <w:vertAlign w:val="baseline"/>
+                <w:lang w:val="en-US"/>
+              </w:rPr>
+              <w:t>Hệ thống sẽ ghi nhận các chức năng người dùng đã thực hiện   thành công.</w:t>
+            </w:r>
+          </w:p>
+        </w:tc>
+      </w:tr>
+      <w:tr>
+        <w:tblPrEx>
+          <w:tblBorders>
+            <w:top w:val="single" w:color="auto" w:sz="4" w:space="0"/>
+            <w:left w:val="single" w:color="auto" w:sz="4" w:space="0"/>
+            <w:bottom w:val="single" w:color="auto" w:sz="4" w:space="0"/>
+            <w:right w:val="single" w:color="auto" w:sz="4" w:space="0"/>
+            <w:insideH w:val="single" w:color="auto" w:sz="4" w:space="0"/>
+            <w:insideV w:val="single" w:color="auto" w:sz="4" w:space="0"/>
+          </w:tblBorders>
+          <w:tblCellMar>
+            <w:top w:w="0" w:type="dxa"/>
+            <w:left w:w="108" w:type="dxa"/>
+            <w:bottom w:w="0" w:type="dxa"/>
+            <w:right w:w="108" w:type="dxa"/>
+          </w:tblCellMar>
+        </w:tblPrEx>
+        <w:tc>
+          <w:tcPr>
+            <w:tcW w:w="8522" w:type="dxa"/>
+          </w:tcPr>
+          <w:p>
+            <w:pPr>
+              <w:widowControl w:val="0"/>
+              <w:jc w:val="both"/>
+              <w:rPr>
+                <w:rFonts w:hint="default"/>
+                <w:sz w:val="32"/>
+                <w:szCs w:val="32"/>
+                <w:vertAlign w:val="baseline"/>
+                <w:lang w:val="en-US"/>
+              </w:rPr>
+            </w:pPr>
+            <w:r>
+              <w:rPr>
+                <w:rFonts w:hint="default"/>
+                <w:sz w:val="32"/>
+                <w:szCs w:val="32"/>
+                <w:vertAlign w:val="baseline"/>
+                <w:lang w:val="en-US"/>
+              </w:rPr>
+              <w:t>Dòng sự kiện phụ:</w:t>
+            </w:r>
+          </w:p>
+          <w:p>
+            <w:pPr>
+              <w:widowControl w:val="0"/>
+              <w:numPr>
+                <w:ilvl w:val="0"/>
+                <w:numId w:val="0"/>
+              </w:numPr>
+              <w:jc w:val="both"/>
+              <w:rPr>
+                <w:rFonts w:hint="default"/>
+                <w:sz w:val="32"/>
+                <w:szCs w:val="32"/>
+                <w:vertAlign w:val="baseline"/>
+                <w:lang w:val="en-US"/>
+              </w:rPr>
+            </w:pPr>
+            <w:r>
+              <w:rPr>
+                <w:rFonts w:hint="default"/>
+                <w:sz w:val="32"/>
+                <w:szCs w:val="32"/>
+                <w:vertAlign w:val="baseline"/>
+                <w:lang w:val="en-US"/>
+              </w:rPr>
+              <w:t>3.3.1 Nếu hệ thống ghi nhận các chức năng người dùng đã thực hiện không thành công thì hệ thống thông báo “Hành động thất bại, vui lòng thử lại” đến người dùng.</w:t>
+            </w:r>
+          </w:p>
+        </w:tc>
+      </w:tr>
+      <w:tr>
+        <w:tblPrEx>
+          <w:tblBorders>
+            <w:top w:val="single" w:color="auto" w:sz="4" w:space="0"/>
+            <w:left w:val="single" w:color="auto" w:sz="4" w:space="0"/>
+            <w:bottom w:val="single" w:color="auto" w:sz="4" w:space="0"/>
+            <w:right w:val="single" w:color="auto" w:sz="4" w:space="0"/>
+            <w:insideH w:val="single" w:color="auto" w:sz="4" w:space="0"/>
+            <w:insideV w:val="single" w:color="auto" w:sz="4" w:space="0"/>
+          </w:tblBorders>
+          <w:tblCellMar>
+            <w:top w:w="0" w:type="dxa"/>
+            <w:left w:w="108" w:type="dxa"/>
+            <w:bottom w:w="0" w:type="dxa"/>
+            <w:right w:w="108" w:type="dxa"/>
+          </w:tblCellMar>
+        </w:tblPrEx>
+        <w:tc>
+          <w:tcPr>
+            <w:tcW w:w="8522" w:type="dxa"/>
+          </w:tcPr>
+          <w:p>
+            <w:pPr>
+              <w:widowControl w:val="0"/>
+              <w:jc w:val="both"/>
+              <w:rPr>
+                <w:rFonts w:hint="default"/>
+                <w:sz w:val="32"/>
+                <w:szCs w:val="32"/>
+                <w:vertAlign w:val="baseline"/>
+                <w:lang w:val="en-US"/>
+              </w:rPr>
+            </w:pPr>
+            <w:r>
+              <w:rPr>
+                <w:rFonts w:hint="default"/>
+                <w:sz w:val="32"/>
+                <w:szCs w:val="32"/>
+                <w:vertAlign w:val="baseline"/>
+                <w:lang w:val="en-US"/>
+              </w:rPr>
+              <w:t xml:space="preserve">Tiền điều kiện: </w:t>
+            </w:r>
+          </w:p>
+          <w:p>
+            <w:pPr>
+              <w:widowControl w:val="0"/>
+              <w:numPr>
+                <w:ilvl w:val="0"/>
+                <w:numId w:val="47"/>
+              </w:numPr>
+              <w:jc w:val="both"/>
+              <w:rPr>
+                <w:rFonts w:hint="default"/>
+                <w:sz w:val="32"/>
+                <w:szCs w:val="32"/>
+                <w:vertAlign w:val="baseline"/>
+                <w:lang w:val="en-US"/>
+              </w:rPr>
+            </w:pPr>
+            <w:r>
+              <w:rPr>
+                <w:rFonts w:hint="default"/>
+                <w:sz w:val="32"/>
+                <w:szCs w:val="32"/>
+                <w:vertAlign w:val="baseline"/>
+                <w:lang w:val="en-US"/>
+              </w:rPr>
+              <w:t>Hệ thống ở chế độ Người dùng.</w:t>
+            </w:r>
+          </w:p>
+        </w:tc>
+      </w:tr>
+      <w:tr>
+        <w:tblPrEx>
+          <w:tblBorders>
+            <w:top w:val="single" w:color="auto" w:sz="4" w:space="0"/>
+            <w:left w:val="single" w:color="auto" w:sz="4" w:space="0"/>
+            <w:bottom w:val="single" w:color="auto" w:sz="4" w:space="0"/>
+            <w:right w:val="single" w:color="auto" w:sz="4" w:space="0"/>
+            <w:insideH w:val="single" w:color="auto" w:sz="4" w:space="0"/>
+            <w:insideV w:val="single" w:color="auto" w:sz="4" w:space="0"/>
+          </w:tblBorders>
+          <w:tblCellMar>
+            <w:top w:w="0" w:type="dxa"/>
+            <w:left w:w="108" w:type="dxa"/>
+            <w:bottom w:w="0" w:type="dxa"/>
+            <w:right w:w="108" w:type="dxa"/>
+          </w:tblCellMar>
+        </w:tblPrEx>
+        <w:tc>
+          <w:tcPr>
+            <w:tcW w:w="8522" w:type="dxa"/>
+          </w:tcPr>
+          <w:p>
+            <w:pPr>
+              <w:widowControl w:val="0"/>
+              <w:jc w:val="both"/>
+              <w:rPr>
+                <w:rFonts w:hint="default"/>
+                <w:sz w:val="32"/>
+                <w:szCs w:val="32"/>
+                <w:vertAlign w:val="baseline"/>
+                <w:lang w:val="en-US"/>
+              </w:rPr>
+            </w:pPr>
+            <w:r>
+              <w:rPr>
+                <w:rFonts w:hint="default"/>
+                <w:sz w:val="32"/>
+                <w:szCs w:val="32"/>
+                <w:vertAlign w:val="baseline"/>
+                <w:lang w:val="en-US"/>
+              </w:rPr>
+              <w:t xml:space="preserve">Hậu điều kiện: </w:t>
+            </w:r>
+          </w:p>
+          <w:p>
+            <w:pPr>
+              <w:widowControl w:val="0"/>
+              <w:numPr>
+                <w:ilvl w:val="0"/>
+                <w:numId w:val="48"/>
+              </w:numPr>
+              <w:ind w:leftChars="0"/>
+              <w:jc w:val="both"/>
+              <w:rPr>
+                <w:rFonts w:hint="default"/>
+                <w:sz w:val="32"/>
+                <w:szCs w:val="32"/>
+                <w:vertAlign w:val="baseline"/>
+                <w:lang w:val="en-US"/>
+              </w:rPr>
+            </w:pPr>
+            <w:r>
+              <w:rPr>
+                <w:rFonts w:hint="default"/>
+                <w:sz w:val="32"/>
+                <w:szCs w:val="32"/>
+                <w:vertAlign w:val="baseline"/>
+                <w:lang w:val="en-US"/>
+              </w:rPr>
+              <w:t>Hệ thống sẵn sàng thực hiện yêu cầu tiếp theo mà người dùng yêu cầu.</w:t>
+            </w:r>
+          </w:p>
+        </w:tc>
+      </w:tr>
+    </w:tbl>
+    <w:p>
+      <w:pPr>
+        <w:rPr>
+          <w:rFonts w:hint="default"/>
+          <w:sz w:val="32"/>
+          <w:szCs w:val="32"/>
+          <w:vertAlign w:val="baseline"/>
+          <w:lang w:val="en-US"/>
+        </w:rPr>
+      </w:pPr>
+    </w:p>
+    <w:p>
+      <w:pPr>
+        <w:rPr>
+          <w:rFonts w:hint="default"/>
+          <w:sz w:val="32"/>
+          <w:szCs w:val="32"/>
+          <w:vertAlign w:val="baseline"/>
+          <w:lang w:val="en-US"/>
+        </w:rPr>
+      </w:pPr>
+      <w:r>
+        <w:rPr>
+          <w:rFonts w:hint="default"/>
+          <w:sz w:val="32"/>
+          <w:szCs w:val="32"/>
+          <w:vertAlign w:val="baseline"/>
+          <w:lang w:val="en-US"/>
+        </w:rPr>
+        <w:t>Đặc tả Usecase Xem danh sách và tìm kiếm bài hát yêu thích</w:t>
+      </w:r>
+    </w:p>
+    <w:tbl>
+      <w:tblPr>
+        <w:tblStyle w:val="4"/>
+        <w:tblW w:w="0" w:type="auto"/>
+        <w:tblInd w:w="0" w:type="dxa"/>
+        <w:tblBorders>
+          <w:top w:val="single" w:color="auto" w:sz="4" w:space="0"/>
+          <w:left w:val="single" w:color="auto" w:sz="4" w:space="0"/>
+          <w:bottom w:val="single" w:color="auto" w:sz="4" w:space="0"/>
+          <w:right w:val="single" w:color="auto" w:sz="4" w:space="0"/>
+          <w:insideH w:val="single" w:color="auto" w:sz="4" w:space="0"/>
+          <w:insideV w:val="single" w:color="auto" w:sz="4" w:space="0"/>
+        </w:tblBorders>
+        <w:tblLayout w:type="autofit"/>
+        <w:tblCellMar>
+          <w:top w:w="0" w:type="dxa"/>
+          <w:left w:w="108" w:type="dxa"/>
+          <w:bottom w:w="0" w:type="dxa"/>
+          <w:right w:w="108" w:type="dxa"/>
+        </w:tblCellMar>
+      </w:tblPr>
+      <w:tblGrid>
+        <w:gridCol w:w="8522"/>
+      </w:tblGrid>
+      <w:tr>
+        <w:tblPrEx>
+          <w:tblBorders>
+            <w:top w:val="single" w:color="auto" w:sz="4" w:space="0"/>
+            <w:left w:val="single" w:color="auto" w:sz="4" w:space="0"/>
+            <w:bottom w:val="single" w:color="auto" w:sz="4" w:space="0"/>
+            <w:right w:val="single" w:color="auto" w:sz="4" w:space="0"/>
+            <w:insideH w:val="single" w:color="auto" w:sz="4" w:space="0"/>
+            <w:insideV w:val="single" w:color="auto" w:sz="4" w:space="0"/>
+          </w:tblBorders>
+          <w:tblCellMar>
+            <w:top w:w="0" w:type="dxa"/>
+            <w:left w:w="108" w:type="dxa"/>
+            <w:bottom w:w="0" w:type="dxa"/>
+            <w:right w:w="108" w:type="dxa"/>
+          </w:tblCellMar>
+        </w:tblPrEx>
+        <w:tc>
+          <w:tcPr>
+            <w:tcW w:w="8522" w:type="dxa"/>
+          </w:tcPr>
+          <w:p>
+            <w:pPr>
+              <w:widowControl w:val="0"/>
+              <w:jc w:val="both"/>
+              <w:rPr>
+                <w:rFonts w:hint="default"/>
+                <w:sz w:val="32"/>
+                <w:szCs w:val="32"/>
+                <w:vertAlign w:val="baseline"/>
+                <w:lang w:val="en-US"/>
+              </w:rPr>
+            </w:pPr>
+            <w:r>
+              <w:rPr>
+                <w:rFonts w:hint="default"/>
+                <w:sz w:val="32"/>
+                <w:szCs w:val="32"/>
+                <w:vertAlign w:val="baseline"/>
+                <w:lang w:val="en-US"/>
+              </w:rPr>
+              <w:t>Tóm tắt: Usecase bắt đầu khi người dùng chọn chức năng Xem danh sách và tìm kiếm bài hát yêu thích trong Quản lý thư viện cá nhân. Hệ thống cho phép người dùng xem danh sách và tìm kiếm bài hát yêu thích trong thư viện cá nhân.</w:t>
+            </w:r>
+          </w:p>
+        </w:tc>
+      </w:tr>
+      <w:tr>
+        <w:tblPrEx>
+          <w:tblBorders>
+            <w:top w:val="single" w:color="auto" w:sz="4" w:space="0"/>
+            <w:left w:val="single" w:color="auto" w:sz="4" w:space="0"/>
+            <w:bottom w:val="single" w:color="auto" w:sz="4" w:space="0"/>
+            <w:right w:val="single" w:color="auto" w:sz="4" w:space="0"/>
+            <w:insideH w:val="single" w:color="auto" w:sz="4" w:space="0"/>
+            <w:insideV w:val="single" w:color="auto" w:sz="4" w:space="0"/>
+          </w:tblBorders>
+          <w:tblCellMar>
+            <w:top w:w="0" w:type="dxa"/>
+            <w:left w:w="108" w:type="dxa"/>
+            <w:bottom w:w="0" w:type="dxa"/>
+            <w:right w:w="108" w:type="dxa"/>
+          </w:tblCellMar>
+        </w:tblPrEx>
+        <w:tc>
+          <w:tcPr>
+            <w:tcW w:w="8522" w:type="dxa"/>
+          </w:tcPr>
+          <w:p>
+            <w:pPr>
+              <w:widowControl w:val="0"/>
+              <w:jc w:val="both"/>
+              <w:rPr>
+                <w:rFonts w:hint="default"/>
+                <w:sz w:val="32"/>
+                <w:szCs w:val="32"/>
+                <w:vertAlign w:val="baseline"/>
+                <w:lang w:val="en-US"/>
+              </w:rPr>
+            </w:pPr>
+            <w:r>
+              <w:rPr>
+                <w:rFonts w:hint="default"/>
+                <w:sz w:val="32"/>
+                <w:szCs w:val="32"/>
+                <w:vertAlign w:val="baseline"/>
+                <w:lang w:val="en-US"/>
+              </w:rPr>
+              <w:t xml:space="preserve">Dòng sự kiện chính: </w:t>
+            </w:r>
+          </w:p>
+          <w:p>
+            <w:pPr>
+              <w:widowControl w:val="0"/>
+              <w:numPr>
+                <w:ilvl w:val="0"/>
+                <w:numId w:val="49"/>
+              </w:numPr>
+              <w:jc w:val="both"/>
+              <w:rPr>
+                <w:rFonts w:hint="default"/>
+                <w:sz w:val="32"/>
+                <w:szCs w:val="32"/>
+                <w:vertAlign w:val="baseline"/>
+                <w:lang w:val="en-US"/>
+              </w:rPr>
+            </w:pPr>
+            <w:r>
+              <w:rPr>
+                <w:rFonts w:hint="default"/>
+                <w:sz w:val="32"/>
+                <w:szCs w:val="32"/>
+                <w:vertAlign w:val="baseline"/>
+                <w:lang w:val="en-US"/>
+              </w:rPr>
+              <w:t>Hệ thống hiện giao diện Xem danh sách và tìm kiếm bài hát yêu thích thành công.</w:t>
+            </w:r>
+          </w:p>
+          <w:p>
+            <w:pPr>
+              <w:widowControl w:val="0"/>
+              <w:numPr>
+                <w:ilvl w:val="0"/>
+                <w:numId w:val="49"/>
+              </w:numPr>
+              <w:ind w:left="0" w:leftChars="0" w:firstLine="0" w:firstLineChars="0"/>
+              <w:jc w:val="both"/>
+              <w:rPr>
+                <w:rFonts w:hint="default"/>
+                <w:sz w:val="32"/>
+                <w:szCs w:val="32"/>
+                <w:vertAlign w:val="baseline"/>
+                <w:lang w:val="en-US"/>
+              </w:rPr>
+            </w:pPr>
+            <w:r>
+              <w:rPr>
+                <w:rFonts w:hint="default"/>
+                <w:sz w:val="32"/>
+                <w:szCs w:val="32"/>
+                <w:vertAlign w:val="baseline"/>
+                <w:lang w:val="en-US"/>
+              </w:rPr>
+              <w:t>Người dùng xem danh sách và tìm kiếm bài hát yêu thích.</w:t>
+            </w:r>
+          </w:p>
+          <w:p>
+            <w:pPr>
+              <w:widowControl w:val="0"/>
+              <w:numPr>
+                <w:ilvl w:val="0"/>
+                <w:numId w:val="49"/>
+              </w:numPr>
+              <w:ind w:left="0" w:leftChars="0" w:firstLine="0" w:firstLineChars="0"/>
+              <w:jc w:val="both"/>
+              <w:rPr>
+                <w:rFonts w:hint="default"/>
+                <w:sz w:val="32"/>
+                <w:szCs w:val="32"/>
+                <w:vertAlign w:val="baseline"/>
+                <w:lang w:val="en-US"/>
+              </w:rPr>
+            </w:pPr>
+            <w:r>
+              <w:rPr>
+                <w:rFonts w:hint="default"/>
+                <w:sz w:val="32"/>
+                <w:szCs w:val="32"/>
+                <w:vertAlign w:val="baseline"/>
+                <w:lang w:val="en-US"/>
+              </w:rPr>
+              <w:t>Người dùng có thể thực hiện các chức năng Nghe nhạc, huỷ Thích, Bình luận, Chia sẻ, Đăng lại khi chọn đúng bài hát mình muốn.</w:t>
+            </w:r>
+          </w:p>
+          <w:p>
+            <w:pPr>
+              <w:widowControl w:val="0"/>
+              <w:numPr>
+                <w:ilvl w:val="0"/>
+                <w:numId w:val="49"/>
+              </w:numPr>
+              <w:ind w:left="0" w:leftChars="0" w:firstLine="0" w:firstLineChars="0"/>
+              <w:jc w:val="both"/>
+              <w:rPr>
+                <w:rFonts w:hint="default"/>
+                <w:sz w:val="32"/>
+                <w:szCs w:val="32"/>
+                <w:vertAlign w:val="baseline"/>
+                <w:lang w:val="en-US"/>
+              </w:rPr>
+            </w:pPr>
+            <w:r>
+              <w:rPr>
+                <w:rFonts w:hint="default"/>
+                <w:sz w:val="32"/>
+                <w:szCs w:val="32"/>
+                <w:vertAlign w:val="baseline"/>
+                <w:lang w:val="en-US"/>
+              </w:rPr>
+              <w:t>Hệ thống ghi nhận các chức năng người dùng đã thực hiện  với bài hát yêu thích đó thành công.</w:t>
+            </w:r>
+          </w:p>
+          <w:p>
+            <w:pPr>
+              <w:widowControl w:val="0"/>
+              <w:numPr>
+                <w:ilvl w:val="0"/>
+                <w:numId w:val="49"/>
+              </w:numPr>
+              <w:ind w:left="0" w:leftChars="0" w:firstLine="0" w:firstLineChars="0"/>
+              <w:jc w:val="both"/>
+              <w:rPr>
+                <w:rFonts w:hint="default"/>
+                <w:sz w:val="32"/>
+                <w:szCs w:val="32"/>
+                <w:vertAlign w:val="baseline"/>
+                <w:lang w:val="en-US"/>
+              </w:rPr>
+            </w:pPr>
+            <w:r>
+              <w:rPr>
+                <w:rFonts w:hint="default"/>
+                <w:sz w:val="32"/>
+                <w:szCs w:val="32"/>
+                <w:vertAlign w:val="baseline"/>
+                <w:lang w:val="en-US"/>
+              </w:rPr>
+              <w:t>Hệ thống cập nhật danh sách bài hát yêu thích của người dùng thành công.</w:t>
+            </w:r>
+          </w:p>
+        </w:tc>
+      </w:tr>
+      <w:tr>
+        <w:tblPrEx>
+          <w:tblBorders>
+            <w:top w:val="single" w:color="auto" w:sz="4" w:space="0"/>
+            <w:left w:val="single" w:color="auto" w:sz="4" w:space="0"/>
+            <w:bottom w:val="single" w:color="auto" w:sz="4" w:space="0"/>
+            <w:right w:val="single" w:color="auto" w:sz="4" w:space="0"/>
+            <w:insideH w:val="single" w:color="auto" w:sz="4" w:space="0"/>
+            <w:insideV w:val="single" w:color="auto" w:sz="4" w:space="0"/>
+          </w:tblBorders>
+          <w:tblCellMar>
+            <w:top w:w="0" w:type="dxa"/>
+            <w:left w:w="108" w:type="dxa"/>
+            <w:bottom w:w="0" w:type="dxa"/>
+            <w:right w:w="108" w:type="dxa"/>
+          </w:tblCellMar>
+        </w:tblPrEx>
+        <w:tc>
+          <w:tcPr>
+            <w:tcW w:w="8522" w:type="dxa"/>
+          </w:tcPr>
+          <w:p>
+            <w:pPr>
+              <w:widowControl w:val="0"/>
+              <w:jc w:val="both"/>
+              <w:rPr>
+                <w:rFonts w:hint="default"/>
+                <w:sz w:val="32"/>
+                <w:szCs w:val="32"/>
+                <w:vertAlign w:val="baseline"/>
+                <w:lang w:val="en-US"/>
+              </w:rPr>
+            </w:pPr>
+            <w:r>
+              <w:rPr>
+                <w:rFonts w:hint="default"/>
+                <w:sz w:val="32"/>
+                <w:szCs w:val="32"/>
+                <w:vertAlign w:val="baseline"/>
+                <w:lang w:val="en-US"/>
+              </w:rPr>
+              <w:t>Dòng sự kiện phụ:</w:t>
+            </w:r>
+          </w:p>
+          <w:p>
+            <w:pPr>
+              <w:widowControl w:val="0"/>
+              <w:numPr>
+                <w:ilvl w:val="0"/>
+                <w:numId w:val="0"/>
+              </w:numPr>
+              <w:jc w:val="both"/>
+              <w:rPr>
+                <w:rFonts w:hint="default"/>
+                <w:sz w:val="32"/>
+                <w:szCs w:val="32"/>
+                <w:vertAlign w:val="baseline"/>
+                <w:lang w:val="en-US"/>
+              </w:rPr>
+            </w:pPr>
+            <w:r>
+              <w:rPr>
+                <w:rFonts w:hint="default"/>
+                <w:sz w:val="32"/>
+                <w:szCs w:val="32"/>
+                <w:vertAlign w:val="baseline"/>
+                <w:lang w:val="en-US"/>
+              </w:rPr>
+              <w:t>4.1 Nếu hệ thống ghi nhận các chức năng người dùng đã thực hiện hoặc cập nhật danh sách bài hát yêu thích không thành công thì hệ thống thông báo “Hành động thất bại, vui lòng thử lại” đến người dùng.</w:t>
+            </w:r>
+          </w:p>
+        </w:tc>
+      </w:tr>
+      <w:tr>
+        <w:tblPrEx>
+          <w:tblBorders>
+            <w:top w:val="single" w:color="auto" w:sz="4" w:space="0"/>
+            <w:left w:val="single" w:color="auto" w:sz="4" w:space="0"/>
+            <w:bottom w:val="single" w:color="auto" w:sz="4" w:space="0"/>
+            <w:right w:val="single" w:color="auto" w:sz="4" w:space="0"/>
+            <w:insideH w:val="single" w:color="auto" w:sz="4" w:space="0"/>
+            <w:insideV w:val="single" w:color="auto" w:sz="4" w:space="0"/>
+          </w:tblBorders>
+          <w:tblCellMar>
+            <w:top w:w="0" w:type="dxa"/>
+            <w:left w:w="108" w:type="dxa"/>
+            <w:bottom w:w="0" w:type="dxa"/>
+            <w:right w:w="108" w:type="dxa"/>
+          </w:tblCellMar>
+        </w:tblPrEx>
+        <w:tc>
+          <w:tcPr>
+            <w:tcW w:w="8522" w:type="dxa"/>
+          </w:tcPr>
+          <w:p>
+            <w:pPr>
+              <w:widowControl w:val="0"/>
+              <w:jc w:val="both"/>
+              <w:rPr>
+                <w:rFonts w:hint="default"/>
+                <w:sz w:val="32"/>
+                <w:szCs w:val="32"/>
+                <w:vertAlign w:val="baseline"/>
+                <w:lang w:val="en-US"/>
+              </w:rPr>
+            </w:pPr>
+            <w:r>
+              <w:rPr>
+                <w:rFonts w:hint="default"/>
+                <w:sz w:val="32"/>
+                <w:szCs w:val="32"/>
+                <w:vertAlign w:val="baseline"/>
+                <w:lang w:val="en-US"/>
+              </w:rPr>
+              <w:t xml:space="preserve">Tiền điều kiện: </w:t>
+            </w:r>
+          </w:p>
+          <w:p>
+            <w:pPr>
+              <w:widowControl w:val="0"/>
+              <w:numPr>
+                <w:ilvl w:val="0"/>
+                <w:numId w:val="50"/>
+              </w:numPr>
+              <w:jc w:val="both"/>
+              <w:rPr>
+                <w:rFonts w:hint="default"/>
+                <w:sz w:val="32"/>
+                <w:szCs w:val="32"/>
+                <w:vertAlign w:val="baseline"/>
+                <w:lang w:val="en-US"/>
+              </w:rPr>
+            </w:pPr>
+            <w:r>
+              <w:rPr>
+                <w:rFonts w:hint="default"/>
+                <w:sz w:val="32"/>
+                <w:szCs w:val="32"/>
+                <w:vertAlign w:val="baseline"/>
+                <w:lang w:val="en-US"/>
+              </w:rPr>
+              <w:t>Hệ thống ở chế độ Người dùng.</w:t>
+            </w:r>
+          </w:p>
+        </w:tc>
+      </w:tr>
+      <w:tr>
+        <w:tblPrEx>
+          <w:tblBorders>
+            <w:top w:val="single" w:color="auto" w:sz="4" w:space="0"/>
+            <w:left w:val="single" w:color="auto" w:sz="4" w:space="0"/>
+            <w:bottom w:val="single" w:color="auto" w:sz="4" w:space="0"/>
+            <w:right w:val="single" w:color="auto" w:sz="4" w:space="0"/>
+            <w:insideH w:val="single" w:color="auto" w:sz="4" w:space="0"/>
+            <w:insideV w:val="single" w:color="auto" w:sz="4" w:space="0"/>
+          </w:tblBorders>
+          <w:tblCellMar>
+            <w:top w:w="0" w:type="dxa"/>
+            <w:left w:w="108" w:type="dxa"/>
+            <w:bottom w:w="0" w:type="dxa"/>
+            <w:right w:w="108" w:type="dxa"/>
+          </w:tblCellMar>
+        </w:tblPrEx>
+        <w:tc>
+          <w:tcPr>
+            <w:tcW w:w="8522" w:type="dxa"/>
+          </w:tcPr>
+          <w:p>
+            <w:pPr>
+              <w:widowControl w:val="0"/>
+              <w:jc w:val="both"/>
+              <w:rPr>
+                <w:rFonts w:hint="default"/>
+                <w:sz w:val="32"/>
+                <w:szCs w:val="32"/>
+                <w:vertAlign w:val="baseline"/>
+                <w:lang w:val="en-US"/>
+              </w:rPr>
+            </w:pPr>
+            <w:r>
+              <w:rPr>
+                <w:rFonts w:hint="default"/>
+                <w:sz w:val="32"/>
+                <w:szCs w:val="32"/>
+                <w:vertAlign w:val="baseline"/>
+                <w:lang w:val="en-US"/>
+              </w:rPr>
+              <w:t xml:space="preserve">Hậu điều kiện: </w:t>
+            </w:r>
+          </w:p>
+          <w:p>
+            <w:pPr>
+              <w:widowControl w:val="0"/>
+              <w:numPr>
+                <w:ilvl w:val="0"/>
+                <w:numId w:val="51"/>
+              </w:numPr>
+              <w:jc w:val="both"/>
+              <w:rPr>
+                <w:rFonts w:hint="default"/>
+                <w:sz w:val="32"/>
+                <w:szCs w:val="32"/>
+                <w:vertAlign w:val="baseline"/>
+                <w:lang w:val="en-US"/>
+              </w:rPr>
+            </w:pPr>
+            <w:r>
+              <w:rPr>
+                <w:rFonts w:hint="default"/>
+                <w:sz w:val="32"/>
+                <w:szCs w:val="32"/>
+                <w:vertAlign w:val="baseline"/>
+                <w:lang w:val="en-US"/>
+              </w:rPr>
+              <w:t>Hệ thống sẵn sàng để thực hiện yêu cầu tiếp theo của người dùng với bài hát yêu thích.</w:t>
+            </w:r>
+          </w:p>
+        </w:tc>
+      </w:tr>
+    </w:tbl>
+    <w:p>
+      <w:pPr>
+        <w:rPr>
+          <w:rFonts w:hint="default"/>
+          <w:sz w:val="32"/>
+          <w:szCs w:val="32"/>
+          <w:vertAlign w:val="baseline"/>
+          <w:lang w:val="en-US"/>
+        </w:rPr>
+      </w:pPr>
+    </w:p>
+    <w:p>
+      <w:pPr>
+        <w:rPr>
+          <w:rFonts w:hint="default"/>
+          <w:sz w:val="32"/>
+          <w:szCs w:val="32"/>
+          <w:vertAlign w:val="baseline"/>
+          <w:lang w:val="en-US"/>
+        </w:rPr>
+      </w:pPr>
+      <w:r>
+        <w:rPr>
+          <w:rFonts w:hint="default"/>
+          <w:sz w:val="32"/>
+          <w:szCs w:val="32"/>
+          <w:vertAlign w:val="baseline"/>
+          <w:lang w:val="en-US"/>
+        </w:rPr>
+        <w:t>Đặc tả Usecase Xem danh sách và tìm kiếm bài hát Following</w:t>
+      </w:r>
+    </w:p>
+    <w:tbl>
+      <w:tblPr>
+        <w:tblStyle w:val="4"/>
+        <w:tblW w:w="0" w:type="auto"/>
+        <w:tblInd w:w="0" w:type="dxa"/>
+        <w:tblBorders>
+          <w:top w:val="single" w:color="auto" w:sz="4" w:space="0"/>
+          <w:left w:val="single" w:color="auto" w:sz="4" w:space="0"/>
+          <w:bottom w:val="single" w:color="auto" w:sz="4" w:space="0"/>
+          <w:right w:val="single" w:color="auto" w:sz="4" w:space="0"/>
+          <w:insideH w:val="single" w:color="auto" w:sz="4" w:space="0"/>
+          <w:insideV w:val="single" w:color="auto" w:sz="4" w:space="0"/>
+        </w:tblBorders>
+        <w:tblLayout w:type="autofit"/>
+        <w:tblCellMar>
+          <w:top w:w="0" w:type="dxa"/>
+          <w:left w:w="108" w:type="dxa"/>
+          <w:bottom w:w="0" w:type="dxa"/>
+          <w:right w:w="108" w:type="dxa"/>
+        </w:tblCellMar>
+      </w:tblPr>
+      <w:tblGrid>
+        <w:gridCol w:w="8522"/>
+      </w:tblGrid>
+      <w:tr>
+        <w:tblPrEx>
+          <w:tblBorders>
+            <w:top w:val="single" w:color="auto" w:sz="4" w:space="0"/>
+            <w:left w:val="single" w:color="auto" w:sz="4" w:space="0"/>
+            <w:bottom w:val="single" w:color="auto" w:sz="4" w:space="0"/>
+            <w:right w:val="single" w:color="auto" w:sz="4" w:space="0"/>
+            <w:insideH w:val="single" w:color="auto" w:sz="4" w:space="0"/>
+            <w:insideV w:val="single" w:color="auto" w:sz="4" w:space="0"/>
+          </w:tblBorders>
+          <w:tblCellMar>
+            <w:top w:w="0" w:type="dxa"/>
+            <w:left w:w="108" w:type="dxa"/>
+            <w:bottom w:w="0" w:type="dxa"/>
+            <w:right w:w="108" w:type="dxa"/>
+          </w:tblCellMar>
+        </w:tblPrEx>
+        <w:tc>
+          <w:tcPr>
+            <w:tcW w:w="8522" w:type="dxa"/>
+          </w:tcPr>
+          <w:p>
+            <w:pPr>
+              <w:widowControl w:val="0"/>
+              <w:jc w:val="both"/>
+              <w:rPr>
+                <w:rFonts w:hint="default"/>
+                <w:sz w:val="32"/>
+                <w:szCs w:val="32"/>
+                <w:vertAlign w:val="baseline"/>
+                <w:lang w:val="en-US"/>
+              </w:rPr>
+            </w:pPr>
+            <w:r>
+              <w:rPr>
+                <w:rFonts w:hint="default"/>
+                <w:sz w:val="32"/>
+                <w:szCs w:val="32"/>
+                <w:vertAlign w:val="baseline"/>
+                <w:lang w:val="en-US"/>
+              </w:rPr>
+              <w:t>Tóm tắt: Usecase bắt đầu khi người dùng chọn chức năng Xem danh sách và tìm kiếm Follower trong Quản lý thư viện cá nhân. Hệ thống cho phép người dùng xem danh sách và tìm kiếm Follower trong thư viện cá nhân.</w:t>
+            </w:r>
+          </w:p>
+        </w:tc>
+      </w:tr>
+      <w:tr>
+        <w:tblPrEx>
+          <w:tblBorders>
+            <w:top w:val="single" w:color="auto" w:sz="4" w:space="0"/>
+            <w:left w:val="single" w:color="auto" w:sz="4" w:space="0"/>
+            <w:bottom w:val="single" w:color="auto" w:sz="4" w:space="0"/>
+            <w:right w:val="single" w:color="auto" w:sz="4" w:space="0"/>
+            <w:insideH w:val="single" w:color="auto" w:sz="4" w:space="0"/>
+            <w:insideV w:val="single" w:color="auto" w:sz="4" w:space="0"/>
+          </w:tblBorders>
+          <w:tblCellMar>
+            <w:top w:w="0" w:type="dxa"/>
+            <w:left w:w="108" w:type="dxa"/>
+            <w:bottom w:w="0" w:type="dxa"/>
+            <w:right w:w="108" w:type="dxa"/>
+          </w:tblCellMar>
+        </w:tblPrEx>
+        <w:tc>
+          <w:tcPr>
+            <w:tcW w:w="8522" w:type="dxa"/>
+          </w:tcPr>
+          <w:p>
+            <w:pPr>
+              <w:widowControl w:val="0"/>
+              <w:jc w:val="both"/>
+              <w:rPr>
+                <w:rFonts w:hint="default"/>
+                <w:sz w:val="32"/>
+                <w:szCs w:val="32"/>
+                <w:vertAlign w:val="baseline"/>
+                <w:lang w:val="en-US"/>
+              </w:rPr>
+            </w:pPr>
+            <w:r>
+              <w:rPr>
+                <w:rFonts w:hint="default"/>
+                <w:sz w:val="32"/>
+                <w:szCs w:val="32"/>
+                <w:vertAlign w:val="baseline"/>
+                <w:lang w:val="en-US"/>
+              </w:rPr>
+              <w:t xml:space="preserve">Dòng sự kiện chính: </w:t>
+            </w:r>
+          </w:p>
+          <w:p>
+            <w:pPr>
+              <w:widowControl w:val="0"/>
+              <w:numPr>
+                <w:ilvl w:val="0"/>
+                <w:numId w:val="52"/>
+              </w:numPr>
+              <w:jc w:val="both"/>
+              <w:rPr>
+                <w:rFonts w:hint="default"/>
+                <w:sz w:val="32"/>
+                <w:szCs w:val="32"/>
+                <w:vertAlign w:val="baseline"/>
+                <w:lang w:val="en-US"/>
+              </w:rPr>
+            </w:pPr>
+            <w:r>
+              <w:rPr>
+                <w:rFonts w:hint="default"/>
+                <w:sz w:val="32"/>
+                <w:szCs w:val="32"/>
+                <w:vertAlign w:val="baseline"/>
+                <w:lang w:val="en-US"/>
+              </w:rPr>
+              <w:t>Hệ thống hiện giao diện Xem danh sách và tìm kiếm Following thành công.</w:t>
+            </w:r>
+          </w:p>
+          <w:p>
+            <w:pPr>
+              <w:widowControl w:val="0"/>
+              <w:numPr>
+                <w:ilvl w:val="0"/>
+                <w:numId w:val="52"/>
+              </w:numPr>
+              <w:ind w:left="0" w:leftChars="0" w:firstLine="0" w:firstLineChars="0"/>
+              <w:jc w:val="both"/>
+              <w:rPr>
+                <w:rFonts w:hint="default"/>
+                <w:sz w:val="32"/>
+                <w:szCs w:val="32"/>
+                <w:vertAlign w:val="baseline"/>
+                <w:lang w:val="en-US"/>
+              </w:rPr>
+            </w:pPr>
+            <w:r>
+              <w:rPr>
+                <w:rFonts w:hint="default"/>
+                <w:sz w:val="32"/>
+                <w:szCs w:val="32"/>
+                <w:vertAlign w:val="baseline"/>
+                <w:lang w:val="en-US"/>
+              </w:rPr>
+              <w:t>Người dùng xem danh sách và tìm kiếm Following.</w:t>
+            </w:r>
+          </w:p>
+          <w:p>
+            <w:pPr>
+              <w:widowControl w:val="0"/>
+              <w:numPr>
+                <w:ilvl w:val="0"/>
+                <w:numId w:val="52"/>
+              </w:numPr>
+              <w:ind w:left="0" w:leftChars="0" w:firstLine="0" w:firstLineChars="0"/>
+              <w:jc w:val="both"/>
+              <w:rPr>
+                <w:rFonts w:hint="default"/>
+                <w:sz w:val="32"/>
+                <w:szCs w:val="32"/>
+                <w:vertAlign w:val="baseline"/>
+                <w:lang w:val="en-US"/>
+              </w:rPr>
+            </w:pPr>
+            <w:r>
+              <w:rPr>
+                <w:rFonts w:hint="default"/>
+                <w:sz w:val="32"/>
+                <w:szCs w:val="32"/>
+                <w:vertAlign w:val="baseline"/>
+                <w:lang w:val="en-US"/>
+              </w:rPr>
+              <w:t>Người dùng có thể thực hiện chức năng Bỏ theo dõi khi chọn đúng người dùng mình muốn.</w:t>
+            </w:r>
+          </w:p>
+          <w:p>
+            <w:pPr>
+              <w:widowControl w:val="0"/>
+              <w:numPr>
+                <w:ilvl w:val="0"/>
+                <w:numId w:val="52"/>
+              </w:numPr>
+              <w:ind w:left="0" w:leftChars="0" w:firstLine="0" w:firstLineChars="0"/>
+              <w:jc w:val="both"/>
+              <w:rPr>
+                <w:rFonts w:hint="default"/>
+                <w:sz w:val="32"/>
+                <w:szCs w:val="32"/>
+                <w:vertAlign w:val="baseline"/>
+                <w:lang w:val="en-US"/>
+              </w:rPr>
+            </w:pPr>
+            <w:r>
+              <w:rPr>
+                <w:rFonts w:hint="default"/>
+                <w:sz w:val="32"/>
+                <w:szCs w:val="32"/>
+                <w:vertAlign w:val="baseline"/>
+                <w:lang w:val="en-US"/>
+              </w:rPr>
+              <w:t>Hệ thống ghi nhận chức năng người dùng đã thực hiện với Following đó thành công.</w:t>
+            </w:r>
+          </w:p>
+          <w:p>
+            <w:pPr>
+              <w:widowControl w:val="0"/>
+              <w:numPr>
+                <w:ilvl w:val="0"/>
+                <w:numId w:val="52"/>
+              </w:numPr>
+              <w:ind w:left="0" w:leftChars="0" w:firstLine="0" w:firstLineChars="0"/>
+              <w:jc w:val="both"/>
+              <w:rPr>
+                <w:rFonts w:hint="default"/>
+                <w:sz w:val="32"/>
+                <w:szCs w:val="32"/>
+                <w:vertAlign w:val="baseline"/>
+                <w:lang w:val="en-US"/>
+              </w:rPr>
+            </w:pPr>
+            <w:r>
+              <w:rPr>
+                <w:rFonts w:hint="default"/>
+                <w:sz w:val="32"/>
+                <w:szCs w:val="32"/>
+                <w:vertAlign w:val="baseline"/>
+                <w:lang w:val="en-US"/>
+              </w:rPr>
+              <w:t>Hệ thống cập nhật danh sách Following của người dùng thành công.</w:t>
+            </w:r>
+          </w:p>
+        </w:tc>
+      </w:tr>
+      <w:tr>
+        <w:tblPrEx>
+          <w:tblBorders>
+            <w:top w:val="single" w:color="auto" w:sz="4" w:space="0"/>
+            <w:left w:val="single" w:color="auto" w:sz="4" w:space="0"/>
+            <w:bottom w:val="single" w:color="auto" w:sz="4" w:space="0"/>
+            <w:right w:val="single" w:color="auto" w:sz="4" w:space="0"/>
+            <w:insideH w:val="single" w:color="auto" w:sz="4" w:space="0"/>
+            <w:insideV w:val="single" w:color="auto" w:sz="4" w:space="0"/>
+          </w:tblBorders>
+          <w:tblCellMar>
+            <w:top w:w="0" w:type="dxa"/>
+            <w:left w:w="108" w:type="dxa"/>
+            <w:bottom w:w="0" w:type="dxa"/>
+            <w:right w:w="108" w:type="dxa"/>
+          </w:tblCellMar>
+        </w:tblPrEx>
+        <w:tc>
+          <w:tcPr>
+            <w:tcW w:w="8522" w:type="dxa"/>
+          </w:tcPr>
+          <w:p>
+            <w:pPr>
+              <w:widowControl w:val="0"/>
+              <w:jc w:val="both"/>
+              <w:rPr>
+                <w:rFonts w:hint="default"/>
+                <w:sz w:val="32"/>
+                <w:szCs w:val="32"/>
+                <w:vertAlign w:val="baseline"/>
+                <w:lang w:val="en-US"/>
+              </w:rPr>
+            </w:pPr>
+            <w:r>
+              <w:rPr>
+                <w:rFonts w:hint="default"/>
+                <w:sz w:val="32"/>
+                <w:szCs w:val="32"/>
+                <w:vertAlign w:val="baseline"/>
+                <w:lang w:val="en-US"/>
+              </w:rPr>
+              <w:t>Dòng sự kiện phụ:</w:t>
+            </w:r>
+          </w:p>
+          <w:p>
+            <w:pPr>
+              <w:widowControl w:val="0"/>
+              <w:numPr>
+                <w:ilvl w:val="0"/>
+                <w:numId w:val="0"/>
+              </w:numPr>
+              <w:jc w:val="both"/>
+              <w:rPr>
+                <w:rFonts w:hint="default"/>
+                <w:sz w:val="32"/>
+                <w:szCs w:val="32"/>
+                <w:vertAlign w:val="baseline"/>
+                <w:lang w:val="en-US"/>
+              </w:rPr>
+            </w:pPr>
+            <w:r>
+              <w:rPr>
+                <w:rFonts w:hint="default"/>
+                <w:sz w:val="32"/>
+                <w:szCs w:val="32"/>
+                <w:vertAlign w:val="baseline"/>
+                <w:lang w:val="en-US"/>
+              </w:rPr>
+              <w:t>4.1 Nếu hệ thống ghi nhận chức năng người dùng đã thực hiện hoặc cập nhật danh sách Following không thành công thì hệ thống thông báo “Hành động thất bại, vui lòng thử lại” đến người dùng.</w:t>
+            </w:r>
+          </w:p>
+        </w:tc>
+      </w:tr>
+      <w:tr>
+        <w:tblPrEx>
+          <w:tblBorders>
+            <w:top w:val="single" w:color="auto" w:sz="4" w:space="0"/>
+            <w:left w:val="single" w:color="auto" w:sz="4" w:space="0"/>
+            <w:bottom w:val="single" w:color="auto" w:sz="4" w:space="0"/>
+            <w:right w:val="single" w:color="auto" w:sz="4" w:space="0"/>
+            <w:insideH w:val="single" w:color="auto" w:sz="4" w:space="0"/>
+            <w:insideV w:val="single" w:color="auto" w:sz="4" w:space="0"/>
+          </w:tblBorders>
+          <w:tblCellMar>
+            <w:top w:w="0" w:type="dxa"/>
+            <w:left w:w="108" w:type="dxa"/>
+            <w:bottom w:w="0" w:type="dxa"/>
+            <w:right w:w="108" w:type="dxa"/>
+          </w:tblCellMar>
+        </w:tblPrEx>
+        <w:tc>
+          <w:tcPr>
+            <w:tcW w:w="8522" w:type="dxa"/>
+          </w:tcPr>
+          <w:p>
+            <w:pPr>
+              <w:widowControl w:val="0"/>
+              <w:jc w:val="both"/>
+              <w:rPr>
+                <w:rFonts w:hint="default"/>
+                <w:sz w:val="32"/>
+                <w:szCs w:val="32"/>
+                <w:vertAlign w:val="baseline"/>
+                <w:lang w:val="en-US"/>
+              </w:rPr>
+            </w:pPr>
+            <w:r>
+              <w:rPr>
+                <w:rFonts w:hint="default"/>
+                <w:sz w:val="32"/>
+                <w:szCs w:val="32"/>
+                <w:vertAlign w:val="baseline"/>
+                <w:lang w:val="en-US"/>
+              </w:rPr>
+              <w:t xml:space="preserve">Tiền điều kiện: </w:t>
+            </w:r>
+          </w:p>
+          <w:p>
+            <w:pPr>
+              <w:widowControl w:val="0"/>
+              <w:numPr>
+                <w:ilvl w:val="0"/>
+                <w:numId w:val="53"/>
+              </w:numPr>
+              <w:jc w:val="both"/>
+              <w:rPr>
+                <w:rFonts w:hint="default"/>
+                <w:sz w:val="32"/>
+                <w:szCs w:val="32"/>
+                <w:vertAlign w:val="baseline"/>
+                <w:lang w:val="en-US"/>
+              </w:rPr>
+            </w:pPr>
+            <w:r>
+              <w:rPr>
+                <w:rFonts w:hint="default"/>
+                <w:sz w:val="32"/>
+                <w:szCs w:val="32"/>
+                <w:vertAlign w:val="baseline"/>
+                <w:lang w:val="en-US"/>
+              </w:rPr>
+              <w:t>Hệ thống ở chế độ Người dùng.</w:t>
+            </w:r>
+          </w:p>
+        </w:tc>
+      </w:tr>
+      <w:tr>
+        <w:tblPrEx>
+          <w:tblBorders>
+            <w:top w:val="single" w:color="auto" w:sz="4" w:space="0"/>
+            <w:left w:val="single" w:color="auto" w:sz="4" w:space="0"/>
+            <w:bottom w:val="single" w:color="auto" w:sz="4" w:space="0"/>
+            <w:right w:val="single" w:color="auto" w:sz="4" w:space="0"/>
+            <w:insideH w:val="single" w:color="auto" w:sz="4" w:space="0"/>
+            <w:insideV w:val="single" w:color="auto" w:sz="4" w:space="0"/>
+          </w:tblBorders>
+          <w:tblCellMar>
+            <w:top w:w="0" w:type="dxa"/>
+            <w:left w:w="108" w:type="dxa"/>
+            <w:bottom w:w="0" w:type="dxa"/>
+            <w:right w:w="108" w:type="dxa"/>
+          </w:tblCellMar>
+        </w:tblPrEx>
+        <w:tc>
+          <w:tcPr>
+            <w:tcW w:w="8522" w:type="dxa"/>
+          </w:tcPr>
+          <w:p>
+            <w:pPr>
+              <w:widowControl w:val="0"/>
+              <w:jc w:val="both"/>
+              <w:rPr>
+                <w:rFonts w:hint="default"/>
+                <w:sz w:val="32"/>
+                <w:szCs w:val="32"/>
+                <w:vertAlign w:val="baseline"/>
+                <w:lang w:val="en-US"/>
+              </w:rPr>
+            </w:pPr>
+            <w:r>
+              <w:rPr>
+                <w:rFonts w:hint="default"/>
+                <w:sz w:val="32"/>
+                <w:szCs w:val="32"/>
+                <w:vertAlign w:val="baseline"/>
+                <w:lang w:val="en-US"/>
+              </w:rPr>
+              <w:t xml:space="preserve">Hậu điều kiện: </w:t>
+            </w:r>
+          </w:p>
+          <w:p>
+            <w:pPr>
+              <w:widowControl w:val="0"/>
+              <w:numPr>
+                <w:ilvl w:val="0"/>
+                <w:numId w:val="54"/>
+              </w:numPr>
+              <w:jc w:val="both"/>
+              <w:rPr>
+                <w:rFonts w:hint="default"/>
+                <w:sz w:val="32"/>
+                <w:szCs w:val="32"/>
+                <w:vertAlign w:val="baseline"/>
+                <w:lang w:val="en-US"/>
+              </w:rPr>
+            </w:pPr>
+            <w:r>
+              <w:rPr>
+                <w:rFonts w:hint="default"/>
+                <w:sz w:val="32"/>
+                <w:szCs w:val="32"/>
+                <w:vertAlign w:val="baseline"/>
+                <w:lang w:val="en-US"/>
+              </w:rPr>
+              <w:t>Hệ thống sẵn sàng để thực hiện yêu cầu tiếp theo của người dùng với bài hát yêu thích.</w:t>
+            </w:r>
+          </w:p>
+        </w:tc>
+      </w:tr>
+    </w:tbl>
+    <w:p>
+      <w:pPr>
+        <w:rPr>
+          <w:rFonts w:hint="default"/>
+          <w:sz w:val="32"/>
+          <w:szCs w:val="32"/>
+          <w:vertAlign w:val="baseline"/>
+          <w:lang w:val="en-US"/>
+        </w:rPr>
+      </w:pPr>
+    </w:p>
+    <w:p>
+      <w:pPr>
+        <w:rPr>
+          <w:rFonts w:hint="default"/>
+          <w:sz w:val="32"/>
+          <w:szCs w:val="32"/>
+          <w:vertAlign w:val="baseline"/>
+          <w:lang w:val="en-US"/>
+        </w:rPr>
+      </w:pPr>
+      <w:r>
+        <w:rPr>
+          <w:rFonts w:hint="default"/>
+          <w:sz w:val="32"/>
+          <w:szCs w:val="32"/>
+          <w:vertAlign w:val="baseline"/>
+          <w:lang w:val="en-US"/>
+        </w:rPr>
         <w:t>Đặc tả Usecase Quản lý hồ sơ cá nhân</w:t>
       </w:r>
     </w:p>
@@ -10611,9 +12211,8 @@
               <w:widowControl w:val="0"/>
               <w:numPr>
                 <w:ilvl w:val="0"/>
-                <w:numId w:val="46"/>
-              </w:numPr>
-              <w:ind w:leftChars="0"/>
+                <w:numId w:val="55"/>
+              </w:numPr>
               <w:jc w:val="both"/>
               <w:rPr>
                 <w:rFonts w:hint="default"/>
@@ -10639,37 +12238,37 @@
               <w:widowControl w:val="0"/>
               <w:numPr>
                 <w:ilvl w:val="0"/>
-                <w:numId w:val="46"/>
-              </w:numPr>
-              <w:ind w:leftChars="0"/>
-              <w:jc w:val="both"/>
-              <w:rPr>
-                <w:rFonts w:hint="default"/>
-                <w:sz w:val="32"/>
-                <w:szCs w:val="32"/>
-                <w:vertAlign w:val="baseline"/>
-                <w:lang w:val="en-US"/>
-              </w:rPr>
-            </w:pPr>
-            <w:r>
-              <w:rPr>
-                <w:rFonts w:hint="default"/>
-                <w:sz w:val="32"/>
-                <w:szCs w:val="32"/>
-                <w:vertAlign w:val="baseline"/>
-                <w:lang w:val="en-US"/>
-              </w:rPr>
-              <w:t>Người dùng xem hồ sơ cá nhân của mình (thông tin, các bài hát đã đăng lại).</w:t>
-            </w:r>
-          </w:p>
-          <w:p>
-            <w:pPr>
-              <w:widowControl w:val="0"/>
-              <w:numPr>
-                <w:ilvl w:val="0"/>
-                <w:numId w:val="46"/>
-              </w:numPr>
-              <w:ind w:leftChars="0"/>
+                <w:numId w:val="55"/>
+              </w:numPr>
+              <w:ind w:left="0" w:leftChars="0" w:firstLine="0" w:firstLineChars="0"/>
+              <w:jc w:val="both"/>
+              <w:rPr>
+                <w:rFonts w:hint="default"/>
+                <w:sz w:val="32"/>
+                <w:szCs w:val="32"/>
+                <w:vertAlign w:val="baseline"/>
+                <w:lang w:val="en-US"/>
+              </w:rPr>
+            </w:pPr>
+            <w:r>
+              <w:rPr>
+                <w:rFonts w:hint="default"/>
+                <w:sz w:val="32"/>
+                <w:szCs w:val="32"/>
+                <w:vertAlign w:val="baseline"/>
+                <w:lang w:val="en-US"/>
+              </w:rPr>
+              <w:t>Người dùng xem hồ sơ cá nhân của mình (thông tin).</w:t>
+            </w:r>
+          </w:p>
+          <w:p>
+            <w:pPr>
+              <w:widowControl w:val="0"/>
+              <w:numPr>
+                <w:ilvl w:val="0"/>
+                <w:numId w:val="55"/>
+              </w:numPr>
+              <w:ind w:left="0" w:leftChars="0" w:firstLine="0" w:firstLineChars="0"/>
               <w:jc w:val="both"/>
               <w:rPr>
                 <w:rFonts w:hint="default"/>
@@ -10714,7 +12313,7 @@
                 <w:vertAlign w:val="baseline"/>
                 <w:lang w:val="en-US"/>
               </w:rPr>
-              <w:t xml:space="preserve">     3.1/ Sửa hồ sơ cá nhân (chuyển sang Usecase Sửa hồ sơ cá nhân).</w:t>
+              <w:t xml:space="preserve">     3.1/ Sửa hồ sơ cá nhân (Chuyển sang Usecase Sửa hồ sơ cá nhân).</w:t>
             </w:r>
           </w:p>
           <w:p>
@@ -10741,42 +12340,15 @@
                 <w:vertAlign w:val="baseline"/>
                 <w:lang w:val="en-US"/>
               </w:rPr>
-              <w:t xml:space="preserve">     3.2/ Xem danh sách và tìm kiếm bài hát yêu thích (chuyển sang Usecase Xem danh sách và tìm kiếm bài hát yêu thích).</w:t>
-            </w:r>
-          </w:p>
-          <w:p>
-            <w:pPr>
-              <w:widowControl w:val="0"/>
-              <w:numPr>
-                <w:ilvl w:val="0"/>
-                <w:numId w:val="0"/>
-              </w:numPr>
-              <w:jc w:val="both"/>
-              <w:rPr>
-                <w:rFonts w:hint="default"/>
-                <w:sz w:val="32"/>
-                <w:szCs w:val="32"/>
-                <w:vertAlign w:val="baseline"/>
-                <w:lang w:val="en-US"/>
-              </w:rPr>
-            </w:pPr>
-            <w:r>
-              <w:rPr>
-                <w:rFonts w:hint="default"/>
-                <w:sz w:val="32"/>
-                <w:szCs w:val="32"/>
-                <w:vertAlign w:val="baseline"/>
-                <w:lang w:val="en-US"/>
-              </w:rPr>
-              <w:t xml:space="preserve">     3.3/ Người dùng có thể thực hiện các chức năng như thích, bình luận, chia sẻ, huỷ đăng lại đối với các bài hát đã đăng lại. </w:t>
-            </w:r>
-          </w:p>
-          <w:p>
-            <w:pPr>
-              <w:widowControl w:val="0"/>
-              <w:numPr>
-                <w:ilvl w:val="0"/>
-                <w:numId w:val="46"/>
+              <w:t xml:space="preserve">     3.3/ Xem danh sách và tìm kiếm bài hát đã đăng lại (Chuyển sang Usecase Xem danh sách và tìm kiếm bài hát đã đăng lại). </w:t>
+            </w:r>
+          </w:p>
+          <w:p>
+            <w:pPr>
+              <w:widowControl w:val="0"/>
+              <w:numPr>
+                <w:ilvl w:val="0"/>
+                <w:numId w:val="55"/>
               </w:numPr>
               <w:ind w:left="0" w:leftChars="0" w:firstLine="0" w:firstLineChars="0"/>
               <w:jc w:val="both"/>
@@ -10796,7 +12368,7 @@
                 <w:vertAlign w:val="baseline"/>
                 <w:lang w:val="en-US"/>
               </w:rPr>
-              <w:t>Hệ thống sẽ ghi nhận các chức năng người dùng đã thực hiện  và cập nhật số lượt tương tác của bài hát thành công.</w:t>
+              <w:t>Hệ thống sẽ ghi nhận các chức năng người dùng đã thực hiện   thành công.</w:t>
             </w:r>
           </w:p>
         </w:tc>
@@ -10923,7 +12495,7 @@
               <w:widowControl w:val="0"/>
               <w:numPr>
                 <w:ilvl w:val="0"/>
-                <w:numId w:val="47"/>
+                <w:numId w:val="56"/>
               </w:numPr>
               <w:jc w:val="both"/>
               <w:rPr>
@@ -10996,9 +12568,8 @@
               <w:widowControl w:val="0"/>
               <w:numPr>
                 <w:ilvl w:val="0"/>
-                <w:numId w:val="48"/>
-              </w:numPr>
-              <w:ind w:leftChars="0"/>
+                <w:numId w:val="57"/>
+              </w:numPr>
               <w:jc w:val="both"/>
               <w:rPr>
                 <w:rFonts w:hint="default"/>
@@ -11017,513 +12588,6 @@
                 <w:lang w:val="en-US"/>
               </w:rPr>
               <w:t>Hệ thống sẵn sàng thực hiện yêu cầu tiếp theo mà người dùng yêu cầu.</w:t>
-            </w:r>
-          </w:p>
-        </w:tc>
-      </w:tr>
-    </w:tbl>
-    <w:p>
-      <w:pPr>
-        <w:rPr>
-          <w:rFonts w:hint="default"/>
-          <w:sz w:val="32"/>
-          <w:szCs w:val="32"/>
-          <w:vertAlign w:val="baseline"/>
-          <w:lang w:val="en-US"/>
-        </w:rPr>
-      </w:pPr>
-    </w:p>
-    <w:p>
-      <w:pPr>
-        <w:rPr>
-          <w:rFonts w:hint="default"/>
-          <w:sz w:val="32"/>
-          <w:szCs w:val="32"/>
-          <w:vertAlign w:val="baseline"/>
-          <w:lang w:val="en-US"/>
-        </w:rPr>
-      </w:pPr>
-      <w:r>
-        <w:rPr>
-          <w:rFonts w:hint="default"/>
-          <w:sz w:val="32"/>
-          <w:szCs w:val="32"/>
-          <w:vertAlign w:val="baseline"/>
-          <w:lang w:val="en-US"/>
-        </w:rPr>
-        <w:t>Đặc tả Usecase Xem danh sách và tìm kiếm bài hát yêu thích</w:t>
-      </w:r>
-    </w:p>
-    <w:tbl>
-      <w:tblPr>
-        <w:tblStyle w:val="4"/>
-        <w:tblW w:w="0" w:type="auto"/>
-        <w:tblInd w:w="0" w:type="dxa"/>
-        <w:tblBorders>
-          <w:top w:val="single" w:color="auto" w:sz="4" w:space="0"/>
-          <w:left w:val="single" w:color="auto" w:sz="4" w:space="0"/>
-          <w:bottom w:val="single" w:color="auto" w:sz="4" w:space="0"/>
-          <w:right w:val="single" w:color="auto" w:sz="4" w:space="0"/>
-          <w:insideH w:val="single" w:color="auto" w:sz="4" w:space="0"/>
-          <w:insideV w:val="single" w:color="auto" w:sz="4" w:space="0"/>
-        </w:tblBorders>
-        <w:tblLayout w:type="autofit"/>
-        <w:tblCellMar>
-          <w:top w:w="0" w:type="dxa"/>
-          <w:left w:w="108" w:type="dxa"/>
-          <w:bottom w:w="0" w:type="dxa"/>
-          <w:right w:w="108" w:type="dxa"/>
-        </w:tblCellMar>
-      </w:tblPr>
-      <w:tblGrid>
-        <w:gridCol w:w="8522"/>
-      </w:tblGrid>
-      <w:tr>
-        <w:tblPrEx>
-          <w:tblBorders>
-            <w:top w:val="single" w:color="auto" w:sz="4" w:space="0"/>
-            <w:left w:val="single" w:color="auto" w:sz="4" w:space="0"/>
-            <w:bottom w:val="single" w:color="auto" w:sz="4" w:space="0"/>
-            <w:right w:val="single" w:color="auto" w:sz="4" w:space="0"/>
-            <w:insideH w:val="single" w:color="auto" w:sz="4" w:space="0"/>
-            <w:insideV w:val="single" w:color="auto" w:sz="4" w:space="0"/>
-          </w:tblBorders>
-          <w:tblCellMar>
-            <w:top w:w="0" w:type="dxa"/>
-            <w:left w:w="108" w:type="dxa"/>
-            <w:bottom w:w="0" w:type="dxa"/>
-            <w:right w:w="108" w:type="dxa"/>
-          </w:tblCellMar>
-        </w:tblPrEx>
-        <w:tc>
-          <w:tcPr>
-            <w:tcW w:w="8522" w:type="dxa"/>
-          </w:tcPr>
-          <w:p>
-            <w:pPr>
-              <w:widowControl w:val="0"/>
-              <w:jc w:val="both"/>
-              <w:rPr>
-                <w:rFonts w:hint="default"/>
-                <w:sz w:val="32"/>
-                <w:szCs w:val="32"/>
-                <w:vertAlign w:val="baseline"/>
-                <w:lang w:val="en-US"/>
-              </w:rPr>
-            </w:pPr>
-            <w:r>
-              <w:rPr>
-                <w:rFonts w:hint="default"/>
-                <w:sz w:val="32"/>
-                <w:szCs w:val="32"/>
-                <w:vertAlign w:val="baseline"/>
-                <w:lang w:val="en-US"/>
-              </w:rPr>
-              <w:t>Tóm tắt: Usecase bắt đầu khi người dùng chọn chức năng Xem danh sách và tìm kiếm bài hát yêu thích trong Quản lý hồ sơ cá nhân. Hệ thống cho phép người dùng xem danh sách và tìm kiếm bài hát yêu thích trong hồ sơ cá nhân.</w:t>
-            </w:r>
-          </w:p>
-        </w:tc>
-      </w:tr>
-      <w:tr>
-        <w:tblPrEx>
-          <w:tblBorders>
-            <w:top w:val="single" w:color="auto" w:sz="4" w:space="0"/>
-            <w:left w:val="single" w:color="auto" w:sz="4" w:space="0"/>
-            <w:bottom w:val="single" w:color="auto" w:sz="4" w:space="0"/>
-            <w:right w:val="single" w:color="auto" w:sz="4" w:space="0"/>
-            <w:insideH w:val="single" w:color="auto" w:sz="4" w:space="0"/>
-            <w:insideV w:val="single" w:color="auto" w:sz="4" w:space="0"/>
-          </w:tblBorders>
-          <w:tblCellMar>
-            <w:top w:w="0" w:type="dxa"/>
-            <w:left w:w="108" w:type="dxa"/>
-            <w:bottom w:w="0" w:type="dxa"/>
-            <w:right w:w="108" w:type="dxa"/>
-          </w:tblCellMar>
-        </w:tblPrEx>
-        <w:tc>
-          <w:tcPr>
-            <w:tcW w:w="8522" w:type="dxa"/>
-          </w:tcPr>
-          <w:p>
-            <w:pPr>
-              <w:widowControl w:val="0"/>
-              <w:jc w:val="both"/>
-              <w:rPr>
-                <w:rFonts w:hint="default"/>
-                <w:sz w:val="32"/>
-                <w:szCs w:val="32"/>
-                <w:vertAlign w:val="baseline"/>
-                <w:lang w:val="en-US"/>
-              </w:rPr>
-            </w:pPr>
-            <w:r>
-              <w:rPr>
-                <w:rFonts w:hint="default"/>
-                <w:sz w:val="32"/>
-                <w:szCs w:val="32"/>
-                <w:vertAlign w:val="baseline"/>
-                <w:lang w:val="en-US"/>
-              </w:rPr>
-              <w:t xml:space="preserve">Dòng sự kiện chính: </w:t>
-            </w:r>
-          </w:p>
-          <w:p>
-            <w:pPr>
-              <w:widowControl w:val="0"/>
-              <w:numPr>
-                <w:ilvl w:val="0"/>
-                <w:numId w:val="49"/>
-              </w:numPr>
-              <w:jc w:val="both"/>
-              <w:rPr>
-                <w:rFonts w:hint="default"/>
-                <w:sz w:val="32"/>
-                <w:szCs w:val="32"/>
-                <w:vertAlign w:val="baseline"/>
-                <w:lang w:val="en-US"/>
-              </w:rPr>
-            </w:pPr>
-            <w:r>
-              <w:rPr>
-                <w:rFonts w:hint="default"/>
-                <w:sz w:val="32"/>
-                <w:szCs w:val="32"/>
-                <w:vertAlign w:val="baseline"/>
-                <w:lang w:val="en-US"/>
-              </w:rPr>
-              <w:t>Hệ thống hiện giao diện Xem danh sách và tìm kiếm bài hất yêu thích thành công.</w:t>
-            </w:r>
-          </w:p>
-          <w:p>
-            <w:pPr>
-              <w:widowControl w:val="0"/>
-              <w:numPr>
-                <w:ilvl w:val="0"/>
-                <w:numId w:val="49"/>
-              </w:numPr>
-              <w:ind w:left="0" w:leftChars="0" w:firstLine="0" w:firstLineChars="0"/>
-              <w:jc w:val="both"/>
-              <w:rPr>
-                <w:rFonts w:hint="default"/>
-                <w:sz w:val="32"/>
-                <w:szCs w:val="32"/>
-                <w:vertAlign w:val="baseline"/>
-                <w:lang w:val="en-US"/>
-              </w:rPr>
-            </w:pPr>
-            <w:r>
-              <w:rPr>
-                <w:rFonts w:hint="default"/>
-                <w:sz w:val="32"/>
-                <w:szCs w:val="32"/>
-                <w:vertAlign w:val="baseline"/>
-                <w:lang w:val="en-US"/>
-              </w:rPr>
-              <w:t>Người dùng xem danh sách và tìm kiếm bài hát yêu thích.</w:t>
-            </w:r>
-          </w:p>
-          <w:p>
-            <w:pPr>
-              <w:widowControl w:val="0"/>
-              <w:numPr>
-                <w:ilvl w:val="0"/>
-                <w:numId w:val="49"/>
-              </w:numPr>
-              <w:ind w:left="0" w:leftChars="0" w:firstLine="0" w:firstLineChars="0"/>
-              <w:jc w:val="both"/>
-              <w:rPr>
-                <w:rFonts w:hint="default"/>
-                <w:sz w:val="32"/>
-                <w:szCs w:val="32"/>
-                <w:vertAlign w:val="baseline"/>
-                <w:lang w:val="en-US"/>
-              </w:rPr>
-            </w:pPr>
-            <w:r>
-              <w:rPr>
-                <w:rFonts w:hint="default"/>
-                <w:sz w:val="32"/>
-                <w:szCs w:val="32"/>
-                <w:vertAlign w:val="baseline"/>
-                <w:lang w:val="en-US"/>
-              </w:rPr>
-              <w:t>Người dùng có thể thực hiện các chức năng Nghe nhạc, huỷ Thích, Bình luận, Chia sẻ, Đăng lại khi chọn đúng bài hát mình muốn.</w:t>
-            </w:r>
-          </w:p>
-          <w:p>
-            <w:pPr>
-              <w:widowControl w:val="0"/>
-              <w:numPr>
-                <w:ilvl w:val="0"/>
-                <w:numId w:val="49"/>
-              </w:numPr>
-              <w:ind w:left="0" w:leftChars="0" w:firstLine="0" w:firstLineChars="0"/>
-              <w:jc w:val="both"/>
-              <w:rPr>
-                <w:rFonts w:hint="default"/>
-                <w:sz w:val="32"/>
-                <w:szCs w:val="32"/>
-                <w:vertAlign w:val="baseline"/>
-                <w:lang w:val="en-US"/>
-              </w:rPr>
-            </w:pPr>
-            <w:r>
-              <w:rPr>
-                <w:rFonts w:hint="default"/>
-                <w:sz w:val="32"/>
-                <w:szCs w:val="32"/>
-                <w:vertAlign w:val="baseline"/>
-                <w:lang w:val="en-US"/>
-              </w:rPr>
-              <w:t>Hệ thống ghi nhận các chức năng người dùng đã thực hiện  với bài hát yêu thích đó thành công.</w:t>
-            </w:r>
-          </w:p>
-          <w:p>
-            <w:pPr>
-              <w:widowControl w:val="0"/>
-              <w:numPr>
-                <w:ilvl w:val="0"/>
-                <w:numId w:val="49"/>
-              </w:numPr>
-              <w:ind w:left="0" w:leftChars="0" w:firstLine="0" w:firstLineChars="0"/>
-              <w:jc w:val="both"/>
-              <w:rPr>
-                <w:rFonts w:hint="default"/>
-                <w:sz w:val="32"/>
-                <w:szCs w:val="32"/>
-                <w:vertAlign w:val="baseline"/>
-                <w:lang w:val="en-US"/>
-              </w:rPr>
-            </w:pPr>
-            <w:r>
-              <w:rPr>
-                <w:rFonts w:hint="default"/>
-                <w:sz w:val="32"/>
-                <w:szCs w:val="32"/>
-                <w:vertAlign w:val="baseline"/>
-                <w:lang w:val="en-US"/>
-              </w:rPr>
-              <w:t>Hệ thống cập nhật danh sách bài hát yêu thích của người dùng thành công.</w:t>
-            </w:r>
-          </w:p>
-        </w:tc>
-      </w:tr>
-      <w:tr>
-        <w:tblPrEx>
-          <w:tblBorders>
-            <w:top w:val="single" w:color="auto" w:sz="4" w:space="0"/>
-            <w:left w:val="single" w:color="auto" w:sz="4" w:space="0"/>
-            <w:bottom w:val="single" w:color="auto" w:sz="4" w:space="0"/>
-            <w:right w:val="single" w:color="auto" w:sz="4" w:space="0"/>
-            <w:insideH w:val="single" w:color="auto" w:sz="4" w:space="0"/>
-            <w:insideV w:val="single" w:color="auto" w:sz="4" w:space="0"/>
-          </w:tblBorders>
-          <w:tblCellMar>
-            <w:top w:w="0" w:type="dxa"/>
-            <w:left w:w="108" w:type="dxa"/>
-            <w:bottom w:w="0" w:type="dxa"/>
-            <w:right w:w="108" w:type="dxa"/>
-          </w:tblCellMar>
-        </w:tblPrEx>
-        <w:tc>
-          <w:tcPr>
-            <w:tcW w:w="8522" w:type="dxa"/>
-          </w:tcPr>
-          <w:p>
-            <w:pPr>
-              <w:widowControl w:val="0"/>
-              <w:jc w:val="both"/>
-              <w:rPr>
-                <w:rFonts w:hint="default"/>
-                <w:sz w:val="32"/>
-                <w:szCs w:val="32"/>
-                <w:vertAlign w:val="baseline"/>
-                <w:lang w:val="en-US"/>
-              </w:rPr>
-            </w:pPr>
-            <w:r>
-              <w:rPr>
-                <w:rFonts w:hint="default"/>
-                <w:sz w:val="32"/>
-                <w:szCs w:val="32"/>
-                <w:vertAlign w:val="baseline"/>
-                <w:lang w:val="en-US"/>
-              </w:rPr>
-              <w:t>Dòng sự kiện phụ:</w:t>
-            </w:r>
-          </w:p>
-          <w:p>
-            <w:pPr>
-              <w:widowControl w:val="0"/>
-              <w:numPr>
-                <w:ilvl w:val="0"/>
-                <w:numId w:val="0"/>
-              </w:numPr>
-              <w:jc w:val="both"/>
-              <w:rPr>
-                <w:rFonts w:hint="default"/>
-                <w:sz w:val="32"/>
-                <w:szCs w:val="32"/>
-                <w:vertAlign w:val="baseline"/>
-                <w:lang w:val="en-US"/>
-              </w:rPr>
-            </w:pPr>
-            <w:r>
-              <w:rPr>
-                <w:rFonts w:hint="default"/>
-                <w:sz w:val="32"/>
-                <w:szCs w:val="32"/>
-                <w:vertAlign w:val="baseline"/>
-                <w:lang w:val="en-US"/>
-              </w:rPr>
-              <w:t>4.1 Nếu hệ thống ghi nhận các chức năng người dùng đã thực hiện hoặc cập nhật danh sách bài hát yêu thích không thành công thì hệ thống thông báo “Hành động thất bại, vui lòng thử lại” đến người dùng.</w:t>
-            </w:r>
-          </w:p>
-        </w:tc>
-      </w:tr>
-      <w:tr>
-        <w:tblPrEx>
-          <w:tblBorders>
-            <w:top w:val="single" w:color="auto" w:sz="4" w:space="0"/>
-            <w:left w:val="single" w:color="auto" w:sz="4" w:space="0"/>
-            <w:bottom w:val="single" w:color="auto" w:sz="4" w:space="0"/>
-            <w:right w:val="single" w:color="auto" w:sz="4" w:space="0"/>
-            <w:insideH w:val="single" w:color="auto" w:sz="4" w:space="0"/>
-            <w:insideV w:val="single" w:color="auto" w:sz="4" w:space="0"/>
-          </w:tblBorders>
-          <w:tblCellMar>
-            <w:top w:w="0" w:type="dxa"/>
-            <w:left w:w="108" w:type="dxa"/>
-            <w:bottom w:w="0" w:type="dxa"/>
-            <w:right w:w="108" w:type="dxa"/>
-          </w:tblCellMar>
-        </w:tblPrEx>
-        <w:tc>
-          <w:tcPr>
-            <w:tcW w:w="8522" w:type="dxa"/>
-          </w:tcPr>
-          <w:p>
-            <w:pPr>
-              <w:widowControl w:val="0"/>
-              <w:jc w:val="both"/>
-              <w:rPr>
-                <w:rFonts w:hint="default"/>
-                <w:sz w:val="32"/>
-                <w:szCs w:val="32"/>
-                <w:vertAlign w:val="baseline"/>
-                <w:lang w:val="en-US"/>
-              </w:rPr>
-            </w:pPr>
-            <w:r>
-              <w:rPr>
-                <w:rFonts w:hint="default"/>
-                <w:sz w:val="32"/>
-                <w:szCs w:val="32"/>
-                <w:vertAlign w:val="baseline"/>
-                <w:lang w:val="en-US"/>
-              </w:rPr>
-              <w:t xml:space="preserve">Tiền điều kiện: </w:t>
-            </w:r>
-          </w:p>
-          <w:p>
-            <w:pPr>
-              <w:widowControl w:val="0"/>
-              <w:numPr>
-                <w:ilvl w:val="0"/>
-                <w:numId w:val="50"/>
-              </w:numPr>
-              <w:jc w:val="both"/>
-              <w:rPr>
-                <w:rFonts w:hint="default"/>
-                <w:sz w:val="32"/>
-                <w:szCs w:val="32"/>
-                <w:vertAlign w:val="baseline"/>
-                <w:lang w:val="en-US"/>
-              </w:rPr>
-            </w:pPr>
-            <w:r>
-              <w:rPr>
-                <w:rFonts w:hint="default"/>
-                <w:sz w:val="32"/>
-                <w:szCs w:val="32"/>
-                <w:vertAlign w:val="baseline"/>
-                <w:lang w:val="en-US"/>
-              </w:rPr>
-              <w:t>Người dùng đăng nhập thành công vào hệ thống.</w:t>
-            </w:r>
-          </w:p>
-        </w:tc>
-      </w:tr>
-      <w:tr>
-        <w:tblPrEx>
-          <w:tblBorders>
-            <w:top w:val="single" w:color="auto" w:sz="4" w:space="0"/>
-            <w:left w:val="single" w:color="auto" w:sz="4" w:space="0"/>
-            <w:bottom w:val="single" w:color="auto" w:sz="4" w:space="0"/>
-            <w:right w:val="single" w:color="auto" w:sz="4" w:space="0"/>
-            <w:insideH w:val="single" w:color="auto" w:sz="4" w:space="0"/>
-            <w:insideV w:val="single" w:color="auto" w:sz="4" w:space="0"/>
-          </w:tblBorders>
-          <w:tblCellMar>
-            <w:top w:w="0" w:type="dxa"/>
-            <w:left w:w="108" w:type="dxa"/>
-            <w:bottom w:w="0" w:type="dxa"/>
-            <w:right w:w="108" w:type="dxa"/>
-          </w:tblCellMar>
-        </w:tblPrEx>
-        <w:tc>
-          <w:tcPr>
-            <w:tcW w:w="8522" w:type="dxa"/>
-          </w:tcPr>
-          <w:p>
-            <w:pPr>
-              <w:widowControl w:val="0"/>
-              <w:jc w:val="both"/>
-              <w:rPr>
-                <w:rFonts w:hint="default"/>
-                <w:sz w:val="32"/>
-                <w:szCs w:val="32"/>
-                <w:vertAlign w:val="baseline"/>
-                <w:lang w:val="en-US"/>
-              </w:rPr>
-            </w:pPr>
-            <w:r>
-              <w:rPr>
-                <w:rFonts w:hint="default"/>
-                <w:sz w:val="32"/>
-                <w:szCs w:val="32"/>
-                <w:vertAlign w:val="baseline"/>
-                <w:lang w:val="en-US"/>
-              </w:rPr>
-              <w:t xml:space="preserve">Hậu điều kiện: </w:t>
-            </w:r>
-          </w:p>
-          <w:p>
-            <w:pPr>
-              <w:widowControl w:val="0"/>
-              <w:numPr>
-                <w:ilvl w:val="0"/>
-                <w:numId w:val="51"/>
-              </w:numPr>
-              <w:jc w:val="both"/>
-              <w:rPr>
-                <w:rFonts w:hint="default"/>
-                <w:sz w:val="32"/>
-                <w:szCs w:val="32"/>
-                <w:vertAlign w:val="baseline"/>
-                <w:lang w:val="en-US"/>
-              </w:rPr>
-            </w:pPr>
-            <w:r>
-              <w:rPr>
-                <w:rFonts w:hint="default"/>
-                <w:sz w:val="32"/>
-                <w:szCs w:val="32"/>
-                <w:vertAlign w:val="baseline"/>
-                <w:lang w:val="en-US"/>
-              </w:rPr>
-              <w:t>Hệ thống sẵn sàng để thực hiện yêu cầu tiếp theo của người dùng với bài hát yêu thích.</w:t>
             </w:r>
           </w:p>
         </w:tc>
@@ -11677,7 +12741,7 @@
               <w:widowControl w:val="0"/>
               <w:numPr>
                 <w:ilvl w:val="0"/>
-                <w:numId w:val="52"/>
+                <w:numId w:val="58"/>
               </w:numPr>
               <w:jc w:val="both"/>
               <w:rPr>
@@ -11704,7 +12768,7 @@
               <w:widowControl w:val="0"/>
               <w:numPr>
                 <w:ilvl w:val="0"/>
-                <w:numId w:val="52"/>
+                <w:numId w:val="58"/>
               </w:numPr>
               <w:ind w:left="0" w:leftChars="0" w:firstLine="0" w:firstLineChars="0"/>
               <w:jc w:val="both"/>
@@ -11732,7 +12796,7 @@
               <w:widowControl w:val="0"/>
               <w:numPr>
                 <w:ilvl w:val="0"/>
-                <w:numId w:val="52"/>
+                <w:numId w:val="58"/>
               </w:numPr>
               <w:ind w:left="0" w:leftChars="0" w:firstLine="0" w:firstLineChars="0"/>
               <w:jc w:val="both"/>
@@ -11760,7 +12824,7 @@
               <w:widowControl w:val="0"/>
               <w:numPr>
                 <w:ilvl w:val="0"/>
-                <w:numId w:val="52"/>
+                <w:numId w:val="58"/>
               </w:numPr>
               <w:ind w:left="0" w:leftChars="0" w:firstLine="0" w:firstLineChars="0"/>
               <w:jc w:val="both"/>
@@ -11788,7 +12852,7 @@
               <w:widowControl w:val="0"/>
               <w:numPr>
                 <w:ilvl w:val="0"/>
-                <w:numId w:val="52"/>
+                <w:numId w:val="58"/>
               </w:numPr>
               <w:ind w:left="0" w:leftChars="0" w:firstLine="0" w:firstLineChars="0"/>
               <w:jc w:val="both"/>
@@ -11935,26 +12999,26 @@
               <w:widowControl w:val="0"/>
               <w:numPr>
                 <w:ilvl w:val="0"/>
-                <w:numId w:val="53"/>
-              </w:numPr>
-              <w:jc w:val="both"/>
-              <w:rPr>
-                <w:rFonts w:hint="default"/>
-                <w:sz w:val="32"/>
-                <w:szCs w:val="32"/>
-                <w:vertAlign w:val="baseline"/>
-                <w:lang w:val="en-US"/>
-              </w:rPr>
-            </w:pPr>
-            <w:r>
-              <w:rPr>
-                <w:rFonts w:hint="default"/>
-                <w:sz w:val="32"/>
-                <w:szCs w:val="32"/>
-                <w:vertAlign w:val="baseline"/>
-                <w:lang w:val="en-US"/>
-              </w:rPr>
-              <w:t>Người dùng đăng nhập thành công vào hệ thống.</w:t>
+                <w:numId w:val="59"/>
+              </w:numPr>
+              <w:jc w:val="both"/>
+              <w:rPr>
+                <w:rFonts w:hint="default"/>
+                <w:sz w:val="32"/>
+                <w:szCs w:val="32"/>
+                <w:vertAlign w:val="baseline"/>
+                <w:lang w:val="en-US"/>
+              </w:rPr>
+            </w:pPr>
+            <w:r>
+              <w:rPr>
+                <w:rFonts w:hint="default"/>
+                <w:sz w:val="32"/>
+                <w:szCs w:val="32"/>
+                <w:vertAlign w:val="baseline"/>
+                <w:lang w:val="en-US"/>
+              </w:rPr>
+              <w:t>Hệ thống ở chế độ Người dùng.</w:t>
             </w:r>
           </w:p>
         </w:tc>
@@ -12008,7 +13072,7 @@
               <w:widowControl w:val="0"/>
               <w:numPr>
                 <w:ilvl w:val="0"/>
-                <w:numId w:val="54"/>
+                <w:numId w:val="60"/>
               </w:numPr>
               <w:jc w:val="both"/>
               <w:rPr>
@@ -12096,6 +13160,12 @@
             <w:insideH w:val="single" w:color="auto" w:sz="4" w:space="0"/>
             <w:insideV w:val="single" w:color="auto" w:sz="4" w:space="0"/>
           </w:tblBorders>
+          <w:tblCellMar>
+            <w:top w:w="0" w:type="dxa"/>
+            <w:left w:w="108" w:type="dxa"/>
+            <w:bottom w:w="0" w:type="dxa"/>
+            <w:right w:w="108" w:type="dxa"/>
+          </w:tblCellMar>
         </w:tblPrEx>
         <w:tc>
           <w:tcPr>
@@ -12175,7 +13245,7 @@
               <w:widowControl w:val="0"/>
               <w:numPr>
                 <w:ilvl w:val="0"/>
-                <w:numId w:val="55"/>
+                <w:numId w:val="61"/>
               </w:numPr>
               <w:jc w:val="both"/>
               <w:rPr>
@@ -12202,7 +13272,7 @@
               <w:widowControl w:val="0"/>
               <w:numPr>
                 <w:ilvl w:val="0"/>
-                <w:numId w:val="55"/>
+                <w:numId w:val="61"/>
               </w:numPr>
               <w:ind w:left="0" w:leftChars="0" w:firstLine="0" w:firstLineChars="0"/>
               <w:jc w:val="both"/>
@@ -12230,7 +13300,7 @@
               <w:widowControl w:val="0"/>
               <w:numPr>
                 <w:ilvl w:val="0"/>
-                <w:numId w:val="55"/>
+                <w:numId w:val="61"/>
               </w:numPr>
               <w:ind w:left="0" w:leftChars="0" w:firstLine="0" w:firstLineChars="0"/>
               <w:jc w:val="both"/>
@@ -12258,7 +13328,7 @@
               <w:widowControl w:val="0"/>
               <w:numPr>
                 <w:ilvl w:val="0"/>
-                <w:numId w:val="55"/>
+                <w:numId w:val="61"/>
               </w:numPr>
               <w:ind w:left="0" w:leftChars="0" w:firstLine="0" w:firstLineChars="0"/>
               <w:jc w:val="both"/>
@@ -12405,7 +13475,7 @@
               <w:widowControl w:val="0"/>
               <w:numPr>
                 <w:ilvl w:val="0"/>
-                <w:numId w:val="56"/>
+                <w:numId w:val="62"/>
               </w:numPr>
               <w:jc w:val="both"/>
               <w:rPr>
@@ -12478,7 +13548,7 @@
               <w:widowControl w:val="0"/>
               <w:numPr>
                 <w:ilvl w:val="0"/>
-                <w:numId w:val="57"/>
+                <w:numId w:val="63"/>
               </w:numPr>
               <w:jc w:val="both"/>
               <w:rPr>
@@ -12651,7 +13721,7 @@
               <w:widowControl w:val="0"/>
               <w:numPr>
                 <w:ilvl w:val="0"/>
-                <w:numId w:val="58"/>
+                <w:numId w:val="64"/>
               </w:numPr>
               <w:jc w:val="both"/>
               <w:rPr>
@@ -12678,7 +13748,7 @@
               <w:widowControl w:val="0"/>
               <w:numPr>
                 <w:ilvl w:val="0"/>
-                <w:numId w:val="58"/>
+                <w:numId w:val="64"/>
               </w:numPr>
               <w:ind w:left="0" w:leftChars="0" w:firstLine="0" w:firstLineChars="0"/>
               <w:jc w:val="both"/>
@@ -12706,7 +13776,7 @@
               <w:widowControl w:val="0"/>
               <w:numPr>
                 <w:ilvl w:val="0"/>
-                <w:numId w:val="58"/>
+                <w:numId w:val="64"/>
               </w:numPr>
               <w:ind w:left="0" w:leftChars="0" w:firstLine="0" w:firstLineChars="0"/>
               <w:jc w:val="both"/>
@@ -12734,7 +13804,7 @@
               <w:widowControl w:val="0"/>
               <w:numPr>
                 <w:ilvl w:val="0"/>
-                <w:numId w:val="58"/>
+                <w:numId w:val="64"/>
               </w:numPr>
               <w:ind w:left="0" w:leftChars="0" w:firstLine="0" w:firstLineChars="0"/>
               <w:jc w:val="both"/>
@@ -12762,7 +13832,7 @@
               <w:widowControl w:val="0"/>
               <w:numPr>
                 <w:ilvl w:val="0"/>
-                <w:numId w:val="58"/>
+                <w:numId w:val="64"/>
               </w:numPr>
               <w:ind w:left="0" w:leftChars="0" w:firstLine="0" w:firstLineChars="0"/>
               <w:jc w:val="both"/>
@@ -12790,7 +13860,7 @@
               <w:widowControl w:val="0"/>
               <w:numPr>
                 <w:ilvl w:val="0"/>
-                <w:numId w:val="58"/>
+                <w:numId w:val="64"/>
               </w:numPr>
               <w:ind w:left="0" w:leftChars="0" w:firstLine="0" w:firstLineChars="0"/>
               <w:jc w:val="both"/>
@@ -12937,7 +14007,7 @@
               <w:widowControl w:val="0"/>
               <w:numPr>
                 <w:ilvl w:val="0"/>
-                <w:numId w:val="59"/>
+                <w:numId w:val="65"/>
               </w:numPr>
               <w:jc w:val="both"/>
               <w:rPr>
@@ -13010,7 +14080,7 @@
               <w:widowControl w:val="0"/>
               <w:numPr>
                 <w:ilvl w:val="0"/>
-                <w:numId w:val="60"/>
+                <w:numId w:val="66"/>
               </w:numPr>
               <w:jc w:val="both"/>
               <w:rPr>
@@ -13098,6 +14168,12 @@
             <w:insideH w:val="single" w:color="auto" w:sz="4" w:space="0"/>
             <w:insideV w:val="single" w:color="auto" w:sz="4" w:space="0"/>
           </w:tblBorders>
+          <w:tblCellMar>
+            <w:top w:w="0" w:type="dxa"/>
+            <w:left w:w="108" w:type="dxa"/>
+            <w:bottom w:w="0" w:type="dxa"/>
+            <w:right w:w="108" w:type="dxa"/>
+          </w:tblCellMar>
         </w:tblPrEx>
         <w:tc>
           <w:tcPr>
@@ -13177,7 +14253,7 @@
               <w:widowControl w:val="0"/>
               <w:numPr>
                 <w:ilvl w:val="0"/>
-                <w:numId w:val="61"/>
+                <w:numId w:val="67"/>
               </w:numPr>
               <w:jc w:val="both"/>
               <w:rPr>
@@ -13204,7 +14280,7 @@
               <w:widowControl w:val="0"/>
               <w:numPr>
                 <w:ilvl w:val="0"/>
-                <w:numId w:val="61"/>
+                <w:numId w:val="67"/>
               </w:numPr>
               <w:ind w:left="0" w:leftChars="0" w:firstLine="0" w:firstLineChars="0"/>
               <w:jc w:val="both"/>
@@ -13232,7 +14308,7 @@
               <w:widowControl w:val="0"/>
               <w:numPr>
                 <w:ilvl w:val="0"/>
-                <w:numId w:val="61"/>
+                <w:numId w:val="67"/>
               </w:numPr>
               <w:ind w:left="0" w:leftChars="0" w:firstLine="0" w:firstLineChars="0"/>
               <w:jc w:val="both"/>
@@ -13344,7 +14420,7 @@
               <w:widowControl w:val="0"/>
               <w:numPr>
                 <w:ilvl w:val="0"/>
-                <w:numId w:val="61"/>
+                <w:numId w:val="67"/>
               </w:numPr>
               <w:ind w:left="0" w:leftChars="0" w:firstLine="0" w:firstLineChars="0"/>
               <w:jc w:val="both"/>
@@ -13491,7 +14567,7 @@
               <w:widowControl w:val="0"/>
               <w:numPr>
                 <w:ilvl w:val="0"/>
-                <w:numId w:val="62"/>
+                <w:numId w:val="68"/>
               </w:numPr>
               <w:jc w:val="both"/>
               <w:rPr>
@@ -13518,7 +14594,7 @@
               <w:widowControl w:val="0"/>
               <w:numPr>
                 <w:ilvl w:val="0"/>
-                <w:numId w:val="62"/>
+                <w:numId w:val="68"/>
               </w:numPr>
               <w:jc w:val="both"/>
               <w:rPr>
@@ -13591,7 +14667,7 @@
               <w:widowControl w:val="0"/>
               <w:numPr>
                 <w:ilvl w:val="0"/>
-                <w:numId w:val="63"/>
+                <w:numId w:val="69"/>
               </w:numPr>
               <w:ind w:leftChars="0"/>
               <w:jc w:val="both"/>
@@ -13765,7 +14841,7 @@
               <w:widowControl w:val="0"/>
               <w:numPr>
                 <w:ilvl w:val="0"/>
-                <w:numId w:val="64"/>
+                <w:numId w:val="70"/>
               </w:numPr>
               <w:jc w:val="both"/>
               <w:rPr>
@@ -13792,7 +14868,7 @@
               <w:widowControl w:val="0"/>
               <w:numPr>
                 <w:ilvl w:val="0"/>
-                <w:numId w:val="64"/>
+                <w:numId w:val="70"/>
               </w:numPr>
               <w:ind w:left="0" w:leftChars="0" w:firstLine="0" w:firstLineChars="0"/>
               <w:jc w:val="both"/>
@@ -13820,7 +14896,7 @@
               <w:widowControl w:val="0"/>
               <w:numPr>
                 <w:ilvl w:val="0"/>
-                <w:numId w:val="64"/>
+                <w:numId w:val="70"/>
               </w:numPr>
               <w:ind w:left="0" w:leftChars="0" w:firstLine="0" w:firstLineChars="0"/>
               <w:jc w:val="both"/>
@@ -13848,7 +14924,7 @@
               <w:widowControl w:val="0"/>
               <w:numPr>
                 <w:ilvl w:val="0"/>
-                <w:numId w:val="64"/>
+                <w:numId w:val="70"/>
               </w:numPr>
               <w:ind w:left="0" w:leftChars="0" w:firstLine="0" w:firstLineChars="0"/>
               <w:jc w:val="both"/>
@@ -13995,7 +15071,7 @@
               <w:widowControl w:val="0"/>
               <w:numPr>
                 <w:ilvl w:val="0"/>
-                <w:numId w:val="65"/>
+                <w:numId w:val="71"/>
               </w:numPr>
               <w:jc w:val="both"/>
               <w:rPr>
@@ -14068,7 +15144,7 @@
               <w:widowControl w:val="0"/>
               <w:numPr>
                 <w:ilvl w:val="0"/>
-                <w:numId w:val="66"/>
+                <w:numId w:val="72"/>
               </w:numPr>
               <w:ind w:leftChars="0"/>
               <w:jc w:val="both"/>
@@ -14242,7 +15318,7 @@
               <w:widowControl w:val="0"/>
               <w:numPr>
                 <w:ilvl w:val="0"/>
-                <w:numId w:val="67"/>
+                <w:numId w:val="73"/>
               </w:numPr>
               <w:jc w:val="both"/>
               <w:rPr>
@@ -14269,7 +15345,7 @@
               <w:widowControl w:val="0"/>
               <w:numPr>
                 <w:ilvl w:val="0"/>
-                <w:numId w:val="67"/>
+                <w:numId w:val="73"/>
               </w:numPr>
               <w:ind w:left="0" w:leftChars="0" w:firstLine="0" w:firstLineChars="0"/>
               <w:jc w:val="both"/>
@@ -14381,7 +15457,7 @@
               <w:widowControl w:val="0"/>
               <w:numPr>
                 <w:ilvl w:val="0"/>
-                <w:numId w:val="67"/>
+                <w:numId w:val="73"/>
               </w:numPr>
               <w:ind w:left="0" w:leftChars="0" w:firstLine="0" w:firstLineChars="0"/>
               <w:jc w:val="both"/>
@@ -14528,7 +15604,7 @@
               <w:widowControl w:val="0"/>
               <w:numPr>
                 <w:ilvl w:val="0"/>
-                <w:numId w:val="68"/>
+                <w:numId w:val="74"/>
               </w:numPr>
               <w:jc w:val="both"/>
               <w:rPr>
@@ -14555,7 +15631,7 @@
               <w:widowControl w:val="0"/>
               <w:numPr>
                 <w:ilvl w:val="0"/>
-                <w:numId w:val="68"/>
+                <w:numId w:val="74"/>
               </w:numPr>
               <w:ind w:left="0" w:leftChars="0" w:firstLine="0" w:firstLineChars="0"/>
               <w:jc w:val="both"/>
@@ -14629,7 +15705,7 @@
               <w:widowControl w:val="0"/>
               <w:numPr>
                 <w:ilvl w:val="0"/>
-                <w:numId w:val="69"/>
+                <w:numId w:val="75"/>
               </w:numPr>
               <w:ind w:leftChars="0"/>
               <w:jc w:val="both"/>
@@ -14803,7 +15879,7 @@
               <w:widowControl w:val="0"/>
               <w:numPr>
                 <w:ilvl w:val="0"/>
-                <w:numId w:val="70"/>
+                <w:numId w:val="76"/>
               </w:numPr>
               <w:jc w:val="both"/>
               <w:rPr>
@@ -14830,7 +15906,7 @@
               <w:widowControl w:val="0"/>
               <w:numPr>
                 <w:ilvl w:val="0"/>
-                <w:numId w:val="70"/>
+                <w:numId w:val="76"/>
               </w:numPr>
               <w:ind w:left="0" w:leftChars="0" w:firstLine="0" w:firstLineChars="0"/>
               <w:jc w:val="both"/>
@@ -14858,7 +15934,7 @@
               <w:widowControl w:val="0"/>
               <w:numPr>
                 <w:ilvl w:val="0"/>
-                <w:numId w:val="70"/>
+                <w:numId w:val="76"/>
               </w:numPr>
               <w:ind w:left="0" w:leftChars="0" w:firstLine="0" w:firstLineChars="0"/>
               <w:jc w:val="both"/>
@@ -14886,7 +15962,7 @@
               <w:widowControl w:val="0"/>
               <w:numPr>
                 <w:ilvl w:val="0"/>
-                <w:numId w:val="70"/>
+                <w:numId w:val="76"/>
               </w:numPr>
               <w:ind w:left="0" w:leftChars="0" w:firstLine="0" w:firstLineChars="0"/>
               <w:jc w:val="both"/>
@@ -15033,7 +16109,7 @@
               <w:widowControl w:val="0"/>
               <w:numPr>
                 <w:ilvl w:val="0"/>
-                <w:numId w:val="71"/>
+                <w:numId w:val="77"/>
               </w:numPr>
               <w:jc w:val="both"/>
               <w:rPr>
@@ -15106,7 +16182,7 @@
               <w:widowControl w:val="0"/>
               <w:numPr>
                 <w:ilvl w:val="0"/>
-                <w:numId w:val="72"/>
+                <w:numId w:val="78"/>
               </w:numPr>
               <w:jc w:val="both"/>
               <w:rPr>
@@ -15279,7 +16355,7 @@
               <w:widowControl w:val="0"/>
               <w:numPr>
                 <w:ilvl w:val="0"/>
-                <w:numId w:val="73"/>
+                <w:numId w:val="79"/>
               </w:numPr>
               <w:jc w:val="both"/>
               <w:rPr>
@@ -15306,7 +16382,7 @@
               <w:widowControl w:val="0"/>
               <w:numPr>
                 <w:ilvl w:val="0"/>
-                <w:numId w:val="73"/>
+                <w:numId w:val="79"/>
               </w:numPr>
               <w:ind w:left="0" w:leftChars="0" w:firstLine="0" w:firstLineChars="0"/>
               <w:jc w:val="both"/>
@@ -15334,7 +16410,7 @@
               <w:widowControl w:val="0"/>
               <w:numPr>
                 <w:ilvl w:val="0"/>
-                <w:numId w:val="73"/>
+                <w:numId w:val="79"/>
               </w:numPr>
               <w:ind w:left="0" w:leftChars="0" w:firstLine="0" w:firstLineChars="0"/>
               <w:jc w:val="both"/>
@@ -15362,7 +16438,7 @@
               <w:widowControl w:val="0"/>
               <w:numPr>
                 <w:ilvl w:val="0"/>
-                <w:numId w:val="73"/>
+                <w:numId w:val="79"/>
               </w:numPr>
               <w:ind w:left="0" w:leftChars="0" w:firstLine="0" w:firstLineChars="0"/>
               <w:jc w:val="both"/>
@@ -15436,7 +16512,7 @@
               <w:widowControl w:val="0"/>
               <w:numPr>
                 <w:ilvl w:val="0"/>
-                <w:numId w:val="74"/>
+                <w:numId w:val="80"/>
               </w:numPr>
               <w:jc w:val="both"/>
               <w:rPr>
@@ -15509,7 +16585,7 @@
               <w:widowControl w:val="0"/>
               <w:numPr>
                 <w:ilvl w:val="0"/>
-                <w:numId w:val="75"/>
+                <w:numId w:val="81"/>
               </w:numPr>
               <w:jc w:val="both"/>
               <w:rPr>
@@ -15582,7 +16658,7 @@
               <w:widowControl w:val="0"/>
               <w:numPr>
                 <w:ilvl w:val="0"/>
-                <w:numId w:val="76"/>
+                <w:numId w:val="82"/>
               </w:numPr>
               <w:ind w:leftChars="0"/>
               <w:jc w:val="both"/>
@@ -16409,6 +17485,18 @@
     </w:lvl>
   </w:abstractNum>
   <w:abstractNum w:abstractNumId="24">
+    <w:nsid w:val="C6E4017A"/>
+    <w:multiLevelType w:val="singleLevel"/>
+    <w:tmpl w:val="C6E4017A"/>
+    <w:lvl w:ilvl="0" w:tentative="0">
+      <w:start w:val="1"/>
+      <w:numFmt w:val="decimal"/>
+      <w:suff w:val="space"/>
+      <w:lvlText w:val="%1."/>
+      <w:lvlJc w:val="left"/>
+    </w:lvl>
+  </w:abstractNum>
+  <w:abstractNum w:abstractNumId="25">
     <w:nsid w:val="C878FD22"/>
     <w:multiLevelType w:val="singleLevel"/>
     <w:tmpl w:val="C878FD22"/>
@@ -16420,7 +17508,7 @@
       <w:lvlJc w:val="left"/>
     </w:lvl>
   </w:abstractNum>
-  <w:abstractNum w:abstractNumId="25">
+  <w:abstractNum w:abstractNumId="26">
     <w:nsid w:val="CAD6F3E4"/>
     <w:multiLevelType w:val="singleLevel"/>
     <w:tmpl w:val="CAD6F3E4"/>
@@ -16432,7 +17520,7 @@
       <w:lvlJc w:val="left"/>
     </w:lvl>
   </w:abstractNum>
-  <w:abstractNum w:abstractNumId="26">
+  <w:abstractNum w:abstractNumId="27">
     <w:nsid w:val="CBEC66A5"/>
     <w:multiLevelType w:val="singleLevel"/>
     <w:tmpl w:val="CBEC66A5"/>
@@ -16444,7 +17532,7 @@
       <w:lvlJc w:val="left"/>
     </w:lvl>
   </w:abstractNum>
-  <w:abstractNum w:abstractNumId="27">
+  <w:abstractNum w:abstractNumId="28">
     <w:nsid w:val="CE762D04"/>
     <w:multiLevelType w:val="multilevel"/>
     <w:tmpl w:val="CE762D04"/>
@@ -16560,7 +17648,7 @@
       </w:rPr>
     </w:lvl>
   </w:abstractNum>
-  <w:abstractNum w:abstractNumId="28">
+  <w:abstractNum w:abstractNumId="29">
     <w:nsid w:val="CFB556DD"/>
     <w:multiLevelType w:val="multilevel"/>
     <w:tmpl w:val="CFB556DD"/>
@@ -16676,7 +17764,7 @@
       </w:rPr>
     </w:lvl>
   </w:abstractNum>
-  <w:abstractNum w:abstractNumId="29">
+  <w:abstractNum w:abstractNumId="30">
     <w:nsid w:val="D4A79DA9"/>
     <w:multiLevelType w:val="multilevel"/>
     <w:tmpl w:val="D4A79DA9"/>
@@ -16816,7 +17904,19 @@
       </w:rPr>
     </w:lvl>
   </w:abstractNum>
-  <w:abstractNum w:abstractNumId="30">
+  <w:abstractNum w:abstractNumId="31">
+    <w:nsid w:val="D5A94411"/>
+    <w:multiLevelType w:val="singleLevel"/>
+    <w:tmpl w:val="D5A94411"/>
+    <w:lvl w:ilvl="0" w:tentative="0">
+      <w:start w:val="1"/>
+      <w:numFmt w:val="decimal"/>
+      <w:suff w:val="space"/>
+      <w:lvlText w:val="%1."/>
+      <w:lvlJc w:val="left"/>
+    </w:lvl>
+  </w:abstractNum>
+  <w:abstractNum w:abstractNumId="32">
     <w:nsid w:val="D84C24CF"/>
     <w:multiLevelType w:val="singleLevel"/>
     <w:tmpl w:val="D84C24CF"/>
@@ -16828,7 +17928,7 @@
       <w:lvlJc w:val="left"/>
     </w:lvl>
   </w:abstractNum>
-  <w:abstractNum w:abstractNumId="31">
+  <w:abstractNum w:abstractNumId="33">
     <w:nsid w:val="E109609F"/>
     <w:multiLevelType w:val="singleLevel"/>
     <w:tmpl w:val="E109609F"/>
@@ -16840,7 +17940,7 @@
       <w:lvlJc w:val="left"/>
     </w:lvl>
   </w:abstractNum>
-  <w:abstractNum w:abstractNumId="32">
+  <w:abstractNum w:abstractNumId="34">
     <w:nsid w:val="E17C0C88"/>
     <w:multiLevelType w:val="singleLevel"/>
     <w:tmpl w:val="E17C0C88"/>
@@ -16852,7 +17952,7 @@
       <w:lvlJc w:val="left"/>
     </w:lvl>
   </w:abstractNum>
-  <w:abstractNum w:abstractNumId="33">
+  <w:abstractNum w:abstractNumId="35">
     <w:nsid w:val="E89A39E4"/>
     <w:multiLevelType w:val="singleLevel"/>
     <w:tmpl w:val="E89A39E4"/>
@@ -16864,7 +17964,7 @@
       <w:lvlJc w:val="left"/>
     </w:lvl>
   </w:abstractNum>
-  <w:abstractNum w:abstractNumId="34">
+  <w:abstractNum w:abstractNumId="36">
     <w:nsid w:val="E8BBC779"/>
     <w:multiLevelType w:val="singleLevel"/>
     <w:tmpl w:val="E8BBC779"/>
@@ -16876,7 +17976,7 @@
       <w:lvlJc w:val="left"/>
     </w:lvl>
   </w:abstractNum>
-  <w:abstractNum w:abstractNumId="35">
+  <w:abstractNum w:abstractNumId="37">
     <w:nsid w:val="E9767898"/>
     <w:multiLevelType w:val="singleLevel"/>
     <w:tmpl w:val="E9767898"/>
@@ -16888,7 +17988,7 @@
       <w:lvlJc w:val="left"/>
     </w:lvl>
   </w:abstractNum>
-  <w:abstractNum w:abstractNumId="36">
+  <w:abstractNum w:abstractNumId="38">
     <w:nsid w:val="EA14CDEE"/>
     <w:multiLevelType w:val="singleLevel"/>
     <w:tmpl w:val="EA14CDEE"/>
@@ -16900,7 +18000,7 @@
       <w:lvlJc w:val="left"/>
     </w:lvl>
   </w:abstractNum>
-  <w:abstractNum w:abstractNumId="37">
+  <w:abstractNum w:abstractNumId="39">
     <w:nsid w:val="FC29D630"/>
     <w:multiLevelType w:val="singleLevel"/>
     <w:tmpl w:val="FC29D630"/>
@@ -16912,7 +18012,7 @@
       <w:lvlJc w:val="left"/>
     </w:lvl>
   </w:abstractNum>
-  <w:abstractNum w:abstractNumId="38">
+  <w:abstractNum w:abstractNumId="40">
     <w:nsid w:val="FE24A8A4"/>
     <w:multiLevelType w:val="singleLevel"/>
     <w:tmpl w:val="FE24A8A4"/>
@@ -16924,7 +18024,7 @@
       <w:lvlJc w:val="left"/>
     </w:lvl>
   </w:abstractNum>
-  <w:abstractNum w:abstractNumId="39">
+  <w:abstractNum w:abstractNumId="41">
     <w:nsid w:val="FE343E4B"/>
     <w:multiLevelType w:val="singleLevel"/>
     <w:tmpl w:val="FE343E4B"/>
@@ -16936,7 +18036,7 @@
       <w:lvlJc w:val="left"/>
     </w:lvl>
   </w:abstractNum>
-  <w:abstractNum w:abstractNumId="40">
+  <w:abstractNum w:abstractNumId="42">
     <w:nsid w:val="09005923"/>
     <w:multiLevelType w:val="singleLevel"/>
     <w:tmpl w:val="09005923"/>
@@ -16948,7 +18048,7 @@
       <w:lvlJc w:val="left"/>
     </w:lvl>
   </w:abstractNum>
-  <w:abstractNum w:abstractNumId="41">
+  <w:abstractNum w:abstractNumId="43">
     <w:nsid w:val="0A7C2C92"/>
     <w:multiLevelType w:val="singleLevel"/>
     <w:tmpl w:val="0A7C2C92"/>
@@ -16960,7 +18060,7 @@
       <w:lvlJc w:val="left"/>
     </w:lvl>
   </w:abstractNum>
-  <w:abstractNum w:abstractNumId="42">
+  <w:abstractNum w:abstractNumId="44">
     <w:nsid w:val="0CD92811"/>
     <w:multiLevelType w:val="singleLevel"/>
     <w:tmpl w:val="0CD92811"/>
@@ -16972,7 +18072,19 @@
       <w:lvlJc w:val="left"/>
     </w:lvl>
   </w:abstractNum>
-  <w:abstractNum w:abstractNumId="43">
+  <w:abstractNum w:abstractNumId="45">
+    <w:nsid w:val="11CC49F7"/>
+    <w:multiLevelType w:val="singleLevel"/>
+    <w:tmpl w:val="11CC49F7"/>
+    <w:lvl w:ilvl="0" w:tentative="0">
+      <w:start w:val="1"/>
+      <w:numFmt w:val="decimal"/>
+      <w:suff w:val="space"/>
+      <w:lvlText w:val="%1."/>
+      <w:lvlJc w:val="left"/>
+    </w:lvl>
+  </w:abstractNum>
+  <w:abstractNum w:abstractNumId="46">
     <w:nsid w:val="12E3D0E2"/>
     <w:multiLevelType w:val="singleLevel"/>
     <w:tmpl w:val="12E3D0E2"/>
@@ -16984,7 +18096,7 @@
       <w:lvlJc w:val="left"/>
     </w:lvl>
   </w:abstractNum>
-  <w:abstractNum w:abstractNumId="44">
+  <w:abstractNum w:abstractNumId="47">
     <w:nsid w:val="18501BFC"/>
     <w:multiLevelType w:val="singleLevel"/>
     <w:tmpl w:val="18501BFC"/>
@@ -16996,7 +18108,7 @@
       <w:lvlJc w:val="left"/>
     </w:lvl>
   </w:abstractNum>
-  <w:abstractNum w:abstractNumId="45">
+  <w:abstractNum w:abstractNumId="48">
     <w:nsid w:val="211769BA"/>
     <w:multiLevelType w:val="singleLevel"/>
     <w:tmpl w:val="211769BA"/>
@@ -17008,7 +18120,19 @@
       <w:lvlJc w:val="left"/>
     </w:lvl>
   </w:abstractNum>
-  <w:abstractNum w:abstractNumId="46">
+  <w:abstractNum w:abstractNumId="49">
+    <w:nsid w:val="245C44B8"/>
+    <w:multiLevelType w:val="singleLevel"/>
+    <w:tmpl w:val="245C44B8"/>
+    <w:lvl w:ilvl="0" w:tentative="0">
+      <w:start w:val="1"/>
+      <w:numFmt w:val="decimal"/>
+      <w:suff w:val="space"/>
+      <w:lvlText w:val="%1."/>
+      <w:lvlJc w:val="left"/>
+    </w:lvl>
+  </w:abstractNum>
+  <w:abstractNum w:abstractNumId="50">
     <w:nsid w:val="27D2B737"/>
     <w:multiLevelType w:val="singleLevel"/>
     <w:tmpl w:val="27D2B737"/>
@@ -17020,7 +18144,7 @@
       <w:lvlJc w:val="left"/>
     </w:lvl>
   </w:abstractNum>
-  <w:abstractNum w:abstractNumId="47">
+  <w:abstractNum w:abstractNumId="51">
     <w:nsid w:val="2DE852F7"/>
     <w:multiLevelType w:val="singleLevel"/>
     <w:tmpl w:val="2DE852F7"/>
@@ -17032,7 +18156,7 @@
       <w:lvlJc w:val="left"/>
     </w:lvl>
   </w:abstractNum>
-  <w:abstractNum w:abstractNumId="48">
+  <w:abstractNum w:abstractNumId="52">
     <w:nsid w:val="30AD9F26"/>
     <w:multiLevelType w:val="singleLevel"/>
     <w:tmpl w:val="30AD9F26"/>
@@ -17044,7 +18168,19 @@
       <w:lvlJc w:val="left"/>
     </w:lvl>
   </w:abstractNum>
-  <w:abstractNum w:abstractNumId="49">
+  <w:abstractNum w:abstractNumId="53">
+    <w:nsid w:val="313FAB6F"/>
+    <w:multiLevelType w:val="singleLevel"/>
+    <w:tmpl w:val="313FAB6F"/>
+    <w:lvl w:ilvl="0" w:tentative="0">
+      <w:start w:val="1"/>
+      <w:numFmt w:val="decimal"/>
+      <w:suff w:val="space"/>
+      <w:lvlText w:val="%1."/>
+      <w:lvlJc w:val="left"/>
+    </w:lvl>
+  </w:abstractNum>
+  <w:abstractNum w:abstractNumId="54">
     <w:nsid w:val="34247F98"/>
     <w:multiLevelType w:val="singleLevel"/>
     <w:tmpl w:val="34247F98"/>
@@ -17056,7 +18192,7 @@
       <w:lvlJc w:val="left"/>
     </w:lvl>
   </w:abstractNum>
-  <w:abstractNum w:abstractNumId="50">
+  <w:abstractNum w:abstractNumId="55">
     <w:nsid w:val="34ACC566"/>
     <w:multiLevelType w:val="singleLevel"/>
     <w:tmpl w:val="34ACC566"/>
@@ -17068,7 +18204,7 @@
       <w:lvlJc w:val="left"/>
     </w:lvl>
   </w:abstractNum>
-  <w:abstractNum w:abstractNumId="51">
+  <w:abstractNum w:abstractNumId="56">
     <w:nsid w:val="36D9EC17"/>
     <w:multiLevelType w:val="singleLevel"/>
     <w:tmpl w:val="36D9EC17"/>
@@ -17080,7 +18216,7 @@
       <w:lvlJc w:val="left"/>
     </w:lvl>
   </w:abstractNum>
-  <w:abstractNum w:abstractNumId="52">
+  <w:abstractNum w:abstractNumId="57">
     <w:nsid w:val="3915D7F5"/>
     <w:multiLevelType w:val="multilevel"/>
     <w:tmpl w:val="3915D7F5"/>
@@ -17196,7 +18332,7 @@
       </w:rPr>
     </w:lvl>
   </w:abstractNum>
-  <w:abstractNum w:abstractNumId="53">
+  <w:abstractNum w:abstractNumId="58">
     <w:nsid w:val="3B3BFDBA"/>
     <w:multiLevelType w:val="singleLevel"/>
     <w:tmpl w:val="3B3BFDBA"/>
@@ -17208,7 +18344,7 @@
       <w:lvlJc w:val="left"/>
     </w:lvl>
   </w:abstractNum>
-  <w:abstractNum w:abstractNumId="54">
+  <w:abstractNum w:abstractNumId="59">
     <w:nsid w:val="3CBCE474"/>
     <w:multiLevelType w:val="singleLevel"/>
     <w:tmpl w:val="3CBCE474"/>
@@ -17220,7 +18356,7 @@
       <w:lvlJc w:val="left"/>
     </w:lvl>
   </w:abstractNum>
-  <w:abstractNum w:abstractNumId="55">
+  <w:abstractNum w:abstractNumId="60">
     <w:nsid w:val="3CC99ABE"/>
     <w:multiLevelType w:val="singleLevel"/>
     <w:tmpl w:val="3CC99ABE"/>
@@ -17232,7 +18368,7 @@
       <w:lvlJc w:val="left"/>
     </w:lvl>
   </w:abstractNum>
-  <w:abstractNum w:abstractNumId="56">
+  <w:abstractNum w:abstractNumId="61">
     <w:nsid w:val="3D4BEBA8"/>
     <w:multiLevelType w:val="singleLevel"/>
     <w:tmpl w:val="3D4BEBA8"/>
@@ -17244,7 +18380,7 @@
       <w:lvlJc w:val="left"/>
     </w:lvl>
   </w:abstractNum>
-  <w:abstractNum w:abstractNumId="57">
+  <w:abstractNum w:abstractNumId="62">
     <w:nsid w:val="43814378"/>
     <w:multiLevelType w:val="singleLevel"/>
     <w:tmpl w:val="43814378"/>
@@ -17256,7 +18392,7 @@
       <w:lvlJc w:val="left"/>
     </w:lvl>
   </w:abstractNum>
-  <w:abstractNum w:abstractNumId="58">
+  <w:abstractNum w:abstractNumId="63">
     <w:nsid w:val="46D2EDB9"/>
     <w:multiLevelType w:val="multilevel"/>
     <w:tmpl w:val="46D2EDB9"/>
@@ -17396,7 +18532,7 @@
       </w:rPr>
     </w:lvl>
   </w:abstractNum>
-  <w:abstractNum w:abstractNumId="59">
+  <w:abstractNum w:abstractNumId="64">
     <w:nsid w:val="4F2E84C6"/>
     <w:multiLevelType w:val="singleLevel"/>
     <w:tmpl w:val="4F2E84C6"/>
@@ -17408,7 +18544,7 @@
       <w:lvlJc w:val="left"/>
     </w:lvl>
   </w:abstractNum>
-  <w:abstractNum w:abstractNumId="60">
+  <w:abstractNum w:abstractNumId="65">
     <w:nsid w:val="52BBEC1D"/>
     <w:multiLevelType w:val="singleLevel"/>
     <w:tmpl w:val="52BBEC1D"/>
@@ -17420,7 +18556,7 @@
       <w:lvlJc w:val="left"/>
     </w:lvl>
   </w:abstractNum>
-  <w:abstractNum w:abstractNumId="61">
+  <w:abstractNum w:abstractNumId="66">
     <w:nsid w:val="537CC0EA"/>
     <w:multiLevelType w:val="singleLevel"/>
     <w:tmpl w:val="537CC0EA"/>
@@ -17432,7 +18568,7 @@
       <w:lvlJc w:val="left"/>
     </w:lvl>
   </w:abstractNum>
-  <w:abstractNum w:abstractNumId="62">
+  <w:abstractNum w:abstractNumId="67">
     <w:nsid w:val="5823DDE9"/>
     <w:multiLevelType w:val="singleLevel"/>
     <w:tmpl w:val="5823DDE9"/>
@@ -17444,7 +18580,7 @@
       <w:lvlJc w:val="left"/>
     </w:lvl>
   </w:abstractNum>
-  <w:abstractNum w:abstractNumId="63">
+  <w:abstractNum w:abstractNumId="68">
     <w:nsid w:val="5973A4FA"/>
     <w:multiLevelType w:val="singleLevel"/>
     <w:tmpl w:val="5973A4FA"/>
@@ -17456,7 +18592,7 @@
       <w:lvlJc w:val="left"/>
     </w:lvl>
   </w:abstractNum>
-  <w:abstractNum w:abstractNumId="64">
+  <w:abstractNum w:abstractNumId="69">
     <w:nsid w:val="6024D89E"/>
     <w:multiLevelType w:val="singleLevel"/>
     <w:tmpl w:val="6024D89E"/>
@@ -17468,7 +18604,7 @@
       <w:lvlJc w:val="left"/>
     </w:lvl>
   </w:abstractNum>
-  <w:abstractNum w:abstractNumId="65">
+  <w:abstractNum w:abstractNumId="70">
     <w:nsid w:val="628F328F"/>
     <w:multiLevelType w:val="singleLevel"/>
     <w:tmpl w:val="628F328F"/>
@@ -17480,7 +18616,7 @@
       <w:lvlJc w:val="left"/>
     </w:lvl>
   </w:abstractNum>
-  <w:abstractNum w:abstractNumId="66">
+  <w:abstractNum w:abstractNumId="71">
     <w:nsid w:val="62FD1C74"/>
     <w:multiLevelType w:val="singleLevel"/>
     <w:tmpl w:val="62FD1C74"/>
@@ -17492,7 +18628,7 @@
       <w:lvlJc w:val="left"/>
     </w:lvl>
   </w:abstractNum>
-  <w:abstractNum w:abstractNumId="67">
+  <w:abstractNum w:abstractNumId="72">
     <w:nsid w:val="658783AF"/>
     <w:multiLevelType w:val="singleLevel"/>
     <w:tmpl w:val="658783AF"/>
@@ -17504,7 +18640,7 @@
       <w:lvlJc w:val="left"/>
     </w:lvl>
   </w:abstractNum>
-  <w:abstractNum w:abstractNumId="68">
+  <w:abstractNum w:abstractNumId="73">
     <w:nsid w:val="65A2A8DF"/>
     <w:multiLevelType w:val="singleLevel"/>
     <w:tmpl w:val="65A2A8DF"/>
@@ -17516,7 +18652,7 @@
       <w:lvlJc w:val="left"/>
     </w:lvl>
   </w:abstractNum>
-  <w:abstractNum w:abstractNumId="69">
+  <w:abstractNum w:abstractNumId="74">
     <w:nsid w:val="67A03EFF"/>
     <w:multiLevelType w:val="singleLevel"/>
     <w:tmpl w:val="67A03EFF"/>
@@ -17528,7 +18664,7 @@
       <w:lvlJc w:val="left"/>
     </w:lvl>
   </w:abstractNum>
-  <w:abstractNum w:abstractNumId="70">
+  <w:abstractNum w:abstractNumId="75">
     <w:nsid w:val="69C1C339"/>
     <w:multiLevelType w:val="singleLevel"/>
     <w:tmpl w:val="69C1C339"/>
@@ -17540,7 +18676,7 @@
       <w:lvlJc w:val="left"/>
     </w:lvl>
   </w:abstractNum>
-  <w:abstractNum w:abstractNumId="71">
+  <w:abstractNum w:abstractNumId="76">
     <w:nsid w:val="6AF88BFE"/>
     <w:multiLevelType w:val="singleLevel"/>
     <w:tmpl w:val="6AF88BFE"/>
@@ -17552,7 +18688,19 @@
       <w:lvlJc w:val="left"/>
     </w:lvl>
   </w:abstractNum>
-  <w:abstractNum w:abstractNumId="72">
+  <w:abstractNum w:abstractNumId="77">
+    <w:nsid w:val="6DA991F1"/>
+    <w:multiLevelType w:val="singleLevel"/>
+    <w:tmpl w:val="6DA991F1"/>
+    <w:lvl w:ilvl="0" w:tentative="0">
+      <w:start w:val="1"/>
+      <w:numFmt w:val="decimal"/>
+      <w:suff w:val="space"/>
+      <w:lvlText w:val="%1."/>
+      <w:lvlJc w:val="left"/>
+    </w:lvl>
+  </w:abstractNum>
+  <w:abstractNum w:abstractNumId="78">
     <w:nsid w:val="779FF94F"/>
     <w:multiLevelType w:val="singleLevel"/>
     <w:tmpl w:val="779FF94F"/>
@@ -17564,7 +18712,7 @@
       <w:lvlJc w:val="left"/>
     </w:lvl>
   </w:abstractNum>
-  <w:abstractNum w:abstractNumId="73">
+  <w:abstractNum w:abstractNumId="79">
     <w:nsid w:val="78DA9A54"/>
     <w:multiLevelType w:val="singleLevel"/>
     <w:tmpl w:val="78DA9A54"/>
@@ -17576,7 +18724,7 @@
       <w:lvlJc w:val="left"/>
     </w:lvl>
   </w:abstractNum>
-  <w:abstractNum w:abstractNumId="74">
+  <w:abstractNum w:abstractNumId="80">
     <w:nsid w:val="7CFEE648"/>
     <w:multiLevelType w:val="singleLevel"/>
     <w:tmpl w:val="7CFEE648"/>
@@ -17588,7 +18736,7 @@
       <w:lvlJc w:val="left"/>
     </w:lvl>
   </w:abstractNum>
-  <w:abstractNum w:abstractNumId="75">
+  <w:abstractNum w:abstractNumId="81">
     <w:nsid w:val="7EE9AE89"/>
     <w:multiLevelType w:val="singleLevel"/>
     <w:tmpl w:val="7EE9AE89"/>
@@ -17610,16 +18758,16 @@
     <w:abstractNumId w:val="18"/>
   </w:num>
   <w:num w:numId="4">
-    <w:abstractNumId w:val="29"/>
+    <w:abstractNumId w:val="30"/>
   </w:num>
   <w:num w:numId="5">
+    <w:abstractNumId w:val="63"/>
+  </w:num>
+  <w:num w:numId="6">
     <w:abstractNumId w:val="58"/>
   </w:num>
-  <w:num w:numId="6">
-    <w:abstractNumId w:val="53"/>
-  </w:num>
   <w:num w:numId="7">
-    <w:abstractNumId w:val="33"/>
+    <w:abstractNumId w:val="35"/>
   </w:num>
   <w:num w:numId="8">
     <w:abstractNumId w:val="16"/>
@@ -17628,103 +18776,103 @@
     <w:abstractNumId w:val="17"/>
   </w:num>
   <w:num w:numId="10">
-    <w:abstractNumId w:val="44"/>
+    <w:abstractNumId w:val="47"/>
   </w:num>
   <w:num w:numId="11">
-    <w:abstractNumId w:val="66"/>
+    <w:abstractNumId w:val="71"/>
   </w:num>
   <w:num w:numId="12">
-    <w:abstractNumId w:val="35"/>
+    <w:abstractNumId w:val="37"/>
   </w:num>
   <w:num w:numId="13">
     <w:abstractNumId w:val="0"/>
   </w:num>
   <w:num w:numId="14">
-    <w:abstractNumId w:val="65"/>
+    <w:abstractNumId w:val="70"/>
   </w:num>
   <w:num w:numId="15">
     <w:abstractNumId w:val="15"/>
   </w:num>
   <w:num w:numId="16">
-    <w:abstractNumId w:val="50"/>
+    <w:abstractNumId w:val="55"/>
   </w:num>
   <w:num w:numId="17">
-    <w:abstractNumId w:val="40"/>
+    <w:abstractNumId w:val="42"/>
   </w:num>
   <w:num w:numId="18">
-    <w:abstractNumId w:val="27"/>
+    <w:abstractNumId w:val="28"/>
   </w:num>
   <w:num w:numId="19">
-    <w:abstractNumId w:val="28"/>
+    <w:abstractNumId w:val="29"/>
   </w:num>
   <w:num w:numId="20">
-    <w:abstractNumId w:val="71"/>
+    <w:abstractNumId w:val="76"/>
   </w:num>
   <w:num w:numId="21">
-    <w:abstractNumId w:val="42"/>
+    <w:abstractNumId w:val="44"/>
   </w:num>
   <w:num w:numId="22">
-    <w:abstractNumId w:val="75"/>
+    <w:abstractNumId w:val="81"/>
   </w:num>
   <w:num w:numId="23">
-    <w:abstractNumId w:val="74"/>
+    <w:abstractNumId w:val="80"/>
   </w:num>
   <w:num w:numId="24">
-    <w:abstractNumId w:val="61"/>
+    <w:abstractNumId w:val="66"/>
   </w:num>
   <w:num w:numId="25">
     <w:abstractNumId w:val="6"/>
   </w:num>
   <w:num w:numId="26">
-    <w:abstractNumId w:val="36"/>
+    <w:abstractNumId w:val="38"/>
   </w:num>
   <w:num w:numId="27">
-    <w:abstractNumId w:val="32"/>
+    <w:abstractNumId w:val="34"/>
   </w:num>
   <w:num w:numId="28">
-    <w:abstractNumId w:val="67"/>
+    <w:abstractNumId w:val="72"/>
   </w:num>
   <w:num w:numId="29">
-    <w:abstractNumId w:val="49"/>
+    <w:abstractNumId w:val="54"/>
   </w:num>
   <w:num w:numId="30">
     <w:abstractNumId w:val="19"/>
   </w:num>
   <w:num w:numId="31">
-    <w:abstractNumId w:val="62"/>
+    <w:abstractNumId w:val="67"/>
   </w:num>
   <w:num w:numId="32">
-    <w:abstractNumId w:val="24"/>
+    <w:abstractNumId w:val="25"/>
   </w:num>
   <w:num w:numId="33">
     <w:abstractNumId w:val="10"/>
   </w:num>
   <w:num w:numId="34">
-    <w:abstractNumId w:val="55"/>
+    <w:abstractNumId w:val="60"/>
   </w:num>
   <w:num w:numId="35">
-    <w:abstractNumId w:val="46"/>
+    <w:abstractNumId w:val="50"/>
   </w:num>
   <w:num w:numId="36">
-    <w:abstractNumId w:val="72"/>
+    <w:abstractNumId w:val="78"/>
   </w:num>
   <w:num w:numId="37">
-    <w:abstractNumId w:val="26"/>
+    <w:abstractNumId w:val="27"/>
   </w:num>
   <w:num w:numId="38">
-    <w:abstractNumId w:val="38"/>
+    <w:abstractNumId w:val="40"/>
   </w:num>
   <w:num w:numId="39">
-    <w:abstractNumId w:val="52"/>
+    <w:abstractNumId w:val="57"/>
   </w:num>
   <w:num w:numId="40">
-    <w:abstractNumId w:val="31"/>
+    <w:abstractNumId w:val="33"/>
   </w:num>
   <w:num w:numId="41">
-    <w:abstractNumId w:val="34"/>
+    <w:abstractNumId w:val="36"/>
   </w:num>
   <w:num w:numId="42">
-    <w:abstractNumId w:val="64"/>
+    <w:abstractNumId w:val="69"/>
   </w:num>
   <w:num w:numId="43">
     <w:abstractNumId w:val="8"/>
@@ -17733,100 +18881,118 @@
     <w:abstractNumId w:val="2"/>
   </w:num>
   <w:num w:numId="45">
-    <w:abstractNumId w:val="47"/>
+    <w:abstractNumId w:val="51"/>
   </w:num>
   <w:num w:numId="46">
     <w:abstractNumId w:val="4"/>
   </w:num>
   <w:num w:numId="47">
-    <w:abstractNumId w:val="70"/>
+    <w:abstractNumId w:val="75"/>
   </w:num>
   <w:num w:numId="48">
-    <w:abstractNumId w:val="48"/>
+    <w:abstractNumId w:val="52"/>
   </w:num>
   <w:num w:numId="49">
     <w:abstractNumId w:val="3"/>
   </w:num>
   <w:num w:numId="50">
-    <w:abstractNumId w:val="60"/>
+    <w:abstractNumId w:val="65"/>
   </w:num>
   <w:num w:numId="51">
+    <w:abstractNumId w:val="41"/>
+  </w:num>
+  <w:num w:numId="52">
+    <w:abstractNumId w:val="77"/>
+  </w:num>
+  <w:num w:numId="53">
+    <w:abstractNumId w:val="53"/>
+  </w:num>
+  <w:num w:numId="54">
+    <w:abstractNumId w:val="45"/>
+  </w:num>
+  <w:num w:numId="55">
+    <w:abstractNumId w:val="24"/>
+  </w:num>
+  <w:num w:numId="56">
+    <w:abstractNumId w:val="49"/>
+  </w:num>
+  <w:num w:numId="57">
+    <w:abstractNumId w:val="31"/>
+  </w:num>
+  <w:num w:numId="58">
+    <w:abstractNumId w:val="73"/>
+  </w:num>
+  <w:num w:numId="59">
+    <w:abstractNumId w:val="59"/>
+  </w:num>
+  <w:num w:numId="60">
+    <w:abstractNumId w:val="62"/>
+  </w:num>
+  <w:num w:numId="61">
+    <w:abstractNumId w:val="26"/>
+  </w:num>
+  <w:num w:numId="62">
+    <w:abstractNumId w:val="23"/>
+  </w:num>
+  <w:num w:numId="63">
+    <w:abstractNumId w:val="1"/>
+  </w:num>
+  <w:num w:numId="64">
+    <w:abstractNumId w:val="32"/>
+  </w:num>
+  <w:num w:numId="65">
+    <w:abstractNumId w:val="12"/>
+  </w:num>
+  <w:num w:numId="66">
+    <w:abstractNumId w:val="9"/>
+  </w:num>
+  <w:num w:numId="67">
+    <w:abstractNumId w:val="48"/>
+  </w:num>
+  <w:num w:numId="68">
+    <w:abstractNumId w:val="46"/>
+  </w:num>
+  <w:num w:numId="69">
+    <w:abstractNumId w:val="22"/>
+  </w:num>
+  <w:num w:numId="70">
+    <w:abstractNumId w:val="20"/>
+  </w:num>
+  <w:num w:numId="71">
+    <w:abstractNumId w:val="56"/>
+  </w:num>
+  <w:num w:numId="72">
+    <w:abstractNumId w:val="5"/>
+  </w:num>
+  <w:num w:numId="73">
+    <w:abstractNumId w:val="64"/>
+  </w:num>
+  <w:num w:numId="74">
+    <w:abstractNumId w:val="79"/>
+  </w:num>
+  <w:num w:numId="75">
+    <w:abstractNumId w:val="7"/>
+  </w:num>
+  <w:num w:numId="76">
+    <w:abstractNumId w:val="74"/>
+  </w:num>
+  <w:num w:numId="77">
+    <w:abstractNumId w:val="43"/>
+  </w:num>
+  <w:num w:numId="78">
+    <w:abstractNumId w:val="68"/>
+  </w:num>
+  <w:num w:numId="79">
+    <w:abstractNumId w:val="21"/>
+  </w:num>
+  <w:num w:numId="80">
     <w:abstractNumId w:val="39"/>
   </w:num>
-  <w:num w:numId="52">
-    <w:abstractNumId w:val="68"/>
-  </w:num>
-  <w:num w:numId="53">
-    <w:abstractNumId w:val="54"/>
-  </w:num>
-  <w:num w:numId="54">
-    <w:abstractNumId w:val="57"/>
-  </w:num>
-  <w:num w:numId="55">
-    <w:abstractNumId w:val="25"/>
-  </w:num>
-  <w:num w:numId="56">
-    <w:abstractNumId w:val="23"/>
-  </w:num>
-  <w:num w:numId="57">
-    <w:abstractNumId w:val="1"/>
-  </w:num>
-  <w:num w:numId="58">
-    <w:abstractNumId w:val="30"/>
-  </w:num>
-  <w:num w:numId="59">
-    <w:abstractNumId w:val="12"/>
-  </w:num>
-  <w:num w:numId="60">
-    <w:abstractNumId w:val="9"/>
-  </w:num>
-  <w:num w:numId="61">
-    <w:abstractNumId w:val="45"/>
-  </w:num>
-  <w:num w:numId="62">
-    <w:abstractNumId w:val="43"/>
-  </w:num>
-  <w:num w:numId="63">
-    <w:abstractNumId w:val="22"/>
-  </w:num>
-  <w:num w:numId="64">
-    <w:abstractNumId w:val="20"/>
-  </w:num>
-  <w:num w:numId="65">
-    <w:abstractNumId w:val="51"/>
-  </w:num>
-  <w:num w:numId="66">
-    <w:abstractNumId w:val="5"/>
-  </w:num>
-  <w:num w:numId="67">
-    <w:abstractNumId w:val="59"/>
-  </w:num>
-  <w:num w:numId="68">
-    <w:abstractNumId w:val="73"/>
-  </w:num>
-  <w:num w:numId="69">
-    <w:abstractNumId w:val="7"/>
-  </w:num>
-  <w:num w:numId="70">
-    <w:abstractNumId w:val="69"/>
-  </w:num>
-  <w:num w:numId="71">
-    <w:abstractNumId w:val="41"/>
-  </w:num>
-  <w:num w:numId="72">
-    <w:abstractNumId w:val="63"/>
-  </w:num>
-  <w:num w:numId="73">
-    <w:abstractNumId w:val="21"/>
-  </w:num>
-  <w:num w:numId="74">
-    <w:abstractNumId w:val="37"/>
-  </w:num>
-  <w:num w:numId="75">
+  <w:num w:numId="81">
     <w:abstractNumId w:val="13"/>
   </w:num>
-  <w:num w:numId="76">
-    <w:abstractNumId w:val="56"/>
+  <w:num w:numId="82">
+    <w:abstractNumId w:val="61"/>
   </w:num>
 </w:numbering>
 </file>

</xml_diff>

<commit_message>
Tách biệt Khám phá bài hát của Admin và User
</commit_message>
<xml_diff>
--- a/Diagrams/UsecaseDiagram/DacTa/DacTaUsecase.docx
+++ b/Diagrams/UsecaseDiagram/DacTa/DacTaUsecase.docx
@@ -1091,6 +1091,31 @@
     <w:p>
       <w:pPr>
         <w:numPr>
+          <w:numId w:val="0"/>
+        </w:numPr>
+        <w:ind w:leftChars="0"/>
+        <w:rPr>
+          <w:rFonts w:hint="default"/>
+          <w:sz w:val="32"/>
+          <w:szCs w:val="32"/>
+          <w:vertAlign w:val="baseline"/>
+          <w:lang w:val="en-US"/>
+        </w:rPr>
+      </w:pPr>
+      <w:r>
+        <w:rPr>
+          <w:rFonts w:hint="default"/>
+          <w:sz w:val="32"/>
+          <w:szCs w:val="32"/>
+          <w:vertAlign w:val="baseline"/>
+          <w:lang w:val="en-US"/>
+        </w:rPr>
+        <w:t>Quản trị viên có quyền cao nhất để vận hành và kiểm duyệt toàn bộ hệ thống:</w:t>
+      </w:r>
+    </w:p>
+    <w:p>
+      <w:pPr>
+        <w:numPr>
           <w:ilvl w:val="0"/>
           <w:numId w:val="5"/>
         </w:numPr>
@@ -1111,7 +1136,7 @@
           <w:vertAlign w:val="baseline"/>
           <w:lang w:val="en-US"/>
         </w:rPr>
-        <w:t>Quản trị viên có quyền cao nhất để vận hành và kiểm duyệt toàn bộ hệ thống:</w:t>
+        <w:t>Quản lý bài hát hệ thống: Admin có thể xem danh sách toàn bộ bài hát có trong và có thể Ẩn bài hát nếu nó vi phạm.</w:t>
       </w:r>
     </w:p>
     <w:p>
@@ -3359,6 +3384,579 @@
           <w:vertAlign w:val="baseline"/>
           <w:lang w:val="en-US"/>
         </w:rPr>
+        <w:t>Đặc tả Usecase Quản lý bài hát hệ thống</w:t>
+      </w:r>
+    </w:p>
+    <w:tbl>
+      <w:tblPr>
+        <w:tblStyle w:val="4"/>
+        <w:tblW w:w="0" w:type="auto"/>
+        <w:tblInd w:w="0" w:type="dxa"/>
+        <w:tblBorders>
+          <w:top w:val="single" w:color="auto" w:sz="4" w:space="0"/>
+          <w:left w:val="single" w:color="auto" w:sz="4" w:space="0"/>
+          <w:bottom w:val="single" w:color="auto" w:sz="4" w:space="0"/>
+          <w:right w:val="single" w:color="auto" w:sz="4" w:space="0"/>
+          <w:insideH w:val="single" w:color="auto" w:sz="4" w:space="0"/>
+          <w:insideV w:val="single" w:color="auto" w:sz="4" w:space="0"/>
+        </w:tblBorders>
+        <w:tblLayout w:type="autofit"/>
+        <w:tblCellMar>
+          <w:top w:w="0" w:type="dxa"/>
+          <w:left w:w="108" w:type="dxa"/>
+          <w:bottom w:w="0" w:type="dxa"/>
+          <w:right w:w="108" w:type="dxa"/>
+        </w:tblCellMar>
+      </w:tblPr>
+      <w:tblGrid>
+        <w:gridCol w:w="8522"/>
+      </w:tblGrid>
+      <w:tr>
+        <w:tblPrEx>
+          <w:tblBorders>
+            <w:top w:val="single" w:color="auto" w:sz="4" w:space="0"/>
+            <w:left w:val="single" w:color="auto" w:sz="4" w:space="0"/>
+            <w:bottom w:val="single" w:color="auto" w:sz="4" w:space="0"/>
+            <w:right w:val="single" w:color="auto" w:sz="4" w:space="0"/>
+            <w:insideH w:val="single" w:color="auto" w:sz="4" w:space="0"/>
+            <w:insideV w:val="single" w:color="auto" w:sz="4" w:space="0"/>
+          </w:tblBorders>
+          <w:tblCellMar>
+            <w:top w:w="0" w:type="dxa"/>
+            <w:left w:w="108" w:type="dxa"/>
+            <w:bottom w:w="0" w:type="dxa"/>
+            <w:right w:w="108" w:type="dxa"/>
+          </w:tblCellMar>
+        </w:tblPrEx>
+        <w:tc>
+          <w:tcPr>
+            <w:tcW w:w="8522" w:type="dxa"/>
+          </w:tcPr>
+          <w:p>
+            <w:pPr>
+              <w:widowControl w:val="0"/>
+              <w:jc w:val="both"/>
+              <w:rPr>
+                <w:rFonts w:hint="default"/>
+                <w:sz w:val="32"/>
+                <w:szCs w:val="32"/>
+                <w:vertAlign w:val="baseline"/>
+                <w:lang w:val="en-US"/>
+              </w:rPr>
+            </w:pPr>
+            <w:r>
+              <w:rPr>
+                <w:rFonts w:hint="default"/>
+                <w:sz w:val="32"/>
+                <w:szCs w:val="32"/>
+                <w:vertAlign w:val="baseline"/>
+                <w:lang w:val="en-US"/>
+              </w:rPr>
+              <w:t>Tóm tắt: Usecase bắt đầu khi Admin chọn chức năng Quản lý bài hát hệ thống. Hệ thống cho phép Admin xem danh sách và tìm kiếm bài hát trong hệ thống.</w:t>
+            </w:r>
+          </w:p>
+        </w:tc>
+      </w:tr>
+      <w:tr>
+        <w:tblPrEx>
+          <w:tblBorders>
+            <w:top w:val="single" w:color="auto" w:sz="4" w:space="0"/>
+            <w:left w:val="single" w:color="auto" w:sz="4" w:space="0"/>
+            <w:bottom w:val="single" w:color="auto" w:sz="4" w:space="0"/>
+            <w:right w:val="single" w:color="auto" w:sz="4" w:space="0"/>
+            <w:insideH w:val="single" w:color="auto" w:sz="4" w:space="0"/>
+            <w:insideV w:val="single" w:color="auto" w:sz="4" w:space="0"/>
+          </w:tblBorders>
+          <w:tblCellMar>
+            <w:top w:w="0" w:type="dxa"/>
+            <w:left w:w="108" w:type="dxa"/>
+            <w:bottom w:w="0" w:type="dxa"/>
+            <w:right w:w="108" w:type="dxa"/>
+          </w:tblCellMar>
+        </w:tblPrEx>
+        <w:tc>
+          <w:tcPr>
+            <w:tcW w:w="8522" w:type="dxa"/>
+          </w:tcPr>
+          <w:p>
+            <w:pPr>
+              <w:widowControl w:val="0"/>
+              <w:jc w:val="both"/>
+              <w:rPr>
+                <w:rFonts w:hint="default"/>
+                <w:sz w:val="32"/>
+                <w:szCs w:val="32"/>
+                <w:vertAlign w:val="baseline"/>
+                <w:lang w:val="en-US"/>
+              </w:rPr>
+            </w:pPr>
+            <w:r>
+              <w:rPr>
+                <w:rFonts w:hint="default"/>
+                <w:sz w:val="32"/>
+                <w:szCs w:val="32"/>
+                <w:vertAlign w:val="baseline"/>
+                <w:lang w:val="en-US"/>
+              </w:rPr>
+              <w:t xml:space="preserve">Dòng sự kiện chính: </w:t>
+            </w:r>
+          </w:p>
+          <w:p>
+            <w:pPr>
+              <w:widowControl w:val="0"/>
+              <w:numPr>
+                <w:ilvl w:val="0"/>
+                <w:numId w:val="12"/>
+              </w:numPr>
+              <w:ind w:leftChars="0"/>
+              <w:jc w:val="both"/>
+              <w:rPr>
+                <w:rFonts w:hint="default"/>
+                <w:sz w:val="32"/>
+                <w:szCs w:val="32"/>
+                <w:vertAlign w:val="baseline"/>
+                <w:lang w:val="en-US"/>
+              </w:rPr>
+            </w:pPr>
+            <w:r>
+              <w:rPr>
+                <w:rFonts w:hint="default"/>
+                <w:sz w:val="32"/>
+                <w:szCs w:val="32"/>
+                <w:vertAlign w:val="baseline"/>
+                <w:lang w:val="en-US"/>
+              </w:rPr>
+              <w:t>Hệ thống hiện giao diện Quản lý bài hát hệ thống thành công.</w:t>
+            </w:r>
+          </w:p>
+          <w:p>
+            <w:pPr>
+              <w:widowControl w:val="0"/>
+              <w:numPr>
+                <w:ilvl w:val="0"/>
+                <w:numId w:val="12"/>
+              </w:numPr>
+              <w:ind w:left="0" w:leftChars="0" w:firstLine="0" w:firstLineChars="0"/>
+              <w:jc w:val="both"/>
+              <w:rPr>
+                <w:rFonts w:hint="default"/>
+                <w:sz w:val="32"/>
+                <w:szCs w:val="32"/>
+                <w:vertAlign w:val="baseline"/>
+                <w:lang w:val="en-US"/>
+              </w:rPr>
+            </w:pPr>
+            <w:r>
+              <w:rPr>
+                <w:rFonts w:hint="default"/>
+                <w:sz w:val="32"/>
+                <w:szCs w:val="32"/>
+                <w:vertAlign w:val="baseline"/>
+                <w:lang w:val="en-US"/>
+              </w:rPr>
+              <w:t>Admin xem danh sách và tìm kiếm bài hát.</w:t>
+            </w:r>
+          </w:p>
+          <w:p>
+            <w:pPr>
+              <w:widowControl w:val="0"/>
+              <w:numPr>
+                <w:ilvl w:val="0"/>
+                <w:numId w:val="12"/>
+              </w:numPr>
+              <w:ind w:left="0" w:leftChars="0" w:firstLine="0" w:firstLineChars="0"/>
+              <w:jc w:val="both"/>
+              <w:rPr>
+                <w:rFonts w:hint="default"/>
+                <w:sz w:val="32"/>
+                <w:szCs w:val="32"/>
+                <w:vertAlign w:val="baseline"/>
+                <w:lang w:val="en-US"/>
+              </w:rPr>
+            </w:pPr>
+            <w:r>
+              <w:rPr>
+                <w:rFonts w:hint="default"/>
+                <w:sz w:val="32"/>
+                <w:szCs w:val="32"/>
+                <w:vertAlign w:val="baseline"/>
+                <w:lang w:val="en-US"/>
+              </w:rPr>
+              <w:t>Admin chọn 1 bài hát và có thể thực hiện chức năng:</w:t>
+            </w:r>
+          </w:p>
+          <w:p>
+            <w:pPr>
+              <w:widowControl w:val="0"/>
+              <w:numPr>
+                <w:ilvl w:val="1"/>
+                <w:numId w:val="12"/>
+              </w:numPr>
+              <w:ind w:left="361" w:leftChars="0"/>
+              <w:jc w:val="both"/>
+              <w:rPr>
+                <w:rFonts w:hint="default"/>
+                <w:sz w:val="32"/>
+                <w:szCs w:val="32"/>
+                <w:vertAlign w:val="baseline"/>
+                <w:lang w:val="en-US"/>
+              </w:rPr>
+            </w:pPr>
+            <w:r>
+              <w:rPr>
+                <w:rFonts w:hint="default"/>
+                <w:sz w:val="32"/>
+                <w:szCs w:val="32"/>
+                <w:vertAlign w:val="baseline"/>
+                <w:lang w:val="en-US"/>
+              </w:rPr>
+              <w:t>Nghe nhạc (Chuyển sang Usecase Nghe nhạc)</w:t>
+            </w:r>
+          </w:p>
+          <w:p>
+            <w:pPr>
+              <w:widowControl w:val="0"/>
+              <w:numPr>
+                <w:ilvl w:val="1"/>
+                <w:numId w:val="12"/>
+              </w:numPr>
+              <w:ind w:left="361" w:leftChars="0"/>
+              <w:jc w:val="both"/>
+              <w:rPr>
+                <w:rFonts w:hint="default"/>
+                <w:sz w:val="32"/>
+                <w:szCs w:val="32"/>
+                <w:vertAlign w:val="baseline"/>
+                <w:lang w:val="en-US"/>
+              </w:rPr>
+            </w:pPr>
+            <w:r>
+              <w:rPr>
+                <w:rFonts w:hint="default"/>
+                <w:sz w:val="32"/>
+                <w:szCs w:val="32"/>
+                <w:vertAlign w:val="baseline"/>
+                <w:lang w:val="en-US"/>
+              </w:rPr>
+              <w:t>Ẩn/Hiện bài hát</w:t>
+            </w:r>
+          </w:p>
+          <w:p>
+            <w:pPr>
+              <w:widowControl w:val="0"/>
+              <w:numPr>
+                <w:ilvl w:val="0"/>
+                <w:numId w:val="12"/>
+              </w:numPr>
+              <w:ind w:left="0" w:leftChars="0" w:firstLine="0" w:firstLineChars="0"/>
+              <w:jc w:val="both"/>
+              <w:rPr>
+                <w:rFonts w:hint="default"/>
+                <w:sz w:val="32"/>
+                <w:szCs w:val="32"/>
+                <w:vertAlign w:val="baseline"/>
+                <w:lang w:val="en-US"/>
+              </w:rPr>
+            </w:pPr>
+            <w:r>
+              <w:rPr>
+                <w:rFonts w:hint="default"/>
+                <w:sz w:val="32"/>
+                <w:szCs w:val="32"/>
+                <w:vertAlign w:val="baseline"/>
+                <w:lang w:val="en-US"/>
+              </w:rPr>
+              <w:t>Hệ thống ghi nhận hành động của Admin thành công.</w:t>
+            </w:r>
+          </w:p>
+          <w:p>
+            <w:pPr>
+              <w:widowControl w:val="0"/>
+              <w:numPr>
+                <w:ilvl w:val="0"/>
+                <w:numId w:val="12"/>
+              </w:numPr>
+              <w:ind w:left="0" w:leftChars="0" w:firstLine="0" w:firstLineChars="0"/>
+              <w:jc w:val="both"/>
+              <w:rPr>
+                <w:rFonts w:hint="default"/>
+                <w:sz w:val="32"/>
+                <w:szCs w:val="32"/>
+                <w:vertAlign w:val="baseline"/>
+                <w:lang w:val="en-US"/>
+              </w:rPr>
+            </w:pPr>
+            <w:r>
+              <w:rPr>
+                <w:rFonts w:hint="default"/>
+                <w:sz w:val="32"/>
+                <w:szCs w:val="32"/>
+                <w:vertAlign w:val="baseline"/>
+                <w:lang w:val="en-US"/>
+              </w:rPr>
+              <w:t>Hệ thống cập nhật trạng thái của bài hát thành công.</w:t>
+            </w:r>
+          </w:p>
+        </w:tc>
+      </w:tr>
+      <w:tr>
+        <w:tblPrEx>
+          <w:tblBorders>
+            <w:top w:val="single" w:color="auto" w:sz="4" w:space="0"/>
+            <w:left w:val="single" w:color="auto" w:sz="4" w:space="0"/>
+            <w:bottom w:val="single" w:color="auto" w:sz="4" w:space="0"/>
+            <w:right w:val="single" w:color="auto" w:sz="4" w:space="0"/>
+            <w:insideH w:val="single" w:color="auto" w:sz="4" w:space="0"/>
+            <w:insideV w:val="single" w:color="auto" w:sz="4" w:space="0"/>
+          </w:tblBorders>
+          <w:tblCellMar>
+            <w:top w:w="0" w:type="dxa"/>
+            <w:left w:w="108" w:type="dxa"/>
+            <w:bottom w:w="0" w:type="dxa"/>
+            <w:right w:w="108" w:type="dxa"/>
+          </w:tblCellMar>
+        </w:tblPrEx>
+        <w:tc>
+          <w:tcPr>
+            <w:tcW w:w="8522" w:type="dxa"/>
+          </w:tcPr>
+          <w:p>
+            <w:pPr>
+              <w:widowControl w:val="0"/>
+              <w:jc w:val="both"/>
+              <w:rPr>
+                <w:rFonts w:hint="default"/>
+                <w:sz w:val="32"/>
+                <w:szCs w:val="32"/>
+                <w:vertAlign w:val="baseline"/>
+                <w:lang w:val="en-US"/>
+              </w:rPr>
+            </w:pPr>
+            <w:r>
+              <w:rPr>
+                <w:rFonts w:hint="default"/>
+                <w:sz w:val="32"/>
+                <w:szCs w:val="32"/>
+                <w:vertAlign w:val="baseline"/>
+                <w:lang w:val="en-US"/>
+              </w:rPr>
+              <w:t>Dòng sự kiện phụ:</w:t>
+            </w:r>
+          </w:p>
+          <w:p>
+            <w:pPr>
+              <w:widowControl w:val="0"/>
+              <w:numPr>
+                <w:ilvl w:val="0"/>
+                <w:numId w:val="0"/>
+              </w:numPr>
+              <w:jc w:val="both"/>
+              <w:rPr>
+                <w:rFonts w:hint="default"/>
+                <w:sz w:val="32"/>
+                <w:szCs w:val="32"/>
+                <w:vertAlign w:val="baseline"/>
+                <w:lang w:val="en-US"/>
+              </w:rPr>
+            </w:pPr>
+            <w:r>
+              <w:rPr>
+                <w:rFonts w:hint="default"/>
+                <w:sz w:val="32"/>
+                <w:szCs w:val="32"/>
+                <w:vertAlign w:val="baseline"/>
+                <w:lang w:val="en-US"/>
+              </w:rPr>
+              <w:t>1.1 Nếu hệ thống lấy danh sách bài hát  không thành công thì hệ thống thông báo “Lấy danh sách bài hát thất bại, vui lòng thử lại” đến Admin.</w:t>
+            </w:r>
+          </w:p>
+        </w:tc>
+      </w:tr>
+      <w:tr>
+        <w:tblPrEx>
+          <w:tblBorders>
+            <w:top w:val="single" w:color="auto" w:sz="4" w:space="0"/>
+            <w:left w:val="single" w:color="auto" w:sz="4" w:space="0"/>
+            <w:bottom w:val="single" w:color="auto" w:sz="4" w:space="0"/>
+            <w:right w:val="single" w:color="auto" w:sz="4" w:space="0"/>
+            <w:insideH w:val="single" w:color="auto" w:sz="4" w:space="0"/>
+            <w:insideV w:val="single" w:color="auto" w:sz="4" w:space="0"/>
+          </w:tblBorders>
+          <w:tblCellMar>
+            <w:top w:w="0" w:type="dxa"/>
+            <w:left w:w="108" w:type="dxa"/>
+            <w:bottom w:w="0" w:type="dxa"/>
+            <w:right w:w="108" w:type="dxa"/>
+          </w:tblCellMar>
+        </w:tblPrEx>
+        <w:tc>
+          <w:tcPr>
+            <w:tcW w:w="8522" w:type="dxa"/>
+          </w:tcPr>
+          <w:p>
+            <w:pPr>
+              <w:widowControl w:val="0"/>
+              <w:jc w:val="both"/>
+              <w:rPr>
+                <w:rFonts w:hint="default"/>
+                <w:sz w:val="32"/>
+                <w:szCs w:val="32"/>
+                <w:vertAlign w:val="baseline"/>
+                <w:lang w:val="en-US"/>
+              </w:rPr>
+            </w:pPr>
+            <w:r>
+              <w:rPr>
+                <w:rFonts w:hint="default"/>
+                <w:sz w:val="32"/>
+                <w:szCs w:val="32"/>
+                <w:vertAlign w:val="baseline"/>
+                <w:lang w:val="en-US"/>
+              </w:rPr>
+              <w:t xml:space="preserve">Tiền điều kiện: </w:t>
+            </w:r>
+          </w:p>
+          <w:p>
+            <w:pPr>
+              <w:widowControl w:val="0"/>
+              <w:numPr>
+                <w:ilvl w:val="0"/>
+                <w:numId w:val="13"/>
+              </w:numPr>
+              <w:jc w:val="both"/>
+              <w:rPr>
+                <w:rFonts w:hint="default"/>
+                <w:sz w:val="32"/>
+                <w:szCs w:val="32"/>
+                <w:vertAlign w:val="baseline"/>
+                <w:lang w:val="en-US"/>
+              </w:rPr>
+            </w:pPr>
+            <w:r>
+              <w:rPr>
+                <w:rFonts w:hint="default"/>
+                <w:sz w:val="32"/>
+                <w:szCs w:val="32"/>
+                <w:vertAlign w:val="baseline"/>
+                <w:lang w:val="en-US"/>
+              </w:rPr>
+              <w:t>Hệ thống ở chế độ Admin.</w:t>
+            </w:r>
+          </w:p>
+        </w:tc>
+      </w:tr>
+      <w:tr>
+        <w:tblPrEx>
+          <w:tblBorders>
+            <w:top w:val="single" w:color="auto" w:sz="4" w:space="0"/>
+            <w:left w:val="single" w:color="auto" w:sz="4" w:space="0"/>
+            <w:bottom w:val="single" w:color="auto" w:sz="4" w:space="0"/>
+            <w:right w:val="single" w:color="auto" w:sz="4" w:space="0"/>
+            <w:insideH w:val="single" w:color="auto" w:sz="4" w:space="0"/>
+            <w:insideV w:val="single" w:color="auto" w:sz="4" w:space="0"/>
+          </w:tblBorders>
+          <w:tblCellMar>
+            <w:top w:w="0" w:type="dxa"/>
+            <w:left w:w="108" w:type="dxa"/>
+            <w:bottom w:w="0" w:type="dxa"/>
+            <w:right w:w="108" w:type="dxa"/>
+          </w:tblCellMar>
+        </w:tblPrEx>
+        <w:tc>
+          <w:tcPr>
+            <w:tcW w:w="8522" w:type="dxa"/>
+          </w:tcPr>
+          <w:p>
+            <w:pPr>
+              <w:widowControl w:val="0"/>
+              <w:jc w:val="both"/>
+              <w:rPr>
+                <w:rFonts w:hint="default"/>
+                <w:sz w:val="32"/>
+                <w:szCs w:val="32"/>
+                <w:vertAlign w:val="baseline"/>
+                <w:lang w:val="en-US"/>
+              </w:rPr>
+            </w:pPr>
+            <w:r>
+              <w:rPr>
+                <w:rFonts w:hint="default"/>
+                <w:sz w:val="32"/>
+                <w:szCs w:val="32"/>
+                <w:vertAlign w:val="baseline"/>
+                <w:lang w:val="en-US"/>
+              </w:rPr>
+              <w:t xml:space="preserve">Hậu điều kiện: </w:t>
+            </w:r>
+          </w:p>
+          <w:p>
+            <w:pPr>
+              <w:widowControl w:val="0"/>
+              <w:numPr>
+                <w:ilvl w:val="0"/>
+                <w:numId w:val="14"/>
+              </w:numPr>
+              <w:jc w:val="both"/>
+              <w:rPr>
+                <w:rFonts w:hint="default"/>
+                <w:sz w:val="32"/>
+                <w:szCs w:val="32"/>
+                <w:vertAlign w:val="baseline"/>
+                <w:lang w:val="en-US"/>
+              </w:rPr>
+            </w:pPr>
+            <w:r>
+              <w:rPr>
+                <w:rFonts w:hint="default"/>
+                <w:sz w:val="32"/>
+                <w:szCs w:val="32"/>
+                <w:vertAlign w:val="baseline"/>
+                <w:lang w:val="en-US"/>
+              </w:rPr>
+              <w:t>Hệ thống sẵn sàng để thực hiện yêu cầu tiếp theo của Admin</w:t>
+            </w:r>
+            <w:bookmarkStart w:id="0" w:name="_GoBack"/>
+            <w:bookmarkEnd w:id="0"/>
+            <w:r>
+              <w:rPr>
+                <w:rFonts w:hint="default"/>
+                <w:sz w:val="32"/>
+                <w:szCs w:val="32"/>
+                <w:vertAlign w:val="baseline"/>
+                <w:lang w:val="en-US"/>
+              </w:rPr>
+              <w:t>.</w:t>
+            </w:r>
+          </w:p>
+        </w:tc>
+      </w:tr>
+    </w:tbl>
+    <w:p>
+      <w:pPr>
+        <w:rPr>
+          <w:sz w:val="32"/>
+          <w:szCs w:val="32"/>
+        </w:rPr>
+      </w:pPr>
+    </w:p>
+    <w:p>
+      <w:pPr>
+        <w:rPr>
+          <w:rFonts w:hint="default"/>
+          <w:sz w:val="32"/>
+          <w:szCs w:val="32"/>
+          <w:vertAlign w:val="baseline"/>
+          <w:lang w:val="en-US"/>
+        </w:rPr>
+      </w:pPr>
+      <w:r>
+        <w:rPr>
+          <w:rFonts w:hint="default"/>
+          <w:sz w:val="32"/>
+          <w:szCs w:val="32"/>
+          <w:vertAlign w:val="baseline"/>
+          <w:lang w:val="en-US"/>
+        </w:rPr>
         <w:t xml:space="preserve">Đặc tả Usecase Quản lý bài hát cá nhân </w:t>
       </w:r>
     </w:p>
@@ -3481,7 +4079,7 @@
               <w:widowControl w:val="0"/>
               <w:numPr>
                 <w:ilvl w:val="0"/>
-                <w:numId w:val="12"/>
+                <w:numId w:val="15"/>
               </w:numPr>
               <w:jc w:val="both"/>
               <w:rPr>
@@ -3508,7 +4106,7 @@
               <w:widowControl w:val="0"/>
               <w:numPr>
                 <w:ilvl w:val="0"/>
-                <w:numId w:val="12"/>
+                <w:numId w:val="15"/>
               </w:numPr>
               <w:ind w:left="0" w:leftChars="0" w:firstLine="0" w:firstLineChars="0"/>
               <w:jc w:val="both"/>
@@ -3536,7 +4134,7 @@
               <w:widowControl w:val="0"/>
               <w:numPr>
                 <w:ilvl w:val="0"/>
-                <w:numId w:val="12"/>
+                <w:numId w:val="15"/>
               </w:numPr>
               <w:ind w:left="0" w:leftChars="0" w:firstLine="0" w:firstLineChars="0"/>
               <w:jc w:val="both"/>
@@ -3648,7 +4246,7 @@
               <w:widowControl w:val="0"/>
               <w:numPr>
                 <w:ilvl w:val="0"/>
-                <w:numId w:val="12"/>
+                <w:numId w:val="15"/>
               </w:numPr>
               <w:ind w:left="0" w:leftChars="0" w:firstLine="0" w:firstLineChars="0"/>
               <w:jc w:val="both"/>
@@ -3795,7 +4393,7 @@
               <w:widowControl w:val="0"/>
               <w:numPr>
                 <w:ilvl w:val="0"/>
-                <w:numId w:val="13"/>
+                <w:numId w:val="16"/>
               </w:numPr>
               <w:ind w:leftChars="0"/>
               <w:jc w:val="both"/>
@@ -3823,7 +4421,7 @@
               <w:widowControl w:val="0"/>
               <w:numPr>
                 <w:ilvl w:val="0"/>
-                <w:numId w:val="13"/>
+                <w:numId w:val="16"/>
               </w:numPr>
               <w:ind w:leftChars="0"/>
               <w:jc w:val="both"/>
@@ -3851,7 +4449,7 @@
               <w:widowControl w:val="0"/>
               <w:numPr>
                 <w:ilvl w:val="0"/>
-                <w:numId w:val="13"/>
+                <w:numId w:val="16"/>
               </w:numPr>
               <w:ind w:leftChars="0"/>
               <w:jc w:val="both"/>
@@ -3925,7 +4523,7 @@
               <w:widowControl w:val="0"/>
               <w:numPr>
                 <w:ilvl w:val="0"/>
-                <w:numId w:val="14"/>
+                <w:numId w:val="17"/>
               </w:numPr>
               <w:ind w:left="0" w:leftChars="0" w:firstLine="0" w:firstLineChars="0"/>
               <w:jc w:val="both"/>
@@ -4099,7 +4697,7 @@
               <w:widowControl w:val="0"/>
               <w:numPr>
                 <w:ilvl w:val="0"/>
-                <w:numId w:val="15"/>
+                <w:numId w:val="18"/>
               </w:numPr>
               <w:jc w:val="both"/>
               <w:rPr>
@@ -4126,7 +4724,7 @@
               <w:widowControl w:val="0"/>
               <w:numPr>
                 <w:ilvl w:val="0"/>
-                <w:numId w:val="15"/>
+                <w:numId w:val="18"/>
               </w:numPr>
               <w:jc w:val="both"/>
               <w:rPr>
@@ -4153,7 +4751,7 @@
               <w:widowControl w:val="0"/>
               <w:numPr>
                 <w:ilvl w:val="0"/>
-                <w:numId w:val="15"/>
+                <w:numId w:val="18"/>
               </w:numPr>
               <w:jc w:val="both"/>
               <w:rPr>
@@ -4180,7 +4778,7 @@
               <w:widowControl w:val="0"/>
               <w:numPr>
                 <w:ilvl w:val="0"/>
-                <w:numId w:val="15"/>
+                <w:numId w:val="18"/>
               </w:numPr>
               <w:jc w:val="both"/>
               <w:rPr>
@@ -4207,7 +4805,7 @@
               <w:widowControl w:val="0"/>
               <w:numPr>
                 <w:ilvl w:val="0"/>
-                <w:numId w:val="15"/>
+                <w:numId w:val="18"/>
               </w:numPr>
               <w:jc w:val="both"/>
               <w:rPr>
@@ -4353,7 +4951,7 @@
               <w:widowControl w:val="0"/>
               <w:numPr>
                 <w:ilvl w:val="0"/>
-                <w:numId w:val="16"/>
+                <w:numId w:val="19"/>
               </w:numPr>
               <w:jc w:val="both"/>
               <w:rPr>
@@ -4380,7 +4978,7 @@
               <w:widowControl w:val="0"/>
               <w:numPr>
                 <w:ilvl w:val="0"/>
-                <w:numId w:val="16"/>
+                <w:numId w:val="19"/>
               </w:numPr>
               <w:jc w:val="both"/>
               <w:rPr>
@@ -4453,7 +5051,7 @@
               <w:widowControl w:val="0"/>
               <w:numPr>
                 <w:ilvl w:val="0"/>
-                <w:numId w:val="17"/>
+                <w:numId w:val="20"/>
               </w:numPr>
               <w:ind w:left="0" w:leftChars="0" w:firstLine="0" w:firstLineChars="0"/>
               <w:jc w:val="both"/>
@@ -4627,7 +5225,7 @@
               <w:widowControl w:val="0"/>
               <w:numPr>
                 <w:ilvl w:val="0"/>
-                <w:numId w:val="18"/>
+                <w:numId w:val="21"/>
               </w:numPr>
               <w:ind w:left="0" w:leftChars="0" w:firstLine="0" w:firstLineChars="0"/>
               <w:jc w:val="both"/>
@@ -4655,7 +5253,7 @@
               <w:widowControl w:val="0"/>
               <w:numPr>
                 <w:ilvl w:val="0"/>
-                <w:numId w:val="18"/>
+                <w:numId w:val="21"/>
               </w:numPr>
               <w:ind w:left="0" w:leftChars="0" w:firstLine="0" w:firstLineChars="0"/>
               <w:jc w:val="both"/>
@@ -4683,7 +5281,7 @@
               <w:widowControl w:val="0"/>
               <w:numPr>
                 <w:ilvl w:val="0"/>
-                <w:numId w:val="18"/>
+                <w:numId w:val="21"/>
               </w:numPr>
               <w:ind w:left="0" w:leftChars="0" w:firstLine="0" w:firstLineChars="0"/>
               <w:jc w:val="both"/>
@@ -4711,7 +5309,7 @@
               <w:widowControl w:val="0"/>
               <w:numPr>
                 <w:ilvl w:val="0"/>
-                <w:numId w:val="18"/>
+                <w:numId w:val="21"/>
               </w:numPr>
               <w:ind w:left="0" w:leftChars="0" w:firstLine="0" w:firstLineChars="0"/>
               <w:jc w:val="both"/>
@@ -4739,7 +5337,7 @@
               <w:widowControl w:val="0"/>
               <w:numPr>
                 <w:ilvl w:val="0"/>
-                <w:numId w:val="18"/>
+                <w:numId w:val="21"/>
               </w:numPr>
               <w:ind w:left="0" w:leftChars="0" w:firstLine="0" w:firstLineChars="0"/>
               <w:jc w:val="both"/>
@@ -4886,7 +5484,7 @@
               <w:widowControl w:val="0"/>
               <w:numPr>
                 <w:ilvl w:val="0"/>
-                <w:numId w:val="19"/>
+                <w:numId w:val="22"/>
               </w:numPr>
               <w:jc w:val="both"/>
               <w:rPr>
@@ -4913,7 +5511,7 @@
               <w:widowControl w:val="0"/>
               <w:numPr>
                 <w:ilvl w:val="0"/>
-                <w:numId w:val="19"/>
+                <w:numId w:val="22"/>
               </w:numPr>
               <w:jc w:val="both"/>
               <w:rPr>
@@ -4940,7 +5538,7 @@
               <w:widowControl w:val="0"/>
               <w:numPr>
                 <w:ilvl w:val="0"/>
-                <w:numId w:val="19"/>
+                <w:numId w:val="22"/>
               </w:numPr>
               <w:jc w:val="both"/>
               <w:rPr>
@@ -5013,7 +5611,7 @@
               <w:widowControl w:val="0"/>
               <w:numPr>
                 <w:ilvl w:val="0"/>
-                <w:numId w:val="20"/>
+                <w:numId w:val="23"/>
               </w:numPr>
               <w:ind w:left="0" w:leftChars="0" w:firstLine="0" w:firstLineChars="0"/>
               <w:jc w:val="both"/>
@@ -5102,12 +5700,6 @@
             <w:insideH w:val="single" w:color="auto" w:sz="4" w:space="0"/>
             <w:insideV w:val="single" w:color="auto" w:sz="4" w:space="0"/>
           </w:tblBorders>
-          <w:tblCellMar>
-            <w:top w:w="0" w:type="dxa"/>
-            <w:left w:w="108" w:type="dxa"/>
-            <w:bottom w:w="0" w:type="dxa"/>
-            <w:right w:w="108" w:type="dxa"/>
-          </w:tblCellMar>
         </w:tblPrEx>
         <w:tc>
           <w:tcPr>
@@ -5187,7 +5779,7 @@
               <w:widowControl w:val="0"/>
               <w:numPr>
                 <w:ilvl w:val="0"/>
-                <w:numId w:val="21"/>
+                <w:numId w:val="24"/>
               </w:numPr>
               <w:ind w:leftChars="0"/>
               <w:jc w:val="both"/>
@@ -5215,7 +5807,7 @@
               <w:widowControl w:val="0"/>
               <w:numPr>
                 <w:ilvl w:val="0"/>
-                <w:numId w:val="21"/>
+                <w:numId w:val="24"/>
               </w:numPr>
               <w:ind w:leftChars="0"/>
               <w:jc w:val="both"/>
@@ -5243,7 +5835,7 @@
               <w:widowControl w:val="0"/>
               <w:numPr>
                 <w:ilvl w:val="0"/>
-                <w:numId w:val="21"/>
+                <w:numId w:val="24"/>
               </w:numPr>
               <w:ind w:leftChars="0"/>
               <w:jc w:val="both"/>
@@ -5271,7 +5863,7 @@
               <w:widowControl w:val="0"/>
               <w:numPr>
                 <w:ilvl w:val="0"/>
-                <w:numId w:val="21"/>
+                <w:numId w:val="24"/>
               </w:numPr>
               <w:ind w:leftChars="0"/>
               <w:jc w:val="both"/>
@@ -5299,7 +5891,7 @@
               <w:widowControl w:val="0"/>
               <w:numPr>
                 <w:ilvl w:val="0"/>
-                <w:numId w:val="21"/>
+                <w:numId w:val="24"/>
               </w:numPr>
               <w:ind w:leftChars="0"/>
               <w:jc w:val="both"/>
@@ -5446,7 +6038,7 @@
               <w:widowControl w:val="0"/>
               <w:numPr>
                 <w:ilvl w:val="0"/>
-                <w:numId w:val="22"/>
+                <w:numId w:val="25"/>
               </w:numPr>
               <w:jc w:val="both"/>
               <w:rPr>
@@ -5473,7 +6065,7 @@
               <w:widowControl w:val="0"/>
               <w:numPr>
                 <w:ilvl w:val="0"/>
-                <w:numId w:val="22"/>
+                <w:numId w:val="25"/>
               </w:numPr>
               <w:jc w:val="both"/>
               <w:rPr>
@@ -5546,7 +6138,7 @@
               <w:widowControl w:val="0"/>
               <w:numPr>
                 <w:ilvl w:val="0"/>
-                <w:numId w:val="23"/>
+                <w:numId w:val="26"/>
               </w:numPr>
               <w:ind w:left="0" w:leftChars="0" w:firstLine="0" w:firstLineChars="0"/>
               <w:jc w:val="both"/>
@@ -5720,7 +6312,7 @@
               <w:widowControl w:val="0"/>
               <w:numPr>
                 <w:ilvl w:val="0"/>
-                <w:numId w:val="24"/>
+                <w:numId w:val="27"/>
               </w:numPr>
               <w:jc w:val="both"/>
               <w:rPr>
@@ -5747,7 +6339,7 @@
               <w:widowControl w:val="0"/>
               <w:numPr>
                 <w:ilvl w:val="0"/>
-                <w:numId w:val="24"/>
+                <w:numId w:val="27"/>
               </w:numPr>
               <w:jc w:val="both"/>
               <w:rPr>
@@ -5774,7 +6366,7 @@
               <w:widowControl w:val="0"/>
               <w:numPr>
                 <w:ilvl w:val="0"/>
-                <w:numId w:val="24"/>
+                <w:numId w:val="27"/>
               </w:numPr>
               <w:jc w:val="both"/>
               <w:rPr>
@@ -5801,7 +6393,7 @@
               <w:widowControl w:val="0"/>
               <w:numPr>
                 <w:ilvl w:val="0"/>
-                <w:numId w:val="24"/>
+                <w:numId w:val="27"/>
               </w:numPr>
               <w:jc w:val="both"/>
               <w:rPr>
@@ -5828,7 +6420,7 @@
               <w:widowControl w:val="0"/>
               <w:numPr>
                 <w:ilvl w:val="0"/>
-                <w:numId w:val="24"/>
+                <w:numId w:val="27"/>
               </w:numPr>
               <w:jc w:val="both"/>
               <w:rPr>
@@ -5855,7 +6447,7 @@
               <w:widowControl w:val="0"/>
               <w:numPr>
                 <w:ilvl w:val="0"/>
-                <w:numId w:val="24"/>
+                <w:numId w:val="27"/>
               </w:numPr>
               <w:jc w:val="both"/>
               <w:rPr>
@@ -6030,7 +6622,7 @@
               <w:widowControl w:val="0"/>
               <w:numPr>
                 <w:ilvl w:val="0"/>
-                <w:numId w:val="25"/>
+                <w:numId w:val="28"/>
               </w:numPr>
               <w:jc w:val="both"/>
               <w:rPr>
@@ -6103,7 +6695,7 @@
               <w:widowControl w:val="0"/>
               <w:numPr>
                 <w:ilvl w:val="0"/>
-                <w:numId w:val="26"/>
+                <w:numId w:val="29"/>
               </w:numPr>
               <w:ind w:leftChars="0"/>
               <w:jc w:val="both"/>
@@ -6277,7 +6869,7 @@
               <w:widowControl w:val="0"/>
               <w:numPr>
                 <w:ilvl w:val="0"/>
-                <w:numId w:val="27"/>
+                <w:numId w:val="30"/>
               </w:numPr>
               <w:jc w:val="both"/>
               <w:rPr>
@@ -6304,7 +6896,7 @@
               <w:widowControl w:val="0"/>
               <w:numPr>
                 <w:ilvl w:val="0"/>
-                <w:numId w:val="27"/>
+                <w:numId w:val="30"/>
               </w:numPr>
               <w:jc w:val="both"/>
               <w:rPr>
@@ -6331,7 +6923,7 @@
               <w:widowControl w:val="0"/>
               <w:numPr>
                 <w:ilvl w:val="0"/>
-                <w:numId w:val="27"/>
+                <w:numId w:val="30"/>
               </w:numPr>
               <w:jc w:val="both"/>
               <w:rPr>
@@ -6358,7 +6950,7 @@
               <w:widowControl w:val="0"/>
               <w:numPr>
                 <w:ilvl w:val="0"/>
-                <w:numId w:val="27"/>
+                <w:numId w:val="30"/>
               </w:numPr>
               <w:jc w:val="both"/>
               <w:rPr>
@@ -6385,7 +6977,7 @@
               <w:widowControl w:val="0"/>
               <w:numPr>
                 <w:ilvl w:val="0"/>
-                <w:numId w:val="27"/>
+                <w:numId w:val="30"/>
               </w:numPr>
               <w:jc w:val="both"/>
               <w:rPr>
@@ -6458,7 +7050,7 @@
               <w:widowControl w:val="0"/>
               <w:numPr>
                 <w:ilvl w:val="1"/>
-                <w:numId w:val="19"/>
+                <w:numId w:val="22"/>
               </w:numPr>
               <w:jc w:val="both"/>
               <w:rPr>
@@ -6632,7 +7224,7 @@
               <w:widowControl w:val="0"/>
               <w:numPr>
                 <w:ilvl w:val="0"/>
-                <w:numId w:val="28"/>
+                <w:numId w:val="31"/>
               </w:numPr>
               <w:jc w:val="both"/>
               <w:rPr>
@@ -6805,7 +7397,7 @@
               <w:widowControl w:val="0"/>
               <w:numPr>
                 <w:ilvl w:val="0"/>
-                <w:numId w:val="29"/>
+                <w:numId w:val="32"/>
               </w:numPr>
               <w:jc w:val="both"/>
               <w:rPr>
@@ -6832,7 +7424,7 @@
               <w:widowControl w:val="0"/>
               <w:numPr>
                 <w:ilvl w:val="0"/>
-                <w:numId w:val="29"/>
+                <w:numId w:val="32"/>
               </w:numPr>
               <w:ind w:left="0" w:leftChars="0" w:firstLine="0" w:firstLineChars="0"/>
               <w:jc w:val="both"/>
@@ -6860,7 +7452,7 @@
               <w:widowControl w:val="0"/>
               <w:numPr>
                 <w:ilvl w:val="0"/>
-                <w:numId w:val="29"/>
+                <w:numId w:val="32"/>
               </w:numPr>
               <w:ind w:left="0" w:leftChars="0" w:firstLine="0" w:firstLineChars="0"/>
               <w:jc w:val="both"/>
@@ -6888,7 +7480,7 @@
               <w:widowControl w:val="0"/>
               <w:numPr>
                 <w:ilvl w:val="0"/>
-                <w:numId w:val="29"/>
+                <w:numId w:val="32"/>
               </w:numPr>
               <w:ind w:left="0" w:leftChars="0" w:firstLine="0" w:firstLineChars="0"/>
               <w:jc w:val="both"/>
@@ -6916,7 +7508,7 @@
               <w:widowControl w:val="0"/>
               <w:numPr>
                 <w:ilvl w:val="0"/>
-                <w:numId w:val="29"/>
+                <w:numId w:val="32"/>
               </w:numPr>
               <w:ind w:left="0" w:leftChars="0" w:firstLine="0" w:firstLineChars="0"/>
               <w:jc w:val="both"/>
@@ -6944,7 +7536,7 @@
               <w:widowControl w:val="0"/>
               <w:numPr>
                 <w:ilvl w:val="0"/>
-                <w:numId w:val="29"/>
+                <w:numId w:val="32"/>
               </w:numPr>
               <w:ind w:left="0" w:leftChars="0" w:firstLine="0" w:firstLineChars="0"/>
               <w:jc w:val="both"/>
@@ -7018,7 +7610,7 @@
               <w:widowControl w:val="0"/>
               <w:numPr>
                 <w:ilvl w:val="1"/>
-                <w:numId w:val="13"/>
+                <w:numId w:val="16"/>
               </w:numPr>
               <w:jc w:val="both"/>
               <w:rPr>
@@ -7192,7 +7784,7 @@
               <w:widowControl w:val="0"/>
               <w:numPr>
                 <w:ilvl w:val="0"/>
-                <w:numId w:val="30"/>
+                <w:numId w:val="33"/>
               </w:numPr>
               <w:jc w:val="both"/>
               <w:rPr>
@@ -7365,7 +7957,7 @@
               <w:widowControl w:val="0"/>
               <w:numPr>
                 <w:ilvl w:val="0"/>
-                <w:numId w:val="31"/>
+                <w:numId w:val="34"/>
               </w:numPr>
               <w:jc w:val="both"/>
               <w:rPr>
@@ -7392,7 +7984,7 @@
               <w:widowControl w:val="0"/>
               <w:numPr>
                 <w:ilvl w:val="0"/>
-                <w:numId w:val="31"/>
+                <w:numId w:val="34"/>
               </w:numPr>
               <w:ind w:left="0" w:leftChars="0" w:firstLine="0" w:firstLineChars="0"/>
               <w:jc w:val="both"/>
@@ -7420,7 +8012,7 @@
               <w:widowControl w:val="0"/>
               <w:numPr>
                 <w:ilvl w:val="0"/>
-                <w:numId w:val="31"/>
+                <w:numId w:val="34"/>
               </w:numPr>
               <w:ind w:left="0" w:leftChars="0" w:firstLine="0" w:firstLineChars="0"/>
               <w:jc w:val="both"/>
@@ -7448,7 +8040,7 @@
               <w:widowControl w:val="0"/>
               <w:numPr>
                 <w:ilvl w:val="0"/>
-                <w:numId w:val="31"/>
+                <w:numId w:val="34"/>
               </w:numPr>
               <w:ind w:left="0" w:leftChars="0" w:firstLine="0" w:firstLineChars="0"/>
               <w:jc w:val="both"/>
@@ -7476,7 +8068,7 @@
               <w:widowControl w:val="0"/>
               <w:numPr>
                 <w:ilvl w:val="0"/>
-                <w:numId w:val="31"/>
+                <w:numId w:val="34"/>
               </w:numPr>
               <w:ind w:left="0" w:leftChars="0" w:firstLine="0" w:firstLineChars="0"/>
               <w:jc w:val="both"/>
@@ -7504,7 +8096,7 @@
               <w:widowControl w:val="0"/>
               <w:numPr>
                 <w:ilvl w:val="0"/>
-                <w:numId w:val="31"/>
+                <w:numId w:val="34"/>
               </w:numPr>
               <w:ind w:left="0" w:leftChars="0" w:firstLine="0" w:firstLineChars="0"/>
               <w:jc w:val="both"/>
@@ -7748,7 +8340,7 @@
               <w:widowControl w:val="0"/>
               <w:numPr>
                 <w:ilvl w:val="0"/>
-                <w:numId w:val="32"/>
+                <w:numId w:val="35"/>
               </w:numPr>
               <w:jc w:val="both"/>
               <w:rPr>
@@ -7921,7 +8513,7 @@
               <w:widowControl w:val="0"/>
               <w:numPr>
                 <w:ilvl w:val="0"/>
-                <w:numId w:val="33"/>
+                <w:numId w:val="36"/>
               </w:numPr>
               <w:jc w:val="both"/>
               <w:rPr>
@@ -7948,7 +8540,7 @@
               <w:widowControl w:val="0"/>
               <w:numPr>
                 <w:ilvl w:val="0"/>
-                <w:numId w:val="28"/>
+                <w:numId w:val="31"/>
               </w:numPr>
               <w:ind w:left="0" w:leftChars="0" w:firstLine="0" w:firstLineChars="0"/>
               <w:jc w:val="both"/>
@@ -8068,7 +8660,7 @@
               <w:widowControl w:val="0"/>
               <w:numPr>
                 <w:ilvl w:val="0"/>
-                <w:numId w:val="34"/>
+                <w:numId w:val="37"/>
               </w:numPr>
               <w:jc w:val="both"/>
               <w:rPr>
@@ -8141,7 +8733,7 @@
               <w:widowControl w:val="0"/>
               <w:numPr>
                 <w:ilvl w:val="0"/>
-                <w:numId w:val="35"/>
+                <w:numId w:val="38"/>
               </w:numPr>
               <w:jc w:val="both"/>
               <w:rPr>
@@ -8314,7 +8906,7 @@
               <w:widowControl w:val="0"/>
               <w:numPr>
                 <w:ilvl w:val="0"/>
-                <w:numId w:val="36"/>
+                <w:numId w:val="39"/>
               </w:numPr>
               <w:jc w:val="both"/>
               <w:rPr>
@@ -8341,7 +8933,7 @@
               <w:widowControl w:val="0"/>
               <w:numPr>
                 <w:ilvl w:val="0"/>
-                <w:numId w:val="36"/>
+                <w:numId w:val="39"/>
               </w:numPr>
               <w:jc w:val="both"/>
               <w:rPr>
@@ -8368,7 +8960,7 @@
               <w:widowControl w:val="0"/>
               <w:numPr>
                 <w:ilvl w:val="0"/>
-                <w:numId w:val="36"/>
+                <w:numId w:val="39"/>
               </w:numPr>
               <w:ind w:left="0" w:leftChars="0" w:firstLine="0" w:firstLineChars="0"/>
               <w:jc w:val="both"/>
@@ -8396,7 +8988,7 @@
               <w:widowControl w:val="0"/>
               <w:numPr>
                 <w:ilvl w:val="0"/>
-                <w:numId w:val="36"/>
+                <w:numId w:val="39"/>
               </w:numPr>
               <w:ind w:left="0" w:leftChars="0" w:firstLine="0" w:firstLineChars="0"/>
               <w:jc w:val="both"/>
@@ -8424,7 +9016,7 @@
               <w:widowControl w:val="0"/>
               <w:numPr>
                 <w:ilvl w:val="0"/>
-                <w:numId w:val="36"/>
+                <w:numId w:val="39"/>
               </w:numPr>
               <w:ind w:left="0" w:leftChars="0" w:firstLine="0" w:firstLineChars="0"/>
               <w:jc w:val="both"/>
@@ -8452,7 +9044,7 @@
               <w:widowControl w:val="0"/>
               <w:numPr>
                 <w:ilvl w:val="0"/>
-                <w:numId w:val="36"/>
+                <w:numId w:val="39"/>
               </w:numPr>
               <w:ind w:left="0" w:leftChars="0" w:firstLine="0" w:firstLineChars="0"/>
               <w:jc w:val="both"/>
@@ -8480,7 +9072,7 @@
               <w:widowControl w:val="0"/>
               <w:numPr>
                 <w:ilvl w:val="0"/>
-                <w:numId w:val="36"/>
+                <w:numId w:val="39"/>
               </w:numPr>
               <w:ind w:left="0" w:leftChars="0" w:firstLine="0" w:firstLineChars="0"/>
               <w:jc w:val="both"/>
@@ -8508,7 +9100,7 @@
               <w:widowControl w:val="0"/>
               <w:numPr>
                 <w:ilvl w:val="0"/>
-                <w:numId w:val="36"/>
+                <w:numId w:val="39"/>
               </w:numPr>
               <w:ind w:left="0" w:leftChars="0" w:firstLine="0" w:firstLineChars="0"/>
               <w:jc w:val="both"/>
@@ -8536,7 +9128,7 @@
               <w:widowControl w:val="0"/>
               <w:numPr>
                 <w:ilvl w:val="0"/>
-                <w:numId w:val="36"/>
+                <w:numId w:val="39"/>
               </w:numPr>
               <w:ind w:left="0" w:leftChars="0" w:firstLine="0" w:firstLineChars="0"/>
               <w:jc w:val="both"/>
@@ -8806,7 +9398,7 @@
               <w:widowControl w:val="0"/>
               <w:numPr>
                 <w:ilvl w:val="0"/>
-                <w:numId w:val="37"/>
+                <w:numId w:val="40"/>
               </w:numPr>
               <w:jc w:val="both"/>
               <w:rPr>
@@ -8979,7 +9571,7 @@
               <w:widowControl w:val="0"/>
               <w:numPr>
                 <w:ilvl w:val="0"/>
-                <w:numId w:val="38"/>
+                <w:numId w:val="41"/>
               </w:numPr>
               <w:ind w:leftChars="0"/>
               <w:jc w:val="both"/>
@@ -9007,7 +9599,7 @@
               <w:widowControl w:val="0"/>
               <w:numPr>
                 <w:ilvl w:val="0"/>
-                <w:numId w:val="38"/>
+                <w:numId w:val="41"/>
               </w:numPr>
               <w:ind w:leftChars="0"/>
               <w:jc w:val="both"/>
@@ -9309,7 +9901,7 @@
               <w:widowControl w:val="0"/>
               <w:numPr>
                 <w:ilvl w:val="0"/>
-                <w:numId w:val="39"/>
+                <w:numId w:val="42"/>
               </w:numPr>
               <w:jc w:val="both"/>
               <w:rPr>
@@ -9482,7 +10074,224 @@
               <w:widowControl w:val="0"/>
               <w:numPr>
                 <w:ilvl w:val="0"/>
-                <w:numId w:val="40"/>
+                <w:numId w:val="43"/>
+              </w:numPr>
+              <w:jc w:val="both"/>
+              <w:rPr>
+                <w:rFonts w:hint="default"/>
+                <w:sz w:val="32"/>
+                <w:szCs w:val="32"/>
+                <w:vertAlign w:val="baseline"/>
+                <w:lang w:val="en-US"/>
+              </w:rPr>
+            </w:pPr>
+            <w:r>
+              <w:rPr>
+                <w:rFonts w:hint="default"/>
+                <w:sz w:val="32"/>
+                <w:szCs w:val="32"/>
+                <w:vertAlign w:val="baseline"/>
+                <w:lang w:val="en-US"/>
+              </w:rPr>
+              <w:t>Hệ thống hiện giao diện Khám phá bài hát thành công.</w:t>
+            </w:r>
+          </w:p>
+          <w:p>
+            <w:pPr>
+              <w:widowControl w:val="0"/>
+              <w:numPr>
+                <w:ilvl w:val="0"/>
+                <w:numId w:val="43"/>
+              </w:numPr>
+              <w:ind w:left="0" w:leftChars="0" w:firstLine="0" w:firstLineChars="0"/>
+              <w:jc w:val="both"/>
+              <w:rPr>
+                <w:rFonts w:hint="default"/>
+                <w:sz w:val="32"/>
+                <w:szCs w:val="32"/>
+                <w:vertAlign w:val="baseline"/>
+                <w:lang w:val="en-US"/>
+              </w:rPr>
+            </w:pPr>
+            <w:r>
+              <w:rPr>
+                <w:rFonts w:hint="default"/>
+                <w:sz w:val="32"/>
+                <w:szCs w:val="32"/>
+                <w:vertAlign w:val="baseline"/>
+                <w:lang w:val="en-US"/>
+              </w:rPr>
+              <w:t>Người dùng xem danh sách và tìm kiếm bài hát.</w:t>
+            </w:r>
+          </w:p>
+          <w:p>
+            <w:pPr>
+              <w:widowControl w:val="0"/>
+              <w:numPr>
+                <w:ilvl w:val="0"/>
+                <w:numId w:val="43"/>
+              </w:numPr>
+              <w:ind w:left="0" w:leftChars="0" w:firstLine="0" w:firstLineChars="0"/>
+              <w:jc w:val="both"/>
+              <w:rPr>
+                <w:rFonts w:hint="default"/>
+                <w:sz w:val="32"/>
+                <w:szCs w:val="32"/>
+                <w:vertAlign w:val="baseline"/>
+                <w:lang w:val="en-US"/>
+              </w:rPr>
+            </w:pPr>
+            <w:r>
+              <w:rPr>
+                <w:rFonts w:hint="default"/>
+                <w:sz w:val="32"/>
+                <w:szCs w:val="32"/>
+                <w:vertAlign w:val="baseline"/>
+                <w:lang w:val="en-US"/>
+              </w:rPr>
+              <w:t>Người dùng chọn 1 bài hát và có thể thực hiện các chức năng:</w:t>
+            </w:r>
+          </w:p>
+          <w:p>
+            <w:pPr>
+              <w:widowControl w:val="0"/>
+              <w:numPr>
+                <w:numId w:val="0"/>
+              </w:numPr>
+              <w:ind w:left="361" w:leftChars="0"/>
+              <w:jc w:val="both"/>
+              <w:rPr>
+                <w:rFonts w:hint="default"/>
+                <w:sz w:val="32"/>
+                <w:szCs w:val="32"/>
+                <w:vertAlign w:val="baseline"/>
+                <w:lang w:val="en-US"/>
+              </w:rPr>
+            </w:pPr>
+            <w:r>
+              <w:rPr>
+                <w:rFonts w:hint="default"/>
+                <w:sz w:val="32"/>
+                <w:szCs w:val="32"/>
+                <w:vertAlign w:val="baseline"/>
+                <w:lang w:val="en-US"/>
+              </w:rPr>
+              <w:t>3.1 Nghe nhạc (Chuyển sang Usecase Nghe nhạc)</w:t>
+            </w:r>
+          </w:p>
+          <w:p>
+            <w:pPr>
+              <w:widowControl w:val="0"/>
+              <w:numPr>
+                <w:numId w:val="0"/>
+              </w:numPr>
+              <w:ind w:left="361" w:leftChars="0"/>
+              <w:jc w:val="both"/>
+              <w:rPr>
+                <w:rFonts w:hint="default"/>
+                <w:sz w:val="32"/>
+                <w:szCs w:val="32"/>
+                <w:vertAlign w:val="baseline"/>
+                <w:lang w:val="en-US"/>
+              </w:rPr>
+            </w:pPr>
+            <w:r>
+              <w:rPr>
+                <w:rFonts w:hint="default"/>
+                <w:sz w:val="32"/>
+                <w:szCs w:val="32"/>
+                <w:vertAlign w:val="baseline"/>
+                <w:lang w:val="en-US"/>
+              </w:rPr>
+              <w:t>3.2 Thích bài hát: Hệ thống sẽ ghi nhận và thêm bài hát đó vào danh sách bài hát yêu thích của người dùng thành công.</w:t>
+            </w:r>
+          </w:p>
+          <w:p>
+            <w:pPr>
+              <w:widowControl w:val="0"/>
+              <w:numPr>
+                <w:numId w:val="0"/>
+              </w:numPr>
+              <w:ind w:left="361" w:leftChars="0"/>
+              <w:jc w:val="both"/>
+              <w:rPr>
+                <w:rFonts w:hint="default"/>
+                <w:sz w:val="32"/>
+                <w:szCs w:val="32"/>
+                <w:vertAlign w:val="baseline"/>
+                <w:lang w:val="en-US"/>
+              </w:rPr>
+            </w:pPr>
+            <w:r>
+              <w:rPr>
+                <w:rFonts w:hint="default"/>
+                <w:sz w:val="32"/>
+                <w:szCs w:val="32"/>
+                <w:vertAlign w:val="baseline"/>
+                <w:lang w:val="en-US"/>
+              </w:rPr>
+              <w:t>3.3 Bình luận bài hát: Hệ thống sẽ hiện khung để người dùng nhập bình luận, người dùng nhập xong và nhấn Gửi, hệ thống sẽ ghi nhận và hiện bình luận của người dùng trong danh sách bình luận của bài hát thành công.</w:t>
+            </w:r>
+          </w:p>
+          <w:p>
+            <w:pPr>
+              <w:widowControl w:val="0"/>
+              <w:numPr>
+                <w:numId w:val="0"/>
+              </w:numPr>
+              <w:ind w:left="361" w:leftChars="0"/>
+              <w:jc w:val="both"/>
+              <w:rPr>
+                <w:rFonts w:hint="default"/>
+                <w:sz w:val="32"/>
+                <w:szCs w:val="32"/>
+                <w:vertAlign w:val="baseline"/>
+                <w:lang w:val="en-US"/>
+              </w:rPr>
+            </w:pPr>
+            <w:r>
+              <w:rPr>
+                <w:rFonts w:hint="default"/>
+                <w:sz w:val="32"/>
+                <w:szCs w:val="32"/>
+                <w:vertAlign w:val="baseline"/>
+                <w:lang w:val="en-US"/>
+              </w:rPr>
+              <w:t>3.4 Chia sẻ bài hát (Chuyển sang Usecase Chia sẻ bài hát)</w:t>
+            </w:r>
+          </w:p>
+          <w:p>
+            <w:pPr>
+              <w:widowControl w:val="0"/>
+              <w:numPr>
+                <w:numId w:val="0"/>
+              </w:numPr>
+              <w:ind w:left="361" w:leftChars="0"/>
+              <w:jc w:val="both"/>
+              <w:rPr>
+                <w:rFonts w:hint="default"/>
+                <w:sz w:val="32"/>
+                <w:szCs w:val="32"/>
+                <w:vertAlign w:val="baseline"/>
+                <w:lang w:val="en-US"/>
+              </w:rPr>
+            </w:pPr>
+            <w:r>
+              <w:rPr>
+                <w:rFonts w:hint="default"/>
+                <w:sz w:val="32"/>
+                <w:szCs w:val="32"/>
+                <w:vertAlign w:val="baseline"/>
+                <w:lang w:val="en-US"/>
+              </w:rPr>
+              <w:t>3.5 Đăng lại bài hát: Hệ thống sẽ ghi nhận và thêm bài hát đó vào hồ sơ cá nhân của người dùng thành công.</w:t>
+            </w:r>
+          </w:p>
+          <w:p>
+            <w:pPr>
+              <w:widowControl w:val="0"/>
+              <w:numPr>
+                <w:numId w:val="0"/>
               </w:numPr>
               <w:ind w:leftChars="0"/>
               <w:jc w:val="both"/>
@@ -9502,259 +10311,34 @@
                 <w:vertAlign w:val="baseline"/>
                 <w:lang w:val="en-US"/>
               </w:rPr>
-              <w:t>Hệ thống hiện giao diện Khám phá bài hát thành công.</w:t>
-            </w:r>
-          </w:p>
-          <w:p>
-            <w:pPr>
-              <w:widowControl w:val="0"/>
-              <w:numPr>
-                <w:ilvl w:val="0"/>
-                <w:numId w:val="39"/>
-              </w:numPr>
-              <w:ind w:left="0" w:leftChars="0" w:firstLine="0" w:firstLineChars="0"/>
-              <w:jc w:val="both"/>
-              <w:rPr>
-                <w:rFonts w:hint="default"/>
-                <w:sz w:val="32"/>
-                <w:szCs w:val="32"/>
-                <w:vertAlign w:val="baseline"/>
-                <w:lang w:val="en-US"/>
-              </w:rPr>
-            </w:pPr>
-            <w:r>
-              <w:rPr>
-                <w:rFonts w:hint="default"/>
-                <w:sz w:val="32"/>
-                <w:szCs w:val="32"/>
-                <w:vertAlign w:val="baseline"/>
-                <w:lang w:val="en-US"/>
-              </w:rPr>
-              <w:t>Người dùng xem danh sách và tìm kiếm bài hát.</w:t>
-            </w:r>
-          </w:p>
-          <w:p>
-            <w:pPr>
-              <w:widowControl w:val="0"/>
-              <w:numPr>
-                <w:ilvl w:val="0"/>
-                <w:numId w:val="39"/>
-              </w:numPr>
-              <w:ind w:left="0" w:leftChars="0" w:firstLine="0" w:firstLineChars="0"/>
-              <w:jc w:val="both"/>
-              <w:rPr>
-                <w:rFonts w:hint="default"/>
-                <w:sz w:val="32"/>
-                <w:szCs w:val="32"/>
-                <w:vertAlign w:val="baseline"/>
-                <w:lang w:val="en-US"/>
-              </w:rPr>
-            </w:pPr>
-            <w:r>
-              <w:rPr>
-                <w:rFonts w:hint="default"/>
-                <w:sz w:val="32"/>
-                <w:szCs w:val="32"/>
-                <w:vertAlign w:val="baseline"/>
-                <w:lang w:val="en-US"/>
-              </w:rPr>
-              <w:t>Người dùng chọn 1 bài hát và có thể thực hiện các chức năng:</w:t>
-            </w:r>
-          </w:p>
-          <w:p>
-            <w:pPr>
-              <w:widowControl w:val="0"/>
-              <w:numPr>
-                <w:ilvl w:val="1"/>
-                <w:numId w:val="39"/>
-              </w:numPr>
-              <w:ind w:left="361" w:leftChars="0" w:firstLine="0" w:firstLineChars="0"/>
-              <w:jc w:val="both"/>
-              <w:rPr>
-                <w:rFonts w:hint="default"/>
-                <w:sz w:val="32"/>
-                <w:szCs w:val="32"/>
-                <w:vertAlign w:val="baseline"/>
-                <w:lang w:val="en-US"/>
-              </w:rPr>
-            </w:pPr>
-            <w:r>
-              <w:rPr>
-                <w:rFonts w:hint="default"/>
-                <w:sz w:val="32"/>
-                <w:szCs w:val="32"/>
-                <w:vertAlign w:val="baseline"/>
-                <w:lang w:val="en-US"/>
-              </w:rPr>
-              <w:t>Nghe nhạc (Chuyển sang Usecase Nghe nhạc)</w:t>
-            </w:r>
-          </w:p>
-          <w:p>
-            <w:pPr>
-              <w:widowControl w:val="0"/>
-              <w:numPr>
-                <w:ilvl w:val="1"/>
-                <w:numId w:val="39"/>
-              </w:numPr>
-              <w:ind w:left="361" w:leftChars="0" w:firstLine="0" w:firstLineChars="0"/>
-              <w:jc w:val="both"/>
-              <w:rPr>
-                <w:rFonts w:hint="default"/>
-                <w:sz w:val="32"/>
-                <w:szCs w:val="32"/>
-                <w:vertAlign w:val="baseline"/>
-                <w:lang w:val="en-US"/>
-              </w:rPr>
-            </w:pPr>
-            <w:r>
-              <w:rPr>
-                <w:rFonts w:hint="default"/>
-                <w:sz w:val="32"/>
-                <w:szCs w:val="32"/>
-                <w:vertAlign w:val="baseline"/>
-                <w:lang w:val="en-US"/>
-              </w:rPr>
-              <w:t>Thích bài hát: Hệ thống sẽ ghi nhận và thêm bài hát đó vào danh sách bài hát yêu thích của người dùng thành công.</w:t>
-            </w:r>
-          </w:p>
-          <w:p>
-            <w:pPr>
-              <w:widowControl w:val="0"/>
-              <w:numPr>
-                <w:ilvl w:val="1"/>
-                <w:numId w:val="39"/>
-              </w:numPr>
-              <w:ind w:left="361" w:leftChars="0" w:firstLine="0" w:firstLineChars="0"/>
-              <w:jc w:val="both"/>
-              <w:rPr>
-                <w:rFonts w:hint="default"/>
-                <w:sz w:val="32"/>
-                <w:szCs w:val="32"/>
-                <w:vertAlign w:val="baseline"/>
-                <w:lang w:val="en-US"/>
-              </w:rPr>
-            </w:pPr>
-            <w:r>
-              <w:rPr>
-                <w:rFonts w:hint="default"/>
-                <w:sz w:val="32"/>
-                <w:szCs w:val="32"/>
-                <w:vertAlign w:val="baseline"/>
-                <w:lang w:val="en-US"/>
-              </w:rPr>
-              <w:t>Bình luận bài hát: Hệ thống sẽ hiện khung để người dùng nhập bình luận, người dùng nhập xong và nhấn Gửi, hệ thống sẽ ghi nhận và hiện bình luận của người dùng trong danh sách bình luận của bài hát thành công.</w:t>
-            </w:r>
-          </w:p>
-          <w:p>
-            <w:pPr>
-              <w:widowControl w:val="0"/>
-              <w:numPr>
-                <w:ilvl w:val="1"/>
-                <w:numId w:val="39"/>
-              </w:numPr>
-              <w:ind w:left="361" w:leftChars="0" w:firstLine="0" w:firstLineChars="0"/>
-              <w:jc w:val="both"/>
-              <w:rPr>
-                <w:rFonts w:hint="default"/>
-                <w:sz w:val="32"/>
-                <w:szCs w:val="32"/>
-                <w:vertAlign w:val="baseline"/>
-                <w:lang w:val="en-US"/>
-              </w:rPr>
-            </w:pPr>
-            <w:r>
-              <w:rPr>
-                <w:rFonts w:hint="default"/>
-                <w:sz w:val="32"/>
-                <w:szCs w:val="32"/>
-                <w:vertAlign w:val="baseline"/>
-                <w:lang w:val="en-US"/>
-              </w:rPr>
-              <w:t>Chia sẻ bài hát (Chuyển sang Usecase Chia sẻ bài hát)</w:t>
-            </w:r>
-          </w:p>
-          <w:p>
-            <w:pPr>
-              <w:widowControl w:val="0"/>
-              <w:numPr>
-                <w:ilvl w:val="1"/>
-                <w:numId w:val="39"/>
-              </w:numPr>
-              <w:ind w:left="361" w:leftChars="0" w:firstLine="0" w:firstLineChars="0"/>
-              <w:jc w:val="both"/>
-              <w:rPr>
-                <w:rFonts w:hint="default"/>
-                <w:sz w:val="32"/>
-                <w:szCs w:val="32"/>
-                <w:vertAlign w:val="baseline"/>
-                <w:lang w:val="en-US"/>
-              </w:rPr>
-            </w:pPr>
-            <w:r>
-              <w:rPr>
-                <w:rFonts w:hint="default"/>
-                <w:sz w:val="32"/>
-                <w:szCs w:val="32"/>
-                <w:vertAlign w:val="baseline"/>
-                <w:lang w:val="en-US"/>
-              </w:rPr>
-              <w:t>Đăng lại bài hát: Hệ thống sẽ ghi nhận và thêm bài hát đó vào hồ sơ cá nhân của người dùng thành công.</w:t>
-            </w:r>
-          </w:p>
-          <w:p>
-            <w:pPr>
-              <w:widowControl w:val="0"/>
-              <w:numPr>
-                <w:ilvl w:val="0"/>
-                <w:numId w:val="39"/>
-              </w:numPr>
-              <w:ind w:left="0" w:leftChars="0" w:firstLine="0" w:firstLineChars="0"/>
-              <w:jc w:val="both"/>
-              <w:rPr>
-                <w:rFonts w:hint="default"/>
-                <w:sz w:val="32"/>
-                <w:szCs w:val="32"/>
-                <w:vertAlign w:val="baseline"/>
-                <w:lang w:val="en-US"/>
-              </w:rPr>
-            </w:pPr>
-            <w:r>
-              <w:rPr>
-                <w:rFonts w:hint="default"/>
-                <w:sz w:val="32"/>
-                <w:szCs w:val="32"/>
-                <w:vertAlign w:val="baseline"/>
-                <w:lang w:val="en-US"/>
-              </w:rPr>
-              <w:t>Hệ thống ghi nhận hành động của người dùng thành công.</w:t>
-            </w:r>
-          </w:p>
-          <w:p>
-            <w:pPr>
-              <w:widowControl w:val="0"/>
-              <w:numPr>
-                <w:ilvl w:val="0"/>
-                <w:numId w:val="39"/>
-              </w:numPr>
-              <w:ind w:left="0" w:leftChars="0" w:firstLine="0" w:firstLineChars="0"/>
-              <w:jc w:val="both"/>
-              <w:rPr>
-                <w:rFonts w:hint="default"/>
-                <w:sz w:val="32"/>
-                <w:szCs w:val="32"/>
-                <w:vertAlign w:val="baseline"/>
-                <w:lang w:val="en-US"/>
-              </w:rPr>
-            </w:pPr>
-            <w:r>
-              <w:rPr>
-                <w:rFonts w:hint="default"/>
-                <w:sz w:val="32"/>
-                <w:szCs w:val="32"/>
-                <w:vertAlign w:val="baseline"/>
-                <w:lang w:val="en-US"/>
-              </w:rPr>
-              <w:t>Hệ thống cập nhật số lượt tương tác của bài hát thành công.</w:t>
+              <w:t>4. Hệ thống ghi nhận hành động của người dùng thành công.</w:t>
+            </w:r>
+          </w:p>
+          <w:p>
+            <w:pPr>
+              <w:widowControl w:val="0"/>
+              <w:numPr>
+                <w:numId w:val="0"/>
+              </w:numPr>
+              <w:ind w:leftChars="0"/>
+              <w:jc w:val="both"/>
+              <w:rPr>
+                <w:rFonts w:hint="default"/>
+                <w:sz w:val="32"/>
+                <w:szCs w:val="32"/>
+                <w:vertAlign w:val="baseline"/>
+                <w:lang w:val="en-US"/>
+              </w:rPr>
+            </w:pPr>
+            <w:r>
+              <w:rPr>
+                <w:rFonts w:hint="default"/>
+                <w:sz w:val="32"/>
+                <w:szCs w:val="32"/>
+                <w:vertAlign w:val="baseline"/>
+                <w:lang w:val="en-US"/>
+              </w:rPr>
+              <w:t>5. Hệ thống cập nhật số lượt tương tác của bài hát thành công.</w:t>
             </w:r>
           </w:p>
         </w:tc>
@@ -9881,7 +10465,7 @@
               <w:widowControl w:val="0"/>
               <w:numPr>
                 <w:ilvl w:val="0"/>
-                <w:numId w:val="41"/>
+                <w:numId w:val="44"/>
               </w:numPr>
               <w:jc w:val="both"/>
               <w:rPr>
@@ -9954,7 +10538,7 @@
               <w:widowControl w:val="0"/>
               <w:numPr>
                 <w:ilvl w:val="0"/>
-                <w:numId w:val="42"/>
+                <w:numId w:val="45"/>
               </w:numPr>
               <w:jc w:val="both"/>
               <w:rPr>
@@ -10127,7 +10711,7 @@
               <w:widowControl w:val="0"/>
               <w:numPr>
                 <w:ilvl w:val="0"/>
-                <w:numId w:val="43"/>
+                <w:numId w:val="46"/>
               </w:numPr>
               <w:jc w:val="both"/>
               <w:rPr>
@@ -10154,7 +10738,7 @@
               <w:widowControl w:val="0"/>
               <w:numPr>
                 <w:ilvl w:val="0"/>
-                <w:numId w:val="43"/>
+                <w:numId w:val="46"/>
               </w:numPr>
               <w:ind w:left="0" w:leftChars="0" w:firstLine="0" w:firstLineChars="0"/>
               <w:jc w:val="both"/>
@@ -10182,7 +10766,7 @@
               <w:widowControl w:val="0"/>
               <w:numPr>
                 <w:ilvl w:val="0"/>
-                <w:numId w:val="43"/>
+                <w:numId w:val="46"/>
               </w:numPr>
               <w:ind w:left="0" w:leftChars="0" w:firstLine="0" w:firstLineChars="0"/>
               <w:jc w:val="both"/>
@@ -10210,7 +10794,7 @@
               <w:widowControl w:val="0"/>
               <w:numPr>
                 <w:ilvl w:val="0"/>
-                <w:numId w:val="43"/>
+                <w:numId w:val="46"/>
               </w:numPr>
               <w:ind w:left="0" w:leftChars="0" w:firstLine="0" w:firstLineChars="0"/>
               <w:jc w:val="both"/>
@@ -10238,7 +10822,7 @@
               <w:widowControl w:val="0"/>
               <w:numPr>
                 <w:ilvl w:val="0"/>
-                <w:numId w:val="43"/>
+                <w:numId w:val="46"/>
               </w:numPr>
               <w:ind w:left="0" w:leftChars="0" w:firstLine="0" w:firstLineChars="0"/>
               <w:jc w:val="both"/>
@@ -10266,7 +10850,7 @@
               <w:widowControl w:val="0"/>
               <w:numPr>
                 <w:ilvl w:val="0"/>
-                <w:numId w:val="43"/>
+                <w:numId w:val="46"/>
               </w:numPr>
               <w:ind w:left="0" w:leftChars="0" w:firstLine="0" w:firstLineChars="0"/>
               <w:jc w:val="both"/>
@@ -10413,7 +10997,7 @@
               <w:widowControl w:val="0"/>
               <w:numPr>
                 <w:ilvl w:val="0"/>
-                <w:numId w:val="44"/>
+                <w:numId w:val="47"/>
               </w:numPr>
               <w:jc w:val="both"/>
               <w:rPr>
@@ -10486,7 +11070,7 @@
               <w:widowControl w:val="0"/>
               <w:numPr>
                 <w:ilvl w:val="0"/>
-                <w:numId w:val="45"/>
+                <w:numId w:val="48"/>
               </w:numPr>
               <w:ind w:leftChars="0"/>
               <w:jc w:val="both"/>
@@ -10663,7 +11247,7 @@
               <w:widowControl w:val="0"/>
               <w:numPr>
                 <w:ilvl w:val="0"/>
-                <w:numId w:val="46"/>
+                <w:numId w:val="49"/>
               </w:numPr>
               <w:ind w:leftChars="0"/>
               <w:jc w:val="both"/>
@@ -10691,7 +11275,7 @@
               <w:widowControl w:val="0"/>
               <w:numPr>
                 <w:ilvl w:val="0"/>
-                <w:numId w:val="46"/>
+                <w:numId w:val="49"/>
               </w:numPr>
               <w:ind w:leftChars="0"/>
               <w:jc w:val="both"/>
@@ -10800,7 +11384,7 @@
               <w:widowControl w:val="0"/>
               <w:numPr>
                 <w:ilvl w:val="0"/>
-                <w:numId w:val="46"/>
+                <w:numId w:val="49"/>
               </w:numPr>
               <w:ind w:left="0" w:leftChars="0" w:firstLine="0" w:firstLineChars="0"/>
               <w:jc w:val="both"/>
@@ -10947,7 +11531,7 @@
               <w:widowControl w:val="0"/>
               <w:numPr>
                 <w:ilvl w:val="0"/>
-                <w:numId w:val="47"/>
+                <w:numId w:val="50"/>
               </w:numPr>
               <w:jc w:val="both"/>
               <w:rPr>
@@ -11020,7 +11604,7 @@
               <w:widowControl w:val="0"/>
               <w:numPr>
                 <w:ilvl w:val="0"/>
-                <w:numId w:val="48"/>
+                <w:numId w:val="51"/>
               </w:numPr>
               <w:ind w:leftChars="0"/>
               <w:jc w:val="both"/>
@@ -11197,7 +11781,7 @@
               <w:widowControl w:val="0"/>
               <w:numPr>
                 <w:ilvl w:val="0"/>
-                <w:numId w:val="49"/>
+                <w:numId w:val="52"/>
               </w:numPr>
               <w:jc w:val="both"/>
               <w:rPr>
@@ -11224,7 +11808,7 @@
               <w:widowControl w:val="0"/>
               <w:numPr>
                 <w:ilvl w:val="0"/>
-                <w:numId w:val="49"/>
+                <w:numId w:val="52"/>
               </w:numPr>
               <w:ind w:left="0" w:leftChars="0" w:firstLine="0" w:firstLineChars="0"/>
               <w:jc w:val="both"/>
@@ -11252,7 +11836,7 @@
               <w:widowControl w:val="0"/>
               <w:numPr>
                 <w:ilvl w:val="0"/>
-                <w:numId w:val="49"/>
+                <w:numId w:val="52"/>
               </w:numPr>
               <w:ind w:left="0" w:leftChars="0" w:firstLine="0" w:firstLineChars="0"/>
               <w:jc w:val="both"/>
@@ -11280,7 +11864,7 @@
               <w:widowControl w:val="0"/>
               <w:numPr>
                 <w:ilvl w:val="0"/>
-                <w:numId w:val="49"/>
+                <w:numId w:val="52"/>
               </w:numPr>
               <w:ind w:left="0" w:leftChars="0" w:firstLine="0" w:firstLineChars="0"/>
               <w:jc w:val="both"/>
@@ -11308,7 +11892,7 @@
               <w:widowControl w:val="0"/>
               <w:numPr>
                 <w:ilvl w:val="0"/>
-                <w:numId w:val="49"/>
+                <w:numId w:val="52"/>
               </w:numPr>
               <w:ind w:left="0" w:leftChars="0" w:firstLine="0" w:firstLineChars="0"/>
               <w:jc w:val="both"/>
@@ -11455,7 +12039,7 @@
               <w:widowControl w:val="0"/>
               <w:numPr>
                 <w:ilvl w:val="0"/>
-                <w:numId w:val="50"/>
+                <w:numId w:val="53"/>
               </w:numPr>
               <w:jc w:val="both"/>
               <w:rPr>
@@ -11528,7 +12112,7 @@
               <w:widowControl w:val="0"/>
               <w:numPr>
                 <w:ilvl w:val="0"/>
-                <w:numId w:val="51"/>
+                <w:numId w:val="54"/>
               </w:numPr>
               <w:jc w:val="both"/>
               <w:rPr>
@@ -11704,7 +12288,7 @@
               <w:widowControl w:val="0"/>
               <w:numPr>
                 <w:ilvl w:val="0"/>
-                <w:numId w:val="52"/>
+                <w:numId w:val="55"/>
               </w:numPr>
               <w:jc w:val="both"/>
               <w:rPr>
@@ -11731,7 +12315,7 @@
               <w:widowControl w:val="0"/>
               <w:numPr>
                 <w:ilvl w:val="0"/>
-                <w:numId w:val="52"/>
+                <w:numId w:val="55"/>
               </w:numPr>
               <w:ind w:left="0" w:leftChars="0" w:firstLine="0" w:firstLineChars="0"/>
               <w:jc w:val="both"/>
@@ -11759,7 +12343,7 @@
               <w:widowControl w:val="0"/>
               <w:numPr>
                 <w:ilvl w:val="0"/>
-                <w:numId w:val="52"/>
+                <w:numId w:val="55"/>
               </w:numPr>
               <w:ind w:left="0" w:leftChars="0" w:firstLine="0" w:firstLineChars="0"/>
               <w:jc w:val="both"/>
@@ -11787,7 +12371,7 @@
               <w:widowControl w:val="0"/>
               <w:numPr>
                 <w:ilvl w:val="0"/>
-                <w:numId w:val="52"/>
+                <w:numId w:val="55"/>
               </w:numPr>
               <w:ind w:left="0" w:leftChars="0" w:firstLine="0" w:firstLineChars="0"/>
               <w:jc w:val="both"/>
@@ -11815,7 +12399,7 @@
               <w:widowControl w:val="0"/>
               <w:numPr>
                 <w:ilvl w:val="0"/>
-                <w:numId w:val="52"/>
+                <w:numId w:val="55"/>
               </w:numPr>
               <w:ind w:left="0" w:leftChars="0" w:firstLine="0" w:firstLineChars="0"/>
               <w:jc w:val="both"/>
@@ -11962,7 +12546,7 @@
               <w:widowControl w:val="0"/>
               <w:numPr>
                 <w:ilvl w:val="0"/>
-                <w:numId w:val="53"/>
+                <w:numId w:val="56"/>
               </w:numPr>
               <w:jc w:val="both"/>
               <w:rPr>
@@ -12035,7 +12619,7 @@
               <w:widowControl w:val="0"/>
               <w:numPr>
                 <w:ilvl w:val="0"/>
-                <w:numId w:val="54"/>
+                <w:numId w:val="57"/>
               </w:numPr>
               <w:jc w:val="both"/>
               <w:rPr>
@@ -12211,7 +12795,7 @@
               <w:widowControl w:val="0"/>
               <w:numPr>
                 <w:ilvl w:val="0"/>
-                <w:numId w:val="55"/>
+                <w:numId w:val="58"/>
               </w:numPr>
               <w:jc w:val="both"/>
               <w:rPr>
@@ -12238,7 +12822,7 @@
               <w:widowControl w:val="0"/>
               <w:numPr>
                 <w:ilvl w:val="0"/>
-                <w:numId w:val="55"/>
+                <w:numId w:val="58"/>
               </w:numPr>
               <w:ind w:left="0" w:leftChars="0" w:firstLine="0" w:firstLineChars="0"/>
               <w:jc w:val="both"/>
@@ -12266,7 +12850,7 @@
               <w:widowControl w:val="0"/>
               <w:numPr>
                 <w:ilvl w:val="0"/>
-                <w:numId w:val="55"/>
+                <w:numId w:val="58"/>
               </w:numPr>
               <w:ind w:left="0" w:leftChars="0" w:firstLine="0" w:firstLineChars="0"/>
               <w:jc w:val="both"/>
@@ -12294,7 +12878,7 @@
               <w:widowControl w:val="0"/>
               <w:numPr>
                 <w:ilvl w:val="0"/>
-                <w:numId w:val="55"/>
+                <w:numId w:val="58"/>
               </w:numPr>
               <w:ind w:left="0" w:leftChars="0" w:firstLine="0" w:firstLineChars="0"/>
               <w:jc w:val="both"/>
@@ -12322,7 +12906,7 @@
               <w:widowControl w:val="0"/>
               <w:numPr>
                 <w:ilvl w:val="0"/>
-                <w:numId w:val="55"/>
+                <w:numId w:val="58"/>
               </w:numPr>
               <w:ind w:left="0" w:leftChars="0" w:firstLine="0" w:firstLineChars="0"/>
               <w:jc w:val="both"/>
@@ -12463,15 +13047,13 @@
               </w:rPr>
               <w:t xml:space="preserve">Tiền điều kiện: </w:t>
             </w:r>
-            <w:bookmarkStart w:id="0" w:name="_GoBack"/>
-            <w:bookmarkEnd w:id="0"/>
-          </w:p>
-          <w:p>
-            <w:pPr>
-              <w:widowControl w:val="0"/>
-              <w:numPr>
-                <w:ilvl w:val="0"/>
-                <w:numId w:val="56"/>
+          </w:p>
+          <w:p>
+            <w:pPr>
+              <w:widowControl w:val="0"/>
+              <w:numPr>
+                <w:ilvl w:val="0"/>
+                <w:numId w:val="59"/>
               </w:numPr>
               <w:jc w:val="both"/>
               <w:rPr>
@@ -12544,7 +13126,7 @@
               <w:widowControl w:val="0"/>
               <w:numPr>
                 <w:ilvl w:val="0"/>
-                <w:numId w:val="57"/>
+                <w:numId w:val="60"/>
               </w:numPr>
               <w:jc w:val="both"/>
               <w:rPr>
@@ -12720,7 +13302,7 @@
               <w:widowControl w:val="0"/>
               <w:numPr>
                 <w:ilvl w:val="0"/>
-                <w:numId w:val="58"/>
+                <w:numId w:val="61"/>
               </w:numPr>
               <w:jc w:val="both"/>
               <w:rPr>
@@ -12747,7 +13329,7 @@
               <w:widowControl w:val="0"/>
               <w:numPr>
                 <w:ilvl w:val="0"/>
-                <w:numId w:val="58"/>
+                <w:numId w:val="61"/>
               </w:numPr>
               <w:ind w:left="0" w:leftChars="0" w:firstLine="0" w:firstLineChars="0"/>
               <w:jc w:val="both"/>
@@ -12775,7 +13357,7 @@
               <w:widowControl w:val="0"/>
               <w:numPr>
                 <w:ilvl w:val="0"/>
-                <w:numId w:val="58"/>
+                <w:numId w:val="61"/>
               </w:numPr>
               <w:ind w:left="0" w:leftChars="0" w:firstLine="0" w:firstLineChars="0"/>
               <w:jc w:val="both"/>
@@ -12857,7 +13439,7 @@
               <w:widowControl w:val="0"/>
               <w:numPr>
                 <w:ilvl w:val="0"/>
-                <w:numId w:val="58"/>
+                <w:numId w:val="61"/>
               </w:numPr>
               <w:ind w:left="0" w:leftChars="0" w:firstLine="0" w:firstLineChars="0"/>
               <w:jc w:val="both"/>
@@ -13004,7 +13586,7 @@
               <w:widowControl w:val="0"/>
               <w:numPr>
                 <w:ilvl w:val="0"/>
-                <w:numId w:val="59"/>
+                <w:numId w:val="62"/>
               </w:numPr>
               <w:jc w:val="both"/>
               <w:rPr>
@@ -13077,7 +13659,7 @@
               <w:widowControl w:val="0"/>
               <w:numPr>
                 <w:ilvl w:val="0"/>
-                <w:numId w:val="60"/>
+                <w:numId w:val="63"/>
               </w:numPr>
               <w:jc w:val="both"/>
               <w:rPr>
@@ -13250,7 +13832,7 @@
               <w:widowControl w:val="0"/>
               <w:numPr>
                 <w:ilvl w:val="0"/>
-                <w:numId w:val="61"/>
+                <w:numId w:val="64"/>
               </w:numPr>
               <w:jc w:val="both"/>
               <w:rPr>
@@ -13277,7 +13859,7 @@
               <w:widowControl w:val="0"/>
               <w:numPr>
                 <w:ilvl w:val="0"/>
-                <w:numId w:val="61"/>
+                <w:numId w:val="64"/>
               </w:numPr>
               <w:ind w:left="0" w:leftChars="0" w:firstLine="0" w:firstLineChars="0"/>
               <w:jc w:val="both"/>
@@ -13305,7 +13887,7 @@
               <w:widowControl w:val="0"/>
               <w:numPr>
                 <w:ilvl w:val="0"/>
-                <w:numId w:val="61"/>
+                <w:numId w:val="64"/>
               </w:numPr>
               <w:ind w:left="0" w:leftChars="0" w:firstLine="0" w:firstLineChars="0"/>
               <w:jc w:val="both"/>
@@ -13333,7 +13915,7 @@
               <w:widowControl w:val="0"/>
               <w:numPr>
                 <w:ilvl w:val="0"/>
-                <w:numId w:val="61"/>
+                <w:numId w:val="64"/>
               </w:numPr>
               <w:ind w:left="0" w:leftChars="0" w:firstLine="0" w:firstLineChars="0"/>
               <w:jc w:val="both"/>
@@ -13361,7 +13943,7 @@
               <w:widowControl w:val="0"/>
               <w:numPr>
                 <w:ilvl w:val="0"/>
-                <w:numId w:val="61"/>
+                <w:numId w:val="64"/>
               </w:numPr>
               <w:ind w:left="0" w:leftChars="0" w:firstLine="0" w:firstLineChars="0"/>
               <w:jc w:val="both"/>
@@ -13508,7 +14090,7 @@
               <w:widowControl w:val="0"/>
               <w:numPr>
                 <w:ilvl w:val="0"/>
-                <w:numId w:val="62"/>
+                <w:numId w:val="65"/>
               </w:numPr>
               <w:jc w:val="both"/>
               <w:rPr>
@@ -13581,7 +14163,7 @@
               <w:widowControl w:val="0"/>
               <w:numPr>
                 <w:ilvl w:val="0"/>
-                <w:numId w:val="63"/>
+                <w:numId w:val="66"/>
               </w:numPr>
               <w:jc w:val="both"/>
               <w:rPr>
@@ -13669,12 +14251,6 @@
             <w:insideH w:val="single" w:color="auto" w:sz="4" w:space="0"/>
             <w:insideV w:val="single" w:color="auto" w:sz="4" w:space="0"/>
           </w:tblBorders>
-          <w:tblCellMar>
-            <w:top w:w="0" w:type="dxa"/>
-            <w:left w:w="108" w:type="dxa"/>
-            <w:bottom w:w="0" w:type="dxa"/>
-            <w:right w:w="108" w:type="dxa"/>
-          </w:tblCellMar>
         </w:tblPrEx>
         <w:tc>
           <w:tcPr>
@@ -13754,7 +14330,7 @@
               <w:widowControl w:val="0"/>
               <w:numPr>
                 <w:ilvl w:val="0"/>
-                <w:numId w:val="64"/>
+                <w:numId w:val="67"/>
               </w:numPr>
               <w:jc w:val="both"/>
               <w:rPr>
@@ -13781,7 +14357,7 @@
               <w:widowControl w:val="0"/>
               <w:numPr>
                 <w:ilvl w:val="0"/>
-                <w:numId w:val="64"/>
+                <w:numId w:val="67"/>
               </w:numPr>
               <w:ind w:left="0" w:leftChars="0" w:firstLine="0" w:firstLineChars="0"/>
               <w:jc w:val="both"/>
@@ -13809,7 +14385,7 @@
               <w:widowControl w:val="0"/>
               <w:numPr>
                 <w:ilvl w:val="0"/>
-                <w:numId w:val="64"/>
+                <w:numId w:val="67"/>
               </w:numPr>
               <w:ind w:left="0" w:leftChars="0" w:firstLine="0" w:firstLineChars="0"/>
               <w:jc w:val="both"/>
@@ -13837,7 +14413,7 @@
               <w:widowControl w:val="0"/>
               <w:numPr>
                 <w:ilvl w:val="0"/>
-                <w:numId w:val="64"/>
+                <w:numId w:val="67"/>
               </w:numPr>
               <w:ind w:left="0" w:leftChars="0" w:firstLine="0" w:firstLineChars="0"/>
               <w:jc w:val="both"/>
@@ -13984,7 +14560,7 @@
               <w:widowControl w:val="0"/>
               <w:numPr>
                 <w:ilvl w:val="0"/>
-                <w:numId w:val="65"/>
+                <w:numId w:val="68"/>
               </w:numPr>
               <w:jc w:val="both"/>
               <w:rPr>
@@ -14057,7 +14633,7 @@
               <w:widowControl w:val="0"/>
               <w:numPr>
                 <w:ilvl w:val="0"/>
-                <w:numId w:val="66"/>
+                <w:numId w:val="69"/>
               </w:numPr>
               <w:jc w:val="both"/>
               <w:rPr>
@@ -14230,7 +14806,7 @@
               <w:widowControl w:val="0"/>
               <w:numPr>
                 <w:ilvl w:val="0"/>
-                <w:numId w:val="67"/>
+                <w:numId w:val="70"/>
               </w:numPr>
               <w:jc w:val="both"/>
               <w:rPr>
@@ -14257,7 +14833,7 @@
               <w:widowControl w:val="0"/>
               <w:numPr>
                 <w:ilvl w:val="0"/>
-                <w:numId w:val="67"/>
+                <w:numId w:val="70"/>
               </w:numPr>
               <w:ind w:left="0" w:leftChars="0" w:firstLine="0" w:firstLineChars="0"/>
               <w:jc w:val="both"/>
@@ -14285,7 +14861,7 @@
               <w:widowControl w:val="0"/>
               <w:numPr>
                 <w:ilvl w:val="0"/>
-                <w:numId w:val="67"/>
+                <w:numId w:val="70"/>
               </w:numPr>
               <w:ind w:left="0" w:leftChars="0" w:firstLine="0" w:firstLineChars="0"/>
               <w:jc w:val="both"/>
@@ -14313,7 +14889,7 @@
               <w:widowControl w:val="0"/>
               <w:numPr>
                 <w:ilvl w:val="0"/>
-                <w:numId w:val="67"/>
+                <w:numId w:val="70"/>
               </w:numPr>
               <w:ind w:left="0" w:leftChars="0" w:firstLine="0" w:firstLineChars="0"/>
               <w:jc w:val="both"/>
@@ -14341,7 +14917,7 @@
               <w:widowControl w:val="0"/>
               <w:numPr>
                 <w:ilvl w:val="0"/>
-                <w:numId w:val="67"/>
+                <w:numId w:val="70"/>
               </w:numPr>
               <w:ind w:left="0" w:leftChars="0" w:firstLine="0" w:firstLineChars="0"/>
               <w:jc w:val="both"/>
@@ -14369,7 +14945,7 @@
               <w:widowControl w:val="0"/>
               <w:numPr>
                 <w:ilvl w:val="0"/>
-                <w:numId w:val="67"/>
+                <w:numId w:val="70"/>
               </w:numPr>
               <w:ind w:left="0" w:leftChars="0" w:firstLine="0" w:firstLineChars="0"/>
               <w:jc w:val="both"/>
@@ -14516,7 +15092,7 @@
               <w:widowControl w:val="0"/>
               <w:numPr>
                 <w:ilvl w:val="0"/>
-                <w:numId w:val="68"/>
+                <w:numId w:val="71"/>
               </w:numPr>
               <w:jc w:val="both"/>
               <w:rPr>
@@ -14589,7 +15165,7 @@
               <w:widowControl w:val="0"/>
               <w:numPr>
                 <w:ilvl w:val="0"/>
-                <w:numId w:val="69"/>
+                <w:numId w:val="72"/>
               </w:numPr>
               <w:jc w:val="both"/>
               <w:rPr>
@@ -14762,7 +15338,7 @@
               <w:widowControl w:val="0"/>
               <w:numPr>
                 <w:ilvl w:val="0"/>
-                <w:numId w:val="70"/>
+                <w:numId w:val="73"/>
               </w:numPr>
               <w:jc w:val="both"/>
               <w:rPr>
@@ -14789,7 +15365,7 @@
               <w:widowControl w:val="0"/>
               <w:numPr>
                 <w:ilvl w:val="0"/>
-                <w:numId w:val="70"/>
+                <w:numId w:val="73"/>
               </w:numPr>
               <w:ind w:left="0" w:leftChars="0" w:firstLine="0" w:firstLineChars="0"/>
               <w:jc w:val="both"/>
@@ -14817,7 +15393,7 @@
               <w:widowControl w:val="0"/>
               <w:numPr>
                 <w:ilvl w:val="0"/>
-                <w:numId w:val="70"/>
+                <w:numId w:val="73"/>
               </w:numPr>
               <w:ind w:left="0" w:leftChars="0" w:firstLine="0" w:firstLineChars="0"/>
               <w:jc w:val="both"/>
@@ -14929,7 +15505,7 @@
               <w:widowControl w:val="0"/>
               <w:numPr>
                 <w:ilvl w:val="0"/>
-                <w:numId w:val="70"/>
+                <w:numId w:val="73"/>
               </w:numPr>
               <w:ind w:left="0" w:leftChars="0" w:firstLine="0" w:firstLineChars="0"/>
               <w:jc w:val="both"/>
@@ -15076,7 +15652,7 @@
               <w:widowControl w:val="0"/>
               <w:numPr>
                 <w:ilvl w:val="0"/>
-                <w:numId w:val="71"/>
+                <w:numId w:val="74"/>
               </w:numPr>
               <w:jc w:val="both"/>
               <w:rPr>
@@ -15103,7 +15679,7 @@
               <w:widowControl w:val="0"/>
               <w:numPr>
                 <w:ilvl w:val="0"/>
-                <w:numId w:val="71"/>
+                <w:numId w:val="74"/>
               </w:numPr>
               <w:jc w:val="both"/>
               <w:rPr>
@@ -15176,7 +15752,7 @@
               <w:widowControl w:val="0"/>
               <w:numPr>
                 <w:ilvl w:val="0"/>
-                <w:numId w:val="72"/>
+                <w:numId w:val="75"/>
               </w:numPr>
               <w:ind w:leftChars="0"/>
               <w:jc w:val="both"/>
@@ -15350,7 +15926,7 @@
               <w:widowControl w:val="0"/>
               <w:numPr>
                 <w:ilvl w:val="0"/>
-                <w:numId w:val="73"/>
+                <w:numId w:val="76"/>
               </w:numPr>
               <w:jc w:val="both"/>
               <w:rPr>
@@ -15377,7 +15953,7 @@
               <w:widowControl w:val="0"/>
               <w:numPr>
                 <w:ilvl w:val="0"/>
-                <w:numId w:val="73"/>
+                <w:numId w:val="76"/>
               </w:numPr>
               <w:ind w:left="0" w:leftChars="0" w:firstLine="0" w:firstLineChars="0"/>
               <w:jc w:val="both"/>
@@ -15405,7 +15981,7 @@
               <w:widowControl w:val="0"/>
               <w:numPr>
                 <w:ilvl w:val="0"/>
-                <w:numId w:val="73"/>
+                <w:numId w:val="76"/>
               </w:numPr>
               <w:ind w:left="0" w:leftChars="0" w:firstLine="0" w:firstLineChars="0"/>
               <w:jc w:val="both"/>
@@ -15433,7 +16009,7 @@
               <w:widowControl w:val="0"/>
               <w:numPr>
                 <w:ilvl w:val="0"/>
-                <w:numId w:val="73"/>
+                <w:numId w:val="76"/>
               </w:numPr>
               <w:ind w:left="0" w:leftChars="0" w:firstLine="0" w:firstLineChars="0"/>
               <w:jc w:val="both"/>
@@ -15580,7 +16156,7 @@
               <w:widowControl w:val="0"/>
               <w:numPr>
                 <w:ilvl w:val="0"/>
-                <w:numId w:val="74"/>
+                <w:numId w:val="77"/>
               </w:numPr>
               <w:jc w:val="both"/>
               <w:rPr>
@@ -15653,7 +16229,7 @@
               <w:widowControl w:val="0"/>
               <w:numPr>
                 <w:ilvl w:val="0"/>
-                <w:numId w:val="75"/>
+                <w:numId w:val="78"/>
               </w:numPr>
               <w:ind w:leftChars="0"/>
               <w:jc w:val="both"/>
@@ -15827,7 +16403,7 @@
               <w:widowControl w:val="0"/>
               <w:numPr>
                 <w:ilvl w:val="0"/>
-                <w:numId w:val="76"/>
+                <w:numId w:val="79"/>
               </w:numPr>
               <w:jc w:val="both"/>
               <w:rPr>
@@ -15854,7 +16430,7 @@
               <w:widowControl w:val="0"/>
               <w:numPr>
                 <w:ilvl w:val="0"/>
-                <w:numId w:val="76"/>
+                <w:numId w:val="79"/>
               </w:numPr>
               <w:ind w:left="0" w:leftChars="0" w:firstLine="0" w:firstLineChars="0"/>
               <w:jc w:val="both"/>
@@ -15966,7 +16542,7 @@
               <w:widowControl w:val="0"/>
               <w:numPr>
                 <w:ilvl w:val="0"/>
-                <w:numId w:val="76"/>
+                <w:numId w:val="79"/>
               </w:numPr>
               <w:ind w:left="0" w:leftChars="0" w:firstLine="0" w:firstLineChars="0"/>
               <w:jc w:val="both"/>
@@ -16113,7 +16689,7 @@
               <w:widowControl w:val="0"/>
               <w:numPr>
                 <w:ilvl w:val="0"/>
-                <w:numId w:val="77"/>
+                <w:numId w:val="80"/>
               </w:numPr>
               <w:jc w:val="both"/>
               <w:rPr>
@@ -16140,7 +16716,7 @@
               <w:widowControl w:val="0"/>
               <w:numPr>
                 <w:ilvl w:val="0"/>
-                <w:numId w:val="77"/>
+                <w:numId w:val="80"/>
               </w:numPr>
               <w:ind w:left="0" w:leftChars="0" w:firstLine="0" w:firstLineChars="0"/>
               <w:jc w:val="both"/>
@@ -16214,7 +16790,7 @@
               <w:widowControl w:val="0"/>
               <w:numPr>
                 <w:ilvl w:val="0"/>
-                <w:numId w:val="78"/>
+                <w:numId w:val="81"/>
               </w:numPr>
               <w:ind w:leftChars="0"/>
               <w:jc w:val="both"/>
@@ -16388,7 +16964,7 @@
               <w:widowControl w:val="0"/>
               <w:numPr>
                 <w:ilvl w:val="0"/>
-                <w:numId w:val="79"/>
+                <w:numId w:val="82"/>
               </w:numPr>
               <w:jc w:val="both"/>
               <w:rPr>
@@ -16415,7 +16991,7 @@
               <w:widowControl w:val="0"/>
               <w:numPr>
                 <w:ilvl w:val="0"/>
-                <w:numId w:val="79"/>
+                <w:numId w:val="82"/>
               </w:numPr>
               <w:ind w:left="0" w:leftChars="0" w:firstLine="0" w:firstLineChars="0"/>
               <w:jc w:val="both"/>
@@ -16443,7 +17019,7 @@
               <w:widowControl w:val="0"/>
               <w:numPr>
                 <w:ilvl w:val="0"/>
-                <w:numId w:val="79"/>
+                <w:numId w:val="82"/>
               </w:numPr>
               <w:ind w:left="0" w:leftChars="0" w:firstLine="0" w:firstLineChars="0"/>
               <w:jc w:val="both"/>
@@ -16471,7 +17047,7 @@
               <w:widowControl w:val="0"/>
               <w:numPr>
                 <w:ilvl w:val="0"/>
-                <w:numId w:val="79"/>
+                <w:numId w:val="82"/>
               </w:numPr>
               <w:ind w:left="0" w:leftChars="0" w:firstLine="0" w:firstLineChars="0"/>
               <w:jc w:val="both"/>
@@ -16618,7 +17194,7 @@
               <w:widowControl w:val="0"/>
               <w:numPr>
                 <w:ilvl w:val="0"/>
-                <w:numId w:val="80"/>
+                <w:numId w:val="83"/>
               </w:numPr>
               <w:jc w:val="both"/>
               <w:rPr>
@@ -16691,7 +17267,7 @@
               <w:widowControl w:val="0"/>
               <w:numPr>
                 <w:ilvl w:val="0"/>
-                <w:numId w:val="81"/>
+                <w:numId w:val="84"/>
               </w:numPr>
               <w:jc w:val="both"/>
               <w:rPr>
@@ -16864,7 +17440,7 @@
               <w:widowControl w:val="0"/>
               <w:numPr>
                 <w:ilvl w:val="0"/>
-                <w:numId w:val="82"/>
+                <w:numId w:val="85"/>
               </w:numPr>
               <w:jc w:val="both"/>
               <w:rPr>
@@ -16891,7 +17467,7 @@
               <w:widowControl w:val="0"/>
               <w:numPr>
                 <w:ilvl w:val="0"/>
-                <w:numId w:val="82"/>
+                <w:numId w:val="85"/>
               </w:numPr>
               <w:ind w:left="0" w:leftChars="0" w:firstLine="0" w:firstLineChars="0"/>
               <w:jc w:val="both"/>
@@ -16919,7 +17495,7 @@
               <w:widowControl w:val="0"/>
               <w:numPr>
                 <w:ilvl w:val="0"/>
-                <w:numId w:val="82"/>
+                <w:numId w:val="85"/>
               </w:numPr>
               <w:ind w:left="0" w:leftChars="0" w:firstLine="0" w:firstLineChars="0"/>
               <w:jc w:val="both"/>
@@ -16947,7 +17523,7 @@
               <w:widowControl w:val="0"/>
               <w:numPr>
                 <w:ilvl w:val="0"/>
-                <w:numId w:val="82"/>
+                <w:numId w:val="85"/>
               </w:numPr>
               <w:ind w:left="0" w:leftChars="0" w:firstLine="0" w:firstLineChars="0"/>
               <w:jc w:val="both"/>
@@ -17021,7 +17597,7 @@
               <w:widowControl w:val="0"/>
               <w:numPr>
                 <w:ilvl w:val="0"/>
-                <w:numId w:val="83"/>
+                <w:numId w:val="86"/>
               </w:numPr>
               <w:jc w:val="both"/>
               <w:rPr>
@@ -17094,7 +17670,7 @@
               <w:widowControl w:val="0"/>
               <w:numPr>
                 <w:ilvl w:val="0"/>
-                <w:numId w:val="84"/>
+                <w:numId w:val="87"/>
               </w:numPr>
               <w:jc w:val="both"/>
               <w:rPr>
@@ -17167,7 +17743,7 @@
               <w:widowControl w:val="0"/>
               <w:numPr>
                 <w:ilvl w:val="0"/>
-                <w:numId w:val="85"/>
+                <w:numId w:val="88"/>
               </w:numPr>
               <w:ind w:leftChars="0"/>
               <w:jc w:val="both"/>
@@ -17994,6 +18570,18 @@
     </w:lvl>
   </w:abstractNum>
   <w:abstractNum w:abstractNumId="24">
+    <w:nsid w:val="C61AA0C7"/>
+    <w:multiLevelType w:val="singleLevel"/>
+    <w:tmpl w:val="C61AA0C7"/>
+    <w:lvl w:ilvl="0" w:tentative="0">
+      <w:start w:val="1"/>
+      <w:numFmt w:val="decimal"/>
+      <w:suff w:val="space"/>
+      <w:lvlText w:val="%1."/>
+      <w:lvlJc w:val="left"/>
+    </w:lvl>
+  </w:abstractNum>
+  <w:abstractNum w:abstractNumId="25">
     <w:nsid w:val="C6E4017A"/>
     <w:multiLevelType w:val="singleLevel"/>
     <w:tmpl w:val="C6E4017A"/>
@@ -18005,7 +18593,7 @@
       <w:lvlJc w:val="left"/>
     </w:lvl>
   </w:abstractNum>
-  <w:abstractNum w:abstractNumId="25">
+  <w:abstractNum w:abstractNumId="26">
     <w:nsid w:val="C878FD22"/>
     <w:multiLevelType w:val="singleLevel"/>
     <w:tmpl w:val="C878FD22"/>
@@ -18017,7 +18605,7 @@
       <w:lvlJc w:val="left"/>
     </w:lvl>
   </w:abstractNum>
-  <w:abstractNum w:abstractNumId="26">
+  <w:abstractNum w:abstractNumId="27">
     <w:nsid w:val="CAD6F3E4"/>
     <w:multiLevelType w:val="singleLevel"/>
     <w:tmpl w:val="CAD6F3E4"/>
@@ -18029,7 +18617,7 @@
       <w:lvlJc w:val="left"/>
     </w:lvl>
   </w:abstractNum>
-  <w:abstractNum w:abstractNumId="27">
+  <w:abstractNum w:abstractNumId="28">
     <w:nsid w:val="CBEC66A5"/>
     <w:multiLevelType w:val="singleLevel"/>
     <w:tmpl w:val="CBEC66A5"/>
@@ -18041,7 +18629,7 @@
       <w:lvlJc w:val="left"/>
     </w:lvl>
   </w:abstractNum>
-  <w:abstractNum w:abstractNumId="28">
+  <w:abstractNum w:abstractNumId="29">
     <w:nsid w:val="CE762D04"/>
     <w:multiLevelType w:val="multilevel"/>
     <w:tmpl w:val="CE762D04"/>
@@ -18157,7 +18745,7 @@
       </w:rPr>
     </w:lvl>
   </w:abstractNum>
-  <w:abstractNum w:abstractNumId="29">
+  <w:abstractNum w:abstractNumId="30">
     <w:nsid w:val="CFB556DD"/>
     <w:multiLevelType w:val="multilevel"/>
     <w:tmpl w:val="CFB556DD"/>
@@ -18273,7 +18861,7 @@
       </w:rPr>
     </w:lvl>
   </w:abstractNum>
-  <w:abstractNum w:abstractNumId="30">
+  <w:abstractNum w:abstractNumId="31">
     <w:nsid w:val="D205B8E8"/>
     <w:multiLevelType w:val="singleLevel"/>
     <w:tmpl w:val="D205B8E8"/>
@@ -18285,7 +18873,7 @@
       <w:lvlJc w:val="left"/>
     </w:lvl>
   </w:abstractNum>
-  <w:abstractNum w:abstractNumId="31">
+  <w:abstractNum w:abstractNumId="32">
     <w:nsid w:val="D4A79DA9"/>
     <w:multiLevelType w:val="multilevel"/>
     <w:tmpl w:val="D4A79DA9"/>
@@ -18425,7 +19013,7 @@
       </w:rPr>
     </w:lvl>
   </w:abstractNum>
-  <w:abstractNum w:abstractNumId="32">
+  <w:abstractNum w:abstractNumId="33">
     <w:nsid w:val="D5A94411"/>
     <w:multiLevelType w:val="singleLevel"/>
     <w:tmpl w:val="D5A94411"/>
@@ -18437,7 +19025,7 @@
       <w:lvlJc w:val="left"/>
     </w:lvl>
   </w:abstractNum>
-  <w:abstractNum w:abstractNumId="33">
+  <w:abstractNum w:abstractNumId="34">
     <w:nsid w:val="D84C24CF"/>
     <w:multiLevelType w:val="singleLevel"/>
     <w:tmpl w:val="D84C24CF"/>
@@ -18449,9 +19037,9 @@
       <w:lvlJc w:val="left"/>
     </w:lvl>
   </w:abstractNum>
-  <w:abstractNum w:abstractNumId="34">
+  <w:abstractNum w:abstractNumId="35">
     <w:nsid w:val="E109609F"/>
-    <w:multiLevelType w:val="singleLevel"/>
+    <w:multiLevelType w:val="multilevel"/>
     <w:tmpl w:val="E109609F"/>
     <w:lvl w:ilvl="0" w:tentative="0">
       <w:start w:val="1"/>
@@ -18460,8 +19048,112 @@
       <w:lvlText w:val="%1."/>
       <w:lvlJc w:val="left"/>
     </w:lvl>
+    <w:lvl w:ilvl="1" w:tentative="0">
+      <w:start w:val="1"/>
+      <w:numFmt w:val="decimal"/>
+      <w:suff w:val="space"/>
+      <w:lvlText w:val="%1.%2"/>
+      <w:lvlJc w:val="left"/>
+      <w:pPr>
+        <w:ind w:left="0" w:leftChars="0" w:firstLine="0" w:firstLineChars="0"/>
+      </w:pPr>
+      <w:rPr>
+        <w:rFonts w:hint="default"/>
+      </w:rPr>
+    </w:lvl>
+    <w:lvl w:ilvl="2" w:tentative="0">
+      <w:start w:val="1"/>
+      <w:numFmt w:val="decimal"/>
+      <w:suff w:val="space"/>
+      <w:lvlText w:val="%1.%2.%3"/>
+      <w:lvlJc w:val="left"/>
+      <w:pPr>
+        <w:ind w:left="0" w:leftChars="0" w:firstLine="0" w:firstLineChars="0"/>
+      </w:pPr>
+      <w:rPr>
+        <w:rFonts w:hint="default"/>
+      </w:rPr>
+    </w:lvl>
+    <w:lvl w:ilvl="3" w:tentative="0">
+      <w:start w:val="1"/>
+      <w:numFmt w:val="decimal"/>
+      <w:suff w:val="space"/>
+      <w:lvlText w:val="%1.%2.%3.%4"/>
+      <w:lvlJc w:val="left"/>
+      <w:pPr>
+        <w:ind w:left="0" w:leftChars="0" w:firstLine="0" w:firstLineChars="0"/>
+      </w:pPr>
+      <w:rPr>
+        <w:rFonts w:hint="default"/>
+      </w:rPr>
+    </w:lvl>
+    <w:lvl w:ilvl="4" w:tentative="0">
+      <w:start w:val="1"/>
+      <w:numFmt w:val="decimal"/>
+      <w:suff w:val="space"/>
+      <w:lvlText w:val="%1.%2.%3.%4.%5"/>
+      <w:lvlJc w:val="left"/>
+      <w:pPr>
+        <w:ind w:left="0" w:leftChars="0" w:firstLine="0" w:firstLineChars="0"/>
+      </w:pPr>
+      <w:rPr>
+        <w:rFonts w:hint="default"/>
+      </w:rPr>
+    </w:lvl>
+    <w:lvl w:ilvl="5" w:tentative="0">
+      <w:start w:val="1"/>
+      <w:numFmt w:val="decimal"/>
+      <w:suff w:val="space"/>
+      <w:lvlText w:val="%1.%2.%3.%4.%5.%6"/>
+      <w:lvlJc w:val="left"/>
+      <w:pPr>
+        <w:ind w:left="0" w:leftChars="0" w:firstLine="0" w:firstLineChars="0"/>
+      </w:pPr>
+      <w:rPr>
+        <w:rFonts w:hint="default"/>
+      </w:rPr>
+    </w:lvl>
+    <w:lvl w:ilvl="6" w:tentative="0">
+      <w:start w:val="1"/>
+      <w:numFmt w:val="decimal"/>
+      <w:suff w:val="space"/>
+      <w:lvlText w:val="%1.%2.%3.%4.%5.%6.%7"/>
+      <w:lvlJc w:val="left"/>
+      <w:pPr>
+        <w:ind w:left="0" w:leftChars="0" w:firstLine="0" w:firstLineChars="0"/>
+      </w:pPr>
+      <w:rPr>
+        <w:rFonts w:hint="default"/>
+      </w:rPr>
+    </w:lvl>
+    <w:lvl w:ilvl="7" w:tentative="0">
+      <w:start w:val="1"/>
+      <w:numFmt w:val="decimal"/>
+      <w:suff w:val="space"/>
+      <w:lvlText w:val="%1.%2.%3.%4.%5.%6.%7.%8"/>
+      <w:lvlJc w:val="left"/>
+      <w:pPr>
+        <w:ind w:left="0" w:leftChars="0" w:firstLine="0" w:firstLineChars="0"/>
+      </w:pPr>
+      <w:rPr>
+        <w:rFonts w:hint="default"/>
+      </w:rPr>
+    </w:lvl>
+    <w:lvl w:ilvl="8" w:tentative="0">
+      <w:start w:val="1"/>
+      <w:numFmt w:val="decimal"/>
+      <w:suff w:val="space"/>
+      <w:lvlText w:val="%1.%2.%3.%4.%5.%6.%7.%8.%9"/>
+      <w:lvlJc w:val="left"/>
+      <w:pPr>
+        <w:ind w:left="0" w:leftChars="0" w:firstLine="0" w:firstLineChars="0"/>
+      </w:pPr>
+      <w:rPr>
+        <w:rFonts w:hint="default"/>
+      </w:rPr>
+    </w:lvl>
   </w:abstractNum>
-  <w:abstractNum w:abstractNumId="35">
+  <w:abstractNum w:abstractNumId="36">
     <w:nsid w:val="E17C0C88"/>
     <w:multiLevelType w:val="singleLevel"/>
     <w:tmpl w:val="E17C0C88"/>
@@ -18473,7 +19165,7 @@
       <w:lvlJc w:val="left"/>
     </w:lvl>
   </w:abstractNum>
-  <w:abstractNum w:abstractNumId="36">
+  <w:abstractNum w:abstractNumId="37">
     <w:nsid w:val="E89A39E4"/>
     <w:multiLevelType w:val="singleLevel"/>
     <w:tmpl w:val="E89A39E4"/>
@@ -18485,7 +19177,7 @@
       <w:lvlJc w:val="left"/>
     </w:lvl>
   </w:abstractNum>
-  <w:abstractNum w:abstractNumId="37">
+  <w:abstractNum w:abstractNumId="38">
     <w:nsid w:val="E8BBC779"/>
     <w:multiLevelType w:val="singleLevel"/>
     <w:tmpl w:val="E8BBC779"/>
@@ -18497,7 +19189,7 @@
       <w:lvlJc w:val="left"/>
     </w:lvl>
   </w:abstractNum>
-  <w:abstractNum w:abstractNumId="38">
+  <w:abstractNum w:abstractNumId="39">
     <w:nsid w:val="E9767898"/>
     <w:multiLevelType w:val="singleLevel"/>
     <w:tmpl w:val="E9767898"/>
@@ -18509,7 +19201,7 @@
       <w:lvlJc w:val="left"/>
     </w:lvl>
   </w:abstractNum>
-  <w:abstractNum w:abstractNumId="39">
+  <w:abstractNum w:abstractNumId="40">
     <w:nsid w:val="EA14CDEE"/>
     <w:multiLevelType w:val="singleLevel"/>
     <w:tmpl w:val="EA14CDEE"/>
@@ -18521,7 +19213,7 @@
       <w:lvlJc w:val="left"/>
     </w:lvl>
   </w:abstractNum>
-  <w:abstractNum w:abstractNumId="40">
+  <w:abstractNum w:abstractNumId="41">
     <w:nsid w:val="FC29D630"/>
     <w:multiLevelType w:val="singleLevel"/>
     <w:tmpl w:val="FC29D630"/>
@@ -18533,7 +19225,7 @@
       <w:lvlJc w:val="left"/>
     </w:lvl>
   </w:abstractNum>
-  <w:abstractNum w:abstractNumId="41">
+  <w:abstractNum w:abstractNumId="42">
     <w:nsid w:val="FE24A8A4"/>
     <w:multiLevelType w:val="singleLevel"/>
     <w:tmpl w:val="FE24A8A4"/>
@@ -18545,7 +19237,7 @@
       <w:lvlJc w:val="left"/>
     </w:lvl>
   </w:abstractNum>
-  <w:abstractNum w:abstractNumId="42">
+  <w:abstractNum w:abstractNumId="43">
     <w:nsid w:val="FE343E4B"/>
     <w:multiLevelType w:val="singleLevel"/>
     <w:tmpl w:val="FE343E4B"/>
@@ -18557,7 +19249,19 @@
       <w:lvlJc w:val="left"/>
     </w:lvl>
   </w:abstractNum>
-  <w:abstractNum w:abstractNumId="43">
+  <w:abstractNum w:abstractNumId="44">
+    <w:nsid w:val="006DE1F7"/>
+    <w:multiLevelType w:val="singleLevel"/>
+    <w:tmpl w:val="006DE1F7"/>
+    <w:lvl w:ilvl="0" w:tentative="0">
+      <w:start w:val="1"/>
+      <w:numFmt w:val="decimal"/>
+      <w:suff w:val="space"/>
+      <w:lvlText w:val="%1."/>
+      <w:lvlJc w:val="left"/>
+    </w:lvl>
+  </w:abstractNum>
+  <w:abstractNum w:abstractNumId="45">
     <w:nsid w:val="09005923"/>
     <w:multiLevelType w:val="singleLevel"/>
     <w:tmpl w:val="09005923"/>
@@ -18569,7 +19273,7 @@
       <w:lvlJc w:val="left"/>
     </w:lvl>
   </w:abstractNum>
-  <w:abstractNum w:abstractNumId="44">
+  <w:abstractNum w:abstractNumId="46">
     <w:nsid w:val="0A7C2C92"/>
     <w:multiLevelType w:val="singleLevel"/>
     <w:tmpl w:val="0A7C2C92"/>
@@ -18581,7 +19285,7 @@
       <w:lvlJc w:val="left"/>
     </w:lvl>
   </w:abstractNum>
-  <w:abstractNum w:abstractNumId="45">
+  <w:abstractNum w:abstractNumId="47">
     <w:nsid w:val="0CD92811"/>
     <w:multiLevelType w:val="singleLevel"/>
     <w:tmpl w:val="0CD92811"/>
@@ -18593,7 +19297,7 @@
       <w:lvlJc w:val="left"/>
     </w:lvl>
   </w:abstractNum>
-  <w:abstractNum w:abstractNumId="46">
+  <w:abstractNum w:abstractNumId="48">
     <w:nsid w:val="11CC49F7"/>
     <w:multiLevelType w:val="singleLevel"/>
     <w:tmpl w:val="11CC49F7"/>
@@ -18605,7 +19309,7 @@
       <w:lvlJc w:val="left"/>
     </w:lvl>
   </w:abstractNum>
-  <w:abstractNum w:abstractNumId="47">
+  <w:abstractNum w:abstractNumId="49">
     <w:nsid w:val="12E3D0E2"/>
     <w:multiLevelType w:val="singleLevel"/>
     <w:tmpl w:val="12E3D0E2"/>
@@ -18617,7 +19321,7 @@
       <w:lvlJc w:val="left"/>
     </w:lvl>
   </w:abstractNum>
-  <w:abstractNum w:abstractNumId="48">
+  <w:abstractNum w:abstractNumId="50">
     <w:nsid w:val="134283BD"/>
     <w:multiLevelType w:val="singleLevel"/>
     <w:tmpl w:val="134283BD"/>
@@ -18629,7 +19333,7 @@
       <w:lvlJc w:val="left"/>
     </w:lvl>
   </w:abstractNum>
-  <w:abstractNum w:abstractNumId="49">
+  <w:abstractNum w:abstractNumId="51">
     <w:nsid w:val="18501BFC"/>
     <w:multiLevelType w:val="singleLevel"/>
     <w:tmpl w:val="18501BFC"/>
@@ -18641,7 +19345,7 @@
       <w:lvlJc w:val="left"/>
     </w:lvl>
   </w:abstractNum>
-  <w:abstractNum w:abstractNumId="50">
+  <w:abstractNum w:abstractNumId="52">
     <w:nsid w:val="211769BA"/>
     <w:multiLevelType w:val="singleLevel"/>
     <w:tmpl w:val="211769BA"/>
@@ -18653,7 +19357,7 @@
       <w:lvlJc w:val="left"/>
     </w:lvl>
   </w:abstractNum>
-  <w:abstractNum w:abstractNumId="51">
+  <w:abstractNum w:abstractNumId="53">
     <w:nsid w:val="245C44B8"/>
     <w:multiLevelType w:val="singleLevel"/>
     <w:tmpl w:val="245C44B8"/>
@@ -18665,7 +19369,7 @@
       <w:lvlJc w:val="left"/>
     </w:lvl>
   </w:abstractNum>
-  <w:abstractNum w:abstractNumId="52">
+  <w:abstractNum w:abstractNumId="54">
     <w:nsid w:val="27D2B737"/>
     <w:multiLevelType w:val="singleLevel"/>
     <w:tmpl w:val="27D2B737"/>
@@ -18677,7 +19381,7 @@
       <w:lvlJc w:val="left"/>
     </w:lvl>
   </w:abstractNum>
-  <w:abstractNum w:abstractNumId="53">
+  <w:abstractNum w:abstractNumId="55">
     <w:nsid w:val="2DE852F7"/>
     <w:multiLevelType w:val="singleLevel"/>
     <w:tmpl w:val="2DE852F7"/>
@@ -18689,7 +19393,7 @@
       <w:lvlJc w:val="left"/>
     </w:lvl>
   </w:abstractNum>
-  <w:abstractNum w:abstractNumId="54">
+  <w:abstractNum w:abstractNumId="56">
     <w:nsid w:val="30AD9F26"/>
     <w:multiLevelType w:val="singleLevel"/>
     <w:tmpl w:val="30AD9F26"/>
@@ -18701,7 +19405,7 @@
       <w:lvlJc w:val="left"/>
     </w:lvl>
   </w:abstractNum>
-  <w:abstractNum w:abstractNumId="55">
+  <w:abstractNum w:abstractNumId="57">
     <w:nsid w:val="313FAB6F"/>
     <w:multiLevelType w:val="singleLevel"/>
     <w:tmpl w:val="313FAB6F"/>
@@ -18713,7 +19417,7 @@
       <w:lvlJc w:val="left"/>
     </w:lvl>
   </w:abstractNum>
-  <w:abstractNum w:abstractNumId="56">
+  <w:abstractNum w:abstractNumId="58">
     <w:nsid w:val="34247F98"/>
     <w:multiLevelType w:val="singleLevel"/>
     <w:tmpl w:val="34247F98"/>
@@ -18725,7 +19429,7 @@
       <w:lvlJc w:val="left"/>
     </w:lvl>
   </w:abstractNum>
-  <w:abstractNum w:abstractNumId="57">
+  <w:abstractNum w:abstractNumId="59">
     <w:nsid w:val="34ACC566"/>
     <w:multiLevelType w:val="singleLevel"/>
     <w:tmpl w:val="34ACC566"/>
@@ -18737,7 +19441,7 @@
       <w:lvlJc w:val="left"/>
     </w:lvl>
   </w:abstractNum>
-  <w:abstractNum w:abstractNumId="58">
+  <w:abstractNum w:abstractNumId="60">
     <w:nsid w:val="36D9EC17"/>
     <w:multiLevelType w:val="singleLevel"/>
     <w:tmpl w:val="36D9EC17"/>
@@ -18749,7 +19453,7 @@
       <w:lvlJc w:val="left"/>
     </w:lvl>
   </w:abstractNum>
-  <w:abstractNum w:abstractNumId="59">
+  <w:abstractNum w:abstractNumId="61">
     <w:nsid w:val="3915D7F5"/>
     <w:multiLevelType w:val="multilevel"/>
     <w:tmpl w:val="3915D7F5"/>
@@ -18865,7 +19569,7 @@
       </w:rPr>
     </w:lvl>
   </w:abstractNum>
-  <w:abstractNum w:abstractNumId="60">
+  <w:abstractNum w:abstractNumId="62">
     <w:nsid w:val="3A182B7F"/>
     <w:multiLevelType w:val="singleLevel"/>
     <w:tmpl w:val="3A182B7F"/>
@@ -18877,7 +19581,7 @@
       <w:lvlJc w:val="left"/>
     </w:lvl>
   </w:abstractNum>
-  <w:abstractNum w:abstractNumId="61">
+  <w:abstractNum w:abstractNumId="63">
     <w:nsid w:val="3B3BFDBA"/>
     <w:multiLevelType w:val="singleLevel"/>
     <w:tmpl w:val="3B3BFDBA"/>
@@ -18889,7 +19593,7 @@
       <w:lvlJc w:val="left"/>
     </w:lvl>
   </w:abstractNum>
-  <w:abstractNum w:abstractNumId="62">
+  <w:abstractNum w:abstractNumId="64">
     <w:nsid w:val="3CBCE474"/>
     <w:multiLevelType w:val="singleLevel"/>
     <w:tmpl w:val="3CBCE474"/>
@@ -18901,7 +19605,7 @@
       <w:lvlJc w:val="left"/>
     </w:lvl>
   </w:abstractNum>
-  <w:abstractNum w:abstractNumId="63">
+  <w:abstractNum w:abstractNumId="65">
     <w:nsid w:val="3CC99ABE"/>
     <w:multiLevelType w:val="singleLevel"/>
     <w:tmpl w:val="3CC99ABE"/>
@@ -18913,7 +19617,7 @@
       <w:lvlJc w:val="left"/>
     </w:lvl>
   </w:abstractNum>
-  <w:abstractNum w:abstractNumId="64">
+  <w:abstractNum w:abstractNumId="66">
     <w:nsid w:val="3D4BEBA8"/>
     <w:multiLevelType w:val="singleLevel"/>
     <w:tmpl w:val="3D4BEBA8"/>
@@ -18925,7 +19629,7 @@
       <w:lvlJc w:val="left"/>
     </w:lvl>
   </w:abstractNum>
-  <w:abstractNum w:abstractNumId="65">
+  <w:abstractNum w:abstractNumId="67">
     <w:nsid w:val="43814378"/>
     <w:multiLevelType w:val="singleLevel"/>
     <w:tmpl w:val="43814378"/>
@@ -18937,7 +19641,7 @@
       <w:lvlJc w:val="left"/>
     </w:lvl>
   </w:abstractNum>
-  <w:abstractNum w:abstractNumId="66">
+  <w:abstractNum w:abstractNumId="68">
     <w:nsid w:val="46D2EDB9"/>
     <w:multiLevelType w:val="multilevel"/>
     <w:tmpl w:val="46D2EDB9"/>
@@ -19077,7 +19781,7 @@
       </w:rPr>
     </w:lvl>
   </w:abstractNum>
-  <w:abstractNum w:abstractNumId="67">
+  <w:abstractNum w:abstractNumId="69">
     <w:nsid w:val="4F2E84C6"/>
     <w:multiLevelType w:val="singleLevel"/>
     <w:tmpl w:val="4F2E84C6"/>
@@ -19089,7 +19793,7 @@
       <w:lvlJc w:val="left"/>
     </w:lvl>
   </w:abstractNum>
-  <w:abstractNum w:abstractNumId="68">
+  <w:abstractNum w:abstractNumId="70">
     <w:nsid w:val="52BBEC1D"/>
     <w:multiLevelType w:val="singleLevel"/>
     <w:tmpl w:val="52BBEC1D"/>
@@ -19101,7 +19805,7 @@
       <w:lvlJc w:val="left"/>
     </w:lvl>
   </w:abstractNum>
-  <w:abstractNum w:abstractNumId="69">
+  <w:abstractNum w:abstractNumId="71">
     <w:nsid w:val="537CC0EA"/>
     <w:multiLevelType w:val="singleLevel"/>
     <w:tmpl w:val="537CC0EA"/>
@@ -19113,7 +19817,7 @@
       <w:lvlJc w:val="left"/>
     </w:lvl>
   </w:abstractNum>
-  <w:abstractNum w:abstractNumId="70">
+  <w:abstractNum w:abstractNumId="72">
     <w:nsid w:val="5823DDE9"/>
     <w:multiLevelType w:val="singleLevel"/>
     <w:tmpl w:val="5823DDE9"/>
@@ -19125,7 +19829,7 @@
       <w:lvlJc w:val="left"/>
     </w:lvl>
   </w:abstractNum>
-  <w:abstractNum w:abstractNumId="71">
+  <w:abstractNum w:abstractNumId="73">
     <w:nsid w:val="5973A4FA"/>
     <w:multiLevelType w:val="singleLevel"/>
     <w:tmpl w:val="5973A4FA"/>
@@ -19137,7 +19841,7 @@
       <w:lvlJc w:val="left"/>
     </w:lvl>
   </w:abstractNum>
-  <w:abstractNum w:abstractNumId="72">
+  <w:abstractNum w:abstractNumId="74">
     <w:nsid w:val="6024D89E"/>
     <w:multiLevelType w:val="singleLevel"/>
     <w:tmpl w:val="6024D89E"/>
@@ -19149,7 +19853,7 @@
       <w:lvlJc w:val="left"/>
     </w:lvl>
   </w:abstractNum>
-  <w:abstractNum w:abstractNumId="73">
+  <w:abstractNum w:abstractNumId="75">
     <w:nsid w:val="628F328F"/>
     <w:multiLevelType w:val="singleLevel"/>
     <w:tmpl w:val="628F328F"/>
@@ -19161,7 +19865,7 @@
       <w:lvlJc w:val="left"/>
     </w:lvl>
   </w:abstractNum>
-  <w:abstractNum w:abstractNumId="74">
+  <w:abstractNum w:abstractNumId="76">
     <w:nsid w:val="62FD1C74"/>
     <w:multiLevelType w:val="singleLevel"/>
     <w:tmpl w:val="62FD1C74"/>
@@ -19173,7 +19877,7 @@
       <w:lvlJc w:val="left"/>
     </w:lvl>
   </w:abstractNum>
-  <w:abstractNum w:abstractNumId="75">
+  <w:abstractNum w:abstractNumId="77">
     <w:nsid w:val="658783AF"/>
     <w:multiLevelType w:val="singleLevel"/>
     <w:tmpl w:val="658783AF"/>
@@ -19185,7 +19889,7 @@
       <w:lvlJc w:val="left"/>
     </w:lvl>
   </w:abstractNum>
-  <w:abstractNum w:abstractNumId="76">
+  <w:abstractNum w:abstractNumId="78">
     <w:nsid w:val="65A2A8DF"/>
     <w:multiLevelType w:val="singleLevel"/>
     <w:tmpl w:val="65A2A8DF"/>
@@ -19197,7 +19901,7 @@
       <w:lvlJc w:val="left"/>
     </w:lvl>
   </w:abstractNum>
-  <w:abstractNum w:abstractNumId="77">
+  <w:abstractNum w:abstractNumId="79">
     <w:nsid w:val="67A03EFF"/>
     <w:multiLevelType w:val="singleLevel"/>
     <w:tmpl w:val="67A03EFF"/>
@@ -19209,7 +19913,7 @@
       <w:lvlJc w:val="left"/>
     </w:lvl>
   </w:abstractNum>
-  <w:abstractNum w:abstractNumId="78">
+  <w:abstractNum w:abstractNumId="80">
     <w:nsid w:val="69C1C339"/>
     <w:multiLevelType w:val="singleLevel"/>
     <w:tmpl w:val="69C1C339"/>
@@ -19221,7 +19925,7 @@
       <w:lvlJc w:val="left"/>
     </w:lvl>
   </w:abstractNum>
-  <w:abstractNum w:abstractNumId="79">
+  <w:abstractNum w:abstractNumId="81">
     <w:nsid w:val="6AF88BFE"/>
     <w:multiLevelType w:val="singleLevel"/>
     <w:tmpl w:val="6AF88BFE"/>
@@ -19233,7 +19937,7 @@
       <w:lvlJc w:val="left"/>
     </w:lvl>
   </w:abstractNum>
-  <w:abstractNum w:abstractNumId="80">
+  <w:abstractNum w:abstractNumId="82">
     <w:nsid w:val="6DA991F1"/>
     <w:multiLevelType w:val="singleLevel"/>
     <w:tmpl w:val="6DA991F1"/>
@@ -19245,7 +19949,7 @@
       <w:lvlJc w:val="left"/>
     </w:lvl>
   </w:abstractNum>
-  <w:abstractNum w:abstractNumId="81">
+  <w:abstractNum w:abstractNumId="83">
     <w:nsid w:val="779FF94F"/>
     <w:multiLevelType w:val="singleLevel"/>
     <w:tmpl w:val="779FF94F"/>
@@ -19257,7 +19961,19 @@
       <w:lvlJc w:val="left"/>
     </w:lvl>
   </w:abstractNum>
-  <w:abstractNum w:abstractNumId="82">
+  <w:abstractNum w:abstractNumId="84">
+    <w:nsid w:val="77A760A7"/>
+    <w:multiLevelType w:val="singleLevel"/>
+    <w:tmpl w:val="77A760A7"/>
+    <w:lvl w:ilvl="0" w:tentative="0">
+      <w:start w:val="1"/>
+      <w:numFmt w:val="decimal"/>
+      <w:suff w:val="space"/>
+      <w:lvlText w:val="%1."/>
+      <w:lvlJc w:val="left"/>
+    </w:lvl>
+  </w:abstractNum>
+  <w:abstractNum w:abstractNumId="85">
     <w:nsid w:val="78DA9A54"/>
     <w:multiLevelType w:val="singleLevel"/>
     <w:tmpl w:val="78DA9A54"/>
@@ -19269,7 +19985,7 @@
       <w:lvlJc w:val="left"/>
     </w:lvl>
   </w:abstractNum>
-  <w:abstractNum w:abstractNumId="83">
+  <w:abstractNum w:abstractNumId="86">
     <w:nsid w:val="7CFEE648"/>
     <w:multiLevelType w:val="singleLevel"/>
     <w:tmpl w:val="7CFEE648"/>
@@ -19281,7 +19997,7 @@
       <w:lvlJc w:val="left"/>
     </w:lvl>
   </w:abstractNum>
-  <w:abstractNum w:abstractNumId="84">
+  <w:abstractNum w:abstractNumId="87">
     <w:nsid w:val="7EE9AE89"/>
     <w:multiLevelType w:val="singleLevel"/>
     <w:tmpl w:val="7EE9AE89"/>
@@ -19303,16 +20019,16 @@
     <w:abstractNumId w:val="18"/>
   </w:num>
   <w:num w:numId="4">
-    <w:abstractNumId w:val="31"/>
+    <w:abstractNumId w:val="32"/>
   </w:num>
   <w:num w:numId="5">
-    <w:abstractNumId w:val="66"/>
+    <w:abstractNumId w:val="68"/>
   </w:num>
   <w:num w:numId="6">
-    <w:abstractNumId w:val="61"/>
+    <w:abstractNumId w:val="63"/>
   </w:num>
   <w:num w:numId="7">
-    <w:abstractNumId w:val="36"/>
+    <w:abstractNumId w:val="37"/>
   </w:num>
   <w:num w:numId="8">
     <w:abstractNumId w:val="16"/>
@@ -19321,232 +20037,241 @@
     <w:abstractNumId w:val="17"/>
   </w:num>
   <w:num w:numId="10">
+    <w:abstractNumId w:val="51"/>
+  </w:num>
+  <w:num w:numId="11">
+    <w:abstractNumId w:val="76"/>
+  </w:num>
+  <w:num w:numId="12">
+    <w:abstractNumId w:val="35"/>
+  </w:num>
+  <w:num w:numId="13">
+    <w:abstractNumId w:val="38"/>
+  </w:num>
+  <w:num w:numId="14">
+    <w:abstractNumId w:val="74"/>
+  </w:num>
+  <w:num w:numId="15">
+    <w:abstractNumId w:val="39"/>
+  </w:num>
+  <w:num w:numId="16">
+    <w:abstractNumId w:val="0"/>
+  </w:num>
+  <w:num w:numId="17">
+    <w:abstractNumId w:val="75"/>
+  </w:num>
+  <w:num w:numId="18">
+    <w:abstractNumId w:val="15"/>
+  </w:num>
+  <w:num w:numId="19">
+    <w:abstractNumId w:val="59"/>
+  </w:num>
+  <w:num w:numId="20">
+    <w:abstractNumId w:val="45"/>
+  </w:num>
+  <w:num w:numId="21">
+    <w:abstractNumId w:val="29"/>
+  </w:num>
+  <w:num w:numId="22">
+    <w:abstractNumId w:val="30"/>
+  </w:num>
+  <w:num w:numId="23">
+    <w:abstractNumId w:val="81"/>
+  </w:num>
+  <w:num w:numId="24">
+    <w:abstractNumId w:val="47"/>
+  </w:num>
+  <w:num w:numId="25">
+    <w:abstractNumId w:val="87"/>
+  </w:num>
+  <w:num w:numId="26">
+    <w:abstractNumId w:val="86"/>
+  </w:num>
+  <w:num w:numId="27">
+    <w:abstractNumId w:val="71"/>
+  </w:num>
+  <w:num w:numId="28">
+    <w:abstractNumId w:val="6"/>
+  </w:num>
+  <w:num w:numId="29">
+    <w:abstractNumId w:val="40"/>
+  </w:num>
+  <w:num w:numId="30">
+    <w:abstractNumId w:val="36"/>
+  </w:num>
+  <w:num w:numId="31">
+    <w:abstractNumId w:val="77"/>
+  </w:num>
+  <w:num w:numId="32">
+    <w:abstractNumId w:val="58"/>
+  </w:num>
+  <w:num w:numId="33">
+    <w:abstractNumId w:val="19"/>
+  </w:num>
+  <w:num w:numId="34">
+    <w:abstractNumId w:val="72"/>
+  </w:num>
+  <w:num w:numId="35">
+    <w:abstractNumId w:val="26"/>
+  </w:num>
+  <w:num w:numId="36">
+    <w:abstractNumId w:val="10"/>
+  </w:num>
+  <w:num w:numId="37">
+    <w:abstractNumId w:val="65"/>
+  </w:num>
+  <w:num w:numId="38">
+    <w:abstractNumId w:val="54"/>
+  </w:num>
+  <w:num w:numId="39">
+    <w:abstractNumId w:val="83"/>
+  </w:num>
+  <w:num w:numId="40">
+    <w:abstractNumId w:val="28"/>
+  </w:num>
+  <w:num w:numId="41">
+    <w:abstractNumId w:val="42"/>
+  </w:num>
+  <w:num w:numId="42">
+    <w:abstractNumId w:val="61"/>
+  </w:num>
+  <w:num w:numId="43">
+    <w:abstractNumId w:val="24"/>
+  </w:num>
+  <w:num w:numId="44">
+    <w:abstractNumId w:val="84"/>
+  </w:num>
+  <w:num w:numId="45">
+    <w:abstractNumId w:val="44"/>
+  </w:num>
+  <w:num w:numId="46">
+    <w:abstractNumId w:val="8"/>
+  </w:num>
+  <w:num w:numId="47">
+    <w:abstractNumId w:val="2"/>
+  </w:num>
+  <w:num w:numId="48">
+    <w:abstractNumId w:val="55"/>
+  </w:num>
+  <w:num w:numId="49">
+    <w:abstractNumId w:val="4"/>
+  </w:num>
+  <w:num w:numId="50">
+    <w:abstractNumId w:val="80"/>
+  </w:num>
+  <w:num w:numId="51">
+    <w:abstractNumId w:val="56"/>
+  </w:num>
+  <w:num w:numId="52">
+    <w:abstractNumId w:val="3"/>
+  </w:num>
+  <w:num w:numId="53">
+    <w:abstractNumId w:val="70"/>
+  </w:num>
+  <w:num w:numId="54">
+    <w:abstractNumId w:val="43"/>
+  </w:num>
+  <w:num w:numId="55">
+    <w:abstractNumId w:val="82"/>
+  </w:num>
+  <w:num w:numId="56">
+    <w:abstractNumId w:val="57"/>
+  </w:num>
+  <w:num w:numId="57">
+    <w:abstractNumId w:val="48"/>
+  </w:num>
+  <w:num w:numId="58">
+    <w:abstractNumId w:val="62"/>
+  </w:num>
+  <w:num w:numId="59">
+    <w:abstractNumId w:val="50"/>
+  </w:num>
+  <w:num w:numId="60">
+    <w:abstractNumId w:val="31"/>
+  </w:num>
+  <w:num w:numId="61">
+    <w:abstractNumId w:val="25"/>
+  </w:num>
+  <w:num w:numId="62">
+    <w:abstractNumId w:val="53"/>
+  </w:num>
+  <w:num w:numId="63">
+    <w:abstractNumId w:val="33"/>
+  </w:num>
+  <w:num w:numId="64">
+    <w:abstractNumId w:val="78"/>
+  </w:num>
+  <w:num w:numId="65">
+    <w:abstractNumId w:val="64"/>
+  </w:num>
+  <w:num w:numId="66">
+    <w:abstractNumId w:val="67"/>
+  </w:num>
+  <w:num w:numId="67">
+    <w:abstractNumId w:val="27"/>
+  </w:num>
+  <w:num w:numId="68">
+    <w:abstractNumId w:val="23"/>
+  </w:num>
+  <w:num w:numId="69">
+    <w:abstractNumId w:val="1"/>
+  </w:num>
+  <w:num w:numId="70">
+    <w:abstractNumId w:val="34"/>
+  </w:num>
+  <w:num w:numId="71">
+    <w:abstractNumId w:val="12"/>
+  </w:num>
+  <w:num w:numId="72">
+    <w:abstractNumId w:val="9"/>
+  </w:num>
+  <w:num w:numId="73">
+    <w:abstractNumId w:val="52"/>
+  </w:num>
+  <w:num w:numId="74">
     <w:abstractNumId w:val="49"/>
   </w:num>
-  <w:num w:numId="11">
-    <w:abstractNumId w:val="74"/>
+  <w:num w:numId="75">
+    <w:abstractNumId w:val="22"/>
   </w:num>
-  <w:num w:numId="12">
-    <w:abstractNumId w:val="38"/>
+  <w:num w:numId="76">
+    <w:abstractNumId w:val="20"/>
   </w:num>
-  <w:num w:numId="13">
-    <w:abstractNumId w:val="0"/>
+  <w:num w:numId="77">
+    <w:abstractNumId w:val="60"/>
   </w:num>
-  <w:num w:numId="14">
+  <w:num w:numId="78">
+    <w:abstractNumId w:val="5"/>
+  </w:num>
+  <w:num w:numId="79">
+    <w:abstractNumId w:val="69"/>
+  </w:num>
+  <w:num w:numId="80">
+    <w:abstractNumId w:val="85"/>
+  </w:num>
+  <w:num w:numId="81">
+    <w:abstractNumId w:val="7"/>
+  </w:num>
+  <w:num w:numId="82">
+    <w:abstractNumId w:val="79"/>
+  </w:num>
+  <w:num w:numId="83">
+    <w:abstractNumId w:val="46"/>
+  </w:num>
+  <w:num w:numId="84">
     <w:abstractNumId w:val="73"/>
   </w:num>
-  <w:num w:numId="15">
-    <w:abstractNumId w:val="15"/>
+  <w:num w:numId="85">
+    <w:abstractNumId w:val="21"/>
   </w:num>
-  <w:num w:numId="16">
-    <w:abstractNumId w:val="57"/>
-  </w:num>
-  <w:num w:numId="17">
-    <w:abstractNumId w:val="43"/>
-  </w:num>
-  <w:num w:numId="18">
-    <w:abstractNumId w:val="28"/>
-  </w:num>
-  <w:num w:numId="19">
-    <w:abstractNumId w:val="29"/>
-  </w:num>
-  <w:num w:numId="20">
-    <w:abstractNumId w:val="79"/>
-  </w:num>
-  <w:num w:numId="21">
-    <w:abstractNumId w:val="45"/>
-  </w:num>
-  <w:num w:numId="22">
-    <w:abstractNumId w:val="84"/>
-  </w:num>
-  <w:num w:numId="23">
-    <w:abstractNumId w:val="83"/>
-  </w:num>
-  <w:num w:numId="24">
-    <w:abstractNumId w:val="69"/>
-  </w:num>
-  <w:num w:numId="25">
-    <w:abstractNumId w:val="6"/>
-  </w:num>
-  <w:num w:numId="26">
-    <w:abstractNumId w:val="39"/>
-  </w:num>
-  <w:num w:numId="27">
-    <w:abstractNumId w:val="35"/>
-  </w:num>
-  <w:num w:numId="28">
-    <w:abstractNumId w:val="75"/>
-  </w:num>
-  <w:num w:numId="29">
-    <w:abstractNumId w:val="56"/>
-  </w:num>
-  <w:num w:numId="30">
-    <w:abstractNumId w:val="19"/>
-  </w:num>
-  <w:num w:numId="31">
-    <w:abstractNumId w:val="70"/>
-  </w:num>
-  <w:num w:numId="32">
-    <w:abstractNumId w:val="25"/>
-  </w:num>
-  <w:num w:numId="33">
-    <w:abstractNumId w:val="10"/>
-  </w:num>
-  <w:num w:numId="34">
-    <w:abstractNumId w:val="63"/>
-  </w:num>
-  <w:num w:numId="35">
-    <w:abstractNumId w:val="52"/>
-  </w:num>
-  <w:num w:numId="36">
-    <w:abstractNumId w:val="81"/>
-  </w:num>
-  <w:num w:numId="37">
-    <w:abstractNumId w:val="27"/>
-  </w:num>
-  <w:num w:numId="38">
+  <w:num w:numId="86">
     <w:abstractNumId w:val="41"/>
   </w:num>
-  <w:num w:numId="39">
-    <w:abstractNumId w:val="59"/>
-  </w:num>
-  <w:num w:numId="40">
-    <w:abstractNumId w:val="34"/>
-  </w:num>
-  <w:num w:numId="41">
-    <w:abstractNumId w:val="37"/>
-  </w:num>
-  <w:num w:numId="42">
-    <w:abstractNumId w:val="72"/>
-  </w:num>
-  <w:num w:numId="43">
-    <w:abstractNumId w:val="8"/>
-  </w:num>
-  <w:num w:numId="44">
-    <w:abstractNumId w:val="2"/>
-  </w:num>
-  <w:num w:numId="45">
-    <w:abstractNumId w:val="53"/>
-  </w:num>
-  <w:num w:numId="46">
-    <w:abstractNumId w:val="4"/>
-  </w:num>
-  <w:num w:numId="47">
-    <w:abstractNumId w:val="78"/>
-  </w:num>
-  <w:num w:numId="48">
-    <w:abstractNumId w:val="54"/>
-  </w:num>
-  <w:num w:numId="49">
-    <w:abstractNumId w:val="3"/>
-  </w:num>
-  <w:num w:numId="50">
-    <w:abstractNumId w:val="68"/>
-  </w:num>
-  <w:num w:numId="51">
-    <w:abstractNumId w:val="42"/>
-  </w:num>
-  <w:num w:numId="52">
-    <w:abstractNumId w:val="80"/>
-  </w:num>
-  <w:num w:numId="53">
-    <w:abstractNumId w:val="55"/>
-  </w:num>
-  <w:num w:numId="54">
-    <w:abstractNumId w:val="46"/>
-  </w:num>
-  <w:num w:numId="55">
-    <w:abstractNumId w:val="60"/>
-  </w:num>
-  <w:num w:numId="56">
-    <w:abstractNumId w:val="48"/>
-  </w:num>
-  <w:num w:numId="57">
-    <w:abstractNumId w:val="30"/>
-  </w:num>
-  <w:num w:numId="58">
-    <w:abstractNumId w:val="24"/>
-  </w:num>
-  <w:num w:numId="59">
-    <w:abstractNumId w:val="51"/>
-  </w:num>
-  <w:num w:numId="60">
-    <w:abstractNumId w:val="32"/>
-  </w:num>
-  <w:num w:numId="61">
-    <w:abstractNumId w:val="76"/>
-  </w:num>
-  <w:num w:numId="62">
-    <w:abstractNumId w:val="62"/>
-  </w:num>
-  <w:num w:numId="63">
-    <w:abstractNumId w:val="65"/>
-  </w:num>
-  <w:num w:numId="64">
-    <w:abstractNumId w:val="26"/>
-  </w:num>
-  <w:num w:numId="65">
-    <w:abstractNumId w:val="23"/>
-  </w:num>
-  <w:num w:numId="66">
-    <w:abstractNumId w:val="1"/>
-  </w:num>
-  <w:num w:numId="67">
-    <w:abstractNumId w:val="33"/>
-  </w:num>
-  <w:num w:numId="68">
-    <w:abstractNumId w:val="12"/>
-  </w:num>
-  <w:num w:numId="69">
-    <w:abstractNumId w:val="9"/>
-  </w:num>
-  <w:num w:numId="70">
-    <w:abstractNumId w:val="50"/>
-  </w:num>
-  <w:num w:numId="71">
-    <w:abstractNumId w:val="47"/>
-  </w:num>
-  <w:num w:numId="72">
-    <w:abstractNumId w:val="22"/>
-  </w:num>
-  <w:num w:numId="73">
-    <w:abstractNumId w:val="20"/>
-  </w:num>
-  <w:num w:numId="74">
-    <w:abstractNumId w:val="58"/>
-  </w:num>
-  <w:num w:numId="75">
-    <w:abstractNumId w:val="5"/>
-  </w:num>
-  <w:num w:numId="76">
-    <w:abstractNumId w:val="67"/>
-  </w:num>
-  <w:num w:numId="77">
-    <w:abstractNumId w:val="82"/>
-  </w:num>
-  <w:num w:numId="78">
-    <w:abstractNumId w:val="7"/>
-  </w:num>
-  <w:num w:numId="79">
-    <w:abstractNumId w:val="77"/>
-  </w:num>
-  <w:num w:numId="80">
-    <w:abstractNumId w:val="44"/>
-  </w:num>
-  <w:num w:numId="81">
-    <w:abstractNumId w:val="71"/>
-  </w:num>
-  <w:num w:numId="82">
-    <w:abstractNumId w:val="21"/>
-  </w:num>
-  <w:num w:numId="83">
-    <w:abstractNumId w:val="40"/>
-  </w:num>
-  <w:num w:numId="84">
+  <w:num w:numId="87">
     <w:abstractNumId w:val="13"/>
   </w:num>
-  <w:num w:numId="85">
-    <w:abstractNumId w:val="64"/>
+  <w:num w:numId="88">
+    <w:abstractNumId w:val="66"/>
   </w:num>
 </w:numbering>
 </file>

</xml_diff>

<commit_message>
Sửa lỗi chính tả trong đặc tả Usecase
</commit_message>
<xml_diff>
--- a/Diagrams/UsecaseDiagram/DacTa/DacTaUsecase.docx
+++ b/Diagrams/UsecaseDiagram/DacTa/DacTaUsecase.docx
@@ -1091,6 +1091,7 @@
     <w:p>
       <w:pPr>
         <w:numPr>
+          <w:ilvl w:val="0"/>
           <w:numId w:val="0"/>
         </w:numPr>
         <w:ind w:leftChars="0"/>
@@ -3913,19 +3914,7 @@
                 <w:vertAlign w:val="baseline"/>
                 <w:lang w:val="en-US"/>
               </w:rPr>
-              <w:t>Hệ thống sẵn sàng để thực hiện yêu cầu tiếp theo của Admin</w:t>
-            </w:r>
-            <w:bookmarkStart w:id="0" w:name="_GoBack"/>
-            <w:bookmarkEnd w:id="0"/>
-            <w:r>
-              <w:rPr>
-                <w:rFonts w:hint="default"/>
-                <w:sz w:val="32"/>
-                <w:szCs w:val="32"/>
-                <w:vertAlign w:val="baseline"/>
-                <w:lang w:val="en-US"/>
-              </w:rPr>
-              <w:t>.</w:t>
+              <w:t>Hệ thống sẵn sàng để thực hiện yêu cầu tiếp theo của Admin.</w:t>
             </w:r>
           </w:p>
         </w:tc>
@@ -4182,7 +4171,7 @@
                 <w:vertAlign w:val="baseline"/>
                 <w:lang w:val="en-US"/>
               </w:rPr>
-              <w:t>3.1/ Tải lên bài hát (Chuyển sang usecase Tải lên bài hát).</w:t>
+              <w:t>3.1/ Tải lên bài hát (Chuyển sang Usecase Tải lên bài hát).</w:t>
             </w:r>
           </w:p>
           <w:p>
@@ -4210,7 +4199,7 @@
                 <w:vertAlign w:val="baseline"/>
                 <w:lang w:val="en-US"/>
               </w:rPr>
-              <w:t>3.2/ Người dùng chọn 1 bài hát cần sửa và chọn Sửa thông tin bài hát (Chuyển sang usecase Sửa thông tin bài hát).</w:t>
+              <w:t>3.2/ Người dùng chọn 1 bài hát cần sửa và chọn Sửa thông tin bài hát (Chuyển sang Usecase Sửa thông tin bài hát).</w:t>
             </w:r>
           </w:p>
           <w:p>
@@ -5700,6 +5689,12 @@
             <w:insideH w:val="single" w:color="auto" w:sz="4" w:space="0"/>
             <w:insideV w:val="single" w:color="auto" w:sz="4" w:space="0"/>
           </w:tblBorders>
+          <w:tblCellMar>
+            <w:top w:w="0" w:type="dxa"/>
+            <w:left w:w="108" w:type="dxa"/>
+            <w:bottom w:w="0" w:type="dxa"/>
+            <w:right w:w="108" w:type="dxa"/>
+          </w:tblCellMar>
         </w:tblPrEx>
         <w:tc>
           <w:tcPr>
@@ -8821,12 +8816,6 @@
             <w:insideH w:val="single" w:color="auto" w:sz="4" w:space="0"/>
             <w:insideV w:val="single" w:color="auto" w:sz="4" w:space="0"/>
           </w:tblBorders>
-          <w:tblCellMar>
-            <w:top w:w="0" w:type="dxa"/>
-            <w:left w:w="108" w:type="dxa"/>
-            <w:bottom w:w="0" w:type="dxa"/>
-            <w:right w:w="108" w:type="dxa"/>
-          </w:tblCellMar>
         </w:tblPrEx>
         <w:tc>
           <w:tcPr>
@@ -10156,6 +10145,7 @@
             <w:pPr>
               <w:widowControl w:val="0"/>
               <w:numPr>
+                <w:ilvl w:val="0"/>
                 <w:numId w:val="0"/>
               </w:numPr>
               <w:ind w:left="361" w:leftChars="0"/>
@@ -10183,6 +10173,7 @@
             <w:pPr>
               <w:widowControl w:val="0"/>
               <w:numPr>
+                <w:ilvl w:val="0"/>
                 <w:numId w:val="0"/>
               </w:numPr>
               <w:ind w:left="361" w:leftChars="0"/>
@@ -10210,6 +10201,7 @@
             <w:pPr>
               <w:widowControl w:val="0"/>
               <w:numPr>
+                <w:ilvl w:val="0"/>
                 <w:numId w:val="0"/>
               </w:numPr>
               <w:ind w:left="361" w:leftChars="0"/>
@@ -10237,6 +10229,7 @@
             <w:pPr>
               <w:widowControl w:val="0"/>
               <w:numPr>
+                <w:ilvl w:val="0"/>
                 <w:numId w:val="0"/>
               </w:numPr>
               <w:ind w:left="361" w:leftChars="0"/>
@@ -10264,6 +10257,7 @@
             <w:pPr>
               <w:widowControl w:val="0"/>
               <w:numPr>
+                <w:ilvl w:val="0"/>
                 <w:numId w:val="0"/>
               </w:numPr>
               <w:ind w:left="361" w:leftChars="0"/>
@@ -10291,6 +10285,7 @@
             <w:pPr>
               <w:widowControl w:val="0"/>
               <w:numPr>
+                <w:ilvl w:val="0"/>
                 <w:numId w:val="0"/>
               </w:numPr>
               <w:ind w:leftChars="0"/>
@@ -10318,6 +10313,7 @@
             <w:pPr>
               <w:widowControl w:val="0"/>
               <w:numPr>
+                <w:ilvl w:val="0"/>
                 <w:numId w:val="0"/>
               </w:numPr>
               <w:ind w:leftChars="0"/>
@@ -11162,12 +11158,6 @@
             <w:insideH w:val="single" w:color="auto" w:sz="4" w:space="0"/>
             <w:insideV w:val="single" w:color="auto" w:sz="4" w:space="0"/>
           </w:tblBorders>
-          <w:tblCellMar>
-            <w:top w:w="0" w:type="dxa"/>
-            <w:left w:w="108" w:type="dxa"/>
-            <w:bottom w:w="0" w:type="dxa"/>
-            <w:right w:w="108" w:type="dxa"/>
-          </w:tblCellMar>
         </w:tblPrEx>
         <w:tc>
           <w:tcPr>
@@ -14251,6 +14241,12 @@
             <w:insideH w:val="single" w:color="auto" w:sz="4" w:space="0"/>
             <w:insideV w:val="single" w:color="auto" w:sz="4" w:space="0"/>
           </w:tblBorders>
+          <w:tblCellMar>
+            <w:top w:w="0" w:type="dxa"/>
+            <w:left w:w="108" w:type="dxa"/>
+            <w:bottom w:w="0" w:type="dxa"/>
+            <w:right w:w="108" w:type="dxa"/>
+          </w:tblCellMar>
         </w:tblPrEx>
         <w:tc>
           <w:tcPr>
@@ -15441,7 +15437,7 @@
                 <w:vertAlign w:val="baseline"/>
                 <w:lang w:val="en-US"/>
               </w:rPr>
-              <w:t>3.1/ Tạo Playlist cá nhân (Chuyển sang usecase Tạo Playlist cá nhân).</w:t>
+              <w:t>3.1/ Tạo Playlist cá nhân (Chuyển sang Usecase Tạo Playlist cá nhân).</w:t>
             </w:r>
           </w:p>
           <w:p>
@@ -15469,7 +15465,7 @@
                 <w:vertAlign w:val="baseline"/>
                 <w:lang w:val="en-US"/>
               </w:rPr>
-              <w:t>3.2/ Người dùng chọn 1 Playlist cần xem chi tiết và chọn Quản lý chi tiết Playlist cá nhân (Chuyển sang usecase Quản lý chi tiết Playlist cá nhân).</w:t>
+              <w:t>3.2/ Người dùng chọn 1 Playlist cần xem chi tiết và chọn Quản lý chi tiết Playlist cá nhân (Chuyển sang Usecase Quản lý chi tiết Playlist cá nhân).</w:t>
             </w:r>
           </w:p>
           <w:p>
@@ -15497,7 +15493,19 @@
                 <w:vertAlign w:val="baseline"/>
                 <w:lang w:val="en-US"/>
               </w:rPr>
-              <w:t>3.3/ Người dùng chọn 1 Playlist cần xoá và chọn Xoá Playlist cá nhân. Hệ thống ghi nhận và xoá Playlist đó ra khỏi danh sách Playlist cá nhân thành công.</w:t>
+              <w:t>3.3/ Người dùng chọn 1 Playlist cần xoá và chọn Xoá Playlist cá nhân. Hệ thống ghi nhận và xoá Playli</w:t>
+            </w:r>
+            <w:bookmarkStart w:id="0" w:name="_GoBack"/>
+            <w:bookmarkEnd w:id="0"/>
+            <w:r>
+              <w:rPr>
+                <w:rFonts w:hint="default"/>
+                <w:sz w:val="32"/>
+                <w:szCs w:val="32"/>
+                <w:vertAlign w:val="baseline"/>
+                <w:lang w:val="en-US"/>
+              </w:rPr>
+              <w:t>st đó ra khỏi danh sách Playlist cá nhân thành công.</w:t>
             </w:r>
           </w:p>
           <w:p>
@@ -16478,7 +16486,7 @@
                 <w:vertAlign w:val="baseline"/>
                 <w:lang w:val="en-US"/>
               </w:rPr>
-              <w:t>2.1/ Sửa thông tin Playlist  (Chuyển sang usecase Sửa thông tin Playlist).</w:t>
+              <w:t>2.1/ Sửa thông tin Playlist  (Chuyển sang Usecase Sửa thông tin Playlist).</w:t>
             </w:r>
           </w:p>
           <w:p>
@@ -16506,7 +16514,7 @@
                 <w:vertAlign w:val="baseline"/>
                 <w:lang w:val="en-US"/>
               </w:rPr>
-              <w:t>2.2/ Thêm bài hát vào Playlist (Chuyển sang usecase Thêm bài hát vào Playlist).</w:t>
+              <w:t>2.2/ Thêm bài hát vào Playlist (Chuyển sang Usecase Thêm bài hát vào Playlist).</w:t>
             </w:r>
           </w:p>
           <w:p>

</xml_diff>